<commit_message>
Changed interface to update baseline values on app
</commit_message>
<xml_diff>
--- a/resources/Test_Framework_Description.docx
+++ b/resources/Test_Framework_Description.docx
@@ -1481,6 +1481,7 @@
             <w:pPr>
               <w:spacing w:after="160"/>
             </w:pPr>
+            <w:commentRangeStart w:id="2"/>
             <w:r>
               <w:t>6.</w:t>
             </w:r>
@@ -1495,7 +1496,96 @@
               <w:spacing w:after="160"/>
             </w:pPr>
             <w:r>
-              <w:t>Cannot put prep inputs more than eligible populations</w:t>
+              <w:t xml:space="preserve">Infections averted when 100% of eligible pop is </w:t>
+            </w:r>
+            <w:r>
+              <w:t>on prep is equal to when 150% is on</w:t>
+            </w:r>
+            <w:commentRangeEnd w:id="2"/>
+            <w:r>
+              <w:rPr>
+                <w:rStyle w:val="CommentReference"/>
+                <w:sz w:val="24"/>
+                <w:szCs w:val="24"/>
+              </w:rPr>
+              <w:commentReference w:id="2"/>
+            </w:r>
+          </w:p>
+        </w:tc>
+        <w:tc>
+          <w:tcPr>
+            <w:tcW w:w="6462" w:type="dxa"/>
+          </w:tcPr>
+          <w:p>
+            <w:pPr>
+              <w:spacing w:after="160"/>
+            </w:pPr>
+            <w:r>
+              <w:t xml:space="preserve">Set high_risk_negative = </w:t>
+            </w:r>
+            <w:r>
+              <w:t>1</w:t>
+            </w:r>
+            <w:r>
+              <w:t>0,000</w:t>
+            </w:r>
+            <w:r>
+              <w:t xml:space="preserve"> people</w:t>
+            </w:r>
+          </w:p>
+          <w:p>
+            <w:pPr>
+              <w:spacing w:after="160"/>
+            </w:pPr>
+            <w:r>
+              <w:t xml:space="preserve">Infections averted 10,000 </w:t>
+            </w:r>
+            <w:r>
+              <w:t>-</w:t>
+            </w:r>
+            <w:r>
+              <w:t xml:space="preserve"> Infections averted 15,000</w:t>
+            </w:r>
+            <w:r>
+              <w:t xml:space="preserve"> =0</w:t>
+            </w:r>
+          </w:p>
+        </w:tc>
+      </w:tr>
+      <w:tr>
+        <w:trPr>
+          <w:trHeight w:val="457"/>
+        </w:trPr>
+        <w:tc>
+          <w:tcPr>
+            <w:tcW w:w="549" w:type="dxa"/>
+          </w:tcPr>
+          <w:p>
+            <w:pPr>
+              <w:spacing w:after="160"/>
+            </w:pPr>
+            <w:r>
+              <w:t>7.</w:t>
+            </w:r>
+          </w:p>
+        </w:tc>
+        <w:tc>
+          <w:tcPr>
+            <w:tcW w:w="2140" w:type="dxa"/>
+          </w:tcPr>
+          <w:p>
+            <w:pPr>
+              <w:spacing w:after="160"/>
+            </w:pPr>
+            <w:r>
+              <w:t xml:space="preserve">Cannot put prep inputs more than </w:t>
+            </w:r>
+            <w:r>
+              <w:lastRenderedPageBreak/>
+              <w:t>eligible populations</w:t>
+            </w:r>
+            <w:r>
+              <w:t xml:space="preserve"> – both?</w:t>
             </w:r>
           </w:p>
         </w:tc>
@@ -1558,6 +1648,23 @@
       </w:r>
     </w:p>
   </w:comment>
+  <w:comment w:id="2" w:author="Alex de Nooy" w:date="2026-01-27T09:18:00Z" w:initials="Ad">
+    <w:p>
+      <w:r>
+        <w:rPr>
+          <w:rStyle w:val="CommentReference"/>
+        </w:rPr>
+        <w:annotationRef/>
+      </w:r>
+      <w:r>
+        <w:rPr>
+          <w:sz w:val="20"/>
+          <w:szCs w:val="20"/>
+        </w:rPr>
+        <w:t>check different costs</w:t>
+      </w:r>
+    </w:p>
+  </w:comment>
 </w:comments>
 </file>
 
@@ -1565,6 +1672,7 @@
 <w15:commentsEx xmlns:wpc="http://schemas.microsoft.com/office/word/2010/wordprocessingCanvas" xmlns:cx="http://schemas.microsoft.com/office/drawing/2014/chartex" xmlns:cx1="http://schemas.microsoft.com/office/drawing/2015/9/8/chartex" xmlns:cx2="http://schemas.microsoft.com/office/drawing/2015/10/21/chartex" xmlns:cx3="http://schemas.microsoft.com/office/drawing/2016/5/9/chartex" xmlns:cx4="http://schemas.microsoft.com/office/drawing/2016/5/10/chartex" xmlns:cx5="http://schemas.microsoft.com/office/drawing/2016/5/11/chartex" xmlns:cx6="http://schemas.microsoft.com/office/drawing/2016/5/12/chartex" xmlns:cx7="http://schemas.microsoft.com/office/drawing/2016/5/13/chartex" xmlns:cx8="http://schemas.microsoft.com/office/drawing/2016/5/14/chartex" xmlns:mc="http://schemas.openxmlformats.org/markup-compatibility/2006" xmlns:aink="http://schemas.microsoft.com/office/drawing/2016/ink" xmlns:am3d="http://schemas.microsoft.com/office/drawing/2017/model3d" xmlns:o="urn:schemas-microsoft-com:office:office" xmlns:oel="http://schemas.microsoft.com/office/2019/extlst" xmlns:r="http://schemas.openxmlformats.org/officeDocument/2006/relationships" xmlns:m="http://schemas.openxmlformats.org/officeDocument/2006/math" xmlns:v="urn:schemas-microsoft-com:vml" xmlns:wp14="http://schemas.microsoft.com/office/word/2010/wordprocessingDrawing" xmlns:wp="http://schemas.openxmlformats.org/drawingml/2006/wordprocessingDrawing" xmlns:w10="urn:schemas-microsoft-com:office:word" xmlns:w="http://schemas.openxmlformats.org/wordprocessingml/2006/main" xmlns:w14="http://schemas.microsoft.com/office/word/2010/wordml" xmlns:w15="http://schemas.microsoft.com/office/word/2012/wordml" xmlns:w16cex="http://schemas.microsoft.com/office/word/2018/wordml/cex" xmlns:w16cid="http://schemas.microsoft.com/office/word/2016/wordml/cid" xmlns:w16="http://schemas.microsoft.com/office/word/2018/wordml" xmlns:w16du="http://schemas.microsoft.com/office/word/2023/wordml/word16du" xmlns:w16sdtdh="http://schemas.microsoft.com/office/word/2020/wordml/sdtdatahash" xmlns:w16sdtfl="http://schemas.microsoft.com/office/word/2024/wordml/sdtformatlock" xmlns:w16se="http://schemas.microsoft.com/office/word/2015/wordml/symex" xmlns:wpg="http://schemas.microsoft.com/office/word/2010/wordprocessingGroup" xmlns:wpi="http://schemas.microsoft.com/office/word/2010/wordprocessingInk" xmlns:wne="http://schemas.microsoft.com/office/word/2006/wordml" xmlns:wps="http://schemas.microsoft.com/office/word/2010/wordprocessingShape" mc:Ignorable="w14 w15 w16se w16cid w16 w16cex w16sdtdh w16sdtfl w16du wp14">
   <w15:commentEx w15:paraId="6F9C2EF7" w15:done="0"/>
   <w15:commentEx w15:paraId="778F6952" w15:paraIdParent="6F9C2EF7" w15:done="0"/>
+  <w15:commentEx w15:paraId="7BC24E07" w15:done="0"/>
 </w15:commentsEx>
 </file>
 
@@ -1572,6 +1680,7 @@
 <w16cex:commentsExtensible xmlns:wpc="http://schemas.microsoft.com/office/word/2010/wordprocessingCanvas" xmlns:cx="http://schemas.microsoft.com/office/drawing/2014/chartex" xmlns:cx1="http://schemas.microsoft.com/office/drawing/2015/9/8/chartex" xmlns:cx2="http://schemas.microsoft.com/office/drawing/2015/10/21/chartex" xmlns:cx3="http://schemas.microsoft.com/office/drawing/2016/5/9/chartex" xmlns:cx4="http://schemas.microsoft.com/office/drawing/2016/5/10/chartex" xmlns:cx5="http://schemas.microsoft.com/office/drawing/2016/5/11/chartex" xmlns:cx6="http://schemas.microsoft.com/office/drawing/2016/5/12/chartex" xmlns:cx7="http://schemas.microsoft.com/office/drawing/2016/5/13/chartex" xmlns:cx8="http://schemas.microsoft.com/office/drawing/2016/5/14/chartex" xmlns:cr="http://schemas.microsoft.com/office/comments/2020/reactions" xmlns:mc="http://schemas.openxmlformats.org/markup-compatibility/2006" xmlns:aink="http://schemas.microsoft.com/office/drawing/2016/ink" xmlns:am3d="http://schemas.microsoft.com/office/drawing/2017/model3d" xmlns:o="urn:schemas-microsoft-com:office:office" xmlns:oel="http://schemas.microsoft.com/office/2019/extlst" xmlns:r="http://schemas.openxmlformats.org/officeDocument/2006/relationships" xmlns:m="http://schemas.openxmlformats.org/officeDocument/2006/math" xmlns:v="urn:schemas-microsoft-com:vml" xmlns:wp14="http://schemas.microsoft.com/office/word/2010/wordprocessingDrawing" xmlns:wp="http://schemas.openxmlformats.org/drawingml/2006/wordprocessingDrawing" xmlns:w10="urn:schemas-microsoft-com:office:word" xmlns:w="http://schemas.openxmlformats.org/wordprocessingml/2006/main" xmlns:w14="http://schemas.microsoft.com/office/word/2010/wordml" xmlns:w15="http://schemas.microsoft.com/office/word/2012/wordml" xmlns:w16cex="http://schemas.microsoft.com/office/word/2018/wordml/cex" xmlns:w16cid="http://schemas.microsoft.com/office/word/2016/wordml/cid" xmlns:w16="http://schemas.microsoft.com/office/word/2018/wordml" xmlns:w16du="http://schemas.microsoft.com/office/word/2023/wordml/word16du" xmlns:w16sdtdh="http://schemas.microsoft.com/office/word/2020/wordml/sdtdatahash" xmlns:w16sdtfl="http://schemas.microsoft.com/office/word/2024/wordml/sdtformatlock" xmlns:w16se="http://schemas.microsoft.com/office/word/2015/wordml/symex" xmlns:wpg="http://schemas.microsoft.com/office/word/2010/wordprocessingGroup" xmlns:wpi="http://schemas.microsoft.com/office/word/2010/wordprocessingInk" xmlns:wne="http://schemas.microsoft.com/office/word/2006/wordml" xmlns:wps="http://schemas.microsoft.com/office/word/2010/wordprocessingShape" mc:Ignorable="w14 w15 w16se w16cid w16 w16cex w16sdtdh w16sdtfl cr w16du wp14">
   <w16cex:commentExtensible w16cex:durableId="0CEB61E4" w16cex:dateUtc="2026-01-26T15:26:00Z"/>
   <w16cex:commentExtensible w16cex:durableId="7248C5EB" w16cex:dateUtc="2026-01-26T15:27:00Z"/>
+  <w16cex:commentExtensible w16cex:durableId="28052605" w16cex:dateUtc="2026-01-27T08:18:00Z"/>
 </w16cex:commentsExtensible>
 </file>
 
@@ -1579,6 +1688,7 @@
 <w16cid:commentsIds xmlns:wpc="http://schemas.microsoft.com/office/word/2010/wordprocessingCanvas" xmlns:cx="http://schemas.microsoft.com/office/drawing/2014/chartex" xmlns:cx1="http://schemas.microsoft.com/office/drawing/2015/9/8/chartex" xmlns:cx2="http://schemas.microsoft.com/office/drawing/2015/10/21/chartex" xmlns:cx3="http://schemas.microsoft.com/office/drawing/2016/5/9/chartex" xmlns:cx4="http://schemas.microsoft.com/office/drawing/2016/5/10/chartex" xmlns:cx5="http://schemas.microsoft.com/office/drawing/2016/5/11/chartex" xmlns:cx6="http://schemas.microsoft.com/office/drawing/2016/5/12/chartex" xmlns:cx7="http://schemas.microsoft.com/office/drawing/2016/5/13/chartex" xmlns:cx8="http://schemas.microsoft.com/office/drawing/2016/5/14/chartex" xmlns:mc="http://schemas.openxmlformats.org/markup-compatibility/2006" xmlns:aink="http://schemas.microsoft.com/office/drawing/2016/ink" xmlns:am3d="http://schemas.microsoft.com/office/drawing/2017/model3d" xmlns:o="urn:schemas-microsoft-com:office:office" xmlns:oel="http://schemas.microsoft.com/office/2019/extlst" xmlns:r="http://schemas.openxmlformats.org/officeDocument/2006/relationships" xmlns:m="http://schemas.openxmlformats.org/officeDocument/2006/math" xmlns:v="urn:schemas-microsoft-com:vml" xmlns:wp14="http://schemas.microsoft.com/office/word/2010/wordprocessingDrawing" xmlns:wp="http://schemas.openxmlformats.org/drawingml/2006/wordprocessingDrawing" xmlns:w10="urn:schemas-microsoft-com:office:word" xmlns:w="http://schemas.openxmlformats.org/wordprocessingml/2006/main" xmlns:w14="http://schemas.microsoft.com/office/word/2010/wordml" xmlns:w15="http://schemas.microsoft.com/office/word/2012/wordml" xmlns:w16cex="http://schemas.microsoft.com/office/word/2018/wordml/cex" xmlns:w16cid="http://schemas.microsoft.com/office/word/2016/wordml/cid" xmlns:w16="http://schemas.microsoft.com/office/word/2018/wordml" xmlns:w16du="http://schemas.microsoft.com/office/word/2023/wordml/word16du" xmlns:w16sdtdh="http://schemas.microsoft.com/office/word/2020/wordml/sdtdatahash" xmlns:w16sdtfl="http://schemas.microsoft.com/office/word/2024/wordml/sdtformatlock" xmlns:w16se="http://schemas.microsoft.com/office/word/2015/wordml/symex" xmlns:wpg="http://schemas.microsoft.com/office/word/2010/wordprocessingGroup" xmlns:wpi="http://schemas.microsoft.com/office/word/2010/wordprocessingInk" xmlns:wne="http://schemas.microsoft.com/office/word/2006/wordml" xmlns:wps="http://schemas.microsoft.com/office/word/2010/wordprocessingShape" mc:Ignorable="w14 w15 w16se w16cid w16 w16cex w16sdtdh w16sdtfl w16du wp14">
   <w16cid:commentId w16cid:paraId="6F9C2EF7" w16cid:durableId="0CEB61E4"/>
   <w16cid:commentId w16cid:paraId="778F6952" w16cid:durableId="7248C5EB"/>
+  <w16cid:commentId w16cid:paraId="7BC24E07" w16cid:durableId="28052605"/>
 </w16cid:commentsIds>
 </file>
 

</xml_diff>

<commit_message>
Added limits on number reached to not exceed the eligible population - fixed scenario update in app
</commit_message>
<xml_diff>
--- a/resources/Test_Framework_Description.docx
+++ b/resources/Test_Framework_Description.docx
@@ -1495,6 +1495,7 @@
             <w:pPr>
               <w:spacing w:after="160"/>
             </w:pPr>
+            <w:commentRangeStart w:id="3"/>
             <w:r>
               <w:t xml:space="preserve">Infections averted when 100% of eligible pop is </w:t>
             </w:r>
@@ -1509,6 +1510,15 @@
                 <w:szCs w:val="24"/>
               </w:rPr>
               <w:commentReference w:id="2"/>
+            </w:r>
+            <w:commentRangeEnd w:id="3"/>
+            <w:r>
+              <w:rPr>
+                <w:rStyle w:val="CommentReference"/>
+                <w:sz w:val="24"/>
+                <w:szCs w:val="24"/>
+              </w:rPr>
+              <w:commentReference w:id="3"/>
             </w:r>
           </w:p>
         </w:tc>
@@ -1665,6 +1675,23 @@
       </w:r>
     </w:p>
   </w:comment>
+  <w:comment w:id="3" w:author="Alex de Nooy" w:date="2026-01-27T10:08:00Z" w:initials="Ad">
+    <w:p>
+      <w:r>
+        <w:rPr>
+          <w:rStyle w:val="CommentReference"/>
+        </w:rPr>
+        <w:annotationRef/>
+      </w:r>
+      <w:r>
+        <w:rPr>
+          <w:sz w:val="20"/>
+          <w:szCs w:val="20"/>
+        </w:rPr>
+        <w:t>Is this a valid test? After the eligible population is there no/limited impact?</w:t>
+      </w:r>
+    </w:p>
+  </w:comment>
 </w:comments>
 </file>
 
@@ -1673,6 +1700,7 @@
   <w15:commentEx w15:paraId="6F9C2EF7" w15:done="0"/>
   <w15:commentEx w15:paraId="778F6952" w15:paraIdParent="6F9C2EF7" w15:done="0"/>
   <w15:commentEx w15:paraId="7BC24E07" w15:done="0"/>
+  <w15:commentEx w15:paraId="329A5C6B" w15:done="0"/>
 </w15:commentsEx>
 </file>
 
@@ -1681,6 +1709,7 @@
   <w16cex:commentExtensible w16cex:durableId="0CEB61E4" w16cex:dateUtc="2026-01-26T15:26:00Z"/>
   <w16cex:commentExtensible w16cex:durableId="7248C5EB" w16cex:dateUtc="2026-01-26T15:27:00Z"/>
   <w16cex:commentExtensible w16cex:durableId="28052605" w16cex:dateUtc="2026-01-27T08:18:00Z"/>
+  <w16cex:commentExtensible w16cex:durableId="7BA2E990" w16cex:dateUtc="2026-01-27T09:08:00Z"/>
 </w16cex:commentsExtensible>
 </file>
 
@@ -1689,6 +1718,7 @@
   <w16cid:commentId w16cid:paraId="6F9C2EF7" w16cid:durableId="0CEB61E4"/>
   <w16cid:commentId w16cid:paraId="778F6952" w16cid:durableId="7248C5EB"/>
   <w16cid:commentId w16cid:paraId="7BC24E07" w16cid:durableId="28052605"/>
+  <w16cid:commentId w16cid:paraId="329A5C6B" w16cid:durableId="7BA2E990"/>
 </w16cid:commentsIds>
 </file>
 

</xml_diff>

<commit_message>
Split testing framework, first VMMC
</commit_message>
<xml_diff>
--- a/resources/Test_Framework_Description.docx
+++ b/resources/Test_Framework_Description.docx
@@ -21,20 +21,20 @@
     <w:tbl>
       <w:tblPr>
         <w:tblStyle w:val="TableGrid"/>
-        <w:tblW w:w="0" w:type="auto"/>
+        <w:tblW w:w="9790" w:type="dxa"/>
         <w:tblLook w:val="04A0" w:firstRow="1" w:lastRow="0" w:firstColumn="1" w:lastColumn="0" w:noHBand="0" w:noVBand="1"/>
       </w:tblPr>
       <w:tblGrid>
-        <w:gridCol w:w="4665"/>
-        <w:gridCol w:w="4665"/>
+        <w:gridCol w:w="4895"/>
+        <w:gridCol w:w="4895"/>
       </w:tblGrid>
       <w:tr>
         <w:trPr>
-          <w:trHeight w:val="304"/>
+          <w:trHeight w:val="301"/>
         </w:trPr>
         <w:tc>
           <w:tcPr>
-            <w:tcW w:w="4665" w:type="dxa"/>
+            <w:tcW w:w="4895" w:type="dxa"/>
           </w:tcPr>
           <w:p>
             <w:pPr>
@@ -55,7 +55,7 @@
         </w:tc>
         <w:tc>
           <w:tcPr>
-            <w:tcW w:w="4665" w:type="dxa"/>
+            <w:tcW w:w="4895" w:type="dxa"/>
           </w:tcPr>
           <w:p>
             <w:pPr>
@@ -77,31 +77,46 @@
       </w:tr>
       <w:tr>
         <w:trPr>
-          <w:trHeight w:val="304"/>
+          <w:trHeight w:val="301"/>
         </w:trPr>
         <w:tc>
           <w:tcPr>
-            <w:tcW w:w="4665" w:type="dxa"/>
+            <w:tcW w:w="4895" w:type="dxa"/>
           </w:tcPr>
           <w:p>
             <w:pPr>
               <w:spacing w:after="120"/>
             </w:pPr>
             <w:r>
-              <w:t>Prevention intervention (prep)</w:t>
-            </w:r>
-          </w:p>
-        </w:tc>
-        <w:tc>
-          <w:tcPr>
-            <w:tcW w:w="4665" w:type="dxa"/>
+              <w:t>Prevention intervention</w:t>
+            </w:r>
+            <w:r>
+              <w:t>s</w:t>
+            </w:r>
+          </w:p>
+        </w:tc>
+        <w:tc>
+          <w:tcPr>
+            <w:tcW w:w="4895" w:type="dxa"/>
           </w:tcPr>
           <w:p>
             <w:pPr>
               <w:spacing w:after="120"/>
             </w:pPr>
             <w:r>
-              <w:t>Sign * #people * efficacy * incidence</w:t>
+              <w:t xml:space="preserve">Infections_averted = </w:t>
+            </w:r>
+            <w:r>
+              <w:t xml:space="preserve">Sign * </w:t>
+            </w:r>
+            <w:r>
+              <w:t>number_reached</w:t>
+            </w:r>
+            <w:r>
+              <w:t xml:space="preserve"> </w:t>
+            </w:r>
+            <w:r>
+              <w:t>* efficacy * incidence</w:t>
             </w:r>
           </w:p>
           <w:p>
@@ -114,18 +129,57 @@
               <w:spacing w:after="120"/>
             </w:pPr>
             <w:r>
-              <w:t>#people=min(number_reached, eligible_pop)</w:t>
+              <w:t>#number_reached</w:t>
+            </w:r>
+            <w:r>
+              <w:t>=target-base</w:t>
+            </w:r>
+          </w:p>
+          <w:p>
+            <w:pPr>
+              <w:spacing w:after="120"/>
+            </w:pPr>
+            <w:r>
+              <w:t>#</w:t>
+            </w:r>
+            <w:r>
+              <w:t>number_reached</w:t>
+            </w:r>
+            <w:r>
+              <w:t xml:space="preserve"> </w:t>
+            </w:r>
+            <w:r>
+              <w:t>=min(number_reached, eligible_pop)</w:t>
+            </w:r>
+          </w:p>
+          <w:p>
+            <w:pPr>
+              <w:spacing w:after="120"/>
+            </w:pPr>
+          </w:p>
+          <w:p>
+            <w:pPr>
+              <w:spacing w:after="120"/>
+            </w:pPr>
+            <w:r>
+              <w:t>Or #</w:t>
+            </w:r>
+            <w:r>
+              <w:t>number_reached</w:t>
+            </w:r>
+            <w:r>
+              <w:t xml:space="preserve"> = eligible-base if target&gt;eligible</w:t>
             </w:r>
           </w:p>
         </w:tc>
       </w:tr>
       <w:tr>
         <w:trPr>
-          <w:trHeight w:val="304"/>
+          <w:trHeight w:val="301"/>
         </w:trPr>
         <w:tc>
           <w:tcPr>
-            <w:tcW w:w="4665" w:type="dxa"/>
+            <w:tcW w:w="4895" w:type="dxa"/>
           </w:tcPr>
           <w:p>
             <w:pPr>
@@ -135,7 +189,7 @@
         </w:tc>
         <w:tc>
           <w:tcPr>
-            <w:tcW w:w="4665" w:type="dxa"/>
+            <w:tcW w:w="4895" w:type="dxa"/>
           </w:tcPr>
           <w:p>
             <w:pPr>
@@ -146,11 +200,11 @@
       </w:tr>
       <w:tr>
         <w:trPr>
-          <w:trHeight w:val="312"/>
+          <w:trHeight w:val="309"/>
         </w:trPr>
         <w:tc>
           <w:tcPr>
-            <w:tcW w:w="4665" w:type="dxa"/>
+            <w:tcW w:w="4895" w:type="dxa"/>
           </w:tcPr>
           <w:p>
             <w:pPr>
@@ -160,7 +214,7 @@
         </w:tc>
         <w:tc>
           <w:tcPr>
-            <w:tcW w:w="4665" w:type="dxa"/>
+            <w:tcW w:w="4895" w:type="dxa"/>
           </w:tcPr>
           <w:p>
             <w:pPr>
@@ -171,11 +225,11 @@
       </w:tr>
       <w:tr>
         <w:trPr>
-          <w:trHeight w:val="304"/>
+          <w:trHeight w:val="301"/>
         </w:trPr>
         <w:tc>
           <w:tcPr>
-            <w:tcW w:w="4665" w:type="dxa"/>
+            <w:tcW w:w="4895" w:type="dxa"/>
           </w:tcPr>
           <w:p>
             <w:pPr>
@@ -185,7 +239,7 @@
         </w:tc>
         <w:tc>
           <w:tcPr>
-            <w:tcW w:w="4665" w:type="dxa"/>
+            <w:tcW w:w="4895" w:type="dxa"/>
           </w:tcPr>
           <w:p>
             <w:pPr>
@@ -196,11 +250,11 @@
       </w:tr>
       <w:tr>
         <w:trPr>
-          <w:trHeight w:val="304"/>
+          <w:trHeight w:val="301"/>
         </w:trPr>
         <w:tc>
           <w:tcPr>
-            <w:tcW w:w="4665" w:type="dxa"/>
+            <w:tcW w:w="4895" w:type="dxa"/>
           </w:tcPr>
           <w:p>
             <w:pPr>
@@ -210,7 +264,7 @@
         </w:tc>
         <w:tc>
           <w:tcPr>
-            <w:tcW w:w="4665" w:type="dxa"/>
+            <w:tcW w:w="4895" w:type="dxa"/>
           </w:tcPr>
           <w:p>
             <w:pPr>
@@ -221,11 +275,11 @@
       </w:tr>
       <w:tr>
         <w:trPr>
-          <w:trHeight w:val="304"/>
+          <w:trHeight w:val="301"/>
         </w:trPr>
         <w:tc>
           <w:tcPr>
-            <w:tcW w:w="4665" w:type="dxa"/>
+            <w:tcW w:w="4895" w:type="dxa"/>
           </w:tcPr>
           <w:p>
             <w:pPr>
@@ -235,7 +289,7 @@
         </w:tc>
         <w:tc>
           <w:tcPr>
-            <w:tcW w:w="4665" w:type="dxa"/>
+            <w:tcW w:w="4895" w:type="dxa"/>
           </w:tcPr>
           <w:p>
             <w:pPr>
@@ -334,7 +388,7 @@
         <w:t xml:space="preserve"> set</w:t>
       </w:r>
       <w:r>
-        <w:t xml:space="preserve"> 1: Population Calculations - Basic Integrity</w:t>
+        <w:t>: Population Calculations - Basic Integrity</w:t>
       </w:r>
     </w:p>
     <w:p>
@@ -342,6 +396,7 @@
         <w:pStyle w:val="Heading3"/>
       </w:pPr>
       <w:r>
+        <w:lastRenderedPageBreak/>
         <w:t>Purpose</w:t>
       </w:r>
     </w:p>
@@ -384,7 +439,6 @@
         <w:spacing w:after="160"/>
       </w:pPr>
       <w:r>
-        <w:lastRenderedPageBreak/>
         <w:t>Uses a standardized population with the following parameters: 1,000,000 total population, 5% HIV prevalence (50,000 PLHIV), 80% diagnosed, 75% on ART, 85% virally suppressed, 5,000 new infections per year, and 1,000 AIDS deaths per year.</w:t>
       </w:r>
     </w:p>
@@ -691,10 +745,10 @@
         <w:t xml:space="preserve">Test </w:t>
       </w:r>
       <w:r>
-        <w:t xml:space="preserve">set </w:t>
-      </w:r>
-      <w:r>
-        <w:t>2: Cascade Progression - No Intervention</w:t>
+        <w:t>set</w:t>
+      </w:r>
+      <w:r>
+        <w:t>: Cascade Progression - No Intervention</w:t>
       </w:r>
     </w:p>
     <w:p>
@@ -916,6 +970,7 @@
               <w:spacing w:after="160"/>
             </w:pPr>
             <w:r>
+              <w:lastRenderedPageBreak/>
               <w:t>2.</w:t>
             </w:r>
           </w:p>
@@ -988,11 +1043,21 @@
       <w:pPr>
         <w:pStyle w:val="Heading2"/>
       </w:pPr>
-      <w:r>
-        <w:t>Test set 3: Prevention Interventions</w:t>
-      </w:r>
-      <w:r>
-        <w:t xml:space="preserve"> (Prep)</w:t>
+      <w:commentRangeStart w:id="0"/>
+      <w:r>
+        <w:t>Test set: Prevention Interventions</w:t>
+      </w:r>
+      <w:r>
+        <w:t xml:space="preserve"> </w:t>
+      </w:r>
+      <w:commentRangeEnd w:id="0"/>
+      <w:r>
+        <w:rPr>
+          <w:rStyle w:val="CommentReference"/>
+          <w:sz w:val="28"/>
+          <w:szCs w:val="28"/>
+        </w:rPr>
+        <w:commentReference w:id="0"/>
       </w:r>
     </w:p>
     <w:p>
@@ -1000,7 +1065,6 @@
         <w:pStyle w:val="Heading3"/>
       </w:pPr>
       <w:r>
-        <w:lastRenderedPageBreak/>
         <w:t>Purpose</w:t>
       </w:r>
     </w:p>
@@ -1009,13 +1073,7 @@
         <w:spacing w:after="160"/>
       </w:pPr>
       <w:r>
-        <w:t xml:space="preserve">Tests that changes in </w:t>
-      </w:r>
-      <w:r>
-        <w:t xml:space="preserve">prep </w:t>
-      </w:r>
-      <w:r>
-        <w:t>prevention interventions are correctly handled by the model. Increases in a prevention intervention (all other remaining equal) should result in infections being averted. Fewer resources for prevention should results in a greater number of infections</w:t>
+        <w:t>Tests that changes in prevention interventions are correctly handled by the model. Increases in a prevention intervention (all other remaining equal) should result in infections being averted. Fewer resources for prevention should results in a greater number of infections</w:t>
       </w:r>
     </w:p>
     <w:p>
@@ -1057,13 +1115,27 @@
         <w:t xml:space="preserve"> (</w:t>
       </w:r>
       <w:r>
-        <w:t>0.053)</w:t>
+        <w:t>0.</w:t>
+      </w:r>
+      <w:r>
+        <w:t>0</w:t>
+      </w:r>
+      <w:r>
+        <w:t>053)</w:t>
       </w:r>
     </w:p>
     <w:p>
       <w:pPr>
         <w:pStyle w:val="Heading3"/>
       </w:pPr>
+    </w:p>
+    <w:p>
+      <w:pPr>
+        <w:pStyle w:val="Heading4"/>
+      </w:pPr>
+      <w:r>
+        <w:t>Prep</w:t>
+      </w:r>
     </w:p>
     <w:tbl>
       <w:tblPr>
@@ -1134,8 +1206,8 @@
                 <w:bCs/>
               </w:rPr>
             </w:pPr>
-            <w:commentRangeStart w:id="0"/>
             <w:commentRangeStart w:id="1"/>
+            <w:commentRangeStart w:id="2"/>
             <w:r>
               <w:rPr>
                 <w:b/>
@@ -1143,18 +1215,6 @@
                 <w:highlight w:val="yellow"/>
               </w:rPr>
               <w:t>Test</w:t>
-            </w:r>
-            <w:commentRangeEnd w:id="0"/>
-            <w:r>
-              <w:rPr>
-                <w:rStyle w:val="CommentReference"/>
-                <w:b/>
-                <w:bCs/>
-                <w:sz w:val="24"/>
-                <w:szCs w:val="24"/>
-                <w:highlight w:val="yellow"/>
-              </w:rPr>
-              <w:commentReference w:id="0"/>
             </w:r>
             <w:commentRangeEnd w:id="1"/>
             <w:r>
@@ -1168,6 +1228,18 @@
               </w:rPr>
               <w:commentReference w:id="1"/>
             </w:r>
+            <w:commentRangeEnd w:id="2"/>
+            <w:r>
+              <w:rPr>
+                <w:rStyle w:val="CommentReference"/>
+                <w:b/>
+                <w:bCs/>
+                <w:sz w:val="24"/>
+                <w:szCs w:val="24"/>
+                <w:highlight w:val="yellow"/>
+              </w:rPr>
+              <w:commentReference w:id="2"/>
+            </w:r>
             <w:r>
               <w:rPr>
                 <w:b/>
@@ -1440,7 +1512,11 @@
               <w:t xml:space="preserve">down </w:t>
             </w:r>
             <w:r>
-              <w:t>oral prep by 1000 users</w:t>
+              <w:t xml:space="preserve">oral </w:t>
+            </w:r>
+            <w:r>
+              <w:lastRenderedPageBreak/>
+              <w:t>prep by 1000 users</w:t>
             </w:r>
           </w:p>
         </w:tc>
@@ -1453,6 +1529,7 @@
               <w:spacing w:after="160"/>
             </w:pPr>
             <w:r>
+              <w:lastRenderedPageBreak/>
               <w:t>Infections averted =-1000*incidence*prep_oral_efficacy + 500*incidence*prep_len_efficacy</w:t>
             </w:r>
           </w:p>
@@ -1481,7 +1558,7 @@
             <w:pPr>
               <w:spacing w:after="160"/>
             </w:pPr>
-            <w:commentRangeStart w:id="2"/>
+            <w:commentRangeStart w:id="3"/>
             <w:r>
               <w:t>6.</w:t>
             </w:r>
@@ -1495,21 +1572,12 @@
             <w:pPr>
               <w:spacing w:after="160"/>
             </w:pPr>
-            <w:commentRangeStart w:id="3"/>
+            <w:commentRangeStart w:id="4"/>
             <w:r>
               <w:t xml:space="preserve">Infections averted when 100% of eligible pop is </w:t>
             </w:r>
             <w:r>
               <w:t>on prep is equal to when 150% is on</w:t>
-            </w:r>
-            <w:commentRangeEnd w:id="2"/>
-            <w:r>
-              <w:rPr>
-                <w:rStyle w:val="CommentReference"/>
-                <w:sz w:val="24"/>
-                <w:szCs w:val="24"/>
-              </w:rPr>
-              <w:commentReference w:id="2"/>
             </w:r>
             <w:commentRangeEnd w:id="3"/>
             <w:r>
@@ -1520,6 +1588,15 @@
               </w:rPr>
               <w:commentReference w:id="3"/>
             </w:r>
+            <w:commentRangeEnd w:id="4"/>
+            <w:r>
+              <w:rPr>
+                <w:rStyle w:val="CommentReference"/>
+                <w:sz w:val="24"/>
+                <w:szCs w:val="24"/>
+              </w:rPr>
+              <w:commentReference w:id="4"/>
+            </w:r>
           </w:p>
         </w:tc>
         <w:tc>
@@ -1588,11 +1665,7 @@
               <w:spacing w:after="160"/>
             </w:pPr>
             <w:r>
-              <w:t xml:space="preserve">Cannot put prep inputs more than </w:t>
-            </w:r>
-            <w:r>
-              <w:lastRenderedPageBreak/>
-              <w:t>eligible populations</w:t>
+              <w:t>Cannot put prep inputs more than eligible populations</w:t>
             </w:r>
             <w:r>
               <w:t xml:space="preserve"> – both?</w:t>
@@ -1607,6 +1680,287 @@
             <w:pPr>
               <w:spacing w:after="160"/>
             </w:pPr>
+          </w:p>
+        </w:tc>
+      </w:tr>
+    </w:tbl>
+    <w:p/>
+    <w:p/>
+    <w:p>
+      <w:pPr>
+        <w:pStyle w:val="Heading4"/>
+      </w:pPr>
+      <w:commentRangeStart w:id="5"/>
+      <w:r>
+        <w:t>VMMC</w:t>
+      </w:r>
+      <w:commentRangeEnd w:id="5"/>
+      <w:r>
+        <w:rPr>
+          <w:rStyle w:val="CommentReference"/>
+          <w:sz w:val="24"/>
+          <w:szCs w:val="24"/>
+        </w:rPr>
+        <w:commentReference w:id="5"/>
+      </w:r>
+    </w:p>
+    <w:p>
+      <w:r>
+        <w:t>Following intervention values assumed:</w:t>
+      </w:r>
+      <w:r>
+        <w:t xml:space="preserve"> vmmc efficacy=60%</w:t>
+      </w:r>
+    </w:p>
+    <w:p/>
+    <w:tbl>
+      <w:tblPr>
+        <w:tblStyle w:val="TableGrid"/>
+        <w:tblW w:w="0" w:type="auto"/>
+        <w:tblLook w:val="04A0" w:firstRow="1" w:lastRow="0" w:firstColumn="1" w:lastColumn="0" w:noHBand="0" w:noVBand="1"/>
+      </w:tblPr>
+      <w:tblGrid>
+        <w:gridCol w:w="549"/>
+        <w:gridCol w:w="2140"/>
+        <w:gridCol w:w="6462"/>
+      </w:tblGrid>
+      <w:tr>
+        <w:trPr>
+          <w:trHeight w:val="457"/>
+        </w:trPr>
+        <w:tc>
+          <w:tcPr>
+            <w:tcW w:w="549" w:type="dxa"/>
+          </w:tcPr>
+          <w:p>
+            <w:pPr>
+              <w:spacing w:after="160"/>
+              <w:rPr>
+                <w:b/>
+                <w:bCs/>
+              </w:rPr>
+            </w:pPr>
+            <w:r>
+              <w:rPr>
+                <w:b/>
+                <w:bCs/>
+              </w:rPr>
+              <w:t>#</w:t>
+            </w:r>
+          </w:p>
+        </w:tc>
+        <w:tc>
+          <w:tcPr>
+            <w:tcW w:w="2140" w:type="dxa"/>
+          </w:tcPr>
+          <w:p>
+            <w:pPr>
+              <w:spacing w:after="160"/>
+              <w:rPr>
+                <w:b/>
+                <w:bCs/>
+              </w:rPr>
+            </w:pPr>
+            <w:r>
+              <w:rPr>
+                <w:b/>
+                <w:bCs/>
+              </w:rPr>
+              <w:t>Description</w:t>
+            </w:r>
+          </w:p>
+        </w:tc>
+        <w:tc>
+          <w:tcPr>
+            <w:tcW w:w="6462" w:type="dxa"/>
+          </w:tcPr>
+          <w:p>
+            <w:pPr>
+              <w:spacing w:after="160"/>
+              <w:rPr>
+                <w:b/>
+                <w:bCs/>
+              </w:rPr>
+            </w:pPr>
+            <w:r>
+              <w:rPr>
+                <w:b/>
+                <w:bCs/>
+                <w:highlight w:val="yellow"/>
+              </w:rPr>
+              <w:t>Test Calculation/expectation</w:t>
+            </w:r>
+          </w:p>
+        </w:tc>
+      </w:tr>
+      <w:tr>
+        <w:trPr>
+          <w:trHeight w:val="457"/>
+        </w:trPr>
+        <w:tc>
+          <w:tcPr>
+            <w:tcW w:w="549" w:type="dxa"/>
+          </w:tcPr>
+          <w:p>
+            <w:pPr>
+              <w:spacing w:after="160"/>
+            </w:pPr>
+            <w:r>
+              <w:t>1.</w:t>
+            </w:r>
+          </w:p>
+        </w:tc>
+        <w:tc>
+          <w:tcPr>
+            <w:tcW w:w="2140" w:type="dxa"/>
+          </w:tcPr>
+          <w:p>
+            <w:pPr>
+              <w:spacing w:after="160"/>
+            </w:pPr>
+            <w:r>
+              <w:t>Increase VMMC by 1000 people</w:t>
+            </w:r>
+          </w:p>
+        </w:tc>
+        <w:tc>
+          <w:tcPr>
+            <w:tcW w:w="6462" w:type="dxa"/>
+          </w:tcPr>
+          <w:p>
+            <w:pPr>
+              <w:spacing w:after="160"/>
+            </w:pPr>
+            <w:r>
+              <w:t>Infections_averted = 1000*incidence*</w:t>
+            </w:r>
+            <w:r>
+              <w:t>vmmc</w:t>
+            </w:r>
+            <w:r>
+              <w:t>_efficacy</w:t>
+            </w:r>
+          </w:p>
+          <w:p>
+            <w:pPr>
+              <w:spacing w:after="160"/>
+            </w:pPr>
+            <w:r>
+              <w:t>Infections_averted=</w:t>
+            </w:r>
+            <w:r>
+              <w:t>3</w:t>
+            </w:r>
+          </w:p>
+        </w:tc>
+      </w:tr>
+      <w:tr>
+        <w:trPr>
+          <w:trHeight w:val="457"/>
+        </w:trPr>
+        <w:tc>
+          <w:tcPr>
+            <w:tcW w:w="549" w:type="dxa"/>
+          </w:tcPr>
+          <w:p>
+            <w:pPr>
+              <w:spacing w:after="160"/>
+            </w:pPr>
+            <w:r>
+              <w:t>2.</w:t>
+            </w:r>
+          </w:p>
+        </w:tc>
+        <w:tc>
+          <w:tcPr>
+            <w:tcW w:w="2140" w:type="dxa"/>
+          </w:tcPr>
+          <w:p>
+            <w:pPr>
+              <w:spacing w:after="160"/>
+            </w:pPr>
+            <w:r>
+              <w:t xml:space="preserve">Scale down </w:t>
+            </w:r>
+            <w:r>
+              <w:t>VMMC</w:t>
+            </w:r>
+            <w:r>
+              <w:t xml:space="preserve"> Prep users by 1000</w:t>
+            </w:r>
+          </w:p>
+        </w:tc>
+        <w:tc>
+          <w:tcPr>
+            <w:tcW w:w="6462" w:type="dxa"/>
+          </w:tcPr>
+          <w:p>
+            <w:pPr>
+              <w:spacing w:after="160"/>
+            </w:pPr>
+            <w:r>
+              <w:t>Infections_averted = -1000*incidence*prep_oral_efficacy</w:t>
+            </w:r>
+          </w:p>
+          <w:p>
+            <w:pPr>
+              <w:spacing w:after="160"/>
+            </w:pPr>
+            <w:r>
+              <w:t>Infections_averted= -4.2</w:t>
+            </w:r>
+          </w:p>
+        </w:tc>
+      </w:tr>
+      <w:tr>
+        <w:trPr>
+          <w:trHeight w:val="457"/>
+        </w:trPr>
+        <w:tc>
+          <w:tcPr>
+            <w:tcW w:w="549" w:type="dxa"/>
+          </w:tcPr>
+          <w:p>
+            <w:pPr>
+              <w:spacing w:after="160"/>
+            </w:pPr>
+            <w:r>
+              <w:t>3.</w:t>
+            </w:r>
+          </w:p>
+        </w:tc>
+        <w:tc>
+          <w:tcPr>
+            <w:tcW w:w="2140" w:type="dxa"/>
+          </w:tcPr>
+          <w:p>
+            <w:pPr>
+              <w:spacing w:after="160"/>
+            </w:pPr>
+            <w:r>
+              <w:t>Scale up len prep users by 1000</w:t>
+            </w:r>
+          </w:p>
+        </w:tc>
+        <w:tc>
+          <w:tcPr>
+            <w:tcW w:w="6462" w:type="dxa"/>
+          </w:tcPr>
+          <w:p>
+            <w:pPr>
+              <w:spacing w:after="160"/>
+            </w:pPr>
+            <w:r>
+              <w:t>Infections_averted = 1000*incidence*prep_len_efficacy</w:t>
+            </w:r>
+          </w:p>
+          <w:p>
+            <w:pPr>
+              <w:spacing w:after="160"/>
+            </w:pPr>
+            <w:r>
+              <w:t>Infections_averted=5</w:t>
+            </w:r>
           </w:p>
         </w:tc>
       </w:tr>
@@ -1624,7 +1978,24 @@
 
 <file path=word/comments.xml><?xml version="1.0" encoding="utf-8"?>
 <w:comments xmlns:wpc="http://schemas.microsoft.com/office/word/2010/wordprocessingCanvas" xmlns:cx="http://schemas.microsoft.com/office/drawing/2014/chartex" xmlns:cx1="http://schemas.microsoft.com/office/drawing/2015/9/8/chartex" xmlns:cx2="http://schemas.microsoft.com/office/drawing/2015/10/21/chartex" xmlns:cx3="http://schemas.microsoft.com/office/drawing/2016/5/9/chartex" xmlns:cx4="http://schemas.microsoft.com/office/drawing/2016/5/10/chartex" xmlns:cx5="http://schemas.microsoft.com/office/drawing/2016/5/11/chartex" xmlns:cx6="http://schemas.microsoft.com/office/drawing/2016/5/12/chartex" xmlns:cx7="http://schemas.microsoft.com/office/drawing/2016/5/13/chartex" xmlns:cx8="http://schemas.microsoft.com/office/drawing/2016/5/14/chartex" xmlns:mc="http://schemas.openxmlformats.org/markup-compatibility/2006" xmlns:aink="http://schemas.microsoft.com/office/drawing/2016/ink" xmlns:am3d="http://schemas.microsoft.com/office/drawing/2017/model3d" xmlns:o="urn:schemas-microsoft-com:office:office" xmlns:oel="http://schemas.microsoft.com/office/2019/extlst" xmlns:r="http://schemas.openxmlformats.org/officeDocument/2006/relationships" xmlns:m="http://schemas.openxmlformats.org/officeDocument/2006/math" xmlns:v="urn:schemas-microsoft-com:vml" xmlns:wp14="http://schemas.microsoft.com/office/word/2010/wordprocessingDrawing" xmlns:wp="http://schemas.openxmlformats.org/drawingml/2006/wordprocessingDrawing" xmlns:w10="urn:schemas-microsoft-com:office:word" xmlns:w="http://schemas.openxmlformats.org/wordprocessingml/2006/main" xmlns:w14="http://schemas.microsoft.com/office/word/2010/wordml" xmlns:w15="http://schemas.microsoft.com/office/word/2012/wordml" xmlns:w16cex="http://schemas.microsoft.com/office/word/2018/wordml/cex" xmlns:w16cid="http://schemas.microsoft.com/office/word/2016/wordml/cid" xmlns:w16="http://schemas.microsoft.com/office/word/2018/wordml" xmlns:w16du="http://schemas.microsoft.com/office/word/2023/wordml/word16du" xmlns:w16sdtdh="http://schemas.microsoft.com/office/word/2020/wordml/sdtdatahash" xmlns:w16sdtfl="http://schemas.microsoft.com/office/word/2024/wordml/sdtformatlock" xmlns:w16se="http://schemas.microsoft.com/office/word/2015/wordml/symex" xmlns:wpg="http://schemas.microsoft.com/office/word/2010/wordprocessingGroup" xmlns:wpi="http://schemas.microsoft.com/office/word/2010/wordprocessingInk" xmlns:wne="http://schemas.microsoft.com/office/word/2006/wordml" xmlns:wps="http://schemas.microsoft.com/office/word/2010/wordprocessingShape" mc:Ignorable="w14 w15 w16se w16cid w16 w16cex w16sdtdh w16sdtfl w16du wp14">
-  <w:comment w:id="0" w:author="Alex de Nooy" w:date="2026-01-26T16:26:00Z" w:initials="Ad">
+  <w:comment w:id="0" w:author="Alex de Nooy" w:date="2026-01-27T10:30:00Z" w:initials="Ad">
+    <w:p>
+      <w:r>
+        <w:rPr>
+          <w:rStyle w:val="CommentReference"/>
+        </w:rPr>
+        <w:annotationRef/>
+      </w:r>
+      <w:r>
+        <w:rPr>
+          <w:sz w:val="20"/>
+          <w:szCs w:val="20"/>
+        </w:rPr>
+        <w:t>How to handle combined - e.g if you had people circumcised and using prep - or can we ignore for now?</w:t>
+      </w:r>
+    </w:p>
+  </w:comment>
+  <w:comment w:id="1" w:author="Alex de Nooy" w:date="2026-01-26T16:26:00Z" w:initials="Ad">
     <w:p>
       <w:r>
         <w:rPr>
@@ -1641,7 +2012,7 @@
       </w:r>
     </w:p>
   </w:comment>
-  <w:comment w:id="1" w:author="Alex de Nooy" w:date="2026-01-26T16:27:00Z" w:initials="Ad">
+  <w:comment w:id="2" w:author="Alex de Nooy" w:date="2026-01-26T16:27:00Z" w:initials="Ad">
     <w:p>
       <w:r>
         <w:rPr>
@@ -1658,7 +2029,7 @@
       </w:r>
     </w:p>
   </w:comment>
-  <w:comment w:id="2" w:author="Alex de Nooy" w:date="2026-01-27T09:18:00Z" w:initials="Ad">
+  <w:comment w:id="3" w:author="Alex de Nooy" w:date="2026-01-27T09:18:00Z" w:initials="Ad">
     <w:p>
       <w:r>
         <w:rPr>
@@ -1675,7 +2046,7 @@
       </w:r>
     </w:p>
   </w:comment>
-  <w:comment w:id="3" w:author="Alex de Nooy" w:date="2026-01-27T10:08:00Z" w:initials="Ad">
+  <w:comment w:id="4" w:author="Alex de Nooy" w:date="2026-01-27T10:08:00Z" w:initials="Ad">
     <w:p>
       <w:r>
         <w:rPr>
@@ -1689,6 +2060,23 @@
           <w:szCs w:val="20"/>
         </w:rPr>
         <w:t>Is this a valid test? After the eligible population is there no/limited impact?</w:t>
+      </w:r>
+    </w:p>
+  </w:comment>
+  <w:comment w:id="5" w:author="Alex de Nooy" w:date="2026-01-27T10:50:00Z" w:initials="Ad">
+    <w:p>
+      <w:r>
+        <w:rPr>
+          <w:rStyle w:val="CommentReference"/>
+        </w:rPr>
+        <w:annotationRef/>
+      </w:r>
+      <w:r>
+        <w:rPr>
+          <w:sz w:val="20"/>
+          <w:szCs w:val="20"/>
+        </w:rPr>
+        <w:t>is VMMC baseline current number of men ccircumcised or annual new circumcisions</w:t>
       </w:r>
     </w:p>
   </w:comment>
@@ -1697,28 +2085,34 @@
 
 <file path=word/commentsExtended.xml><?xml version="1.0" encoding="utf-8"?>
 <w15:commentsEx xmlns:wpc="http://schemas.microsoft.com/office/word/2010/wordprocessingCanvas" xmlns:cx="http://schemas.microsoft.com/office/drawing/2014/chartex" xmlns:cx1="http://schemas.microsoft.com/office/drawing/2015/9/8/chartex" xmlns:cx2="http://schemas.microsoft.com/office/drawing/2015/10/21/chartex" xmlns:cx3="http://schemas.microsoft.com/office/drawing/2016/5/9/chartex" xmlns:cx4="http://schemas.microsoft.com/office/drawing/2016/5/10/chartex" xmlns:cx5="http://schemas.microsoft.com/office/drawing/2016/5/11/chartex" xmlns:cx6="http://schemas.microsoft.com/office/drawing/2016/5/12/chartex" xmlns:cx7="http://schemas.microsoft.com/office/drawing/2016/5/13/chartex" xmlns:cx8="http://schemas.microsoft.com/office/drawing/2016/5/14/chartex" xmlns:mc="http://schemas.openxmlformats.org/markup-compatibility/2006" xmlns:aink="http://schemas.microsoft.com/office/drawing/2016/ink" xmlns:am3d="http://schemas.microsoft.com/office/drawing/2017/model3d" xmlns:o="urn:schemas-microsoft-com:office:office" xmlns:oel="http://schemas.microsoft.com/office/2019/extlst" xmlns:r="http://schemas.openxmlformats.org/officeDocument/2006/relationships" xmlns:m="http://schemas.openxmlformats.org/officeDocument/2006/math" xmlns:v="urn:schemas-microsoft-com:vml" xmlns:wp14="http://schemas.microsoft.com/office/word/2010/wordprocessingDrawing" xmlns:wp="http://schemas.openxmlformats.org/drawingml/2006/wordprocessingDrawing" xmlns:w10="urn:schemas-microsoft-com:office:word" xmlns:w="http://schemas.openxmlformats.org/wordprocessingml/2006/main" xmlns:w14="http://schemas.microsoft.com/office/word/2010/wordml" xmlns:w15="http://schemas.microsoft.com/office/word/2012/wordml" xmlns:w16cex="http://schemas.microsoft.com/office/word/2018/wordml/cex" xmlns:w16cid="http://schemas.microsoft.com/office/word/2016/wordml/cid" xmlns:w16="http://schemas.microsoft.com/office/word/2018/wordml" xmlns:w16du="http://schemas.microsoft.com/office/word/2023/wordml/word16du" xmlns:w16sdtdh="http://schemas.microsoft.com/office/word/2020/wordml/sdtdatahash" xmlns:w16sdtfl="http://schemas.microsoft.com/office/word/2024/wordml/sdtformatlock" xmlns:w16se="http://schemas.microsoft.com/office/word/2015/wordml/symex" xmlns:wpg="http://schemas.microsoft.com/office/word/2010/wordprocessingGroup" xmlns:wpi="http://schemas.microsoft.com/office/word/2010/wordprocessingInk" xmlns:wne="http://schemas.microsoft.com/office/word/2006/wordml" xmlns:wps="http://schemas.microsoft.com/office/word/2010/wordprocessingShape" mc:Ignorable="w14 w15 w16se w16cid w16 w16cex w16sdtdh w16sdtfl w16du wp14">
+  <w15:commentEx w15:paraId="5DD5C29F" w15:done="0"/>
   <w15:commentEx w15:paraId="6F9C2EF7" w15:done="0"/>
   <w15:commentEx w15:paraId="778F6952" w15:paraIdParent="6F9C2EF7" w15:done="0"/>
   <w15:commentEx w15:paraId="7BC24E07" w15:done="0"/>
   <w15:commentEx w15:paraId="329A5C6B" w15:done="0"/>
+  <w15:commentEx w15:paraId="72D29243" w15:done="0"/>
 </w15:commentsEx>
 </file>
 
 <file path=word/commentsExtensible.xml><?xml version="1.0" encoding="utf-8"?>
 <w16cex:commentsExtensible xmlns:wpc="http://schemas.microsoft.com/office/word/2010/wordprocessingCanvas" xmlns:cx="http://schemas.microsoft.com/office/drawing/2014/chartex" xmlns:cx1="http://schemas.microsoft.com/office/drawing/2015/9/8/chartex" xmlns:cx2="http://schemas.microsoft.com/office/drawing/2015/10/21/chartex" xmlns:cx3="http://schemas.microsoft.com/office/drawing/2016/5/9/chartex" xmlns:cx4="http://schemas.microsoft.com/office/drawing/2016/5/10/chartex" xmlns:cx5="http://schemas.microsoft.com/office/drawing/2016/5/11/chartex" xmlns:cx6="http://schemas.microsoft.com/office/drawing/2016/5/12/chartex" xmlns:cx7="http://schemas.microsoft.com/office/drawing/2016/5/13/chartex" xmlns:cx8="http://schemas.microsoft.com/office/drawing/2016/5/14/chartex" xmlns:cr="http://schemas.microsoft.com/office/comments/2020/reactions" xmlns:mc="http://schemas.openxmlformats.org/markup-compatibility/2006" xmlns:aink="http://schemas.microsoft.com/office/drawing/2016/ink" xmlns:am3d="http://schemas.microsoft.com/office/drawing/2017/model3d" xmlns:o="urn:schemas-microsoft-com:office:office" xmlns:oel="http://schemas.microsoft.com/office/2019/extlst" xmlns:r="http://schemas.openxmlformats.org/officeDocument/2006/relationships" xmlns:m="http://schemas.openxmlformats.org/officeDocument/2006/math" xmlns:v="urn:schemas-microsoft-com:vml" xmlns:wp14="http://schemas.microsoft.com/office/word/2010/wordprocessingDrawing" xmlns:wp="http://schemas.openxmlformats.org/drawingml/2006/wordprocessingDrawing" xmlns:w10="urn:schemas-microsoft-com:office:word" xmlns:w="http://schemas.openxmlformats.org/wordprocessingml/2006/main" xmlns:w14="http://schemas.microsoft.com/office/word/2010/wordml" xmlns:w15="http://schemas.microsoft.com/office/word/2012/wordml" xmlns:w16cex="http://schemas.microsoft.com/office/word/2018/wordml/cex" xmlns:w16cid="http://schemas.microsoft.com/office/word/2016/wordml/cid" xmlns:w16="http://schemas.microsoft.com/office/word/2018/wordml" xmlns:w16du="http://schemas.microsoft.com/office/word/2023/wordml/word16du" xmlns:w16sdtdh="http://schemas.microsoft.com/office/word/2020/wordml/sdtdatahash" xmlns:w16sdtfl="http://schemas.microsoft.com/office/word/2024/wordml/sdtformatlock" xmlns:w16se="http://schemas.microsoft.com/office/word/2015/wordml/symex" xmlns:wpg="http://schemas.microsoft.com/office/word/2010/wordprocessingGroup" xmlns:wpi="http://schemas.microsoft.com/office/word/2010/wordprocessingInk" xmlns:wne="http://schemas.microsoft.com/office/word/2006/wordml" xmlns:wps="http://schemas.microsoft.com/office/word/2010/wordprocessingShape" mc:Ignorable="w14 w15 w16se w16cid w16 w16cex w16sdtdh w16sdtfl cr w16du wp14">
+  <w16cex:commentExtensible w16cex:durableId="19ADAC4E" w16cex:dateUtc="2026-01-27T09:30:00Z"/>
   <w16cex:commentExtensible w16cex:durableId="0CEB61E4" w16cex:dateUtc="2026-01-26T15:26:00Z"/>
   <w16cex:commentExtensible w16cex:durableId="7248C5EB" w16cex:dateUtc="2026-01-26T15:27:00Z"/>
   <w16cex:commentExtensible w16cex:durableId="28052605" w16cex:dateUtc="2026-01-27T08:18:00Z"/>
   <w16cex:commentExtensible w16cex:durableId="7BA2E990" w16cex:dateUtc="2026-01-27T09:08:00Z"/>
+  <w16cex:commentExtensible w16cex:durableId="196B1233" w16cex:dateUtc="2026-01-27T09:50:00Z"/>
 </w16cex:commentsExtensible>
 </file>
 
 <file path=word/commentsIds.xml><?xml version="1.0" encoding="utf-8"?>
 <w16cid:commentsIds xmlns:wpc="http://schemas.microsoft.com/office/word/2010/wordprocessingCanvas" xmlns:cx="http://schemas.microsoft.com/office/drawing/2014/chartex" xmlns:cx1="http://schemas.microsoft.com/office/drawing/2015/9/8/chartex" xmlns:cx2="http://schemas.microsoft.com/office/drawing/2015/10/21/chartex" xmlns:cx3="http://schemas.microsoft.com/office/drawing/2016/5/9/chartex" xmlns:cx4="http://schemas.microsoft.com/office/drawing/2016/5/10/chartex" xmlns:cx5="http://schemas.microsoft.com/office/drawing/2016/5/11/chartex" xmlns:cx6="http://schemas.microsoft.com/office/drawing/2016/5/12/chartex" xmlns:cx7="http://schemas.microsoft.com/office/drawing/2016/5/13/chartex" xmlns:cx8="http://schemas.microsoft.com/office/drawing/2016/5/14/chartex" xmlns:mc="http://schemas.openxmlformats.org/markup-compatibility/2006" xmlns:aink="http://schemas.microsoft.com/office/drawing/2016/ink" xmlns:am3d="http://schemas.microsoft.com/office/drawing/2017/model3d" xmlns:o="urn:schemas-microsoft-com:office:office" xmlns:oel="http://schemas.microsoft.com/office/2019/extlst" xmlns:r="http://schemas.openxmlformats.org/officeDocument/2006/relationships" xmlns:m="http://schemas.openxmlformats.org/officeDocument/2006/math" xmlns:v="urn:schemas-microsoft-com:vml" xmlns:wp14="http://schemas.microsoft.com/office/word/2010/wordprocessingDrawing" xmlns:wp="http://schemas.openxmlformats.org/drawingml/2006/wordprocessingDrawing" xmlns:w10="urn:schemas-microsoft-com:office:word" xmlns:w="http://schemas.openxmlformats.org/wordprocessingml/2006/main" xmlns:w14="http://schemas.microsoft.com/office/word/2010/wordml" xmlns:w15="http://schemas.microsoft.com/office/word/2012/wordml" xmlns:w16cex="http://schemas.microsoft.com/office/word/2018/wordml/cex" xmlns:w16cid="http://schemas.microsoft.com/office/word/2016/wordml/cid" xmlns:w16="http://schemas.microsoft.com/office/word/2018/wordml" xmlns:w16du="http://schemas.microsoft.com/office/word/2023/wordml/word16du" xmlns:w16sdtdh="http://schemas.microsoft.com/office/word/2020/wordml/sdtdatahash" xmlns:w16sdtfl="http://schemas.microsoft.com/office/word/2024/wordml/sdtformatlock" xmlns:w16se="http://schemas.microsoft.com/office/word/2015/wordml/symex" xmlns:wpg="http://schemas.microsoft.com/office/word/2010/wordprocessingGroup" xmlns:wpi="http://schemas.microsoft.com/office/word/2010/wordprocessingInk" xmlns:wne="http://schemas.microsoft.com/office/word/2006/wordml" xmlns:wps="http://schemas.microsoft.com/office/word/2010/wordprocessingShape" mc:Ignorable="w14 w15 w16se w16cid w16 w16cex w16sdtdh w16sdtfl w16du wp14">
+  <w16cid:commentId w16cid:paraId="5DD5C29F" w16cid:durableId="19ADAC4E"/>
   <w16cid:commentId w16cid:paraId="6F9C2EF7" w16cid:durableId="0CEB61E4"/>
   <w16cid:commentId w16cid:paraId="778F6952" w16cid:durableId="7248C5EB"/>
   <w16cid:commentId w16cid:paraId="7BC24E07" w16cid:durableId="28052605"/>
   <w16cid:commentId w16cid:paraId="329A5C6B" w16cid:durableId="7BA2E990"/>
+  <w16cid:commentId w16cid:paraId="72D29243" w16cid:durableId="196B1233"/>
 </w16cid:commentsIds>
 </file>
 
@@ -2709,7 +3103,6 @@
   <w:style w:type="paragraph" w:styleId="Heading4">
     <w:name w:val="heading 4"/>
     <w:uiPriority w:val="9"/>
-    <w:semiHidden/>
     <w:unhideWhenUsed/>
     <w:qFormat/>
     <w:pPr>

</xml_diff>

<commit_message>
Scale down VMMC test
</commit_message>
<xml_diff>
--- a/resources/Test_Framework_Description.docx
+++ b/resources/Test_Framework_Description.docx
@@ -1683,6 +1683,47 @@
           </w:p>
         </w:tc>
       </w:tr>
+      <w:tr>
+        <w:trPr>
+          <w:trHeight w:val="457"/>
+        </w:trPr>
+        <w:tc>
+          <w:tcPr>
+            <w:tcW w:w="549" w:type="dxa"/>
+          </w:tcPr>
+          <w:p>
+            <w:pPr>
+              <w:spacing w:after="160"/>
+            </w:pPr>
+            <w:r>
+              <w:t>8.</w:t>
+            </w:r>
+          </w:p>
+        </w:tc>
+        <w:tc>
+          <w:tcPr>
+            <w:tcW w:w="2140" w:type="dxa"/>
+          </w:tcPr>
+          <w:p>
+            <w:pPr>
+              <w:spacing w:after="160"/>
+            </w:pPr>
+            <w:r>
+              <w:t>Costs</w:t>
+            </w:r>
+          </w:p>
+        </w:tc>
+        <w:tc>
+          <w:tcPr>
+            <w:tcW w:w="6462" w:type="dxa"/>
+          </w:tcPr>
+          <w:p>
+            <w:pPr>
+              <w:spacing w:after="160"/>
+            </w:pPr>
+          </w:p>
+        </w:tc>
+      </w:tr>
     </w:tbl>
     <w:p/>
     <w:p/>
@@ -1690,18 +1731,8 @@
       <w:pPr>
         <w:pStyle w:val="Heading4"/>
       </w:pPr>
-      <w:commentRangeStart w:id="5"/>
       <w:r>
         <w:t>VMMC</w:t>
-      </w:r>
-      <w:commentRangeEnd w:id="5"/>
-      <w:r>
-        <w:rPr>
-          <w:rStyle w:val="CommentReference"/>
-          <w:sz w:val="24"/>
-          <w:szCs w:val="24"/>
-        </w:rPr>
-        <w:commentReference w:id="5"/>
       </w:r>
     </w:p>
     <w:p>
@@ -1886,7 +1917,7 @@
               <w:t>VMMC</w:t>
             </w:r>
             <w:r>
-              <w:t xml:space="preserve"> Prep users by 1000</w:t>
+              <w:t xml:space="preserve"> by 1000</w:t>
             </w:r>
           </w:p>
         </w:tc>
@@ -1899,15 +1930,13 @@
               <w:spacing w:after="160"/>
             </w:pPr>
             <w:r>
-              <w:t>Infections_averted = -1000*incidence*prep_oral_efficacy</w:t>
-            </w:r>
-          </w:p>
-          <w:p>
-            <w:pPr>
-              <w:spacing w:after="160"/>
-            </w:pPr>
-            <w:r>
-              <w:t>Infections_averted= -4.2</w:t>
+              <w:t>Infections_averted = -1000*incidence*</w:t>
+            </w:r>
+            <w:r>
+              <w:t xml:space="preserve"> </w:t>
+            </w:r>
+            <w:r>
+              <w:t>vmmc_efficacy</w:t>
             </w:r>
           </w:p>
         </w:tc>
@@ -1925,6 +1954,362 @@
               <w:spacing w:after="160"/>
             </w:pPr>
             <w:r>
+              <w:t>3</w:t>
+            </w:r>
+          </w:p>
+        </w:tc>
+        <w:tc>
+          <w:tcPr>
+            <w:tcW w:w="2140" w:type="dxa"/>
+          </w:tcPr>
+          <w:p>
+            <w:pPr>
+              <w:spacing w:after="160"/>
+            </w:pPr>
+            <w:r>
+              <w:t>VMMC cannot exceed eligible pop</w:t>
+            </w:r>
+          </w:p>
+        </w:tc>
+        <w:tc>
+          <w:tcPr>
+            <w:tcW w:w="6462" w:type="dxa"/>
+          </w:tcPr>
+          <w:p>
+            <w:pPr>
+              <w:spacing w:after="160"/>
+            </w:pPr>
+            <w:r>
+              <w:t xml:space="preserve">Set </w:t>
+            </w:r>
+            <w:r>
+              <w:t>uncircumcised_males</w:t>
+            </w:r>
+            <w:r>
+              <w:t xml:space="preserve"> </w:t>
+            </w:r>
+            <w:r>
+              <w:t>= 10</w:t>
+            </w:r>
+            <w:r>
+              <w:t>0</w:t>
+            </w:r>
+            <w:r>
+              <w:t>,000 people</w:t>
+            </w:r>
+          </w:p>
+          <w:p>
+            <w:pPr>
+              <w:spacing w:after="160"/>
+            </w:pPr>
+            <w:r>
+              <w:t>Infections averted 1</w:t>
+            </w:r>
+            <w:r>
+              <w:t>50</w:t>
+            </w:r>
+            <w:r>
+              <w:t xml:space="preserve">,000 </w:t>
+            </w:r>
+            <w:r>
+              <w:t>–</w:t>
+            </w:r>
+            <w:r>
+              <w:t xml:space="preserve"> Infections</w:t>
+            </w:r>
+            <w:r>
+              <w:t xml:space="preserve"> averted 100,000 =0</w:t>
+            </w:r>
+          </w:p>
+        </w:tc>
+      </w:tr>
+      <w:tr>
+        <w:trPr>
+          <w:trHeight w:val="457"/>
+        </w:trPr>
+        <w:tc>
+          <w:tcPr>
+            <w:tcW w:w="549" w:type="dxa"/>
+          </w:tcPr>
+          <w:p>
+            <w:pPr>
+              <w:spacing w:after="160"/>
+            </w:pPr>
+            <w:r>
+              <w:t>4</w:t>
+            </w:r>
+            <w:r>
+              <w:t>.</w:t>
+            </w:r>
+          </w:p>
+        </w:tc>
+        <w:tc>
+          <w:tcPr>
+            <w:tcW w:w="2140" w:type="dxa"/>
+          </w:tcPr>
+          <w:p>
+            <w:pPr>
+              <w:spacing w:after="160"/>
+            </w:pPr>
+            <w:r>
+              <w:t>Costs</w:t>
+            </w:r>
+          </w:p>
+        </w:tc>
+        <w:tc>
+          <w:tcPr>
+            <w:tcW w:w="6462" w:type="dxa"/>
+          </w:tcPr>
+          <w:p>
+            <w:pPr>
+              <w:spacing w:after="160"/>
+            </w:pPr>
+          </w:p>
+        </w:tc>
+      </w:tr>
+    </w:tbl>
+    <w:p/>
+    <w:p/>
+    <w:p>
+      <w:pPr>
+        <w:pStyle w:val="Heading4"/>
+      </w:pPr>
+      <w:r>
+        <w:t xml:space="preserve">PEP </w:t>
+      </w:r>
+    </w:p>
+    <w:p>
+      <w:r>
+        <w:t xml:space="preserve">Following intervention values assumed: </w:t>
+      </w:r>
+      <w:r>
+        <w:t>PEP</w:t>
+      </w:r>
+      <w:r>
+        <w:t xml:space="preserve"> efficacy=</w:t>
+      </w:r>
+      <w:r>
+        <w:t>5</w:t>
+      </w:r>
+      <w:r>
+        <w:t>0%</w:t>
+      </w:r>
+    </w:p>
+    <w:p/>
+    <w:tbl>
+      <w:tblPr>
+        <w:tblStyle w:val="TableGrid"/>
+        <w:tblW w:w="0" w:type="auto"/>
+        <w:tblLook w:val="04A0" w:firstRow="1" w:lastRow="0" w:firstColumn="1" w:lastColumn="0" w:noHBand="0" w:noVBand="1"/>
+      </w:tblPr>
+      <w:tblGrid>
+        <w:gridCol w:w="549"/>
+        <w:gridCol w:w="2140"/>
+        <w:gridCol w:w="6462"/>
+      </w:tblGrid>
+      <w:tr>
+        <w:trPr>
+          <w:trHeight w:val="457"/>
+        </w:trPr>
+        <w:tc>
+          <w:tcPr>
+            <w:tcW w:w="549" w:type="dxa"/>
+          </w:tcPr>
+          <w:p>
+            <w:pPr>
+              <w:spacing w:after="160"/>
+              <w:rPr>
+                <w:b/>
+                <w:bCs/>
+              </w:rPr>
+            </w:pPr>
+            <w:r>
+              <w:rPr>
+                <w:b/>
+                <w:bCs/>
+              </w:rPr>
+              <w:t>#</w:t>
+            </w:r>
+          </w:p>
+        </w:tc>
+        <w:tc>
+          <w:tcPr>
+            <w:tcW w:w="2140" w:type="dxa"/>
+          </w:tcPr>
+          <w:p>
+            <w:pPr>
+              <w:spacing w:after="160"/>
+              <w:rPr>
+                <w:b/>
+                <w:bCs/>
+              </w:rPr>
+            </w:pPr>
+            <w:r>
+              <w:rPr>
+                <w:b/>
+                <w:bCs/>
+              </w:rPr>
+              <w:t>Description</w:t>
+            </w:r>
+          </w:p>
+        </w:tc>
+        <w:tc>
+          <w:tcPr>
+            <w:tcW w:w="6462" w:type="dxa"/>
+          </w:tcPr>
+          <w:p>
+            <w:pPr>
+              <w:spacing w:after="160"/>
+              <w:rPr>
+                <w:b/>
+                <w:bCs/>
+              </w:rPr>
+            </w:pPr>
+            <w:r>
+              <w:rPr>
+                <w:b/>
+                <w:bCs/>
+                <w:highlight w:val="yellow"/>
+              </w:rPr>
+              <w:t>Test Calculation/expectation</w:t>
+            </w:r>
+          </w:p>
+        </w:tc>
+      </w:tr>
+      <w:tr>
+        <w:trPr>
+          <w:trHeight w:val="457"/>
+        </w:trPr>
+        <w:tc>
+          <w:tcPr>
+            <w:tcW w:w="549" w:type="dxa"/>
+          </w:tcPr>
+          <w:p>
+            <w:pPr>
+              <w:spacing w:after="160"/>
+            </w:pPr>
+            <w:r>
+              <w:t>1.</w:t>
+            </w:r>
+          </w:p>
+        </w:tc>
+        <w:tc>
+          <w:tcPr>
+            <w:tcW w:w="2140" w:type="dxa"/>
+          </w:tcPr>
+          <w:p>
+            <w:pPr>
+              <w:spacing w:after="160"/>
+            </w:pPr>
+            <w:r>
+              <w:t xml:space="preserve">Increase </w:t>
+            </w:r>
+            <w:r>
+              <w:t>PEP</w:t>
+            </w:r>
+            <w:r>
+              <w:t xml:space="preserve"> by 1000 people</w:t>
+            </w:r>
+          </w:p>
+        </w:tc>
+        <w:tc>
+          <w:tcPr>
+            <w:tcW w:w="6462" w:type="dxa"/>
+          </w:tcPr>
+          <w:p>
+            <w:pPr>
+              <w:spacing w:after="160"/>
+            </w:pPr>
+            <w:r>
+              <w:t>Infections_averted = 1000*incidence*</w:t>
+            </w:r>
+            <w:r>
+              <w:t>pep</w:t>
+            </w:r>
+            <w:r>
+              <w:t>_efficacy</w:t>
+            </w:r>
+          </w:p>
+          <w:p>
+            <w:pPr>
+              <w:spacing w:after="160"/>
+            </w:pPr>
+            <w:r>
+              <w:t>Infections_averted=</w:t>
+            </w:r>
+          </w:p>
+        </w:tc>
+      </w:tr>
+      <w:tr>
+        <w:trPr>
+          <w:trHeight w:val="457"/>
+        </w:trPr>
+        <w:tc>
+          <w:tcPr>
+            <w:tcW w:w="549" w:type="dxa"/>
+          </w:tcPr>
+          <w:p>
+            <w:pPr>
+              <w:spacing w:after="160"/>
+            </w:pPr>
+            <w:r>
+              <w:t>2.</w:t>
+            </w:r>
+          </w:p>
+        </w:tc>
+        <w:tc>
+          <w:tcPr>
+            <w:tcW w:w="2140" w:type="dxa"/>
+          </w:tcPr>
+          <w:p>
+            <w:pPr>
+              <w:spacing w:after="160"/>
+            </w:pPr>
+            <w:r>
+              <w:t xml:space="preserve">Scale down </w:t>
+            </w:r>
+            <w:r>
+              <w:t>PEP</w:t>
+            </w:r>
+            <w:r>
+              <w:t xml:space="preserve"> by 1000</w:t>
+            </w:r>
+          </w:p>
+        </w:tc>
+        <w:tc>
+          <w:tcPr>
+            <w:tcW w:w="6462" w:type="dxa"/>
+          </w:tcPr>
+          <w:p>
+            <w:pPr>
+              <w:spacing w:after="160"/>
+            </w:pPr>
+            <w:r>
+              <w:t xml:space="preserve">Infections_averted = -1000*incidence* </w:t>
+            </w:r>
+            <w:r>
+              <w:t>pep</w:t>
+            </w:r>
+            <w:r>
+              <w:t>_efficacy</w:t>
+            </w:r>
+          </w:p>
+        </w:tc>
+      </w:tr>
+      <w:tr>
+        <w:trPr>
+          <w:trHeight w:val="457"/>
+        </w:trPr>
+        <w:tc>
+          <w:tcPr>
+            <w:tcW w:w="549" w:type="dxa"/>
+          </w:tcPr>
+          <w:p>
+            <w:pPr>
+              <w:spacing w:after="160"/>
+            </w:pPr>
+            <w:r>
+              <w:lastRenderedPageBreak/>
               <w:t>3.</w:t>
             </w:r>
           </w:p>
@@ -1938,7 +2323,7 @@
               <w:spacing w:after="160"/>
             </w:pPr>
             <w:r>
-              <w:t>Scale up len prep users by 1000</w:t>
+              <w:t>Costs</w:t>
             </w:r>
           </w:p>
         </w:tc>
@@ -1950,17 +2335,6 @@
             <w:pPr>
               <w:spacing w:after="160"/>
             </w:pPr>
-            <w:r>
-              <w:t>Infections_averted = 1000*incidence*prep_len_efficacy</w:t>
-            </w:r>
-          </w:p>
-          <w:p>
-            <w:pPr>
-              <w:spacing w:after="160"/>
-            </w:pPr>
-            <w:r>
-              <w:t>Infections_averted=5</w:t>
-            </w:r>
           </w:p>
         </w:tc>
       </w:tr>
@@ -2063,23 +2437,6 @@
       </w:r>
     </w:p>
   </w:comment>
-  <w:comment w:id="5" w:author="Alex de Nooy" w:date="2026-01-27T10:50:00Z" w:initials="Ad">
-    <w:p>
-      <w:r>
-        <w:rPr>
-          <w:rStyle w:val="CommentReference"/>
-        </w:rPr>
-        <w:annotationRef/>
-      </w:r>
-      <w:r>
-        <w:rPr>
-          <w:sz w:val="20"/>
-          <w:szCs w:val="20"/>
-        </w:rPr>
-        <w:t>is VMMC baseline current number of men ccircumcised or annual new circumcisions</w:t>
-      </w:r>
-    </w:p>
-  </w:comment>
 </w:comments>
 </file>
 
@@ -2090,7 +2447,6 @@
   <w15:commentEx w15:paraId="778F6952" w15:paraIdParent="6F9C2EF7" w15:done="0"/>
   <w15:commentEx w15:paraId="7BC24E07" w15:done="0"/>
   <w15:commentEx w15:paraId="329A5C6B" w15:done="0"/>
-  <w15:commentEx w15:paraId="72D29243" w15:done="0"/>
 </w15:commentsEx>
 </file>
 
@@ -2101,7 +2457,6 @@
   <w16cex:commentExtensible w16cex:durableId="7248C5EB" w16cex:dateUtc="2026-01-26T15:27:00Z"/>
   <w16cex:commentExtensible w16cex:durableId="28052605" w16cex:dateUtc="2026-01-27T08:18:00Z"/>
   <w16cex:commentExtensible w16cex:durableId="7BA2E990" w16cex:dateUtc="2026-01-27T09:08:00Z"/>
-  <w16cex:commentExtensible w16cex:durableId="196B1233" w16cex:dateUtc="2026-01-27T09:50:00Z"/>
 </w16cex:commentsExtensible>
 </file>
 
@@ -2112,7 +2467,6 @@
   <w16cid:commentId w16cid:paraId="778F6952" w16cid:durableId="7248C5EB"/>
   <w16cid:commentId w16cid:paraId="7BC24E07" w16cid:durableId="28052605"/>
   <w16cid:commentId w16cid:paraId="329A5C6B" w16cid:durableId="7BA2E990"/>
-  <w16cid:commentId w16cid:paraId="72D29243" w16cid:durableId="196B1233"/>
 </w16cid:commentsIds>
 </file>
 

</xml_diff>

<commit_message>
Initial prep costing test
</commit_message>
<xml_diff>
--- a/resources/Test_Framework_Description.docx
+++ b/resources/Test_Framework_Description.docx
@@ -1979,47 +1979,6 @@
             <w:pPr>
               <w:spacing w:after="160"/>
             </w:pPr>
-            <w:r>
-              <w:t xml:space="preserve">Set </w:t>
-            </w:r>
-            <w:r>
-              <w:t>uncircumcised_males</w:t>
-            </w:r>
-            <w:r>
-              <w:t xml:space="preserve"> </w:t>
-            </w:r>
-            <w:r>
-              <w:t>= 10</w:t>
-            </w:r>
-            <w:r>
-              <w:t>0</w:t>
-            </w:r>
-            <w:r>
-              <w:t>,000 people</w:t>
-            </w:r>
-          </w:p>
-          <w:p>
-            <w:pPr>
-              <w:spacing w:after="160"/>
-            </w:pPr>
-            <w:r>
-              <w:t>Infections averted 1</w:t>
-            </w:r>
-            <w:r>
-              <w:t>50</w:t>
-            </w:r>
-            <w:r>
-              <w:t xml:space="preserve">,000 </w:t>
-            </w:r>
-            <w:r>
-              <w:t>–</w:t>
-            </w:r>
-            <w:r>
-              <w:t xml:space="preserve"> Infections</w:t>
-            </w:r>
-            <w:r>
-              <w:t xml:space="preserve"> averted 100,000 =0</w:t>
-            </w:r>
           </w:p>
         </w:tc>
       </w:tr>
@@ -2093,6 +2052,9 @@
       </w:r>
       <w:r>
         <w:t>0%</w:t>
+      </w:r>
+      <w:r>
+        <w:t>, baseline PEP = 1000 people</w:t>
       </w:r>
     </w:p>
     <w:p/>
@@ -2208,7 +2170,13 @@
               <w:t>PEP</w:t>
             </w:r>
             <w:r>
-              <w:t xml:space="preserve"> by 1000 people</w:t>
+              <w:t xml:space="preserve"> by </w:t>
+            </w:r>
+            <w:r>
+              <w:t>500</w:t>
+            </w:r>
+            <w:r>
+              <w:t xml:space="preserve"> people</w:t>
             </w:r>
           </w:p>
         </w:tc>
@@ -2253,6 +2221,7 @@
               <w:spacing w:after="160"/>
             </w:pPr>
             <w:r>
+              <w:lastRenderedPageBreak/>
               <w:t>2.</w:t>
             </w:r>
           </w:p>
@@ -2309,7 +2278,6 @@
               <w:spacing w:after="160"/>
             </w:pPr>
             <w:r>
-              <w:lastRenderedPageBreak/>
               <w:t>3.</w:t>
             </w:r>
           </w:p>

</xml_diff>

<commit_message>
coverage paramaters cant be more than 100%
</commit_message>
<xml_diff>
--- a/resources/Test_Framework_Description.docx
+++ b/resources/Test_Framework_Description.docx
@@ -1136,6 +1136,9 @@
       <w:r>
         <w:t>Prep</w:t>
       </w:r>
+      <w:r>
+        <w:t>– Adult infections</w:t>
+      </w:r>
     </w:p>
     <w:tbl>
       <w:tblPr>
@@ -1733,6 +1736,9 @@
       </w:pPr>
       <w:r>
         <w:t>VMMC</w:t>
+      </w:r>
+      <w:r>
+        <w:t>– Adult infections</w:t>
       </w:r>
     </w:p>
     <w:p>
@@ -2036,6 +2042,9 @@
       <w:r>
         <w:t xml:space="preserve">PEP </w:t>
       </w:r>
+      <w:r>
+        <w:t>– Adult infections</w:t>
+      </w:r>
     </w:p>
     <w:p>
       <w:r>
@@ -2293,6 +2302,688 @@
             <w:r>
               <w:t>Costs</w:t>
             </w:r>
+          </w:p>
+        </w:tc>
+        <w:tc>
+          <w:tcPr>
+            <w:tcW w:w="6462" w:type="dxa"/>
+          </w:tcPr>
+          <w:p>
+            <w:pPr>
+              <w:spacing w:after="160"/>
+            </w:pPr>
+          </w:p>
+        </w:tc>
+      </w:tr>
+    </w:tbl>
+    <w:p/>
+    <w:p/>
+    <w:p>
+      <w:pPr>
+        <w:pStyle w:val="Heading4"/>
+      </w:pPr>
+      <w:r>
+        <w:t>Condoms</w:t>
+      </w:r>
+      <w:r>
+        <w:t xml:space="preserve"> – Adult infections</w:t>
+      </w:r>
+    </w:p>
+    <w:p>
+      <w:r>
+        <w:t xml:space="preserve">Following intervention values assumed: </w:t>
+      </w:r>
+      <w:r>
+        <w:t>condoms</w:t>
+      </w:r>
+      <w:r>
+        <w:t xml:space="preserve"> efficacy=</w:t>
+      </w:r>
+      <w:r>
+        <w:t>99</w:t>
+      </w:r>
+      <w:r>
+        <w:t xml:space="preserve">%, </w:t>
+      </w:r>
+    </w:p>
+    <w:p/>
+    <w:tbl>
+      <w:tblPr>
+        <w:tblStyle w:val="TableGrid"/>
+        <w:tblW w:w="0" w:type="auto"/>
+        <w:tblLook w:val="04A0" w:firstRow="1" w:lastRow="0" w:firstColumn="1" w:lastColumn="0" w:noHBand="0" w:noVBand="1"/>
+      </w:tblPr>
+      <w:tblGrid>
+        <w:gridCol w:w="549"/>
+        <w:gridCol w:w="2140"/>
+        <w:gridCol w:w="6462"/>
+      </w:tblGrid>
+      <w:tr>
+        <w:trPr>
+          <w:trHeight w:val="457"/>
+        </w:trPr>
+        <w:tc>
+          <w:tcPr>
+            <w:tcW w:w="549" w:type="dxa"/>
+          </w:tcPr>
+          <w:p>
+            <w:pPr>
+              <w:spacing w:after="160"/>
+              <w:rPr>
+                <w:b/>
+                <w:bCs/>
+              </w:rPr>
+            </w:pPr>
+            <w:r>
+              <w:rPr>
+                <w:b/>
+                <w:bCs/>
+              </w:rPr>
+              <w:t>#</w:t>
+            </w:r>
+          </w:p>
+        </w:tc>
+        <w:tc>
+          <w:tcPr>
+            <w:tcW w:w="2140" w:type="dxa"/>
+          </w:tcPr>
+          <w:p>
+            <w:pPr>
+              <w:spacing w:after="160"/>
+              <w:rPr>
+                <w:b/>
+                <w:bCs/>
+              </w:rPr>
+            </w:pPr>
+            <w:r>
+              <w:rPr>
+                <w:b/>
+                <w:bCs/>
+              </w:rPr>
+              <w:t>Description</w:t>
+            </w:r>
+          </w:p>
+        </w:tc>
+        <w:tc>
+          <w:tcPr>
+            <w:tcW w:w="6462" w:type="dxa"/>
+          </w:tcPr>
+          <w:p>
+            <w:pPr>
+              <w:spacing w:after="160"/>
+              <w:rPr>
+                <w:b/>
+                <w:bCs/>
+              </w:rPr>
+            </w:pPr>
+            <w:r>
+              <w:rPr>
+                <w:b/>
+                <w:bCs/>
+                <w:highlight w:val="yellow"/>
+              </w:rPr>
+              <w:t>Test Calculation/expectation</w:t>
+            </w:r>
+          </w:p>
+        </w:tc>
+      </w:tr>
+      <w:tr>
+        <w:trPr>
+          <w:trHeight w:val="457"/>
+        </w:trPr>
+        <w:tc>
+          <w:tcPr>
+            <w:tcW w:w="549" w:type="dxa"/>
+          </w:tcPr>
+          <w:p>
+            <w:pPr>
+              <w:spacing w:after="160"/>
+            </w:pPr>
+            <w:r>
+              <w:t>1.</w:t>
+            </w:r>
+          </w:p>
+        </w:tc>
+        <w:tc>
+          <w:tcPr>
+            <w:tcW w:w="2140" w:type="dxa"/>
+          </w:tcPr>
+          <w:p>
+            <w:pPr>
+              <w:spacing w:after="160"/>
+            </w:pPr>
+          </w:p>
+        </w:tc>
+        <w:tc>
+          <w:tcPr>
+            <w:tcW w:w="6462" w:type="dxa"/>
+          </w:tcPr>
+          <w:p>
+            <w:pPr>
+              <w:spacing w:after="160"/>
+            </w:pPr>
+          </w:p>
+        </w:tc>
+      </w:tr>
+      <w:tr>
+        <w:trPr>
+          <w:trHeight w:val="457"/>
+        </w:trPr>
+        <w:tc>
+          <w:tcPr>
+            <w:tcW w:w="549" w:type="dxa"/>
+          </w:tcPr>
+          <w:p>
+            <w:pPr>
+              <w:spacing w:after="160"/>
+            </w:pPr>
+            <w:r>
+              <w:t>2.</w:t>
+            </w:r>
+          </w:p>
+        </w:tc>
+        <w:tc>
+          <w:tcPr>
+            <w:tcW w:w="2140" w:type="dxa"/>
+          </w:tcPr>
+          <w:p>
+            <w:pPr>
+              <w:spacing w:after="160"/>
+            </w:pPr>
+          </w:p>
+        </w:tc>
+        <w:tc>
+          <w:tcPr>
+            <w:tcW w:w="6462" w:type="dxa"/>
+          </w:tcPr>
+          <w:p>
+            <w:pPr>
+              <w:spacing w:after="160"/>
+            </w:pPr>
+          </w:p>
+        </w:tc>
+      </w:tr>
+      <w:tr>
+        <w:trPr>
+          <w:trHeight w:val="457"/>
+        </w:trPr>
+        <w:tc>
+          <w:tcPr>
+            <w:tcW w:w="549" w:type="dxa"/>
+          </w:tcPr>
+          <w:p>
+            <w:pPr>
+              <w:spacing w:after="160"/>
+            </w:pPr>
+            <w:r>
+              <w:t>3.</w:t>
+            </w:r>
+          </w:p>
+        </w:tc>
+        <w:tc>
+          <w:tcPr>
+            <w:tcW w:w="2140" w:type="dxa"/>
+          </w:tcPr>
+          <w:p>
+            <w:pPr>
+              <w:spacing w:after="160"/>
+            </w:pPr>
+          </w:p>
+        </w:tc>
+        <w:tc>
+          <w:tcPr>
+            <w:tcW w:w="6462" w:type="dxa"/>
+          </w:tcPr>
+          <w:p>
+            <w:pPr>
+              <w:spacing w:after="160"/>
+            </w:pPr>
+          </w:p>
+        </w:tc>
+      </w:tr>
+    </w:tbl>
+    <w:p/>
+    <w:p/>
+    <w:p>
+      <w:pPr>
+        <w:pStyle w:val="Heading4"/>
+      </w:pPr>
+      <w:r>
+        <w:t>Infant prophylaxis – Infant infections</w:t>
+      </w:r>
+    </w:p>
+    <w:p>
+      <w:r>
+        <w:t xml:space="preserve">Following intervention values assumed: condoms efficacy=99%, </w:t>
+      </w:r>
+    </w:p>
+    <w:p/>
+    <w:tbl>
+      <w:tblPr>
+        <w:tblStyle w:val="TableGrid"/>
+        <w:tblW w:w="0" w:type="auto"/>
+        <w:tblLook w:val="04A0" w:firstRow="1" w:lastRow="0" w:firstColumn="1" w:lastColumn="0" w:noHBand="0" w:noVBand="1"/>
+      </w:tblPr>
+      <w:tblGrid>
+        <w:gridCol w:w="549"/>
+        <w:gridCol w:w="2140"/>
+        <w:gridCol w:w="6462"/>
+      </w:tblGrid>
+      <w:tr>
+        <w:trPr>
+          <w:trHeight w:val="457"/>
+        </w:trPr>
+        <w:tc>
+          <w:tcPr>
+            <w:tcW w:w="549" w:type="dxa"/>
+          </w:tcPr>
+          <w:p>
+            <w:pPr>
+              <w:spacing w:after="160"/>
+              <w:rPr>
+                <w:b/>
+                <w:bCs/>
+              </w:rPr>
+            </w:pPr>
+            <w:r>
+              <w:rPr>
+                <w:b/>
+                <w:bCs/>
+              </w:rPr>
+              <w:t>#</w:t>
+            </w:r>
+          </w:p>
+        </w:tc>
+        <w:tc>
+          <w:tcPr>
+            <w:tcW w:w="2140" w:type="dxa"/>
+          </w:tcPr>
+          <w:p>
+            <w:pPr>
+              <w:spacing w:after="160"/>
+              <w:rPr>
+                <w:b/>
+                <w:bCs/>
+              </w:rPr>
+            </w:pPr>
+            <w:r>
+              <w:rPr>
+                <w:b/>
+                <w:bCs/>
+              </w:rPr>
+              <w:t>Description</w:t>
+            </w:r>
+          </w:p>
+        </w:tc>
+        <w:tc>
+          <w:tcPr>
+            <w:tcW w:w="6462" w:type="dxa"/>
+          </w:tcPr>
+          <w:p>
+            <w:pPr>
+              <w:spacing w:after="160"/>
+              <w:rPr>
+                <w:b/>
+                <w:bCs/>
+              </w:rPr>
+            </w:pPr>
+            <w:r>
+              <w:rPr>
+                <w:b/>
+                <w:bCs/>
+                <w:highlight w:val="yellow"/>
+              </w:rPr>
+              <w:t>Test Calculation/expectation</w:t>
+            </w:r>
+          </w:p>
+        </w:tc>
+      </w:tr>
+      <w:tr>
+        <w:trPr>
+          <w:trHeight w:val="457"/>
+        </w:trPr>
+        <w:tc>
+          <w:tcPr>
+            <w:tcW w:w="549" w:type="dxa"/>
+          </w:tcPr>
+          <w:p>
+            <w:pPr>
+              <w:spacing w:after="160"/>
+            </w:pPr>
+            <w:r>
+              <w:t>1.</w:t>
+            </w:r>
+          </w:p>
+        </w:tc>
+        <w:tc>
+          <w:tcPr>
+            <w:tcW w:w="2140" w:type="dxa"/>
+          </w:tcPr>
+          <w:p>
+            <w:pPr>
+              <w:spacing w:after="160"/>
+            </w:pPr>
+          </w:p>
+        </w:tc>
+        <w:tc>
+          <w:tcPr>
+            <w:tcW w:w="6462" w:type="dxa"/>
+          </w:tcPr>
+          <w:p>
+            <w:pPr>
+              <w:spacing w:after="160"/>
+            </w:pPr>
+          </w:p>
+        </w:tc>
+      </w:tr>
+      <w:tr>
+        <w:trPr>
+          <w:trHeight w:val="457"/>
+        </w:trPr>
+        <w:tc>
+          <w:tcPr>
+            <w:tcW w:w="549" w:type="dxa"/>
+          </w:tcPr>
+          <w:p>
+            <w:pPr>
+              <w:spacing w:after="160"/>
+            </w:pPr>
+            <w:r>
+              <w:t>2.</w:t>
+            </w:r>
+          </w:p>
+        </w:tc>
+        <w:tc>
+          <w:tcPr>
+            <w:tcW w:w="2140" w:type="dxa"/>
+          </w:tcPr>
+          <w:p>
+            <w:pPr>
+              <w:spacing w:after="160"/>
+            </w:pPr>
+          </w:p>
+        </w:tc>
+        <w:tc>
+          <w:tcPr>
+            <w:tcW w:w="6462" w:type="dxa"/>
+          </w:tcPr>
+          <w:p>
+            <w:pPr>
+              <w:spacing w:after="160"/>
+            </w:pPr>
+          </w:p>
+        </w:tc>
+      </w:tr>
+      <w:tr>
+        <w:trPr>
+          <w:trHeight w:val="457"/>
+        </w:trPr>
+        <w:tc>
+          <w:tcPr>
+            <w:tcW w:w="549" w:type="dxa"/>
+          </w:tcPr>
+          <w:p>
+            <w:pPr>
+              <w:spacing w:after="160"/>
+            </w:pPr>
+            <w:r>
+              <w:t>3.</w:t>
+            </w:r>
+          </w:p>
+        </w:tc>
+        <w:tc>
+          <w:tcPr>
+            <w:tcW w:w="2140" w:type="dxa"/>
+          </w:tcPr>
+          <w:p>
+            <w:pPr>
+              <w:spacing w:after="160"/>
+            </w:pPr>
+          </w:p>
+        </w:tc>
+        <w:tc>
+          <w:tcPr>
+            <w:tcW w:w="6462" w:type="dxa"/>
+          </w:tcPr>
+          <w:p>
+            <w:pPr>
+              <w:spacing w:after="160"/>
+            </w:pPr>
+          </w:p>
+        </w:tc>
+      </w:tr>
+    </w:tbl>
+    <w:p/>
+    <w:p/>
+    <w:p>
+      <w:pPr>
+        <w:rPr>
+          <w:i/>
+          <w:iCs/>
+          <w:color w:val="2E74B5"/>
+        </w:rPr>
+      </w:pPr>
+      <w:r>
+        <w:rPr>
+          <w:i/>
+          <w:iCs/>
+          <w:color w:val="2E74B5"/>
+        </w:rPr>
+        <w:t>C</w:t>
+      </w:r>
+      <w:r>
+        <w:rPr>
+          <w:i/>
+          <w:iCs/>
+          <w:color w:val="2E74B5"/>
+        </w:rPr>
+        <w:t>otrimoxazole</w:t>
+      </w:r>
+      <w:r>
+        <w:rPr>
+          <w:i/>
+          <w:iCs/>
+          <w:color w:val="2E74B5"/>
+        </w:rPr>
+        <w:t xml:space="preserve"> - Mortality</w:t>
+      </w:r>
+    </w:p>
+    <w:p>
+      <w:r>
+        <w:t xml:space="preserve">Following intervention values assumed: </w:t>
+      </w:r>
+      <w:r>
+        <w:t>cotrimoxazole</w:t>
+      </w:r>
+      <w:r>
+        <w:t xml:space="preserve"> efficacy=99%, </w:t>
+      </w:r>
+    </w:p>
+    <w:p/>
+    <w:tbl>
+      <w:tblPr>
+        <w:tblStyle w:val="TableGrid"/>
+        <w:tblW w:w="0" w:type="auto"/>
+        <w:tblLook w:val="04A0" w:firstRow="1" w:lastRow="0" w:firstColumn="1" w:lastColumn="0" w:noHBand="0" w:noVBand="1"/>
+      </w:tblPr>
+      <w:tblGrid>
+        <w:gridCol w:w="549"/>
+        <w:gridCol w:w="2140"/>
+        <w:gridCol w:w="6462"/>
+      </w:tblGrid>
+      <w:tr>
+        <w:trPr>
+          <w:trHeight w:val="457"/>
+        </w:trPr>
+        <w:tc>
+          <w:tcPr>
+            <w:tcW w:w="549" w:type="dxa"/>
+          </w:tcPr>
+          <w:p>
+            <w:pPr>
+              <w:spacing w:after="160"/>
+              <w:rPr>
+                <w:b/>
+                <w:bCs/>
+              </w:rPr>
+            </w:pPr>
+            <w:r>
+              <w:rPr>
+                <w:b/>
+                <w:bCs/>
+              </w:rPr>
+              <w:t>#</w:t>
+            </w:r>
+          </w:p>
+        </w:tc>
+        <w:tc>
+          <w:tcPr>
+            <w:tcW w:w="2140" w:type="dxa"/>
+          </w:tcPr>
+          <w:p>
+            <w:pPr>
+              <w:spacing w:after="160"/>
+              <w:rPr>
+                <w:b/>
+                <w:bCs/>
+              </w:rPr>
+            </w:pPr>
+            <w:r>
+              <w:rPr>
+                <w:b/>
+                <w:bCs/>
+              </w:rPr>
+              <w:t>Description</w:t>
+            </w:r>
+          </w:p>
+        </w:tc>
+        <w:tc>
+          <w:tcPr>
+            <w:tcW w:w="6462" w:type="dxa"/>
+          </w:tcPr>
+          <w:p>
+            <w:pPr>
+              <w:spacing w:after="160"/>
+              <w:rPr>
+                <w:b/>
+                <w:bCs/>
+              </w:rPr>
+            </w:pPr>
+            <w:r>
+              <w:rPr>
+                <w:b/>
+                <w:bCs/>
+                <w:highlight w:val="yellow"/>
+              </w:rPr>
+              <w:t>Test Calculation/expectation</w:t>
+            </w:r>
+          </w:p>
+        </w:tc>
+      </w:tr>
+      <w:tr>
+        <w:trPr>
+          <w:trHeight w:val="457"/>
+        </w:trPr>
+        <w:tc>
+          <w:tcPr>
+            <w:tcW w:w="549" w:type="dxa"/>
+          </w:tcPr>
+          <w:p>
+            <w:pPr>
+              <w:spacing w:after="160"/>
+            </w:pPr>
+            <w:r>
+              <w:t>1.</w:t>
+            </w:r>
+          </w:p>
+        </w:tc>
+        <w:tc>
+          <w:tcPr>
+            <w:tcW w:w="2140" w:type="dxa"/>
+          </w:tcPr>
+          <w:p>
+            <w:pPr>
+              <w:spacing w:after="160"/>
+            </w:pPr>
+            <w:r>
+              <w:t xml:space="preserve">Increasing coverage of </w:t>
+            </w:r>
+          </w:p>
+        </w:tc>
+        <w:tc>
+          <w:tcPr>
+            <w:tcW w:w="6462" w:type="dxa"/>
+          </w:tcPr>
+          <w:p>
+            <w:pPr>
+              <w:spacing w:after="160"/>
+            </w:pPr>
+          </w:p>
+        </w:tc>
+      </w:tr>
+      <w:tr>
+        <w:trPr>
+          <w:trHeight w:val="457"/>
+        </w:trPr>
+        <w:tc>
+          <w:tcPr>
+            <w:tcW w:w="549" w:type="dxa"/>
+          </w:tcPr>
+          <w:p>
+            <w:pPr>
+              <w:spacing w:after="160"/>
+            </w:pPr>
+            <w:r>
+              <w:t>2.</w:t>
+            </w:r>
+          </w:p>
+        </w:tc>
+        <w:tc>
+          <w:tcPr>
+            <w:tcW w:w="2140" w:type="dxa"/>
+          </w:tcPr>
+          <w:p>
+            <w:pPr>
+              <w:spacing w:after="160"/>
+            </w:pPr>
+          </w:p>
+        </w:tc>
+        <w:tc>
+          <w:tcPr>
+            <w:tcW w:w="6462" w:type="dxa"/>
+          </w:tcPr>
+          <w:p>
+            <w:pPr>
+              <w:spacing w:after="160"/>
+            </w:pPr>
+          </w:p>
+        </w:tc>
+      </w:tr>
+      <w:tr>
+        <w:trPr>
+          <w:trHeight w:val="457"/>
+        </w:trPr>
+        <w:tc>
+          <w:tcPr>
+            <w:tcW w:w="549" w:type="dxa"/>
+          </w:tcPr>
+          <w:p>
+            <w:pPr>
+              <w:spacing w:after="160"/>
+            </w:pPr>
+            <w:r>
+              <w:t>3.</w:t>
+            </w:r>
+          </w:p>
+        </w:tc>
+        <w:tc>
+          <w:tcPr>
+            <w:tcW w:w="2140" w:type="dxa"/>
+          </w:tcPr>
+          <w:p>
+            <w:pPr>
+              <w:spacing w:after="160"/>
+            </w:pPr>
           </w:p>
         </w:tc>
         <w:tc>

</xml_diff>

<commit_message>
Set up testing test framework
</commit_message>
<xml_diff>
--- a/resources/Test_Framework_Description.docx
+++ b/resources/Test_Framework_Description.docx
@@ -25,8 +25,8 @@
         <w:tblLook w:val="04A0" w:firstRow="1" w:lastRow="0" w:firstColumn="1" w:lastColumn="0" w:noHBand="0" w:noVBand="1"/>
       </w:tblPr>
       <w:tblGrid>
-        <w:gridCol w:w="4895"/>
-        <w:gridCol w:w="4895"/>
+        <w:gridCol w:w="4444"/>
+        <w:gridCol w:w="5346"/>
       </w:tblGrid>
       <w:tr>
         <w:trPr>
@@ -93,6 +93,12 @@
             <w:r>
               <w:t>s</w:t>
             </w:r>
+            <w:r>
+              <w:t xml:space="preserve"> (infections </w:t>
+            </w:r>
+            <w:r>
+              <w:t>averted)</w:t>
+            </w:r>
           </w:p>
         </w:tc>
         <w:tc>
@@ -185,6 +191,15 @@
             <w:pPr>
               <w:spacing w:after="120"/>
             </w:pPr>
+            <w:r>
+              <w:t>Prevention interventions (</w:t>
+            </w:r>
+            <w:r>
+              <w:t>deaths</w:t>
+            </w:r>
+            <w:r>
+              <w:t xml:space="preserve"> averted)</w:t>
+            </w:r>
           </w:p>
         </w:tc>
         <w:tc>
@@ -195,6 +210,36 @@
             <w:pPr>
               <w:spacing w:after="120"/>
             </w:pPr>
+            <w:r>
+              <w:t>mortality_rate &lt;- context$aids_deaths_per_year / pops$plhiv</w:t>
+            </w:r>
+          </w:p>
+          <w:p>
+            <w:pPr>
+              <w:spacing w:after="120"/>
+            </w:pPr>
+          </w:p>
+          <w:p>
+            <w:pPr>
+              <w:spacing w:after="120"/>
+            </w:pPr>
+            <w:r>
+              <w:t>number_reached=</w:t>
+            </w:r>
+            <w:r>
+              <w:t>(target-base)*eligible</w:t>
+            </w:r>
+          </w:p>
+          <w:p>
+            <w:pPr>
+              <w:spacing w:after="120"/>
+            </w:pPr>
+            <w:r>
+              <w:t xml:space="preserve">deaths_averted = </w:t>
+            </w:r>
+            <w:r>
+              <w:t>sign * number_reached * mortality_rate * intervention$efficacy</w:t>
+            </w:r>
           </w:p>
         </w:tc>
       </w:tr>
@@ -210,6 +255,21 @@
             <w:pPr>
               <w:spacing w:after="120"/>
             </w:pPr>
+            <w:r>
+              <w:t>Testing</w:t>
+            </w:r>
+            <w:r>
+              <w:t xml:space="preserve"> (new dx</w:t>
+            </w:r>
+            <w:r>
+              <w:t>,</w:t>
+            </w:r>
+            <w:r>
+              <w:t xml:space="preserve"> re engagement</w:t>
+            </w:r>
+            <w:r>
+              <w:t xml:space="preserve"> and ART inititations</w:t>
+            </w:r>
           </w:p>
         </w:tc>
         <w:tc>
@@ -220,6 +280,114 @@
             <w:pPr>
               <w:spacing w:after="120"/>
             </w:pPr>
+            <w:r>
+              <w:t>Base_yield=(undiagnosed+ltfu)</w:t>
+            </w:r>
+            <w:r>
+              <w:t>/sexually_active</w:t>
+            </w:r>
+          </w:p>
+          <w:p>
+            <w:pPr>
+              <w:spacing w:after="120"/>
+            </w:pPr>
+            <w:r>
+              <w:t>(max 10%)</w:t>
+            </w:r>
+          </w:p>
+          <w:p>
+            <w:pPr>
+              <w:spacing w:after="120"/>
+            </w:pPr>
+          </w:p>
+          <w:p>
+            <w:pPr>
+              <w:spacing w:after="120"/>
+            </w:pPr>
+            <w:r>
+              <w:t>number_reached=(target-base)*eligible</w:t>
+            </w:r>
+          </w:p>
+          <w:p>
+            <w:pPr>
+              <w:spacing w:after="120"/>
+            </w:pPr>
+          </w:p>
+          <w:p>
+            <w:pPr>
+              <w:spacing w:after="120"/>
+            </w:pPr>
+            <w:r>
+              <w:t>test_yield=base_yield*yield_multiplier</w:t>
+            </w:r>
+          </w:p>
+          <w:p>
+            <w:pPr>
+              <w:spacing w:after="120"/>
+            </w:pPr>
+            <w:r>
+              <w:t>#pos_tests=number_reached*test_yield*efficacy</w:t>
+            </w:r>
+          </w:p>
+          <w:p>
+            <w:pPr>
+              <w:spacing w:after="120"/>
+            </w:pPr>
+            <w:r>
+              <w:t>New_dx=positive_tests*(1-re_test_prop)</w:t>
+            </w:r>
+          </w:p>
+          <w:p>
+            <w:pPr>
+              <w:spacing w:after="120"/>
+            </w:pPr>
+            <w:r>
+              <w:t>Re_engagement=positive_tests*(re_test_prop</w:t>
+            </w:r>
+          </w:p>
+          <w:p>
+            <w:pPr>
+              <w:spacing w:after="120"/>
+            </w:pPr>
+          </w:p>
+          <w:p>
+            <w:pPr>
+              <w:spacing w:after="120"/>
+            </w:pPr>
+            <w:r>
+              <w:t>T</w:t>
+            </w:r>
+            <w:r>
+              <w:t>est</w:t>
+            </w:r>
+            <w:r>
+              <w:t>s_performed=sign*number_reached</w:t>
+            </w:r>
+          </w:p>
+          <w:p>
+            <w:pPr>
+              <w:spacing w:after="120"/>
+            </w:pPr>
+          </w:p>
+          <w:p>
+            <w:pPr>
+              <w:spacing w:after="120"/>
+            </w:pPr>
+            <w:r>
+              <w:t>Art</w:t>
+            </w:r>
+            <w:r>
+              <w:t>_</w:t>
+            </w:r>
+            <w:r>
+              <w:t>inititations=</w:t>
+            </w:r>
+            <w:r>
+              <w:t>sign*</w:t>
+            </w:r>
+            <w:r>
+              <w:t>positive_tests*linkage_rate</w:t>
+            </w:r>
           </w:p>
         </w:tc>
       </w:tr>
@@ -381,6 +549,7 @@
       <w:pPr>
         <w:pStyle w:val="Heading2"/>
       </w:pPr>
+      <w:commentRangeStart w:id="0"/>
       <w:r>
         <w:t>Test</w:t>
       </w:r>
@@ -390,13 +559,21 @@
       <w:r>
         <w:t>: Population Calculations - Basic Integrity</w:t>
       </w:r>
+      <w:commentRangeEnd w:id="0"/>
+      <w:r>
+        <w:rPr>
+          <w:rStyle w:val="CommentReference"/>
+          <w:sz w:val="28"/>
+          <w:szCs w:val="28"/>
+        </w:rPr>
+        <w:commentReference w:id="0"/>
+      </w:r>
     </w:p>
     <w:p>
       <w:pPr>
         <w:pStyle w:val="Heading3"/>
       </w:pPr>
       <w:r>
-        <w:lastRenderedPageBreak/>
         <w:t>Purpose</w:t>
       </w:r>
     </w:p>
@@ -697,6 +874,7 @@
               <w:spacing w:after="160"/>
             </w:pPr>
             <w:r>
+              <w:lastRenderedPageBreak/>
               <w:t>4.</w:t>
             </w:r>
           </w:p>
@@ -970,7 +1148,6 @@
               <w:spacing w:after="160"/>
             </w:pPr>
             <w:r>
-              <w:lastRenderedPageBreak/>
               <w:t>2.</w:t>
             </w:r>
           </w:p>
@@ -1043,21 +1220,21 @@
       <w:pPr>
         <w:pStyle w:val="Heading2"/>
       </w:pPr>
-      <w:commentRangeStart w:id="0"/>
+      <w:commentRangeStart w:id="1"/>
       <w:r>
         <w:t>Test set: Prevention Interventions</w:t>
       </w:r>
       <w:r>
         <w:t xml:space="preserve"> </w:t>
       </w:r>
-      <w:commentRangeEnd w:id="0"/>
+      <w:commentRangeEnd w:id="1"/>
       <w:r>
         <w:rPr>
           <w:rStyle w:val="CommentReference"/>
           <w:sz w:val="28"/>
           <w:szCs w:val="28"/>
         </w:rPr>
-        <w:commentReference w:id="0"/>
+        <w:commentReference w:id="1"/>
       </w:r>
     </w:p>
     <w:p>
@@ -1209,8 +1386,8 @@
                 <w:bCs/>
               </w:rPr>
             </w:pPr>
-            <w:commentRangeStart w:id="1"/>
             <w:commentRangeStart w:id="2"/>
+            <w:commentRangeStart w:id="3"/>
             <w:r>
               <w:rPr>
                 <w:b/>
@@ -1219,7 +1396,7 @@
               </w:rPr>
               <w:t>Test</w:t>
             </w:r>
-            <w:commentRangeEnd w:id="1"/>
+            <w:commentRangeEnd w:id="2"/>
             <w:r>
               <w:rPr>
                 <w:rStyle w:val="CommentReference"/>
@@ -1229,9 +1406,9 @@
                 <w:szCs w:val="24"/>
                 <w:highlight w:val="yellow"/>
               </w:rPr>
-              <w:commentReference w:id="1"/>
-            </w:r>
-            <w:commentRangeEnd w:id="2"/>
+              <w:commentReference w:id="2"/>
+            </w:r>
+            <w:commentRangeEnd w:id="3"/>
             <w:r>
               <w:rPr>
                 <w:rStyle w:val="CommentReference"/>
@@ -1241,7 +1418,7 @@
                 <w:szCs w:val="24"/>
                 <w:highlight w:val="yellow"/>
               </w:rPr>
-              <w:commentReference w:id="2"/>
+              <w:commentReference w:id="3"/>
             </w:r>
             <w:r>
               <w:rPr>
@@ -1515,11 +1692,7 @@
               <w:t xml:space="preserve">down </w:t>
             </w:r>
             <w:r>
-              <w:t xml:space="preserve">oral </w:t>
-            </w:r>
-            <w:r>
-              <w:lastRenderedPageBreak/>
-              <w:t>prep by 1000 users</w:t>
+              <w:t>oral prep by 1000 users</w:t>
             </w:r>
           </w:p>
         </w:tc>
@@ -1532,7 +1705,6 @@
               <w:spacing w:after="160"/>
             </w:pPr>
             <w:r>
-              <w:lastRenderedPageBreak/>
               <w:t>Infections averted =-1000*incidence*prep_oral_efficacy + 500*incidence*prep_len_efficacy</w:t>
             </w:r>
           </w:p>
@@ -1561,7 +1733,7 @@
             <w:pPr>
               <w:spacing w:after="160"/>
             </w:pPr>
-            <w:commentRangeStart w:id="3"/>
+            <w:commentRangeStart w:id="4"/>
             <w:r>
               <w:t>6.</w:t>
             </w:r>
@@ -1575,30 +1747,30 @@
             <w:pPr>
               <w:spacing w:after="160"/>
             </w:pPr>
-            <w:commentRangeStart w:id="4"/>
+            <w:commentRangeStart w:id="5"/>
             <w:r>
               <w:t xml:space="preserve">Infections averted when 100% of eligible pop is </w:t>
             </w:r>
             <w:r>
               <w:t>on prep is equal to when 150% is on</w:t>
             </w:r>
-            <w:commentRangeEnd w:id="3"/>
+            <w:commentRangeEnd w:id="4"/>
             <w:r>
               <w:rPr>
                 <w:rStyle w:val="CommentReference"/>
                 <w:sz w:val="24"/>
                 <w:szCs w:val="24"/>
               </w:rPr>
-              <w:commentReference w:id="3"/>
-            </w:r>
-            <w:commentRangeEnd w:id="4"/>
+              <w:commentReference w:id="4"/>
+            </w:r>
+            <w:commentRangeEnd w:id="5"/>
             <w:r>
               <w:rPr>
                 <w:rStyle w:val="CommentReference"/>
                 <w:sz w:val="24"/>
                 <w:szCs w:val="24"/>
               </w:rPr>
-              <w:commentReference w:id="4"/>
+              <w:commentReference w:id="5"/>
             </w:r>
           </w:p>
         </w:tc>
@@ -1843,6 +2015,7 @@
               <w:spacing w:after="160"/>
             </w:pPr>
             <w:r>
+              <w:lastRenderedPageBreak/>
               <w:t>1.</w:t>
             </w:r>
           </w:p>
@@ -2230,7 +2403,6 @@
               <w:spacing w:after="160"/>
             </w:pPr>
             <w:r>
-              <w:lastRenderedPageBreak/>
               <w:t>2.</w:t>
             </w:r>
           </w:p>
@@ -2689,6 +2861,7 @@
               <w:spacing w:after="160"/>
             </w:pPr>
             <w:r>
+              <w:lastRenderedPageBreak/>
               <w:t>2.</w:t>
             </w:r>
           </w:p>
@@ -2796,7 +2969,13 @@
         <w:t>cotrimoxazole</w:t>
       </w:r>
       <w:r>
-        <w:t xml:space="preserve"> efficacy=99%, </w:t>
+        <w:t xml:space="preserve"> efficacy=</w:t>
+      </w:r>
+      <w:r>
+        <w:t>10</w:t>
+      </w:r>
+      <w:r>
+        <w:t xml:space="preserve">%, </w:t>
       </w:r>
     </w:p>
     <w:p/>
@@ -2924,6 +3103,12 @@
             <w:pPr>
               <w:spacing w:after="160"/>
             </w:pPr>
+            <w:r>
+              <w:t>Deaths_averted=0.2*</w:t>
+            </w:r>
+            <w:r>
+              <w:t>mortality_rate*plhiv*efficacy_ctx</w:t>
+            </w:r>
           </w:p>
         </w:tc>
       </w:tr>
@@ -2952,6 +3137,12 @@
             <w:pPr>
               <w:spacing w:after="160"/>
             </w:pPr>
+            <w:r>
+              <w:t>Decreasing</w:t>
+            </w:r>
+            <w:r>
+              <w:t xml:space="preserve"> coverage of CTX by 20%</w:t>
+            </w:r>
           </w:p>
         </w:tc>
         <w:tc>
@@ -2962,6 +3153,15 @@
             <w:pPr>
               <w:spacing w:after="160"/>
             </w:pPr>
+            <w:r>
+              <w:t>Deaths_averted=</w:t>
+            </w:r>
+            <w:r>
+              <w:t>-</w:t>
+            </w:r>
+            <w:r>
+              <w:t>0.2*mortality_rate*plhiv*efficacy_ctx</w:t>
+            </w:r>
           </w:p>
         </w:tc>
       </w:tr>
@@ -2990,6 +3190,238 @@
             <w:pPr>
               <w:spacing w:after="160"/>
             </w:pPr>
+            <w:r>
+              <w:t>Costs</w:t>
+            </w:r>
+          </w:p>
+        </w:tc>
+        <w:tc>
+          <w:tcPr>
+            <w:tcW w:w="6462" w:type="dxa"/>
+          </w:tcPr>
+          <w:p>
+            <w:pPr>
+              <w:spacing w:after="160"/>
+            </w:pPr>
+          </w:p>
+        </w:tc>
+      </w:tr>
+    </w:tbl>
+    <w:p>
+      <w:pPr>
+        <w:rPr>
+          <w:i/>
+          <w:iCs/>
+          <w:color w:val="2E74B5"/>
+        </w:rPr>
+      </w:pPr>
+      <w:r>
+        <w:rPr>
+          <w:i/>
+          <w:iCs/>
+          <w:color w:val="2E74B5"/>
+        </w:rPr>
+        <w:t>Combined Preventions</w:t>
+      </w:r>
+      <w:r>
+        <w:rPr>
+          <w:i/>
+          <w:iCs/>
+          <w:color w:val="2E74B5"/>
+        </w:rPr>
+        <w:t xml:space="preserve"> -</w:t>
+      </w:r>
+    </w:p>
+    <w:p>
+      <w:r>
+        <w:t xml:space="preserve">Following intervention values assumed: cotrimoxazole efficacy=10%, </w:t>
+      </w:r>
+    </w:p>
+    <w:p/>
+    <w:tbl>
+      <w:tblPr>
+        <w:tblStyle w:val="TableGrid"/>
+        <w:tblW w:w="0" w:type="auto"/>
+        <w:tblLook w:val="04A0" w:firstRow="1" w:lastRow="0" w:firstColumn="1" w:lastColumn="0" w:noHBand="0" w:noVBand="1"/>
+      </w:tblPr>
+      <w:tblGrid>
+        <w:gridCol w:w="549"/>
+        <w:gridCol w:w="2140"/>
+        <w:gridCol w:w="6462"/>
+      </w:tblGrid>
+      <w:tr>
+        <w:trPr>
+          <w:trHeight w:val="457"/>
+        </w:trPr>
+        <w:tc>
+          <w:tcPr>
+            <w:tcW w:w="549" w:type="dxa"/>
+          </w:tcPr>
+          <w:p>
+            <w:pPr>
+              <w:spacing w:after="160"/>
+              <w:rPr>
+                <w:b/>
+                <w:bCs/>
+              </w:rPr>
+            </w:pPr>
+            <w:r>
+              <w:rPr>
+                <w:b/>
+                <w:bCs/>
+              </w:rPr>
+              <w:t>#</w:t>
+            </w:r>
+          </w:p>
+        </w:tc>
+        <w:tc>
+          <w:tcPr>
+            <w:tcW w:w="2140" w:type="dxa"/>
+          </w:tcPr>
+          <w:p>
+            <w:pPr>
+              <w:spacing w:after="160"/>
+              <w:rPr>
+                <w:b/>
+                <w:bCs/>
+              </w:rPr>
+            </w:pPr>
+            <w:r>
+              <w:rPr>
+                <w:b/>
+                <w:bCs/>
+              </w:rPr>
+              <w:t>Description</w:t>
+            </w:r>
+          </w:p>
+        </w:tc>
+        <w:tc>
+          <w:tcPr>
+            <w:tcW w:w="6462" w:type="dxa"/>
+          </w:tcPr>
+          <w:p>
+            <w:pPr>
+              <w:spacing w:after="160"/>
+              <w:rPr>
+                <w:b/>
+                <w:bCs/>
+              </w:rPr>
+            </w:pPr>
+            <w:r>
+              <w:rPr>
+                <w:b/>
+                <w:bCs/>
+                <w:highlight w:val="yellow"/>
+              </w:rPr>
+              <w:t>Test Calculation/expectation</w:t>
+            </w:r>
+          </w:p>
+        </w:tc>
+      </w:tr>
+      <w:tr>
+        <w:trPr>
+          <w:trHeight w:val="457"/>
+        </w:trPr>
+        <w:tc>
+          <w:tcPr>
+            <w:tcW w:w="549" w:type="dxa"/>
+          </w:tcPr>
+          <w:p>
+            <w:pPr>
+              <w:spacing w:after="160"/>
+            </w:pPr>
+            <w:r>
+              <w:t>1.</w:t>
+            </w:r>
+          </w:p>
+        </w:tc>
+        <w:tc>
+          <w:tcPr>
+            <w:tcW w:w="2140" w:type="dxa"/>
+          </w:tcPr>
+          <w:p>
+            <w:pPr>
+              <w:spacing w:after="160"/>
+            </w:pPr>
+          </w:p>
+        </w:tc>
+        <w:tc>
+          <w:tcPr>
+            <w:tcW w:w="6462" w:type="dxa"/>
+          </w:tcPr>
+          <w:p>
+            <w:pPr>
+              <w:spacing w:after="160"/>
+            </w:pPr>
+          </w:p>
+        </w:tc>
+      </w:tr>
+      <w:tr>
+        <w:trPr>
+          <w:trHeight w:val="457"/>
+        </w:trPr>
+        <w:tc>
+          <w:tcPr>
+            <w:tcW w:w="549" w:type="dxa"/>
+          </w:tcPr>
+          <w:p>
+            <w:pPr>
+              <w:spacing w:after="160"/>
+            </w:pPr>
+            <w:r>
+              <w:t>2.</w:t>
+            </w:r>
+          </w:p>
+        </w:tc>
+        <w:tc>
+          <w:tcPr>
+            <w:tcW w:w="2140" w:type="dxa"/>
+          </w:tcPr>
+          <w:p>
+            <w:pPr>
+              <w:spacing w:after="160"/>
+            </w:pPr>
+          </w:p>
+        </w:tc>
+        <w:tc>
+          <w:tcPr>
+            <w:tcW w:w="6462" w:type="dxa"/>
+          </w:tcPr>
+          <w:p>
+            <w:pPr>
+              <w:spacing w:after="160"/>
+            </w:pPr>
+          </w:p>
+        </w:tc>
+      </w:tr>
+      <w:tr>
+        <w:trPr>
+          <w:trHeight w:val="457"/>
+        </w:trPr>
+        <w:tc>
+          <w:tcPr>
+            <w:tcW w:w="549" w:type="dxa"/>
+          </w:tcPr>
+          <w:p>
+            <w:pPr>
+              <w:spacing w:after="160"/>
+            </w:pPr>
+            <w:r>
+              <w:t>3.</w:t>
+            </w:r>
+          </w:p>
+        </w:tc>
+        <w:tc>
+          <w:tcPr>
+            <w:tcW w:w="2140" w:type="dxa"/>
+          </w:tcPr>
+          <w:p>
+            <w:pPr>
+              <w:spacing w:after="160"/>
+            </w:pPr>
+            <w:r>
+              <w:t>Costs</w:t>
+            </w:r>
           </w:p>
         </w:tc>
         <w:tc>
@@ -3005,6 +3437,84 @@
       </w:tr>
     </w:tbl>
     <w:p/>
+    <w:p/>
+    <w:p>
+      <w:pPr>
+        <w:pStyle w:val="Heading2"/>
+      </w:pPr>
+      <w:r>
+        <w:t xml:space="preserve">Test set: </w:t>
+      </w:r>
+      <w:r>
+        <w:t>Testing Interventions</w:t>
+      </w:r>
+    </w:p>
+    <w:p>
+      <w:pPr>
+        <w:pStyle w:val="Heading2"/>
+      </w:pPr>
+    </w:p>
+    <w:p>
+      <w:pPr>
+        <w:pStyle w:val="Heading3"/>
+      </w:pPr>
+      <w:r>
+        <w:t>Purpose</w:t>
+      </w:r>
+    </w:p>
+    <w:p>
+      <w:pPr>
+        <w:spacing w:after="160"/>
+      </w:pPr>
+      <w:r>
+        <w:t xml:space="preserve">Tests that changes in </w:t>
+      </w:r>
+      <w:r>
+        <w:t>testing</w:t>
+      </w:r>
+      <w:r>
+        <w:t xml:space="preserve"> interventions </w:t>
+      </w:r>
+      <w:r>
+        <w:t xml:space="preserve">and modalities </w:t>
+      </w:r>
+      <w:r>
+        <w:t xml:space="preserve">are correctly handled by the model. Increases in </w:t>
+      </w:r>
+      <w:r>
+        <w:t>testing</w:t>
+      </w:r>
+      <w:r>
+        <w:t>(all other remaining equal) should result in</w:t>
+      </w:r>
+      <w:r>
+        <w:t xml:space="preserve"> higher number of individuals being diagnosed</w:t>
+      </w:r>
+      <w:r>
+        <w:t xml:space="preserve">, and subsequently a larger number of individuals being on treatment. </w:t>
+      </w:r>
+    </w:p>
+    <w:p>
+      <w:pPr>
+        <w:pStyle w:val="Heading3"/>
+      </w:pPr>
+      <w:r>
+        <w:t>Test Logic</w:t>
+      </w:r>
+    </w:p>
+    <w:p>
+      <w:pPr>
+        <w:spacing w:after="160"/>
+      </w:pPr>
+      <w:r>
+        <w:t xml:space="preserve">Uses a standardized population with the following parameters: 1,000,000 total population, 5% HIV prevalence (50,000 PLHIV), 80% diagnosed, 75% on ART, 85% virally suppressed, 5,000 new infections per year, and 1,000 AIDS deaths per year. Different values selected for scenario and baseline preventions. </w:t>
+      </w:r>
+    </w:p>
+    <w:p>
+      <w:pPr>
+        <w:pStyle w:val="Heading2"/>
+      </w:pPr>
+    </w:p>
     <w:sectPr>
       <w:pgSz w:w="12240" w:h="15840"/>
       <w:pgMar w:top="1440" w:right="1440" w:bottom="1440" w:left="1440" w:header="708" w:footer="708" w:gutter="0"/>
@@ -3017,7 +3527,24 @@
 
 <file path=word/comments.xml><?xml version="1.0" encoding="utf-8"?>
 <w:comments xmlns:wpc="http://schemas.microsoft.com/office/word/2010/wordprocessingCanvas" xmlns:cx="http://schemas.microsoft.com/office/drawing/2014/chartex" xmlns:cx1="http://schemas.microsoft.com/office/drawing/2015/9/8/chartex" xmlns:cx2="http://schemas.microsoft.com/office/drawing/2015/10/21/chartex" xmlns:cx3="http://schemas.microsoft.com/office/drawing/2016/5/9/chartex" xmlns:cx4="http://schemas.microsoft.com/office/drawing/2016/5/10/chartex" xmlns:cx5="http://schemas.microsoft.com/office/drawing/2016/5/11/chartex" xmlns:cx6="http://schemas.microsoft.com/office/drawing/2016/5/12/chartex" xmlns:cx7="http://schemas.microsoft.com/office/drawing/2016/5/13/chartex" xmlns:cx8="http://schemas.microsoft.com/office/drawing/2016/5/14/chartex" xmlns:mc="http://schemas.openxmlformats.org/markup-compatibility/2006" xmlns:aink="http://schemas.microsoft.com/office/drawing/2016/ink" xmlns:am3d="http://schemas.microsoft.com/office/drawing/2017/model3d" xmlns:o="urn:schemas-microsoft-com:office:office" xmlns:oel="http://schemas.microsoft.com/office/2019/extlst" xmlns:r="http://schemas.openxmlformats.org/officeDocument/2006/relationships" xmlns:m="http://schemas.openxmlformats.org/officeDocument/2006/math" xmlns:v="urn:schemas-microsoft-com:vml" xmlns:wp14="http://schemas.microsoft.com/office/word/2010/wordprocessingDrawing" xmlns:wp="http://schemas.openxmlformats.org/drawingml/2006/wordprocessingDrawing" xmlns:w10="urn:schemas-microsoft-com:office:word" xmlns:w="http://schemas.openxmlformats.org/wordprocessingml/2006/main" xmlns:w14="http://schemas.microsoft.com/office/word/2010/wordml" xmlns:w15="http://schemas.microsoft.com/office/word/2012/wordml" xmlns:w16cex="http://schemas.microsoft.com/office/word/2018/wordml/cex" xmlns:w16cid="http://schemas.microsoft.com/office/word/2016/wordml/cid" xmlns:w16="http://schemas.microsoft.com/office/word/2018/wordml" xmlns:w16du="http://schemas.microsoft.com/office/word/2023/wordml/word16du" xmlns:w16sdtdh="http://schemas.microsoft.com/office/word/2020/wordml/sdtdatahash" xmlns:w16sdtfl="http://schemas.microsoft.com/office/word/2024/wordml/sdtformatlock" xmlns:w16se="http://schemas.microsoft.com/office/word/2015/wordml/symex" xmlns:wpg="http://schemas.microsoft.com/office/word/2010/wordprocessingGroup" xmlns:wpi="http://schemas.microsoft.com/office/word/2010/wordprocessingInk" xmlns:wne="http://schemas.microsoft.com/office/word/2006/wordml" xmlns:wps="http://schemas.microsoft.com/office/word/2010/wordprocessingShape" mc:Ignorable="w14 w15 w16se w16cid w16 w16cex w16sdtdh w16sdtfl w16du wp14">
-  <w:comment w:id="0" w:author="Alex de Nooy" w:date="2026-01-27T10:30:00Z" w:initials="Ad">
+  <w:comment w:id="0" w:author="Alex de Nooy" w:date="2026-01-28T10:45:00Z" w:initials="Ad">
+    <w:p>
+      <w:r>
+        <w:rPr>
+          <w:rStyle w:val="CommentReference"/>
+        </w:rPr>
+        <w:annotationRef/>
+      </w:r>
+      <w:r>
+        <w:rPr>
+          <w:sz w:val="20"/>
+          <w:szCs w:val="20"/>
+        </w:rPr>
+        <w:t>check all sub pops, pregnant women, infants etc</w:t>
+      </w:r>
+    </w:p>
+  </w:comment>
+  <w:comment w:id="1" w:author="Alex de Nooy" w:date="2026-01-27T10:30:00Z" w:initials="Ad">
     <w:p>
       <w:r>
         <w:rPr>
@@ -3034,7 +3561,7 @@
       </w:r>
     </w:p>
   </w:comment>
-  <w:comment w:id="1" w:author="Alex de Nooy" w:date="2026-01-26T16:26:00Z" w:initials="Ad">
+  <w:comment w:id="2" w:author="Alex de Nooy" w:date="2026-01-26T16:26:00Z" w:initials="Ad">
     <w:p>
       <w:r>
         <w:rPr>
@@ -3051,7 +3578,7 @@
       </w:r>
     </w:p>
   </w:comment>
-  <w:comment w:id="2" w:author="Alex de Nooy" w:date="2026-01-26T16:27:00Z" w:initials="Ad">
+  <w:comment w:id="3" w:author="Alex de Nooy" w:date="2026-01-26T16:27:00Z" w:initials="Ad">
     <w:p>
       <w:r>
         <w:rPr>
@@ -3068,7 +3595,7 @@
       </w:r>
     </w:p>
   </w:comment>
-  <w:comment w:id="3" w:author="Alex de Nooy" w:date="2026-01-27T09:18:00Z" w:initials="Ad">
+  <w:comment w:id="4" w:author="Alex de Nooy" w:date="2026-01-27T09:18:00Z" w:initials="Ad">
     <w:p>
       <w:r>
         <w:rPr>
@@ -3085,7 +3612,7 @@
       </w:r>
     </w:p>
   </w:comment>
-  <w:comment w:id="4" w:author="Alex de Nooy" w:date="2026-01-27T10:08:00Z" w:initials="Ad">
+  <w:comment w:id="5" w:author="Alex de Nooy" w:date="2026-01-27T10:08:00Z" w:initials="Ad">
     <w:p>
       <w:r>
         <w:rPr>
@@ -3107,6 +3634,7 @@
 
 <file path=word/commentsExtended.xml><?xml version="1.0" encoding="utf-8"?>
 <w15:commentsEx xmlns:wpc="http://schemas.microsoft.com/office/word/2010/wordprocessingCanvas" xmlns:cx="http://schemas.microsoft.com/office/drawing/2014/chartex" xmlns:cx1="http://schemas.microsoft.com/office/drawing/2015/9/8/chartex" xmlns:cx2="http://schemas.microsoft.com/office/drawing/2015/10/21/chartex" xmlns:cx3="http://schemas.microsoft.com/office/drawing/2016/5/9/chartex" xmlns:cx4="http://schemas.microsoft.com/office/drawing/2016/5/10/chartex" xmlns:cx5="http://schemas.microsoft.com/office/drawing/2016/5/11/chartex" xmlns:cx6="http://schemas.microsoft.com/office/drawing/2016/5/12/chartex" xmlns:cx7="http://schemas.microsoft.com/office/drawing/2016/5/13/chartex" xmlns:cx8="http://schemas.microsoft.com/office/drawing/2016/5/14/chartex" xmlns:mc="http://schemas.openxmlformats.org/markup-compatibility/2006" xmlns:aink="http://schemas.microsoft.com/office/drawing/2016/ink" xmlns:am3d="http://schemas.microsoft.com/office/drawing/2017/model3d" xmlns:o="urn:schemas-microsoft-com:office:office" xmlns:oel="http://schemas.microsoft.com/office/2019/extlst" xmlns:r="http://schemas.openxmlformats.org/officeDocument/2006/relationships" xmlns:m="http://schemas.openxmlformats.org/officeDocument/2006/math" xmlns:v="urn:schemas-microsoft-com:vml" xmlns:wp14="http://schemas.microsoft.com/office/word/2010/wordprocessingDrawing" xmlns:wp="http://schemas.openxmlformats.org/drawingml/2006/wordprocessingDrawing" xmlns:w10="urn:schemas-microsoft-com:office:word" xmlns:w="http://schemas.openxmlformats.org/wordprocessingml/2006/main" xmlns:w14="http://schemas.microsoft.com/office/word/2010/wordml" xmlns:w15="http://schemas.microsoft.com/office/word/2012/wordml" xmlns:w16cex="http://schemas.microsoft.com/office/word/2018/wordml/cex" xmlns:w16cid="http://schemas.microsoft.com/office/word/2016/wordml/cid" xmlns:w16="http://schemas.microsoft.com/office/word/2018/wordml" xmlns:w16du="http://schemas.microsoft.com/office/word/2023/wordml/word16du" xmlns:w16sdtdh="http://schemas.microsoft.com/office/word/2020/wordml/sdtdatahash" xmlns:w16sdtfl="http://schemas.microsoft.com/office/word/2024/wordml/sdtformatlock" xmlns:w16se="http://schemas.microsoft.com/office/word/2015/wordml/symex" xmlns:wpg="http://schemas.microsoft.com/office/word/2010/wordprocessingGroup" xmlns:wpi="http://schemas.microsoft.com/office/word/2010/wordprocessingInk" xmlns:wne="http://schemas.microsoft.com/office/word/2006/wordml" xmlns:wps="http://schemas.microsoft.com/office/word/2010/wordprocessingShape" mc:Ignorable="w14 w15 w16se w16cid w16 w16cex w16sdtdh w16sdtfl w16du wp14">
+  <w15:commentEx w15:paraId="7BB99941" w15:done="0"/>
   <w15:commentEx w15:paraId="5DD5C29F" w15:done="0"/>
   <w15:commentEx w15:paraId="6F9C2EF7" w15:done="0"/>
   <w15:commentEx w15:paraId="778F6952" w15:paraIdParent="6F9C2EF7" w15:done="0"/>
@@ -3117,6 +3645,7 @@
 
 <file path=word/commentsExtensible.xml><?xml version="1.0" encoding="utf-8"?>
 <w16cex:commentsExtensible xmlns:wpc="http://schemas.microsoft.com/office/word/2010/wordprocessingCanvas" xmlns:cx="http://schemas.microsoft.com/office/drawing/2014/chartex" xmlns:cx1="http://schemas.microsoft.com/office/drawing/2015/9/8/chartex" xmlns:cx2="http://schemas.microsoft.com/office/drawing/2015/10/21/chartex" xmlns:cx3="http://schemas.microsoft.com/office/drawing/2016/5/9/chartex" xmlns:cx4="http://schemas.microsoft.com/office/drawing/2016/5/10/chartex" xmlns:cx5="http://schemas.microsoft.com/office/drawing/2016/5/11/chartex" xmlns:cx6="http://schemas.microsoft.com/office/drawing/2016/5/12/chartex" xmlns:cx7="http://schemas.microsoft.com/office/drawing/2016/5/13/chartex" xmlns:cx8="http://schemas.microsoft.com/office/drawing/2016/5/14/chartex" xmlns:cr="http://schemas.microsoft.com/office/comments/2020/reactions" xmlns:mc="http://schemas.openxmlformats.org/markup-compatibility/2006" xmlns:aink="http://schemas.microsoft.com/office/drawing/2016/ink" xmlns:am3d="http://schemas.microsoft.com/office/drawing/2017/model3d" xmlns:o="urn:schemas-microsoft-com:office:office" xmlns:oel="http://schemas.microsoft.com/office/2019/extlst" xmlns:r="http://schemas.openxmlformats.org/officeDocument/2006/relationships" xmlns:m="http://schemas.openxmlformats.org/officeDocument/2006/math" xmlns:v="urn:schemas-microsoft-com:vml" xmlns:wp14="http://schemas.microsoft.com/office/word/2010/wordprocessingDrawing" xmlns:wp="http://schemas.openxmlformats.org/drawingml/2006/wordprocessingDrawing" xmlns:w10="urn:schemas-microsoft-com:office:word" xmlns:w="http://schemas.openxmlformats.org/wordprocessingml/2006/main" xmlns:w14="http://schemas.microsoft.com/office/word/2010/wordml" xmlns:w15="http://schemas.microsoft.com/office/word/2012/wordml" xmlns:w16cex="http://schemas.microsoft.com/office/word/2018/wordml/cex" xmlns:w16cid="http://schemas.microsoft.com/office/word/2016/wordml/cid" xmlns:w16="http://schemas.microsoft.com/office/word/2018/wordml" xmlns:w16du="http://schemas.microsoft.com/office/word/2023/wordml/word16du" xmlns:w16sdtdh="http://schemas.microsoft.com/office/word/2020/wordml/sdtdatahash" xmlns:w16sdtfl="http://schemas.microsoft.com/office/word/2024/wordml/sdtformatlock" xmlns:w16se="http://schemas.microsoft.com/office/word/2015/wordml/symex" xmlns:wpg="http://schemas.microsoft.com/office/word/2010/wordprocessingGroup" xmlns:wpi="http://schemas.microsoft.com/office/word/2010/wordprocessingInk" xmlns:wne="http://schemas.microsoft.com/office/word/2006/wordml" xmlns:wps="http://schemas.microsoft.com/office/word/2010/wordprocessingShape" mc:Ignorable="w14 w15 w16se w16cid w16 w16cex w16sdtdh w16sdtfl cr w16du wp14">
+  <w16cex:commentExtensible w16cex:durableId="175AC2BF" w16cex:dateUtc="2026-01-28T09:45:00Z"/>
   <w16cex:commentExtensible w16cex:durableId="19ADAC4E" w16cex:dateUtc="2026-01-27T09:30:00Z"/>
   <w16cex:commentExtensible w16cex:durableId="0CEB61E4" w16cex:dateUtc="2026-01-26T15:26:00Z"/>
   <w16cex:commentExtensible w16cex:durableId="7248C5EB" w16cex:dateUtc="2026-01-26T15:27:00Z"/>
@@ -3127,6 +3656,7 @@
 
 <file path=word/commentsIds.xml><?xml version="1.0" encoding="utf-8"?>
 <w16cid:commentsIds xmlns:wpc="http://schemas.microsoft.com/office/word/2010/wordprocessingCanvas" xmlns:cx="http://schemas.microsoft.com/office/drawing/2014/chartex" xmlns:cx1="http://schemas.microsoft.com/office/drawing/2015/9/8/chartex" xmlns:cx2="http://schemas.microsoft.com/office/drawing/2015/10/21/chartex" xmlns:cx3="http://schemas.microsoft.com/office/drawing/2016/5/9/chartex" xmlns:cx4="http://schemas.microsoft.com/office/drawing/2016/5/10/chartex" xmlns:cx5="http://schemas.microsoft.com/office/drawing/2016/5/11/chartex" xmlns:cx6="http://schemas.microsoft.com/office/drawing/2016/5/12/chartex" xmlns:cx7="http://schemas.microsoft.com/office/drawing/2016/5/13/chartex" xmlns:cx8="http://schemas.microsoft.com/office/drawing/2016/5/14/chartex" xmlns:mc="http://schemas.openxmlformats.org/markup-compatibility/2006" xmlns:aink="http://schemas.microsoft.com/office/drawing/2016/ink" xmlns:am3d="http://schemas.microsoft.com/office/drawing/2017/model3d" xmlns:o="urn:schemas-microsoft-com:office:office" xmlns:oel="http://schemas.microsoft.com/office/2019/extlst" xmlns:r="http://schemas.openxmlformats.org/officeDocument/2006/relationships" xmlns:m="http://schemas.openxmlformats.org/officeDocument/2006/math" xmlns:v="urn:schemas-microsoft-com:vml" xmlns:wp14="http://schemas.microsoft.com/office/word/2010/wordprocessingDrawing" xmlns:wp="http://schemas.openxmlformats.org/drawingml/2006/wordprocessingDrawing" xmlns:w10="urn:schemas-microsoft-com:office:word" xmlns:w="http://schemas.openxmlformats.org/wordprocessingml/2006/main" xmlns:w14="http://schemas.microsoft.com/office/word/2010/wordml" xmlns:w15="http://schemas.microsoft.com/office/word/2012/wordml" xmlns:w16cex="http://schemas.microsoft.com/office/word/2018/wordml/cex" xmlns:w16cid="http://schemas.microsoft.com/office/word/2016/wordml/cid" xmlns:w16="http://schemas.microsoft.com/office/word/2018/wordml" xmlns:w16du="http://schemas.microsoft.com/office/word/2023/wordml/word16du" xmlns:w16sdtdh="http://schemas.microsoft.com/office/word/2020/wordml/sdtdatahash" xmlns:w16sdtfl="http://schemas.microsoft.com/office/word/2024/wordml/sdtformatlock" xmlns:w16se="http://schemas.microsoft.com/office/word/2015/wordml/symex" xmlns:wpg="http://schemas.microsoft.com/office/word/2010/wordprocessingGroup" xmlns:wpi="http://schemas.microsoft.com/office/word/2010/wordprocessingInk" xmlns:wne="http://schemas.microsoft.com/office/word/2006/wordml" xmlns:wps="http://schemas.microsoft.com/office/word/2010/wordprocessingShape" mc:Ignorable="w14 w15 w16se w16cid w16 w16cex w16sdtdh w16sdtfl w16du wp14">
+  <w16cid:commentId w16cid:paraId="7BB99941" w16cid:durableId="175AC2BF"/>
   <w16cid:commentId w16cid:paraId="5DD5C29F" w16cid:durableId="19ADAC4E"/>
   <w16cid:commentId w16cid:paraId="6F9C2EF7" w16cid:durableId="0CEB61E4"/>
   <w16cid:commentId w16cid:paraId="778F6952" w16cid:durableId="7248C5EB"/>

</xml_diff>

<commit_message>
Big updates - testing logic (broken interface) and first basic testing tests
</commit_message>
<xml_diff>
--- a/resources/Test_Framework_Description.docx
+++ b/resources/Test_Framework_Description.docx
@@ -25,8 +25,8 @@
         <w:tblLook w:val="04A0" w:firstRow="1" w:lastRow="0" w:firstColumn="1" w:lastColumn="0" w:noHBand="0" w:noVBand="1"/>
       </w:tblPr>
       <w:tblGrid>
-        <w:gridCol w:w="4444"/>
-        <w:gridCol w:w="5346"/>
+        <w:gridCol w:w="4143"/>
+        <w:gridCol w:w="5647"/>
       </w:tblGrid>
       <w:tr>
         <w:trPr>
@@ -116,10 +116,7 @@
               <w:t xml:space="preserve">Sign * </w:t>
             </w:r>
             <w:r>
-              <w:t>number_reached</w:t>
-            </w:r>
-            <w:r>
-              <w:t xml:space="preserve"> </w:t>
+              <w:t xml:space="preserve">number_reached </w:t>
             </w:r>
             <w:r>
               <w:t>* efficacy * incidence</w:t>
@@ -135,10 +132,7 @@
               <w:spacing w:after="120"/>
             </w:pPr>
             <w:r>
-              <w:t>#number_reached</w:t>
-            </w:r>
-            <w:r>
-              <w:t>=target-base</w:t>
+              <w:t>#number_reached=target-base</w:t>
             </w:r>
           </w:p>
           <w:p>
@@ -146,13 +140,7 @@
               <w:spacing w:after="120"/>
             </w:pPr>
             <w:r>
-              <w:t>#</w:t>
-            </w:r>
-            <w:r>
-              <w:t>number_reached</w:t>
-            </w:r>
-            <w:r>
-              <w:t xml:space="preserve"> </w:t>
+              <w:t xml:space="preserve">#number_reached </w:t>
             </w:r>
             <w:r>
               <w:t>=min(number_reached, eligible_pop)</w:t>
@@ -168,10 +156,7 @@
               <w:spacing w:after="120"/>
             </w:pPr>
             <w:r>
-              <w:t>Or #</w:t>
-            </w:r>
-            <w:r>
-              <w:t>number_reached</w:t>
+              <w:t>Or #number_reached</w:t>
             </w:r>
             <w:r>
               <w:t xml:space="preserve"> = eligible-base if target&gt;eligible</w:t>
@@ -192,13 +177,7 @@
               <w:spacing w:after="120"/>
             </w:pPr>
             <w:r>
-              <w:t>Prevention interventions (</w:t>
-            </w:r>
-            <w:r>
-              <w:t>deaths</w:t>
-            </w:r>
-            <w:r>
-              <w:t xml:space="preserve"> averted)</w:t>
+              <w:t>Prevention interventions (deaths averted)</w:t>
             </w:r>
           </w:p>
         </w:tc>
@@ -281,7 +260,13 @@
               <w:spacing w:after="120"/>
             </w:pPr>
             <w:r>
-              <w:t>Base_yield=(undiagnosed+ltfu)</w:t>
+              <w:t>Base_yield=</w:t>
+            </w:r>
+            <w:r>
+              <w:t>0.9*</w:t>
+            </w:r>
+            <w:r>
+              <w:t>(undiagnosed+ltfu)</w:t>
             </w:r>
             <w:r>
               <w:t>/sexually_active</w:t>
@@ -387,6 +372,23 @@
             </w:r>
             <w:r>
               <w:t>positive_tests*linkage_rate</w:t>
+            </w:r>
+          </w:p>
+          <w:p>
+            <w:pPr>
+              <w:spacing w:after="120"/>
+            </w:pPr>
+          </w:p>
+          <w:p>
+            <w:pPr>
+              <w:spacing w:after="120"/>
+            </w:pPr>
+            <w:r>
+              <w:lastRenderedPageBreak/>
+              <w:t>Virally_suppressed = ART_inititations*0.9</w:t>
+            </w:r>
+            <w:r>
+              <w:t>*VS_95_target</w:t>
             </w:r>
           </w:p>
         </w:tc>
@@ -822,6 +824,7 @@
               <w:spacing w:after="160"/>
             </w:pPr>
             <w:r>
+              <w:lastRenderedPageBreak/>
               <w:t>3.</w:t>
             </w:r>
           </w:p>
@@ -874,7 +877,6 @@
               <w:spacing w:after="160"/>
             </w:pPr>
             <w:r>
-              <w:lastRenderedPageBreak/>
               <w:t>4.</w:t>
             </w:r>
           </w:p>
@@ -1266,7 +1268,11 @@
         <w:spacing w:after="160"/>
       </w:pPr>
       <w:r>
-        <w:t xml:space="preserve">Uses a standardized population with the following parameters: 1,000,000 total population, 5% HIV prevalence (50,000 PLHIV), 80% diagnosed, 75% on ART, 85% virally suppressed, 5,000 new infections per year, and 1,000 AIDS deaths per year. Different values selected for scenario and baseline preventions. </w:t>
+        <w:t xml:space="preserve">Uses a standardized population with the following parameters: 1,000,000 total population, 5% HIV prevalence (50,000 PLHIV), 80% diagnosed, 75% on ART, 85% </w:t>
+      </w:r>
+      <w:r>
+        <w:lastRenderedPageBreak/>
+        <w:t xml:space="preserve">virally suppressed, 5,000 new infections per year, and 1,000 AIDS deaths per year. Different values selected for scenario and baseline preventions. </w:t>
       </w:r>
     </w:p>
     <w:p>
@@ -1840,10 +1846,7 @@
               <w:spacing w:after="160"/>
             </w:pPr>
             <w:r>
-              <w:t>Cannot put prep inputs more than eligible populations</w:t>
-            </w:r>
-            <w:r>
-              <w:t xml:space="preserve"> – both?</w:t>
+              <w:t>Cannot put prep inputs more than eligible populations – both?</w:t>
             </w:r>
           </w:p>
         </w:tc>
@@ -1915,10 +1918,8 @@
     </w:p>
     <w:p>
       <w:r>
-        <w:t>Following intervention values assumed:</w:t>
-      </w:r>
-      <w:r>
-        <w:t xml:space="preserve"> vmmc efficacy=60%</w:t>
+        <w:lastRenderedPageBreak/>
+        <w:t>Following intervention values assumed: vmmc efficacy=60%</w:t>
       </w:r>
     </w:p>
     <w:p/>
@@ -2015,7 +2016,6 @@
               <w:spacing w:after="160"/>
             </w:pPr>
             <w:r>
-              <w:lastRenderedPageBreak/>
               <w:t>1.</w:t>
             </w:r>
           </w:p>
@@ -2112,10 +2112,7 @@
               <w:t>Infections_averted = -1000*incidence*</w:t>
             </w:r>
             <w:r>
-              <w:t xml:space="preserve"> </w:t>
-            </w:r>
-            <w:r>
-              <w:t>vmmc_efficacy</w:t>
+              <w:t xml:space="preserve"> vmmc_efficacy</w:t>
             </w:r>
           </w:p>
         </w:tc>
@@ -2221,19 +2218,7 @@
     </w:p>
     <w:p>
       <w:r>
-        <w:t xml:space="preserve">Following intervention values assumed: </w:t>
-      </w:r>
-      <w:r>
-        <w:t>PEP</w:t>
-      </w:r>
-      <w:r>
-        <w:t xml:space="preserve"> efficacy=</w:t>
-      </w:r>
-      <w:r>
-        <w:t>5</w:t>
-      </w:r>
-      <w:r>
-        <w:t>0%</w:t>
+        <w:t>Following intervention values assumed: PEP efficacy=50%</w:t>
       </w:r>
       <w:r>
         <w:t>, baseline PEP = 1000 people</w:t>
@@ -2503,19 +2488,7 @@
     </w:p>
     <w:p>
       <w:r>
-        <w:t xml:space="preserve">Following intervention values assumed: </w:t>
-      </w:r>
-      <w:r>
-        <w:t>condoms</w:t>
-      </w:r>
-      <w:r>
-        <w:t xml:space="preserve"> efficacy=</w:t>
-      </w:r>
-      <w:r>
-        <w:t>99</w:t>
-      </w:r>
-      <w:r>
-        <w:t xml:space="preserve">%, </w:t>
+        <w:t xml:space="preserve">Following intervention values assumed: condoms efficacy=99%, </w:t>
       </w:r>
     </w:p>
     <w:p/>
@@ -2762,6 +2735,7 @@
                 <w:b/>
                 <w:bCs/>
               </w:rPr>
+              <w:lastRenderedPageBreak/>
               <w:t>#</w:t>
             </w:r>
           </w:p>
@@ -2861,7 +2835,6 @@
               <w:spacing w:after="160"/>
             </w:pPr>
             <w:r>
-              <w:lastRenderedPageBreak/>
               <w:t>2.</w:t>
             </w:r>
           </w:p>
@@ -3138,10 +3111,7 @@
               <w:spacing w:after="160"/>
             </w:pPr>
             <w:r>
-              <w:t>Decreasing</w:t>
-            </w:r>
-            <w:r>
-              <w:t xml:space="preserve"> coverage of CTX by 20%</w:t>
+              <w:t>Decreasing coverage of CTX by 20%</w:t>
             </w:r>
           </w:p>
         </w:tc>
@@ -3154,13 +3124,7 @@
               <w:spacing w:after="160"/>
             </w:pPr>
             <w:r>
-              <w:t>Deaths_averted=</w:t>
-            </w:r>
-            <w:r>
-              <w:t>-</w:t>
-            </w:r>
-            <w:r>
-              <w:t>0.2*mortality_rate*plhiv*efficacy_ctx</w:t>
+              <w:t>Deaths_averted=-0.2*mortality_rate*plhiv*efficacy_ctx</w:t>
             </w:r>
           </w:p>
         </w:tc>
@@ -3215,21 +3179,22 @@
           <w:color w:val="2E74B5"/>
         </w:rPr>
       </w:pPr>
-      <w:r>
+    </w:p>
+    <w:p>
+      <w:pPr>
         <w:rPr>
           <w:i/>
           <w:iCs/>
           <w:color w:val="2E74B5"/>
         </w:rPr>
-        <w:t>Combined Preventions</w:t>
-      </w:r>
+      </w:pPr>
       <w:r>
         <w:rPr>
           <w:i/>
           <w:iCs/>
           <w:color w:val="2E74B5"/>
         </w:rPr>
-        <w:t xml:space="preserve"> -</w:t>
+        <w:t>Combined Preventions -</w:t>
       </w:r>
     </w:p>
     <w:p>
@@ -3467,28 +3432,7 @@
         <w:spacing w:after="160"/>
       </w:pPr>
       <w:r>
-        <w:t xml:space="preserve">Tests that changes in </w:t>
-      </w:r>
-      <w:r>
-        <w:t>testing</w:t>
-      </w:r>
-      <w:r>
-        <w:t xml:space="preserve"> interventions </w:t>
-      </w:r>
-      <w:r>
-        <w:t xml:space="preserve">and modalities </w:t>
-      </w:r>
-      <w:r>
-        <w:t xml:space="preserve">are correctly handled by the model. Increases in </w:t>
-      </w:r>
-      <w:r>
-        <w:t>testing</w:t>
-      </w:r>
-      <w:r>
-        <w:t>(all other remaining equal) should result in</w:t>
-      </w:r>
-      <w:r>
-        <w:t xml:space="preserve"> higher number of individuals being diagnosed</w:t>
+        <w:t>Tests that changes in testing interventions and modalities are correctly handled by the model. Increases in testing(all other remaining equal) should result in higher number of individuals being diagnosed</w:t>
       </w:r>
       <w:r>
         <w:t xml:space="preserve">, and subsequently a larger number of individuals being on treatment. </w:t>
@@ -3507,12 +3451,628 @@
         <w:spacing w:after="160"/>
       </w:pPr>
       <w:r>
-        <w:t xml:space="preserve">Uses a standardized population with the following parameters: 1,000,000 total population, 5% HIV prevalence (50,000 PLHIV), 80% diagnosed, 75% on ART, 85% virally suppressed, 5,000 new infections per year, and 1,000 AIDS deaths per year. Different values selected for scenario and baseline preventions. </w:t>
+        <w:lastRenderedPageBreak/>
+        <w:t>Uses a standardized population with the following parameters: 1,000,000 total population, 5% HIV prevalence (50,000 PLHIV), 80% diagnosed, 75% on ART, 85% virally suppressed, 5,000 new infections per year, 1,000 AIDS deaths per year</w:t>
+      </w:r>
+      <w:r>
+        <w:t xml:space="preserve">, </w:t>
+      </w:r>
+      <w:r>
+        <w:t xml:space="preserve">crude </w:t>
+      </w:r>
+      <w:r>
+        <w:t xml:space="preserve">birth rate </w:t>
+      </w:r>
+      <w:r>
+        <w:t>24 per 1000, 49% of population male</w:t>
+      </w:r>
+      <w:r>
+        <w:t xml:space="preserve"> </w:t>
+      </w:r>
+      <w:r>
+        <w:t>,</w:t>
+      </w:r>
+      <w:r>
+        <w:t>and 40%</w:t>
+      </w:r>
+      <w:r>
+        <w:t xml:space="preserve"> </w:t>
+      </w:r>
+      <w:r>
+        <w:t>of population under 15.</w:t>
       </w:r>
     </w:p>
     <w:p>
       <w:pPr>
         <w:pStyle w:val="Heading2"/>
+        <w:rPr>
+          <w:b w:val="0"/>
+          <w:bCs w:val="0"/>
+          <w:sz w:val="24"/>
+          <w:szCs w:val="24"/>
+        </w:rPr>
+      </w:pPr>
+      <w:r>
+        <w:rPr>
+          <w:b w:val="0"/>
+          <w:bCs w:val="0"/>
+          <w:sz w:val="24"/>
+          <w:szCs w:val="24"/>
+        </w:rPr>
+        <w:t>Intervention assumptions</w:t>
+      </w:r>
+      <w:r>
+        <w:rPr>
+          <w:b w:val="0"/>
+          <w:bCs w:val="0"/>
+          <w:sz w:val="24"/>
+          <w:szCs w:val="24"/>
+        </w:rPr>
+        <w:t xml:space="preserve">: </w:t>
+      </w:r>
+      <w:r>
+        <w:rPr>
+          <w:b w:val="0"/>
+          <w:bCs w:val="0"/>
+          <w:sz w:val="24"/>
+          <w:szCs w:val="24"/>
+        </w:rPr>
+        <w:t>base yield multiplier is 90%</w:t>
+      </w:r>
+      <w:r>
+        <w:rPr>
+          <w:b w:val="0"/>
+          <w:bCs w:val="0"/>
+          <w:sz w:val="24"/>
+          <w:szCs w:val="24"/>
+        </w:rPr>
+        <w:t>, general facility tests multiplier</w:t>
+      </w:r>
+      <w:r>
+        <w:rPr>
+          <w:b w:val="0"/>
+          <w:bCs w:val="0"/>
+          <w:sz w:val="24"/>
+          <w:szCs w:val="24"/>
+        </w:rPr>
+        <w:t xml:space="preserve"> and linkage rate (</w:t>
+      </w:r>
+      <w:r>
+        <w:rPr>
+          <w:b w:val="0"/>
+          <w:bCs w:val="0"/>
+          <w:sz w:val="24"/>
+          <w:szCs w:val="24"/>
+        </w:rPr>
+        <w:t>1</w:t>
+      </w:r>
+      <w:r>
+        <w:rPr>
+          <w:b w:val="0"/>
+          <w:bCs w:val="0"/>
+          <w:sz w:val="24"/>
+          <w:szCs w:val="24"/>
+        </w:rPr>
+        <w:t>,0.9)</w:t>
+      </w:r>
+      <w:r>
+        <w:rPr>
+          <w:b w:val="0"/>
+          <w:bCs w:val="0"/>
+          <w:sz w:val="24"/>
+          <w:szCs w:val="24"/>
+        </w:rPr>
+        <w:t>, targeted facility test multiplier</w:t>
+      </w:r>
+      <w:r>
+        <w:rPr>
+          <w:b w:val="0"/>
+          <w:bCs w:val="0"/>
+          <w:sz w:val="24"/>
+          <w:szCs w:val="24"/>
+        </w:rPr>
+        <w:t xml:space="preserve"> and linkage rate (2, 0.8)</w:t>
+      </w:r>
+      <w:r>
+        <w:rPr>
+          <w:b w:val="0"/>
+          <w:bCs w:val="0"/>
+          <w:sz w:val="24"/>
+          <w:szCs w:val="24"/>
+        </w:rPr>
+        <w:t xml:space="preserve">, test efficacy </w:t>
+      </w:r>
+      <w:r>
+        <w:rPr>
+          <w:b w:val="0"/>
+          <w:bCs w:val="0"/>
+          <w:sz w:val="24"/>
+          <w:szCs w:val="24"/>
+        </w:rPr>
+        <w:t>=0.97</w:t>
+      </w:r>
+      <w:r>
+        <w:rPr>
+          <w:b w:val="0"/>
+          <w:bCs w:val="0"/>
+          <w:sz w:val="24"/>
+          <w:szCs w:val="24"/>
+        </w:rPr>
+        <w:t>, base_yield =0.02175</w:t>
+      </w:r>
+      <w:r>
+        <w:rPr>
+          <w:b w:val="0"/>
+          <w:bCs w:val="0"/>
+          <w:sz w:val="24"/>
+          <w:szCs w:val="24"/>
+        </w:rPr>
+        <w:t xml:space="preserve">, </w:t>
+      </w:r>
+      <w:r>
+        <w:rPr>
+          <w:b w:val="0"/>
+          <w:bCs w:val="0"/>
+          <w:sz w:val="24"/>
+          <w:szCs w:val="24"/>
+          <w:highlight w:val="yellow"/>
+        </w:rPr>
+        <w:t>re_test_prop =0.5</w:t>
+      </w:r>
+      <w:r>
+        <w:rPr>
+          <w:b w:val="0"/>
+          <w:bCs w:val="0"/>
+          <w:sz w:val="24"/>
+          <w:szCs w:val="24"/>
+        </w:rPr>
+        <w:t xml:space="preserve">, </w:t>
+      </w:r>
+      <w:r>
+        <w:rPr>
+          <w:b w:val="0"/>
+          <w:bCs w:val="0"/>
+          <w:sz w:val="24"/>
+          <w:szCs w:val="24"/>
+          <w:highlight w:val="yellow"/>
+        </w:rPr>
+        <w:t>base_</w:t>
+      </w:r>
+      <w:r>
+        <w:rPr>
+          <w:b w:val="0"/>
+          <w:bCs w:val="0"/>
+          <w:sz w:val="24"/>
+          <w:szCs w:val="24"/>
+          <w:highlight w:val="yellow"/>
+        </w:rPr>
+        <w:t>v</w:t>
+      </w:r>
+      <w:r>
+        <w:rPr>
+          <w:b w:val="0"/>
+          <w:bCs w:val="0"/>
+          <w:sz w:val="24"/>
+          <w:szCs w:val="24"/>
+          <w:highlight w:val="yellow"/>
+        </w:rPr>
+        <w:t>iral_suppression</w:t>
+      </w:r>
+      <w:r>
+        <w:rPr>
+          <w:b w:val="0"/>
+          <w:bCs w:val="0"/>
+          <w:sz w:val="24"/>
+          <w:szCs w:val="24"/>
+          <w:highlight w:val="yellow"/>
+        </w:rPr>
+        <w:t xml:space="preserve"> = percent_on_art</w:t>
+      </w:r>
+      <w:r>
+        <w:rPr>
+          <w:b w:val="0"/>
+          <w:bCs w:val="0"/>
+          <w:sz w:val="24"/>
+          <w:szCs w:val="24"/>
+          <w:highlight w:val="yellow"/>
+        </w:rPr>
+        <w:t>-10</w:t>
+      </w:r>
+    </w:p>
+    <w:p>
+      <w:pPr>
+        <w:pStyle w:val="Heading2"/>
+        <w:rPr>
+          <w:b w:val="0"/>
+          <w:bCs w:val="0"/>
+          <w:sz w:val="24"/>
+          <w:szCs w:val="24"/>
+        </w:rPr>
+      </w:pPr>
+    </w:p>
+    <w:p>
+      <w:pPr>
+        <w:rPr>
+          <w:i/>
+          <w:iCs/>
+          <w:color w:val="2E74B5"/>
+        </w:rPr>
+      </w:pPr>
+      <w:commentRangeStart w:id="6"/>
+      <w:r>
+        <w:rPr>
+          <w:i/>
+          <w:iCs/>
+          <w:color w:val="2E74B5"/>
+        </w:rPr>
+        <w:t>Basic test functionality</w:t>
+      </w:r>
+      <w:commentRangeEnd w:id="6"/>
+      <w:r>
+        <w:rPr>
+          <w:rStyle w:val="CommentReference"/>
+          <w:i/>
+          <w:iCs/>
+          <w:color w:val="2E74B5"/>
+          <w:sz w:val="24"/>
+          <w:szCs w:val="24"/>
+        </w:rPr>
+        <w:commentReference w:id="6"/>
+      </w:r>
+    </w:p>
+    <w:tbl>
+      <w:tblPr>
+        <w:tblStyle w:val="TableGrid"/>
+        <w:tblW w:w="0" w:type="auto"/>
+        <w:tblLook w:val="04A0" w:firstRow="1" w:lastRow="0" w:firstColumn="1" w:lastColumn="0" w:noHBand="0" w:noVBand="1"/>
+      </w:tblPr>
+      <w:tblGrid>
+        <w:gridCol w:w="549"/>
+        <w:gridCol w:w="2140"/>
+        <w:gridCol w:w="6462"/>
+      </w:tblGrid>
+      <w:tr>
+        <w:trPr>
+          <w:trHeight w:val="457"/>
+        </w:trPr>
+        <w:tc>
+          <w:tcPr>
+            <w:tcW w:w="549" w:type="dxa"/>
+          </w:tcPr>
+          <w:p>
+            <w:pPr>
+              <w:spacing w:after="160"/>
+              <w:rPr>
+                <w:b/>
+                <w:bCs/>
+              </w:rPr>
+            </w:pPr>
+            <w:r>
+              <w:rPr>
+                <w:b/>
+                <w:bCs/>
+              </w:rPr>
+              <w:t>#</w:t>
+            </w:r>
+          </w:p>
+        </w:tc>
+        <w:tc>
+          <w:tcPr>
+            <w:tcW w:w="2140" w:type="dxa"/>
+          </w:tcPr>
+          <w:p>
+            <w:pPr>
+              <w:spacing w:after="160"/>
+              <w:rPr>
+                <w:b/>
+                <w:bCs/>
+              </w:rPr>
+            </w:pPr>
+            <w:r>
+              <w:rPr>
+                <w:b/>
+                <w:bCs/>
+              </w:rPr>
+              <w:t>Description</w:t>
+            </w:r>
+          </w:p>
+        </w:tc>
+        <w:tc>
+          <w:tcPr>
+            <w:tcW w:w="6462" w:type="dxa"/>
+          </w:tcPr>
+          <w:p>
+            <w:pPr>
+              <w:spacing w:after="160"/>
+              <w:rPr>
+                <w:b/>
+                <w:bCs/>
+              </w:rPr>
+            </w:pPr>
+            <w:r>
+              <w:rPr>
+                <w:b/>
+                <w:bCs/>
+              </w:rPr>
+              <w:t>Test Calculation/expectation</w:t>
+            </w:r>
+          </w:p>
+        </w:tc>
+      </w:tr>
+      <w:tr>
+        <w:trPr>
+          <w:trHeight w:val="457"/>
+        </w:trPr>
+        <w:tc>
+          <w:tcPr>
+            <w:tcW w:w="549" w:type="dxa"/>
+          </w:tcPr>
+          <w:p>
+            <w:pPr>
+              <w:spacing w:after="160"/>
+            </w:pPr>
+            <w:r>
+              <w:t>1.</w:t>
+            </w:r>
+          </w:p>
+        </w:tc>
+        <w:tc>
+          <w:tcPr>
+            <w:tcW w:w="2140" w:type="dxa"/>
+          </w:tcPr>
+          <w:p>
+            <w:pPr>
+              <w:spacing w:after="160"/>
+            </w:pPr>
+            <w:r>
+              <w:t xml:space="preserve">Scale up </w:t>
+            </w:r>
+            <w:r>
+              <w:t xml:space="preserve">general facility testing </w:t>
+            </w:r>
+            <w:r>
+              <w:t xml:space="preserve"> </w:t>
+            </w:r>
+            <w:r>
+              <w:t>by 10 000 tests</w:t>
+            </w:r>
+            <w:r>
+              <w:t xml:space="preserve"> – positive tests</w:t>
+            </w:r>
+          </w:p>
+        </w:tc>
+        <w:tc>
+          <w:tcPr>
+            <w:tcW w:w="6462" w:type="dxa"/>
+          </w:tcPr>
+          <w:p>
+            <w:pPr>
+              <w:spacing w:after="160"/>
+            </w:pPr>
+            <w:r>
+              <w:t xml:space="preserve">expected_positive </w:t>
+            </w:r>
+            <w:r>
+              <w:t>=</w:t>
+            </w:r>
+            <w:r>
+              <w:t xml:space="preserve"> 10000 * base_yield * test_yield_multiplier</w:t>
+            </w:r>
+            <w:r>
+              <w:t>*</w:t>
+            </w:r>
+            <w:r>
+              <w:t>efficacy</w:t>
+            </w:r>
+          </w:p>
+          <w:p>
+            <w:pPr>
+              <w:spacing w:after="160"/>
+            </w:pPr>
+            <w:r>
+              <w:t>expected_positive=</w:t>
+            </w:r>
+            <w:r>
+              <w:t xml:space="preserve"> 211</w:t>
+            </w:r>
+          </w:p>
+        </w:tc>
+      </w:tr>
+      <w:tr>
+        <w:trPr>
+          <w:trHeight w:val="457"/>
+        </w:trPr>
+        <w:tc>
+          <w:tcPr>
+            <w:tcW w:w="549" w:type="dxa"/>
+          </w:tcPr>
+          <w:p>
+            <w:pPr>
+              <w:spacing w:after="160"/>
+            </w:pPr>
+            <w:r>
+              <w:t>2.</w:t>
+            </w:r>
+          </w:p>
+        </w:tc>
+        <w:tc>
+          <w:tcPr>
+            <w:tcW w:w="2140" w:type="dxa"/>
+          </w:tcPr>
+          <w:p>
+            <w:pPr>
+              <w:spacing w:after="160"/>
+            </w:pPr>
+            <w:r>
+              <w:t xml:space="preserve">Scale up general facility testing  by 10 000 tests – </w:t>
+            </w:r>
+            <w:r>
+              <w:t>new diagnoses</w:t>
+            </w:r>
+          </w:p>
+        </w:tc>
+        <w:tc>
+          <w:tcPr>
+            <w:tcW w:w="6462" w:type="dxa"/>
+          </w:tcPr>
+          <w:p>
+            <w:pPr>
+              <w:spacing w:after="160"/>
+            </w:pPr>
+            <w:r>
+              <w:t>Expected new_dia</w:t>
+            </w:r>
+            <w:r>
+              <w:t>gnoses = positive_tests*(1-re_test_prop)</w:t>
+            </w:r>
+          </w:p>
+          <w:p>
+            <w:pPr>
+              <w:spacing w:after="160"/>
+            </w:pPr>
+            <w:r>
+              <w:t>Expected_new_diagnsoes = 105/106</w:t>
+            </w:r>
+          </w:p>
+        </w:tc>
+      </w:tr>
+      <w:tr>
+        <w:trPr>
+          <w:trHeight w:val="457"/>
+        </w:trPr>
+        <w:tc>
+          <w:tcPr>
+            <w:tcW w:w="549" w:type="dxa"/>
+          </w:tcPr>
+          <w:p>
+            <w:pPr>
+              <w:spacing w:after="160"/>
+            </w:pPr>
+            <w:r>
+              <w:t>3</w:t>
+            </w:r>
+          </w:p>
+        </w:tc>
+        <w:tc>
+          <w:tcPr>
+            <w:tcW w:w="2140" w:type="dxa"/>
+          </w:tcPr>
+          <w:p>
+            <w:pPr>
+              <w:spacing w:after="160"/>
+            </w:pPr>
+            <w:r>
+              <w:t xml:space="preserve">Scale up general facility testing  by 10 000 tests – </w:t>
+            </w:r>
+            <w:r>
+              <w:t>ART initiations</w:t>
+            </w:r>
+          </w:p>
+        </w:tc>
+        <w:tc>
+          <w:tcPr>
+            <w:tcW w:w="6462" w:type="dxa"/>
+          </w:tcPr>
+          <w:p>
+            <w:pPr>
+              <w:spacing w:after="160"/>
+            </w:pPr>
+            <w:r>
+              <w:t xml:space="preserve">Experted_art_inititations = </w:t>
+            </w:r>
+            <w:r>
+              <w:t>positive tests</w:t>
+            </w:r>
+            <w:r>
+              <w:t xml:space="preserve"> * linkage_rate</w:t>
+            </w:r>
+          </w:p>
+          <w:p>
+            <w:pPr>
+              <w:spacing w:after="160"/>
+            </w:pPr>
+            <w:r>
+              <w:t>Experted_art_inititations</w:t>
+            </w:r>
+            <w:r>
+              <w:t xml:space="preserve"> = </w:t>
+            </w:r>
+            <w:r>
+              <w:t>~190</w:t>
+            </w:r>
+          </w:p>
+        </w:tc>
+      </w:tr>
+      <w:tr>
+        <w:trPr>
+          <w:trHeight w:val="457"/>
+        </w:trPr>
+        <w:tc>
+          <w:tcPr>
+            <w:tcW w:w="549" w:type="dxa"/>
+          </w:tcPr>
+          <w:p>
+            <w:pPr>
+              <w:spacing w:after="160"/>
+            </w:pPr>
+            <w:r>
+              <w:t>4</w:t>
+            </w:r>
+          </w:p>
+        </w:tc>
+        <w:tc>
+          <w:tcPr>
+            <w:tcW w:w="2140" w:type="dxa"/>
+          </w:tcPr>
+          <w:p>
+            <w:pPr>
+              <w:spacing w:after="160"/>
+            </w:pPr>
+            <w:r>
+              <w:t xml:space="preserve">Scale up general facility testing  by 10 000 tests – </w:t>
+            </w:r>
+            <w:r>
+              <w:t>viral suppression</w:t>
+            </w:r>
+          </w:p>
+        </w:tc>
+        <w:tc>
+          <w:tcPr>
+            <w:tcW w:w="6462" w:type="dxa"/>
+          </w:tcPr>
+          <w:p>
+            <w:pPr>
+              <w:spacing w:after="160"/>
+            </w:pPr>
+            <w:r>
+              <w:rPr>
+                <w:highlight w:val="yellow"/>
+              </w:rPr>
+              <w:t xml:space="preserve">New_virally_suppressed = </w:t>
+            </w:r>
+            <w:r>
+              <w:rPr>
+                <w:highlight w:val="yellow"/>
+              </w:rPr>
+              <w:t>Expected_art_inititations*</w:t>
+            </w:r>
+            <w:r>
+              <w:rPr>
+                <w:highlight w:val="yellow"/>
+              </w:rPr>
+              <w:t>base_viral_suppression</w:t>
+            </w:r>
+          </w:p>
+        </w:tc>
+      </w:tr>
+    </w:tbl>
+    <w:p>
+      <w:pPr>
+        <w:pStyle w:val="Heading2"/>
+        <w:rPr>
+          <w:b w:val="0"/>
+          <w:bCs w:val="0"/>
+        </w:rPr>
       </w:pPr>
     </w:p>
     <w:sectPr>
@@ -3629,6 +4189,23 @@
       </w:r>
     </w:p>
   </w:comment>
+  <w:comment w:id="6" w:author="Alex de Nooy" w:date="2026-02-05T10:37:00Z" w:initials="Ad">
+    <w:p>
+      <w:r>
+        <w:rPr>
+          <w:rStyle w:val="CommentReference"/>
+        </w:rPr>
+        <w:annotationRef/>
+      </w:r>
+      <w:r>
+        <w:rPr>
+          <w:sz w:val="20"/>
+          <w:szCs w:val="20"/>
+        </w:rPr>
+        <w:t>costs</w:t>
+      </w:r>
+    </w:p>
+  </w:comment>
 </w:comments>
 </file>
 
@@ -3640,6 +4217,7 @@
   <w15:commentEx w15:paraId="778F6952" w15:paraIdParent="6F9C2EF7" w15:done="0"/>
   <w15:commentEx w15:paraId="7BC24E07" w15:done="0"/>
   <w15:commentEx w15:paraId="329A5C6B" w15:done="0"/>
+  <w15:commentEx w15:paraId="79A1C8E3" w15:done="0"/>
 </w15:commentsEx>
 </file>
 
@@ -3651,6 +4229,7 @@
   <w16cex:commentExtensible w16cex:durableId="7248C5EB" w16cex:dateUtc="2026-01-26T15:27:00Z"/>
   <w16cex:commentExtensible w16cex:durableId="28052605" w16cex:dateUtc="2026-01-27T08:18:00Z"/>
   <w16cex:commentExtensible w16cex:durableId="7BA2E990" w16cex:dateUtc="2026-01-27T09:08:00Z"/>
+  <w16cex:commentExtensible w16cex:durableId="26D61787" w16cex:dateUtc="2026-02-05T09:37:00Z"/>
 </w16cex:commentsExtensible>
 </file>
 
@@ -3662,6 +4241,7 @@
   <w16cid:commentId w16cid:paraId="778F6952" w16cid:durableId="7248C5EB"/>
   <w16cid:commentId w16cid:paraId="7BC24E07" w16cid:durableId="28052605"/>
   <w16cid:commentId w16cid:paraId="329A5C6B" w16cid:durableId="7BA2E990"/>
+  <w16cid:commentId w16cid:paraId="79A1C8E3" w16cid:durableId="26D61787"/>
 </w16cid:commentsIds>
 </file>
 

</xml_diff>

<commit_message>
Tes multiple modalities - unit tests plus app fix
</commit_message>
<xml_diff>
--- a/resources/Test_Framework_Description.docx
+++ b/resources/Test_Framework_Description.docx
@@ -3407,11 +3407,21 @@
       <w:pPr>
         <w:pStyle w:val="Heading2"/>
       </w:pPr>
+      <w:commentRangeStart w:id="6"/>
       <w:r>
         <w:t xml:space="preserve">Test set: </w:t>
       </w:r>
       <w:r>
         <w:t>Testing Interventions</w:t>
+      </w:r>
+      <w:commentRangeEnd w:id="6"/>
+      <w:r>
+        <w:rPr>
+          <w:rStyle w:val="CommentReference"/>
+          <w:sz w:val="28"/>
+          <w:szCs w:val="28"/>
+        </w:rPr>
+        <w:commentReference w:id="6"/>
       </w:r>
     </w:p>
     <w:p>
@@ -3698,7 +3708,7 @@
           <w:color w:val="2E74B5"/>
         </w:rPr>
       </w:pPr>
-      <w:commentRangeStart w:id="6"/>
+      <w:commentRangeStart w:id="7"/>
       <w:r>
         <w:rPr>
           <w:i/>
@@ -3707,7 +3717,7 @@
         </w:rPr>
         <w:t>Basic test functionality</w:t>
       </w:r>
-      <w:commentRangeEnd w:id="6"/>
+      <w:commentRangeEnd w:id="7"/>
       <w:r>
         <w:rPr>
           <w:rStyle w:val="CommentReference"/>
@@ -3717,7 +3727,7 @@
           <w:sz w:val="24"/>
           <w:szCs w:val="24"/>
         </w:rPr>
-        <w:commentReference w:id="6"/>
+        <w:commentReference w:id="7"/>
       </w:r>
     </w:p>
     <w:tbl>
@@ -4063,6 +4073,490 @@
               <w:t>base_viral_suppression</w:t>
             </w:r>
           </w:p>
+          <w:p>
+            <w:pPr>
+              <w:spacing w:after="160"/>
+            </w:pPr>
+            <w:r>
+              <w:t>New_virally_suppressed =</w:t>
+            </w:r>
+            <w:r>
+              <w:t xml:space="preserve"> 142</w:t>
+            </w:r>
+          </w:p>
+        </w:tc>
+      </w:tr>
+    </w:tbl>
+    <w:p>
+      <w:pPr>
+        <w:pStyle w:val="Heading2"/>
+        <w:rPr>
+          <w:b w:val="0"/>
+          <w:bCs w:val="0"/>
+        </w:rPr>
+      </w:pPr>
+    </w:p>
+    <w:p>
+      <w:pPr>
+        <w:rPr>
+          <w:i/>
+          <w:iCs/>
+          <w:color w:val="2E74B5"/>
+        </w:rPr>
+      </w:pPr>
+      <w:r>
+        <w:rPr>
+          <w:i/>
+          <w:iCs/>
+          <w:color w:val="2E74B5"/>
+        </w:rPr>
+        <w:t>Multiple test modalit</w:t>
+      </w:r>
+      <w:r>
+        <w:rPr>
+          <w:i/>
+          <w:iCs/>
+          <w:color w:val="2E74B5"/>
+        </w:rPr>
+        <w:t>ies</w:t>
+      </w:r>
+    </w:p>
+    <w:p>
+      <w:pPr>
+        <w:rPr>
+          <w:color w:val="000000" w:themeColor="text1"/>
+        </w:rPr>
+      </w:pPr>
+      <w:r>
+        <w:rPr>
+          <w:color w:val="000000" w:themeColor="text1"/>
+        </w:rPr>
+        <w:t>General test multiplier =1, targeted test multiplier =2</w:t>
+      </w:r>
+    </w:p>
+    <w:p>
+      <w:pPr>
+        <w:rPr>
+          <w:color w:val="2E74B5"/>
+        </w:rPr>
+      </w:pPr>
+    </w:p>
+    <w:tbl>
+      <w:tblPr>
+        <w:tblStyle w:val="TableGrid"/>
+        <w:tblW w:w="0" w:type="auto"/>
+        <w:tblLook w:val="04A0" w:firstRow="1" w:lastRow="0" w:firstColumn="1" w:lastColumn="0" w:noHBand="0" w:noVBand="1"/>
+      </w:tblPr>
+      <w:tblGrid>
+        <w:gridCol w:w="549"/>
+        <w:gridCol w:w="2140"/>
+        <w:gridCol w:w="6462"/>
+      </w:tblGrid>
+      <w:tr>
+        <w:trPr>
+          <w:trHeight w:val="457"/>
+        </w:trPr>
+        <w:tc>
+          <w:tcPr>
+            <w:tcW w:w="549" w:type="dxa"/>
+          </w:tcPr>
+          <w:p>
+            <w:pPr>
+              <w:spacing w:after="160"/>
+              <w:rPr>
+                <w:b/>
+                <w:bCs/>
+              </w:rPr>
+            </w:pPr>
+            <w:r>
+              <w:rPr>
+                <w:b/>
+                <w:bCs/>
+              </w:rPr>
+              <w:t>#</w:t>
+            </w:r>
+          </w:p>
+        </w:tc>
+        <w:tc>
+          <w:tcPr>
+            <w:tcW w:w="2140" w:type="dxa"/>
+          </w:tcPr>
+          <w:p>
+            <w:pPr>
+              <w:spacing w:after="160"/>
+              <w:rPr>
+                <w:b/>
+                <w:bCs/>
+              </w:rPr>
+            </w:pPr>
+            <w:r>
+              <w:rPr>
+                <w:b/>
+                <w:bCs/>
+              </w:rPr>
+              <w:t>Description</w:t>
+            </w:r>
+          </w:p>
+        </w:tc>
+        <w:tc>
+          <w:tcPr>
+            <w:tcW w:w="6462" w:type="dxa"/>
+          </w:tcPr>
+          <w:p>
+            <w:pPr>
+              <w:spacing w:after="160"/>
+              <w:rPr>
+                <w:b/>
+                <w:bCs/>
+              </w:rPr>
+            </w:pPr>
+            <w:r>
+              <w:rPr>
+                <w:b/>
+                <w:bCs/>
+              </w:rPr>
+              <w:t>Test Calculation/expectation</w:t>
+            </w:r>
+          </w:p>
+        </w:tc>
+      </w:tr>
+      <w:tr>
+        <w:trPr>
+          <w:trHeight w:val="457"/>
+        </w:trPr>
+        <w:tc>
+          <w:tcPr>
+            <w:tcW w:w="549" w:type="dxa"/>
+          </w:tcPr>
+          <w:p>
+            <w:pPr>
+              <w:spacing w:after="160"/>
+            </w:pPr>
+            <w:r>
+              <w:t>1.</w:t>
+            </w:r>
+          </w:p>
+        </w:tc>
+        <w:tc>
+          <w:tcPr>
+            <w:tcW w:w="2140" w:type="dxa"/>
+          </w:tcPr>
+          <w:p>
+            <w:pPr>
+              <w:spacing w:after="160"/>
+            </w:pPr>
+            <w:r>
+              <w:t xml:space="preserve">Scale up general facility testing  by 10 000 tests </w:t>
+            </w:r>
+            <w:r>
+              <w:t>and targeted testing by 10 000</w:t>
+            </w:r>
+            <w:r>
+              <w:t>– positive tests</w:t>
+            </w:r>
+          </w:p>
+        </w:tc>
+        <w:tc>
+          <w:tcPr>
+            <w:tcW w:w="6462" w:type="dxa"/>
+          </w:tcPr>
+          <w:p>
+            <w:pPr>
+              <w:spacing w:after="160"/>
+            </w:pPr>
+            <w:r>
+              <w:t>Expected_positives_targeted= 2* expected_positives_general</w:t>
+            </w:r>
+          </w:p>
+          <w:p>
+            <w:pPr>
+              <w:spacing w:after="160"/>
+            </w:pPr>
+          </w:p>
+          <w:p>
+            <w:pPr>
+              <w:spacing w:after="160"/>
+            </w:pPr>
+            <w:r>
+              <w:t>422=2*211</w:t>
+            </w:r>
+          </w:p>
+          <w:p>
+            <w:pPr>
+              <w:spacing w:after="160"/>
+            </w:pPr>
+          </w:p>
+        </w:tc>
+      </w:tr>
+      <w:tr>
+        <w:trPr>
+          <w:trHeight w:val="457"/>
+        </w:trPr>
+        <w:tc>
+          <w:tcPr>
+            <w:tcW w:w="549" w:type="dxa"/>
+          </w:tcPr>
+          <w:p>
+            <w:pPr>
+              <w:spacing w:after="160"/>
+            </w:pPr>
+            <w:r>
+              <w:lastRenderedPageBreak/>
+              <w:t>2</w:t>
+            </w:r>
+          </w:p>
+        </w:tc>
+        <w:tc>
+          <w:tcPr>
+            <w:tcW w:w="2140" w:type="dxa"/>
+          </w:tcPr>
+          <w:p>
+            <w:pPr>
+              <w:spacing w:after="160"/>
+            </w:pPr>
+            <w:r>
+              <w:t>Scale up general facility testing  by 10 000 tests and targeted testing by 10 000– positive tests</w:t>
+            </w:r>
+            <w:r>
+              <w:t xml:space="preserve"> 2</w:t>
+            </w:r>
+          </w:p>
+        </w:tc>
+        <w:tc>
+          <w:tcPr>
+            <w:tcW w:w="6462" w:type="dxa"/>
+          </w:tcPr>
+          <w:p>
+            <w:pPr>
+              <w:spacing w:after="160"/>
+            </w:pPr>
+            <w:r>
+              <w:t xml:space="preserve">Expected_positives_total= </w:t>
+            </w:r>
+            <w:r>
+              <w:t xml:space="preserve">(10000 * base_yield * </w:t>
+            </w:r>
+            <w:r>
+              <w:t>general_multiplier* general_efficacy) + (10000*base_yield* target_multiplier*target efficacy)</w:t>
+            </w:r>
+          </w:p>
+          <w:p>
+            <w:pPr>
+              <w:spacing w:after="160"/>
+            </w:pPr>
+          </w:p>
+          <w:p>
+            <w:pPr>
+              <w:spacing w:after="160"/>
+            </w:pPr>
+            <w:r>
+              <w:t>Expected_positives_total</w:t>
+            </w:r>
+            <w:r>
+              <w:t>=</w:t>
+            </w:r>
+            <w:r>
+              <w:t>633</w:t>
+            </w:r>
+          </w:p>
+        </w:tc>
+      </w:tr>
+      <w:tr>
+        <w:trPr>
+          <w:trHeight w:val="457"/>
+        </w:trPr>
+        <w:tc>
+          <w:tcPr>
+            <w:tcW w:w="549" w:type="dxa"/>
+          </w:tcPr>
+          <w:p>
+            <w:pPr>
+              <w:spacing w:after="160"/>
+            </w:pPr>
+            <w:r>
+              <w:t>3</w:t>
+            </w:r>
+            <w:r>
+              <w:t>.</w:t>
+            </w:r>
+          </w:p>
+        </w:tc>
+        <w:tc>
+          <w:tcPr>
+            <w:tcW w:w="2140" w:type="dxa"/>
+          </w:tcPr>
+          <w:p>
+            <w:pPr>
+              <w:spacing w:after="160"/>
+            </w:pPr>
+            <w:r>
+              <w:t>Scale up general facility testing  by 10 000 tests – new diagnoses</w:t>
+            </w:r>
+          </w:p>
+        </w:tc>
+        <w:tc>
+          <w:tcPr>
+            <w:tcW w:w="6462" w:type="dxa"/>
+          </w:tcPr>
+          <w:p>
+            <w:pPr>
+              <w:spacing w:after="160"/>
+            </w:pPr>
+            <w:r>
+              <w:t>Expected_new_diagnoses = Expected_positives_total</w:t>
+            </w:r>
+            <w:r>
+              <w:t>*(1-re_test_prop)</w:t>
+            </w:r>
+          </w:p>
+          <w:p>
+            <w:pPr>
+              <w:spacing w:after="160"/>
+            </w:pPr>
+            <w:r>
+              <w:t>Expected_new_diagn</w:t>
+            </w:r>
+            <w:r>
+              <w:t>o</w:t>
+            </w:r>
+            <w:r>
+              <w:t xml:space="preserve">ses = </w:t>
+            </w:r>
+            <w:r>
+              <w:t>316</w:t>
+            </w:r>
+            <w:r>
+              <w:t>*</w:t>
+            </w:r>
+          </w:p>
+        </w:tc>
+      </w:tr>
+      <w:tr>
+        <w:trPr>
+          <w:trHeight w:val="457"/>
+        </w:trPr>
+        <w:tc>
+          <w:tcPr>
+            <w:tcW w:w="549" w:type="dxa"/>
+          </w:tcPr>
+          <w:p>
+            <w:pPr>
+              <w:spacing w:after="160"/>
+            </w:pPr>
+            <w:r>
+              <w:t>4</w:t>
+            </w:r>
+          </w:p>
+        </w:tc>
+        <w:tc>
+          <w:tcPr>
+            <w:tcW w:w="2140" w:type="dxa"/>
+          </w:tcPr>
+          <w:p>
+            <w:pPr>
+              <w:spacing w:after="160"/>
+            </w:pPr>
+            <w:r>
+              <w:t>Scale up general facility testing  by 10 000 tests – ART initiations</w:t>
+            </w:r>
+          </w:p>
+        </w:tc>
+        <w:tc>
+          <w:tcPr>
+            <w:tcW w:w="6462" w:type="dxa"/>
+          </w:tcPr>
+          <w:p>
+            <w:pPr>
+              <w:spacing w:after="160"/>
+            </w:pPr>
+            <w:r>
+              <w:t xml:space="preserve">Experted_art_inititations = </w:t>
+            </w:r>
+            <w:r>
+              <w:t>expected_positive_general*general_linkage_rate</w:t>
+            </w:r>
+            <w:r>
+              <w:t>+ expected_positive_targeted*taregetd_linkage_rate</w:t>
+            </w:r>
+          </w:p>
+          <w:p>
+            <w:pPr>
+              <w:spacing w:after="160"/>
+            </w:pPr>
+            <w:r>
+              <w:t>Experted_art_inititations =</w:t>
+            </w:r>
+            <w:r>
+              <w:t xml:space="preserve"> </w:t>
+            </w:r>
+            <w:r>
+              <w:t>527</w:t>
+            </w:r>
+          </w:p>
+        </w:tc>
+      </w:tr>
+      <w:tr>
+        <w:trPr>
+          <w:trHeight w:val="457"/>
+        </w:trPr>
+        <w:tc>
+          <w:tcPr>
+            <w:tcW w:w="549" w:type="dxa"/>
+          </w:tcPr>
+          <w:p>
+            <w:pPr>
+              <w:spacing w:after="160"/>
+            </w:pPr>
+            <w:r>
+              <w:t>5</w:t>
+            </w:r>
+          </w:p>
+        </w:tc>
+        <w:tc>
+          <w:tcPr>
+            <w:tcW w:w="2140" w:type="dxa"/>
+          </w:tcPr>
+          <w:p>
+            <w:pPr>
+              <w:spacing w:after="160"/>
+            </w:pPr>
+            <w:r>
+              <w:t>Scale up general facility testing  by 10 000 tests – viral suppression</w:t>
+            </w:r>
+          </w:p>
+        </w:tc>
+        <w:tc>
+          <w:tcPr>
+            <w:tcW w:w="6462" w:type="dxa"/>
+          </w:tcPr>
+          <w:p>
+            <w:pPr>
+              <w:spacing w:after="160"/>
+            </w:pPr>
+            <w:r>
+              <w:rPr>
+                <w:highlight w:val="yellow"/>
+              </w:rPr>
+              <w:t xml:space="preserve">New_virally_suppressed = </w:t>
+            </w:r>
+            <w:r>
+              <w:rPr>
+                <w:highlight w:val="yellow"/>
+              </w:rPr>
+              <w:t>Expected_art_inititations*base_viral_suppression</w:t>
+            </w:r>
+          </w:p>
+          <w:p>
+            <w:pPr>
+              <w:spacing w:after="160"/>
+            </w:pPr>
+            <w:r>
+              <w:t xml:space="preserve">New_virally_suppressed = </w:t>
+            </w:r>
+            <w:r>
+              <w:t>396</w:t>
+            </w:r>
+          </w:p>
         </w:tc>
       </w:tr>
     </w:tbl>
@@ -4189,7 +4683,24 @@
       </w:r>
     </w:p>
   </w:comment>
-  <w:comment w:id="6" w:author="Alex de Nooy" w:date="2026-02-05T10:37:00Z" w:initials="Ad">
+  <w:comment w:id="6" w:author="Alex de Nooy" w:date="2026-02-06T09:47:00Z" w:initials="Ad">
+    <w:p>
+      <w:r>
+        <w:rPr>
+          <w:rStyle w:val="CommentReference"/>
+        </w:rPr>
+        <w:annotationRef/>
+      </w:r>
+      <w:r>
+        <w:rPr>
+          <w:sz w:val="20"/>
+          <w:szCs w:val="20"/>
+        </w:rPr>
+        <w:t>check the 95's</w:t>
+      </w:r>
+    </w:p>
+  </w:comment>
+  <w:comment w:id="7" w:author="Alex de Nooy" w:date="2026-02-05T10:37:00Z" w:initials="Ad">
     <w:p>
       <w:r>
         <w:rPr>
@@ -4217,6 +4728,7 @@
   <w15:commentEx w15:paraId="778F6952" w15:paraIdParent="6F9C2EF7" w15:done="0"/>
   <w15:commentEx w15:paraId="7BC24E07" w15:done="0"/>
   <w15:commentEx w15:paraId="329A5C6B" w15:done="0"/>
+  <w15:commentEx w15:paraId="7E69DD53" w15:done="0"/>
   <w15:commentEx w15:paraId="79A1C8E3" w15:done="0"/>
 </w15:commentsEx>
 </file>
@@ -4229,6 +4741,7 @@
   <w16cex:commentExtensible w16cex:durableId="7248C5EB" w16cex:dateUtc="2026-01-26T15:27:00Z"/>
   <w16cex:commentExtensible w16cex:durableId="28052605" w16cex:dateUtc="2026-01-27T08:18:00Z"/>
   <w16cex:commentExtensible w16cex:durableId="7BA2E990" w16cex:dateUtc="2026-01-27T09:08:00Z"/>
+  <w16cex:commentExtensible w16cex:durableId="31044006" w16cex:dateUtc="2026-02-06T08:47:00Z"/>
   <w16cex:commentExtensible w16cex:durableId="26D61787" w16cex:dateUtc="2026-02-05T09:37:00Z"/>
 </w16cex:commentsExtensible>
 </file>
@@ -4241,6 +4754,7 @@
   <w16cid:commentId w16cid:paraId="778F6952" w16cid:durableId="7248C5EB"/>
   <w16cid:commentId w16cid:paraId="7BC24E07" w16cid:durableId="28052605"/>
   <w16cid:commentId w16cid:paraId="329A5C6B" w16cid:durableId="7BA2E990"/>
+  <w16cid:commentId w16cid:paraId="7E69DD53" w16cid:durableId="31044006"/>
   <w16cid:commentId w16cid:paraId="79A1C8E3" w16cid:durableId="26D61787"/>
 </w16cid:commentsIds>
 </file>

</xml_diff>

<commit_message>
Check 95s with testing
</commit_message>
<xml_diff>
--- a/resources/Test_Framework_Description.docx
+++ b/resources/Test_Framework_Description.docx
@@ -3426,11 +3426,6 @@
     </w:p>
     <w:p>
       <w:pPr>
-        <w:pStyle w:val="Heading2"/>
-      </w:pPr>
-    </w:p>
-    <w:p>
-      <w:pPr>
         <w:pStyle w:val="Heading3"/>
       </w:pPr>
       <w:r>
@@ -3684,9 +3679,8 @@
           <w:bCs w:val="0"/>
           <w:sz w:val="24"/>
           <w:szCs w:val="24"/>
-          <w:highlight w:val="yellow"/>
         </w:rPr>
-        <w:t>-10</w:t>
+        <w:t>*0.9</w:t>
       </w:r>
     </w:p>
     <w:p>
@@ -4081,7 +4075,10 @@
               <w:t>New_virally_suppressed =</w:t>
             </w:r>
             <w:r>
-              <w:t xml:space="preserve"> 142</w:t>
+              <w:t xml:space="preserve"> 14</w:t>
+            </w:r>
+            <w:r>
+              <w:t>5</w:t>
             </w:r>
           </w:p>
         </w:tc>
@@ -4556,6 +4553,172 @@
             <w:r>
               <w:t>396</w:t>
             </w:r>
+          </w:p>
+        </w:tc>
+      </w:tr>
+      <w:tr>
+        <w:trPr>
+          <w:trHeight w:val="457"/>
+        </w:trPr>
+        <w:tc>
+          <w:tcPr>
+            <w:tcW w:w="549" w:type="dxa"/>
+          </w:tcPr>
+          <w:p>
+            <w:pPr>
+              <w:spacing w:after="160"/>
+            </w:pPr>
+            <w:r>
+              <w:t>6</w:t>
+            </w:r>
+          </w:p>
+        </w:tc>
+        <w:tc>
+          <w:tcPr>
+            <w:tcW w:w="2140" w:type="dxa"/>
+          </w:tcPr>
+          <w:p>
+            <w:pPr>
+              <w:spacing w:after="160"/>
+            </w:pPr>
+            <w:r>
+              <w:t xml:space="preserve">Scale up general facility testing  by 10 000 tests – </w:t>
+            </w:r>
+            <w:r>
+              <w:t>1</w:t>
+            </w:r>
+            <w:r>
+              <w:rPr>
+                <w:vertAlign w:val="superscript"/>
+              </w:rPr>
+              <w:t>st</w:t>
+            </w:r>
+            <w:r>
+              <w:t xml:space="preserve"> 95</w:t>
+            </w:r>
+          </w:p>
+        </w:tc>
+        <w:tc>
+          <w:tcPr>
+            <w:tcW w:w="6462" w:type="dxa"/>
+          </w:tcPr>
+          <w:p>
+            <w:pPr>
+              <w:spacing w:after="160"/>
+            </w:pPr>
+            <w:r>
+              <w:t>New_diagnosed</w:t>
+            </w:r>
+            <w:r>
+              <w:t>_total= baseline_diagnosed</w:t>
+            </w:r>
+            <w:r>
+              <w:t>+expected_new_diagnoses</w:t>
+            </w:r>
+          </w:p>
+          <w:p>
+            <w:pPr>
+              <w:spacing w:after="160"/>
+            </w:pPr>
+          </w:p>
+          <w:p>
+            <w:pPr>
+              <w:spacing w:after="160"/>
+            </w:pPr>
+            <w:r>
+              <w:t>1</w:t>
+            </w:r>
+            <w:r>
+              <w:rPr>
+                <w:vertAlign w:val="superscript"/>
+              </w:rPr>
+              <w:t>st</w:t>
+            </w:r>
+            <w:r>
+              <w:t>_95=</w:t>
+            </w:r>
+            <w:r>
+              <w:t xml:space="preserve"> </w:t>
+            </w:r>
+            <w:r>
+              <w:t>diagnosed</w:t>
+            </w:r>
+            <w:r>
+              <w:t xml:space="preserve">/PLHIV = </w:t>
+            </w:r>
+            <w:r>
+              <w:t>80.6%</w:t>
+            </w:r>
+          </w:p>
+        </w:tc>
+      </w:tr>
+      <w:tr>
+        <w:trPr>
+          <w:trHeight w:val="457"/>
+        </w:trPr>
+        <w:tc>
+          <w:tcPr>
+            <w:tcW w:w="549" w:type="dxa"/>
+          </w:tcPr>
+          <w:p>
+            <w:pPr>
+              <w:spacing w:after="160"/>
+            </w:pPr>
+          </w:p>
+        </w:tc>
+        <w:tc>
+          <w:tcPr>
+            <w:tcW w:w="2140" w:type="dxa"/>
+          </w:tcPr>
+          <w:p>
+            <w:pPr>
+              <w:spacing w:after="160"/>
+            </w:pPr>
+          </w:p>
+        </w:tc>
+        <w:tc>
+          <w:tcPr>
+            <w:tcW w:w="6462" w:type="dxa"/>
+          </w:tcPr>
+          <w:p>
+            <w:pPr>
+              <w:spacing w:after="160"/>
+            </w:pPr>
+          </w:p>
+        </w:tc>
+      </w:tr>
+      <w:tr>
+        <w:trPr>
+          <w:trHeight w:val="457"/>
+        </w:trPr>
+        <w:tc>
+          <w:tcPr>
+            <w:tcW w:w="549" w:type="dxa"/>
+          </w:tcPr>
+          <w:p>
+            <w:pPr>
+              <w:spacing w:after="160"/>
+            </w:pPr>
+          </w:p>
+        </w:tc>
+        <w:tc>
+          <w:tcPr>
+            <w:tcW w:w="2140" w:type="dxa"/>
+          </w:tcPr>
+          <w:p>
+            <w:pPr>
+              <w:spacing w:after="160"/>
+            </w:pPr>
+          </w:p>
+        </w:tc>
+        <w:tc>
+          <w:tcPr>
+            <w:tcW w:w="6462" w:type="dxa"/>
+          </w:tcPr>
+          <w:p>
+            <w:pPr>
+              <w:spacing w:after="160"/>
+            </w:pPr>
           </w:p>
         </w:tc>
       </w:tr>

</xml_diff>

<commit_message>
Planning document + paramter list update
</commit_message>
<xml_diff>
--- a/resources/Test_Framework_Description.docx
+++ b/resources/Test_Framework_Description.docx
@@ -384,7 +384,6 @@
               <w:spacing w:after="120"/>
             </w:pPr>
             <w:r>
-              <w:lastRenderedPageBreak/>
               <w:t>Virally_suppressed = ART_inititations*0.9</w:t>
             </w:r>
             <w:r>
@@ -511,7 +510,7 @@
         <w:pStyle w:val="Heading2"/>
         <w:numPr>
           <w:ilvl w:val="0"/>
-          <w:numId w:val="4"/>
+          <w:numId w:val="3"/>
         </w:numPr>
       </w:pPr>
       <w:r>
@@ -529,7 +528,7 @@
         <w:pStyle w:val="Heading2"/>
         <w:numPr>
           <w:ilvl w:val="0"/>
-          <w:numId w:val="4"/>
+          <w:numId w:val="3"/>
         </w:numPr>
       </w:pPr>
       <w:r>
@@ -824,7 +823,6 @@
               <w:spacing w:after="160"/>
             </w:pPr>
             <w:r>
-              <w:lastRenderedPageBreak/>
               <w:t>3.</w:t>
             </w:r>
           </w:p>
@@ -1088,7 +1086,7 @@
               <w:pStyle w:val="ListParagraph"/>
               <w:numPr>
                 <w:ilvl w:val="0"/>
-                <w:numId w:val="2"/>
+                <w:numId w:val="1"/>
               </w:numPr>
               <w:spacing w:after="160"/>
             </w:pPr>
@@ -1096,6 +1094,81 @@
               <w:t>Infections_averted=0</w:t>
             </w:r>
           </w:p>
+          <w:p>
+            <w:pPr>
+              <w:pStyle w:val="ListParagraph"/>
+              <w:numPr>
+                <w:ilvl w:val="0"/>
+                <w:numId w:val="1"/>
+              </w:numPr>
+              <w:spacing w:after="160"/>
+            </w:pPr>
+            <w:r>
+              <w:t>Deaths_averted=0</w:t>
+            </w:r>
+          </w:p>
+          <w:p>
+            <w:pPr>
+              <w:pStyle w:val="ListParagraph"/>
+              <w:numPr>
+                <w:ilvl w:val="0"/>
+                <w:numId w:val="1"/>
+              </w:numPr>
+              <w:spacing w:after="160"/>
+            </w:pPr>
+            <w:r>
+              <w:t>New_diagnoses=0</w:t>
+            </w:r>
+          </w:p>
+          <w:p>
+            <w:pPr>
+              <w:pStyle w:val="ListParagraph"/>
+              <w:numPr>
+                <w:ilvl w:val="0"/>
+                <w:numId w:val="1"/>
+              </w:numPr>
+              <w:spacing w:after="160"/>
+            </w:pPr>
+            <w:r>
+              <w:t>Art_inititations=0</w:t>
+            </w:r>
+          </w:p>
+        </w:tc>
+      </w:tr>
+      <w:tr>
+        <w:trPr>
+          <w:trHeight w:val="457"/>
+        </w:trPr>
+        <w:tc>
+          <w:tcPr>
+            <w:tcW w:w="549" w:type="dxa"/>
+          </w:tcPr>
+          <w:p>
+            <w:pPr>
+              <w:spacing w:after="160"/>
+            </w:pPr>
+            <w:r>
+              <w:t>2.</w:t>
+            </w:r>
+          </w:p>
+        </w:tc>
+        <w:tc>
+          <w:tcPr>
+            <w:tcW w:w="2423" w:type="dxa"/>
+          </w:tcPr>
+          <w:p>
+            <w:pPr>
+              <w:spacing w:after="160"/>
+            </w:pPr>
+            <w:r>
+              <w:t>Cascade values (95’s) unchanged</w:t>
+            </w:r>
+          </w:p>
+        </w:tc>
+        <w:tc>
+          <w:tcPr>
+            <w:tcW w:w="6179" w:type="dxa"/>
+          </w:tcPr>
           <w:p>
             <w:pPr>
               <w:pStyle w:val="ListParagraph"/>
@@ -1106,7 +1179,7 @@
               <w:spacing w:after="160"/>
             </w:pPr>
             <w:r>
-              <w:t>Deaths_averted=0</w:t>
+              <w:t>Scenario_diagnosed=baseline_diagnosed</w:t>
             </w:r>
           </w:p>
           <w:p>
@@ -1119,7 +1192,7 @@
               <w:spacing w:after="160"/>
             </w:pPr>
             <w:r>
-              <w:t>New_diagnoses=0</w:t>
+              <w:t>Scenario_on_art=baseline_on_art</w:t>
             </w:r>
           </w:p>
           <w:p>
@@ -1128,81 +1201,6 @@
               <w:numPr>
                 <w:ilvl w:val="0"/>
                 <w:numId w:val="2"/>
-              </w:numPr>
-              <w:spacing w:after="160"/>
-            </w:pPr>
-            <w:r>
-              <w:t>Art_inititations=0</w:t>
-            </w:r>
-          </w:p>
-        </w:tc>
-      </w:tr>
-      <w:tr>
-        <w:trPr>
-          <w:trHeight w:val="457"/>
-        </w:trPr>
-        <w:tc>
-          <w:tcPr>
-            <w:tcW w:w="549" w:type="dxa"/>
-          </w:tcPr>
-          <w:p>
-            <w:pPr>
-              <w:spacing w:after="160"/>
-            </w:pPr>
-            <w:r>
-              <w:t>2.</w:t>
-            </w:r>
-          </w:p>
-        </w:tc>
-        <w:tc>
-          <w:tcPr>
-            <w:tcW w:w="2423" w:type="dxa"/>
-          </w:tcPr>
-          <w:p>
-            <w:pPr>
-              <w:spacing w:after="160"/>
-            </w:pPr>
-            <w:r>
-              <w:t>Cascade values (95’s) unchanged</w:t>
-            </w:r>
-          </w:p>
-        </w:tc>
-        <w:tc>
-          <w:tcPr>
-            <w:tcW w:w="6179" w:type="dxa"/>
-          </w:tcPr>
-          <w:p>
-            <w:pPr>
-              <w:pStyle w:val="ListParagraph"/>
-              <w:numPr>
-                <w:ilvl w:val="0"/>
-                <w:numId w:val="3"/>
-              </w:numPr>
-              <w:spacing w:after="160"/>
-            </w:pPr>
-            <w:r>
-              <w:t>Scenario_diagnosed=baseline_diagnosed</w:t>
-            </w:r>
-          </w:p>
-          <w:p>
-            <w:pPr>
-              <w:pStyle w:val="ListParagraph"/>
-              <w:numPr>
-                <w:ilvl w:val="0"/>
-                <w:numId w:val="3"/>
-              </w:numPr>
-              <w:spacing w:after="160"/>
-            </w:pPr>
-            <w:r>
-              <w:t>Scenario_on_art=baseline_on_art</w:t>
-            </w:r>
-          </w:p>
-          <w:p>
-            <w:pPr>
-              <w:pStyle w:val="ListParagraph"/>
-              <w:numPr>
-                <w:ilvl w:val="0"/>
-                <w:numId w:val="3"/>
               </w:numPr>
               <w:spacing w:after="160"/>
             </w:pPr>
@@ -1268,11 +1266,7 @@
         <w:spacing w:after="160"/>
       </w:pPr>
       <w:r>
-        <w:t xml:space="preserve">Uses a standardized population with the following parameters: 1,000,000 total population, 5% HIV prevalence (50,000 PLHIV), 80% diagnosed, 75% on ART, 85% </w:t>
-      </w:r>
-      <w:r>
-        <w:lastRenderedPageBreak/>
-        <w:t xml:space="preserve">virally suppressed, 5,000 new infections per year, and 1,000 AIDS deaths per year. Different values selected for scenario and baseline preventions. </w:t>
+        <w:t xml:space="preserve">Uses a standardized population with the following parameters: 1,000,000 total population, 5% HIV prevalence (50,000 PLHIV), 80% diagnosed, 75% on ART, 85% virally suppressed, 5,000 new infections per year, and 1,000 AIDS deaths per year. Different values selected for scenario and baseline preventions. </w:t>
       </w:r>
     </w:p>
     <w:p>
@@ -1918,7 +1912,6 @@
     </w:p>
     <w:p>
       <w:r>
-        <w:lastRenderedPageBreak/>
         <w:t>Following intervention values assumed: vmmc efficacy=60%</w:t>
       </w:r>
     </w:p>
@@ -2735,7 +2728,6 @@
                 <w:b/>
                 <w:bCs/>
               </w:rPr>
-              <w:lastRenderedPageBreak/>
               <w:t>#</w:t>
             </w:r>
           </w:p>
@@ -3456,7 +3448,6 @@
         <w:spacing w:after="160"/>
       </w:pPr>
       <w:r>
-        <w:lastRenderedPageBreak/>
         <w:t>Uses a standardized population with the following parameters: 1,000,000 total population, 5% HIV prevalence (50,000 PLHIV), 80% diagnosed, 75% on ART, 85% virally suppressed, 5,000 new infections per year, 1,000 AIDS deaths per year</w:t>
       </w:r>
       <w:r>
@@ -3966,10 +3957,7 @@
               <w:spacing w:after="160"/>
             </w:pPr>
             <w:r>
-              <w:t xml:space="preserve">Scale up general facility testing  by 10 000 tests – </w:t>
-            </w:r>
-            <w:r>
-              <w:t>ART initiations</w:t>
+              <w:t>Scale up general facility testing  by 10 000 tests – ART initiations</w:t>
             </w:r>
           </w:p>
         </w:tc>
@@ -3996,10 +3984,7 @@
               <w:spacing w:after="160"/>
             </w:pPr>
             <w:r>
-              <w:t>Experted_art_inititations</w:t>
-            </w:r>
-            <w:r>
-              <w:t xml:space="preserve"> = </w:t>
+              <w:t xml:space="preserve">Experted_art_inititations = </w:t>
             </w:r>
             <w:r>
               <w:t>~190</w:t>
@@ -4033,10 +4018,7 @@
               <w:spacing w:after="160"/>
             </w:pPr>
             <w:r>
-              <w:t xml:space="preserve">Scale up general facility testing  by 10 000 tests – </w:t>
-            </w:r>
-            <w:r>
-              <w:t>viral suppression</w:t>
+              <w:t>Scale up general facility testing  by 10 000 tests – viral suppression</w:t>
             </w:r>
           </w:p>
         </w:tc>
@@ -4298,7 +4280,6 @@
               <w:spacing w:after="160"/>
             </w:pPr>
             <w:r>
-              <w:lastRenderedPageBreak/>
               <w:t>2</w:t>
             </w:r>
           </w:p>
@@ -4312,10 +4293,7 @@
               <w:spacing w:after="160"/>
             </w:pPr>
             <w:r>
-              <w:t>Scale up general facility testing  by 10 000 tests and targeted testing by 10 000– positive tests</w:t>
-            </w:r>
-            <w:r>
-              <w:t xml:space="preserve"> 2</w:t>
+              <w:t>Scale up general facility testing  by 10 000 tests and targeted testing by 10 000– positive tests 2</w:t>
             </w:r>
           </w:p>
         </w:tc>
@@ -4347,10 +4325,7 @@
               <w:spacing w:after="160"/>
             </w:pPr>
             <w:r>
-              <w:t>Expected_positives_total</w:t>
-            </w:r>
-            <w:r>
-              <w:t>=</w:t>
+              <w:t>Expected_positives_total=</w:t>
             </w:r>
             <w:r>
               <w:t>633</w:t>
@@ -4400,10 +4375,7 @@
               <w:spacing w:after="160"/>
             </w:pPr>
             <w:r>
-              <w:t>Expected_new_diagnoses = Expected_positives_total</w:t>
-            </w:r>
-            <w:r>
-              <w:t>*(1-re_test_prop)</w:t>
+              <w:t>Expected_new_diagnoses = Expected_positives_total*(1-re_test_prop)</w:t>
             </w:r>
           </w:p>
           <w:p>
@@ -4582,8 +4554,46 @@
               <w:spacing w:after="160"/>
             </w:pPr>
             <w:r>
-              <w:t xml:space="preserve">Scale up general facility testing  by 10 000 tests – </w:t>
-            </w:r>
+              <w:t>Scale up general facility testing  by 10 000 tests – 1</w:t>
+            </w:r>
+            <w:r>
+              <w:rPr>
+                <w:vertAlign w:val="superscript"/>
+              </w:rPr>
+              <w:t>st</w:t>
+            </w:r>
+            <w:r>
+              <w:t xml:space="preserve"> 95</w:t>
+            </w:r>
+          </w:p>
+        </w:tc>
+        <w:tc>
+          <w:tcPr>
+            <w:tcW w:w="6462" w:type="dxa"/>
+          </w:tcPr>
+          <w:p>
+            <w:pPr>
+              <w:spacing w:after="160"/>
+            </w:pPr>
+            <w:r>
+              <w:t>New_diagnosed</w:t>
+            </w:r>
+            <w:r>
+              <w:t>_total= baseline_diagnosed</w:t>
+            </w:r>
+            <w:r>
+              <w:t>+expected_new_diagnoses</w:t>
+            </w:r>
+          </w:p>
+          <w:p>
+            <w:pPr>
+              <w:spacing w:after="160"/>
+            </w:pPr>
+          </w:p>
+          <w:p>
+            <w:pPr>
+              <w:spacing w:after="160"/>
+            </w:pPr>
             <w:r>
               <w:t>1</w:t>
             </w:r>
@@ -4594,54 +4604,10 @@
               <w:t>st</w:t>
             </w:r>
             <w:r>
-              <w:t xml:space="preserve"> 95</w:t>
-            </w:r>
-          </w:p>
-        </w:tc>
-        <w:tc>
-          <w:tcPr>
-            <w:tcW w:w="6462" w:type="dxa"/>
-          </w:tcPr>
-          <w:p>
-            <w:pPr>
-              <w:spacing w:after="160"/>
-            </w:pPr>
-            <w:r>
-              <w:t>New_diagnosed</w:t>
-            </w:r>
-            <w:r>
-              <w:t>_total= baseline_diagnosed</w:t>
-            </w:r>
-            <w:r>
-              <w:t>+expected_new_diagnoses</w:t>
-            </w:r>
-          </w:p>
-          <w:p>
-            <w:pPr>
-              <w:spacing w:after="160"/>
-            </w:pPr>
-          </w:p>
-          <w:p>
-            <w:pPr>
-              <w:spacing w:after="160"/>
-            </w:pPr>
-            <w:r>
-              <w:t>1</w:t>
-            </w:r>
-            <w:r>
-              <w:rPr>
-                <w:vertAlign w:val="superscript"/>
-              </w:rPr>
-              <w:t>st</w:t>
-            </w:r>
-            <w:r>
               <w:t>_95=</w:t>
             </w:r>
             <w:r>
-              <w:t xml:space="preserve"> </w:t>
-            </w:r>
-            <w:r>
-              <w:t>diagnosed</w:t>
+              <w:t xml:space="preserve"> diagnosed</w:t>
             </w:r>
             <w:r>
               <w:t xml:space="preserve">/PLHIV = </w:t>
@@ -5435,23 +5401,23 @@
       </w:pPr>
     </w:lvl>
   </w:abstractNum>
-  <w:num w:numId="1" w16cid:durableId="1895044576">
+  <w:num w:numId="1" w16cid:durableId="1294671567">
+    <w:abstractNumId w:val="2"/>
+  </w:num>
+  <w:num w:numId="2" w16cid:durableId="1388527350">
+    <w:abstractNumId w:val="1"/>
+  </w:num>
+  <w:num w:numId="3" w16cid:durableId="1400325688">
+    <w:abstractNumId w:val="0"/>
+  </w:num>
+  <w:num w:numId="4" w16cid:durableId="1587029756">
+    <w:abstractNumId w:val="4"/>
+  </w:num>
+  <w:num w:numId="5" w16cid:durableId="1895044576">
     <w:abstractNumId w:val="3"/>
     <w:lvlOverride w:ilvl="0">
       <w:startOverride w:val="1"/>
     </w:lvlOverride>
-  </w:num>
-  <w:num w:numId="2" w16cid:durableId="1294671567">
-    <w:abstractNumId w:val="2"/>
-  </w:num>
-  <w:num w:numId="3" w16cid:durableId="1388527350">
-    <w:abstractNumId w:val="1"/>
-  </w:num>
-  <w:num w:numId="4" w16cid:durableId="1400325688">
-    <w:abstractNumId w:val="0"/>
-  </w:num>
-  <w:num w:numId="5" w16cid:durableId="1587029756">
-    <w:abstractNumId w:val="4"/>
   </w:num>
 </w:numbering>
 </file>
@@ -6431,16 +6397,4 @@
     </a:ext>
   </a:extLst>
 </a:theme>
-</file>
-
-<file path=customXml/item1.xml><?xml version="1.0" encoding="utf-8"?>
-<b:Sources xmlns:b="http://schemas.openxmlformats.org/officeDocument/2006/bibliography" xmlns="http://schemas.openxmlformats.org/officeDocument/2006/bibliography" SelectedStyle="/APASixthEditionOfficeOnline.xsl" StyleName="APA" Version="6"/>
-</file>
-
-<file path=customXml/itemProps1.xml><?xml version="1.0" encoding="utf-8"?>
-<ds:datastoreItem xmlns:ds="http://schemas.openxmlformats.org/officeDocument/2006/customXml" ds:itemID="{F78F3579-9448-9A4E-BEC8-6D6F798BD66C}">
-  <ds:schemaRefs>
-    <ds:schemaRef ds:uri="http://schemas.openxmlformats.org/officeDocument/2006/bibliography"/>
-  </ds:schemaRefs>
-</ds:datastoreItem>
 </file>
</xml_diff>

<commit_message>
Start 12 Feb - before UI prep limits
</commit_message>
<xml_diff>
--- a/resources/Test_Framework_Description.docx
+++ b/resources/Test_Framework_Description.docx
@@ -34,7 +34,7 @@
         </w:trPr>
         <w:tc>
           <w:tcPr>
-            <w:tcW w:w="4895" w:type="dxa"/>
+            <w:tcW w:w="4143" w:type="dxa"/>
           </w:tcPr>
           <w:p>
             <w:pPr>
@@ -55,7 +55,7 @@
         </w:tc>
         <w:tc>
           <w:tcPr>
-            <w:tcW w:w="4895" w:type="dxa"/>
+            <w:tcW w:w="5647" w:type="dxa"/>
           </w:tcPr>
           <w:p>
             <w:pPr>
@@ -81,7 +81,7 @@
         </w:trPr>
         <w:tc>
           <w:tcPr>
-            <w:tcW w:w="4895" w:type="dxa"/>
+            <w:tcW w:w="4143" w:type="dxa"/>
           </w:tcPr>
           <w:p>
             <w:pPr>
@@ -103,7 +103,7 @@
         </w:tc>
         <w:tc>
           <w:tcPr>
-            <w:tcW w:w="4895" w:type="dxa"/>
+            <w:tcW w:w="5647" w:type="dxa"/>
           </w:tcPr>
           <w:p>
             <w:pPr>
@@ -170,7 +170,7 @@
         </w:trPr>
         <w:tc>
           <w:tcPr>
-            <w:tcW w:w="4895" w:type="dxa"/>
+            <w:tcW w:w="4143" w:type="dxa"/>
           </w:tcPr>
           <w:p>
             <w:pPr>
@@ -183,7 +183,7 @@
         </w:tc>
         <w:tc>
           <w:tcPr>
-            <w:tcW w:w="4895" w:type="dxa"/>
+            <w:tcW w:w="5647" w:type="dxa"/>
           </w:tcPr>
           <w:p>
             <w:pPr>
@@ -228,7 +228,7 @@
         </w:trPr>
         <w:tc>
           <w:tcPr>
-            <w:tcW w:w="4895" w:type="dxa"/>
+            <w:tcW w:w="4143" w:type="dxa"/>
           </w:tcPr>
           <w:p>
             <w:pPr>
@@ -253,7 +253,7 @@
         </w:tc>
         <w:tc>
           <w:tcPr>
-            <w:tcW w:w="4895" w:type="dxa"/>
+            <w:tcW w:w="5647" w:type="dxa"/>
           </w:tcPr>
           <w:p>
             <w:pPr>
@@ -384,6 +384,7 @@
               <w:spacing w:after="120"/>
             </w:pPr>
             <w:r>
+              <w:lastRenderedPageBreak/>
               <w:t>Virally_suppressed = ART_inititations*0.9</w:t>
             </w:r>
             <w:r>
@@ -398,7 +399,7 @@
         </w:trPr>
         <w:tc>
           <w:tcPr>
-            <w:tcW w:w="4895" w:type="dxa"/>
+            <w:tcW w:w="4143" w:type="dxa"/>
           </w:tcPr>
           <w:p>
             <w:pPr>
@@ -408,7 +409,7 @@
         </w:tc>
         <w:tc>
           <w:tcPr>
-            <w:tcW w:w="4895" w:type="dxa"/>
+            <w:tcW w:w="5647" w:type="dxa"/>
           </w:tcPr>
           <w:p>
             <w:pPr>
@@ -423,7 +424,7 @@
         </w:trPr>
         <w:tc>
           <w:tcPr>
-            <w:tcW w:w="4895" w:type="dxa"/>
+            <w:tcW w:w="4143" w:type="dxa"/>
           </w:tcPr>
           <w:p>
             <w:pPr>
@@ -433,7 +434,7 @@
         </w:tc>
         <w:tc>
           <w:tcPr>
-            <w:tcW w:w="4895" w:type="dxa"/>
+            <w:tcW w:w="5647" w:type="dxa"/>
           </w:tcPr>
           <w:p>
             <w:pPr>
@@ -448,7 +449,7 @@
         </w:trPr>
         <w:tc>
           <w:tcPr>
-            <w:tcW w:w="4895" w:type="dxa"/>
+            <w:tcW w:w="4143" w:type="dxa"/>
           </w:tcPr>
           <w:p>
             <w:pPr>
@@ -458,7 +459,7 @@
         </w:tc>
         <w:tc>
           <w:tcPr>
-            <w:tcW w:w="4895" w:type="dxa"/>
+            <w:tcW w:w="5647" w:type="dxa"/>
           </w:tcPr>
           <w:p>
             <w:pPr>
@@ -478,7 +479,7 @@
         <w:pStyle w:val="Heading1"/>
       </w:pPr>
       <w:r>
-        <w:t>Test Framework Documentation</w:t>
+        <w:t>App and Logic validation</w:t>
       </w:r>
     </w:p>
     <w:p>
@@ -486,22 +487,360 @@
         <w:pStyle w:val="Heading2"/>
       </w:pPr>
       <w:r>
-        <w:t>Overview</w:t>
-      </w:r>
+        <w:t>App Validation</w:t>
+      </w:r>
+    </w:p>
+    <w:tbl>
+      <w:tblPr>
+        <w:tblStyle w:val="TableGrid"/>
+        <w:tblW w:w="0" w:type="auto"/>
+        <w:tblLook w:val="04A0" w:firstRow="1" w:lastRow="0" w:firstColumn="1" w:lastColumn="0" w:noHBand="0" w:noVBand="1"/>
+      </w:tblPr>
+      <w:tblGrid>
+        <w:gridCol w:w="461"/>
+        <w:gridCol w:w="3362"/>
+        <w:gridCol w:w="5527"/>
+      </w:tblGrid>
+      <w:tr>
+        <w:tc>
+          <w:tcPr>
+            <w:tcW w:w="461" w:type="dxa"/>
+          </w:tcPr>
+          <w:p>
+            <w:pPr>
+              <w:pStyle w:val="Heading2"/>
+              <w:rPr>
+                <w:b w:val="0"/>
+                <w:bCs w:val="0"/>
+              </w:rPr>
+            </w:pPr>
+            <w:r>
+              <w:rPr>
+                <w:b w:val="0"/>
+                <w:bCs w:val="0"/>
+              </w:rPr>
+              <w:t>1</w:t>
+            </w:r>
+          </w:p>
+        </w:tc>
+        <w:tc>
+          <w:tcPr>
+            <w:tcW w:w="3362" w:type="dxa"/>
+          </w:tcPr>
+          <w:p>
+            <w:pPr>
+              <w:pStyle w:val="Heading2"/>
+              <w:rPr>
+                <w:b w:val="0"/>
+                <w:bCs w:val="0"/>
+              </w:rPr>
+            </w:pPr>
+            <w:r>
+              <w:rPr>
+                <w:b w:val="0"/>
+                <w:bCs w:val="0"/>
+              </w:rPr>
+              <w:t>Input validation - prep</w:t>
+            </w:r>
+          </w:p>
+        </w:tc>
+        <w:tc>
+          <w:tcPr>
+            <w:tcW w:w="5527" w:type="dxa"/>
+          </w:tcPr>
+          <w:p>
+            <w:pPr>
+              <w:pStyle w:val="Heading2"/>
+              <w:rPr>
+                <w:b w:val="0"/>
+                <w:bCs w:val="0"/>
+              </w:rPr>
+            </w:pPr>
+            <w:r>
+              <w:rPr>
+                <w:b w:val="0"/>
+                <w:bCs w:val="0"/>
+              </w:rPr>
+              <w:t>People on oral prep + people on lenacapavir cannot exceed adult population</w:t>
+            </w:r>
+          </w:p>
+        </w:tc>
+      </w:tr>
+      <w:tr>
+        <w:tc>
+          <w:tcPr>
+            <w:tcW w:w="461" w:type="dxa"/>
+          </w:tcPr>
+          <w:p>
+            <w:pPr>
+              <w:pStyle w:val="Heading2"/>
+              <w:rPr>
+                <w:b w:val="0"/>
+                <w:bCs w:val="0"/>
+              </w:rPr>
+            </w:pPr>
+          </w:p>
+        </w:tc>
+        <w:tc>
+          <w:tcPr>
+            <w:tcW w:w="3362" w:type="dxa"/>
+          </w:tcPr>
+          <w:p>
+            <w:pPr>
+              <w:pStyle w:val="Heading2"/>
+              <w:rPr>
+                <w:b w:val="0"/>
+                <w:bCs w:val="0"/>
+              </w:rPr>
+            </w:pPr>
+            <w:r>
+              <w:rPr>
+                <w:b w:val="0"/>
+                <w:bCs w:val="0"/>
+              </w:rPr>
+              <w:t>Input validation – vmmc</w:t>
+            </w:r>
+          </w:p>
+        </w:tc>
+        <w:tc>
+          <w:tcPr>
+            <w:tcW w:w="5527" w:type="dxa"/>
+          </w:tcPr>
+          <w:p>
+            <w:pPr>
+              <w:pStyle w:val="Heading2"/>
+              <w:rPr>
+                <w:b w:val="0"/>
+                <w:bCs w:val="0"/>
+              </w:rPr>
+            </w:pPr>
+            <w:r>
+              <w:rPr>
+                <w:b w:val="0"/>
+                <w:bCs w:val="0"/>
+              </w:rPr>
+              <w:t>Number of people receiving annual VMMC cannot exceed population of uncircumcised males</w:t>
+            </w:r>
+          </w:p>
+        </w:tc>
+      </w:tr>
+      <w:tr>
+        <w:tc>
+          <w:tcPr>
+            <w:tcW w:w="461" w:type="dxa"/>
+          </w:tcPr>
+          <w:p>
+            <w:pPr>
+              <w:pStyle w:val="Heading2"/>
+              <w:rPr>
+                <w:b w:val="0"/>
+                <w:bCs w:val="0"/>
+              </w:rPr>
+            </w:pPr>
+          </w:p>
+        </w:tc>
+        <w:tc>
+          <w:tcPr>
+            <w:tcW w:w="3362" w:type="dxa"/>
+          </w:tcPr>
+          <w:p>
+            <w:pPr>
+              <w:pStyle w:val="Heading2"/>
+              <w:rPr>
+                <w:b w:val="0"/>
+                <w:bCs w:val="0"/>
+              </w:rPr>
+            </w:pPr>
+          </w:p>
+        </w:tc>
+        <w:tc>
+          <w:tcPr>
+            <w:tcW w:w="5527" w:type="dxa"/>
+          </w:tcPr>
+          <w:p>
+            <w:pPr>
+              <w:pStyle w:val="Heading2"/>
+              <w:rPr>
+                <w:b w:val="0"/>
+                <w:bCs w:val="0"/>
+              </w:rPr>
+            </w:pPr>
+          </w:p>
+        </w:tc>
+      </w:tr>
+      <w:tr>
+        <w:tc>
+          <w:tcPr>
+            <w:tcW w:w="461" w:type="dxa"/>
+          </w:tcPr>
+          <w:p>
+            <w:pPr>
+              <w:pStyle w:val="Heading2"/>
+              <w:rPr>
+                <w:b w:val="0"/>
+                <w:bCs w:val="0"/>
+              </w:rPr>
+            </w:pPr>
+          </w:p>
+        </w:tc>
+        <w:tc>
+          <w:tcPr>
+            <w:tcW w:w="3362" w:type="dxa"/>
+          </w:tcPr>
+          <w:p>
+            <w:pPr>
+              <w:pStyle w:val="Heading2"/>
+              <w:rPr>
+                <w:b w:val="0"/>
+                <w:bCs w:val="0"/>
+              </w:rPr>
+            </w:pPr>
+          </w:p>
+        </w:tc>
+        <w:tc>
+          <w:tcPr>
+            <w:tcW w:w="5527" w:type="dxa"/>
+          </w:tcPr>
+          <w:p>
+            <w:pPr>
+              <w:pStyle w:val="Heading2"/>
+              <w:rPr>
+                <w:b w:val="0"/>
+                <w:bCs w:val="0"/>
+              </w:rPr>
+            </w:pPr>
+          </w:p>
+        </w:tc>
+      </w:tr>
+      <w:tr>
+        <w:tc>
+          <w:tcPr>
+            <w:tcW w:w="461" w:type="dxa"/>
+          </w:tcPr>
+          <w:p>
+            <w:pPr>
+              <w:pStyle w:val="Heading2"/>
+              <w:rPr>
+                <w:b w:val="0"/>
+                <w:bCs w:val="0"/>
+              </w:rPr>
+            </w:pPr>
+          </w:p>
+        </w:tc>
+        <w:tc>
+          <w:tcPr>
+            <w:tcW w:w="3362" w:type="dxa"/>
+          </w:tcPr>
+          <w:p>
+            <w:pPr>
+              <w:pStyle w:val="Heading2"/>
+              <w:rPr>
+                <w:b w:val="0"/>
+                <w:bCs w:val="0"/>
+              </w:rPr>
+            </w:pPr>
+          </w:p>
+        </w:tc>
+        <w:tc>
+          <w:tcPr>
+            <w:tcW w:w="5527" w:type="dxa"/>
+          </w:tcPr>
+          <w:p>
+            <w:pPr>
+              <w:pStyle w:val="Heading2"/>
+              <w:rPr>
+                <w:b w:val="0"/>
+                <w:bCs w:val="0"/>
+              </w:rPr>
+            </w:pPr>
+          </w:p>
+        </w:tc>
+      </w:tr>
+      <w:tr>
+        <w:tc>
+          <w:tcPr>
+            <w:tcW w:w="461" w:type="dxa"/>
+          </w:tcPr>
+          <w:p>
+            <w:pPr>
+              <w:pStyle w:val="Heading2"/>
+              <w:rPr>
+                <w:b w:val="0"/>
+                <w:bCs w:val="0"/>
+              </w:rPr>
+            </w:pPr>
+          </w:p>
+        </w:tc>
+        <w:tc>
+          <w:tcPr>
+            <w:tcW w:w="3362" w:type="dxa"/>
+          </w:tcPr>
+          <w:p>
+            <w:pPr>
+              <w:pStyle w:val="Heading2"/>
+              <w:rPr>
+                <w:b w:val="0"/>
+                <w:bCs w:val="0"/>
+              </w:rPr>
+            </w:pPr>
+          </w:p>
+        </w:tc>
+        <w:tc>
+          <w:tcPr>
+            <w:tcW w:w="5527" w:type="dxa"/>
+          </w:tcPr>
+          <w:p>
+            <w:pPr>
+              <w:pStyle w:val="Heading2"/>
+              <w:rPr>
+                <w:b w:val="0"/>
+                <w:bCs w:val="0"/>
+              </w:rPr>
+            </w:pPr>
+          </w:p>
+        </w:tc>
+      </w:tr>
+    </w:tbl>
+    <w:p>
+      <w:pPr>
+        <w:pStyle w:val="Heading2"/>
+      </w:pPr>
     </w:p>
     <w:p>
       <w:pPr>
-        <w:spacing w:after="240"/>
-      </w:pPr>
-      <w:r>
-        <w:t>This document describes the comprehensive testing framework for the HIV Intervention Impact Calculator. The test suite validates model calculations, intervention logic, and ensures the accuracy of population dynamics, cascade calculations, and impact metrics. Each test is designed to verify specific aspects of the model's functionality.</w:t>
-      </w:r>
+        <w:pStyle w:val="Heading1"/>
+      </w:pPr>
     </w:p>
     <w:p>
       <w:pPr>
+        <w:pStyle w:val="Heading1"/>
+      </w:pPr>
+      <w:r>
+        <w:t>Test Framework Documentation</w:t>
+      </w:r>
+    </w:p>
+    <w:p>
+      <w:pPr>
         <w:pStyle w:val="Heading2"/>
       </w:pPr>
       <w:r>
+        <w:t>Overview</w:t>
+      </w:r>
+    </w:p>
+    <w:p>
+      <w:pPr>
+        <w:spacing w:after="240"/>
+      </w:pPr>
+      <w:r>
+        <w:t>This document describes the comprehensive testing framework for the HIV Intervention Impact Calculator. The test suite validates model calculations, intervention logic, and ensures the accuracy of population dynamics, cascade calculations, and impact metrics. Each test is designed to verify specific aspects of the model's functionality.</w:t>
+      </w:r>
+    </w:p>
+    <w:p>
+      <w:pPr>
+        <w:pStyle w:val="Heading2"/>
+      </w:pPr>
+      <w:r>
+        <w:lastRenderedPageBreak/>
         <w:t>Key test functions in R</w:t>
       </w:r>
     </w:p>
@@ -993,6 +1332,7 @@
                 <w:b/>
                 <w:bCs/>
               </w:rPr>
+              <w:lastRenderedPageBreak/>
               <w:t>#</w:t>
             </w:r>
           </w:p>
@@ -1621,6 +1961,7 @@
               <w:spacing w:after="160"/>
             </w:pPr>
             <w:r>
+              <w:lastRenderedPageBreak/>
               <w:t>4.</w:t>
             </w:r>
           </w:p>
@@ -3090,6 +3431,7 @@
               <w:spacing w:after="160"/>
             </w:pPr>
             <w:r>
+              <w:lastRenderedPageBreak/>
               <w:t>2.</w:t>
             </w:r>
           </w:p>
@@ -3886,6 +4228,7 @@
               <w:spacing w:after="160"/>
             </w:pPr>
             <w:r>
+              <w:lastRenderedPageBreak/>
               <w:t>2.</w:t>
             </w:r>
           </w:p>
@@ -4477,6 +4820,7 @@
               <w:spacing w:after="160"/>
             </w:pPr>
             <w:r>
+              <w:lastRenderedPageBreak/>
               <w:t>5</w:t>
             </w:r>
           </w:p>

</xml_diff>

<commit_message>
Basic data & prep app limits
</commit_message>
<xml_diff>
--- a/resources/Test_Framework_Description.docx
+++ b/resources/Test_Framework_Description.docx
@@ -384,7 +384,6 @@
               <w:spacing w:after="120"/>
             </w:pPr>
             <w:r>
-              <w:lastRenderedPageBreak/>
               <w:t>Virally_suppressed = ART_inititations*0.9</w:t>
             </w:r>
             <w:r>
@@ -497,14 +496,18 @@
         <w:tblLook w:val="04A0" w:firstRow="1" w:lastRow="0" w:firstColumn="1" w:lastColumn="0" w:noHBand="0" w:noVBand="1"/>
       </w:tblPr>
       <w:tblGrid>
-        <w:gridCol w:w="461"/>
-        <w:gridCol w:w="3362"/>
-        <w:gridCol w:w="5527"/>
+        <w:gridCol w:w="416"/>
+        <w:gridCol w:w="1989"/>
+        <w:gridCol w:w="4114"/>
+        <w:gridCol w:w="2831"/>
       </w:tblGrid>
       <w:tr>
-        <w:tc>
-          <w:tcPr>
-            <w:tcW w:w="461" w:type="dxa"/>
+        <w:trPr>
+          <w:trHeight w:val="2228"/>
+        </w:trPr>
+        <w:tc>
+          <w:tcPr>
+            <w:tcW w:w="416" w:type="dxa"/>
           </w:tcPr>
           <w:p>
             <w:pPr>
@@ -514,18 +517,11 @@
                 <w:bCs w:val="0"/>
               </w:rPr>
             </w:pPr>
-            <w:r>
-              <w:rPr>
-                <w:b w:val="0"/>
-                <w:bCs w:val="0"/>
-              </w:rPr>
-              <w:t>1</w:t>
-            </w:r>
-          </w:p>
-        </w:tc>
-        <w:tc>
-          <w:tcPr>
-            <w:tcW w:w="3362" w:type="dxa"/>
+          </w:p>
+        </w:tc>
+        <w:tc>
+          <w:tcPr>
+            <w:tcW w:w="1989" w:type="dxa"/>
           </w:tcPr>
           <w:p>
             <w:pPr>
@@ -540,13 +536,34 @@
                 <w:b w:val="0"/>
                 <w:bCs w:val="0"/>
               </w:rPr>
-              <w:t>Input validation - prep</w:t>
-            </w:r>
-          </w:p>
-        </w:tc>
-        <w:tc>
-          <w:tcPr>
-            <w:tcW w:w="5527" w:type="dxa"/>
+              <w:t xml:space="preserve">Epi </w:t>
+            </w:r>
+            <w:r>
+              <w:rPr>
+                <w:b w:val="0"/>
+                <w:bCs w:val="0"/>
+              </w:rPr>
+              <w:t xml:space="preserve">params </w:t>
+            </w:r>
+            <w:r>
+              <w:rPr>
+                <w:b w:val="0"/>
+                <w:bCs w:val="0"/>
+              </w:rPr>
+              <w:t>– lower limits</w:t>
+            </w:r>
+            <w:r>
+              <w:rPr>
+                <w:b w:val="0"/>
+                <w:bCs w:val="0"/>
+              </w:rPr>
+              <w:t xml:space="preserve"> </w:t>
+            </w:r>
+          </w:p>
+        </w:tc>
+        <w:tc>
+          <w:tcPr>
+            <w:tcW w:w="4114" w:type="dxa"/>
           </w:tcPr>
           <w:p>
             <w:pPr>
@@ -561,15 +578,586 @@
                 <w:b w:val="0"/>
                 <w:bCs w:val="0"/>
               </w:rPr>
+              <w:t>Cannot be negative</w:t>
+            </w:r>
+          </w:p>
+        </w:tc>
+        <w:tc>
+          <w:tcPr>
+            <w:tcW w:w="2831" w:type="dxa"/>
+          </w:tcPr>
+          <w:p>
+            <w:pPr>
+              <w:pStyle w:val="Heading2"/>
+              <w:jc w:val="center"/>
+              <w:rPr>
+                <w:b w:val="0"/>
+                <w:bCs w:val="0"/>
+              </w:rPr>
+            </w:pPr>
+          </w:p>
+        </w:tc>
+      </w:tr>
+      <w:tr>
+        <w:trPr>
+          <w:trHeight w:val="2228"/>
+        </w:trPr>
+        <w:tc>
+          <w:tcPr>
+            <w:tcW w:w="416" w:type="dxa"/>
+          </w:tcPr>
+          <w:p>
+            <w:pPr>
+              <w:pStyle w:val="Heading2"/>
+              <w:rPr>
+                <w:b w:val="0"/>
+                <w:bCs w:val="0"/>
+              </w:rPr>
+            </w:pPr>
+          </w:p>
+        </w:tc>
+        <w:tc>
+          <w:tcPr>
+            <w:tcW w:w="1989" w:type="dxa"/>
+          </w:tcPr>
+          <w:p>
+            <w:pPr>
+              <w:pStyle w:val="Heading2"/>
+              <w:rPr>
+                <w:b w:val="0"/>
+                <w:bCs w:val="0"/>
+              </w:rPr>
+            </w:pPr>
+            <w:r>
+              <w:rPr>
+                <w:b w:val="0"/>
+                <w:bCs w:val="0"/>
+              </w:rPr>
+              <w:t xml:space="preserve">Epi params – percentage indicators </w:t>
+            </w:r>
+          </w:p>
+        </w:tc>
+        <w:tc>
+          <w:tcPr>
+            <w:tcW w:w="4114" w:type="dxa"/>
+          </w:tcPr>
+          <w:p>
+            <w:pPr>
+              <w:pStyle w:val="Heading2"/>
+              <w:rPr>
+                <w:b w:val="0"/>
+                <w:bCs w:val="0"/>
+              </w:rPr>
+            </w:pPr>
+            <w:r>
+              <w:rPr>
+                <w:b w:val="0"/>
+                <w:bCs w:val="0"/>
+              </w:rPr>
+              <w:t>Cannot exceed 100%</w:t>
+            </w:r>
+          </w:p>
+        </w:tc>
+        <w:tc>
+          <w:tcPr>
+            <w:tcW w:w="2831" w:type="dxa"/>
+          </w:tcPr>
+          <w:p>
+            <w:pPr>
+              <w:pStyle w:val="Heading2"/>
+              <w:jc w:val="center"/>
+              <w:rPr>
+                <w:b w:val="0"/>
+                <w:bCs w:val="0"/>
+              </w:rPr>
+            </w:pPr>
+          </w:p>
+        </w:tc>
+      </w:tr>
+      <w:tr>
+        <w:trPr>
+          <w:trHeight w:val="2228"/>
+        </w:trPr>
+        <w:tc>
+          <w:tcPr>
+            <w:tcW w:w="416" w:type="dxa"/>
+          </w:tcPr>
+          <w:p>
+            <w:pPr>
+              <w:pStyle w:val="Heading2"/>
+              <w:rPr>
+                <w:b w:val="0"/>
+                <w:bCs w:val="0"/>
+              </w:rPr>
+            </w:pPr>
+          </w:p>
+        </w:tc>
+        <w:tc>
+          <w:tcPr>
+            <w:tcW w:w="1989" w:type="dxa"/>
+          </w:tcPr>
+          <w:p>
+            <w:pPr>
+              <w:pStyle w:val="Heading2"/>
+              <w:rPr>
+                <w:b w:val="0"/>
+                <w:bCs w:val="0"/>
+              </w:rPr>
+            </w:pPr>
+            <w:r>
+              <w:rPr>
+                <w:b w:val="0"/>
+                <w:bCs w:val="0"/>
+              </w:rPr>
+              <w:t>Epi params – new infections</w:t>
+            </w:r>
+          </w:p>
+        </w:tc>
+        <w:tc>
+          <w:tcPr>
+            <w:tcW w:w="4114" w:type="dxa"/>
+          </w:tcPr>
+          <w:p>
+            <w:pPr>
+              <w:pStyle w:val="Heading2"/>
+              <w:rPr>
+                <w:b w:val="0"/>
+                <w:bCs w:val="0"/>
+              </w:rPr>
+            </w:pPr>
+            <w:r>
+              <w:rPr>
+                <w:b w:val="0"/>
+                <w:bCs w:val="0"/>
+              </w:rPr>
+              <w:t xml:space="preserve">Cannot exceed HIV negative </w:t>
+            </w:r>
+            <w:r>
+              <w:rPr>
+                <w:b w:val="0"/>
+                <w:bCs w:val="0"/>
+              </w:rPr>
+              <w:t>population</w:t>
+            </w:r>
+          </w:p>
+        </w:tc>
+        <w:tc>
+          <w:tcPr>
+            <w:tcW w:w="2831" w:type="dxa"/>
+          </w:tcPr>
+          <w:p>
+            <w:pPr>
+              <w:pStyle w:val="Heading2"/>
+              <w:jc w:val="center"/>
+              <w:rPr>
+                <w:b w:val="0"/>
+                <w:bCs w:val="0"/>
+              </w:rPr>
+            </w:pPr>
+          </w:p>
+        </w:tc>
+      </w:tr>
+      <w:tr>
+        <w:trPr>
+          <w:trHeight w:val="2228"/>
+        </w:trPr>
+        <w:tc>
+          <w:tcPr>
+            <w:tcW w:w="416" w:type="dxa"/>
+          </w:tcPr>
+          <w:p>
+            <w:pPr>
+              <w:pStyle w:val="Heading2"/>
+              <w:rPr>
+                <w:b w:val="0"/>
+                <w:bCs w:val="0"/>
+              </w:rPr>
+            </w:pPr>
+          </w:p>
+        </w:tc>
+        <w:tc>
+          <w:tcPr>
+            <w:tcW w:w="1989" w:type="dxa"/>
+          </w:tcPr>
+          <w:p>
+            <w:pPr>
+              <w:pStyle w:val="Heading2"/>
+              <w:rPr>
+                <w:b w:val="0"/>
+                <w:bCs w:val="0"/>
+              </w:rPr>
+            </w:pPr>
+            <w:r>
+              <w:rPr>
+                <w:b w:val="0"/>
+                <w:bCs w:val="0"/>
+              </w:rPr>
+              <w:t>Epi params – new diagnoses</w:t>
+            </w:r>
+          </w:p>
+        </w:tc>
+        <w:tc>
+          <w:tcPr>
+            <w:tcW w:w="4114" w:type="dxa"/>
+          </w:tcPr>
+          <w:p>
+            <w:pPr>
+              <w:pStyle w:val="Heading2"/>
+              <w:rPr>
+                <w:b w:val="0"/>
+                <w:bCs w:val="0"/>
+              </w:rPr>
+            </w:pPr>
+            <w:r>
+              <w:rPr>
+                <w:b w:val="0"/>
+                <w:bCs w:val="0"/>
+              </w:rPr>
+              <w:t>Cannot exceed undiagnosed population</w:t>
+            </w:r>
+          </w:p>
+        </w:tc>
+        <w:tc>
+          <w:tcPr>
+            <w:tcW w:w="2831" w:type="dxa"/>
+          </w:tcPr>
+          <w:p>
+            <w:pPr>
+              <w:pStyle w:val="Heading2"/>
+              <w:jc w:val="center"/>
+              <w:rPr>
+                <w:b w:val="0"/>
+                <w:bCs w:val="0"/>
+              </w:rPr>
+            </w:pPr>
+          </w:p>
+        </w:tc>
+      </w:tr>
+      <w:tr>
+        <w:trPr>
+          <w:trHeight w:val="2228"/>
+        </w:trPr>
+        <w:tc>
+          <w:tcPr>
+            <w:tcW w:w="416" w:type="dxa"/>
+          </w:tcPr>
+          <w:p>
+            <w:pPr>
+              <w:pStyle w:val="Heading2"/>
+              <w:rPr>
+                <w:b w:val="0"/>
+                <w:bCs w:val="0"/>
+              </w:rPr>
+            </w:pPr>
+          </w:p>
+        </w:tc>
+        <w:tc>
+          <w:tcPr>
+            <w:tcW w:w="1989" w:type="dxa"/>
+          </w:tcPr>
+          <w:p>
+            <w:pPr>
+              <w:pStyle w:val="Heading2"/>
+              <w:rPr>
+                <w:b w:val="0"/>
+                <w:bCs w:val="0"/>
+              </w:rPr>
+            </w:pPr>
+            <w:r>
+              <w:rPr>
+                <w:b w:val="0"/>
+                <w:bCs w:val="0"/>
+              </w:rPr>
+              <w:t>Epi params – AIDS deaths</w:t>
+            </w:r>
+          </w:p>
+        </w:tc>
+        <w:tc>
+          <w:tcPr>
+            <w:tcW w:w="4114" w:type="dxa"/>
+          </w:tcPr>
+          <w:p>
+            <w:pPr>
+              <w:pStyle w:val="Heading2"/>
+              <w:rPr>
+                <w:b w:val="0"/>
+                <w:bCs w:val="0"/>
+              </w:rPr>
+            </w:pPr>
+            <w:r>
+              <w:rPr>
+                <w:b w:val="0"/>
+                <w:bCs w:val="0"/>
+              </w:rPr>
+              <w:t>Cannot exceed PLHIV</w:t>
+            </w:r>
+          </w:p>
+        </w:tc>
+        <w:tc>
+          <w:tcPr>
+            <w:tcW w:w="2831" w:type="dxa"/>
+          </w:tcPr>
+          <w:p>
+            <w:pPr>
+              <w:pStyle w:val="Heading2"/>
+              <w:jc w:val="center"/>
+              <w:rPr>
+                <w:b w:val="0"/>
+                <w:bCs w:val="0"/>
+              </w:rPr>
+            </w:pPr>
+          </w:p>
+        </w:tc>
+      </w:tr>
+      <w:tr>
+        <w:trPr>
+          <w:trHeight w:val="2228"/>
+        </w:trPr>
+        <w:tc>
+          <w:tcPr>
+            <w:tcW w:w="416" w:type="dxa"/>
+          </w:tcPr>
+          <w:p>
+            <w:pPr>
+              <w:pStyle w:val="Heading2"/>
+              <w:rPr>
+                <w:b w:val="0"/>
+                <w:bCs w:val="0"/>
+              </w:rPr>
+            </w:pPr>
+          </w:p>
+        </w:tc>
+        <w:tc>
+          <w:tcPr>
+            <w:tcW w:w="1989" w:type="dxa"/>
+          </w:tcPr>
+          <w:p>
+            <w:pPr>
+              <w:pStyle w:val="Heading2"/>
+              <w:rPr>
+                <w:b w:val="0"/>
+                <w:bCs w:val="0"/>
+              </w:rPr>
+            </w:pPr>
+            <w:r>
+              <w:rPr>
+                <w:b w:val="0"/>
+                <w:bCs w:val="0"/>
+              </w:rPr>
+              <w:t>Coverage limits</w:t>
+            </w:r>
+          </w:p>
+        </w:tc>
+        <w:tc>
+          <w:tcPr>
+            <w:tcW w:w="4114" w:type="dxa"/>
+          </w:tcPr>
+          <w:p>
+            <w:pPr>
+              <w:pStyle w:val="Heading2"/>
+              <w:rPr>
+                <w:b w:val="0"/>
+                <w:bCs w:val="0"/>
+              </w:rPr>
+            </w:pPr>
+            <w:r>
+              <w:rPr>
+                <w:b w:val="0"/>
+                <w:bCs w:val="0"/>
+              </w:rPr>
+              <w:t>All coverage interventions must be contained (0,100%)</w:t>
+            </w:r>
+          </w:p>
+        </w:tc>
+        <w:tc>
+          <w:tcPr>
+            <w:tcW w:w="2831" w:type="dxa"/>
+          </w:tcPr>
+          <w:p>
+            <w:pPr>
+              <w:pStyle w:val="Heading2"/>
+              <w:jc w:val="center"/>
+              <w:rPr>
+                <w:b w:val="0"/>
+                <w:bCs w:val="0"/>
+              </w:rPr>
+            </w:pPr>
+            <w:r>
+              <w:rPr>
+                <w:b w:val="0"/>
+                <w:bCs w:val="0"/>
+              </w:rPr>
+              <w:t>Done – automatically adjusts to 0 or 100%</w:t>
+            </w:r>
+          </w:p>
+          <w:p>
+            <w:pPr>
+              <w:pStyle w:val="Heading2"/>
+              <w:jc w:val="center"/>
+              <w:rPr>
+                <w:b w:val="0"/>
+                <w:bCs w:val="0"/>
+                <w:color w:val="EE0000"/>
+              </w:rPr>
+            </w:pPr>
+            <w:r>
+              <w:rPr>
+                <w:b w:val="0"/>
+                <w:bCs w:val="0"/>
+                <w:color w:val="EE0000"/>
+              </w:rPr>
+              <w:t>Might be worth including a warning about the adjustment later</w:t>
+            </w:r>
+          </w:p>
+        </w:tc>
+      </w:tr>
+      <w:tr>
+        <w:tc>
+          <w:tcPr>
+            <w:tcW w:w="416" w:type="dxa"/>
+          </w:tcPr>
+          <w:p>
+            <w:pPr>
+              <w:pStyle w:val="Heading2"/>
+              <w:rPr>
+                <w:b w:val="0"/>
+                <w:bCs w:val="0"/>
+              </w:rPr>
+            </w:pPr>
+          </w:p>
+        </w:tc>
+        <w:tc>
+          <w:tcPr>
+            <w:tcW w:w="1989" w:type="dxa"/>
+          </w:tcPr>
+          <w:p>
+            <w:pPr>
+              <w:pStyle w:val="Heading2"/>
+              <w:rPr>
+                <w:b w:val="0"/>
+                <w:bCs w:val="0"/>
+              </w:rPr>
+            </w:pPr>
+            <w:r>
+              <w:rPr>
+                <w:b w:val="0"/>
+                <w:bCs w:val="0"/>
+              </w:rPr>
+              <w:t>Numeric input limits - min</w:t>
+            </w:r>
+          </w:p>
+        </w:tc>
+        <w:tc>
+          <w:tcPr>
+            <w:tcW w:w="4114" w:type="dxa"/>
+          </w:tcPr>
+          <w:p>
+            <w:pPr>
+              <w:pStyle w:val="Heading2"/>
+              <w:rPr>
+                <w:b w:val="0"/>
+                <w:bCs w:val="0"/>
+              </w:rPr>
+            </w:pPr>
+            <w:r>
+              <w:rPr>
+                <w:b w:val="0"/>
+                <w:bCs w:val="0"/>
+              </w:rPr>
+              <w:t>Number of people cannot be less than 0</w:t>
+            </w:r>
+          </w:p>
+        </w:tc>
+        <w:tc>
+          <w:tcPr>
+            <w:tcW w:w="2831" w:type="dxa"/>
+          </w:tcPr>
+          <w:p>
+            <w:pPr>
+              <w:pStyle w:val="Heading2"/>
+              <w:jc w:val="center"/>
+              <w:rPr>
+                <w:b w:val="0"/>
+                <w:bCs w:val="0"/>
+              </w:rPr>
+            </w:pPr>
+            <w:r>
+              <w:rPr>
+                <w:b w:val="0"/>
+                <w:bCs w:val="0"/>
+              </w:rPr>
+              <w:t>Done – automatically adjusts to 0 with negative input</w:t>
+            </w:r>
+          </w:p>
+        </w:tc>
+      </w:tr>
+      <w:tr>
+        <w:tc>
+          <w:tcPr>
+            <w:tcW w:w="416" w:type="dxa"/>
+          </w:tcPr>
+          <w:p>
+            <w:pPr>
+              <w:pStyle w:val="Heading2"/>
+              <w:rPr>
+                <w:b w:val="0"/>
+                <w:bCs w:val="0"/>
+              </w:rPr>
+            </w:pPr>
+          </w:p>
+        </w:tc>
+        <w:tc>
+          <w:tcPr>
+            <w:tcW w:w="1989" w:type="dxa"/>
+          </w:tcPr>
+          <w:p>
+            <w:pPr>
+              <w:pStyle w:val="Heading2"/>
+              <w:rPr>
+                <w:b w:val="0"/>
+                <w:bCs w:val="0"/>
+              </w:rPr>
+            </w:pPr>
+            <w:r>
+              <w:rPr>
+                <w:b w:val="0"/>
+                <w:bCs w:val="0"/>
+              </w:rPr>
+              <w:t>Numeric i</w:t>
+            </w:r>
+            <w:r>
+              <w:rPr>
+                <w:b w:val="0"/>
+                <w:bCs w:val="0"/>
+              </w:rPr>
+              <w:t>nput validation - prep</w:t>
+            </w:r>
+          </w:p>
+        </w:tc>
+        <w:tc>
+          <w:tcPr>
+            <w:tcW w:w="4114" w:type="dxa"/>
+          </w:tcPr>
+          <w:p>
+            <w:pPr>
+              <w:pStyle w:val="Heading2"/>
+              <w:rPr>
+                <w:b w:val="0"/>
+                <w:bCs w:val="0"/>
+              </w:rPr>
+            </w:pPr>
+            <w:r>
+              <w:rPr>
+                <w:b w:val="0"/>
+                <w:bCs w:val="0"/>
+              </w:rPr>
               <w:t>People on oral prep + people on lenacapavir cannot exceed adult population</w:t>
             </w:r>
           </w:p>
         </w:tc>
-      </w:tr>
-      <w:tr>
-        <w:tc>
-          <w:tcPr>
-            <w:tcW w:w="461" w:type="dxa"/>
+        <w:tc>
+          <w:tcPr>
+            <w:tcW w:w="2831" w:type="dxa"/>
           </w:tcPr>
           <w:p>
             <w:pPr>
@@ -579,11 +1167,20 @@
                 <w:bCs w:val="0"/>
               </w:rPr>
             </w:pPr>
-          </w:p>
-        </w:tc>
-        <w:tc>
-          <w:tcPr>
-            <w:tcW w:w="3362" w:type="dxa"/>
+            <w:r>
+              <w:rPr>
+                <w:b w:val="0"/>
+                <w:bCs w:val="0"/>
+              </w:rPr>
+              <w:t>Limits in place and working – app a little buggy about using the arrows straight after exceeding limits</w:t>
+            </w:r>
+          </w:p>
+        </w:tc>
+      </w:tr>
+      <w:tr>
+        <w:tc>
+          <w:tcPr>
+            <w:tcW w:w="416" w:type="dxa"/>
           </w:tcPr>
           <w:p>
             <w:pPr>
@@ -593,18 +1190,11 @@
                 <w:bCs w:val="0"/>
               </w:rPr>
             </w:pPr>
-            <w:r>
-              <w:rPr>
-                <w:b w:val="0"/>
-                <w:bCs w:val="0"/>
-              </w:rPr>
-              <w:t>Input validation – vmmc</w:t>
-            </w:r>
-          </w:p>
-        </w:tc>
-        <w:tc>
-          <w:tcPr>
-            <w:tcW w:w="5527" w:type="dxa"/>
+          </w:p>
+        </w:tc>
+        <w:tc>
+          <w:tcPr>
+            <w:tcW w:w="1989" w:type="dxa"/>
           </w:tcPr>
           <w:p>
             <w:pPr>
@@ -619,15 +1209,34 @@
                 <w:b w:val="0"/>
                 <w:bCs w:val="0"/>
               </w:rPr>
+              <w:t>Numeric input validation – vmmc</w:t>
+            </w:r>
+          </w:p>
+        </w:tc>
+        <w:tc>
+          <w:tcPr>
+            <w:tcW w:w="4114" w:type="dxa"/>
+          </w:tcPr>
+          <w:p>
+            <w:pPr>
+              <w:pStyle w:val="Heading2"/>
+              <w:rPr>
+                <w:b w:val="0"/>
+                <w:bCs w:val="0"/>
+              </w:rPr>
+            </w:pPr>
+            <w:r>
+              <w:rPr>
+                <w:b w:val="0"/>
+                <w:bCs w:val="0"/>
+              </w:rPr>
               <w:t>Number of people receiving annual VMMC cannot exceed population of uncircumcised males</w:t>
             </w:r>
           </w:p>
         </w:tc>
-      </w:tr>
-      <w:tr>
-        <w:tc>
-          <w:tcPr>
-            <w:tcW w:w="461" w:type="dxa"/>
+        <w:tc>
+          <w:tcPr>
+            <w:tcW w:w="2831" w:type="dxa"/>
           </w:tcPr>
           <w:p>
             <w:pPr>
@@ -639,9 +1248,11 @@
             </w:pPr>
           </w:p>
         </w:tc>
-        <w:tc>
-          <w:tcPr>
-            <w:tcW w:w="3362" w:type="dxa"/>
+      </w:tr>
+      <w:tr>
+        <w:tc>
+          <w:tcPr>
+            <w:tcW w:w="416" w:type="dxa"/>
           </w:tcPr>
           <w:p>
             <w:pPr>
@@ -655,7 +1266,7 @@
         </w:tc>
         <w:tc>
           <w:tcPr>
-            <w:tcW w:w="5527" w:type="dxa"/>
+            <w:tcW w:w="1989" w:type="dxa"/>
           </w:tcPr>
           <w:p>
             <w:pPr>
@@ -665,13 +1276,18 @@
                 <w:bCs w:val="0"/>
               </w:rPr>
             </w:pPr>
-          </w:p>
-        </w:tc>
-      </w:tr>
-      <w:tr>
-        <w:tc>
-          <w:tcPr>
-            <w:tcW w:w="461" w:type="dxa"/>
+            <w:r>
+              <w:rPr>
+                <w:b w:val="0"/>
+                <w:bCs w:val="0"/>
+              </w:rPr>
+              <w:t xml:space="preserve">MMD combination limits </w:t>
+            </w:r>
+          </w:p>
+        </w:tc>
+        <w:tc>
+          <w:tcPr>
+            <w:tcW w:w="4114" w:type="dxa"/>
           </w:tcPr>
           <w:p>
             <w:pPr>
@@ -681,11 +1297,18 @@
                 <w:bCs w:val="0"/>
               </w:rPr>
             </w:pPr>
-          </w:p>
-        </w:tc>
-        <w:tc>
-          <w:tcPr>
-            <w:tcW w:w="3362" w:type="dxa"/>
+            <w:r>
+              <w:rPr>
+                <w:b w:val="0"/>
+                <w:bCs w:val="0"/>
+              </w:rPr>
+              <w:t>Together the three categories of MMD cannot exceed 100% of stable clients</w:t>
+            </w:r>
+          </w:p>
+        </w:tc>
+        <w:tc>
+          <w:tcPr>
+            <w:tcW w:w="2831" w:type="dxa"/>
           </w:tcPr>
           <w:p>
             <w:pPr>
@@ -697,9 +1320,11 @@
             </w:pPr>
           </w:p>
         </w:tc>
-        <w:tc>
-          <w:tcPr>
-            <w:tcW w:w="5527" w:type="dxa"/>
+      </w:tr>
+      <w:tr>
+        <w:tc>
+          <w:tcPr>
+            <w:tcW w:w="416" w:type="dxa"/>
           </w:tcPr>
           <w:p>
             <w:pPr>
@@ -711,11 +1336,9 @@
             </w:pPr>
           </w:p>
         </w:tc>
-      </w:tr>
-      <w:tr>
-        <w:tc>
-          <w:tcPr>
-            <w:tcW w:w="461" w:type="dxa"/>
+        <w:tc>
+          <w:tcPr>
+            <w:tcW w:w="1989" w:type="dxa"/>
           </w:tcPr>
           <w:p>
             <w:pPr>
@@ -729,7 +1352,7 @@
         </w:tc>
         <w:tc>
           <w:tcPr>
-            <w:tcW w:w="3362" w:type="dxa"/>
+            <w:tcW w:w="4114" w:type="dxa"/>
           </w:tcPr>
           <w:p>
             <w:pPr>
@@ -743,7 +1366,7 @@
         </w:tc>
         <w:tc>
           <w:tcPr>
-            <w:tcW w:w="5527" w:type="dxa"/>
+            <w:tcW w:w="2831" w:type="dxa"/>
           </w:tcPr>
           <w:p>
             <w:pPr>
@@ -759,7 +1382,7 @@
       <w:tr>
         <w:tc>
           <w:tcPr>
-            <w:tcW w:w="461" w:type="dxa"/>
+            <w:tcW w:w="416" w:type="dxa"/>
           </w:tcPr>
           <w:p>
             <w:pPr>
@@ -773,7 +1396,7 @@
         </w:tc>
         <w:tc>
           <w:tcPr>
-            <w:tcW w:w="3362" w:type="dxa"/>
+            <w:tcW w:w="1989" w:type="dxa"/>
           </w:tcPr>
           <w:p>
             <w:pPr>
@@ -787,7 +1410,79 @@
         </w:tc>
         <w:tc>
           <w:tcPr>
-            <w:tcW w:w="5527" w:type="dxa"/>
+            <w:tcW w:w="4114" w:type="dxa"/>
+          </w:tcPr>
+          <w:p>
+            <w:pPr>
+              <w:pStyle w:val="Heading2"/>
+              <w:rPr>
+                <w:b w:val="0"/>
+                <w:bCs w:val="0"/>
+              </w:rPr>
+            </w:pPr>
+          </w:p>
+        </w:tc>
+        <w:tc>
+          <w:tcPr>
+            <w:tcW w:w="2831" w:type="dxa"/>
+          </w:tcPr>
+          <w:p>
+            <w:pPr>
+              <w:pStyle w:val="Heading2"/>
+              <w:rPr>
+                <w:b w:val="0"/>
+                <w:bCs w:val="0"/>
+              </w:rPr>
+            </w:pPr>
+          </w:p>
+        </w:tc>
+      </w:tr>
+      <w:tr>
+        <w:tc>
+          <w:tcPr>
+            <w:tcW w:w="416" w:type="dxa"/>
+          </w:tcPr>
+          <w:p>
+            <w:pPr>
+              <w:pStyle w:val="Heading2"/>
+              <w:rPr>
+                <w:b w:val="0"/>
+                <w:bCs w:val="0"/>
+              </w:rPr>
+            </w:pPr>
+          </w:p>
+        </w:tc>
+        <w:tc>
+          <w:tcPr>
+            <w:tcW w:w="1989" w:type="dxa"/>
+          </w:tcPr>
+          <w:p>
+            <w:pPr>
+              <w:pStyle w:val="Heading2"/>
+              <w:rPr>
+                <w:b w:val="0"/>
+                <w:bCs w:val="0"/>
+              </w:rPr>
+            </w:pPr>
+          </w:p>
+        </w:tc>
+        <w:tc>
+          <w:tcPr>
+            <w:tcW w:w="4114" w:type="dxa"/>
+          </w:tcPr>
+          <w:p>
+            <w:pPr>
+              <w:pStyle w:val="Heading2"/>
+              <w:rPr>
+                <w:b w:val="0"/>
+                <w:bCs w:val="0"/>
+              </w:rPr>
+            </w:pPr>
+          </w:p>
+        </w:tc>
+        <w:tc>
+          <w:tcPr>
+            <w:tcW w:w="2831" w:type="dxa"/>
           </w:tcPr>
           <w:p>
             <w:pPr>
@@ -840,7 +1535,6 @@
         <w:pStyle w:val="Heading2"/>
       </w:pPr>
       <w:r>
-        <w:lastRenderedPageBreak/>
         <w:t>Key test functions in R</w:t>
       </w:r>
     </w:p>
@@ -1332,7 +2026,6 @@
                 <w:b/>
                 <w:bCs/>
               </w:rPr>
-              <w:lastRenderedPageBreak/>
               <w:t>#</w:t>
             </w:r>
           </w:p>
@@ -1961,7 +2654,6 @@
               <w:spacing w:after="160"/>
             </w:pPr>
             <w:r>
-              <w:lastRenderedPageBreak/>
               <w:t>4.</w:t>
             </w:r>
           </w:p>
@@ -3431,7 +4123,6 @@
               <w:spacing w:after="160"/>
             </w:pPr>
             <w:r>
-              <w:lastRenderedPageBreak/>
               <w:t>2.</w:t>
             </w:r>
           </w:p>
@@ -4228,7 +4919,6 @@
               <w:spacing w:after="160"/>
             </w:pPr>
             <w:r>
-              <w:lastRenderedPageBreak/>
               <w:t>2.</w:t>
             </w:r>
           </w:p>
@@ -4820,7 +5510,6 @@
               <w:spacing w:after="160"/>
             </w:pPr>
             <w:r>
-              <w:lastRenderedPageBreak/>
               <w:t>5</w:t>
             </w:r>
           </w:p>

</xml_diff>

<commit_message>
Adpated app version - initial tetsing set-up
</commit_message>
<xml_diff>
--- a/resources/Test_Framework_Description.docx
+++ b/resources/Test_Framework_Description.docx
@@ -384,6 +384,7 @@
               <w:spacing w:after="120"/>
             </w:pPr>
             <w:r>
+              <w:lastRenderedPageBreak/>
               <w:t>Virally_suppressed = ART_inititations*0.9</w:t>
             </w:r>
             <w:r>
@@ -792,7 +793,14 @@
                 <w:b w:val="0"/>
                 <w:bCs w:val="0"/>
               </w:rPr>
-              <w:t>Epi params – new diagnoses</w:t>
+              <w:t xml:space="preserve">Epi params – new </w:t>
+            </w:r>
+            <w:r>
+              <w:rPr>
+                <w:b w:val="0"/>
+                <w:bCs w:val="0"/>
+              </w:rPr>
+              <w:t>diagnoses</w:t>
             </w:r>
           </w:p>
         </w:tc>
@@ -868,7 +876,14 @@
                 <w:b w:val="0"/>
                 <w:bCs w:val="0"/>
               </w:rPr>
-              <w:t>Epi params – AIDS deaths</w:t>
+              <w:t xml:space="preserve">Epi params – </w:t>
+            </w:r>
+            <w:r>
+              <w:rPr>
+                <w:b w:val="0"/>
+                <w:bCs w:val="0"/>
+              </w:rPr>
+              <w:t>AIDS deaths</w:t>
             </w:r>
           </w:p>
         </w:tc>
@@ -889,7 +904,14 @@
                 <w:b w:val="0"/>
                 <w:bCs w:val="0"/>
               </w:rPr>
-              <w:t>Cannot exceed PLHIV</w:t>
+              <w:t xml:space="preserve">Cannot exceed </w:t>
+            </w:r>
+            <w:r>
+              <w:rPr>
+                <w:b w:val="0"/>
+                <w:bCs w:val="0"/>
+              </w:rPr>
+              <w:t>PLHIV</w:t>
             </w:r>
           </w:p>
         </w:tc>
@@ -1086,7 +1108,14 @@
                 <w:b w:val="0"/>
                 <w:bCs w:val="0"/>
               </w:rPr>
-              <w:t>Done – automatically adjusts to 0 with negative input</w:t>
+              <w:t>Done – automatically adjusts to 0</w:t>
+            </w:r>
+            <w:r>
+              <w:rPr>
+                <w:b w:val="0"/>
+                <w:bCs w:val="0"/>
+              </w:rPr>
+              <w:t xml:space="preserve"> with negative input</w:t>
             </w:r>
           </w:p>
         </w:tc>
@@ -1908,6 +1937,7 @@
               <w:spacing w:after="160"/>
             </w:pPr>
             <w:r>
+              <w:lastRenderedPageBreak/>
               <w:t>4.</w:t>
             </w:r>
           </w:p>
@@ -3078,6 +3108,7 @@
               <w:spacing w:after="160"/>
             </w:pPr>
             <w:r>
+              <w:lastRenderedPageBreak/>
               <w:t>Infections_averted=</w:t>
             </w:r>
             <w:r>
@@ -3099,6 +3130,7 @@
               <w:spacing w:after="160"/>
             </w:pPr>
             <w:r>
+              <w:lastRenderedPageBreak/>
               <w:t>2.</w:t>
             </w:r>
           </w:p>
@@ -3894,6 +3926,7 @@
               <w:spacing w:after="160"/>
             </w:pPr>
             <w:r>
+              <w:lastRenderedPageBreak/>
               <w:t>3.</w:t>
             </w:r>
           </w:p>
@@ -4463,6 +4496,9 @@
       <w:r>
         <w:t xml:space="preserve">, and subsequently a larger number of individuals being on treatment. </w:t>
       </w:r>
+      <w:r>
+        <w:t>Also calculating difference between baseline and a scenario.</w:t>
+      </w:r>
     </w:p>
     <w:p>
       <w:pPr>
@@ -4524,6 +4560,7 @@
           <w:sz w:val="24"/>
           <w:szCs w:val="24"/>
         </w:rPr>
+        <w:lastRenderedPageBreak/>
         <w:t>Intervention assumptions</w:t>
       </w:r>
       <w:r>
@@ -5331,6 +5368,7 @@
               <w:spacing w:after="160"/>
             </w:pPr>
             <w:r>
+              <w:lastRenderedPageBreak/>
               <w:t>3</w:t>
             </w:r>
             <w:r>
@@ -5885,8 +5923,52 @@
               <w:t>_plhiv_diagnosed=</w:t>
             </w:r>
             <w:r>
-              <w:t>PLHIV_diagnosed - re_test_prop* current_diagnoses</w:t>
-            </w:r>
+              <w:t xml:space="preserve">PLHIV_diagnosed - </w:t>
+            </w:r>
+            <w:r>
+              <w:t>re_test_prop* current_diagnoses</w:t>
+            </w:r>
+          </w:p>
+        </w:tc>
+      </w:tr>
+      <w:tr>
+        <w:trPr>
+          <w:trHeight w:val="457"/>
+        </w:trPr>
+        <w:tc>
+          <w:tcPr>
+            <w:tcW w:w="549" w:type="dxa"/>
+          </w:tcPr>
+          <w:p>
+            <w:pPr>
+              <w:spacing w:after="160"/>
+            </w:pPr>
+            <w:r>
+              <w:t>3.</w:t>
+            </w:r>
+          </w:p>
+        </w:tc>
+        <w:tc>
+          <w:tcPr>
+            <w:tcW w:w="2140" w:type="dxa"/>
+          </w:tcPr>
+          <w:p>
+            <w:pPr>
+              <w:spacing w:after="160"/>
+            </w:pPr>
+            <w:r>
+              <w:t>Set all testing to be 0 – new PLHIV diagnosed</w:t>
+            </w:r>
+          </w:p>
+        </w:tc>
+        <w:tc>
+          <w:tcPr>
+            <w:tcW w:w="6462" w:type="dxa"/>
+          </w:tcPr>
+          <w:p>
+            <w:pPr>
+              <w:spacing w:after="160"/>
+            </w:pPr>
           </w:p>
         </w:tc>
       </w:tr>

</xml_diff>

<commit_message>
Adapting limits on newly diagnosed, art initiations etc when doing mass tetsing
</commit_message>
<xml_diff>
--- a/resources/Test_Framework_Description.docx
+++ b/resources/Test_Framework_Description.docx
@@ -4544,202 +4544,314 @@
       </w:r>
     </w:p>
     <w:p>
-      <w:pPr>
-        <w:pStyle w:val="Heading2"/>
+      <w:r>
+        <w:t>Intervention assumptions</w:t>
+      </w:r>
+      <w:r>
+        <w:t xml:space="preserve">: </w:t>
+      </w:r>
+      <w:r>
+        <w:t>base yield multiplier is 90%</w:t>
+      </w:r>
+      <w:r>
+        <w:t>, general facility tests multiplier</w:t>
+      </w:r>
+      <w:r>
+        <w:t xml:space="preserve"> and linkage rate (</w:t>
+      </w:r>
+      <w:r>
+        <w:t>1</w:t>
+      </w:r>
+      <w:r>
+        <w:t>,0.9)</w:t>
+      </w:r>
+      <w:r>
+        <w:t>, targeted facility test multiplier</w:t>
+      </w:r>
+      <w:r>
+        <w:t xml:space="preserve"> and linkage rate (2, 0.8)</w:t>
+      </w:r>
+      <w:r>
+        <w:t xml:space="preserve">, test </w:t>
+      </w:r>
+      <w:r>
+        <w:lastRenderedPageBreak/>
+        <w:t xml:space="preserve">efficacy </w:t>
+      </w:r>
+      <w:r>
+        <w:t>=0.97</w:t>
+      </w:r>
+      <w:r>
+        <w:t>, base_yield =0.02175</w:t>
+      </w:r>
+      <w:r>
+        <w:t xml:space="preserve">, </w:t>
+      </w:r>
+      <w:r>
         <w:rPr>
-          <w:b w:val="0"/>
-          <w:bCs w:val="0"/>
-          <w:sz w:val="24"/>
-          <w:szCs w:val="24"/>
-        </w:rPr>
-      </w:pPr>
-      <w:r>
-        <w:rPr>
-          <w:b w:val="0"/>
-          <w:bCs w:val="0"/>
-          <w:sz w:val="24"/>
-          <w:szCs w:val="24"/>
-        </w:rPr>
-        <w:lastRenderedPageBreak/>
-        <w:t>Intervention assumptions</w:t>
-      </w:r>
-      <w:r>
-        <w:rPr>
-          <w:b w:val="0"/>
-          <w:bCs w:val="0"/>
-          <w:sz w:val="24"/>
-          <w:szCs w:val="24"/>
-        </w:rPr>
-        <w:t xml:space="preserve">: </w:t>
-      </w:r>
-      <w:r>
-        <w:rPr>
-          <w:b w:val="0"/>
-          <w:bCs w:val="0"/>
-          <w:sz w:val="24"/>
-          <w:szCs w:val="24"/>
-        </w:rPr>
-        <w:t>base yield multiplier is 90%</w:t>
-      </w:r>
-      <w:r>
-        <w:rPr>
-          <w:b w:val="0"/>
-          <w:bCs w:val="0"/>
-          <w:sz w:val="24"/>
-          <w:szCs w:val="24"/>
-        </w:rPr>
-        <w:t>, general facility tests multiplier</w:t>
-      </w:r>
-      <w:r>
-        <w:rPr>
-          <w:b w:val="0"/>
-          <w:bCs w:val="0"/>
-          <w:sz w:val="24"/>
-          <w:szCs w:val="24"/>
-        </w:rPr>
-        <w:t xml:space="preserve"> and linkage rate (</w:t>
-      </w:r>
-      <w:r>
-        <w:rPr>
-          <w:b w:val="0"/>
-          <w:bCs w:val="0"/>
-          <w:sz w:val="24"/>
-          <w:szCs w:val="24"/>
-        </w:rPr>
-        <w:t>1</w:t>
-      </w:r>
-      <w:r>
-        <w:rPr>
-          <w:b w:val="0"/>
-          <w:bCs w:val="0"/>
-          <w:sz w:val="24"/>
-          <w:szCs w:val="24"/>
-        </w:rPr>
-        <w:t>,0.9)</w:t>
-      </w:r>
-      <w:r>
-        <w:rPr>
-          <w:b w:val="0"/>
-          <w:bCs w:val="0"/>
-          <w:sz w:val="24"/>
-          <w:szCs w:val="24"/>
-        </w:rPr>
-        <w:t>, targeted facility test multiplier</w:t>
-      </w:r>
-      <w:r>
-        <w:rPr>
-          <w:b w:val="0"/>
-          <w:bCs w:val="0"/>
-          <w:sz w:val="24"/>
-          <w:szCs w:val="24"/>
-        </w:rPr>
-        <w:t xml:space="preserve"> and linkage rate (2, 0.8)</w:t>
-      </w:r>
-      <w:r>
-        <w:rPr>
-          <w:b w:val="0"/>
-          <w:bCs w:val="0"/>
-          <w:sz w:val="24"/>
-          <w:szCs w:val="24"/>
-        </w:rPr>
-        <w:t xml:space="preserve">, test efficacy </w:t>
-      </w:r>
-      <w:r>
-        <w:rPr>
-          <w:b w:val="0"/>
-          <w:bCs w:val="0"/>
-          <w:sz w:val="24"/>
-          <w:szCs w:val="24"/>
-        </w:rPr>
-        <w:t>=0.97</w:t>
-      </w:r>
-      <w:r>
-        <w:rPr>
-          <w:b w:val="0"/>
-          <w:bCs w:val="0"/>
-          <w:sz w:val="24"/>
-          <w:szCs w:val="24"/>
-        </w:rPr>
-        <w:t>, base_yield =0.02175</w:t>
-      </w:r>
-      <w:r>
-        <w:rPr>
-          <w:b w:val="0"/>
-          <w:bCs w:val="0"/>
-          <w:sz w:val="24"/>
-          <w:szCs w:val="24"/>
-        </w:rPr>
-        <w:t xml:space="preserve">, </w:t>
-      </w:r>
-      <w:r>
-        <w:rPr>
-          <w:b w:val="0"/>
-          <w:bCs w:val="0"/>
-          <w:sz w:val="24"/>
-          <w:szCs w:val="24"/>
           <w:highlight w:val="yellow"/>
         </w:rPr>
         <w:t>re_test_prop =0.5</w:t>
       </w:r>
       <w:r>
+        <w:t xml:space="preserve">, </w:t>
+      </w:r>
+      <w:r>
         <w:rPr>
-          <w:b w:val="0"/>
-          <w:bCs w:val="0"/>
-          <w:sz w:val="24"/>
-          <w:szCs w:val="24"/>
-        </w:rPr>
-        <w:t xml:space="preserve">, </w:t>
-      </w:r>
-      <w:r>
-        <w:rPr>
-          <w:b w:val="0"/>
-          <w:bCs w:val="0"/>
-          <w:sz w:val="24"/>
-          <w:szCs w:val="24"/>
           <w:highlight w:val="yellow"/>
         </w:rPr>
         <w:t>base_</w:t>
       </w:r>
       <w:r>
         <w:rPr>
-          <w:b w:val="0"/>
-          <w:bCs w:val="0"/>
-          <w:sz w:val="24"/>
-          <w:szCs w:val="24"/>
           <w:highlight w:val="yellow"/>
         </w:rPr>
         <w:t>v</w:t>
       </w:r>
       <w:r>
         <w:rPr>
-          <w:b w:val="0"/>
-          <w:bCs w:val="0"/>
-          <w:sz w:val="24"/>
-          <w:szCs w:val="24"/>
           <w:highlight w:val="yellow"/>
         </w:rPr>
         <w:t>iral_suppression</w:t>
       </w:r>
       <w:r>
         <w:rPr>
-          <w:b w:val="0"/>
-          <w:bCs w:val="0"/>
-          <w:sz w:val="24"/>
-          <w:szCs w:val="24"/>
           <w:highlight w:val="yellow"/>
         </w:rPr>
         <w:t xml:space="preserve"> = percent_on_art</w:t>
       </w:r>
       <w:r>
-        <w:rPr>
-          <w:b w:val="0"/>
-          <w:bCs w:val="0"/>
-          <w:sz w:val="24"/>
-          <w:szCs w:val="24"/>
-        </w:rPr>
         <w:t>*0.9</w:t>
       </w:r>
+      <w:r>
+        <w:t>. General test_cost $8</w:t>
+      </w:r>
+      <w:r>
+        <w:t>, linkage cost $4</w:t>
+      </w:r>
     </w:p>
+    <w:p/>
+    <w:p>
+      <w:pPr>
+        <w:pStyle w:val="Heading4"/>
+      </w:pPr>
+      <w:r>
+        <w:t>Zero Testing</w:t>
+      </w:r>
+    </w:p>
+    <w:p/>
+    <w:tbl>
+      <w:tblPr>
+        <w:tblStyle w:val="TableGrid"/>
+        <w:tblW w:w="0" w:type="auto"/>
+        <w:tblLook w:val="04A0" w:firstRow="1" w:lastRow="0" w:firstColumn="1" w:lastColumn="0" w:noHBand="0" w:noVBand="1"/>
+      </w:tblPr>
+      <w:tblGrid>
+        <w:gridCol w:w="549"/>
+        <w:gridCol w:w="2140"/>
+        <w:gridCol w:w="6462"/>
+      </w:tblGrid>
+      <w:tr>
+        <w:trPr>
+          <w:trHeight w:val="457"/>
+        </w:trPr>
+        <w:tc>
+          <w:tcPr>
+            <w:tcW w:w="549" w:type="dxa"/>
+          </w:tcPr>
+          <w:p>
+            <w:pPr>
+              <w:spacing w:after="160"/>
+              <w:rPr>
+                <w:b/>
+                <w:bCs/>
+              </w:rPr>
+            </w:pPr>
+            <w:r>
+              <w:rPr>
+                <w:b/>
+                <w:bCs/>
+              </w:rPr>
+              <w:t>#</w:t>
+            </w:r>
+          </w:p>
+        </w:tc>
+        <w:tc>
+          <w:tcPr>
+            <w:tcW w:w="2140" w:type="dxa"/>
+          </w:tcPr>
+          <w:p>
+            <w:pPr>
+              <w:spacing w:after="160"/>
+              <w:rPr>
+                <w:b/>
+                <w:bCs/>
+              </w:rPr>
+            </w:pPr>
+            <w:r>
+              <w:rPr>
+                <w:b/>
+                <w:bCs/>
+              </w:rPr>
+              <w:t>Description</w:t>
+            </w:r>
+          </w:p>
+        </w:tc>
+        <w:tc>
+          <w:tcPr>
+            <w:tcW w:w="6462" w:type="dxa"/>
+          </w:tcPr>
+          <w:p>
+            <w:pPr>
+              <w:spacing w:after="160"/>
+              <w:rPr>
+                <w:b/>
+                <w:bCs/>
+              </w:rPr>
+            </w:pPr>
+            <w:r>
+              <w:rPr>
+                <w:b/>
+                <w:bCs/>
+              </w:rPr>
+              <w:t>Test Calculation/expectation</w:t>
+            </w:r>
+          </w:p>
+        </w:tc>
+      </w:tr>
+      <w:tr>
+        <w:trPr>
+          <w:trHeight w:val="457"/>
+        </w:trPr>
+        <w:tc>
+          <w:tcPr>
+            <w:tcW w:w="549" w:type="dxa"/>
+          </w:tcPr>
+          <w:p>
+            <w:pPr>
+              <w:spacing w:after="160"/>
+            </w:pPr>
+            <w:r>
+              <w:t>1.</w:t>
+            </w:r>
+          </w:p>
+        </w:tc>
+        <w:tc>
+          <w:tcPr>
+            <w:tcW w:w="2140" w:type="dxa"/>
+          </w:tcPr>
+          <w:p>
+            <w:pPr>
+              <w:spacing w:after="160"/>
+            </w:pPr>
+            <w:r>
+              <w:t>Set all testing to be 0 – new diagnoses</w:t>
+            </w:r>
+          </w:p>
+        </w:tc>
+        <w:tc>
+          <w:tcPr>
+            <w:tcW w:w="6462" w:type="dxa"/>
+          </w:tcPr>
+          <w:p>
+            <w:pPr>
+              <w:spacing w:after="160"/>
+            </w:pPr>
+            <w:r>
+              <w:t>Expected_new_diagnoses = 0</w:t>
+            </w:r>
+          </w:p>
+        </w:tc>
+      </w:tr>
+      <w:tr>
+        <w:trPr>
+          <w:trHeight w:val="457"/>
+        </w:trPr>
+        <w:tc>
+          <w:tcPr>
+            <w:tcW w:w="549" w:type="dxa"/>
+          </w:tcPr>
+          <w:p>
+            <w:pPr>
+              <w:spacing w:after="160"/>
+            </w:pPr>
+            <w:r>
+              <w:t>2.</w:t>
+            </w:r>
+          </w:p>
+        </w:tc>
+        <w:tc>
+          <w:tcPr>
+            <w:tcW w:w="2140" w:type="dxa"/>
+          </w:tcPr>
+          <w:p>
+            <w:pPr>
+              <w:spacing w:after="160"/>
+            </w:pPr>
+            <w:r>
+              <w:t>Set all testing to be 0 – art_inititations</w:t>
+            </w:r>
+          </w:p>
+        </w:tc>
+        <w:tc>
+          <w:tcPr>
+            <w:tcW w:w="6462" w:type="dxa"/>
+          </w:tcPr>
+          <w:p>
+            <w:pPr>
+              <w:spacing w:after="160"/>
+            </w:pPr>
+            <w:r>
+              <w:t>Expected_art_inititations=0</w:t>
+            </w:r>
+          </w:p>
+        </w:tc>
+      </w:tr>
+      <w:tr>
+        <w:trPr>
+          <w:trHeight w:val="457"/>
+        </w:trPr>
+        <w:tc>
+          <w:tcPr>
+            <w:tcW w:w="549" w:type="dxa"/>
+          </w:tcPr>
+          <w:p>
+            <w:pPr>
+              <w:spacing w:after="160"/>
+            </w:pPr>
+            <w:r>
+              <w:t>3.</w:t>
+            </w:r>
+          </w:p>
+        </w:tc>
+        <w:tc>
+          <w:tcPr>
+            <w:tcW w:w="2140" w:type="dxa"/>
+          </w:tcPr>
+          <w:p>
+            <w:pPr>
+              <w:spacing w:after="160"/>
+            </w:pPr>
+            <w:r>
+              <w:t>Set all testing to be 0 – new PLHIV diagnosed</w:t>
+            </w:r>
+          </w:p>
+        </w:tc>
+        <w:tc>
+          <w:tcPr>
+            <w:tcW w:w="6462" w:type="dxa"/>
+          </w:tcPr>
+          <w:p>
+            <w:pPr>
+              <w:spacing w:after="160"/>
+            </w:pPr>
+            <w:r>
+              <w:t>Expected_additional_suppressed =0</w:t>
+            </w:r>
+          </w:p>
+        </w:tc>
+      </w:tr>
+    </w:tbl>
     <w:p/>
     <w:p>
       <w:pPr>
@@ -5116,10 +5228,657 @@
         <w:pStyle w:val="Heading4"/>
       </w:pPr>
       <w:r>
+        <w:t>Scale up scenario to 20</w:t>
+      </w:r>
+      <w:r>
+        <w:t>,</w:t>
+      </w:r>
+      <w:r>
+        <w:t>000 tests over 10,000 baseline</w:t>
+      </w:r>
+    </w:p>
+    <w:tbl>
+      <w:tblPr>
+        <w:tblStyle w:val="TableGrid"/>
+        <w:tblW w:w="0" w:type="auto"/>
+        <w:tblLook w:val="04A0" w:firstRow="1" w:lastRow="0" w:firstColumn="1" w:lastColumn="0" w:noHBand="0" w:noVBand="1"/>
+      </w:tblPr>
+      <w:tblGrid>
+        <w:gridCol w:w="549"/>
+        <w:gridCol w:w="2140"/>
+        <w:gridCol w:w="6548"/>
+      </w:tblGrid>
+      <w:tr>
+        <w:trPr>
+          <w:trHeight w:val="457"/>
+        </w:trPr>
+        <w:tc>
+          <w:tcPr>
+            <w:tcW w:w="549" w:type="dxa"/>
+          </w:tcPr>
+          <w:p>
+            <w:pPr>
+              <w:spacing w:after="160"/>
+              <w:rPr>
+                <w:b/>
+                <w:bCs/>
+              </w:rPr>
+            </w:pPr>
+            <w:r>
+              <w:rPr>
+                <w:b/>
+                <w:bCs/>
+              </w:rPr>
+              <w:t>#</w:t>
+            </w:r>
+          </w:p>
+        </w:tc>
+        <w:tc>
+          <w:tcPr>
+            <w:tcW w:w="2140" w:type="dxa"/>
+          </w:tcPr>
+          <w:p>
+            <w:pPr>
+              <w:spacing w:after="160"/>
+              <w:rPr>
+                <w:b/>
+                <w:bCs/>
+              </w:rPr>
+            </w:pPr>
+            <w:r>
+              <w:rPr>
+                <w:b/>
+                <w:bCs/>
+              </w:rPr>
+              <w:t>Description</w:t>
+            </w:r>
+          </w:p>
+        </w:tc>
+        <w:tc>
+          <w:tcPr>
+            <w:tcW w:w="6462" w:type="dxa"/>
+          </w:tcPr>
+          <w:p>
+            <w:pPr>
+              <w:spacing w:after="160"/>
+              <w:rPr>
+                <w:b/>
+                <w:bCs/>
+              </w:rPr>
+            </w:pPr>
+            <w:r>
+              <w:rPr>
+                <w:b/>
+                <w:bCs/>
+              </w:rPr>
+              <w:t>Test Calculation/expectation</w:t>
+            </w:r>
+          </w:p>
+        </w:tc>
+      </w:tr>
+      <w:tr>
+        <w:trPr>
+          <w:trHeight w:val="457"/>
+        </w:trPr>
+        <w:tc>
+          <w:tcPr>
+            <w:tcW w:w="549" w:type="dxa"/>
+          </w:tcPr>
+          <w:p>
+            <w:pPr>
+              <w:spacing w:after="160"/>
+            </w:pPr>
+            <w:r>
+              <w:t>1.</w:t>
+            </w:r>
+          </w:p>
+        </w:tc>
+        <w:tc>
+          <w:tcPr>
+            <w:tcW w:w="2140" w:type="dxa"/>
+          </w:tcPr>
+          <w:p>
+            <w:pPr>
+              <w:spacing w:after="160"/>
+            </w:pPr>
+            <w:r>
+              <w:t xml:space="preserve">Scale up general facility testing  by </w:t>
+            </w:r>
+            <w:r>
+              <w:lastRenderedPageBreak/>
+              <w:t>10 000 tests – positive tests</w:t>
+            </w:r>
+          </w:p>
+        </w:tc>
+        <w:tc>
+          <w:tcPr>
+            <w:tcW w:w="6462" w:type="dxa"/>
+          </w:tcPr>
+          <w:p>
+            <w:pPr>
+              <w:spacing w:after="160"/>
+            </w:pPr>
+            <w:r>
+              <w:lastRenderedPageBreak/>
+              <w:t>Expected_positive_scenario=2*expected_positive_baseline</w:t>
+            </w:r>
+          </w:p>
+        </w:tc>
+      </w:tr>
+      <w:tr>
+        <w:trPr>
+          <w:trHeight w:val="457"/>
+        </w:trPr>
+        <w:tc>
+          <w:tcPr>
+            <w:tcW w:w="549" w:type="dxa"/>
+          </w:tcPr>
+          <w:p>
+            <w:pPr>
+              <w:spacing w:after="160"/>
+            </w:pPr>
+            <w:r>
+              <w:lastRenderedPageBreak/>
+              <w:t>2.</w:t>
+            </w:r>
+          </w:p>
+        </w:tc>
+        <w:tc>
+          <w:tcPr>
+            <w:tcW w:w="2140" w:type="dxa"/>
+          </w:tcPr>
+          <w:p>
+            <w:pPr>
+              <w:spacing w:after="160"/>
+            </w:pPr>
+            <w:r>
+              <w:t>Scale up general facility testing  by 10 000 tests – new diagnoses</w:t>
+            </w:r>
+          </w:p>
+        </w:tc>
+        <w:tc>
+          <w:tcPr>
+            <w:tcW w:w="6462" w:type="dxa"/>
+          </w:tcPr>
+          <w:p>
+            <w:pPr>
+              <w:spacing w:after="160"/>
+            </w:pPr>
+            <w:r>
+              <w:t>Expected_</w:t>
+            </w:r>
+            <w:r>
+              <w:t>new_dx</w:t>
+            </w:r>
+            <w:r>
+              <w:t>_scenario=2*expected_</w:t>
+            </w:r>
+            <w:r>
+              <w:t>new_dx</w:t>
+            </w:r>
+            <w:r>
+              <w:t>_baseline</w:t>
+            </w:r>
+          </w:p>
+        </w:tc>
+      </w:tr>
+      <w:tr>
+        <w:trPr>
+          <w:trHeight w:val="457"/>
+        </w:trPr>
+        <w:tc>
+          <w:tcPr>
+            <w:tcW w:w="549" w:type="dxa"/>
+          </w:tcPr>
+          <w:p>
+            <w:pPr>
+              <w:spacing w:after="160"/>
+            </w:pPr>
+            <w:r>
+              <w:t>3</w:t>
+            </w:r>
+          </w:p>
+        </w:tc>
+        <w:tc>
+          <w:tcPr>
+            <w:tcW w:w="2140" w:type="dxa"/>
+          </w:tcPr>
+          <w:p>
+            <w:pPr>
+              <w:spacing w:after="160"/>
+            </w:pPr>
+            <w:r>
+              <w:t>Scale up general facility testing  by 10 000 tests – ART initiations</w:t>
+            </w:r>
+          </w:p>
+        </w:tc>
+        <w:tc>
+          <w:tcPr>
+            <w:tcW w:w="6462" w:type="dxa"/>
+          </w:tcPr>
+          <w:p>
+            <w:pPr>
+              <w:spacing w:after="160"/>
+            </w:pPr>
+            <w:r>
+              <w:t>Expected_</w:t>
+            </w:r>
+            <w:r>
+              <w:t>art_init</w:t>
+            </w:r>
+            <w:r>
+              <w:t>_scenario=2*expected_</w:t>
+            </w:r>
+            <w:r>
+              <w:t xml:space="preserve"> </w:t>
+            </w:r>
+            <w:r>
+              <w:t>art_init</w:t>
+            </w:r>
+            <w:r>
+              <w:t xml:space="preserve"> </w:t>
+            </w:r>
+            <w:r>
+              <w:t>_baseline</w:t>
+            </w:r>
+          </w:p>
+        </w:tc>
+      </w:tr>
+      <w:tr>
+        <w:trPr>
+          <w:trHeight w:val="457"/>
+        </w:trPr>
+        <w:tc>
+          <w:tcPr>
+            <w:tcW w:w="549" w:type="dxa"/>
+          </w:tcPr>
+          <w:p>
+            <w:pPr>
+              <w:spacing w:after="160"/>
+            </w:pPr>
+            <w:r>
+              <w:t>4</w:t>
+            </w:r>
+          </w:p>
+        </w:tc>
+        <w:tc>
+          <w:tcPr>
+            <w:tcW w:w="2140" w:type="dxa"/>
+          </w:tcPr>
+          <w:p>
+            <w:pPr>
+              <w:spacing w:after="160"/>
+            </w:pPr>
+            <w:r>
+              <w:t>Scale up general facility testing  by 10 000 tests – viral suppression</w:t>
+            </w:r>
+          </w:p>
+        </w:tc>
+        <w:tc>
+          <w:tcPr>
+            <w:tcW w:w="6462" w:type="dxa"/>
+          </w:tcPr>
+          <w:p>
+            <w:pPr>
+              <w:spacing w:after="160"/>
+            </w:pPr>
+            <w:r>
+              <w:t>Expected_</w:t>
+            </w:r>
+            <w:r>
+              <w:t>vs</w:t>
+            </w:r>
+            <w:r>
+              <w:t xml:space="preserve">_scenario=2*expected_ </w:t>
+            </w:r>
+            <w:r>
+              <w:t>vs</w:t>
+            </w:r>
+            <w:r>
+              <w:t>_baseline</w:t>
+            </w:r>
+          </w:p>
+        </w:tc>
+      </w:tr>
+    </w:tbl>
+    <w:p/>
+    <w:p>
+      <w:pPr>
+        <w:pStyle w:val="Heading4"/>
+      </w:pPr>
+      <w:r>
+        <w:t xml:space="preserve">Scale </w:t>
+      </w:r>
+      <w:r>
+        <w:t>down</w:t>
+      </w:r>
+      <w:r>
+        <w:t xml:space="preserve"> scenario to </w:t>
+      </w:r>
+      <w:r>
+        <w:t>1</w:t>
+      </w:r>
+      <w:r>
+        <w:t xml:space="preserve">0,000 tests </w:t>
+      </w:r>
+      <w:r>
+        <w:t>from</w:t>
+      </w:r>
+      <w:r>
+        <w:t xml:space="preserve"> </w:t>
+      </w:r>
+      <w:r>
+        <w:t>5</w:t>
+      </w:r>
+      <w:r>
+        <w:t>0,000 baseline</w:t>
+      </w:r>
+    </w:p>
+    <w:tbl>
+      <w:tblPr>
+        <w:tblStyle w:val="TableGrid"/>
+        <w:tblW w:w="0" w:type="auto"/>
+        <w:tblLook w:val="04A0" w:firstRow="1" w:lastRow="0" w:firstColumn="1" w:lastColumn="0" w:noHBand="0" w:noVBand="1"/>
+      </w:tblPr>
+      <w:tblGrid>
+        <w:gridCol w:w="533"/>
+        <w:gridCol w:w="2069"/>
+        <w:gridCol w:w="6748"/>
+      </w:tblGrid>
+      <w:tr>
+        <w:trPr>
+          <w:trHeight w:val="457"/>
+        </w:trPr>
+        <w:tc>
+          <w:tcPr>
+            <w:tcW w:w="549" w:type="dxa"/>
+          </w:tcPr>
+          <w:p>
+            <w:pPr>
+              <w:spacing w:after="160"/>
+              <w:rPr>
+                <w:b/>
+                <w:bCs/>
+              </w:rPr>
+            </w:pPr>
+            <w:r>
+              <w:rPr>
+                <w:b/>
+                <w:bCs/>
+              </w:rPr>
+              <w:t>#</w:t>
+            </w:r>
+          </w:p>
+        </w:tc>
+        <w:tc>
+          <w:tcPr>
+            <w:tcW w:w="2140" w:type="dxa"/>
+          </w:tcPr>
+          <w:p>
+            <w:pPr>
+              <w:spacing w:after="160"/>
+              <w:rPr>
+                <w:b/>
+                <w:bCs/>
+              </w:rPr>
+            </w:pPr>
+            <w:r>
+              <w:rPr>
+                <w:b/>
+                <w:bCs/>
+              </w:rPr>
+              <w:t>Description</w:t>
+            </w:r>
+          </w:p>
+        </w:tc>
+        <w:tc>
+          <w:tcPr>
+            <w:tcW w:w="6462" w:type="dxa"/>
+          </w:tcPr>
+          <w:p>
+            <w:pPr>
+              <w:spacing w:after="160"/>
+              <w:rPr>
+                <w:b/>
+                <w:bCs/>
+              </w:rPr>
+            </w:pPr>
+            <w:r>
+              <w:rPr>
+                <w:b/>
+                <w:bCs/>
+              </w:rPr>
+              <w:t>Test Calculation/expectation</w:t>
+            </w:r>
+          </w:p>
+        </w:tc>
+      </w:tr>
+      <w:tr>
+        <w:trPr>
+          <w:trHeight w:val="457"/>
+        </w:trPr>
+        <w:tc>
+          <w:tcPr>
+            <w:tcW w:w="549" w:type="dxa"/>
+          </w:tcPr>
+          <w:p>
+            <w:pPr>
+              <w:spacing w:after="160"/>
+            </w:pPr>
+            <w:r>
+              <w:t>1.</w:t>
+            </w:r>
+          </w:p>
+        </w:tc>
+        <w:tc>
+          <w:tcPr>
+            <w:tcW w:w="2140" w:type="dxa"/>
+          </w:tcPr>
+          <w:p>
+            <w:pPr>
+              <w:spacing w:after="160"/>
+            </w:pPr>
+            <w:r>
+              <w:t xml:space="preserve">Scale </w:t>
+            </w:r>
+            <w:r>
+              <w:t>down</w:t>
+            </w:r>
+            <w:r>
+              <w:t xml:space="preserve"> general facility testing  </w:t>
+            </w:r>
+            <w:r>
+              <w:t>to</w:t>
+            </w:r>
+            <w:r>
+              <w:t xml:space="preserve"> 10 000 tests – positive tests</w:t>
+            </w:r>
+          </w:p>
+        </w:tc>
+        <w:tc>
+          <w:tcPr>
+            <w:tcW w:w="6462" w:type="dxa"/>
+          </w:tcPr>
+          <w:p>
+            <w:pPr>
+              <w:spacing w:after="160"/>
+            </w:pPr>
+            <w:r>
+              <w:t>Expected_positive_scenario=</w:t>
+            </w:r>
+            <w:r>
+              <w:t>0.</w:t>
+            </w:r>
+            <w:r>
+              <w:t>2*expected_positive_baseline</w:t>
+            </w:r>
+          </w:p>
+        </w:tc>
+      </w:tr>
+      <w:tr>
+        <w:trPr>
+          <w:trHeight w:val="457"/>
+        </w:trPr>
+        <w:tc>
+          <w:tcPr>
+            <w:tcW w:w="549" w:type="dxa"/>
+          </w:tcPr>
+          <w:p>
+            <w:pPr>
+              <w:spacing w:after="160"/>
+            </w:pPr>
+            <w:r>
+              <w:t>2.</w:t>
+            </w:r>
+          </w:p>
+        </w:tc>
+        <w:tc>
+          <w:tcPr>
+            <w:tcW w:w="2140" w:type="dxa"/>
+          </w:tcPr>
+          <w:p>
+            <w:pPr>
+              <w:spacing w:after="160"/>
+            </w:pPr>
+            <w:r>
+              <w:t>Scale down general facility testing  to 10 000 tests – new diagnoses</w:t>
+            </w:r>
+          </w:p>
+        </w:tc>
+        <w:tc>
+          <w:tcPr>
+            <w:tcW w:w="6462" w:type="dxa"/>
+          </w:tcPr>
+          <w:p>
+            <w:pPr>
+              <w:spacing w:after="160"/>
+            </w:pPr>
+            <w:r>
+              <w:t>Expected_new_dx_scenario=</w:t>
+            </w:r>
+            <w:r>
+              <w:t>0.</w:t>
+            </w:r>
+            <w:r>
+              <w:t>2*expected_new_dx_baseline</w:t>
+            </w:r>
+          </w:p>
+        </w:tc>
+      </w:tr>
+      <w:tr>
+        <w:trPr>
+          <w:trHeight w:val="457"/>
+        </w:trPr>
+        <w:tc>
+          <w:tcPr>
+            <w:tcW w:w="549" w:type="dxa"/>
+          </w:tcPr>
+          <w:p>
+            <w:pPr>
+              <w:spacing w:after="160"/>
+            </w:pPr>
+            <w:r>
+              <w:t>3</w:t>
+            </w:r>
+          </w:p>
+        </w:tc>
+        <w:tc>
+          <w:tcPr>
+            <w:tcW w:w="2140" w:type="dxa"/>
+          </w:tcPr>
+          <w:p>
+            <w:pPr>
+              <w:spacing w:after="160"/>
+            </w:pPr>
+            <w:r>
+              <w:t>Scale down general facility testing  to 10 000 tests – ART initiations</w:t>
+            </w:r>
+          </w:p>
+        </w:tc>
+        <w:tc>
+          <w:tcPr>
+            <w:tcW w:w="6462" w:type="dxa"/>
+          </w:tcPr>
+          <w:p>
+            <w:pPr>
+              <w:spacing w:after="160"/>
+            </w:pPr>
+            <w:r>
+              <w:t>Expected_art_init_scenario=</w:t>
+            </w:r>
+            <w:r>
+              <w:t>0.</w:t>
+            </w:r>
+            <w:r>
+              <w:t>2*expected_ art_init _baseline</w:t>
+            </w:r>
+          </w:p>
+        </w:tc>
+      </w:tr>
+      <w:tr>
+        <w:trPr>
+          <w:trHeight w:val="457"/>
+        </w:trPr>
+        <w:tc>
+          <w:tcPr>
+            <w:tcW w:w="549" w:type="dxa"/>
+          </w:tcPr>
+          <w:p>
+            <w:pPr>
+              <w:spacing w:after="160"/>
+            </w:pPr>
+            <w:r>
+              <w:t>4</w:t>
+            </w:r>
+          </w:p>
+        </w:tc>
+        <w:tc>
+          <w:tcPr>
+            <w:tcW w:w="2140" w:type="dxa"/>
+          </w:tcPr>
+          <w:p>
+            <w:pPr>
+              <w:spacing w:after="160"/>
+            </w:pPr>
+            <w:r>
+              <w:t>Scale down general facility testing  to 10 000 tests – viral suppression</w:t>
+            </w:r>
+          </w:p>
+        </w:tc>
+        <w:tc>
+          <w:tcPr>
+            <w:tcW w:w="6462" w:type="dxa"/>
+          </w:tcPr>
+          <w:p>
+            <w:pPr>
+              <w:spacing w:after="160"/>
+            </w:pPr>
+            <w:r>
+              <w:t>Expected_vs_scenario=</w:t>
+            </w:r>
+            <w:r>
+              <w:t>0.</w:t>
+            </w:r>
+            <w:r>
+              <w:t>2*expected_ vs_baseline</w:t>
+            </w:r>
+          </w:p>
+        </w:tc>
+      </w:tr>
+    </w:tbl>
+    <w:p/>
+    <w:p>
+      <w:pPr>
+        <w:pStyle w:val="Heading4"/>
+      </w:pPr>
+      <w:r>
         <w:t>Multiple test modalit</w:t>
       </w:r>
       <w:r>
         <w:t>ies</w:t>
+      </w:r>
+      <w:r>
+        <w:t xml:space="preserve"> (single scenario)</w:t>
       </w:r>
     </w:p>
     <w:p>
@@ -5133,6 +5892,74 @@
           <w:color w:val="000000" w:themeColor="text1"/>
         </w:rPr>
         <w:t>General test multiplier =1, targeted test multiplier =2</w:t>
+      </w:r>
+    </w:p>
+    <w:p>
+      <w:pPr>
+        <w:rPr>
+          <w:color w:val="000000" w:themeColor="text1"/>
+        </w:rPr>
+      </w:pPr>
+      <w:r>
+        <w:rPr>
+          <w:color w:val="000000" w:themeColor="text1"/>
+        </w:rPr>
+        <w:t>Compare three scenarios:</w:t>
+      </w:r>
+    </w:p>
+    <w:p>
+      <w:pPr>
+        <w:pStyle w:val="ListParagraph"/>
+        <w:numPr>
+          <w:ilvl w:val="0"/>
+          <w:numId w:val="7"/>
+        </w:numPr>
+        <w:rPr>
+          <w:color w:val="000000" w:themeColor="text1"/>
+        </w:rPr>
+      </w:pPr>
+      <w:r>
+        <w:rPr>
+          <w:color w:val="000000" w:themeColor="text1"/>
+        </w:rPr>
+        <w:lastRenderedPageBreak/>
+        <w:t>10,000 general</w:t>
+      </w:r>
+    </w:p>
+    <w:p>
+      <w:pPr>
+        <w:pStyle w:val="ListParagraph"/>
+        <w:numPr>
+          <w:ilvl w:val="0"/>
+          <w:numId w:val="7"/>
+        </w:numPr>
+        <w:rPr>
+          <w:color w:val="000000" w:themeColor="text1"/>
+        </w:rPr>
+      </w:pPr>
+      <w:r>
+        <w:rPr>
+          <w:color w:val="000000" w:themeColor="text1"/>
+        </w:rPr>
+        <w:t>10,000 targeted</w:t>
+      </w:r>
+    </w:p>
+    <w:p>
+      <w:pPr>
+        <w:pStyle w:val="ListParagraph"/>
+        <w:numPr>
+          <w:ilvl w:val="0"/>
+          <w:numId w:val="7"/>
+        </w:numPr>
+        <w:rPr>
+          <w:color w:val="000000" w:themeColor="text1"/>
+        </w:rPr>
+      </w:pPr>
+      <w:r>
+        <w:rPr>
+          <w:color w:val="000000" w:themeColor="text1"/>
+        </w:rPr>
+        <w:t>10,000 targeted + 10,000 general</w:t>
       </w:r>
     </w:p>
     <w:p>
@@ -5247,13 +6074,10 @@
               <w:spacing w:after="160"/>
             </w:pPr>
             <w:r>
-              <w:t xml:space="preserve">Scale up general facility testing  by 10 000 tests </w:t>
-            </w:r>
-            <w:r>
-              <w:t>and targeted testing by 10 000</w:t>
-            </w:r>
-            <w:r>
-              <w:t>– positive tests</w:t>
+              <w:t>P</w:t>
+            </w:r>
+            <w:r>
+              <w:t>ositive tests</w:t>
             </w:r>
           </w:p>
         </w:tc>
@@ -5263,29 +6087,42 @@
           </w:tcPr>
           <w:p>
             <w:pPr>
-              <w:spacing w:after="160"/>
-            </w:pPr>
-            <w:r>
-              <w:t>Expected_positives_targeted= 2* expected_positives_general</w:t>
-            </w:r>
-          </w:p>
-          <w:p>
-            <w:pPr>
-              <w:spacing w:after="160"/>
-            </w:pPr>
-          </w:p>
-          <w:p>
-            <w:pPr>
-              <w:spacing w:after="160"/>
-            </w:pPr>
-            <w:r>
-              <w:t>422=2*211</w:t>
-            </w:r>
-          </w:p>
-          <w:p>
-            <w:pPr>
-              <w:spacing w:after="160"/>
-            </w:pPr>
+              <w:pStyle w:val="ListParagraph"/>
+              <w:numPr>
+                <w:ilvl w:val="0"/>
+                <w:numId w:val="9"/>
+              </w:numPr>
+              <w:spacing w:after="160"/>
+            </w:pPr>
+            <w:r>
+              <w:t>211</w:t>
+            </w:r>
+          </w:p>
+          <w:p>
+            <w:pPr>
+              <w:pStyle w:val="ListParagraph"/>
+              <w:numPr>
+                <w:ilvl w:val="0"/>
+                <w:numId w:val="9"/>
+              </w:numPr>
+              <w:spacing w:after="160"/>
+            </w:pPr>
+            <w:r>
+              <w:t>422</w:t>
+            </w:r>
+          </w:p>
+          <w:p>
+            <w:pPr>
+              <w:pStyle w:val="ListParagraph"/>
+              <w:numPr>
+                <w:ilvl w:val="0"/>
+                <w:numId w:val="9"/>
+              </w:numPr>
+              <w:spacing w:after="160"/>
+            </w:pPr>
+            <w:r>
+              <w:t>633</w:t>
+            </w:r>
           </w:p>
         </w:tc>
       </w:tr>
@@ -5304,6 +6141,9 @@
             <w:r>
               <w:t>2</w:t>
             </w:r>
+            <w:r>
+              <w:t>.</w:t>
+            </w:r>
           </w:p>
         </w:tc>
         <w:tc>
@@ -5315,7 +6155,7 @@
               <w:spacing w:after="160"/>
             </w:pPr>
             <w:r>
-              <w:t>Scale up general facility testing  by 10 000 tests and targeted testing by 10 000– positive tests 2</w:t>
+              <w:t>New diagnoses</w:t>
             </w:r>
           </w:p>
         </w:tc>
@@ -5325,32 +6165,53 @@
           </w:tcPr>
           <w:p>
             <w:pPr>
-              <w:spacing w:after="160"/>
-            </w:pPr>
-            <w:r>
-              <w:t xml:space="preserve">Expected_positives_total= </w:t>
-            </w:r>
-            <w:r>
-              <w:t xml:space="preserve">(10000 * base_yield * </w:t>
-            </w:r>
-            <w:r>
-              <w:t>general_multiplier* general_efficacy) + (10000*base_yield* target_multiplier*target efficacy)</w:t>
-            </w:r>
-          </w:p>
-          <w:p>
-            <w:pPr>
-              <w:spacing w:after="160"/>
-            </w:pPr>
-          </w:p>
-          <w:p>
-            <w:pPr>
-              <w:spacing w:after="160"/>
-            </w:pPr>
-            <w:r>
-              <w:t>Expected_positives_total=</w:t>
-            </w:r>
+              <w:pStyle w:val="ListParagraph"/>
+              <w:numPr>
+                <w:ilvl w:val="0"/>
+                <w:numId w:val="10"/>
+              </w:numPr>
+              <w:spacing w:after="160"/>
+            </w:pPr>
+            <w:r>
+              <w:t>211</w:t>
+            </w:r>
+            <w:r>
+              <w:t>*0.5 =105</w:t>
+            </w:r>
+          </w:p>
+          <w:p>
+            <w:pPr>
+              <w:pStyle w:val="ListParagraph"/>
+              <w:numPr>
+                <w:ilvl w:val="0"/>
+                <w:numId w:val="10"/>
+              </w:numPr>
+              <w:spacing w:after="160"/>
+            </w:pPr>
+            <w:r>
+              <w:t>422</w:t>
+            </w:r>
+            <w:r>
+              <w:t>*0.5 =211</w:t>
+            </w:r>
+          </w:p>
+          <w:p>
+            <w:pPr>
+              <w:pStyle w:val="ListParagraph"/>
+              <w:numPr>
+                <w:ilvl w:val="0"/>
+                <w:numId w:val="10"/>
+              </w:numPr>
+              <w:spacing w:after="160"/>
+            </w:pPr>
             <w:r>
               <w:t>633</w:t>
+            </w:r>
+            <w:r>
+              <w:t xml:space="preserve">*0.5 = </w:t>
+            </w:r>
+            <w:r>
+              <w:t>316/317</w:t>
             </w:r>
           </w:p>
         </w:tc>
@@ -5368,12 +6229,8 @@
               <w:spacing w:after="160"/>
             </w:pPr>
             <w:r>
-              <w:lastRenderedPageBreak/>
               <w:t>3</w:t>
             </w:r>
-            <w:r>
-              <w:t>.</w:t>
-            </w:r>
           </w:p>
         </w:tc>
         <w:tc>
@@ -5385,7 +6242,10 @@
               <w:spacing w:after="160"/>
             </w:pPr>
             <w:r>
-              <w:t>Scale up general facility testing  by 10 000 tests – new diagnoses</w:t>
+              <w:t xml:space="preserve">ART </w:t>
+            </w:r>
+            <w:r>
+              <w:t>initiations</w:t>
             </w:r>
           </w:p>
         </w:tc>
@@ -5395,30 +6255,50 @@
           </w:tcPr>
           <w:p>
             <w:pPr>
-              <w:spacing w:after="160"/>
-            </w:pPr>
-            <w:r>
-              <w:t>Expected_new_diagnoses = Expected_positives_total*(1-re_test_prop)</w:t>
-            </w:r>
-          </w:p>
-          <w:p>
-            <w:pPr>
-              <w:spacing w:after="160"/>
-            </w:pPr>
-            <w:r>
-              <w:t>Expected_new_diagn</w:t>
-            </w:r>
-            <w:r>
-              <w:t>o</w:t>
-            </w:r>
-            <w:r>
-              <w:t xml:space="preserve">ses = </w:t>
-            </w:r>
-            <w:r>
-              <w:t>316</w:t>
-            </w:r>
-            <w:r>
-              <w:t>*</w:t>
+              <w:pStyle w:val="ListParagraph"/>
+              <w:numPr>
+                <w:ilvl w:val="0"/>
+                <w:numId w:val="11"/>
+              </w:numPr>
+              <w:spacing w:after="160"/>
+            </w:pPr>
+            <w:r>
+              <w:t>New_dx1*0.9</w:t>
+            </w:r>
+            <w:r>
+              <w:t xml:space="preserve"> = 190</w:t>
+            </w:r>
+          </w:p>
+          <w:p>
+            <w:pPr>
+              <w:pStyle w:val="ListParagraph"/>
+              <w:numPr>
+                <w:ilvl w:val="0"/>
+                <w:numId w:val="11"/>
+              </w:numPr>
+              <w:spacing w:after="160"/>
+            </w:pPr>
+            <w:r>
+              <w:t>New_dx2 *0.8</w:t>
+            </w:r>
+            <w:r>
+              <w:t xml:space="preserve"> = 338</w:t>
+            </w:r>
+          </w:p>
+          <w:p>
+            <w:pPr>
+              <w:pStyle w:val="ListParagraph"/>
+              <w:numPr>
+                <w:ilvl w:val="0"/>
+                <w:numId w:val="11"/>
+              </w:numPr>
+              <w:spacing w:after="160"/>
+            </w:pPr>
+            <w:r>
+              <w:t>New_dx1*0.9 + new_dx2*0.8</w:t>
+            </w:r>
+            <w:r>
+              <w:t xml:space="preserve"> = 527/528</w:t>
             </w:r>
           </w:p>
         </w:tc>
@@ -5449,7 +6329,7 @@
               <w:spacing w:after="160"/>
             </w:pPr>
             <w:r>
-              <w:t>Scale up general facility testing  by 10 000 tests – ART initiations</w:t>
+              <w:t>Viral suppression</w:t>
             </w:r>
           </w:p>
         </w:tc>
@@ -5459,258 +6339,51 @@
           </w:tcPr>
           <w:p>
             <w:pPr>
-              <w:spacing w:after="160"/>
-            </w:pPr>
-            <w:r>
-              <w:t xml:space="preserve">Experted_art_inititations = </w:t>
-            </w:r>
-            <w:r>
-              <w:t>expected_positive_general*general_linkage_rate</w:t>
-            </w:r>
-            <w:r>
-              <w:t>+ expected_positive_targeted*taregetd_linkage_rate</w:t>
-            </w:r>
-          </w:p>
-          <w:p>
-            <w:pPr>
-              <w:spacing w:after="160"/>
-            </w:pPr>
-            <w:r>
-              <w:t>Experted_art_inititations =</w:t>
+              <w:pStyle w:val="ListParagraph"/>
+              <w:numPr>
+                <w:ilvl w:val="0"/>
+                <w:numId w:val="12"/>
+              </w:numPr>
+              <w:spacing w:after="160"/>
+            </w:pPr>
+            <w:r>
+              <w:t>Art_init</w:t>
+            </w:r>
+            <w:r>
+              <w:t>1</w:t>
+            </w:r>
+            <w:r>
+              <w:t xml:space="preserve">*base_viral_suppression </w:t>
+            </w:r>
+          </w:p>
+          <w:p>
+            <w:pPr>
+              <w:pStyle w:val="ListParagraph"/>
+              <w:numPr>
+                <w:ilvl w:val="0"/>
+                <w:numId w:val="12"/>
+              </w:numPr>
+              <w:spacing w:after="160"/>
+            </w:pPr>
+            <w:r>
+              <w:t>Art_init2*base_viral_suppression</w:t>
             </w:r>
             <w:r>
               <w:t xml:space="preserve"> </w:t>
             </w:r>
-            <w:r>
-              <w:t>527</w:t>
-            </w:r>
-          </w:p>
-        </w:tc>
-      </w:tr>
-      <w:tr>
-        <w:trPr>
-          <w:trHeight w:val="457"/>
-        </w:trPr>
-        <w:tc>
-          <w:tcPr>
-            <w:tcW w:w="549" w:type="dxa"/>
-          </w:tcPr>
-          <w:p>
-            <w:pPr>
-              <w:spacing w:after="160"/>
-            </w:pPr>
-            <w:r>
-              <w:t>5</w:t>
-            </w:r>
-          </w:p>
-        </w:tc>
-        <w:tc>
-          <w:tcPr>
-            <w:tcW w:w="2140" w:type="dxa"/>
-          </w:tcPr>
-          <w:p>
-            <w:pPr>
-              <w:spacing w:after="160"/>
-            </w:pPr>
-            <w:r>
-              <w:t>Scale up general facility testing  by 10 000 tests – viral suppression</w:t>
-            </w:r>
-          </w:p>
-        </w:tc>
-        <w:tc>
-          <w:tcPr>
-            <w:tcW w:w="6462" w:type="dxa"/>
-          </w:tcPr>
-          <w:p>
-            <w:pPr>
-              <w:spacing w:after="160"/>
-            </w:pPr>
-            <w:r>
-              <w:rPr>
-                <w:highlight w:val="yellow"/>
-              </w:rPr>
-              <w:t xml:space="preserve">New_virally_suppressed = </w:t>
-            </w:r>
-            <w:r>
-              <w:rPr>
-                <w:highlight w:val="yellow"/>
-              </w:rPr>
-              <w:t>Expected_art_inititations*base_viral_suppression</w:t>
-            </w:r>
-          </w:p>
-          <w:p>
-            <w:pPr>
-              <w:spacing w:after="160"/>
-            </w:pPr>
-            <w:r>
-              <w:t xml:space="preserve">New_virally_suppressed = </w:t>
-            </w:r>
-            <w:r>
-              <w:t>396</w:t>
-            </w:r>
-          </w:p>
-        </w:tc>
-      </w:tr>
-      <w:tr>
-        <w:trPr>
-          <w:trHeight w:val="457"/>
-        </w:trPr>
-        <w:tc>
-          <w:tcPr>
-            <w:tcW w:w="549" w:type="dxa"/>
-          </w:tcPr>
-          <w:p>
-            <w:pPr>
-              <w:spacing w:after="160"/>
-            </w:pPr>
-            <w:r>
-              <w:t>6</w:t>
-            </w:r>
-          </w:p>
-        </w:tc>
-        <w:tc>
-          <w:tcPr>
-            <w:tcW w:w="2140" w:type="dxa"/>
-          </w:tcPr>
-          <w:p>
-            <w:pPr>
-              <w:spacing w:after="160"/>
-            </w:pPr>
-            <w:r>
-              <w:t>Scale up general facility testing  by 10 000 tests – 1</w:t>
-            </w:r>
-            <w:r>
-              <w:rPr>
-                <w:vertAlign w:val="superscript"/>
-              </w:rPr>
-              <w:t>st</w:t>
-            </w:r>
-            <w:r>
-              <w:t xml:space="preserve"> 95</w:t>
-            </w:r>
-          </w:p>
-        </w:tc>
-        <w:tc>
-          <w:tcPr>
-            <w:tcW w:w="6462" w:type="dxa"/>
-          </w:tcPr>
-          <w:p>
-            <w:pPr>
-              <w:spacing w:after="160"/>
-            </w:pPr>
-            <w:r>
-              <w:t>New_diagnosed</w:t>
-            </w:r>
-            <w:r>
-              <w:t>_total= baseline_diagnosed</w:t>
-            </w:r>
-            <w:r>
-              <w:t>+expected_new_diagnoses</w:t>
-            </w:r>
-          </w:p>
-          <w:p>
-            <w:pPr>
-              <w:spacing w:after="160"/>
-            </w:pPr>
-          </w:p>
-          <w:p>
-            <w:pPr>
-              <w:spacing w:after="160"/>
-            </w:pPr>
-            <w:r>
-              <w:t>1</w:t>
-            </w:r>
-            <w:r>
-              <w:rPr>
-                <w:vertAlign w:val="superscript"/>
-              </w:rPr>
-              <w:t>st</w:t>
-            </w:r>
-            <w:r>
-              <w:t>_95=</w:t>
-            </w:r>
-            <w:r>
-              <w:t xml:space="preserve"> diagnosed</w:t>
-            </w:r>
-            <w:r>
-              <w:t xml:space="preserve">/PLHIV = </w:t>
-            </w:r>
-            <w:r>
-              <w:t>80.6%</w:t>
-            </w:r>
-          </w:p>
-        </w:tc>
-      </w:tr>
-      <w:tr>
-        <w:trPr>
-          <w:trHeight w:val="457"/>
-        </w:trPr>
-        <w:tc>
-          <w:tcPr>
-            <w:tcW w:w="549" w:type="dxa"/>
-          </w:tcPr>
-          <w:p>
-            <w:pPr>
-              <w:spacing w:after="160"/>
-            </w:pPr>
-            <w:r>
-              <w:t>7</w:t>
-            </w:r>
-          </w:p>
-        </w:tc>
-        <w:tc>
-          <w:tcPr>
-            <w:tcW w:w="2140" w:type="dxa"/>
-          </w:tcPr>
-          <w:p>
-            <w:pPr>
-              <w:spacing w:after="160"/>
-            </w:pPr>
-          </w:p>
-        </w:tc>
-        <w:tc>
-          <w:tcPr>
-            <w:tcW w:w="6462" w:type="dxa"/>
-          </w:tcPr>
-          <w:p>
-            <w:pPr>
-              <w:spacing w:after="160"/>
-            </w:pPr>
-          </w:p>
-        </w:tc>
-      </w:tr>
-      <w:tr>
-        <w:trPr>
-          <w:trHeight w:val="457"/>
-        </w:trPr>
-        <w:tc>
-          <w:tcPr>
-            <w:tcW w:w="549" w:type="dxa"/>
-          </w:tcPr>
-          <w:p>
-            <w:pPr>
-              <w:spacing w:after="160"/>
-            </w:pPr>
-          </w:p>
-        </w:tc>
-        <w:tc>
-          <w:tcPr>
-            <w:tcW w:w="2140" w:type="dxa"/>
-          </w:tcPr>
-          <w:p>
-            <w:pPr>
-              <w:spacing w:after="160"/>
-            </w:pPr>
-          </w:p>
-        </w:tc>
-        <w:tc>
-          <w:tcPr>
-            <w:tcW w:w="6462" w:type="dxa"/>
-          </w:tcPr>
-          <w:p>
-            <w:pPr>
-              <w:spacing w:after="160"/>
-            </w:pPr>
+          </w:p>
+          <w:p>
+            <w:pPr>
+              <w:pStyle w:val="ListParagraph"/>
+              <w:numPr>
+                <w:ilvl w:val="0"/>
+                <w:numId w:val="12"/>
+              </w:numPr>
+              <w:spacing w:after="160"/>
+            </w:pPr>
+            <w:r>
+              <w:t>(Art_init1+Art_init2)*base_viral_suppression</w:t>
+            </w:r>
           </w:p>
         </w:tc>
       </w:tr>
@@ -5726,256 +6399,20 @@
     </w:p>
     <w:p>
       <w:pPr>
-        <w:pStyle w:val="Heading4"/>
-      </w:pPr>
-      <w:r>
-        <w:t>Zero Testing</w:t>
-      </w:r>
+        <w:rPr>
+          <w:i/>
+          <w:iCs/>
+          <w:color w:val="2E74B5"/>
+        </w:rPr>
+      </w:pPr>
     </w:p>
     <w:p>
       <w:pPr>
-        <w:pStyle w:val="Heading4"/>
-      </w:pPr>
-    </w:p>
-    <w:tbl>
-      <w:tblPr>
-        <w:tblStyle w:val="TableGrid"/>
-        <w:tblW w:w="0" w:type="auto"/>
-        <w:tblLook w:val="04A0" w:firstRow="1" w:lastRow="0" w:firstColumn="1" w:lastColumn="0" w:noHBand="0" w:noVBand="1"/>
-      </w:tblPr>
-      <w:tblGrid>
-        <w:gridCol w:w="549"/>
-        <w:gridCol w:w="2140"/>
-        <w:gridCol w:w="6462"/>
-      </w:tblGrid>
-      <w:tr>
-        <w:trPr>
-          <w:trHeight w:val="457"/>
-        </w:trPr>
-        <w:tc>
-          <w:tcPr>
-            <w:tcW w:w="549" w:type="dxa"/>
-          </w:tcPr>
-          <w:p>
-            <w:pPr>
-              <w:spacing w:after="160"/>
-              <w:rPr>
-                <w:b/>
-                <w:bCs/>
-              </w:rPr>
-            </w:pPr>
-            <w:r>
-              <w:rPr>
-                <w:b/>
-                <w:bCs/>
-              </w:rPr>
-              <w:t>#</w:t>
-            </w:r>
-          </w:p>
-        </w:tc>
-        <w:tc>
-          <w:tcPr>
-            <w:tcW w:w="2140" w:type="dxa"/>
-          </w:tcPr>
-          <w:p>
-            <w:pPr>
-              <w:spacing w:after="160"/>
-              <w:rPr>
-                <w:b/>
-                <w:bCs/>
-              </w:rPr>
-            </w:pPr>
-            <w:r>
-              <w:rPr>
-                <w:b/>
-                <w:bCs/>
-              </w:rPr>
-              <w:t>Description</w:t>
-            </w:r>
-          </w:p>
-        </w:tc>
-        <w:tc>
-          <w:tcPr>
-            <w:tcW w:w="6462" w:type="dxa"/>
-          </w:tcPr>
-          <w:p>
-            <w:pPr>
-              <w:spacing w:after="160"/>
-              <w:rPr>
-                <w:b/>
-                <w:bCs/>
-              </w:rPr>
-            </w:pPr>
-            <w:r>
-              <w:rPr>
-                <w:b/>
-                <w:bCs/>
-              </w:rPr>
-              <w:t>Test Calculation/expectation</w:t>
-            </w:r>
-          </w:p>
-        </w:tc>
-      </w:tr>
-      <w:tr>
-        <w:trPr>
-          <w:trHeight w:val="457"/>
-        </w:trPr>
-        <w:tc>
-          <w:tcPr>
-            <w:tcW w:w="549" w:type="dxa"/>
-          </w:tcPr>
-          <w:p>
-            <w:pPr>
-              <w:spacing w:after="160"/>
-            </w:pPr>
-            <w:r>
-              <w:t>1.</w:t>
-            </w:r>
-          </w:p>
-        </w:tc>
-        <w:tc>
-          <w:tcPr>
-            <w:tcW w:w="2140" w:type="dxa"/>
-          </w:tcPr>
-          <w:p>
-            <w:pPr>
-              <w:spacing w:after="160"/>
-            </w:pPr>
-            <w:r>
-              <w:t>Set all testing to be 0</w:t>
-            </w:r>
-            <w:r>
-              <w:t xml:space="preserve"> – new diagnoses</w:t>
-            </w:r>
-          </w:p>
-        </w:tc>
-        <w:tc>
-          <w:tcPr>
-            <w:tcW w:w="6462" w:type="dxa"/>
-          </w:tcPr>
-          <w:p>
-            <w:pPr>
-              <w:spacing w:after="160"/>
-            </w:pPr>
-            <w:r>
-              <w:t xml:space="preserve">Expected_new_diagnoses = </w:t>
-            </w:r>
-            <w:r>
-              <w:t>-</w:t>
-            </w:r>
-            <w:r>
-              <w:t>re_test_prop</w:t>
-            </w:r>
-            <w:r>
-              <w:t>* current_diagnoses</w:t>
-            </w:r>
-          </w:p>
-        </w:tc>
-      </w:tr>
-      <w:tr>
-        <w:trPr>
-          <w:trHeight w:val="457"/>
-        </w:trPr>
-        <w:tc>
-          <w:tcPr>
-            <w:tcW w:w="549" w:type="dxa"/>
-          </w:tcPr>
-          <w:p>
-            <w:pPr>
-              <w:spacing w:after="160"/>
-            </w:pPr>
-            <w:r>
-              <w:t>2.</w:t>
-            </w:r>
-          </w:p>
-        </w:tc>
-        <w:tc>
-          <w:tcPr>
-            <w:tcW w:w="2140" w:type="dxa"/>
-          </w:tcPr>
-          <w:p>
-            <w:pPr>
-              <w:spacing w:after="160"/>
-            </w:pPr>
-            <w:r>
-              <w:t xml:space="preserve">Set all testing to be 0 – new </w:t>
-            </w:r>
-            <w:r>
-              <w:t>PLHIV diagnosed</w:t>
-            </w:r>
-          </w:p>
-        </w:tc>
-        <w:tc>
-          <w:tcPr>
-            <w:tcW w:w="6462" w:type="dxa"/>
-          </w:tcPr>
-          <w:p>
-            <w:pPr>
-              <w:spacing w:after="160"/>
-            </w:pPr>
-            <w:r>
-              <w:t>Expected</w:t>
-            </w:r>
-            <w:r>
-              <w:t>_new</w:t>
-            </w:r>
-            <w:r>
-              <w:t>_plhiv_diagnosed=</w:t>
-            </w:r>
-            <w:r>
-              <w:t xml:space="preserve">PLHIV_diagnosed - </w:t>
-            </w:r>
-            <w:r>
-              <w:t>re_test_prop* current_diagnoses</w:t>
-            </w:r>
-          </w:p>
-        </w:tc>
-      </w:tr>
-      <w:tr>
-        <w:trPr>
-          <w:trHeight w:val="457"/>
-        </w:trPr>
-        <w:tc>
-          <w:tcPr>
-            <w:tcW w:w="549" w:type="dxa"/>
-          </w:tcPr>
-          <w:p>
-            <w:pPr>
-              <w:spacing w:after="160"/>
-            </w:pPr>
-            <w:r>
-              <w:t>3.</w:t>
-            </w:r>
-          </w:p>
-        </w:tc>
-        <w:tc>
-          <w:tcPr>
-            <w:tcW w:w="2140" w:type="dxa"/>
-          </w:tcPr>
-          <w:p>
-            <w:pPr>
-              <w:spacing w:after="160"/>
-            </w:pPr>
-            <w:r>
-              <w:t>Set all testing to be 0 – new PLHIV diagnosed</w:t>
-            </w:r>
-          </w:p>
-        </w:tc>
-        <w:tc>
-          <w:tcPr>
-            <w:tcW w:w="6462" w:type="dxa"/>
-          </w:tcPr>
-          <w:p>
-            <w:pPr>
-              <w:spacing w:after="160"/>
-            </w:pPr>
-          </w:p>
-        </w:tc>
-      </w:tr>
-    </w:tbl>
-    <w:p>
-      <w:pPr>
-        <w:pStyle w:val="Heading4"/>
+        <w:rPr>
+          <w:i/>
+          <w:iCs/>
+          <w:color w:val="2E74B5"/>
+        </w:rPr>
       </w:pPr>
     </w:p>
     <w:sectPr>
@@ -6171,6 +6608,119 @@
 <file path=word/numbering.xml><?xml version="1.0" encoding="utf-8"?>
 <w:numbering xmlns:wpc="http://schemas.microsoft.com/office/word/2010/wordprocessingCanvas" xmlns:cx="http://schemas.microsoft.com/office/drawing/2014/chartex" xmlns:cx1="http://schemas.microsoft.com/office/drawing/2015/9/8/chartex" xmlns:cx2="http://schemas.microsoft.com/office/drawing/2015/10/21/chartex" xmlns:cx3="http://schemas.microsoft.com/office/drawing/2016/5/9/chartex" xmlns:cx4="http://schemas.microsoft.com/office/drawing/2016/5/10/chartex" xmlns:cx5="http://schemas.microsoft.com/office/drawing/2016/5/11/chartex" xmlns:cx6="http://schemas.microsoft.com/office/drawing/2016/5/12/chartex" xmlns:cx7="http://schemas.microsoft.com/office/drawing/2016/5/13/chartex" xmlns:cx8="http://schemas.microsoft.com/office/drawing/2016/5/14/chartex" xmlns:mc="http://schemas.openxmlformats.org/markup-compatibility/2006" xmlns:aink="http://schemas.microsoft.com/office/drawing/2016/ink" xmlns:am3d="http://schemas.microsoft.com/office/drawing/2017/model3d" xmlns:o="urn:schemas-microsoft-com:office:office" xmlns:oel="http://schemas.microsoft.com/office/2019/extlst" xmlns:r="http://schemas.openxmlformats.org/officeDocument/2006/relationships" xmlns:m="http://schemas.openxmlformats.org/officeDocument/2006/math" xmlns:v="urn:schemas-microsoft-com:vml" xmlns:wp14="http://schemas.microsoft.com/office/word/2010/wordprocessingDrawing" xmlns:wp="http://schemas.openxmlformats.org/drawingml/2006/wordprocessingDrawing" xmlns:w10="urn:schemas-microsoft-com:office:word" xmlns:w="http://schemas.openxmlformats.org/wordprocessingml/2006/main" xmlns:w14="http://schemas.microsoft.com/office/word/2010/wordml" xmlns:w15="http://schemas.microsoft.com/office/word/2012/wordml" xmlns:w16cex="http://schemas.microsoft.com/office/word/2018/wordml/cex" xmlns:w16cid="http://schemas.microsoft.com/office/word/2016/wordml/cid" xmlns:w16="http://schemas.microsoft.com/office/word/2018/wordml" xmlns:w16du="http://schemas.microsoft.com/office/word/2023/wordml/word16du" xmlns:w16sdtdh="http://schemas.microsoft.com/office/word/2020/wordml/sdtdatahash" xmlns:w16sdtfl="http://schemas.microsoft.com/office/word/2024/wordml/sdtformatlock" xmlns:w16se="http://schemas.microsoft.com/office/word/2015/wordml/symex" xmlns:wpg="http://schemas.microsoft.com/office/word/2010/wordprocessingGroup" xmlns:wpi="http://schemas.microsoft.com/office/word/2010/wordprocessingInk" xmlns:wne="http://schemas.microsoft.com/office/word/2006/wordml" xmlns:wps="http://schemas.microsoft.com/office/word/2010/wordprocessingShape" mc:Ignorable="w14 w15 w16se w16cid w16 w16cex w16sdtdh w16sdtfl w16du wp14">
   <w:abstractNum w:abstractNumId="0" w15:restartNumberingAfterBreak="0">
+    <w:nsid w:val="028E31F8"/>
+    <w:multiLevelType w:val="hybridMultilevel"/>
+    <w:tmpl w:val="B8E25894"/>
+    <w:lvl w:ilvl="0" w:tplc="FFFFFFFF">
+      <w:start w:val="1"/>
+      <w:numFmt w:val="decimal"/>
+      <w:lvlText w:val="%1."/>
+      <w:lvlJc w:val="left"/>
+      <w:pPr>
+        <w:ind w:left="778" w:hanging="360"/>
+      </w:pPr>
+      <w:rPr>
+        <w:rFonts w:hint="default"/>
+      </w:rPr>
+    </w:lvl>
+    <w:lvl w:ilvl="1" w:tplc="FFFFFFFF" w:tentative="1">
+      <w:start w:val="1"/>
+      <w:numFmt w:val="bullet"/>
+      <w:lvlText w:val="o"/>
+      <w:lvlJc w:val="left"/>
+      <w:pPr>
+        <w:ind w:left="1498" w:hanging="360"/>
+      </w:pPr>
+      <w:rPr>
+        <w:rFonts w:ascii="Courier New" w:hAnsi="Courier New" w:cs="Courier New" w:hint="default"/>
+      </w:rPr>
+    </w:lvl>
+    <w:lvl w:ilvl="2" w:tplc="FFFFFFFF" w:tentative="1">
+      <w:start w:val="1"/>
+      <w:numFmt w:val="bullet"/>
+      <w:lvlText w:val=""/>
+      <w:lvlJc w:val="left"/>
+      <w:pPr>
+        <w:ind w:left="2218" w:hanging="360"/>
+      </w:pPr>
+      <w:rPr>
+        <w:rFonts w:ascii="Wingdings" w:hAnsi="Wingdings" w:hint="default"/>
+      </w:rPr>
+    </w:lvl>
+    <w:lvl w:ilvl="3" w:tplc="FFFFFFFF" w:tentative="1">
+      <w:start w:val="1"/>
+      <w:numFmt w:val="bullet"/>
+      <w:lvlText w:val=""/>
+      <w:lvlJc w:val="left"/>
+      <w:pPr>
+        <w:ind w:left="2938" w:hanging="360"/>
+      </w:pPr>
+      <w:rPr>
+        <w:rFonts w:ascii="Symbol" w:hAnsi="Symbol" w:hint="default"/>
+      </w:rPr>
+    </w:lvl>
+    <w:lvl w:ilvl="4" w:tplc="FFFFFFFF" w:tentative="1">
+      <w:start w:val="1"/>
+      <w:numFmt w:val="bullet"/>
+      <w:lvlText w:val="o"/>
+      <w:lvlJc w:val="left"/>
+      <w:pPr>
+        <w:ind w:left="3658" w:hanging="360"/>
+      </w:pPr>
+      <w:rPr>
+        <w:rFonts w:ascii="Courier New" w:hAnsi="Courier New" w:cs="Courier New" w:hint="default"/>
+      </w:rPr>
+    </w:lvl>
+    <w:lvl w:ilvl="5" w:tplc="FFFFFFFF" w:tentative="1">
+      <w:start w:val="1"/>
+      <w:numFmt w:val="bullet"/>
+      <w:lvlText w:val=""/>
+      <w:lvlJc w:val="left"/>
+      <w:pPr>
+        <w:ind w:left="4378" w:hanging="360"/>
+      </w:pPr>
+      <w:rPr>
+        <w:rFonts w:ascii="Wingdings" w:hAnsi="Wingdings" w:hint="default"/>
+      </w:rPr>
+    </w:lvl>
+    <w:lvl w:ilvl="6" w:tplc="FFFFFFFF" w:tentative="1">
+      <w:start w:val="1"/>
+      <w:numFmt w:val="bullet"/>
+      <w:lvlText w:val=""/>
+      <w:lvlJc w:val="left"/>
+      <w:pPr>
+        <w:ind w:left="5098" w:hanging="360"/>
+      </w:pPr>
+      <w:rPr>
+        <w:rFonts w:ascii="Symbol" w:hAnsi="Symbol" w:hint="default"/>
+      </w:rPr>
+    </w:lvl>
+    <w:lvl w:ilvl="7" w:tplc="FFFFFFFF" w:tentative="1">
+      <w:start w:val="1"/>
+      <w:numFmt w:val="bullet"/>
+      <w:lvlText w:val="o"/>
+      <w:lvlJc w:val="left"/>
+      <w:pPr>
+        <w:ind w:left="5818" w:hanging="360"/>
+      </w:pPr>
+      <w:rPr>
+        <w:rFonts w:ascii="Courier New" w:hAnsi="Courier New" w:cs="Courier New" w:hint="default"/>
+      </w:rPr>
+    </w:lvl>
+    <w:lvl w:ilvl="8" w:tplc="FFFFFFFF" w:tentative="1">
+      <w:start w:val="1"/>
+      <w:numFmt w:val="bullet"/>
+      <w:lvlText w:val=""/>
+      <w:lvlJc w:val="left"/>
+      <w:pPr>
+        <w:ind w:left="6538" w:hanging="360"/>
+      </w:pPr>
+      <w:rPr>
+        <w:rFonts w:ascii="Wingdings" w:hAnsi="Wingdings" w:hint="default"/>
+      </w:rPr>
+    </w:lvl>
+  </w:abstractNum>
+  <w:abstractNum w:abstractNumId="1" w15:restartNumberingAfterBreak="0">
     <w:nsid w:val="0DDA1F93"/>
     <w:multiLevelType w:val="hybridMultilevel"/>
     <w:tmpl w:val="038A4812"/>
@@ -6282,7 +6832,120 @@
       </w:rPr>
     </w:lvl>
   </w:abstractNum>
-  <w:abstractNum w:abstractNumId="1" w15:restartNumberingAfterBreak="0">
+  <w:abstractNum w:abstractNumId="2" w15:restartNumberingAfterBreak="0">
+    <w:nsid w:val="1BE44397"/>
+    <w:multiLevelType w:val="hybridMultilevel"/>
+    <w:tmpl w:val="B8E25894"/>
+    <w:lvl w:ilvl="0" w:tplc="FFFFFFFF">
+      <w:start w:val="1"/>
+      <w:numFmt w:val="decimal"/>
+      <w:lvlText w:val="%1."/>
+      <w:lvlJc w:val="left"/>
+      <w:pPr>
+        <w:ind w:left="778" w:hanging="360"/>
+      </w:pPr>
+      <w:rPr>
+        <w:rFonts w:hint="default"/>
+      </w:rPr>
+    </w:lvl>
+    <w:lvl w:ilvl="1" w:tplc="FFFFFFFF" w:tentative="1">
+      <w:start w:val="1"/>
+      <w:numFmt w:val="bullet"/>
+      <w:lvlText w:val="o"/>
+      <w:lvlJc w:val="left"/>
+      <w:pPr>
+        <w:ind w:left="1498" w:hanging="360"/>
+      </w:pPr>
+      <w:rPr>
+        <w:rFonts w:ascii="Courier New" w:hAnsi="Courier New" w:cs="Courier New" w:hint="default"/>
+      </w:rPr>
+    </w:lvl>
+    <w:lvl w:ilvl="2" w:tplc="FFFFFFFF" w:tentative="1">
+      <w:start w:val="1"/>
+      <w:numFmt w:val="bullet"/>
+      <w:lvlText w:val=""/>
+      <w:lvlJc w:val="left"/>
+      <w:pPr>
+        <w:ind w:left="2218" w:hanging="360"/>
+      </w:pPr>
+      <w:rPr>
+        <w:rFonts w:ascii="Wingdings" w:hAnsi="Wingdings" w:hint="default"/>
+      </w:rPr>
+    </w:lvl>
+    <w:lvl w:ilvl="3" w:tplc="FFFFFFFF" w:tentative="1">
+      <w:start w:val="1"/>
+      <w:numFmt w:val="bullet"/>
+      <w:lvlText w:val=""/>
+      <w:lvlJc w:val="left"/>
+      <w:pPr>
+        <w:ind w:left="2938" w:hanging="360"/>
+      </w:pPr>
+      <w:rPr>
+        <w:rFonts w:ascii="Symbol" w:hAnsi="Symbol" w:hint="default"/>
+      </w:rPr>
+    </w:lvl>
+    <w:lvl w:ilvl="4" w:tplc="FFFFFFFF" w:tentative="1">
+      <w:start w:val="1"/>
+      <w:numFmt w:val="bullet"/>
+      <w:lvlText w:val="o"/>
+      <w:lvlJc w:val="left"/>
+      <w:pPr>
+        <w:ind w:left="3658" w:hanging="360"/>
+      </w:pPr>
+      <w:rPr>
+        <w:rFonts w:ascii="Courier New" w:hAnsi="Courier New" w:cs="Courier New" w:hint="default"/>
+      </w:rPr>
+    </w:lvl>
+    <w:lvl w:ilvl="5" w:tplc="FFFFFFFF" w:tentative="1">
+      <w:start w:val="1"/>
+      <w:numFmt w:val="bullet"/>
+      <w:lvlText w:val=""/>
+      <w:lvlJc w:val="left"/>
+      <w:pPr>
+        <w:ind w:left="4378" w:hanging="360"/>
+      </w:pPr>
+      <w:rPr>
+        <w:rFonts w:ascii="Wingdings" w:hAnsi="Wingdings" w:hint="default"/>
+      </w:rPr>
+    </w:lvl>
+    <w:lvl w:ilvl="6" w:tplc="FFFFFFFF" w:tentative="1">
+      <w:start w:val="1"/>
+      <w:numFmt w:val="bullet"/>
+      <w:lvlText w:val=""/>
+      <w:lvlJc w:val="left"/>
+      <w:pPr>
+        <w:ind w:left="5098" w:hanging="360"/>
+      </w:pPr>
+      <w:rPr>
+        <w:rFonts w:ascii="Symbol" w:hAnsi="Symbol" w:hint="default"/>
+      </w:rPr>
+    </w:lvl>
+    <w:lvl w:ilvl="7" w:tplc="FFFFFFFF" w:tentative="1">
+      <w:start w:val="1"/>
+      <w:numFmt w:val="bullet"/>
+      <w:lvlText w:val="o"/>
+      <w:lvlJc w:val="left"/>
+      <w:pPr>
+        <w:ind w:left="5818" w:hanging="360"/>
+      </w:pPr>
+      <w:rPr>
+        <w:rFonts w:ascii="Courier New" w:hAnsi="Courier New" w:cs="Courier New" w:hint="default"/>
+      </w:rPr>
+    </w:lvl>
+    <w:lvl w:ilvl="8" w:tplc="FFFFFFFF" w:tentative="1">
+      <w:start w:val="1"/>
+      <w:numFmt w:val="bullet"/>
+      <w:lvlText w:val=""/>
+      <w:lvlJc w:val="left"/>
+      <w:pPr>
+        <w:ind w:left="6538" w:hanging="360"/>
+      </w:pPr>
+      <w:rPr>
+        <w:rFonts w:ascii="Wingdings" w:hAnsi="Wingdings" w:hint="default"/>
+      </w:rPr>
+    </w:lvl>
+  </w:abstractNum>
+  <w:abstractNum w:abstractNumId="3" w15:restartNumberingAfterBreak="0">
     <w:nsid w:val="1C2F69FE"/>
     <w:multiLevelType w:val="hybridMultilevel"/>
     <w:tmpl w:val="FD10D792"/>
@@ -6394,7 +7057,7 @@
       </w:rPr>
     </w:lvl>
   </w:abstractNum>
-  <w:abstractNum w:abstractNumId="2" w15:restartNumberingAfterBreak="0">
+  <w:abstractNum w:abstractNumId="4" w15:restartNumberingAfterBreak="0">
     <w:nsid w:val="25F60763"/>
     <w:multiLevelType w:val="hybridMultilevel"/>
     <w:tmpl w:val="025AA02A"/>
@@ -6506,7 +7169,93 @@
       </w:rPr>
     </w:lvl>
   </w:abstractNum>
-  <w:abstractNum w:abstractNumId="3" w15:restartNumberingAfterBreak="0">
+  <w:abstractNum w:abstractNumId="5" w15:restartNumberingAfterBreak="0">
+    <w:nsid w:val="2AB51A0F"/>
+    <w:multiLevelType w:val="hybridMultilevel"/>
+    <w:tmpl w:val="9BC8E37E"/>
+    <w:lvl w:ilvl="0" w:tplc="0809000F">
+      <w:start w:val="1"/>
+      <w:numFmt w:val="decimal"/>
+      <w:lvlText w:val="%1."/>
+      <w:lvlJc w:val="left"/>
+      <w:pPr>
+        <w:ind w:left="778" w:hanging="360"/>
+      </w:pPr>
+    </w:lvl>
+    <w:lvl w:ilvl="1" w:tplc="08090019" w:tentative="1">
+      <w:start w:val="1"/>
+      <w:numFmt w:val="lowerLetter"/>
+      <w:lvlText w:val="%2."/>
+      <w:lvlJc w:val="left"/>
+      <w:pPr>
+        <w:ind w:left="1498" w:hanging="360"/>
+      </w:pPr>
+    </w:lvl>
+    <w:lvl w:ilvl="2" w:tplc="0809001B" w:tentative="1">
+      <w:start w:val="1"/>
+      <w:numFmt w:val="lowerRoman"/>
+      <w:lvlText w:val="%3."/>
+      <w:lvlJc w:val="right"/>
+      <w:pPr>
+        <w:ind w:left="2218" w:hanging="180"/>
+      </w:pPr>
+    </w:lvl>
+    <w:lvl w:ilvl="3" w:tplc="0809000F" w:tentative="1">
+      <w:start w:val="1"/>
+      <w:numFmt w:val="decimal"/>
+      <w:lvlText w:val="%4."/>
+      <w:lvlJc w:val="left"/>
+      <w:pPr>
+        <w:ind w:left="2938" w:hanging="360"/>
+      </w:pPr>
+    </w:lvl>
+    <w:lvl w:ilvl="4" w:tplc="08090019" w:tentative="1">
+      <w:start w:val="1"/>
+      <w:numFmt w:val="lowerLetter"/>
+      <w:lvlText w:val="%5."/>
+      <w:lvlJc w:val="left"/>
+      <w:pPr>
+        <w:ind w:left="3658" w:hanging="360"/>
+      </w:pPr>
+    </w:lvl>
+    <w:lvl w:ilvl="5" w:tplc="0809001B" w:tentative="1">
+      <w:start w:val="1"/>
+      <w:numFmt w:val="lowerRoman"/>
+      <w:lvlText w:val="%6."/>
+      <w:lvlJc w:val="right"/>
+      <w:pPr>
+        <w:ind w:left="4378" w:hanging="180"/>
+      </w:pPr>
+    </w:lvl>
+    <w:lvl w:ilvl="6" w:tplc="0809000F" w:tentative="1">
+      <w:start w:val="1"/>
+      <w:numFmt w:val="decimal"/>
+      <w:lvlText w:val="%7."/>
+      <w:lvlJc w:val="left"/>
+      <w:pPr>
+        <w:ind w:left="5098" w:hanging="360"/>
+      </w:pPr>
+    </w:lvl>
+    <w:lvl w:ilvl="7" w:tplc="08090019" w:tentative="1">
+      <w:start w:val="1"/>
+      <w:numFmt w:val="lowerLetter"/>
+      <w:lvlText w:val="%8."/>
+      <w:lvlJc w:val="left"/>
+      <w:pPr>
+        <w:ind w:left="5818" w:hanging="360"/>
+      </w:pPr>
+    </w:lvl>
+    <w:lvl w:ilvl="8" w:tplc="0809001B" w:tentative="1">
+      <w:start w:val="1"/>
+      <w:numFmt w:val="lowerRoman"/>
+      <w:lvlText w:val="%9."/>
+      <w:lvlJc w:val="right"/>
+      <w:pPr>
+        <w:ind w:left="6538" w:hanging="180"/>
+      </w:pPr>
+    </w:lvl>
+  </w:abstractNum>
+  <w:abstractNum w:abstractNumId="6" w15:restartNumberingAfterBreak="0">
     <w:nsid w:val="34F85DF1"/>
     <w:multiLevelType w:val="hybridMultilevel"/>
     <w:tmpl w:val="6DACE55E"/>
@@ -6592,7 +7341,346 @@
       </w:pPr>
     </w:lvl>
   </w:abstractNum>
-  <w:abstractNum w:abstractNumId="4" w15:restartNumberingAfterBreak="0">
+  <w:abstractNum w:abstractNumId="7" w15:restartNumberingAfterBreak="0">
+    <w:nsid w:val="4E1F3226"/>
+    <w:multiLevelType w:val="hybridMultilevel"/>
+    <w:tmpl w:val="B32C39DC"/>
+    <w:lvl w:ilvl="0" w:tplc="FFFFFFFF">
+      <w:start w:val="1"/>
+      <w:numFmt w:val="decimal"/>
+      <w:lvlText w:val="%1."/>
+      <w:lvlJc w:val="left"/>
+      <w:pPr>
+        <w:ind w:left="778" w:hanging="360"/>
+      </w:pPr>
+      <w:rPr>
+        <w:rFonts w:hint="default"/>
+      </w:rPr>
+    </w:lvl>
+    <w:lvl w:ilvl="1" w:tplc="FFFFFFFF" w:tentative="1">
+      <w:start w:val="1"/>
+      <w:numFmt w:val="bullet"/>
+      <w:lvlText w:val="o"/>
+      <w:lvlJc w:val="left"/>
+      <w:pPr>
+        <w:ind w:left="1498" w:hanging="360"/>
+      </w:pPr>
+      <w:rPr>
+        <w:rFonts w:ascii="Courier New" w:hAnsi="Courier New" w:cs="Courier New" w:hint="default"/>
+      </w:rPr>
+    </w:lvl>
+    <w:lvl w:ilvl="2" w:tplc="FFFFFFFF" w:tentative="1">
+      <w:start w:val="1"/>
+      <w:numFmt w:val="bullet"/>
+      <w:lvlText w:val=""/>
+      <w:lvlJc w:val="left"/>
+      <w:pPr>
+        <w:ind w:left="2218" w:hanging="360"/>
+      </w:pPr>
+      <w:rPr>
+        <w:rFonts w:ascii="Wingdings" w:hAnsi="Wingdings" w:hint="default"/>
+      </w:rPr>
+    </w:lvl>
+    <w:lvl w:ilvl="3" w:tplc="FFFFFFFF" w:tentative="1">
+      <w:start w:val="1"/>
+      <w:numFmt w:val="bullet"/>
+      <w:lvlText w:val=""/>
+      <w:lvlJc w:val="left"/>
+      <w:pPr>
+        <w:ind w:left="2938" w:hanging="360"/>
+      </w:pPr>
+      <w:rPr>
+        <w:rFonts w:ascii="Symbol" w:hAnsi="Symbol" w:hint="default"/>
+      </w:rPr>
+    </w:lvl>
+    <w:lvl w:ilvl="4" w:tplc="FFFFFFFF" w:tentative="1">
+      <w:start w:val="1"/>
+      <w:numFmt w:val="bullet"/>
+      <w:lvlText w:val="o"/>
+      <w:lvlJc w:val="left"/>
+      <w:pPr>
+        <w:ind w:left="3658" w:hanging="360"/>
+      </w:pPr>
+      <w:rPr>
+        <w:rFonts w:ascii="Courier New" w:hAnsi="Courier New" w:cs="Courier New" w:hint="default"/>
+      </w:rPr>
+    </w:lvl>
+    <w:lvl w:ilvl="5" w:tplc="FFFFFFFF" w:tentative="1">
+      <w:start w:val="1"/>
+      <w:numFmt w:val="bullet"/>
+      <w:lvlText w:val=""/>
+      <w:lvlJc w:val="left"/>
+      <w:pPr>
+        <w:ind w:left="4378" w:hanging="360"/>
+      </w:pPr>
+      <w:rPr>
+        <w:rFonts w:ascii="Wingdings" w:hAnsi="Wingdings" w:hint="default"/>
+      </w:rPr>
+    </w:lvl>
+    <w:lvl w:ilvl="6" w:tplc="FFFFFFFF" w:tentative="1">
+      <w:start w:val="1"/>
+      <w:numFmt w:val="bullet"/>
+      <w:lvlText w:val=""/>
+      <w:lvlJc w:val="left"/>
+      <w:pPr>
+        <w:ind w:left="5098" w:hanging="360"/>
+      </w:pPr>
+      <w:rPr>
+        <w:rFonts w:ascii="Symbol" w:hAnsi="Symbol" w:hint="default"/>
+      </w:rPr>
+    </w:lvl>
+    <w:lvl w:ilvl="7" w:tplc="FFFFFFFF" w:tentative="1">
+      <w:start w:val="1"/>
+      <w:numFmt w:val="bullet"/>
+      <w:lvlText w:val="o"/>
+      <w:lvlJc w:val="left"/>
+      <w:pPr>
+        <w:ind w:left="5818" w:hanging="360"/>
+      </w:pPr>
+      <w:rPr>
+        <w:rFonts w:ascii="Courier New" w:hAnsi="Courier New" w:cs="Courier New" w:hint="default"/>
+      </w:rPr>
+    </w:lvl>
+    <w:lvl w:ilvl="8" w:tplc="FFFFFFFF" w:tentative="1">
+      <w:start w:val="1"/>
+      <w:numFmt w:val="bullet"/>
+      <w:lvlText w:val=""/>
+      <w:lvlJc w:val="left"/>
+      <w:pPr>
+        <w:ind w:left="6538" w:hanging="360"/>
+      </w:pPr>
+      <w:rPr>
+        <w:rFonts w:ascii="Wingdings" w:hAnsi="Wingdings" w:hint="default"/>
+      </w:rPr>
+    </w:lvl>
+  </w:abstractNum>
+  <w:abstractNum w:abstractNumId="8" w15:restartNumberingAfterBreak="0">
+    <w:nsid w:val="51852F6C"/>
+    <w:multiLevelType w:val="hybridMultilevel"/>
+    <w:tmpl w:val="B8E25894"/>
+    <w:lvl w:ilvl="0" w:tplc="0809000F">
+      <w:start w:val="1"/>
+      <w:numFmt w:val="decimal"/>
+      <w:lvlText w:val="%1."/>
+      <w:lvlJc w:val="left"/>
+      <w:pPr>
+        <w:ind w:left="778" w:hanging="360"/>
+      </w:pPr>
+      <w:rPr>
+        <w:rFonts w:hint="default"/>
+      </w:rPr>
+    </w:lvl>
+    <w:lvl w:ilvl="1" w:tplc="FFFFFFFF" w:tentative="1">
+      <w:start w:val="1"/>
+      <w:numFmt w:val="bullet"/>
+      <w:lvlText w:val="o"/>
+      <w:lvlJc w:val="left"/>
+      <w:pPr>
+        <w:ind w:left="1498" w:hanging="360"/>
+      </w:pPr>
+      <w:rPr>
+        <w:rFonts w:ascii="Courier New" w:hAnsi="Courier New" w:cs="Courier New" w:hint="default"/>
+      </w:rPr>
+    </w:lvl>
+    <w:lvl w:ilvl="2" w:tplc="FFFFFFFF" w:tentative="1">
+      <w:start w:val="1"/>
+      <w:numFmt w:val="bullet"/>
+      <w:lvlText w:val=""/>
+      <w:lvlJc w:val="left"/>
+      <w:pPr>
+        <w:ind w:left="2218" w:hanging="360"/>
+      </w:pPr>
+      <w:rPr>
+        <w:rFonts w:ascii="Wingdings" w:hAnsi="Wingdings" w:hint="default"/>
+      </w:rPr>
+    </w:lvl>
+    <w:lvl w:ilvl="3" w:tplc="FFFFFFFF" w:tentative="1">
+      <w:start w:val="1"/>
+      <w:numFmt w:val="bullet"/>
+      <w:lvlText w:val=""/>
+      <w:lvlJc w:val="left"/>
+      <w:pPr>
+        <w:ind w:left="2938" w:hanging="360"/>
+      </w:pPr>
+      <w:rPr>
+        <w:rFonts w:ascii="Symbol" w:hAnsi="Symbol" w:hint="default"/>
+      </w:rPr>
+    </w:lvl>
+    <w:lvl w:ilvl="4" w:tplc="FFFFFFFF" w:tentative="1">
+      <w:start w:val="1"/>
+      <w:numFmt w:val="bullet"/>
+      <w:lvlText w:val="o"/>
+      <w:lvlJc w:val="left"/>
+      <w:pPr>
+        <w:ind w:left="3658" w:hanging="360"/>
+      </w:pPr>
+      <w:rPr>
+        <w:rFonts w:ascii="Courier New" w:hAnsi="Courier New" w:cs="Courier New" w:hint="default"/>
+      </w:rPr>
+    </w:lvl>
+    <w:lvl w:ilvl="5" w:tplc="FFFFFFFF" w:tentative="1">
+      <w:start w:val="1"/>
+      <w:numFmt w:val="bullet"/>
+      <w:lvlText w:val=""/>
+      <w:lvlJc w:val="left"/>
+      <w:pPr>
+        <w:ind w:left="4378" w:hanging="360"/>
+      </w:pPr>
+      <w:rPr>
+        <w:rFonts w:ascii="Wingdings" w:hAnsi="Wingdings" w:hint="default"/>
+      </w:rPr>
+    </w:lvl>
+    <w:lvl w:ilvl="6" w:tplc="FFFFFFFF" w:tentative="1">
+      <w:start w:val="1"/>
+      <w:numFmt w:val="bullet"/>
+      <w:lvlText w:val=""/>
+      <w:lvlJc w:val="left"/>
+      <w:pPr>
+        <w:ind w:left="5098" w:hanging="360"/>
+      </w:pPr>
+      <w:rPr>
+        <w:rFonts w:ascii="Symbol" w:hAnsi="Symbol" w:hint="default"/>
+      </w:rPr>
+    </w:lvl>
+    <w:lvl w:ilvl="7" w:tplc="FFFFFFFF" w:tentative="1">
+      <w:start w:val="1"/>
+      <w:numFmt w:val="bullet"/>
+      <w:lvlText w:val="o"/>
+      <w:lvlJc w:val="left"/>
+      <w:pPr>
+        <w:ind w:left="5818" w:hanging="360"/>
+      </w:pPr>
+      <w:rPr>
+        <w:rFonts w:ascii="Courier New" w:hAnsi="Courier New" w:cs="Courier New" w:hint="default"/>
+      </w:rPr>
+    </w:lvl>
+    <w:lvl w:ilvl="8" w:tplc="FFFFFFFF" w:tentative="1">
+      <w:start w:val="1"/>
+      <w:numFmt w:val="bullet"/>
+      <w:lvlText w:val=""/>
+      <w:lvlJc w:val="left"/>
+      <w:pPr>
+        <w:ind w:left="6538" w:hanging="360"/>
+      </w:pPr>
+      <w:rPr>
+        <w:rFonts w:ascii="Wingdings" w:hAnsi="Wingdings" w:hint="default"/>
+      </w:rPr>
+    </w:lvl>
+  </w:abstractNum>
+  <w:abstractNum w:abstractNumId="9" w15:restartNumberingAfterBreak="0">
+    <w:nsid w:val="57EA6864"/>
+    <w:multiLevelType w:val="hybridMultilevel"/>
+    <w:tmpl w:val="2DDE0918"/>
+    <w:lvl w:ilvl="0" w:tplc="08090001">
+      <w:start w:val="1"/>
+      <w:numFmt w:val="bullet"/>
+      <w:lvlText w:val=""/>
+      <w:lvlJc w:val="left"/>
+      <w:pPr>
+        <w:ind w:left="778" w:hanging="360"/>
+      </w:pPr>
+      <w:rPr>
+        <w:rFonts w:ascii="Symbol" w:hAnsi="Symbol" w:hint="default"/>
+      </w:rPr>
+    </w:lvl>
+    <w:lvl w:ilvl="1" w:tplc="08090003" w:tentative="1">
+      <w:start w:val="1"/>
+      <w:numFmt w:val="bullet"/>
+      <w:lvlText w:val="o"/>
+      <w:lvlJc w:val="left"/>
+      <w:pPr>
+        <w:ind w:left="1498" w:hanging="360"/>
+      </w:pPr>
+      <w:rPr>
+        <w:rFonts w:ascii="Courier New" w:hAnsi="Courier New" w:cs="Courier New" w:hint="default"/>
+      </w:rPr>
+    </w:lvl>
+    <w:lvl w:ilvl="2" w:tplc="08090005" w:tentative="1">
+      <w:start w:val="1"/>
+      <w:numFmt w:val="bullet"/>
+      <w:lvlText w:val=""/>
+      <w:lvlJc w:val="left"/>
+      <w:pPr>
+        <w:ind w:left="2218" w:hanging="360"/>
+      </w:pPr>
+      <w:rPr>
+        <w:rFonts w:ascii="Wingdings" w:hAnsi="Wingdings" w:hint="default"/>
+      </w:rPr>
+    </w:lvl>
+    <w:lvl w:ilvl="3" w:tplc="08090001" w:tentative="1">
+      <w:start w:val="1"/>
+      <w:numFmt w:val="bullet"/>
+      <w:lvlText w:val=""/>
+      <w:lvlJc w:val="left"/>
+      <w:pPr>
+        <w:ind w:left="2938" w:hanging="360"/>
+      </w:pPr>
+      <w:rPr>
+        <w:rFonts w:ascii="Symbol" w:hAnsi="Symbol" w:hint="default"/>
+      </w:rPr>
+    </w:lvl>
+    <w:lvl w:ilvl="4" w:tplc="08090003" w:tentative="1">
+      <w:start w:val="1"/>
+      <w:numFmt w:val="bullet"/>
+      <w:lvlText w:val="o"/>
+      <w:lvlJc w:val="left"/>
+      <w:pPr>
+        <w:ind w:left="3658" w:hanging="360"/>
+      </w:pPr>
+      <w:rPr>
+        <w:rFonts w:ascii="Courier New" w:hAnsi="Courier New" w:cs="Courier New" w:hint="default"/>
+      </w:rPr>
+    </w:lvl>
+    <w:lvl w:ilvl="5" w:tplc="08090005" w:tentative="1">
+      <w:start w:val="1"/>
+      <w:numFmt w:val="bullet"/>
+      <w:lvlText w:val=""/>
+      <w:lvlJc w:val="left"/>
+      <w:pPr>
+        <w:ind w:left="4378" w:hanging="360"/>
+      </w:pPr>
+      <w:rPr>
+        <w:rFonts w:ascii="Wingdings" w:hAnsi="Wingdings" w:hint="default"/>
+      </w:rPr>
+    </w:lvl>
+    <w:lvl w:ilvl="6" w:tplc="08090001" w:tentative="1">
+      <w:start w:val="1"/>
+      <w:numFmt w:val="bullet"/>
+      <w:lvlText w:val=""/>
+      <w:lvlJc w:val="left"/>
+      <w:pPr>
+        <w:ind w:left="5098" w:hanging="360"/>
+      </w:pPr>
+      <w:rPr>
+        <w:rFonts w:ascii="Symbol" w:hAnsi="Symbol" w:hint="default"/>
+      </w:rPr>
+    </w:lvl>
+    <w:lvl w:ilvl="7" w:tplc="08090003" w:tentative="1">
+      <w:start w:val="1"/>
+      <w:numFmt w:val="bullet"/>
+      <w:lvlText w:val="o"/>
+      <w:lvlJc w:val="left"/>
+      <w:pPr>
+        <w:ind w:left="5818" w:hanging="360"/>
+      </w:pPr>
+      <w:rPr>
+        <w:rFonts w:ascii="Courier New" w:hAnsi="Courier New" w:cs="Courier New" w:hint="default"/>
+      </w:rPr>
+    </w:lvl>
+    <w:lvl w:ilvl="8" w:tplc="08090005" w:tentative="1">
+      <w:start w:val="1"/>
+      <w:numFmt w:val="bullet"/>
+      <w:lvlText w:val=""/>
+      <w:lvlJc w:val="left"/>
+      <w:pPr>
+        <w:ind w:left="6538" w:hanging="360"/>
+      </w:pPr>
+      <w:rPr>
+        <w:rFonts w:ascii="Wingdings" w:hAnsi="Wingdings" w:hint="default"/>
+      </w:rPr>
+    </w:lvl>
+  </w:abstractNum>
+  <w:abstractNum w:abstractNumId="10" w15:restartNumberingAfterBreak="0">
     <w:nsid w:val="589100E7"/>
     <w:multiLevelType w:val="hybridMultilevel"/>
     <w:tmpl w:val="AE48755C"/>
@@ -6681,23 +7769,157 @@
       </w:pPr>
     </w:lvl>
   </w:abstractNum>
+  <w:abstractNum w:abstractNumId="11" w15:restartNumberingAfterBreak="0">
+    <w:nsid w:val="5DC05C83"/>
+    <w:multiLevelType w:val="hybridMultilevel"/>
+    <w:tmpl w:val="C6707418"/>
+    <w:lvl w:ilvl="0" w:tplc="FFFFFFFF">
+      <w:start w:val="1"/>
+      <w:numFmt w:val="decimal"/>
+      <w:lvlText w:val="%1."/>
+      <w:lvlJc w:val="left"/>
+      <w:pPr>
+        <w:ind w:left="778" w:hanging="360"/>
+      </w:pPr>
+      <w:rPr>
+        <w:rFonts w:hint="default"/>
+      </w:rPr>
+    </w:lvl>
+    <w:lvl w:ilvl="1" w:tplc="FFFFFFFF" w:tentative="1">
+      <w:start w:val="1"/>
+      <w:numFmt w:val="bullet"/>
+      <w:lvlText w:val="o"/>
+      <w:lvlJc w:val="left"/>
+      <w:pPr>
+        <w:ind w:left="1498" w:hanging="360"/>
+      </w:pPr>
+      <w:rPr>
+        <w:rFonts w:ascii="Courier New" w:hAnsi="Courier New" w:cs="Courier New" w:hint="default"/>
+      </w:rPr>
+    </w:lvl>
+    <w:lvl w:ilvl="2" w:tplc="FFFFFFFF" w:tentative="1">
+      <w:start w:val="1"/>
+      <w:numFmt w:val="bullet"/>
+      <w:lvlText w:val=""/>
+      <w:lvlJc w:val="left"/>
+      <w:pPr>
+        <w:ind w:left="2218" w:hanging="360"/>
+      </w:pPr>
+      <w:rPr>
+        <w:rFonts w:ascii="Wingdings" w:hAnsi="Wingdings" w:hint="default"/>
+      </w:rPr>
+    </w:lvl>
+    <w:lvl w:ilvl="3" w:tplc="FFFFFFFF" w:tentative="1">
+      <w:start w:val="1"/>
+      <w:numFmt w:val="bullet"/>
+      <w:lvlText w:val=""/>
+      <w:lvlJc w:val="left"/>
+      <w:pPr>
+        <w:ind w:left="2938" w:hanging="360"/>
+      </w:pPr>
+      <w:rPr>
+        <w:rFonts w:ascii="Symbol" w:hAnsi="Symbol" w:hint="default"/>
+      </w:rPr>
+    </w:lvl>
+    <w:lvl w:ilvl="4" w:tplc="FFFFFFFF" w:tentative="1">
+      <w:start w:val="1"/>
+      <w:numFmt w:val="bullet"/>
+      <w:lvlText w:val="o"/>
+      <w:lvlJc w:val="left"/>
+      <w:pPr>
+        <w:ind w:left="3658" w:hanging="360"/>
+      </w:pPr>
+      <w:rPr>
+        <w:rFonts w:ascii="Courier New" w:hAnsi="Courier New" w:cs="Courier New" w:hint="default"/>
+      </w:rPr>
+    </w:lvl>
+    <w:lvl w:ilvl="5" w:tplc="FFFFFFFF" w:tentative="1">
+      <w:start w:val="1"/>
+      <w:numFmt w:val="bullet"/>
+      <w:lvlText w:val=""/>
+      <w:lvlJc w:val="left"/>
+      <w:pPr>
+        <w:ind w:left="4378" w:hanging="360"/>
+      </w:pPr>
+      <w:rPr>
+        <w:rFonts w:ascii="Wingdings" w:hAnsi="Wingdings" w:hint="default"/>
+      </w:rPr>
+    </w:lvl>
+    <w:lvl w:ilvl="6" w:tplc="FFFFFFFF" w:tentative="1">
+      <w:start w:val="1"/>
+      <w:numFmt w:val="bullet"/>
+      <w:lvlText w:val=""/>
+      <w:lvlJc w:val="left"/>
+      <w:pPr>
+        <w:ind w:left="5098" w:hanging="360"/>
+      </w:pPr>
+      <w:rPr>
+        <w:rFonts w:ascii="Symbol" w:hAnsi="Symbol" w:hint="default"/>
+      </w:rPr>
+    </w:lvl>
+    <w:lvl w:ilvl="7" w:tplc="FFFFFFFF" w:tentative="1">
+      <w:start w:val="1"/>
+      <w:numFmt w:val="bullet"/>
+      <w:lvlText w:val="o"/>
+      <w:lvlJc w:val="left"/>
+      <w:pPr>
+        <w:ind w:left="5818" w:hanging="360"/>
+      </w:pPr>
+      <w:rPr>
+        <w:rFonts w:ascii="Courier New" w:hAnsi="Courier New" w:cs="Courier New" w:hint="default"/>
+      </w:rPr>
+    </w:lvl>
+    <w:lvl w:ilvl="8" w:tplc="FFFFFFFF" w:tentative="1">
+      <w:start w:val="1"/>
+      <w:numFmt w:val="bullet"/>
+      <w:lvlText w:val=""/>
+      <w:lvlJc w:val="left"/>
+      <w:pPr>
+        <w:ind w:left="6538" w:hanging="360"/>
+      </w:pPr>
+      <w:rPr>
+        <w:rFonts w:ascii="Wingdings" w:hAnsi="Wingdings" w:hint="default"/>
+      </w:rPr>
+    </w:lvl>
+  </w:abstractNum>
   <w:num w:numId="1" w16cid:durableId="1294671567">
-    <w:abstractNumId w:val="2"/>
+    <w:abstractNumId w:val="4"/>
   </w:num>
   <w:num w:numId="2" w16cid:durableId="1388527350">
+    <w:abstractNumId w:val="3"/>
+  </w:num>
+  <w:num w:numId="3" w16cid:durableId="1400325688">
     <w:abstractNumId w:val="1"/>
   </w:num>
-  <w:num w:numId="3" w16cid:durableId="1400325688">
-    <w:abstractNumId w:val="0"/>
-  </w:num>
   <w:num w:numId="4" w16cid:durableId="1587029756">
-    <w:abstractNumId w:val="4"/>
+    <w:abstractNumId w:val="10"/>
   </w:num>
   <w:num w:numId="5" w16cid:durableId="1895044576">
-    <w:abstractNumId w:val="3"/>
+    <w:abstractNumId w:val="6"/>
     <w:lvlOverride w:ilvl="0">
       <w:startOverride w:val="1"/>
     </w:lvlOverride>
+  </w:num>
+  <w:num w:numId="6" w16cid:durableId="945699028">
+    <w:abstractNumId w:val="9"/>
+  </w:num>
+  <w:num w:numId="7" w16cid:durableId="2089231128">
+    <w:abstractNumId w:val="8"/>
+  </w:num>
+  <w:num w:numId="8" w16cid:durableId="1598639917">
+    <w:abstractNumId w:val="5"/>
+  </w:num>
+  <w:num w:numId="9" w16cid:durableId="842817522">
+    <w:abstractNumId w:val="0"/>
+  </w:num>
+  <w:num w:numId="10" w16cid:durableId="953828051">
+    <w:abstractNumId w:val="2"/>
+  </w:num>
+  <w:num w:numId="11" w16cid:durableId="400906209">
+    <w:abstractNumId w:val="7"/>
+  </w:num>
+  <w:num w:numId="12" w16cid:durableId="1488978462">
+    <w:abstractNumId w:val="11"/>
   </w:num>
 </w:numbering>
 </file>

</xml_diff>

<commit_message>
Finished testing  - testing (besides cost)
</commit_message>
<xml_diff>
--- a/resources/Test_Framework_Description.docx
+++ b/resources/Test_Framework_Description.docx
@@ -247,7 +247,10 @@
               <w:t xml:space="preserve"> re engagement</w:t>
             </w:r>
             <w:r>
-              <w:t xml:space="preserve"> and ART inititations</w:t>
+              <w:t xml:space="preserve"> and ART </w:t>
+            </w:r>
+            <w:r>
+              <w:t>initiations</w:t>
             </w:r>
           </w:p>
         </w:tc>
@@ -260,13 +263,7 @@
               <w:spacing w:after="120"/>
             </w:pPr>
             <w:r>
-              <w:t>Base_yield=</w:t>
-            </w:r>
-            <w:r>
-              <w:t>0.9*</w:t>
-            </w:r>
-            <w:r>
-              <w:t>(undiagnosed+ltfu)</w:t>
+              <w:t>Base_yield=(undiagnosed+ltfu)</w:t>
             </w:r>
             <w:r>
               <w:t>/sexually_active</w:t>
@@ -5378,7 +5375,6 @@
               <w:spacing w:after="160"/>
             </w:pPr>
             <w:r>
-              <w:lastRenderedPageBreak/>
               <w:t>2.</w:t>
             </w:r>
           </w:p>
@@ -6414,7 +6410,618 @@
           <w:color w:val="2E74B5"/>
         </w:rPr>
       </w:pPr>
+      <w:r>
+        <w:rPr>
+          <w:i/>
+          <w:iCs/>
+          <w:color w:val="2E74B5"/>
+        </w:rPr>
+        <w:t>Limits on mass testing</w:t>
+      </w:r>
     </w:p>
+    <w:p>
+      <w:r>
+        <w:t xml:space="preserve">Regardless of number of tests performed, </w:t>
+      </w:r>
+      <w:r>
+        <w:t xml:space="preserve">there </w:t>
+      </w:r>
+      <w:r>
+        <w:t xml:space="preserve">need to be limits on the number of people that can be identified. </w:t>
+      </w:r>
+      <w:r>
+        <w:t>We c</w:t>
+      </w:r>
+      <w:r>
+        <w:t xml:space="preserve">annot </w:t>
+      </w:r>
+      <w:r>
+        <w:t>diagnose more that</w:t>
+      </w:r>
+      <w:r>
+        <w:t xml:space="preserve"> the number of undiagnosed </w:t>
+      </w:r>
+      <w:r>
+        <w:t>PLHIV</w:t>
+      </w:r>
+      <w:r>
+        <w:t xml:space="preserve"> (for new diagnoses) nor the number of people currently LTFU</w:t>
+      </w:r>
+      <w:r>
+        <w:t xml:space="preserve"> (for re-engagement)</w:t>
+      </w:r>
+      <w:r>
+        <w:t xml:space="preserve">. </w:t>
+      </w:r>
+      <w:r>
+        <w:t>Also include limits that these numbers cannot exceed more than 95% of each population (realistically, we are unlikely to find every single person).</w:t>
+      </w:r>
+      <w:r>
+        <w:t xml:space="preserve"> Set 1,000,000 tests. </w:t>
+      </w:r>
+    </w:p>
+    <w:p/>
+    <w:tbl>
+      <w:tblPr>
+        <w:tblStyle w:val="TableGrid"/>
+        <w:tblW w:w="0" w:type="auto"/>
+        <w:tblLook w:val="04A0" w:firstRow="1" w:lastRow="0" w:firstColumn="1" w:lastColumn="0" w:noHBand="0" w:noVBand="1"/>
+      </w:tblPr>
+      <w:tblGrid>
+        <w:gridCol w:w="549"/>
+        <w:gridCol w:w="2140"/>
+        <w:gridCol w:w="6462"/>
+      </w:tblGrid>
+      <w:tr>
+        <w:trPr>
+          <w:trHeight w:val="457"/>
+        </w:trPr>
+        <w:tc>
+          <w:tcPr>
+            <w:tcW w:w="549" w:type="dxa"/>
+          </w:tcPr>
+          <w:p>
+            <w:pPr>
+              <w:spacing w:after="160"/>
+              <w:rPr>
+                <w:b/>
+                <w:bCs/>
+              </w:rPr>
+            </w:pPr>
+            <w:r>
+              <w:rPr>
+                <w:b/>
+                <w:bCs/>
+              </w:rPr>
+              <w:t>#</w:t>
+            </w:r>
+          </w:p>
+        </w:tc>
+        <w:tc>
+          <w:tcPr>
+            <w:tcW w:w="2140" w:type="dxa"/>
+          </w:tcPr>
+          <w:p>
+            <w:pPr>
+              <w:spacing w:after="160"/>
+              <w:rPr>
+                <w:b/>
+                <w:bCs/>
+              </w:rPr>
+            </w:pPr>
+            <w:r>
+              <w:rPr>
+                <w:b/>
+                <w:bCs/>
+              </w:rPr>
+              <w:t>Description</w:t>
+            </w:r>
+          </w:p>
+        </w:tc>
+        <w:tc>
+          <w:tcPr>
+            <w:tcW w:w="6462" w:type="dxa"/>
+          </w:tcPr>
+          <w:p>
+            <w:pPr>
+              <w:spacing w:after="160"/>
+              <w:rPr>
+                <w:b/>
+                <w:bCs/>
+              </w:rPr>
+            </w:pPr>
+            <w:r>
+              <w:rPr>
+                <w:b/>
+                <w:bCs/>
+              </w:rPr>
+              <w:t>Test Calculation/expectation</w:t>
+            </w:r>
+          </w:p>
+        </w:tc>
+      </w:tr>
+      <w:tr>
+        <w:trPr>
+          <w:trHeight w:val="457"/>
+        </w:trPr>
+        <w:tc>
+          <w:tcPr>
+            <w:tcW w:w="549" w:type="dxa"/>
+          </w:tcPr>
+          <w:p>
+            <w:pPr>
+              <w:spacing w:after="160"/>
+            </w:pPr>
+            <w:r>
+              <w:t>1.</w:t>
+            </w:r>
+          </w:p>
+        </w:tc>
+        <w:tc>
+          <w:tcPr>
+            <w:tcW w:w="2140" w:type="dxa"/>
+          </w:tcPr>
+          <w:p>
+            <w:pPr>
+              <w:spacing w:after="160"/>
+            </w:pPr>
+            <w:r>
+              <w:t>Re-engagment</w:t>
+            </w:r>
+          </w:p>
+        </w:tc>
+        <w:tc>
+          <w:tcPr>
+            <w:tcW w:w="6462" w:type="dxa"/>
+          </w:tcPr>
+          <w:p>
+            <w:pPr>
+              <w:spacing w:after="160"/>
+            </w:pPr>
+            <w:r>
+              <w:t>Re-engagement</w:t>
+            </w:r>
+            <w:r>
+              <w:t xml:space="preserve"> &lt;=0.95*</w:t>
+            </w:r>
+            <w:r>
+              <w:t>LTFU</w:t>
+            </w:r>
+          </w:p>
+        </w:tc>
+      </w:tr>
+      <w:tr>
+        <w:trPr>
+          <w:trHeight w:val="457"/>
+        </w:trPr>
+        <w:tc>
+          <w:tcPr>
+            <w:tcW w:w="549" w:type="dxa"/>
+          </w:tcPr>
+          <w:p>
+            <w:pPr>
+              <w:spacing w:after="160"/>
+            </w:pPr>
+            <w:r>
+              <w:t>2.</w:t>
+            </w:r>
+          </w:p>
+        </w:tc>
+        <w:tc>
+          <w:tcPr>
+            <w:tcW w:w="2140" w:type="dxa"/>
+          </w:tcPr>
+          <w:p>
+            <w:pPr>
+              <w:spacing w:after="160"/>
+            </w:pPr>
+            <w:r>
+              <w:t>New diagnoses</w:t>
+            </w:r>
+          </w:p>
+        </w:tc>
+        <w:tc>
+          <w:tcPr>
+            <w:tcW w:w="6462" w:type="dxa"/>
+          </w:tcPr>
+          <w:p>
+            <w:pPr>
+              <w:spacing w:after="160"/>
+            </w:pPr>
+            <w:r>
+              <w:t>New dx &lt;=0.95*undiagnosed</w:t>
+            </w:r>
+          </w:p>
+        </w:tc>
+      </w:tr>
+      <w:tr>
+        <w:trPr>
+          <w:trHeight w:val="457"/>
+        </w:trPr>
+        <w:tc>
+          <w:tcPr>
+            <w:tcW w:w="549" w:type="dxa"/>
+          </w:tcPr>
+          <w:p>
+            <w:pPr>
+              <w:spacing w:after="160"/>
+            </w:pPr>
+            <w:r>
+              <w:t>3</w:t>
+            </w:r>
+          </w:p>
+        </w:tc>
+        <w:tc>
+          <w:tcPr>
+            <w:tcW w:w="2140" w:type="dxa"/>
+          </w:tcPr>
+          <w:p>
+            <w:pPr>
+              <w:spacing w:after="160"/>
+            </w:pPr>
+            <w:r>
+              <w:t>Positive tests</w:t>
+            </w:r>
+          </w:p>
+        </w:tc>
+        <w:tc>
+          <w:tcPr>
+            <w:tcW w:w="6462" w:type="dxa"/>
+          </w:tcPr>
+          <w:p>
+            <w:pPr>
+              <w:spacing w:after="160"/>
+            </w:pPr>
+            <w:r>
+              <w:t>Positive tests = adapted_new_dx + adapted_re_enaggement</w:t>
+            </w:r>
+          </w:p>
+        </w:tc>
+      </w:tr>
+      <w:tr>
+        <w:trPr>
+          <w:trHeight w:val="457"/>
+        </w:trPr>
+        <w:tc>
+          <w:tcPr>
+            <w:tcW w:w="549" w:type="dxa"/>
+          </w:tcPr>
+          <w:p>
+            <w:pPr>
+              <w:spacing w:after="160"/>
+            </w:pPr>
+            <w:r>
+              <w:t>4.</w:t>
+            </w:r>
+          </w:p>
+        </w:tc>
+        <w:tc>
+          <w:tcPr>
+            <w:tcW w:w="2140" w:type="dxa"/>
+          </w:tcPr>
+          <w:p>
+            <w:pPr>
+              <w:spacing w:after="160"/>
+            </w:pPr>
+            <w:r>
+              <w:t>ART Initiations</w:t>
+            </w:r>
+          </w:p>
+        </w:tc>
+        <w:tc>
+          <w:tcPr>
+            <w:tcW w:w="6462" w:type="dxa"/>
+          </w:tcPr>
+          <w:p>
+            <w:pPr>
+              <w:spacing w:after="160"/>
+            </w:pPr>
+            <w:r>
+              <w:t xml:space="preserve">Reinitiations &lt;= </w:t>
+            </w:r>
+            <w:r>
+              <w:t>adapted_positive</w:t>
+            </w:r>
+            <w:r>
+              <w:t xml:space="preserve"> * </w:t>
+            </w:r>
+            <w:r>
+              <w:rPr>
+                <w:highlight w:val="yellow"/>
+              </w:rPr>
+              <w:t>average_linkage</w:t>
+            </w:r>
+          </w:p>
+        </w:tc>
+      </w:tr>
+      <w:tr>
+        <w:trPr>
+          <w:trHeight w:val="457"/>
+        </w:trPr>
+        <w:tc>
+          <w:tcPr>
+            <w:tcW w:w="549" w:type="dxa"/>
+          </w:tcPr>
+          <w:p>
+            <w:pPr>
+              <w:spacing w:after="160"/>
+            </w:pPr>
+            <w:r>
+              <w:t>5</w:t>
+            </w:r>
+          </w:p>
+        </w:tc>
+        <w:tc>
+          <w:tcPr>
+            <w:tcW w:w="2140" w:type="dxa"/>
+          </w:tcPr>
+          <w:p>
+            <w:pPr>
+              <w:spacing w:after="160"/>
+            </w:pPr>
+            <w:r>
+              <w:t>VS</w:t>
+            </w:r>
+          </w:p>
+        </w:tc>
+        <w:tc>
+          <w:tcPr>
+            <w:tcW w:w="6462" w:type="dxa"/>
+          </w:tcPr>
+          <w:p>
+            <w:pPr>
+              <w:spacing w:after="160"/>
+            </w:pPr>
+            <w:r>
+              <w:t xml:space="preserve">New_VS &lt;= </w:t>
+            </w:r>
+            <w:r>
+              <w:t>Reinitiations</w:t>
+            </w:r>
+            <w:r>
+              <w:t>*base_viral_suppression</w:t>
+            </w:r>
+          </w:p>
+        </w:tc>
+      </w:tr>
+    </w:tbl>
+    <w:p/>
+    <w:p>
+      <w:pPr>
+        <w:rPr>
+          <w:i/>
+          <w:iCs/>
+          <w:color w:val="2E74B5"/>
+        </w:rPr>
+      </w:pPr>
+      <w:r>
+        <w:rPr>
+          <w:i/>
+          <w:iCs/>
+          <w:color w:val="2E74B5"/>
+        </w:rPr>
+        <w:lastRenderedPageBreak/>
+        <w:t>Different linkage rates</w:t>
+      </w:r>
+    </w:p>
+    <w:p>
+      <w:r>
+        <w:t xml:space="preserve">Test that modalities with different linkage rates have differing number of art initiations from the same number of tests. 30,000 general facility (linkage: 0.9), 30,000 HIVST community (linkage 0.8). </w:t>
+      </w:r>
+    </w:p>
+    <w:p/>
+    <w:tbl>
+      <w:tblPr>
+        <w:tblStyle w:val="TableGrid"/>
+        <w:tblW w:w="0" w:type="auto"/>
+        <w:tblLook w:val="04A0" w:firstRow="1" w:lastRow="0" w:firstColumn="1" w:lastColumn="0" w:noHBand="0" w:noVBand="1"/>
+      </w:tblPr>
+      <w:tblGrid>
+        <w:gridCol w:w="549"/>
+        <w:gridCol w:w="2140"/>
+        <w:gridCol w:w="6462"/>
+      </w:tblGrid>
+      <w:tr>
+        <w:trPr>
+          <w:trHeight w:val="457"/>
+        </w:trPr>
+        <w:tc>
+          <w:tcPr>
+            <w:tcW w:w="549" w:type="dxa"/>
+          </w:tcPr>
+          <w:p>
+            <w:pPr>
+              <w:spacing w:after="160"/>
+              <w:rPr>
+                <w:b/>
+                <w:bCs/>
+              </w:rPr>
+            </w:pPr>
+            <w:r>
+              <w:rPr>
+                <w:b/>
+                <w:bCs/>
+              </w:rPr>
+              <w:t>#</w:t>
+            </w:r>
+          </w:p>
+        </w:tc>
+        <w:tc>
+          <w:tcPr>
+            <w:tcW w:w="2140" w:type="dxa"/>
+          </w:tcPr>
+          <w:p>
+            <w:pPr>
+              <w:spacing w:after="160"/>
+              <w:rPr>
+                <w:b/>
+                <w:bCs/>
+              </w:rPr>
+            </w:pPr>
+            <w:r>
+              <w:rPr>
+                <w:b/>
+                <w:bCs/>
+              </w:rPr>
+              <w:t>Description</w:t>
+            </w:r>
+          </w:p>
+        </w:tc>
+        <w:tc>
+          <w:tcPr>
+            <w:tcW w:w="6462" w:type="dxa"/>
+          </w:tcPr>
+          <w:p>
+            <w:pPr>
+              <w:spacing w:after="160"/>
+              <w:rPr>
+                <w:b/>
+                <w:bCs/>
+              </w:rPr>
+            </w:pPr>
+            <w:r>
+              <w:rPr>
+                <w:b/>
+                <w:bCs/>
+              </w:rPr>
+              <w:t>Test Calculation/expectation</w:t>
+            </w:r>
+          </w:p>
+        </w:tc>
+      </w:tr>
+      <w:tr>
+        <w:trPr>
+          <w:trHeight w:val="457"/>
+        </w:trPr>
+        <w:tc>
+          <w:tcPr>
+            <w:tcW w:w="549" w:type="dxa"/>
+          </w:tcPr>
+          <w:p>
+            <w:pPr>
+              <w:spacing w:after="160"/>
+            </w:pPr>
+            <w:r>
+              <w:t>1.</w:t>
+            </w:r>
+          </w:p>
+        </w:tc>
+        <w:tc>
+          <w:tcPr>
+            <w:tcW w:w="2140" w:type="dxa"/>
+          </w:tcPr>
+          <w:p>
+            <w:pPr>
+              <w:spacing w:after="160"/>
+            </w:pPr>
+            <w:r>
+              <w:t>Calculated linkage</w:t>
+            </w:r>
+          </w:p>
+        </w:tc>
+        <w:tc>
+          <w:tcPr>
+            <w:tcW w:w="6462" w:type="dxa"/>
+          </w:tcPr>
+          <w:p>
+            <w:pPr>
+              <w:spacing w:after="160"/>
+            </w:pPr>
+            <w:r>
+              <w:t>Calculated facility linkage</w:t>
+            </w:r>
+            <w:r>
+              <w:t xml:space="preserve"> </w:t>
+            </w:r>
+            <w:r>
+              <w:t xml:space="preserve"> &gt; calculated HIVST linkage</w:t>
+            </w:r>
+          </w:p>
+          <w:p>
+            <w:pPr>
+              <w:spacing w:after="160"/>
+            </w:pPr>
+            <w:r>
+              <w:t>90% and 70% respectively</w:t>
+            </w:r>
+          </w:p>
+        </w:tc>
+      </w:tr>
+      <w:tr>
+        <w:trPr>
+          <w:trHeight w:val="457"/>
+        </w:trPr>
+        <w:tc>
+          <w:tcPr>
+            <w:tcW w:w="549" w:type="dxa"/>
+          </w:tcPr>
+          <w:p>
+            <w:pPr>
+              <w:spacing w:after="160"/>
+            </w:pPr>
+            <w:r>
+              <w:t>2.</w:t>
+            </w:r>
+          </w:p>
+        </w:tc>
+        <w:tc>
+          <w:tcPr>
+            <w:tcW w:w="2140" w:type="dxa"/>
+          </w:tcPr>
+          <w:p>
+            <w:pPr>
+              <w:spacing w:after="160"/>
+            </w:pPr>
+            <w:r>
+              <w:t xml:space="preserve">ART </w:t>
+            </w:r>
+            <w:r>
+              <w:t>initiations</w:t>
+            </w:r>
+          </w:p>
+        </w:tc>
+        <w:tc>
+          <w:tcPr>
+            <w:tcW w:w="6462" w:type="dxa"/>
+          </w:tcPr>
+          <w:p>
+            <w:pPr>
+              <w:spacing w:after="160"/>
+            </w:pPr>
+            <w:r>
+              <w:t>Facility_ART_inititations&gt; HIVST initiations</w:t>
+            </w:r>
+          </w:p>
+          <w:p>
+            <w:pPr>
+              <w:spacing w:after="160"/>
+            </w:pPr>
+          </w:p>
+        </w:tc>
+      </w:tr>
+    </w:tbl>
+    <w:p/>
+    <w:p>
+      <w:pPr>
+        <w:pStyle w:val="Heading4"/>
+      </w:pPr>
+      <w:r>
+        <w:t>ZERO TESTING IN SCENARIO VS BASELINE WITH TESTIN</w:t>
+      </w:r>
+      <w:r>
+        <w:t>G</w:t>
+      </w:r>
+    </w:p>
+    <w:p>
+      <w:r>
+        <w:t xml:space="preserve">Set </w:t>
+      </w:r>
+      <w:r>
+        <w:t xml:space="preserve">baseline to have 40000 facility tests and 20000 community tests and no testing in the scenario. </w:t>
+      </w:r>
+    </w:p>
+    <w:p/>
+    <w:p/>
     <w:sectPr>
       <w:pgSz w:w="12240" w:h="15840"/>
       <w:pgMar w:top="1440" w:right="1440" w:bottom="1440" w:left="1440" w:header="708" w:footer="708" w:gutter="0"/>

</xml_diff>

<commit_message>
Before baseline infection changes
</commit_message>
<xml_diff>
--- a/resources/Test_Framework_Description.docx
+++ b/resources/Test_Framework_Description.docx
@@ -2298,7 +2298,13 @@
         <w:spacing w:after="160"/>
       </w:pPr>
       <w:r>
-        <w:t xml:space="preserve">Uses a standardized population with the following parameters: 1,000,000 total population, 5% HIV prevalence (50,000 PLHIV), 80% diagnosed, 75% on ART, 85% virally suppressed, 5,000 new infections per year, and 1,000 AIDS deaths per year. Different values selected for scenario and baseline preventions. </w:t>
+        <w:t xml:space="preserve">Uses a standardized population with the following parameters: 1,000,000 total population, 5% HIV prevalence (50,000 PLHIV), 80% diagnosed, 75% on ART, 85% virally suppressed, </w:t>
+      </w:r>
+      <w:r>
+        <w:t>2500</w:t>
+      </w:r>
+      <w:r>
+        <w:t xml:space="preserve"> new infections per year, and 1,000 AIDS deaths per year. Different values selected for scenario and baseline preventions. </w:t>
       </w:r>
     </w:p>
     <w:p>
@@ -2332,6 +2338,875 @@
       <w:r>
         <w:t>053)</w:t>
       </w:r>
+    </w:p>
+    <w:p>
+      <w:pPr>
+        <w:pStyle w:val="Heading4"/>
+      </w:pPr>
+      <w:r>
+        <w:lastRenderedPageBreak/>
+        <w:t>Zero prevention – No infections averted</w:t>
+      </w:r>
+    </w:p>
+    <w:p>
+      <w:pPr>
+        <w:pStyle w:val="Heading4"/>
+      </w:pPr>
+    </w:p>
+    <w:tbl>
+      <w:tblPr>
+        <w:tblStyle w:val="TableGrid"/>
+        <w:tblW w:w="0" w:type="auto"/>
+        <w:tblLook w:val="04A0" w:firstRow="1" w:lastRow="0" w:firstColumn="1" w:lastColumn="0" w:noHBand="0" w:noVBand="1"/>
+      </w:tblPr>
+      <w:tblGrid>
+        <w:gridCol w:w="549"/>
+        <w:gridCol w:w="2140"/>
+        <w:gridCol w:w="6462"/>
+      </w:tblGrid>
+      <w:tr>
+        <w:trPr>
+          <w:trHeight w:val="457"/>
+        </w:trPr>
+        <w:tc>
+          <w:tcPr>
+            <w:tcW w:w="549" w:type="dxa"/>
+          </w:tcPr>
+          <w:p>
+            <w:pPr>
+              <w:spacing w:after="160"/>
+              <w:rPr>
+                <w:b/>
+                <w:bCs/>
+              </w:rPr>
+            </w:pPr>
+            <w:r>
+              <w:rPr>
+                <w:b/>
+                <w:bCs/>
+              </w:rPr>
+              <w:t>#</w:t>
+            </w:r>
+          </w:p>
+        </w:tc>
+        <w:tc>
+          <w:tcPr>
+            <w:tcW w:w="2140" w:type="dxa"/>
+          </w:tcPr>
+          <w:p>
+            <w:pPr>
+              <w:spacing w:after="160"/>
+              <w:rPr>
+                <w:b/>
+                <w:bCs/>
+              </w:rPr>
+            </w:pPr>
+            <w:r>
+              <w:rPr>
+                <w:b/>
+                <w:bCs/>
+              </w:rPr>
+              <w:t>Description</w:t>
+            </w:r>
+          </w:p>
+        </w:tc>
+        <w:tc>
+          <w:tcPr>
+            <w:tcW w:w="6462" w:type="dxa"/>
+          </w:tcPr>
+          <w:p>
+            <w:pPr>
+              <w:spacing w:after="160"/>
+              <w:rPr>
+                <w:b/>
+                <w:bCs/>
+              </w:rPr>
+            </w:pPr>
+            <w:r>
+              <w:rPr>
+                <w:b/>
+                <w:bCs/>
+              </w:rPr>
+              <w:t>Test Calculation/expectation</w:t>
+            </w:r>
+          </w:p>
+        </w:tc>
+      </w:tr>
+      <w:tr>
+        <w:trPr>
+          <w:trHeight w:val="457"/>
+        </w:trPr>
+        <w:tc>
+          <w:tcPr>
+            <w:tcW w:w="549" w:type="dxa"/>
+          </w:tcPr>
+          <w:p>
+            <w:pPr>
+              <w:spacing w:after="160"/>
+            </w:pPr>
+            <w:r>
+              <w:t>1.</w:t>
+            </w:r>
+          </w:p>
+        </w:tc>
+        <w:tc>
+          <w:tcPr>
+            <w:tcW w:w="2140" w:type="dxa"/>
+          </w:tcPr>
+          <w:p>
+            <w:pPr>
+              <w:spacing w:after="160"/>
+            </w:pPr>
+            <w:r>
+              <w:t>All prevention to 0 – no adult  infections averted</w:t>
+            </w:r>
+          </w:p>
+        </w:tc>
+        <w:tc>
+          <w:tcPr>
+            <w:tcW w:w="6462" w:type="dxa"/>
+          </w:tcPr>
+          <w:p>
+            <w:pPr>
+              <w:spacing w:after="160"/>
+            </w:pPr>
+            <w:r>
+              <w:t>Adult_i</w:t>
+            </w:r>
+            <w:r>
+              <w:t xml:space="preserve">nfections_averted = </w:t>
+            </w:r>
+            <w:r>
+              <w:t>0</w:t>
+            </w:r>
+          </w:p>
+          <w:p>
+            <w:pPr>
+              <w:spacing w:after="160"/>
+            </w:pPr>
+          </w:p>
+        </w:tc>
+      </w:tr>
+      <w:tr>
+        <w:trPr>
+          <w:trHeight w:val="457"/>
+        </w:trPr>
+        <w:tc>
+          <w:tcPr>
+            <w:tcW w:w="549" w:type="dxa"/>
+          </w:tcPr>
+          <w:p>
+            <w:pPr>
+              <w:spacing w:after="160"/>
+            </w:pPr>
+            <w:r>
+              <w:t>2.</w:t>
+            </w:r>
+          </w:p>
+        </w:tc>
+        <w:tc>
+          <w:tcPr>
+            <w:tcW w:w="2140" w:type="dxa"/>
+          </w:tcPr>
+          <w:p>
+            <w:pPr>
+              <w:spacing w:after="160"/>
+            </w:pPr>
+            <w:r>
+              <w:t xml:space="preserve">All prevention to 0 – no </w:t>
+            </w:r>
+            <w:r>
+              <w:t>infant</w:t>
+            </w:r>
+            <w:r>
+              <w:t xml:space="preserve">  infections averted</w:t>
+            </w:r>
+          </w:p>
+        </w:tc>
+        <w:tc>
+          <w:tcPr>
+            <w:tcW w:w="6462" w:type="dxa"/>
+          </w:tcPr>
+          <w:p>
+            <w:pPr>
+              <w:spacing w:after="160"/>
+            </w:pPr>
+            <w:r>
+              <w:t>Infant</w:t>
+            </w:r>
+            <w:r>
+              <w:t>_infections_averted = 0</w:t>
+            </w:r>
+          </w:p>
+          <w:p>
+            <w:pPr>
+              <w:spacing w:after="160"/>
+            </w:pPr>
+          </w:p>
+        </w:tc>
+      </w:tr>
+      <w:tr>
+        <w:trPr>
+          <w:trHeight w:val="457"/>
+        </w:trPr>
+        <w:tc>
+          <w:tcPr>
+            <w:tcW w:w="549" w:type="dxa"/>
+          </w:tcPr>
+          <w:p>
+            <w:pPr>
+              <w:spacing w:after="160"/>
+            </w:pPr>
+            <w:r>
+              <w:t>3.</w:t>
+            </w:r>
+          </w:p>
+        </w:tc>
+        <w:tc>
+          <w:tcPr>
+            <w:tcW w:w="2140" w:type="dxa"/>
+          </w:tcPr>
+          <w:p>
+            <w:pPr>
+              <w:spacing w:after="160"/>
+            </w:pPr>
+            <w:r>
+              <w:t>End infections = b</w:t>
+            </w:r>
+            <w:r>
+              <w:t>aseline infections</w:t>
+            </w:r>
+          </w:p>
+        </w:tc>
+        <w:tc>
+          <w:tcPr>
+            <w:tcW w:w="6462" w:type="dxa"/>
+          </w:tcPr>
+          <w:p>
+            <w:pPr>
+              <w:spacing w:after="160"/>
+            </w:pPr>
+            <w:r>
+              <w:t>Input new infection</w:t>
+            </w:r>
+            <w:r>
+              <w:t>s</w:t>
+            </w:r>
+            <w:r>
+              <w:t xml:space="preserve"> = scenario end infections</w:t>
+            </w:r>
+          </w:p>
+        </w:tc>
+      </w:tr>
+    </w:tbl>
+    <w:p>
+      <w:pPr>
+        <w:pStyle w:val="Heading4"/>
+        <w:rPr>
+          <w:i w:val="0"/>
+          <w:iCs w:val="0"/>
+        </w:rPr>
+      </w:pPr>
+    </w:p>
+    <w:p>
+      <w:pPr>
+        <w:pStyle w:val="Heading4"/>
+      </w:pPr>
+      <w:r>
+        <w:t>Doubling oral prep</w:t>
+      </w:r>
+      <w:r>
+        <w:t>- doubles infections averted</w:t>
+      </w:r>
+    </w:p>
+    <w:p>
+      <w:r>
+        <w:t>Efficacy at 80%, scenario 1</w:t>
+      </w:r>
+      <w:r>
+        <w:t xml:space="preserve"> has 10000 prep-users, scenario 2 has 20000 prep users</w:t>
+      </w:r>
+    </w:p>
+    <w:p>
+      <w:pPr>
+        <w:pStyle w:val="Heading4"/>
+      </w:pPr>
+    </w:p>
+    <w:tbl>
+      <w:tblPr>
+        <w:tblStyle w:val="TableGrid"/>
+        <w:tblW w:w="0" w:type="auto"/>
+        <w:tblLook w:val="04A0" w:firstRow="1" w:lastRow="0" w:firstColumn="1" w:lastColumn="0" w:noHBand="0" w:noVBand="1"/>
+      </w:tblPr>
+      <w:tblGrid>
+        <w:gridCol w:w="549"/>
+        <w:gridCol w:w="2140"/>
+        <w:gridCol w:w="6462"/>
+      </w:tblGrid>
+      <w:tr>
+        <w:trPr>
+          <w:trHeight w:val="457"/>
+        </w:trPr>
+        <w:tc>
+          <w:tcPr>
+            <w:tcW w:w="549" w:type="dxa"/>
+          </w:tcPr>
+          <w:p>
+            <w:pPr>
+              <w:spacing w:after="160"/>
+              <w:rPr>
+                <w:b/>
+                <w:bCs/>
+              </w:rPr>
+            </w:pPr>
+            <w:r>
+              <w:rPr>
+                <w:b/>
+                <w:bCs/>
+              </w:rPr>
+              <w:t>#</w:t>
+            </w:r>
+          </w:p>
+        </w:tc>
+        <w:tc>
+          <w:tcPr>
+            <w:tcW w:w="2140" w:type="dxa"/>
+          </w:tcPr>
+          <w:p>
+            <w:pPr>
+              <w:spacing w:after="160"/>
+              <w:rPr>
+                <w:b/>
+                <w:bCs/>
+              </w:rPr>
+            </w:pPr>
+            <w:r>
+              <w:rPr>
+                <w:b/>
+                <w:bCs/>
+              </w:rPr>
+              <w:t>Description</w:t>
+            </w:r>
+          </w:p>
+        </w:tc>
+        <w:tc>
+          <w:tcPr>
+            <w:tcW w:w="6462" w:type="dxa"/>
+          </w:tcPr>
+          <w:p>
+            <w:pPr>
+              <w:spacing w:after="160"/>
+              <w:rPr>
+                <w:b/>
+                <w:bCs/>
+              </w:rPr>
+            </w:pPr>
+            <w:r>
+              <w:rPr>
+                <w:b/>
+                <w:bCs/>
+              </w:rPr>
+              <w:t>Test Calculation/expectation</w:t>
+            </w:r>
+          </w:p>
+        </w:tc>
+      </w:tr>
+      <w:tr>
+        <w:trPr>
+          <w:trHeight w:val="457"/>
+        </w:trPr>
+        <w:tc>
+          <w:tcPr>
+            <w:tcW w:w="549" w:type="dxa"/>
+          </w:tcPr>
+          <w:p>
+            <w:pPr>
+              <w:spacing w:after="160"/>
+            </w:pPr>
+            <w:r>
+              <w:t>1.</w:t>
+            </w:r>
+          </w:p>
+        </w:tc>
+        <w:tc>
+          <w:tcPr>
+            <w:tcW w:w="2140" w:type="dxa"/>
+          </w:tcPr>
+          <w:p>
+            <w:pPr>
+              <w:spacing w:after="160"/>
+            </w:pPr>
+            <w:r>
+              <w:t>Scenario 1 – infections averted matchets expectation</w:t>
+            </w:r>
+          </w:p>
+        </w:tc>
+        <w:tc>
+          <w:tcPr>
+            <w:tcW w:w="6462" w:type="dxa"/>
+          </w:tcPr>
+          <w:p>
+            <w:pPr>
+              <w:spacing w:after="160"/>
+            </w:pPr>
+            <w:r>
+              <w:t xml:space="preserve">Adult_infections_averted = </w:t>
+            </w:r>
+            <w:r>
+              <w:t>10000*incidence*efficacy</w:t>
+            </w:r>
+          </w:p>
+          <w:p>
+            <w:pPr>
+              <w:spacing w:after="160"/>
+            </w:pPr>
+            <w:r>
+              <w:t>Adult_infections_averted =</w:t>
+            </w:r>
+            <w:r>
+              <w:t xml:space="preserve"> </w:t>
+            </w:r>
+            <w:r>
+              <w:t>21</w:t>
+            </w:r>
+          </w:p>
+          <w:p>
+            <w:pPr>
+              <w:spacing w:after="160"/>
+            </w:pPr>
+          </w:p>
+        </w:tc>
+      </w:tr>
+      <w:tr>
+        <w:trPr>
+          <w:trHeight w:val="457"/>
+        </w:trPr>
+        <w:tc>
+          <w:tcPr>
+            <w:tcW w:w="549" w:type="dxa"/>
+          </w:tcPr>
+          <w:p>
+            <w:pPr>
+              <w:spacing w:after="160"/>
+            </w:pPr>
+            <w:r>
+              <w:t>2.</w:t>
+            </w:r>
+          </w:p>
+        </w:tc>
+        <w:tc>
+          <w:tcPr>
+            <w:tcW w:w="2140" w:type="dxa"/>
+          </w:tcPr>
+          <w:p>
+            <w:pPr>
+              <w:spacing w:after="160"/>
+            </w:pPr>
+            <w:r>
+              <w:t xml:space="preserve">Scenario </w:t>
+            </w:r>
+            <w:r>
+              <w:t>2</w:t>
+            </w:r>
+            <w:r>
+              <w:t xml:space="preserve"> – infections averted matchets expectation</w:t>
+            </w:r>
+          </w:p>
+        </w:tc>
+        <w:tc>
+          <w:tcPr>
+            <w:tcW w:w="6462" w:type="dxa"/>
+          </w:tcPr>
+          <w:p>
+            <w:pPr>
+              <w:spacing w:after="160"/>
+            </w:pPr>
+            <w:r>
+              <w:t xml:space="preserve">Adult_infections_averted = </w:t>
+            </w:r>
+            <w:r>
+              <w:t>2</w:t>
+            </w:r>
+            <w:r>
+              <w:t>0000*incidence*efficacy</w:t>
+            </w:r>
+          </w:p>
+          <w:p>
+            <w:pPr>
+              <w:spacing w:after="160"/>
+            </w:pPr>
+            <w:r>
+              <w:t xml:space="preserve">Adult_infections_averted = </w:t>
+            </w:r>
+            <w:r>
+              <w:t>42</w:t>
+            </w:r>
+          </w:p>
+          <w:p>
+            <w:pPr>
+              <w:spacing w:after="160"/>
+            </w:pPr>
+          </w:p>
+        </w:tc>
+      </w:tr>
+      <w:tr>
+        <w:trPr>
+          <w:trHeight w:val="457"/>
+        </w:trPr>
+        <w:tc>
+          <w:tcPr>
+            <w:tcW w:w="549" w:type="dxa"/>
+          </w:tcPr>
+          <w:p>
+            <w:pPr>
+              <w:spacing w:after="160"/>
+            </w:pPr>
+            <w:r>
+              <w:t>3.</w:t>
+            </w:r>
+          </w:p>
+        </w:tc>
+        <w:tc>
+          <w:tcPr>
+            <w:tcW w:w="2140" w:type="dxa"/>
+          </w:tcPr>
+          <w:p>
+            <w:pPr>
+              <w:spacing w:after="160"/>
+            </w:pPr>
+            <w:r>
+              <w:t xml:space="preserve">Scenario 2 has double the infections averetd </w:t>
+            </w:r>
+          </w:p>
+        </w:tc>
+        <w:tc>
+          <w:tcPr>
+            <w:tcW w:w="6462" w:type="dxa"/>
+          </w:tcPr>
+          <w:p>
+            <w:pPr>
+              <w:spacing w:after="160"/>
+            </w:pPr>
+            <w:r>
+              <w:t>Adult_infections_averted</w:t>
+            </w:r>
+            <w:r>
+              <w:t xml:space="preserve">_scen2=2* </w:t>
+            </w:r>
+            <w:r>
+              <w:t>Adult_infections_averted</w:t>
+            </w:r>
+            <w:r>
+              <w:t>_scen1</w:t>
+            </w:r>
+          </w:p>
+        </w:tc>
+      </w:tr>
+    </w:tbl>
+    <w:p>
+      <w:pPr>
+        <w:pStyle w:val="Heading4"/>
+        <w:rPr>
+          <w:i w:val="0"/>
+          <w:iCs w:val="0"/>
+        </w:rPr>
+      </w:pPr>
+    </w:p>
+    <w:p>
+      <w:pPr>
+        <w:pStyle w:val="Heading4"/>
+      </w:pPr>
+      <w:r>
+        <w:t>Scaling down prep reduces infections averetd</w:t>
+      </w:r>
+    </w:p>
+    <w:p>
+      <w:r>
+        <w:t xml:space="preserve">Efficacy at 80%, </w:t>
+      </w:r>
+      <w:r>
+        <w:t>baseline</w:t>
+      </w:r>
+      <w:r>
+        <w:t xml:space="preserve"> has </w:t>
+      </w:r>
+      <w:r>
+        <w:t>5000</w:t>
+      </w:r>
+      <w:r>
+        <w:t xml:space="preserve"> prep-users, scenario </w:t>
+      </w:r>
+      <w:r>
+        <w:t>1</w:t>
+      </w:r>
+      <w:r>
+        <w:t xml:space="preserve"> has </w:t>
+      </w:r>
+      <w:r>
+        <w:t>1</w:t>
+      </w:r>
+      <w:r>
+        <w:t>000 prep users</w:t>
+      </w:r>
+    </w:p>
+    <w:p>
+      <w:pPr>
+        <w:pStyle w:val="Heading4"/>
+      </w:pPr>
+    </w:p>
+    <w:tbl>
+      <w:tblPr>
+        <w:tblStyle w:val="TableGrid"/>
+        <w:tblW w:w="0" w:type="auto"/>
+        <w:tblLook w:val="04A0" w:firstRow="1" w:lastRow="0" w:firstColumn="1" w:lastColumn="0" w:noHBand="0" w:noVBand="1"/>
+      </w:tblPr>
+      <w:tblGrid>
+        <w:gridCol w:w="549"/>
+        <w:gridCol w:w="2140"/>
+        <w:gridCol w:w="6462"/>
+      </w:tblGrid>
+      <w:tr>
+        <w:trPr>
+          <w:trHeight w:val="457"/>
+        </w:trPr>
+        <w:tc>
+          <w:tcPr>
+            <w:tcW w:w="549" w:type="dxa"/>
+          </w:tcPr>
+          <w:p>
+            <w:pPr>
+              <w:spacing w:after="160"/>
+              <w:rPr>
+                <w:b/>
+                <w:bCs/>
+              </w:rPr>
+            </w:pPr>
+            <w:r>
+              <w:rPr>
+                <w:b/>
+                <w:bCs/>
+              </w:rPr>
+              <w:t>#</w:t>
+            </w:r>
+          </w:p>
+        </w:tc>
+        <w:tc>
+          <w:tcPr>
+            <w:tcW w:w="2140" w:type="dxa"/>
+          </w:tcPr>
+          <w:p>
+            <w:pPr>
+              <w:spacing w:after="160"/>
+              <w:rPr>
+                <w:b/>
+                <w:bCs/>
+              </w:rPr>
+            </w:pPr>
+            <w:r>
+              <w:rPr>
+                <w:b/>
+                <w:bCs/>
+              </w:rPr>
+              <w:t>Description</w:t>
+            </w:r>
+          </w:p>
+        </w:tc>
+        <w:tc>
+          <w:tcPr>
+            <w:tcW w:w="6462" w:type="dxa"/>
+          </w:tcPr>
+          <w:p>
+            <w:pPr>
+              <w:spacing w:after="160"/>
+              <w:rPr>
+                <w:b/>
+                <w:bCs/>
+              </w:rPr>
+            </w:pPr>
+            <w:r>
+              <w:rPr>
+                <w:b/>
+                <w:bCs/>
+              </w:rPr>
+              <w:t>Test Calculation/expectation</w:t>
+            </w:r>
+          </w:p>
+        </w:tc>
+      </w:tr>
+      <w:tr>
+        <w:trPr>
+          <w:trHeight w:val="457"/>
+        </w:trPr>
+        <w:tc>
+          <w:tcPr>
+            <w:tcW w:w="549" w:type="dxa"/>
+          </w:tcPr>
+          <w:p>
+            <w:pPr>
+              <w:spacing w:after="160"/>
+            </w:pPr>
+            <w:r>
+              <w:t>1.</w:t>
+            </w:r>
+          </w:p>
+        </w:tc>
+        <w:tc>
+          <w:tcPr>
+            <w:tcW w:w="2140" w:type="dxa"/>
+          </w:tcPr>
+          <w:p>
+            <w:pPr>
+              <w:spacing w:after="160"/>
+            </w:pPr>
+            <w:r>
+              <w:t>Scenario 1 has fewer infections averted than baseline</w:t>
+            </w:r>
+          </w:p>
+        </w:tc>
+        <w:tc>
+          <w:tcPr>
+            <w:tcW w:w="6462" w:type="dxa"/>
+          </w:tcPr>
+          <w:p>
+            <w:pPr>
+              <w:spacing w:after="160"/>
+            </w:pPr>
+            <w:r>
+              <w:t>Adult_infections_averted = 10000*incidence*efficacy</w:t>
+            </w:r>
+          </w:p>
+          <w:p>
+            <w:pPr>
+              <w:spacing w:after="160"/>
+            </w:pPr>
+            <w:r>
+              <w:t>Adult_infections_averted = 21</w:t>
+            </w:r>
+          </w:p>
+          <w:p>
+            <w:pPr>
+              <w:spacing w:after="160"/>
+            </w:pPr>
+          </w:p>
+        </w:tc>
+      </w:tr>
+      <w:tr>
+        <w:trPr>
+          <w:trHeight w:val="457"/>
+        </w:trPr>
+        <w:tc>
+          <w:tcPr>
+            <w:tcW w:w="549" w:type="dxa"/>
+          </w:tcPr>
+          <w:p>
+            <w:pPr>
+              <w:spacing w:after="160"/>
+            </w:pPr>
+            <w:r>
+              <w:t>2.</w:t>
+            </w:r>
+          </w:p>
+        </w:tc>
+        <w:tc>
+          <w:tcPr>
+            <w:tcW w:w="2140" w:type="dxa"/>
+          </w:tcPr>
+          <w:p>
+            <w:pPr>
+              <w:spacing w:after="160"/>
+            </w:pPr>
+            <w:r>
+              <w:t xml:space="preserve">Scenario 2 – infections averted </w:t>
+            </w:r>
+            <w:r>
+              <w:lastRenderedPageBreak/>
+              <w:t>matchets expectation</w:t>
+            </w:r>
+          </w:p>
+        </w:tc>
+        <w:tc>
+          <w:tcPr>
+            <w:tcW w:w="6462" w:type="dxa"/>
+          </w:tcPr>
+          <w:p>
+            <w:pPr>
+              <w:spacing w:after="160"/>
+            </w:pPr>
+            <w:r>
+              <w:lastRenderedPageBreak/>
+              <w:t>Adult_infections_averted = 20000*incidence*efficacy</w:t>
+            </w:r>
+          </w:p>
+          <w:p>
+            <w:pPr>
+              <w:spacing w:after="160"/>
+            </w:pPr>
+            <w:r>
+              <w:lastRenderedPageBreak/>
+              <w:t>Adult_infections_averted = 42</w:t>
+            </w:r>
+          </w:p>
+          <w:p>
+            <w:pPr>
+              <w:spacing w:after="160"/>
+            </w:pPr>
+          </w:p>
+        </w:tc>
+      </w:tr>
+      <w:tr>
+        <w:trPr>
+          <w:trHeight w:val="457"/>
+        </w:trPr>
+        <w:tc>
+          <w:tcPr>
+            <w:tcW w:w="549" w:type="dxa"/>
+          </w:tcPr>
+          <w:p>
+            <w:pPr>
+              <w:spacing w:after="160"/>
+            </w:pPr>
+            <w:r>
+              <w:lastRenderedPageBreak/>
+              <w:t>3.</w:t>
+            </w:r>
+          </w:p>
+        </w:tc>
+        <w:tc>
+          <w:tcPr>
+            <w:tcW w:w="2140" w:type="dxa"/>
+          </w:tcPr>
+          <w:p>
+            <w:pPr>
+              <w:spacing w:after="160"/>
+            </w:pPr>
+            <w:r>
+              <w:t xml:space="preserve">Scenario 2 has double the infections averetd </w:t>
+            </w:r>
+          </w:p>
+        </w:tc>
+        <w:tc>
+          <w:tcPr>
+            <w:tcW w:w="6462" w:type="dxa"/>
+          </w:tcPr>
+          <w:p>
+            <w:pPr>
+              <w:spacing w:after="160"/>
+            </w:pPr>
+            <w:r>
+              <w:t>Adult_infections_averted_scen2=2* Adult_infections_averted_scen1</w:t>
+            </w:r>
+          </w:p>
+        </w:tc>
+      </w:tr>
+    </w:tbl>
+    <w:p>
+      <w:pPr>
+        <w:pStyle w:val="Heading4"/>
+        <w:rPr>
+          <w:i w:val="0"/>
+          <w:iCs w:val="0"/>
+        </w:rPr>
+      </w:pPr>
     </w:p>
     <w:p/>
     <w:p>
@@ -3077,7 +3952,6 @@
               <w:spacing w:after="160"/>
             </w:pPr>
             <w:r>
-              <w:lastRenderedPageBreak/>
               <w:t>Infections_averted=</w:t>
             </w:r>
             <w:r>
@@ -3099,7 +3973,6 @@
               <w:spacing w:after="160"/>
             </w:pPr>
             <w:r>
-              <w:lastRenderedPageBreak/>
               <w:t>2.</w:t>
             </w:r>
           </w:p>
@@ -3722,6 +4595,7 @@
     </w:p>
     <w:p>
       <w:r>
+        <w:lastRenderedPageBreak/>
         <w:t xml:space="preserve">Following intervention values assumed: condoms efficacy=99%, </w:t>
       </w:r>
     </w:p>
@@ -3895,7 +4769,6 @@
               <w:spacing w:after="160"/>
             </w:pPr>
             <w:r>
-              <w:lastRenderedPageBreak/>
               <w:t>3.</w:t>
             </w:r>
           </w:p>
@@ -4482,6 +5355,7 @@
         <w:spacing w:after="160"/>
       </w:pPr>
       <w:r>
+        <w:lastRenderedPageBreak/>
         <w:t>Uses a standardized population with the following parameters: 1,000,000 total population, 5% HIV prevalence (50,000 PLHIV), 80% diagnosed, 75% on ART, 85% virally suppressed, 5,000 new infections per year, 1,000 AIDS deaths per year</w:t>
       </w:r>
       <w:r>
@@ -4541,11 +5415,7 @@
         <w:t xml:space="preserve"> and linkage rate (2, 0.8)</w:t>
       </w:r>
       <w:r>
-        <w:t xml:space="preserve">, test </w:t>
-      </w:r>
-      <w:r>
-        <w:lastRenderedPageBreak/>
-        <w:t xml:space="preserve">efficacy </w:t>
+        <w:t xml:space="preserve">, test efficacy </w:t>
       </w:r>
       <w:r>
         <w:t>=0.97</w:t>
@@ -5311,11 +6181,7 @@
               <w:spacing w:after="160"/>
             </w:pPr>
             <w:r>
-              <w:t xml:space="preserve">Scale up general facility testing  by </w:t>
-            </w:r>
-            <w:r>
-              <w:lastRenderedPageBreak/>
-              <w:t>10 000 tests – positive tests</w:t>
+              <w:t>Scale up general facility testing  by 10 000 tests – positive tests</w:t>
             </w:r>
           </w:p>
         </w:tc>
@@ -5328,7 +6194,6 @@
               <w:spacing w:after="160"/>
             </w:pPr>
             <w:r>
-              <w:lastRenderedPageBreak/>
               <w:t>Expected_positive_scenario=2*expected_positive_baseline</w:t>
             </w:r>
           </w:p>
@@ -5725,7 +6590,11 @@
               <w:spacing w:after="160"/>
             </w:pPr>
             <w:r>
-              <w:t>Scale down general facility testing  to 10 000 tests – viral suppression</w:t>
+              <w:t xml:space="preserve">Scale down general facility testing  to 10 000 </w:t>
+            </w:r>
+            <w:r>
+              <w:lastRenderedPageBreak/>
+              <w:t>tests – viral suppression</w:t>
             </w:r>
           </w:p>
         </w:tc>
@@ -5738,6 +6607,7 @@
               <w:spacing w:after="160"/>
             </w:pPr>
             <w:r>
+              <w:lastRenderedPageBreak/>
               <w:t>Expected_vs_scenario=</w:t>
             </w:r>
             <w:r>
@@ -5806,7 +6676,6 @@
         <w:rPr>
           <w:color w:val="000000" w:themeColor="text1"/>
         </w:rPr>
-        <w:lastRenderedPageBreak/>
         <w:t>10,000 general</w:t>
       </w:r>
     </w:p>
@@ -6517,6 +7386,7 @@
               <w:spacing w:after="160"/>
             </w:pPr>
             <w:r>
+              <w:lastRenderedPageBreak/>
               <w:t>3</w:t>
             </w:r>
           </w:p>
@@ -6664,7 +7534,6 @@
           <w:iCs/>
           <w:color w:val="2E74B5"/>
         </w:rPr>
-        <w:lastRenderedPageBreak/>
         <w:t>Different linkage rates</w:t>
       </w:r>
     </w:p>

</xml_diff>

<commit_message>
Mortality impact testing complete
</commit_message>
<xml_diff>
--- a/resources/Test_Framework_Description.docx
+++ b/resources/Test_Framework_Description.docx
@@ -500,6 +500,230 @@
             </w:r>
             <w:r>
               <w:t>number_reached * unsuppressed_rate * 0.20</w:t>
+            </w:r>
+          </w:p>
+        </w:tc>
+      </w:tr>
+      <w:tr>
+        <w:trPr>
+          <w:trHeight w:val="301"/>
+        </w:trPr>
+        <w:tc>
+          <w:tcPr>
+            <w:tcW w:w="4143" w:type="dxa"/>
+          </w:tcPr>
+          <w:p>
+            <w:pPr>
+              <w:spacing w:after="120"/>
+            </w:pPr>
+            <w:r>
+              <w:t>Mortality among a sub-group</w:t>
+            </w:r>
+          </w:p>
+        </w:tc>
+        <w:tc>
+          <w:tcPr>
+            <w:tcW w:w="5647" w:type="dxa"/>
+          </w:tcPr>
+          <w:p>
+            <w:pPr>
+              <w:spacing w:after="120"/>
+            </w:pPr>
+            <w:r>
+              <w:t>calc_deaths_expected &lt;- function(n, base_rate, ahd_rate, prop_ahd) {</w:t>
+            </w:r>
+          </w:p>
+          <w:p>
+            <w:pPr>
+              <w:spacing w:after="120"/>
+            </w:pPr>
+            <w:r>
+              <w:t xml:space="preserve">  n * ((1 - prop_ahd) * base_rate + prop_ahd * ahd_rate)</w:t>
+            </w:r>
+          </w:p>
+          <w:p>
+            <w:pPr>
+              <w:spacing w:after="120"/>
+            </w:pPr>
+            <w:r>
+              <w:t>}</w:t>
+            </w:r>
+          </w:p>
+          <w:p>
+            <w:pPr>
+              <w:spacing w:after="120"/>
+            </w:pPr>
+          </w:p>
+          <w:p>
+            <w:pPr>
+              <w:spacing w:after="120"/>
+            </w:pPr>
+            <w:r>
+              <w:t>N = number of individuals, base_rate = mortality rate for subgroup, ahd_rate = mortality rate among those with AHD, prop_ahd = proportion of subgroup with AHD</w:t>
+            </w:r>
+          </w:p>
+        </w:tc>
+      </w:tr>
+      <w:tr>
+        <w:trPr>
+          <w:trHeight w:val="301"/>
+        </w:trPr>
+        <w:tc>
+          <w:tcPr>
+            <w:tcW w:w="4143" w:type="dxa"/>
+          </w:tcPr>
+          <w:p>
+            <w:pPr>
+              <w:spacing w:after="120"/>
+            </w:pPr>
+            <w:r>
+              <w:t>Mortality impact on new inititations for cotrimoxazole and OI management</w:t>
+            </w:r>
+          </w:p>
+        </w:tc>
+        <w:tc>
+          <w:tcPr>
+            <w:tcW w:w="5647" w:type="dxa"/>
+          </w:tcPr>
+          <w:p>
+            <w:pPr>
+              <w:spacing w:after="120"/>
+            </w:pPr>
+            <w:r>
+              <w:t>Assume smultiplicative effect</w:t>
+            </w:r>
+          </w:p>
+          <w:p>
+            <w:pPr>
+              <w:spacing w:after="120"/>
+            </w:pPr>
+            <w:r>
+              <w:t>eff_base = base_rate × (1 − cotrix_cov × cotrix_eff) × (1 − oi_cov × oi_eff)</w:t>
+            </w:r>
+          </w:p>
+        </w:tc>
+      </w:tr>
+      <w:tr>
+        <w:trPr>
+          <w:trHeight w:val="301"/>
+        </w:trPr>
+        <w:tc>
+          <w:tcPr>
+            <w:tcW w:w="4143" w:type="dxa"/>
+          </w:tcPr>
+          <w:p>
+            <w:pPr>
+              <w:spacing w:after="120"/>
+            </w:pPr>
+            <w:r>
+              <w:t>CD4 testing and AHD package</w:t>
+            </w:r>
+          </w:p>
+        </w:tc>
+        <w:tc>
+          <w:tcPr>
+            <w:tcW w:w="5647" w:type="dxa"/>
+          </w:tcPr>
+          <w:p>
+            <w:pPr>
+              <w:spacing w:after="120"/>
+            </w:pPr>
+          </w:p>
+        </w:tc>
+      </w:tr>
+      <w:tr>
+        <w:trPr>
+          <w:trHeight w:val="301"/>
+        </w:trPr>
+        <w:tc>
+          <w:tcPr>
+            <w:tcW w:w="9790" w:type="dxa"/>
+            <w:gridSpan w:val="2"/>
+          </w:tcPr>
+          <w:p>
+            <w:pPr>
+              <w:pStyle w:val="font-claude-response-body"/>
+            </w:pPr>
+            <w:r>
+              <w:rPr>
+                <w:rStyle w:val="Strong"/>
+              </w:rPr>
+              <w:t>Mortality Model Assumptions</w:t>
+            </w:r>
+          </w:p>
+          <w:p>
+            <w:r>
+              <w:rPr>
+                <w:rFonts w:hAnsi="Symbol"/>
+              </w:rPr>
+              <w:t></w:t>
+            </w:r>
+            <w:r>
+              <w:t xml:space="preserve">  Mortality is modelled across five cascade groups (undiagnosed, diagnosed not on ART, </w:t>
+            </w:r>
+            <w:commentRangeStart w:id="0"/>
+            <w:r>
+              <w:t xml:space="preserve">new ART initiations, established </w:t>
+            </w:r>
+            <w:commentRangeEnd w:id="0"/>
+            <w:r>
+              <w:rPr>
+                <w:rStyle w:val="CommentReference"/>
+                <w:sz w:val="24"/>
+                <w:szCs w:val="24"/>
+              </w:rPr>
+              <w:commentReference w:id="0"/>
+            </w:r>
+            <w:r>
+              <w:t xml:space="preserve">on ART not suppressed, established suppressed) with annual rates of 10%, 10%, 6%, 0.8%, and 0.3% respectively </w:t>
+            </w:r>
+          </w:p>
+          <w:p>
+            <w:r>
+              <w:rPr>
+                <w:rFonts w:hAnsi="Symbol"/>
+              </w:rPr>
+              <w:t></w:t>
+            </w:r>
+            <w:r>
+              <w:t xml:space="preserve">  20% of individuals in the undiagnosed, diagnosed-not-on-ART, and new initiation groups are assumed to have AHD, facing an additional annual mortality rate of 20%; established patients are assumed to have no AHD </w:t>
+            </w:r>
+          </w:p>
+          <w:p>
+            <w:r>
+              <w:rPr>
+                <w:rFonts w:hAnsi="Symbol"/>
+              </w:rPr>
+              <w:t></w:t>
+            </w:r>
+            <w:r>
+              <w:t xml:space="preserve">  Cotrimoxazole and OI management reduce the base mortality rate for new initiations only, with effects applied multiplicatively based on coverage and efficacy </w:t>
+            </w:r>
+          </w:p>
+          <w:p>
+            <w:r>
+              <w:rPr>
+                <w:rFonts w:hAnsi="Symbol"/>
+              </w:rPr>
+              <w:t></w:t>
+            </w:r>
+            <w:r>
+              <w:t xml:space="preserve">  The AHD package reduces AHD-specific mortality for new initiations, but is gated by CD4 testing — only those tested and identified with AHD are eligible, so the effective reduction scales with CD4 coverage × AHD package coverage × efficacy </w:t>
+            </w:r>
+          </w:p>
+          <w:p>
+            <w:pPr>
+              <w:pStyle w:val="font-claude-response-body"/>
+            </w:pPr>
+            <w:r>
+              <w:rPr>
+                <w:rFonts w:hAnsi="Symbol"/>
+              </w:rPr>
+              <w:lastRenderedPageBreak/>
+              <w:t></w:t>
+            </w:r>
+            <w:r>
+              <w:t xml:space="preserve">  Costs are applied per person reached: CD4 testing to all new initiates tested, AHD package to those diagnosed with AHD only, and cotrimoxazole/OI management to all new initiates receiving each intervention</w:t>
             </w:r>
           </w:p>
         </w:tc>
@@ -596,54 +820,23 @@
           <w:tcPr>
             <w:tcW w:w="416" w:type="dxa"/>
           </w:tcPr>
-          <w:p>
-            <w:pPr>
-              <w:pStyle w:val="Heading2"/>
-              <w:rPr>
-                <w:b w:val="0"/>
-                <w:bCs w:val="0"/>
-              </w:rPr>
-            </w:pPr>
-          </w:p>
+          <w:p/>
         </w:tc>
         <w:tc>
           <w:tcPr>
             <w:tcW w:w="1989" w:type="dxa"/>
           </w:tcPr>
           <w:p>
-            <w:pPr>
-              <w:pStyle w:val="Heading2"/>
-              <w:rPr>
-                <w:b w:val="0"/>
-                <w:bCs w:val="0"/>
-              </w:rPr>
-            </w:pPr>
-            <w:r>
-              <w:rPr>
-                <w:b w:val="0"/>
-                <w:bCs w:val="0"/>
-              </w:rPr>
+            <w:r>
               <w:t xml:space="preserve">Epi </w:t>
             </w:r>
             <w:r>
-              <w:rPr>
-                <w:b w:val="0"/>
-                <w:bCs w:val="0"/>
-              </w:rPr>
               <w:t xml:space="preserve">params </w:t>
             </w:r>
             <w:r>
-              <w:rPr>
-                <w:b w:val="0"/>
-                <w:bCs w:val="0"/>
-              </w:rPr>
               <w:t>– lower limits</w:t>
             </w:r>
             <w:r>
-              <w:rPr>
-                <w:b w:val="0"/>
-                <w:bCs w:val="0"/>
-              </w:rPr>
               <w:t xml:space="preserve"> </w:t>
             </w:r>
           </w:p>
@@ -653,18 +846,7 @@
             <w:tcW w:w="4114" w:type="dxa"/>
           </w:tcPr>
           <w:p>
-            <w:pPr>
-              <w:pStyle w:val="Heading2"/>
-              <w:rPr>
-                <w:b w:val="0"/>
-                <w:bCs w:val="0"/>
-              </w:rPr>
-            </w:pPr>
-            <w:r>
-              <w:rPr>
-                <w:b w:val="0"/>
-                <w:bCs w:val="0"/>
-              </w:rPr>
+            <w:r>
               <w:t>Cannot be negative</w:t>
             </w:r>
           </w:p>
@@ -673,16 +855,7 @@
           <w:tcPr>
             <w:tcW w:w="2831" w:type="dxa"/>
           </w:tcPr>
-          <w:p>
-            <w:pPr>
-              <w:pStyle w:val="Heading2"/>
-              <w:jc w:val="center"/>
-              <w:rPr>
-                <w:b w:val="0"/>
-                <w:bCs w:val="0"/>
-              </w:rPr>
-            </w:pPr>
-          </w:p>
+          <w:p/>
         </w:tc>
       </w:tr>
       <w:tr>
@@ -693,33 +866,14 @@
           <w:tcPr>
             <w:tcW w:w="416" w:type="dxa"/>
           </w:tcPr>
-          <w:p>
-            <w:pPr>
-              <w:pStyle w:val="Heading2"/>
-              <w:rPr>
-                <w:b w:val="0"/>
-                <w:bCs w:val="0"/>
-              </w:rPr>
-            </w:pPr>
-          </w:p>
+          <w:p/>
         </w:tc>
         <w:tc>
           <w:tcPr>
             <w:tcW w:w="1989" w:type="dxa"/>
           </w:tcPr>
           <w:p>
-            <w:pPr>
-              <w:pStyle w:val="Heading2"/>
-              <w:rPr>
-                <w:b w:val="0"/>
-                <w:bCs w:val="0"/>
-              </w:rPr>
-            </w:pPr>
-            <w:r>
-              <w:rPr>
-                <w:b w:val="0"/>
-                <w:bCs w:val="0"/>
-              </w:rPr>
+            <w:r>
               <w:t xml:space="preserve">Epi params – percentage indicators </w:t>
             </w:r>
           </w:p>
@@ -729,18 +883,7 @@
             <w:tcW w:w="4114" w:type="dxa"/>
           </w:tcPr>
           <w:p>
-            <w:pPr>
-              <w:pStyle w:val="Heading2"/>
-              <w:rPr>
-                <w:b w:val="0"/>
-                <w:bCs w:val="0"/>
-              </w:rPr>
-            </w:pPr>
-            <w:r>
-              <w:rPr>
-                <w:b w:val="0"/>
-                <w:bCs w:val="0"/>
-              </w:rPr>
+            <w:r>
               <w:t>Cannot exceed 100%</w:t>
             </w:r>
           </w:p>
@@ -749,16 +892,7 @@
           <w:tcPr>
             <w:tcW w:w="2831" w:type="dxa"/>
           </w:tcPr>
-          <w:p>
-            <w:pPr>
-              <w:pStyle w:val="Heading2"/>
-              <w:jc w:val="center"/>
-              <w:rPr>
-                <w:b w:val="0"/>
-                <w:bCs w:val="0"/>
-              </w:rPr>
-            </w:pPr>
-          </w:p>
+          <w:p/>
         </w:tc>
       </w:tr>
       <w:tr>
@@ -769,33 +903,14 @@
           <w:tcPr>
             <w:tcW w:w="416" w:type="dxa"/>
           </w:tcPr>
-          <w:p>
-            <w:pPr>
-              <w:pStyle w:val="Heading2"/>
-              <w:rPr>
-                <w:b w:val="0"/>
-                <w:bCs w:val="0"/>
-              </w:rPr>
-            </w:pPr>
-          </w:p>
+          <w:p/>
         </w:tc>
         <w:tc>
           <w:tcPr>
             <w:tcW w:w="1989" w:type="dxa"/>
           </w:tcPr>
           <w:p>
-            <w:pPr>
-              <w:pStyle w:val="Heading2"/>
-              <w:rPr>
-                <w:b w:val="0"/>
-                <w:bCs w:val="0"/>
-              </w:rPr>
-            </w:pPr>
-            <w:r>
-              <w:rPr>
-                <w:b w:val="0"/>
-                <w:bCs w:val="0"/>
-              </w:rPr>
+            <w:r>
               <w:t>Epi params – new infections</w:t>
             </w:r>
           </w:p>
@@ -805,25 +920,10 @@
             <w:tcW w:w="4114" w:type="dxa"/>
           </w:tcPr>
           <w:p>
-            <w:pPr>
-              <w:pStyle w:val="Heading2"/>
-              <w:rPr>
-                <w:b w:val="0"/>
-                <w:bCs w:val="0"/>
-              </w:rPr>
-            </w:pPr>
-            <w:r>
-              <w:rPr>
-                <w:b w:val="0"/>
-                <w:bCs w:val="0"/>
-              </w:rPr>
+            <w:r>
               <w:t xml:space="preserve">Cannot exceed HIV negative </w:t>
             </w:r>
             <w:r>
-              <w:rPr>
-                <w:b w:val="0"/>
-                <w:bCs w:val="0"/>
-              </w:rPr>
               <w:t>population</w:t>
             </w:r>
           </w:p>
@@ -832,16 +932,7 @@
           <w:tcPr>
             <w:tcW w:w="2831" w:type="dxa"/>
           </w:tcPr>
-          <w:p>
-            <w:pPr>
-              <w:pStyle w:val="Heading2"/>
-              <w:jc w:val="center"/>
-              <w:rPr>
-                <w:b w:val="0"/>
-                <w:bCs w:val="0"/>
-              </w:rPr>
-            </w:pPr>
-          </w:p>
+          <w:p/>
         </w:tc>
       </w:tr>
       <w:tr>
@@ -852,33 +943,14 @@
           <w:tcPr>
             <w:tcW w:w="416" w:type="dxa"/>
           </w:tcPr>
-          <w:p>
-            <w:pPr>
-              <w:pStyle w:val="Heading2"/>
-              <w:rPr>
-                <w:b w:val="0"/>
-                <w:bCs w:val="0"/>
-              </w:rPr>
-            </w:pPr>
-          </w:p>
+          <w:p/>
         </w:tc>
         <w:tc>
           <w:tcPr>
             <w:tcW w:w="1989" w:type="dxa"/>
           </w:tcPr>
           <w:p>
-            <w:pPr>
-              <w:pStyle w:val="Heading2"/>
-              <w:rPr>
-                <w:b w:val="0"/>
-                <w:bCs w:val="0"/>
-              </w:rPr>
-            </w:pPr>
-            <w:r>
-              <w:rPr>
-                <w:b w:val="0"/>
-                <w:bCs w:val="0"/>
-              </w:rPr>
+            <w:r>
               <w:t>Epi params – new diagnoses</w:t>
             </w:r>
           </w:p>
@@ -888,18 +960,7 @@
             <w:tcW w:w="4114" w:type="dxa"/>
           </w:tcPr>
           <w:p>
-            <w:pPr>
-              <w:pStyle w:val="Heading2"/>
-              <w:rPr>
-                <w:b w:val="0"/>
-                <w:bCs w:val="0"/>
-              </w:rPr>
-            </w:pPr>
-            <w:r>
-              <w:rPr>
-                <w:b w:val="0"/>
-                <w:bCs w:val="0"/>
-              </w:rPr>
+            <w:r>
               <w:t>Cannot exceed undiagnosed population</w:t>
             </w:r>
           </w:p>
@@ -908,16 +969,7 @@
           <w:tcPr>
             <w:tcW w:w="2831" w:type="dxa"/>
           </w:tcPr>
-          <w:p>
-            <w:pPr>
-              <w:pStyle w:val="Heading2"/>
-              <w:jc w:val="center"/>
-              <w:rPr>
-                <w:b w:val="0"/>
-                <w:bCs w:val="0"/>
-              </w:rPr>
-            </w:pPr>
-          </w:p>
+          <w:p/>
         </w:tc>
       </w:tr>
       <w:tr>
@@ -928,33 +980,14 @@
           <w:tcPr>
             <w:tcW w:w="416" w:type="dxa"/>
           </w:tcPr>
-          <w:p>
-            <w:pPr>
-              <w:pStyle w:val="Heading2"/>
-              <w:rPr>
-                <w:b w:val="0"/>
-                <w:bCs w:val="0"/>
-              </w:rPr>
-            </w:pPr>
-          </w:p>
+          <w:p/>
         </w:tc>
         <w:tc>
           <w:tcPr>
             <w:tcW w:w="1989" w:type="dxa"/>
           </w:tcPr>
           <w:p>
-            <w:pPr>
-              <w:pStyle w:val="Heading2"/>
-              <w:rPr>
-                <w:b w:val="0"/>
-                <w:bCs w:val="0"/>
-              </w:rPr>
-            </w:pPr>
-            <w:r>
-              <w:rPr>
-                <w:b w:val="0"/>
-                <w:bCs w:val="0"/>
-              </w:rPr>
+            <w:r>
               <w:t>Epi params – AIDS deaths</w:t>
             </w:r>
           </w:p>
@@ -964,18 +997,7 @@
             <w:tcW w:w="4114" w:type="dxa"/>
           </w:tcPr>
           <w:p>
-            <w:pPr>
-              <w:pStyle w:val="Heading2"/>
-              <w:rPr>
-                <w:b w:val="0"/>
-                <w:bCs w:val="0"/>
-              </w:rPr>
-            </w:pPr>
-            <w:r>
-              <w:rPr>
-                <w:b w:val="0"/>
-                <w:bCs w:val="0"/>
-              </w:rPr>
+            <w:r>
               <w:t>Cannot exceed PLHIV</w:t>
             </w:r>
           </w:p>
@@ -984,16 +1006,7 @@
           <w:tcPr>
             <w:tcW w:w="2831" w:type="dxa"/>
           </w:tcPr>
-          <w:p>
-            <w:pPr>
-              <w:pStyle w:val="Heading2"/>
-              <w:jc w:val="center"/>
-              <w:rPr>
-                <w:b w:val="0"/>
-                <w:bCs w:val="0"/>
-              </w:rPr>
-            </w:pPr>
-          </w:p>
+          <w:p/>
         </w:tc>
       </w:tr>
       <w:tr>
@@ -1004,33 +1017,14 @@
           <w:tcPr>
             <w:tcW w:w="416" w:type="dxa"/>
           </w:tcPr>
-          <w:p>
-            <w:pPr>
-              <w:pStyle w:val="Heading2"/>
-              <w:rPr>
-                <w:b w:val="0"/>
-                <w:bCs w:val="0"/>
-              </w:rPr>
-            </w:pPr>
-          </w:p>
+          <w:p/>
         </w:tc>
         <w:tc>
           <w:tcPr>
             <w:tcW w:w="1989" w:type="dxa"/>
           </w:tcPr>
           <w:p>
-            <w:pPr>
-              <w:pStyle w:val="Heading2"/>
-              <w:rPr>
-                <w:b w:val="0"/>
-                <w:bCs w:val="0"/>
-              </w:rPr>
-            </w:pPr>
-            <w:r>
-              <w:rPr>
-                <w:b w:val="0"/>
-                <w:bCs w:val="0"/>
-              </w:rPr>
+            <w:r>
               <w:t>Coverage limits</w:t>
             </w:r>
           </w:p>
@@ -1040,18 +1034,7 @@
             <w:tcW w:w="4114" w:type="dxa"/>
           </w:tcPr>
           <w:p>
-            <w:pPr>
-              <w:pStyle w:val="Heading2"/>
-              <w:rPr>
-                <w:b w:val="0"/>
-                <w:bCs w:val="0"/>
-              </w:rPr>
-            </w:pPr>
-            <w:r>
-              <w:rPr>
-                <w:b w:val="0"/>
-                <w:bCs w:val="0"/>
-              </w:rPr>
+            <w:r>
               <w:t>All coverage interventions must be contained (0,100%)</w:t>
             </w:r>
           </w:p>
@@ -1061,36 +1044,18 @@
             <w:tcW w:w="2831" w:type="dxa"/>
           </w:tcPr>
           <w:p>
-            <w:pPr>
-              <w:pStyle w:val="Heading2"/>
-              <w:jc w:val="center"/>
-              <w:rPr>
-                <w:b w:val="0"/>
-                <w:bCs w:val="0"/>
-              </w:rPr>
-            </w:pPr>
-            <w:r>
-              <w:rPr>
-                <w:b w:val="0"/>
-                <w:bCs w:val="0"/>
-              </w:rPr>
+            <w:r>
               <w:t>Done – automatically adjusts to 0 or 100%</w:t>
             </w:r>
           </w:p>
           <w:p>
             <w:pPr>
-              <w:pStyle w:val="Heading2"/>
-              <w:jc w:val="center"/>
-              <w:rPr>
-                <w:b w:val="0"/>
-                <w:bCs w:val="0"/>
+              <w:rPr>
                 <w:color w:val="EE0000"/>
               </w:rPr>
             </w:pPr>
             <w:r>
               <w:rPr>
-                <w:b w:val="0"/>
-                <w:bCs w:val="0"/>
                 <w:color w:val="EE0000"/>
               </w:rPr>
               <w:t>Might be worth including a warning about the adjustment later</w:t>
@@ -1103,33 +1068,14 @@
           <w:tcPr>
             <w:tcW w:w="416" w:type="dxa"/>
           </w:tcPr>
-          <w:p>
-            <w:pPr>
-              <w:pStyle w:val="Heading2"/>
-              <w:rPr>
-                <w:b w:val="0"/>
-                <w:bCs w:val="0"/>
-              </w:rPr>
-            </w:pPr>
-          </w:p>
+          <w:p/>
         </w:tc>
         <w:tc>
           <w:tcPr>
             <w:tcW w:w="1989" w:type="dxa"/>
           </w:tcPr>
           <w:p>
-            <w:pPr>
-              <w:pStyle w:val="Heading2"/>
-              <w:rPr>
-                <w:b w:val="0"/>
-                <w:bCs w:val="0"/>
-              </w:rPr>
-            </w:pPr>
-            <w:r>
-              <w:rPr>
-                <w:b w:val="0"/>
-                <w:bCs w:val="0"/>
-              </w:rPr>
+            <w:r>
               <w:t>Numeric input limits - min</w:t>
             </w:r>
           </w:p>
@@ -1139,18 +1085,7 @@
             <w:tcW w:w="4114" w:type="dxa"/>
           </w:tcPr>
           <w:p>
-            <w:pPr>
-              <w:pStyle w:val="Heading2"/>
-              <w:rPr>
-                <w:b w:val="0"/>
-                <w:bCs w:val="0"/>
-              </w:rPr>
-            </w:pPr>
-            <w:r>
-              <w:rPr>
-                <w:b w:val="0"/>
-                <w:bCs w:val="0"/>
-              </w:rPr>
+            <w:r>
               <w:t>Number of people cannot be less than 0</w:t>
             </w:r>
           </w:p>
@@ -1160,19 +1095,7 @@
             <w:tcW w:w="2831" w:type="dxa"/>
           </w:tcPr>
           <w:p>
-            <w:pPr>
-              <w:pStyle w:val="Heading2"/>
-              <w:jc w:val="center"/>
-              <w:rPr>
-                <w:b w:val="0"/>
-                <w:bCs w:val="0"/>
-              </w:rPr>
-            </w:pPr>
-            <w:r>
-              <w:rPr>
-                <w:b w:val="0"/>
-                <w:bCs w:val="0"/>
-              </w:rPr>
+            <w:r>
               <w:t>Done – automatically adjusts to 0 with negative input</w:t>
             </w:r>
           </w:p>
@@ -1183,40 +1106,17 @@
           <w:tcPr>
             <w:tcW w:w="416" w:type="dxa"/>
           </w:tcPr>
-          <w:p>
-            <w:pPr>
-              <w:pStyle w:val="Heading2"/>
-              <w:rPr>
-                <w:b w:val="0"/>
-                <w:bCs w:val="0"/>
-              </w:rPr>
-            </w:pPr>
-          </w:p>
+          <w:p/>
         </w:tc>
         <w:tc>
           <w:tcPr>
             <w:tcW w:w="1989" w:type="dxa"/>
           </w:tcPr>
           <w:p>
-            <w:pPr>
-              <w:pStyle w:val="Heading2"/>
-              <w:rPr>
-                <w:b w:val="0"/>
-                <w:bCs w:val="0"/>
-              </w:rPr>
-            </w:pPr>
-            <w:r>
-              <w:rPr>
-                <w:b w:val="0"/>
-                <w:bCs w:val="0"/>
-              </w:rPr>
+            <w:r>
               <w:t>Numeric i</w:t>
             </w:r>
             <w:r>
-              <w:rPr>
-                <w:b w:val="0"/>
-                <w:bCs w:val="0"/>
-              </w:rPr>
               <w:t>nput validation - prep</w:t>
             </w:r>
           </w:p>
@@ -1226,18 +1126,7 @@
             <w:tcW w:w="4114" w:type="dxa"/>
           </w:tcPr>
           <w:p>
-            <w:pPr>
-              <w:pStyle w:val="Heading2"/>
-              <w:rPr>
-                <w:b w:val="0"/>
-                <w:bCs w:val="0"/>
-              </w:rPr>
-            </w:pPr>
-            <w:r>
-              <w:rPr>
-                <w:b w:val="0"/>
-                <w:bCs w:val="0"/>
-              </w:rPr>
+            <w:r>
               <w:t>People on oral prep + people on lenacapavir cannot exceed adult population</w:t>
             </w:r>
           </w:p>
@@ -1247,18 +1136,7 @@
             <w:tcW w:w="2831" w:type="dxa"/>
           </w:tcPr>
           <w:p>
-            <w:pPr>
-              <w:pStyle w:val="Heading2"/>
-              <w:rPr>
-                <w:b w:val="0"/>
-                <w:bCs w:val="0"/>
-              </w:rPr>
-            </w:pPr>
-            <w:r>
-              <w:rPr>
-                <w:b w:val="0"/>
-                <w:bCs w:val="0"/>
-              </w:rPr>
+            <w:r>
               <w:t>Limits in place and working – app a little buggy about using the arrows straight after exceeding limits</w:t>
             </w:r>
           </w:p>
@@ -1269,33 +1147,14 @@
           <w:tcPr>
             <w:tcW w:w="416" w:type="dxa"/>
           </w:tcPr>
-          <w:p>
-            <w:pPr>
-              <w:pStyle w:val="Heading2"/>
-              <w:rPr>
-                <w:b w:val="0"/>
-                <w:bCs w:val="0"/>
-              </w:rPr>
-            </w:pPr>
-          </w:p>
+          <w:p/>
         </w:tc>
         <w:tc>
           <w:tcPr>
             <w:tcW w:w="1989" w:type="dxa"/>
           </w:tcPr>
           <w:p>
-            <w:pPr>
-              <w:pStyle w:val="Heading2"/>
-              <w:rPr>
-                <w:b w:val="0"/>
-                <w:bCs w:val="0"/>
-              </w:rPr>
-            </w:pPr>
-            <w:r>
-              <w:rPr>
-                <w:b w:val="0"/>
-                <w:bCs w:val="0"/>
-              </w:rPr>
+            <w:r>
               <w:t>Numeric input validation – vmmc</w:t>
             </w:r>
           </w:p>
@@ -1305,18 +1164,7 @@
             <w:tcW w:w="4114" w:type="dxa"/>
           </w:tcPr>
           <w:p>
-            <w:pPr>
-              <w:pStyle w:val="Heading2"/>
-              <w:rPr>
-                <w:b w:val="0"/>
-                <w:bCs w:val="0"/>
-              </w:rPr>
-            </w:pPr>
-            <w:r>
-              <w:rPr>
-                <w:b w:val="0"/>
-                <w:bCs w:val="0"/>
-              </w:rPr>
+            <w:r>
               <w:t>Number of people receiving annual VMMC cannot exceed population of uncircumcised males</w:t>
             </w:r>
           </w:p>
@@ -1325,15 +1173,7 @@
           <w:tcPr>
             <w:tcW w:w="2831" w:type="dxa"/>
           </w:tcPr>
-          <w:p>
-            <w:pPr>
-              <w:pStyle w:val="Heading2"/>
-              <w:rPr>
-                <w:b w:val="0"/>
-                <w:bCs w:val="0"/>
-              </w:rPr>
-            </w:pPr>
-          </w:p>
+          <w:p/>
         </w:tc>
       </w:tr>
       <w:tr>
@@ -1341,33 +1181,14 @@
           <w:tcPr>
             <w:tcW w:w="416" w:type="dxa"/>
           </w:tcPr>
-          <w:p>
-            <w:pPr>
-              <w:pStyle w:val="Heading2"/>
-              <w:rPr>
-                <w:b w:val="0"/>
-                <w:bCs w:val="0"/>
-              </w:rPr>
-            </w:pPr>
-          </w:p>
+          <w:p/>
         </w:tc>
         <w:tc>
           <w:tcPr>
             <w:tcW w:w="1989" w:type="dxa"/>
           </w:tcPr>
           <w:p>
-            <w:pPr>
-              <w:pStyle w:val="Heading2"/>
-              <w:rPr>
-                <w:b w:val="0"/>
-                <w:bCs w:val="0"/>
-              </w:rPr>
-            </w:pPr>
-            <w:r>
-              <w:rPr>
-                <w:b w:val="0"/>
-                <w:bCs w:val="0"/>
-              </w:rPr>
+            <w:r>
               <w:t xml:space="preserve">MMD combination limits </w:t>
             </w:r>
           </w:p>
@@ -1377,18 +1198,7 @@
             <w:tcW w:w="4114" w:type="dxa"/>
           </w:tcPr>
           <w:p>
-            <w:pPr>
-              <w:pStyle w:val="Heading2"/>
-              <w:rPr>
-                <w:b w:val="0"/>
-                <w:bCs w:val="0"/>
-              </w:rPr>
-            </w:pPr>
-            <w:r>
-              <w:rPr>
-                <w:b w:val="0"/>
-                <w:bCs w:val="0"/>
-              </w:rPr>
+            <w:r>
               <w:t>Together the three categories of MMD cannot exceed 100% of stable clients</w:t>
             </w:r>
           </w:p>
@@ -1397,15 +1207,7 @@
           <w:tcPr>
             <w:tcW w:w="2831" w:type="dxa"/>
           </w:tcPr>
-          <w:p>
-            <w:pPr>
-              <w:pStyle w:val="Heading2"/>
-              <w:rPr>
-                <w:b w:val="0"/>
-                <w:bCs w:val="0"/>
-              </w:rPr>
-            </w:pPr>
-          </w:p>
+          <w:p/>
         </w:tc>
       </w:tr>
       <w:tr>
@@ -1413,57 +1215,25 @@
           <w:tcPr>
             <w:tcW w:w="416" w:type="dxa"/>
           </w:tcPr>
-          <w:p>
-            <w:pPr>
-              <w:pStyle w:val="Heading2"/>
-              <w:rPr>
-                <w:b w:val="0"/>
-                <w:bCs w:val="0"/>
-              </w:rPr>
-            </w:pPr>
-          </w:p>
+          <w:p/>
         </w:tc>
         <w:tc>
           <w:tcPr>
             <w:tcW w:w="1989" w:type="dxa"/>
           </w:tcPr>
-          <w:p>
-            <w:pPr>
-              <w:pStyle w:val="Heading2"/>
-              <w:rPr>
-                <w:b w:val="0"/>
-                <w:bCs w:val="0"/>
-              </w:rPr>
-            </w:pPr>
-          </w:p>
+          <w:p/>
         </w:tc>
         <w:tc>
           <w:tcPr>
             <w:tcW w:w="4114" w:type="dxa"/>
           </w:tcPr>
-          <w:p>
-            <w:pPr>
-              <w:pStyle w:val="Heading2"/>
-              <w:rPr>
-                <w:b w:val="0"/>
-                <w:bCs w:val="0"/>
-              </w:rPr>
-            </w:pPr>
-          </w:p>
+          <w:p/>
         </w:tc>
         <w:tc>
           <w:tcPr>
             <w:tcW w:w="2831" w:type="dxa"/>
           </w:tcPr>
-          <w:p>
-            <w:pPr>
-              <w:pStyle w:val="Heading2"/>
-              <w:rPr>
-                <w:b w:val="0"/>
-                <w:bCs w:val="0"/>
-              </w:rPr>
-            </w:pPr>
-          </w:p>
+          <w:p/>
         </w:tc>
       </w:tr>
       <w:tr>
@@ -1471,57 +1241,25 @@
           <w:tcPr>
             <w:tcW w:w="416" w:type="dxa"/>
           </w:tcPr>
-          <w:p>
-            <w:pPr>
-              <w:pStyle w:val="Heading2"/>
-              <w:rPr>
-                <w:b w:val="0"/>
-                <w:bCs w:val="0"/>
-              </w:rPr>
-            </w:pPr>
-          </w:p>
+          <w:p/>
         </w:tc>
         <w:tc>
           <w:tcPr>
             <w:tcW w:w="1989" w:type="dxa"/>
           </w:tcPr>
-          <w:p>
-            <w:pPr>
-              <w:pStyle w:val="Heading2"/>
-              <w:rPr>
-                <w:b w:val="0"/>
-                <w:bCs w:val="0"/>
-              </w:rPr>
-            </w:pPr>
-          </w:p>
+          <w:p/>
         </w:tc>
         <w:tc>
           <w:tcPr>
             <w:tcW w:w="4114" w:type="dxa"/>
           </w:tcPr>
-          <w:p>
-            <w:pPr>
-              <w:pStyle w:val="Heading2"/>
-              <w:rPr>
-                <w:b w:val="0"/>
-                <w:bCs w:val="0"/>
-              </w:rPr>
-            </w:pPr>
-          </w:p>
+          <w:p/>
         </w:tc>
         <w:tc>
           <w:tcPr>
             <w:tcW w:w="2831" w:type="dxa"/>
           </w:tcPr>
-          <w:p>
-            <w:pPr>
-              <w:pStyle w:val="Heading2"/>
-              <w:rPr>
-                <w:b w:val="0"/>
-                <w:bCs w:val="0"/>
-              </w:rPr>
-            </w:pPr>
-          </w:p>
+          <w:p/>
         </w:tc>
       </w:tr>
       <w:tr>
@@ -1529,57 +1267,25 @@
           <w:tcPr>
             <w:tcW w:w="416" w:type="dxa"/>
           </w:tcPr>
-          <w:p>
-            <w:pPr>
-              <w:pStyle w:val="Heading2"/>
-              <w:rPr>
-                <w:b w:val="0"/>
-                <w:bCs w:val="0"/>
-              </w:rPr>
-            </w:pPr>
-          </w:p>
+          <w:p/>
         </w:tc>
         <w:tc>
           <w:tcPr>
             <w:tcW w:w="1989" w:type="dxa"/>
           </w:tcPr>
-          <w:p>
-            <w:pPr>
-              <w:pStyle w:val="Heading2"/>
-              <w:rPr>
-                <w:b w:val="0"/>
-                <w:bCs w:val="0"/>
-              </w:rPr>
-            </w:pPr>
-          </w:p>
+          <w:p/>
         </w:tc>
         <w:tc>
           <w:tcPr>
             <w:tcW w:w="4114" w:type="dxa"/>
           </w:tcPr>
-          <w:p>
-            <w:pPr>
-              <w:pStyle w:val="Heading2"/>
-              <w:rPr>
-                <w:b w:val="0"/>
-                <w:bCs w:val="0"/>
-              </w:rPr>
-            </w:pPr>
-          </w:p>
+          <w:p/>
         </w:tc>
         <w:tc>
           <w:tcPr>
             <w:tcW w:w="2831" w:type="dxa"/>
           </w:tcPr>
-          <w:p>
-            <w:pPr>
-              <w:pStyle w:val="Heading2"/>
-              <w:rPr>
-                <w:b w:val="0"/>
-                <w:bCs w:val="0"/>
-              </w:rPr>
-            </w:pPr>
-          </w:p>
+          <w:p/>
         </w:tc>
       </w:tr>
     </w:tbl>
@@ -1622,6 +1328,7 @@
         <w:pStyle w:val="Heading2"/>
       </w:pPr>
       <w:r>
+        <w:lastRenderedPageBreak/>
         <w:t>Key test functions in R</w:t>
       </w:r>
     </w:p>
@@ -1670,7 +1377,7 @@
       <w:pPr>
         <w:pStyle w:val="Heading2"/>
       </w:pPr>
-      <w:commentRangeStart w:id="0"/>
+      <w:commentRangeStart w:id="1"/>
       <w:r>
         <w:t>Test</w:t>
       </w:r>
@@ -1680,14 +1387,14 @@
       <w:r>
         <w:t>: Population Calculations - Basic Integrity</w:t>
       </w:r>
-      <w:commentRangeEnd w:id="0"/>
+      <w:commentRangeEnd w:id="1"/>
       <w:r>
         <w:rPr>
           <w:rStyle w:val="CommentReference"/>
           <w:sz w:val="28"/>
           <w:szCs w:val="28"/>
         </w:rPr>
-        <w:commentReference w:id="0"/>
+        <w:commentReference w:id="1"/>
       </w:r>
     </w:p>
     <w:p>
@@ -1729,7 +1436,6 @@
         <w:pStyle w:val="Heading3"/>
       </w:pPr>
       <w:r>
-        <w:lastRenderedPageBreak/>
         <w:t>Test Context</w:t>
       </w:r>
     </w:p>
@@ -2114,6 +1820,7 @@
                 <w:b/>
                 <w:bCs/>
               </w:rPr>
+              <w:lastRenderedPageBreak/>
               <w:t>#</w:t>
             </w:r>
           </w:p>
@@ -2341,22 +2048,21 @@
       <w:pPr>
         <w:pStyle w:val="Heading2"/>
       </w:pPr>
-      <w:commentRangeStart w:id="1"/>
-      <w:r>
-        <w:lastRenderedPageBreak/>
+      <w:commentRangeStart w:id="2"/>
+      <w:r>
         <w:t>Test set: Prevention Interventions</w:t>
       </w:r>
       <w:r>
         <w:t xml:space="preserve"> </w:t>
       </w:r>
-      <w:commentRangeEnd w:id="1"/>
+      <w:commentRangeEnd w:id="2"/>
       <w:r>
         <w:rPr>
           <w:rStyle w:val="CommentReference"/>
           <w:sz w:val="28"/>
           <w:szCs w:val="28"/>
         </w:rPr>
-        <w:commentReference w:id="1"/>
+        <w:commentReference w:id="2"/>
       </w:r>
     </w:p>
     <w:p>
@@ -2690,6 +2396,7 @@
         <w:pStyle w:val="Heading4"/>
       </w:pPr>
       <w:r>
+        <w:lastRenderedPageBreak/>
         <w:t>Doubling oral prep</w:t>
       </w:r>
       <w:r>
@@ -2935,7 +2642,6 @@
               <w:spacing w:after="160"/>
             </w:pPr>
             <w:r>
-              <w:lastRenderedPageBreak/>
               <w:t>3.</w:t>
             </w:r>
           </w:p>
@@ -3336,8 +3042,8 @@
                 <w:bCs/>
               </w:rPr>
             </w:pPr>
-            <w:commentRangeStart w:id="2"/>
             <w:commentRangeStart w:id="3"/>
+            <w:commentRangeStart w:id="4"/>
             <w:r>
               <w:rPr>
                 <w:b/>
@@ -3346,7 +3052,7 @@
               </w:rPr>
               <w:t>Test</w:t>
             </w:r>
-            <w:commentRangeEnd w:id="2"/>
+            <w:commentRangeEnd w:id="3"/>
             <w:r>
               <w:rPr>
                 <w:rStyle w:val="CommentReference"/>
@@ -3356,9 +3062,9 @@
                 <w:szCs w:val="24"/>
                 <w:highlight w:val="yellow"/>
               </w:rPr>
-              <w:commentReference w:id="2"/>
-            </w:r>
-            <w:commentRangeEnd w:id="3"/>
+              <w:commentReference w:id="3"/>
+            </w:r>
+            <w:commentRangeEnd w:id="4"/>
             <w:r>
               <w:rPr>
                 <w:rStyle w:val="CommentReference"/>
@@ -3368,7 +3074,7 @@
                 <w:szCs w:val="24"/>
                 <w:highlight w:val="yellow"/>
               </w:rPr>
-              <w:commentReference w:id="3"/>
+              <w:commentReference w:id="4"/>
             </w:r>
             <w:r>
               <w:rPr>
@@ -3461,6 +3167,7 @@
               <w:spacing w:after="160"/>
             </w:pPr>
             <w:r>
+              <w:lastRenderedPageBreak/>
               <w:t>2.</w:t>
             </w:r>
           </w:p>
@@ -3642,11 +3349,7 @@
               <w:t xml:space="preserve">down </w:t>
             </w:r>
             <w:r>
-              <w:t xml:space="preserve">oral </w:t>
-            </w:r>
-            <w:r>
-              <w:lastRenderedPageBreak/>
-              <w:t>prep by 1000 users</w:t>
+              <w:t>oral prep by 1000 users</w:t>
             </w:r>
           </w:p>
         </w:tc>
@@ -3659,7 +3362,6 @@
               <w:spacing w:after="160"/>
             </w:pPr>
             <w:r>
-              <w:lastRenderedPageBreak/>
               <w:t>Infections averted =-1000*incidence*prep_oral_efficacy + 500*incidence*prep_len_efficacy</w:t>
             </w:r>
           </w:p>
@@ -3688,7 +3390,7 @@
             <w:pPr>
               <w:spacing w:after="160"/>
             </w:pPr>
-            <w:commentRangeStart w:id="4"/>
+            <w:commentRangeStart w:id="5"/>
             <w:r>
               <w:t>6.</w:t>
             </w:r>
@@ -3702,30 +3404,30 @@
             <w:pPr>
               <w:spacing w:after="160"/>
             </w:pPr>
-            <w:commentRangeStart w:id="5"/>
+            <w:commentRangeStart w:id="6"/>
             <w:r>
               <w:t xml:space="preserve">Infections averted when 100% of eligible pop is </w:t>
             </w:r>
             <w:r>
               <w:t>on prep is equal to when 150% is on</w:t>
             </w:r>
-            <w:commentRangeEnd w:id="4"/>
+            <w:commentRangeEnd w:id="5"/>
             <w:r>
               <w:rPr>
                 <w:rStyle w:val="CommentReference"/>
                 <w:sz w:val="24"/>
                 <w:szCs w:val="24"/>
               </w:rPr>
-              <w:commentReference w:id="4"/>
-            </w:r>
-            <w:commentRangeEnd w:id="5"/>
+              <w:commentReference w:id="5"/>
+            </w:r>
+            <w:commentRangeEnd w:id="6"/>
             <w:r>
               <w:rPr>
                 <w:rStyle w:val="CommentReference"/>
                 <w:sz w:val="24"/>
                 <w:szCs w:val="24"/>
               </w:rPr>
-              <w:commentReference w:id="5"/>
+              <w:commentReference w:id="6"/>
             </w:r>
           </w:p>
         </w:tc>
@@ -4119,6 +3821,7 @@
               <w:spacing w:after="160"/>
             </w:pPr>
             <w:r>
+              <w:lastRenderedPageBreak/>
               <w:t>4</w:t>
             </w:r>
             <w:r>
@@ -4336,7 +4039,6 @@
               <w:spacing w:after="160"/>
             </w:pPr>
             <w:r>
-              <w:lastRenderedPageBreak/>
               <w:t>2.</w:t>
             </w:r>
           </w:p>
@@ -4932,6 +4634,7 @@
                 <w:b/>
                 <w:bCs/>
               </w:rPr>
+              <w:lastRenderedPageBreak/>
               <w:t>#</w:t>
             </w:r>
           </w:p>
@@ -5355,21 +5058,21 @@
       <w:pPr>
         <w:pStyle w:val="Heading2"/>
       </w:pPr>
-      <w:commentRangeStart w:id="6"/>
+      <w:commentRangeStart w:id="7"/>
       <w:r>
         <w:t xml:space="preserve">Test set: </w:t>
       </w:r>
       <w:r>
         <w:t>Testing Interventions</w:t>
       </w:r>
-      <w:commentRangeEnd w:id="6"/>
+      <w:commentRangeEnd w:id="7"/>
       <w:r>
         <w:rPr>
           <w:rStyle w:val="CommentReference"/>
           <w:sz w:val="28"/>
           <w:szCs w:val="28"/>
         </w:rPr>
-        <w:commentReference w:id="6"/>
+        <w:commentReference w:id="7"/>
       </w:r>
     </w:p>
     <w:p>
@@ -5622,6 +5325,7 @@
               <w:spacing w:after="160"/>
             </w:pPr>
             <w:r>
+              <w:lastRenderedPageBreak/>
               <w:t>1.</w:t>
             </w:r>
           </w:p>
@@ -5747,18 +5451,18 @@
       <w:pPr>
         <w:pStyle w:val="Heading4"/>
       </w:pPr>
-      <w:commentRangeStart w:id="7"/>
+      <w:commentRangeStart w:id="8"/>
       <w:r>
         <w:t>Basic test functionality</w:t>
       </w:r>
-      <w:commentRangeEnd w:id="7"/>
+      <w:commentRangeEnd w:id="8"/>
       <w:r>
         <w:rPr>
           <w:rStyle w:val="CommentReference"/>
           <w:sz w:val="24"/>
           <w:szCs w:val="24"/>
         </w:rPr>
-        <w:commentReference w:id="7"/>
+        <w:commentReference w:id="8"/>
       </w:r>
     </w:p>
     <w:tbl>
@@ -5793,7 +5497,6 @@
                 <w:b/>
                 <w:bCs/>
               </w:rPr>
-              <w:lastRenderedPageBreak/>
               <w:t>#</w:t>
             </w:r>
           </w:p>
@@ -6308,6 +6011,7 @@
               <w:spacing w:after="160"/>
             </w:pPr>
             <w:r>
+              <w:lastRenderedPageBreak/>
               <w:t>3</w:t>
             </w:r>
           </w:p>
@@ -6485,7 +6189,6 @@
               <w:spacing w:after="160"/>
             </w:pPr>
             <w:r>
-              <w:lastRenderedPageBreak/>
               <w:t>1.</w:t>
             </w:r>
           </w:p>
@@ -6909,6 +6612,7 @@
               <w:spacing w:after="160"/>
             </w:pPr>
             <w:r>
+              <w:lastRenderedPageBreak/>
               <w:t>422</w:t>
             </w:r>
           </w:p>
@@ -6940,6 +6644,7 @@
               <w:spacing w:after="160"/>
             </w:pPr>
             <w:r>
+              <w:lastRenderedPageBreak/>
               <w:t>2</w:t>
             </w:r>
             <w:r>
@@ -7108,7 +6813,6 @@
               <w:spacing w:after="160"/>
             </w:pPr>
             <w:r>
-              <w:lastRenderedPageBreak/>
               <w:t>4</w:t>
             </w:r>
           </w:p>
@@ -7683,6 +7387,7 @@
               <w:spacing w:after="160"/>
             </w:pPr>
             <w:r>
+              <w:lastRenderedPageBreak/>
               <w:t>1.</w:t>
             </w:r>
           </w:p>
@@ -7810,7 +7515,6 @@
         <w:spacing w:after="160"/>
       </w:pPr>
       <w:r>
-        <w:lastRenderedPageBreak/>
         <w:t xml:space="preserve">Tests that changes in </w:t>
       </w:r>
       <w:r>
@@ -8155,7 +7859,11 @@
               <w:t>scales up (doubles)</w:t>
             </w:r>
             <w:r>
-              <w:t xml:space="preserve"> VL coverage over baseline (80% vs 40%) should have double the additional suppressed</w:t>
+              <w:t xml:space="preserve"> VL </w:t>
+            </w:r>
+            <w:r>
+              <w:lastRenderedPageBreak/>
+              <w:t>coverage over baseline (80% vs 40%) should have double the additional suppressed</w:t>
             </w:r>
           </w:p>
         </w:tc>
@@ -8168,6 +7876,7 @@
               <w:spacing w:after="160"/>
             </w:pPr>
             <w:r>
+              <w:lastRenderedPageBreak/>
               <w:t>Additional_suppressed_scen_1 = 2*Additional_suppressed_base</w:t>
             </w:r>
           </w:p>
@@ -8202,11 +7911,7 @@
               <w:t xml:space="preserve"> </w:t>
             </w:r>
             <w:r>
-              <w:t xml:space="preserve">Intervention which scales down VL testing should scale down additional </w:t>
-            </w:r>
-            <w:r>
-              <w:lastRenderedPageBreak/>
-              <w:t>suppressed (</w:t>
+              <w:t>Intervention which scales down VL testing should scale down additional suppressed (</w:t>
             </w:r>
             <w:r>
               <w:t>20% vs 60%)</w:t>
@@ -8222,7 +7927,6 @@
               <w:spacing w:after="160"/>
             </w:pPr>
             <w:r>
-              <w:lastRenderedPageBreak/>
               <w:t xml:space="preserve">Additional_suppressed_scen_1 = </w:t>
             </w:r>
             <w:r>
@@ -8495,6 +8199,1464 @@
               </w:rPr>
               <w:t>0 i</w:t>
             </w:r>
+          </w:p>
+        </w:tc>
+      </w:tr>
+    </w:tbl>
+    <w:p/>
+    <w:p/>
+    <w:p>
+      <w:pPr>
+        <w:pStyle w:val="Heading2"/>
+      </w:pPr>
+      <w:r>
+        <w:t xml:space="preserve">Test set: </w:t>
+      </w:r>
+      <w:r>
+        <w:t>Mortality, AHD and OI</w:t>
+      </w:r>
+    </w:p>
+    <w:p>
+      <w:pPr>
+        <w:pStyle w:val="Heading3"/>
+      </w:pPr>
+      <w:r>
+        <w:t>Purpose</w:t>
+      </w:r>
+    </w:p>
+    <w:p>
+      <w:pPr>
+        <w:spacing w:after="160"/>
+      </w:pPr>
+      <w:r>
+        <w:t xml:space="preserve">Tests </w:t>
+      </w:r>
+      <w:r>
+        <w:t xml:space="preserve">basic mortality assumptions as well as the impact of certain interventions like the AHD package and OI testing and management. </w:t>
+      </w:r>
+    </w:p>
+    <w:p>
+      <w:pPr>
+        <w:pStyle w:val="Heading3"/>
+      </w:pPr>
+      <w:r>
+        <w:t>Test Logic</w:t>
+      </w:r>
+    </w:p>
+    <w:p>
+      <w:pPr>
+        <w:spacing w:after="160"/>
+      </w:pPr>
+      <w:r>
+        <w:t xml:space="preserve">Uses a standardized population with the following parameters: 1,000,000 total population, 5% HIV prevalence (50,000 PLHIV), 80% diagnosed, 75% on ART, 85% </w:t>
+      </w:r>
+      <w:r>
+        <w:lastRenderedPageBreak/>
+        <w:t xml:space="preserve">virally suppressed, </w:t>
+      </w:r>
+      <w:r>
+        <w:t>2500</w:t>
+      </w:r>
+      <w:r>
+        <w:t xml:space="preserve"> new infections per year, 1,000 AIDS deaths per year, crude birth rate 2</w:t>
+      </w:r>
+      <w:r>
+        <w:t>5</w:t>
+      </w:r>
+      <w:r>
+        <w:t xml:space="preserve"> per 1000, 49% of population male ,and 40% of population under 15.</w:t>
+      </w:r>
+    </w:p>
+    <w:p>
+      <w:pPr>
+        <w:spacing w:after="160"/>
+      </w:pPr>
+      <w:r>
+        <w:rPr>
+          <w:b/>
+          <w:bCs/>
+        </w:rPr>
+        <w:t>MORTALITY_RATES</w:t>
+      </w:r>
+      <w:r>
+        <w:rPr>
+          <w:b/>
+          <w:bCs/>
+        </w:rPr>
+        <w:t>:</w:t>
+      </w:r>
+      <w:r>
+        <w:t xml:space="preserve"> </w:t>
+      </w:r>
+      <w:r>
+        <w:t>untreated_undiagnosed = 0.10,</w:t>
+      </w:r>
+      <w:r>
+        <w:t xml:space="preserve"> </w:t>
+      </w:r>
+      <w:r>
+        <w:t>new_art_initiations=0.06, treated= 0.008,</w:t>
+      </w:r>
+      <w:r>
+        <w:t xml:space="preserve"> </w:t>
+      </w:r>
+      <w:r>
+        <w:t>suppressed = 0.003,</w:t>
+      </w:r>
+      <w:r>
+        <w:t xml:space="preserve"> </w:t>
+      </w:r>
+      <w:r>
+        <w:t>ahd= 0.20</w:t>
+      </w:r>
+    </w:p>
+    <w:p>
+      <w:pPr>
+        <w:spacing w:after="160"/>
+      </w:pPr>
+      <w:r>
+        <w:rPr>
+          <w:b/>
+          <w:bCs/>
+        </w:rPr>
+        <w:t xml:space="preserve">Proportion AHD: </w:t>
+      </w:r>
+      <w:r>
+        <w:t>undiagnosed= 0.20,</w:t>
+      </w:r>
+      <w:r>
+        <w:t xml:space="preserve"> </w:t>
+      </w:r>
+      <w:r>
+        <w:t>diagnosed_not_art</w:t>
+      </w:r>
+      <w:r>
+        <w:t xml:space="preserve"> </w:t>
+      </w:r>
+      <w:r>
+        <w:t>= 0.20,</w:t>
+      </w:r>
+      <w:r>
+        <w:t xml:space="preserve"> </w:t>
+      </w:r>
+      <w:r>
+        <w:t>new_initiations= 0.20,</w:t>
+      </w:r>
+    </w:p>
+    <w:p>
+      <w:pPr>
+        <w:spacing w:after="160"/>
+      </w:pPr>
+      <w:r>
+        <w:t>established_treated = 0.00,</w:t>
+      </w:r>
+      <w:r>
+        <w:t xml:space="preserve"> </w:t>
+      </w:r>
+      <w:r>
+        <w:t>established_supp    = 0.00</w:t>
+      </w:r>
+    </w:p>
+    <w:p/>
+    <w:tbl>
+      <w:tblPr>
+        <w:tblStyle w:val="TableGrid"/>
+        <w:tblW w:w="0" w:type="auto"/>
+        <w:tblLook w:val="04A0" w:firstRow="1" w:lastRow="0" w:firstColumn="1" w:lastColumn="0" w:noHBand="0" w:noVBand="1"/>
+      </w:tblPr>
+      <w:tblGrid>
+        <w:gridCol w:w="549"/>
+        <w:gridCol w:w="2140"/>
+        <w:gridCol w:w="6462"/>
+      </w:tblGrid>
+      <w:tr>
+        <w:trPr>
+          <w:trHeight w:val="457"/>
+        </w:trPr>
+        <w:tc>
+          <w:tcPr>
+            <w:tcW w:w="549" w:type="dxa"/>
+          </w:tcPr>
+          <w:p>
+            <w:pPr>
+              <w:spacing w:after="160"/>
+              <w:rPr>
+                <w:b/>
+                <w:bCs/>
+              </w:rPr>
+            </w:pPr>
+            <w:r>
+              <w:rPr>
+                <w:b/>
+                <w:bCs/>
+              </w:rPr>
+              <w:t>#</w:t>
+            </w:r>
+          </w:p>
+        </w:tc>
+        <w:tc>
+          <w:tcPr>
+            <w:tcW w:w="2140" w:type="dxa"/>
+          </w:tcPr>
+          <w:p>
+            <w:pPr>
+              <w:spacing w:after="160"/>
+              <w:rPr>
+                <w:b/>
+                <w:bCs/>
+              </w:rPr>
+            </w:pPr>
+            <w:r>
+              <w:rPr>
+                <w:b/>
+                <w:bCs/>
+              </w:rPr>
+              <w:t>Description</w:t>
+            </w:r>
+          </w:p>
+        </w:tc>
+        <w:tc>
+          <w:tcPr>
+            <w:tcW w:w="6462" w:type="dxa"/>
+          </w:tcPr>
+          <w:p>
+            <w:pPr>
+              <w:spacing w:after="160"/>
+              <w:rPr>
+                <w:b/>
+                <w:bCs/>
+              </w:rPr>
+            </w:pPr>
+            <w:r>
+              <w:rPr>
+                <w:b/>
+                <w:bCs/>
+                <w:highlight w:val="yellow"/>
+              </w:rPr>
+              <w:t>Test Calculation/expectation</w:t>
+            </w:r>
+          </w:p>
+        </w:tc>
+      </w:tr>
+      <w:tr>
+        <w:trPr>
+          <w:trHeight w:val="457"/>
+        </w:trPr>
+        <w:tc>
+          <w:tcPr>
+            <w:tcW w:w="549" w:type="dxa"/>
+          </w:tcPr>
+          <w:p>
+            <w:pPr>
+              <w:spacing w:after="160"/>
+            </w:pPr>
+            <w:r>
+              <w:t>1.</w:t>
+            </w:r>
+          </w:p>
+        </w:tc>
+        <w:tc>
+          <w:tcPr>
+            <w:tcW w:w="2140" w:type="dxa"/>
+          </w:tcPr>
+          <w:p>
+            <w:pPr>
+              <w:spacing w:after="160"/>
+            </w:pPr>
+            <w:r>
+              <w:t>All mortality rates set to 0</w:t>
+            </w:r>
+          </w:p>
+        </w:tc>
+        <w:tc>
+          <w:tcPr>
+            <w:tcW w:w="6462" w:type="dxa"/>
+          </w:tcPr>
+          <w:p>
+            <w:pPr>
+              <w:spacing w:after="160"/>
+            </w:pPr>
+            <w:r>
+              <w:t>Deaths = 0</w:t>
+            </w:r>
+          </w:p>
+          <w:p>
+            <w:pPr>
+              <w:spacing w:after="160"/>
+            </w:pPr>
+            <w:r>
+              <w:t>Deaths averted = 0</w:t>
+            </w:r>
+          </w:p>
+        </w:tc>
+      </w:tr>
+      <w:tr>
+        <w:trPr>
+          <w:trHeight w:val="457"/>
+        </w:trPr>
+        <w:tc>
+          <w:tcPr>
+            <w:tcW w:w="549" w:type="dxa"/>
+          </w:tcPr>
+          <w:p>
+            <w:pPr>
+              <w:spacing w:after="160"/>
+            </w:pPr>
+            <w:r>
+              <w:t>2.</w:t>
+            </w:r>
+          </w:p>
+        </w:tc>
+        <w:tc>
+          <w:tcPr>
+            <w:tcW w:w="2140" w:type="dxa"/>
+          </w:tcPr>
+          <w:p>
+            <w:pPr>
+              <w:spacing w:after="160"/>
+            </w:pPr>
+            <w:r>
+              <w:t>Mortality of untreated groups</w:t>
+            </w:r>
+            <w:r>
+              <w:t xml:space="preserve"> </w:t>
+            </w:r>
+            <w:r>
+              <w:t>including the effects of AHD</w:t>
+            </w:r>
+            <w:r>
+              <w:t>– total deaths are sum of undiagnosed and diagnosed not on ART</w:t>
+            </w:r>
+          </w:p>
+        </w:tc>
+        <w:tc>
+          <w:tcPr>
+            <w:tcW w:w="6462" w:type="dxa"/>
+          </w:tcPr>
+          <w:p>
+            <w:pPr>
+              <w:spacing w:after="160"/>
+            </w:pPr>
+            <w:r>
+              <w:t>expected_total &lt;- expected_deaths_undiag + expected_deaths_diag_not_art</w:t>
+            </w:r>
+          </w:p>
+          <w:p>
+            <w:pPr>
+              <w:spacing w:after="160"/>
+            </w:pPr>
+          </w:p>
+          <w:p>
+            <w:pPr>
+              <w:spacing w:after="160"/>
+            </w:pPr>
+            <w:r>
+              <w:t>expected_deaths_undiag &lt;- calc_deaths_expected(n_undiag,0.10, 0.20, 0.20)</w:t>
+            </w:r>
+          </w:p>
+          <w:p>
+            <w:pPr>
+              <w:spacing w:after="160"/>
+            </w:pPr>
+            <w:r>
+              <w:t>expected_deaths_diag_not_art &lt;- calc_deaths_expected(n_diag_not_art, 0.10, 0.20, 0.20)</w:t>
+            </w:r>
+          </w:p>
+          <w:p>
+            <w:pPr>
+              <w:spacing w:after="160"/>
+            </w:pPr>
+          </w:p>
+          <w:p>
+            <w:pPr>
+              <w:spacing w:after="160"/>
+            </w:pPr>
+            <w:r>
+              <w:t>expected_total</w:t>
+            </w:r>
+            <w:r>
+              <w:t xml:space="preserve"> =2400</w:t>
+            </w:r>
+            <w:r>
+              <w:t xml:space="preserve"> (1200+1200)</w:t>
+            </w:r>
+          </w:p>
+        </w:tc>
+      </w:tr>
+      <w:tr>
+        <w:trPr>
+          <w:trHeight w:val="457"/>
+        </w:trPr>
+        <w:tc>
+          <w:tcPr>
+            <w:tcW w:w="549" w:type="dxa"/>
+          </w:tcPr>
+          <w:p>
+            <w:pPr>
+              <w:spacing w:after="160"/>
+            </w:pPr>
+          </w:p>
+        </w:tc>
+        <w:tc>
+          <w:tcPr>
+            <w:tcW w:w="2140" w:type="dxa"/>
+          </w:tcPr>
+          <w:p>
+            <w:pPr>
+              <w:spacing w:after="160"/>
+            </w:pPr>
+          </w:p>
+        </w:tc>
+        <w:tc>
+          <w:tcPr>
+            <w:tcW w:w="6462" w:type="dxa"/>
+          </w:tcPr>
+          <w:p>
+            <w:pPr>
+              <w:spacing w:after="160"/>
+            </w:pPr>
+          </w:p>
+        </w:tc>
+      </w:tr>
+      <w:tr>
+        <w:trPr>
+          <w:trHeight w:val="457"/>
+        </w:trPr>
+        <w:tc>
+          <w:tcPr>
+            <w:tcW w:w="549" w:type="dxa"/>
+          </w:tcPr>
+          <w:p>
+            <w:pPr>
+              <w:spacing w:after="160"/>
+            </w:pPr>
+            <w:r>
+              <w:t>4.</w:t>
+            </w:r>
+          </w:p>
+        </w:tc>
+        <w:tc>
+          <w:tcPr>
+            <w:tcW w:w="2140" w:type="dxa"/>
+          </w:tcPr>
+          <w:p>
+            <w:pPr>
+              <w:spacing w:after="160"/>
+            </w:pPr>
+            <w:r>
+              <w:t>Established on treatment</w:t>
+            </w:r>
+            <w:r>
+              <w:t xml:space="preserve"> (not suppressed)</w:t>
+            </w:r>
+            <w:r>
+              <w:t xml:space="preserve"> use</w:t>
+            </w:r>
+            <w:r>
+              <w:t>s</w:t>
+            </w:r>
+            <w:r>
+              <w:t xml:space="preserve"> treated mortality rate and assumption of 0 AHD</w:t>
+            </w:r>
+          </w:p>
+        </w:tc>
+        <w:tc>
+          <w:tcPr>
+            <w:tcW w:w="6462" w:type="dxa"/>
+          </w:tcPr>
+          <w:p>
+            <w:pPr>
+              <w:spacing w:after="160"/>
+            </w:pPr>
+            <w:r>
+              <w:t>Expected_deaths = n_</w:t>
+            </w:r>
+            <w:r>
+              <w:t>treated_established *0.</w:t>
+            </w:r>
+            <w:r>
+              <w:t>0</w:t>
+            </w:r>
+            <w:r>
+              <w:t>08</w:t>
+            </w:r>
+          </w:p>
+          <w:p>
+            <w:pPr>
+              <w:spacing w:after="160"/>
+            </w:pPr>
+            <w:r>
+              <w:t>Expected_deaths =</w:t>
+            </w:r>
+            <w:r>
+              <w:t>36</w:t>
+            </w:r>
+          </w:p>
+          <w:p>
+            <w:pPr>
+              <w:spacing w:after="160"/>
+            </w:pPr>
+            <w:r>
+              <w:t>Expected_deaths</w:t>
+            </w:r>
+            <w:r>
+              <w:t xml:space="preserve"> = end_deaths</w:t>
+            </w:r>
+          </w:p>
+        </w:tc>
+      </w:tr>
+      <w:tr>
+        <w:trPr>
+          <w:trHeight w:val="457"/>
+        </w:trPr>
+        <w:tc>
+          <w:tcPr>
+            <w:tcW w:w="549" w:type="dxa"/>
+          </w:tcPr>
+          <w:p>
+            <w:pPr>
+              <w:spacing w:after="160"/>
+            </w:pPr>
+            <w:r>
+              <w:t>5</w:t>
+            </w:r>
+          </w:p>
+        </w:tc>
+        <w:tc>
+          <w:tcPr>
+            <w:tcW w:w="2140" w:type="dxa"/>
+          </w:tcPr>
+          <w:p>
+            <w:pPr>
+              <w:spacing w:after="160"/>
+            </w:pPr>
+            <w:r>
+              <w:t xml:space="preserve">Established </w:t>
+            </w:r>
+            <w:r>
+              <w:t>suppressed</w:t>
+            </w:r>
+            <w:r>
+              <w:t xml:space="preserve"> uses treated mortality rate and assumption of 0 AHD</w:t>
+            </w:r>
+          </w:p>
+        </w:tc>
+        <w:tc>
+          <w:tcPr>
+            <w:tcW w:w="6462" w:type="dxa"/>
+          </w:tcPr>
+          <w:p>
+            <w:pPr>
+              <w:spacing w:after="160"/>
+            </w:pPr>
+            <w:r>
+              <w:t>Expected_deaths = n_</w:t>
+            </w:r>
+            <w:r>
+              <w:t>suppressed</w:t>
+            </w:r>
+            <w:r>
+              <w:t xml:space="preserve"> *0.</w:t>
+            </w:r>
+            <w:r>
+              <w:t>0</w:t>
+            </w:r>
+            <w:r>
+              <w:t>0</w:t>
+            </w:r>
+            <w:r>
+              <w:t>3</w:t>
+            </w:r>
+          </w:p>
+          <w:p>
+            <w:pPr>
+              <w:spacing w:after="160"/>
+            </w:pPr>
+            <w:r>
+              <w:t>Expected_deaths =36</w:t>
+            </w:r>
+          </w:p>
+          <w:p>
+            <w:pPr>
+              <w:spacing w:after="160"/>
+            </w:pPr>
+            <w:r>
+              <w:t>Expected_deaths = end_deaths</w:t>
+            </w:r>
+          </w:p>
+        </w:tc>
+      </w:tr>
+      <w:tr>
+        <w:trPr>
+          <w:trHeight w:val="457"/>
+        </w:trPr>
+        <w:tc>
+          <w:tcPr>
+            <w:tcW w:w="549" w:type="dxa"/>
+          </w:tcPr>
+          <w:p>
+            <w:pPr>
+              <w:spacing w:after="160"/>
+            </w:pPr>
+            <w:r>
+              <w:t>6.</w:t>
+            </w:r>
+          </w:p>
+        </w:tc>
+        <w:tc>
+          <w:tcPr>
+            <w:tcW w:w="2140" w:type="dxa"/>
+          </w:tcPr>
+          <w:p>
+            <w:pPr>
+              <w:spacing w:after="160"/>
+            </w:pPr>
+            <w:r>
+              <w:t xml:space="preserve">AHD mortality rate has no effect on mortality of established </w:t>
+            </w:r>
+            <w:r>
+              <w:lastRenderedPageBreak/>
+              <w:t xml:space="preserve">groups (assumed </w:t>
+            </w:r>
+            <w:r>
+              <w:t>prop AHD 0</w:t>
+            </w:r>
+            <w:r>
+              <w:t>)</w:t>
+            </w:r>
+          </w:p>
+        </w:tc>
+        <w:tc>
+          <w:tcPr>
+            <w:tcW w:w="6462" w:type="dxa"/>
+          </w:tcPr>
+          <w:p>
+            <w:pPr>
+              <w:spacing w:after="160"/>
+            </w:pPr>
+            <w:r>
+              <w:lastRenderedPageBreak/>
+              <w:t>Deaths_low_AHD = Deaths_high_AHD</w:t>
+            </w:r>
+          </w:p>
+        </w:tc>
+      </w:tr>
+      <w:tr>
+        <w:trPr>
+          <w:trHeight w:val="457"/>
+        </w:trPr>
+        <w:tc>
+          <w:tcPr>
+            <w:tcW w:w="549" w:type="dxa"/>
+          </w:tcPr>
+          <w:p>
+            <w:pPr>
+              <w:spacing w:after="160"/>
+            </w:pPr>
+            <w:r>
+              <w:t>7.</w:t>
+            </w:r>
+          </w:p>
+        </w:tc>
+        <w:tc>
+          <w:tcPr>
+            <w:tcW w:w="2140" w:type="dxa"/>
+          </w:tcPr>
+          <w:p>
+            <w:pPr>
+              <w:spacing w:after="160"/>
+            </w:pPr>
+            <w:r>
+              <w:t>New initiations – cotrimoxazole reduces base mortality</w:t>
+            </w:r>
+            <w:r>
+              <w:t xml:space="preserve"> (assume no AHD mortality)</w:t>
+            </w:r>
+          </w:p>
+        </w:tc>
+        <w:tc>
+          <w:tcPr>
+            <w:tcW w:w="6462" w:type="dxa"/>
+          </w:tcPr>
+          <w:p>
+            <w:pPr>
+              <w:spacing w:after="160"/>
+            </w:pPr>
+            <w:r>
+              <w:t># With ahd=0: deaths_new = art_init * (1 - 0.20) * eff_base_rate</w:t>
+            </w:r>
+          </w:p>
+          <w:p>
+            <w:pPr>
+              <w:spacing w:after="160"/>
+            </w:pPr>
+            <w:r>
+              <w:t># Without cotrix: deaths_new = art_init * 0.80 * 0.10</w:t>
+            </w:r>
+          </w:p>
+          <w:p>
+            <w:pPr>
+              <w:spacing w:after="160"/>
+            </w:pPr>
+            <w:r>
+              <w:t># With cotrix 100% coverage, efficacy 0.50: eff_base = 0.10 * 0.50 = 0.05</w:t>
+            </w:r>
+          </w:p>
+          <w:p>
+            <w:pPr>
+              <w:spacing w:after="160"/>
+            </w:pPr>
+            <w:r>
+              <w:t># deaths_new = art_init * 0.80 * 0.05</w:t>
+            </w:r>
+          </w:p>
+          <w:p>
+            <w:pPr>
+              <w:spacing w:after="160"/>
+            </w:pPr>
+            <w:r>
+              <w:t xml:space="preserve">  expected_no</w:t>
+            </w:r>
+            <w:r>
+              <w:t>_ctx</w:t>
+            </w:r>
+            <w:r>
+              <w:t xml:space="preserve">   &lt;- round(art_init * 0.80 * 0.10)</w:t>
+            </w:r>
+          </w:p>
+          <w:p>
+            <w:pPr>
+              <w:spacing w:after="160"/>
+            </w:pPr>
+            <w:r>
+              <w:t xml:space="preserve">  expected_with</w:t>
+            </w:r>
+            <w:r>
+              <w:t>_ctx</w:t>
+            </w:r>
+            <w:r>
+              <w:t xml:space="preserve"> &lt;- round(art_init * 0.80 * 0.05)</w:t>
+            </w:r>
+          </w:p>
+        </w:tc>
+      </w:tr>
+      <w:tr>
+        <w:trPr>
+          <w:trHeight w:val="457"/>
+        </w:trPr>
+        <w:tc>
+          <w:tcPr>
+            <w:tcW w:w="549" w:type="dxa"/>
+          </w:tcPr>
+          <w:p>
+            <w:pPr>
+              <w:spacing w:after="160"/>
+            </w:pPr>
+            <w:r>
+              <w:t>8.</w:t>
+            </w:r>
+          </w:p>
+        </w:tc>
+        <w:tc>
+          <w:tcPr>
+            <w:tcW w:w="2140" w:type="dxa"/>
+          </w:tcPr>
+          <w:p>
+            <w:pPr>
+              <w:spacing w:after="160"/>
+            </w:pPr>
+            <w:r>
+              <w:t xml:space="preserve">New initiations – </w:t>
+            </w:r>
+            <w:r>
+              <w:t>OI management</w:t>
+            </w:r>
+            <w:r>
+              <w:t xml:space="preserve"> reduces base mortality (assume no AHD mortality)</w:t>
+            </w:r>
+          </w:p>
+        </w:tc>
+        <w:tc>
+          <w:tcPr>
+            <w:tcW w:w="6462" w:type="dxa"/>
+          </w:tcPr>
+          <w:p>
+            <w:pPr>
+              <w:spacing w:after="160"/>
+            </w:pPr>
+            <w:r>
+              <w:t>Expected deaths</w:t>
+            </w:r>
+            <w:r>
+              <w:t xml:space="preserve"> (OI)</w:t>
+            </w:r>
+            <w:r>
+              <w:t xml:space="preserve"> &lt;= </w:t>
+            </w:r>
+            <w:r>
+              <w:t>expected deaths (no OI)</w:t>
+            </w:r>
+          </w:p>
+          <w:p>
+            <w:pPr>
+              <w:spacing w:after="160"/>
+            </w:pPr>
+            <w:r>
+              <w:t># eff_base = 0.10 * (1 - 0.40) = 0.06</w:t>
+            </w:r>
+          </w:p>
+          <w:p>
+            <w:pPr>
+              <w:spacing w:after="160"/>
+            </w:pPr>
+            <w:r>
+              <w:t xml:space="preserve">  expected_no   &lt;- round(art_init * 0.80 * 0.10)</w:t>
+            </w:r>
+          </w:p>
+          <w:p>
+            <w:pPr>
+              <w:spacing w:after="160"/>
+            </w:pPr>
+            <w:r>
+              <w:t xml:space="preserve">  expected_with &lt;- round(art_init * 0.80 * 0.06)</w:t>
+            </w:r>
+          </w:p>
+        </w:tc>
+      </w:tr>
+      <w:tr>
+        <w:trPr>
+          <w:trHeight w:val="457"/>
+        </w:trPr>
+        <w:tc>
+          <w:tcPr>
+            <w:tcW w:w="549" w:type="dxa"/>
+          </w:tcPr>
+          <w:p>
+            <w:pPr>
+              <w:spacing w:after="160"/>
+            </w:pPr>
+            <w:r>
+              <w:t>9</w:t>
+            </w:r>
+          </w:p>
+        </w:tc>
+        <w:tc>
+          <w:tcPr>
+            <w:tcW w:w="2140" w:type="dxa"/>
+          </w:tcPr>
+          <w:p>
+            <w:pPr>
+              <w:spacing w:after="160"/>
+            </w:pPr>
+            <w:r>
+              <w:t xml:space="preserve">New </w:t>
+            </w:r>
+            <w:r>
+              <w:t>initiations</w:t>
+            </w:r>
+            <w:r>
+              <w:t xml:space="preserve"> – multiplicative effect of combined OI and cotrimoxazole</w:t>
+            </w:r>
+          </w:p>
+        </w:tc>
+        <w:tc>
+          <w:tcPr>
+            <w:tcW w:w="6462" w:type="dxa"/>
+          </w:tcPr>
+          <w:p>
+            <w:pPr>
+              <w:spacing w:after="160"/>
+            </w:pPr>
+            <w:r>
+              <w:t>eff_base = base_rate × (1 − cotrix_cov × cotrix_eff) × (1 − oi_cov × oi_eff)</w:t>
+            </w:r>
+          </w:p>
+          <w:p>
+            <w:pPr>
+              <w:spacing w:after="160"/>
+            </w:pPr>
+          </w:p>
+          <w:p>
+            <w:pPr>
+              <w:spacing w:after="160"/>
+            </w:pPr>
+            <w:r>
+              <w:t>Checks:</w:t>
+            </w:r>
+          </w:p>
+          <w:p>
+            <w:pPr>
+              <w:pStyle w:val="ListParagraph"/>
+              <w:numPr>
+                <w:ilvl w:val="0"/>
+                <w:numId w:val="14"/>
+              </w:numPr>
+              <w:spacing w:after="160"/>
+            </w:pPr>
+            <w:r>
+              <w:t>100% coverage of both outputs expected</w:t>
+            </w:r>
+          </w:p>
+          <w:p>
+            <w:pPr>
+              <w:pStyle w:val="ListParagraph"/>
+              <w:numPr>
+                <w:ilvl w:val="0"/>
+                <w:numId w:val="14"/>
+              </w:numPr>
+              <w:spacing w:after="160"/>
+            </w:pPr>
+            <w:r>
+              <w:t>Partial coverage:</w:t>
+            </w:r>
+          </w:p>
+          <w:p>
+            <w:pPr>
+              <w:pStyle w:val="ListParagraph"/>
+              <w:numPr>
+                <w:ilvl w:val="1"/>
+                <w:numId w:val="14"/>
+              </w:numPr>
+              <w:spacing w:after="160"/>
+            </w:pPr>
+            <w:r>
+              <w:t>Outputs expected</w:t>
+            </w:r>
+          </w:p>
+          <w:p>
+            <w:pPr>
+              <w:pStyle w:val="ListParagraph"/>
+              <w:numPr>
+                <w:ilvl w:val="1"/>
+                <w:numId w:val="14"/>
+              </w:numPr>
+              <w:spacing w:after="160"/>
+            </w:pPr>
+            <w:r>
+              <w:t>Fewer deaths than no coverage</w:t>
+            </w:r>
+          </w:p>
+          <w:p>
+            <w:pPr>
+              <w:pStyle w:val="ListParagraph"/>
+              <w:numPr>
+                <w:ilvl w:val="1"/>
+                <w:numId w:val="14"/>
+              </w:numPr>
+              <w:spacing w:after="160"/>
+            </w:pPr>
+            <w:r>
+              <w:t>More deaths than full coverage</w:t>
+            </w:r>
+          </w:p>
+          <w:p>
+            <w:pPr>
+              <w:pStyle w:val="ListParagraph"/>
+              <w:numPr>
+                <w:ilvl w:val="0"/>
+                <w:numId w:val="14"/>
+              </w:numPr>
+              <w:spacing w:after="160"/>
+            </w:pPr>
+            <w:r>
+              <w:t>Double cotrimoxazole coverage</w:t>
+            </w:r>
+          </w:p>
+          <w:p>
+            <w:pPr>
+              <w:pStyle w:val="ListParagraph"/>
+              <w:numPr>
+                <w:ilvl w:val="1"/>
+                <w:numId w:val="14"/>
+              </w:numPr>
+              <w:spacing w:after="160"/>
+            </w:pPr>
+            <w:r>
+              <w:t>Fewer deaths at higher coverage</w:t>
+            </w:r>
+          </w:p>
+        </w:tc>
+      </w:tr>
+      <w:tr>
+        <w:trPr>
+          <w:trHeight w:val="457"/>
+        </w:trPr>
+        <w:tc>
+          <w:tcPr>
+            <w:tcW w:w="549" w:type="dxa"/>
+          </w:tcPr>
+          <w:p>
+            <w:pPr>
+              <w:spacing w:after="160"/>
+            </w:pPr>
+            <w:r>
+              <w:t>10</w:t>
+            </w:r>
+          </w:p>
+        </w:tc>
+        <w:tc>
+          <w:tcPr>
+            <w:tcW w:w="2140" w:type="dxa"/>
+          </w:tcPr>
+          <w:p>
+            <w:pPr>
+              <w:spacing w:after="160"/>
+            </w:pPr>
+            <w:r>
+              <w:t xml:space="preserve">CTX and OI do not impacts </w:t>
+            </w:r>
+            <w:r>
+              <w:t>mortality among other groups</w:t>
+            </w:r>
+          </w:p>
+        </w:tc>
+        <w:tc>
+          <w:tcPr>
+            <w:tcW w:w="6462" w:type="dxa"/>
+          </w:tcPr>
+          <w:p>
+            <w:pPr>
+              <w:spacing w:after="160"/>
+            </w:pPr>
+            <w:r>
+              <w:t>Deaths Established (with CTX and OI) = Deaths Established (without CTX and OI)</w:t>
+            </w:r>
+          </w:p>
+        </w:tc>
+      </w:tr>
+      <w:tr>
+        <w:trPr>
+          <w:trHeight w:val="457"/>
+        </w:trPr>
+        <w:tc>
+          <w:tcPr>
+            <w:tcW w:w="549" w:type="dxa"/>
+          </w:tcPr>
+          <w:p>
+            <w:pPr>
+              <w:spacing w:after="160"/>
+            </w:pPr>
+            <w:r>
+              <w:t>11</w:t>
+            </w:r>
+          </w:p>
+        </w:tc>
+        <w:tc>
+          <w:tcPr>
+            <w:tcW w:w="2140" w:type="dxa"/>
+          </w:tcPr>
+          <w:p>
+            <w:pPr>
+              <w:spacing w:after="160"/>
+            </w:pPr>
+            <w:r>
+              <w:t>AHD package has zero effect without CD4 testing</w:t>
+            </w:r>
+          </w:p>
+        </w:tc>
+        <w:tc>
+          <w:tcPr>
+            <w:tcW w:w="6462" w:type="dxa"/>
+          </w:tcPr>
+          <w:p>
+            <w:pPr>
+              <w:spacing w:after="160"/>
+            </w:pPr>
+            <w:r>
+              <w:t>Deaths without interventions = deaths with AHD but no CD4</w:t>
+            </w:r>
+          </w:p>
+        </w:tc>
+      </w:tr>
+      <w:tr>
+        <w:trPr>
+          <w:trHeight w:val="457"/>
+        </w:trPr>
+        <w:tc>
+          <w:tcPr>
+            <w:tcW w:w="549" w:type="dxa"/>
+          </w:tcPr>
+          <w:p>
+            <w:pPr>
+              <w:spacing w:after="160"/>
+            </w:pPr>
+            <w:r>
+              <w:lastRenderedPageBreak/>
+              <w:t>12</w:t>
+            </w:r>
+          </w:p>
+        </w:tc>
+        <w:tc>
+          <w:tcPr>
+            <w:tcW w:w="2140" w:type="dxa"/>
+          </w:tcPr>
+          <w:p>
+            <w:pPr>
+              <w:spacing w:after="160"/>
+            </w:pPr>
+            <w:r>
+              <w:t>AHD package with CD4 testing reduces AHD mortality for new initiations</w:t>
+            </w:r>
+          </w:p>
+        </w:tc>
+        <w:tc>
+          <w:tcPr>
+            <w:tcW w:w="6462" w:type="dxa"/>
+          </w:tcPr>
+          <w:p>
+            <w:pPr>
+              <w:spacing w:after="160"/>
+            </w:pPr>
+            <w:r>
+              <w:t>AHD and CD4 reduced deaths</w:t>
+            </w:r>
+          </w:p>
+        </w:tc>
+      </w:tr>
+      <w:tr>
+        <w:trPr>
+          <w:trHeight w:val="457"/>
+        </w:trPr>
+        <w:tc>
+          <w:tcPr>
+            <w:tcW w:w="549" w:type="dxa"/>
+          </w:tcPr>
+          <w:p>
+            <w:pPr>
+              <w:spacing w:after="160"/>
+            </w:pPr>
+            <w:r>
+              <w:t>13</w:t>
+            </w:r>
+          </w:p>
+        </w:tc>
+        <w:tc>
+          <w:tcPr>
+            <w:tcW w:w="2140" w:type="dxa"/>
+          </w:tcPr>
+          <w:p>
+            <w:pPr>
+              <w:spacing w:after="160"/>
+            </w:pPr>
+            <w:r>
+              <w:t>AHD package effect scales proportionally with CD4 coverage</w:t>
+            </w:r>
+          </w:p>
+        </w:tc>
+        <w:tc>
+          <w:tcPr>
+            <w:tcW w:w="6462" w:type="dxa"/>
+          </w:tcPr>
+          <w:p>
+            <w:pPr>
+              <w:spacing w:after="160"/>
+            </w:pPr>
+            <w:r>
+              <w:t>50% CD4 should give ~50% of the deaths averted vs 100% CD4</w:t>
+            </w:r>
+          </w:p>
+        </w:tc>
+      </w:tr>
+      <w:tr>
+        <w:trPr>
+          <w:trHeight w:val="457"/>
+        </w:trPr>
+        <w:tc>
+          <w:tcPr>
+            <w:tcW w:w="549" w:type="dxa"/>
+          </w:tcPr>
+          <w:p>
+            <w:pPr>
+              <w:spacing w:after="160"/>
+            </w:pPr>
+            <w:r>
+              <w:t>14</w:t>
+            </w:r>
+          </w:p>
+        </w:tc>
+        <w:tc>
+          <w:tcPr>
+            <w:tcW w:w="2140" w:type="dxa"/>
+          </w:tcPr>
+          <w:p>
+            <w:pPr>
+              <w:spacing w:after="160"/>
+            </w:pPr>
+            <w:r>
+              <w:t>No mortality interventions</w:t>
+            </w:r>
+          </w:p>
+        </w:tc>
+        <w:tc>
+          <w:tcPr>
+            <w:tcW w:w="6462" w:type="dxa"/>
+          </w:tcPr>
+          <w:p>
+            <w:pPr>
+              <w:spacing w:after="160"/>
+            </w:pPr>
+            <w:r>
+              <w:t>Deaths averted = 0</w:t>
+            </w:r>
+          </w:p>
+        </w:tc>
+      </w:tr>
+      <w:tr>
+        <w:trPr>
+          <w:trHeight w:val="457"/>
+        </w:trPr>
+        <w:tc>
+          <w:tcPr>
+            <w:tcW w:w="549" w:type="dxa"/>
+          </w:tcPr>
+          <w:p>
+            <w:pPr>
+              <w:spacing w:after="160"/>
+            </w:pPr>
+          </w:p>
+        </w:tc>
+        <w:tc>
+          <w:tcPr>
+            <w:tcW w:w="2140" w:type="dxa"/>
+          </w:tcPr>
+          <w:p>
+            <w:pPr>
+              <w:spacing w:after="160"/>
+            </w:pPr>
+          </w:p>
+        </w:tc>
+        <w:tc>
+          <w:tcPr>
+            <w:tcW w:w="6462" w:type="dxa"/>
+          </w:tcPr>
+          <w:p>
+            <w:pPr>
+              <w:spacing w:after="160"/>
+            </w:pPr>
+          </w:p>
+        </w:tc>
+      </w:tr>
+      <w:tr>
+        <w:trPr>
+          <w:trHeight w:val="457"/>
+        </w:trPr>
+        <w:tc>
+          <w:tcPr>
+            <w:tcW w:w="549" w:type="dxa"/>
+          </w:tcPr>
+          <w:p>
+            <w:pPr>
+              <w:spacing w:after="160"/>
+            </w:pPr>
+          </w:p>
+        </w:tc>
+        <w:tc>
+          <w:tcPr>
+            <w:tcW w:w="2140" w:type="dxa"/>
+          </w:tcPr>
+          <w:p>
+            <w:pPr>
+              <w:spacing w:after="160"/>
+            </w:pPr>
+          </w:p>
+        </w:tc>
+        <w:tc>
+          <w:tcPr>
+            <w:tcW w:w="6462" w:type="dxa"/>
+          </w:tcPr>
+          <w:p>
+            <w:pPr>
+              <w:spacing w:after="160"/>
+            </w:pPr>
+          </w:p>
+        </w:tc>
+      </w:tr>
+      <w:tr>
+        <w:trPr>
+          <w:trHeight w:val="457"/>
+        </w:trPr>
+        <w:tc>
+          <w:tcPr>
+            <w:tcW w:w="549" w:type="dxa"/>
+          </w:tcPr>
+          <w:p>
+            <w:pPr>
+              <w:spacing w:after="160"/>
+            </w:pPr>
+          </w:p>
+        </w:tc>
+        <w:tc>
+          <w:tcPr>
+            <w:tcW w:w="2140" w:type="dxa"/>
+          </w:tcPr>
+          <w:p>
+            <w:pPr>
+              <w:spacing w:after="160"/>
+            </w:pPr>
+          </w:p>
+        </w:tc>
+        <w:tc>
+          <w:tcPr>
+            <w:tcW w:w="6462" w:type="dxa"/>
+          </w:tcPr>
+          <w:p>
+            <w:pPr>
+              <w:spacing w:after="160"/>
+            </w:pPr>
+          </w:p>
+        </w:tc>
+      </w:tr>
+      <w:tr>
+        <w:trPr>
+          <w:trHeight w:val="457"/>
+        </w:trPr>
+        <w:tc>
+          <w:tcPr>
+            <w:tcW w:w="549" w:type="dxa"/>
+          </w:tcPr>
+          <w:p>
+            <w:pPr>
+              <w:spacing w:after="160"/>
+            </w:pPr>
+          </w:p>
+        </w:tc>
+        <w:tc>
+          <w:tcPr>
+            <w:tcW w:w="2140" w:type="dxa"/>
+          </w:tcPr>
+          <w:p>
+            <w:pPr>
+              <w:spacing w:after="160"/>
+            </w:pPr>
+          </w:p>
+        </w:tc>
+        <w:tc>
+          <w:tcPr>
+            <w:tcW w:w="6462" w:type="dxa"/>
+          </w:tcPr>
+          <w:p>
+            <w:pPr>
+              <w:spacing w:after="160"/>
+            </w:pPr>
+          </w:p>
+        </w:tc>
+      </w:tr>
+      <w:tr>
+        <w:trPr>
+          <w:trHeight w:val="457"/>
+        </w:trPr>
+        <w:tc>
+          <w:tcPr>
+            <w:tcW w:w="549" w:type="dxa"/>
+          </w:tcPr>
+          <w:p>
+            <w:pPr>
+              <w:spacing w:after="160"/>
+            </w:pPr>
+          </w:p>
+        </w:tc>
+        <w:tc>
+          <w:tcPr>
+            <w:tcW w:w="2140" w:type="dxa"/>
+          </w:tcPr>
+          <w:p>
+            <w:pPr>
+              <w:spacing w:after="160"/>
+            </w:pPr>
+          </w:p>
+        </w:tc>
+        <w:tc>
+          <w:tcPr>
+            <w:tcW w:w="6462" w:type="dxa"/>
+          </w:tcPr>
+          <w:p>
+            <w:pPr>
+              <w:spacing w:after="160"/>
+            </w:pPr>
+          </w:p>
+        </w:tc>
+      </w:tr>
+      <w:tr>
+        <w:trPr>
+          <w:trHeight w:val="457"/>
+        </w:trPr>
+        <w:tc>
+          <w:tcPr>
+            <w:tcW w:w="549" w:type="dxa"/>
+          </w:tcPr>
+          <w:p>
+            <w:pPr>
+              <w:spacing w:after="160"/>
+            </w:pPr>
+            <w:r>
+              <w:t>20</w:t>
+            </w:r>
+          </w:p>
+        </w:tc>
+        <w:tc>
+          <w:tcPr>
+            <w:tcW w:w="2140" w:type="dxa"/>
+          </w:tcPr>
+          <w:p>
+            <w:pPr>
+              <w:spacing w:after="160"/>
+            </w:pPr>
+            <w:r>
+              <w:t>More testing</w:t>
+            </w:r>
+            <w:r>
+              <w:t xml:space="preserve"> results in more initi</w:t>
+            </w:r>
+            <w:r>
+              <w:t>at</w:t>
+            </w:r>
+            <w:r>
+              <w:t xml:space="preserve">ions and more </w:t>
+            </w:r>
+            <w:r>
+              <w:t>deaths</w:t>
+            </w:r>
+            <w:r>
+              <w:t xml:space="preserve"> averted</w:t>
+            </w:r>
+          </w:p>
+        </w:tc>
+        <w:tc>
+          <w:tcPr>
+            <w:tcW w:w="6462" w:type="dxa"/>
+          </w:tcPr>
+          <w:p>
+            <w:pPr>
+              <w:spacing w:after="160"/>
+            </w:pPr>
+            <w:r>
+              <w:t xml:space="preserve">initiations </w:t>
+            </w:r>
+            <w:r>
+              <w:t xml:space="preserve">(high test) &gt; </w:t>
+            </w:r>
+            <w:r>
+              <w:t xml:space="preserve">initiations </w:t>
+            </w:r>
+            <w:r>
+              <w:t>(low test)</w:t>
+            </w:r>
+          </w:p>
+          <w:p>
+            <w:pPr>
+              <w:spacing w:after="160"/>
+            </w:pPr>
+            <w:r>
+              <w:t>deaths</w:t>
+            </w:r>
+            <w:r>
+              <w:t xml:space="preserve"> averted (high test) &gt; deaths averted (low test)</w:t>
+            </w:r>
+          </w:p>
+          <w:p>
+            <w:pPr>
+              <w:spacing w:after="160"/>
+            </w:pPr>
           </w:p>
         </w:tc>
       </w:tr>
@@ -8512,7 +9674,24 @@
 
 <file path=word/comments.xml><?xml version="1.0" encoding="utf-8"?>
 <w:comments xmlns:wpc="http://schemas.microsoft.com/office/word/2010/wordprocessingCanvas" xmlns:cx="http://schemas.microsoft.com/office/drawing/2014/chartex" xmlns:cx1="http://schemas.microsoft.com/office/drawing/2015/9/8/chartex" xmlns:cx2="http://schemas.microsoft.com/office/drawing/2015/10/21/chartex" xmlns:cx3="http://schemas.microsoft.com/office/drawing/2016/5/9/chartex" xmlns:cx4="http://schemas.microsoft.com/office/drawing/2016/5/10/chartex" xmlns:cx5="http://schemas.microsoft.com/office/drawing/2016/5/11/chartex" xmlns:cx6="http://schemas.microsoft.com/office/drawing/2016/5/12/chartex" xmlns:cx7="http://schemas.microsoft.com/office/drawing/2016/5/13/chartex" xmlns:cx8="http://schemas.microsoft.com/office/drawing/2016/5/14/chartex" xmlns:mc="http://schemas.openxmlformats.org/markup-compatibility/2006" xmlns:aink="http://schemas.microsoft.com/office/drawing/2016/ink" xmlns:am3d="http://schemas.microsoft.com/office/drawing/2017/model3d" xmlns:o="urn:schemas-microsoft-com:office:office" xmlns:oel="http://schemas.microsoft.com/office/2019/extlst" xmlns:r="http://schemas.openxmlformats.org/officeDocument/2006/relationships" xmlns:m="http://schemas.openxmlformats.org/officeDocument/2006/math" xmlns:v="urn:schemas-microsoft-com:vml" xmlns:wp14="http://schemas.microsoft.com/office/word/2010/wordprocessingDrawing" xmlns:wp="http://schemas.openxmlformats.org/drawingml/2006/wordprocessingDrawing" xmlns:w10="urn:schemas-microsoft-com:office:word" xmlns:w="http://schemas.openxmlformats.org/wordprocessingml/2006/main" xmlns:w14="http://schemas.microsoft.com/office/word/2010/wordml" xmlns:w15="http://schemas.microsoft.com/office/word/2012/wordml" xmlns:w16cex="http://schemas.microsoft.com/office/word/2018/wordml/cex" xmlns:w16cid="http://schemas.microsoft.com/office/word/2016/wordml/cid" xmlns:w16="http://schemas.microsoft.com/office/word/2018/wordml" xmlns:w16du="http://schemas.microsoft.com/office/word/2023/wordml/word16du" xmlns:w16sdtdh="http://schemas.microsoft.com/office/word/2020/wordml/sdtdatahash" xmlns:w16sdtfl="http://schemas.microsoft.com/office/word/2024/wordml/sdtformatlock" xmlns:w16se="http://schemas.microsoft.com/office/word/2015/wordml/symex" xmlns:wpg="http://schemas.microsoft.com/office/word/2010/wordprocessingGroup" xmlns:wpi="http://schemas.microsoft.com/office/word/2010/wordprocessingInk" xmlns:wne="http://schemas.microsoft.com/office/word/2006/wordml" xmlns:wps="http://schemas.microsoft.com/office/word/2010/wordprocessingShape" mc:Ignorable="w14 w15 w16se w16cid w16 w16cex w16sdtdh w16sdtfl w16du wp14">
-  <w:comment w:id="0" w:author="Alex de Nooy" w:date="2026-01-28T10:45:00Z" w:initials="Ad">
+  <w:comment w:id="0" w:author="Alex de Nooy" w:date="2026-03-09T14:32:00Z" w:initials="Ad">
+    <w:p>
+      <w:r>
+        <w:rPr>
+          <w:rStyle w:val="CommentReference"/>
+        </w:rPr>
+        <w:annotationRef/>
+      </w:r>
+      <w:r>
+        <w:rPr>
+          <w:sz w:val="20"/>
+          <w:szCs w:val="20"/>
+        </w:rPr>
+        <w:t>several HIV models, including thembisa, break down mortality by time on ART - with first year having higher mortality</w:t>
+      </w:r>
+    </w:p>
+  </w:comment>
+  <w:comment w:id="1" w:author="Alex de Nooy" w:date="2026-01-28T10:45:00Z" w:initials="Ad">
     <w:p>
       <w:r>
         <w:rPr>
@@ -8529,7 +9708,7 @@
       </w:r>
     </w:p>
   </w:comment>
-  <w:comment w:id="1" w:author="Alex de Nooy" w:date="2026-01-27T10:30:00Z" w:initials="Ad">
+  <w:comment w:id="2" w:author="Alex de Nooy" w:date="2026-01-27T10:30:00Z" w:initials="Ad">
     <w:p>
       <w:r>
         <w:rPr>
@@ -8546,7 +9725,7 @@
       </w:r>
     </w:p>
   </w:comment>
-  <w:comment w:id="2" w:author="Alex de Nooy" w:date="2026-01-26T16:26:00Z" w:initials="Ad">
+  <w:comment w:id="3" w:author="Alex de Nooy" w:date="2026-01-26T16:26:00Z" w:initials="Ad">
     <w:p>
       <w:r>
         <w:rPr>
@@ -8563,7 +9742,7 @@
       </w:r>
     </w:p>
   </w:comment>
-  <w:comment w:id="3" w:author="Alex de Nooy" w:date="2026-01-26T16:27:00Z" w:initials="Ad">
+  <w:comment w:id="4" w:author="Alex de Nooy" w:date="2026-01-26T16:27:00Z" w:initials="Ad">
     <w:p>
       <w:r>
         <w:rPr>
@@ -8580,7 +9759,7 @@
       </w:r>
     </w:p>
   </w:comment>
-  <w:comment w:id="4" w:author="Alex de Nooy" w:date="2026-01-27T09:18:00Z" w:initials="Ad">
+  <w:comment w:id="5" w:author="Alex de Nooy" w:date="2026-01-27T09:18:00Z" w:initials="Ad">
     <w:p>
       <w:r>
         <w:rPr>
@@ -8597,7 +9776,7 @@
       </w:r>
     </w:p>
   </w:comment>
-  <w:comment w:id="5" w:author="Alex de Nooy" w:date="2026-01-27T10:08:00Z" w:initials="Ad">
+  <w:comment w:id="6" w:author="Alex de Nooy" w:date="2026-01-27T10:08:00Z" w:initials="Ad">
     <w:p>
       <w:r>
         <w:rPr>
@@ -8614,7 +9793,7 @@
       </w:r>
     </w:p>
   </w:comment>
-  <w:comment w:id="6" w:author="Alex de Nooy" w:date="2026-02-06T09:47:00Z" w:initials="Ad">
+  <w:comment w:id="7" w:author="Alex de Nooy" w:date="2026-02-06T09:47:00Z" w:initials="Ad">
     <w:p>
       <w:r>
         <w:rPr>
@@ -8631,7 +9810,7 @@
       </w:r>
     </w:p>
   </w:comment>
-  <w:comment w:id="7" w:author="Alex de Nooy" w:date="2026-02-05T10:37:00Z" w:initials="Ad">
+  <w:comment w:id="8" w:author="Alex de Nooy" w:date="2026-02-05T10:37:00Z" w:initials="Ad">
     <w:p>
       <w:r>
         <w:rPr>
@@ -8653,6 +9832,7 @@
 
 <file path=word/commentsExtended.xml><?xml version="1.0" encoding="utf-8"?>
 <w15:commentsEx xmlns:wpc="http://schemas.microsoft.com/office/word/2010/wordprocessingCanvas" xmlns:cx="http://schemas.microsoft.com/office/drawing/2014/chartex" xmlns:cx1="http://schemas.microsoft.com/office/drawing/2015/9/8/chartex" xmlns:cx2="http://schemas.microsoft.com/office/drawing/2015/10/21/chartex" xmlns:cx3="http://schemas.microsoft.com/office/drawing/2016/5/9/chartex" xmlns:cx4="http://schemas.microsoft.com/office/drawing/2016/5/10/chartex" xmlns:cx5="http://schemas.microsoft.com/office/drawing/2016/5/11/chartex" xmlns:cx6="http://schemas.microsoft.com/office/drawing/2016/5/12/chartex" xmlns:cx7="http://schemas.microsoft.com/office/drawing/2016/5/13/chartex" xmlns:cx8="http://schemas.microsoft.com/office/drawing/2016/5/14/chartex" xmlns:mc="http://schemas.openxmlformats.org/markup-compatibility/2006" xmlns:aink="http://schemas.microsoft.com/office/drawing/2016/ink" xmlns:am3d="http://schemas.microsoft.com/office/drawing/2017/model3d" xmlns:o="urn:schemas-microsoft-com:office:office" xmlns:oel="http://schemas.microsoft.com/office/2019/extlst" xmlns:r="http://schemas.openxmlformats.org/officeDocument/2006/relationships" xmlns:m="http://schemas.openxmlformats.org/officeDocument/2006/math" xmlns:v="urn:schemas-microsoft-com:vml" xmlns:wp14="http://schemas.microsoft.com/office/word/2010/wordprocessingDrawing" xmlns:wp="http://schemas.openxmlformats.org/drawingml/2006/wordprocessingDrawing" xmlns:w10="urn:schemas-microsoft-com:office:word" xmlns:w="http://schemas.openxmlformats.org/wordprocessingml/2006/main" xmlns:w14="http://schemas.microsoft.com/office/word/2010/wordml" xmlns:w15="http://schemas.microsoft.com/office/word/2012/wordml" xmlns:w16cex="http://schemas.microsoft.com/office/word/2018/wordml/cex" xmlns:w16cid="http://schemas.microsoft.com/office/word/2016/wordml/cid" xmlns:w16="http://schemas.microsoft.com/office/word/2018/wordml" xmlns:w16du="http://schemas.microsoft.com/office/word/2023/wordml/word16du" xmlns:w16sdtdh="http://schemas.microsoft.com/office/word/2020/wordml/sdtdatahash" xmlns:w16sdtfl="http://schemas.microsoft.com/office/word/2024/wordml/sdtformatlock" xmlns:w16se="http://schemas.microsoft.com/office/word/2015/wordml/symex" xmlns:wpg="http://schemas.microsoft.com/office/word/2010/wordprocessingGroup" xmlns:wpi="http://schemas.microsoft.com/office/word/2010/wordprocessingInk" xmlns:wne="http://schemas.microsoft.com/office/word/2006/wordml" xmlns:wps="http://schemas.microsoft.com/office/word/2010/wordprocessingShape" mc:Ignorable="w14 w15 w16se w16cid w16 w16cex w16sdtdh w16sdtfl w16du wp14">
+  <w15:commentEx w15:paraId="75D781C0" w15:done="0"/>
   <w15:commentEx w15:paraId="7BB99941" w15:done="0"/>
   <w15:commentEx w15:paraId="5DD5C29F" w15:done="0"/>
   <w15:commentEx w15:paraId="6F9C2EF7" w15:done="0"/>
@@ -8666,6 +9846,7 @@
 
 <file path=word/commentsExtensible.xml><?xml version="1.0" encoding="utf-8"?>
 <w16cex:commentsExtensible xmlns:wpc="http://schemas.microsoft.com/office/word/2010/wordprocessingCanvas" xmlns:cx="http://schemas.microsoft.com/office/drawing/2014/chartex" xmlns:cx1="http://schemas.microsoft.com/office/drawing/2015/9/8/chartex" xmlns:cx2="http://schemas.microsoft.com/office/drawing/2015/10/21/chartex" xmlns:cx3="http://schemas.microsoft.com/office/drawing/2016/5/9/chartex" xmlns:cx4="http://schemas.microsoft.com/office/drawing/2016/5/10/chartex" xmlns:cx5="http://schemas.microsoft.com/office/drawing/2016/5/11/chartex" xmlns:cx6="http://schemas.microsoft.com/office/drawing/2016/5/12/chartex" xmlns:cx7="http://schemas.microsoft.com/office/drawing/2016/5/13/chartex" xmlns:cx8="http://schemas.microsoft.com/office/drawing/2016/5/14/chartex" xmlns:cr="http://schemas.microsoft.com/office/comments/2020/reactions" xmlns:mc="http://schemas.openxmlformats.org/markup-compatibility/2006" xmlns:aink="http://schemas.microsoft.com/office/drawing/2016/ink" xmlns:am3d="http://schemas.microsoft.com/office/drawing/2017/model3d" xmlns:o="urn:schemas-microsoft-com:office:office" xmlns:oel="http://schemas.microsoft.com/office/2019/extlst" xmlns:r="http://schemas.openxmlformats.org/officeDocument/2006/relationships" xmlns:m="http://schemas.openxmlformats.org/officeDocument/2006/math" xmlns:v="urn:schemas-microsoft-com:vml" xmlns:wp14="http://schemas.microsoft.com/office/word/2010/wordprocessingDrawing" xmlns:wp="http://schemas.openxmlformats.org/drawingml/2006/wordprocessingDrawing" xmlns:w10="urn:schemas-microsoft-com:office:word" xmlns:w="http://schemas.openxmlformats.org/wordprocessingml/2006/main" xmlns:w14="http://schemas.microsoft.com/office/word/2010/wordml" xmlns:w15="http://schemas.microsoft.com/office/word/2012/wordml" xmlns:w16cex="http://schemas.microsoft.com/office/word/2018/wordml/cex" xmlns:w16cid="http://schemas.microsoft.com/office/word/2016/wordml/cid" xmlns:w16="http://schemas.microsoft.com/office/word/2018/wordml" xmlns:w16du="http://schemas.microsoft.com/office/word/2023/wordml/word16du" xmlns:w16sdtdh="http://schemas.microsoft.com/office/word/2020/wordml/sdtdatahash" xmlns:w16sdtfl="http://schemas.microsoft.com/office/word/2024/wordml/sdtformatlock" xmlns:w16se="http://schemas.microsoft.com/office/word/2015/wordml/symex" xmlns:wpg="http://schemas.microsoft.com/office/word/2010/wordprocessingGroup" xmlns:wpi="http://schemas.microsoft.com/office/word/2010/wordprocessingInk" xmlns:wne="http://schemas.microsoft.com/office/word/2006/wordml" xmlns:wps="http://schemas.microsoft.com/office/word/2010/wordprocessingShape" mc:Ignorable="w14 w15 w16se w16cid w16 w16cex w16sdtdh w16sdtfl cr w16du wp14">
+  <w16cex:commentExtensible w16cex:durableId="48524E13" w16cex:dateUtc="2026-03-09T13:32:00Z"/>
   <w16cex:commentExtensible w16cex:durableId="175AC2BF" w16cex:dateUtc="2026-01-28T09:45:00Z"/>
   <w16cex:commentExtensible w16cex:durableId="19ADAC4E" w16cex:dateUtc="2026-01-27T09:30:00Z"/>
   <w16cex:commentExtensible w16cex:durableId="0CEB61E4" w16cex:dateUtc="2026-01-26T15:26:00Z"/>
@@ -8679,6 +9860,7 @@
 
 <file path=word/commentsIds.xml><?xml version="1.0" encoding="utf-8"?>
 <w16cid:commentsIds xmlns:wpc="http://schemas.microsoft.com/office/word/2010/wordprocessingCanvas" xmlns:cx="http://schemas.microsoft.com/office/drawing/2014/chartex" xmlns:cx1="http://schemas.microsoft.com/office/drawing/2015/9/8/chartex" xmlns:cx2="http://schemas.microsoft.com/office/drawing/2015/10/21/chartex" xmlns:cx3="http://schemas.microsoft.com/office/drawing/2016/5/9/chartex" xmlns:cx4="http://schemas.microsoft.com/office/drawing/2016/5/10/chartex" xmlns:cx5="http://schemas.microsoft.com/office/drawing/2016/5/11/chartex" xmlns:cx6="http://schemas.microsoft.com/office/drawing/2016/5/12/chartex" xmlns:cx7="http://schemas.microsoft.com/office/drawing/2016/5/13/chartex" xmlns:cx8="http://schemas.microsoft.com/office/drawing/2016/5/14/chartex" xmlns:mc="http://schemas.openxmlformats.org/markup-compatibility/2006" xmlns:aink="http://schemas.microsoft.com/office/drawing/2016/ink" xmlns:am3d="http://schemas.microsoft.com/office/drawing/2017/model3d" xmlns:o="urn:schemas-microsoft-com:office:office" xmlns:oel="http://schemas.microsoft.com/office/2019/extlst" xmlns:r="http://schemas.openxmlformats.org/officeDocument/2006/relationships" xmlns:m="http://schemas.openxmlformats.org/officeDocument/2006/math" xmlns:v="urn:schemas-microsoft-com:vml" xmlns:wp14="http://schemas.microsoft.com/office/word/2010/wordprocessingDrawing" xmlns:wp="http://schemas.openxmlformats.org/drawingml/2006/wordprocessingDrawing" xmlns:w10="urn:schemas-microsoft-com:office:word" xmlns:w="http://schemas.openxmlformats.org/wordprocessingml/2006/main" xmlns:w14="http://schemas.microsoft.com/office/word/2010/wordml" xmlns:w15="http://schemas.microsoft.com/office/word/2012/wordml" xmlns:w16cex="http://schemas.microsoft.com/office/word/2018/wordml/cex" xmlns:w16cid="http://schemas.microsoft.com/office/word/2016/wordml/cid" xmlns:w16="http://schemas.microsoft.com/office/word/2018/wordml" xmlns:w16du="http://schemas.microsoft.com/office/word/2023/wordml/word16du" xmlns:w16sdtdh="http://schemas.microsoft.com/office/word/2020/wordml/sdtdatahash" xmlns:w16sdtfl="http://schemas.microsoft.com/office/word/2024/wordml/sdtformatlock" xmlns:w16se="http://schemas.microsoft.com/office/word/2015/wordml/symex" xmlns:wpg="http://schemas.microsoft.com/office/word/2010/wordprocessingGroup" xmlns:wpi="http://schemas.microsoft.com/office/word/2010/wordprocessingInk" xmlns:wne="http://schemas.microsoft.com/office/word/2006/wordml" xmlns:wps="http://schemas.microsoft.com/office/word/2010/wordprocessingShape" mc:Ignorable="w14 w15 w16se w16cid w16 w16cex w16sdtdh w16sdtfl w16du wp14">
+  <w16cid:commentId w16cid:paraId="75D781C0" w16cid:durableId="48524E13"/>
   <w16cid:commentId w16cid:paraId="7BB99941" w16cid:durableId="175AC2BF"/>
   <w16cid:commentId w16cid:paraId="5DD5C29F" w16cid:durableId="19ADAC4E"/>
   <w16cid:commentId w16cid:paraId="6F9C2EF7" w16cid:durableId="0CEB61E4"/>
@@ -10074,6 +11256,119 @@
       <w:lvlJc w:val="left"/>
       <w:pPr>
         <w:ind w:left="6538" w:hanging="360"/>
+      </w:pPr>
+      <w:rPr>
+        <w:rFonts w:ascii="Wingdings" w:hAnsi="Wingdings" w:hint="default"/>
+      </w:rPr>
+    </w:lvl>
+  </w:abstractNum>
+  <w:abstractNum w:abstractNumId="13" w15:restartNumberingAfterBreak="0">
+    <w:nsid w:val="64B25DB8"/>
+    <w:multiLevelType w:val="hybridMultilevel"/>
+    <w:tmpl w:val="3176DDE4"/>
+    <w:lvl w:ilvl="0" w:tplc="08090001">
+      <w:start w:val="1"/>
+      <w:numFmt w:val="bullet"/>
+      <w:lvlText w:val=""/>
+      <w:lvlJc w:val="left"/>
+      <w:pPr>
+        <w:ind w:left="720" w:hanging="360"/>
+      </w:pPr>
+      <w:rPr>
+        <w:rFonts w:ascii="Symbol" w:hAnsi="Symbol" w:hint="default"/>
+      </w:rPr>
+    </w:lvl>
+    <w:lvl w:ilvl="1" w:tplc="08090003">
+      <w:start w:val="1"/>
+      <w:numFmt w:val="bullet"/>
+      <w:lvlText w:val="o"/>
+      <w:lvlJc w:val="left"/>
+      <w:pPr>
+        <w:ind w:left="1440" w:hanging="360"/>
+      </w:pPr>
+      <w:rPr>
+        <w:rFonts w:ascii="Courier New" w:hAnsi="Courier New" w:cs="Courier New" w:hint="default"/>
+      </w:rPr>
+    </w:lvl>
+    <w:lvl w:ilvl="2" w:tplc="08090005" w:tentative="1">
+      <w:start w:val="1"/>
+      <w:numFmt w:val="bullet"/>
+      <w:lvlText w:val=""/>
+      <w:lvlJc w:val="left"/>
+      <w:pPr>
+        <w:ind w:left="2160" w:hanging="360"/>
+      </w:pPr>
+      <w:rPr>
+        <w:rFonts w:ascii="Wingdings" w:hAnsi="Wingdings" w:hint="default"/>
+      </w:rPr>
+    </w:lvl>
+    <w:lvl w:ilvl="3" w:tplc="08090001" w:tentative="1">
+      <w:start w:val="1"/>
+      <w:numFmt w:val="bullet"/>
+      <w:lvlText w:val=""/>
+      <w:lvlJc w:val="left"/>
+      <w:pPr>
+        <w:ind w:left="2880" w:hanging="360"/>
+      </w:pPr>
+      <w:rPr>
+        <w:rFonts w:ascii="Symbol" w:hAnsi="Symbol" w:hint="default"/>
+      </w:rPr>
+    </w:lvl>
+    <w:lvl w:ilvl="4" w:tplc="08090003" w:tentative="1">
+      <w:start w:val="1"/>
+      <w:numFmt w:val="bullet"/>
+      <w:lvlText w:val="o"/>
+      <w:lvlJc w:val="left"/>
+      <w:pPr>
+        <w:ind w:left="3600" w:hanging="360"/>
+      </w:pPr>
+      <w:rPr>
+        <w:rFonts w:ascii="Courier New" w:hAnsi="Courier New" w:cs="Courier New" w:hint="default"/>
+      </w:rPr>
+    </w:lvl>
+    <w:lvl w:ilvl="5" w:tplc="08090005" w:tentative="1">
+      <w:start w:val="1"/>
+      <w:numFmt w:val="bullet"/>
+      <w:lvlText w:val=""/>
+      <w:lvlJc w:val="left"/>
+      <w:pPr>
+        <w:ind w:left="4320" w:hanging="360"/>
+      </w:pPr>
+      <w:rPr>
+        <w:rFonts w:ascii="Wingdings" w:hAnsi="Wingdings" w:hint="default"/>
+      </w:rPr>
+    </w:lvl>
+    <w:lvl w:ilvl="6" w:tplc="08090001" w:tentative="1">
+      <w:start w:val="1"/>
+      <w:numFmt w:val="bullet"/>
+      <w:lvlText w:val=""/>
+      <w:lvlJc w:val="left"/>
+      <w:pPr>
+        <w:ind w:left="5040" w:hanging="360"/>
+      </w:pPr>
+      <w:rPr>
+        <w:rFonts w:ascii="Symbol" w:hAnsi="Symbol" w:hint="default"/>
+      </w:rPr>
+    </w:lvl>
+    <w:lvl w:ilvl="7" w:tplc="08090003" w:tentative="1">
+      <w:start w:val="1"/>
+      <w:numFmt w:val="bullet"/>
+      <w:lvlText w:val="o"/>
+      <w:lvlJc w:val="left"/>
+      <w:pPr>
+        <w:ind w:left="5760" w:hanging="360"/>
+      </w:pPr>
+      <w:rPr>
+        <w:rFonts w:ascii="Courier New" w:hAnsi="Courier New" w:cs="Courier New" w:hint="default"/>
+      </w:rPr>
+    </w:lvl>
+    <w:lvl w:ilvl="8" w:tplc="08090005" w:tentative="1">
+      <w:start w:val="1"/>
+      <w:numFmt w:val="bullet"/>
+      <w:lvlText w:val=""/>
+      <w:lvlJc w:val="left"/>
+      <w:pPr>
+        <w:ind w:left="6480" w:hanging="360"/>
       </w:pPr>
       <w:rPr>
         <w:rFonts w:ascii="Wingdings" w:hAnsi="Wingdings" w:hint="default"/>
@@ -10121,6 +11416,9 @@
   </w:num>
   <w:num w:numId="13" w16cid:durableId="1082490718">
     <w:abstractNumId w:val="2"/>
+  </w:num>
+  <w:num w:numId="14" w16cid:durableId="892691908">
+    <w:abstractNumId w:val="13"/>
   </w:num>
 </w:numbering>
 </file>
@@ -10784,6 +12082,28 @@
       <w:szCs w:val="20"/>
     </w:rPr>
   </w:style>
+  <w:style w:type="paragraph" w:customStyle="1" w:styleId="font-claude-response-body">
+    <w:name w:val="font-claude-response-body"/>
+    <w:basedOn w:val="Normal"/>
+    <w:rsid w:val="00C64E3C"/>
+    <w:pPr>
+      <w:spacing w:before="100" w:beforeAutospacing="1" w:after="100" w:afterAutospacing="1"/>
+    </w:pPr>
+    <w:rPr>
+      <w:rFonts w:ascii="Times New Roman" w:eastAsia="Times New Roman" w:hAnsi="Times New Roman" w:cs="Times New Roman"/>
+    </w:rPr>
+  </w:style>
+  <w:style w:type="character" w:styleId="Strong">
+    <w:name w:val="Strong"/>
+    <w:basedOn w:val="DefaultParagraphFont"/>
+    <w:uiPriority w:val="22"/>
+    <w:qFormat/>
+    <w:rsid w:val="00C64E3C"/>
+    <w:rPr>
+      <w:b/>
+      <w:bCs/>
+    </w:rPr>
+  </w:style>
 </w:styles>
 </file>
 

</xml_diff>

<commit_message>
Initial retention and LTFU testing
</commit_message>
<xml_diff>
--- a/resources/Test_Framework_Description.docx
+++ b/resources/Test_Framework_Description.docx
@@ -672,6 +672,9 @@
       </w:pPr>
       <w:r>
         <w:t>Testing re-engages from the prevalent LTFU stock first; tracking/tracing acts on the remainder</w:t>
+      </w:r>
+      <w:r>
+        <w:t xml:space="preserve"> </w:t>
       </w:r>
     </w:p>
     <w:p>
@@ -1559,13 +1562,7 @@
               <w:spacing w:after="120"/>
             </w:pPr>
             <w:r>
-              <w:t xml:space="preserve">coverage_pct  </w:t>
-            </w:r>
-            <w:r>
-              <w:t>= %</w:t>
-            </w:r>
-            <w:r>
-              <w:t xml:space="preserve"> of people on ART</w:t>
+              <w:t>coverage_pct  = % of people on ART</w:t>
             </w:r>
             <w:r>
               <w:t xml:space="preserve"> receiving viral load test</w:t>
@@ -1576,13 +1573,7 @@
               <w:spacing w:after="120"/>
             </w:pPr>
             <w:r>
-              <w:t xml:space="preserve">eligible_pop   </w:t>
-            </w:r>
-            <w:r>
-              <w:t>= people_</w:t>
-            </w:r>
-            <w:r>
-              <w:t>on_art</w:t>
+              <w:t>eligible_pop   = people_on_art</w:t>
             </w:r>
           </w:p>
           <w:p>
@@ -1732,7 +1723,13 @@
               <w:spacing w:after="120"/>
             </w:pPr>
             <w:r>
-              <w:t>Assume smultiplicative effect</w:t>
+              <w:t>Assumes</w:t>
+            </w:r>
+            <w:r>
+              <w:t xml:space="preserve"> </w:t>
+            </w:r>
+            <w:r>
+              <w:t>multiplicative effect</w:t>
             </w:r>
           </w:p>
           <w:p>
@@ -3326,13 +3323,7 @@
               <w:spacing w:after="160"/>
             </w:pPr>
             <w:r>
-              <w:t xml:space="preserve">All prevention to 0 – no </w:t>
-            </w:r>
-            <w:r>
-              <w:t>infant</w:t>
-            </w:r>
-            <w:r>
-              <w:t xml:space="preserve">  infections averted</w:t>
+              <w:t>All prevention to 0 – no infant  infections averted</w:t>
             </w:r>
           </w:p>
         </w:tc>
@@ -3345,10 +3336,7 @@
               <w:spacing w:after="160"/>
             </w:pPr>
             <w:r>
-              <w:t>Infant</w:t>
-            </w:r>
-            <w:r>
-              <w:t>_infections_averted = 0</w:t>
+              <w:t>Infant_infections_averted = 0</w:t>
             </w:r>
           </w:p>
           <w:p>
@@ -3563,10 +3551,7 @@
               <w:spacing w:after="160"/>
             </w:pPr>
             <w:r>
-              <w:t>Adult_infections_averted =</w:t>
-            </w:r>
-            <w:r>
-              <w:t xml:space="preserve"> </w:t>
+              <w:t xml:space="preserve">Adult_infections_averted = </w:t>
             </w:r>
             <w:r>
               <w:t>21</w:t>
@@ -3605,13 +3590,7 @@
               <w:spacing w:after="160"/>
             </w:pPr>
             <w:r>
-              <w:t xml:space="preserve">Scenario </w:t>
-            </w:r>
-            <w:r>
-              <w:t>2</w:t>
-            </w:r>
-            <w:r>
-              <w:t xml:space="preserve"> – infections averted matchets expectation</w:t>
+              <w:t>Scenario 2 – infections averted matchets expectation</w:t>
             </w:r>
           </w:p>
         </w:tc>
@@ -3624,24 +3603,15 @@
               <w:spacing w:after="160"/>
             </w:pPr>
             <w:r>
-              <w:t xml:space="preserve">Adult_infections_averted = </w:t>
-            </w:r>
-            <w:r>
-              <w:t>2</w:t>
-            </w:r>
-            <w:r>
-              <w:t>0000*incidence*efficacy</w:t>
-            </w:r>
-          </w:p>
-          <w:p>
-            <w:pPr>
-              <w:spacing w:after="160"/>
-            </w:pPr>
-            <w:r>
-              <w:t xml:space="preserve">Adult_infections_averted = </w:t>
-            </w:r>
-            <w:r>
-              <w:t>42</w:t>
+              <w:t>Adult_infections_averted = 20000*incidence*efficacy</w:t>
+            </w:r>
+          </w:p>
+          <w:p>
+            <w:pPr>
+              <w:spacing w:after="160"/>
+            </w:pPr>
+            <w:r>
+              <w:t>Adult_infections_averted = 42</w:t>
             </w:r>
           </w:p>
           <w:p>
@@ -3690,16 +3660,7 @@
               <w:spacing w:after="160"/>
             </w:pPr>
             <w:r>
-              <w:t>Adult_infections_averted</w:t>
-            </w:r>
-            <w:r>
-              <w:t xml:space="preserve">_scen2=2* </w:t>
-            </w:r>
-            <w:r>
-              <w:t>Adult_infections_averted</w:t>
-            </w:r>
-            <w:r>
-              <w:t>_scen1</w:t>
+              <w:t>Adult_infections_averted_scen2=2* Adult_infections_averted_scen1</w:t>
             </w:r>
           </w:p>
         </w:tc>
@@ -8515,13 +8476,7 @@
         <w:pStyle w:val="Heading2"/>
       </w:pPr>
       <w:r>
-        <w:t xml:space="preserve">Test set: </w:t>
-      </w:r>
-      <w:r>
-        <w:t>Viral suppression</w:t>
-      </w:r>
-      <w:r>
-        <w:t xml:space="preserve"> Interventions</w:t>
+        <w:t>Test set: Viral suppression Interventions</w:t>
       </w:r>
     </w:p>
     <w:p>
@@ -8537,13 +8492,7 @@
         <w:spacing w:after="160"/>
       </w:pPr>
       <w:r>
-        <w:t xml:space="preserve">Tests that changes in </w:t>
-      </w:r>
-      <w:r>
-        <w:t>viral load testing coverage</w:t>
-      </w:r>
-      <w:r>
-        <w:t xml:space="preserve"> and modalities are correctly handled by the model. Increases in </w:t>
+        <w:t xml:space="preserve">Tests that changes in viral load testing coverage and modalities are correctly handled by the model. Increases in </w:t>
       </w:r>
       <w:r>
         <w:t>viral load testing</w:t>
@@ -8949,13 +8898,7 @@
               <w:spacing w:after="160"/>
             </w:pPr>
             <w:r>
-              <w:t xml:space="preserve">Additional_suppressed_scen_1 = </w:t>
-            </w:r>
-            <w:r>
-              <w:t>1/3</w:t>
-            </w:r>
-            <w:r>
-              <w:t>*Additional_suppressed_base</w:t>
+              <w:t>Additional_suppressed_scen_1 = 1/3*Additional_suppressed_base</w:t>
             </w:r>
           </w:p>
         </w:tc>
@@ -9005,10 +8948,7 @@
               <w:spacing w:after="160"/>
             </w:pPr>
             <w:r>
-              <w:t>Additional_suppressed_</w:t>
-            </w:r>
-            <w:r>
-              <w:t>high= 3*Additional_suppressed_low</w:t>
+              <w:t>Additional_suppressed_high= 3*Additional_suppressed_low</w:t>
             </w:r>
           </w:p>
         </w:tc>
@@ -9070,10 +9010,7 @@
               <w:spacing w:after="160"/>
             </w:pPr>
             <w:r>
-              <w:t>end_on_art</w:t>
-            </w:r>
-            <w:r>
-              <w:t xml:space="preserve"> &lt;= </w:t>
+              <w:t xml:space="preserve">end_on_art &lt;= </w:t>
             </w:r>
             <w:r>
               <w:t>end_</w:t>
@@ -9092,10 +9029,7 @@
               <w:spacing w:after="160"/>
             </w:pPr>
             <w:r>
-              <w:t>end_diagnosed</w:t>
-            </w:r>
-            <w:r>
-              <w:t xml:space="preserve"> &lt;=PLHIV</w:t>
+              <w:t>end_diagnosed &lt;=PLHIV</w:t>
             </w:r>
           </w:p>
           <w:p>
@@ -9231,11 +9165,39 @@
       <w:pPr>
         <w:pStyle w:val="Heading2"/>
       </w:pPr>
-      <w:r>
-        <w:t xml:space="preserve">Test set: </w:t>
-      </w:r>
-      <w:r>
-        <w:t>Mortality, AHD and OI</w:t>
+    </w:p>
+    <w:p>
+      <w:pPr>
+        <w:pStyle w:val="Heading2"/>
+      </w:pPr>
+    </w:p>
+    <w:p>
+      <w:pPr>
+        <w:pStyle w:val="Heading2"/>
+      </w:pPr>
+    </w:p>
+    <w:p>
+      <w:pPr>
+        <w:pStyle w:val="Heading2"/>
+      </w:pPr>
+    </w:p>
+    <w:p>
+      <w:pPr>
+        <w:pStyle w:val="Heading2"/>
+      </w:pPr>
+    </w:p>
+    <w:p>
+      <w:pPr>
+        <w:pStyle w:val="Heading2"/>
+      </w:pPr>
+    </w:p>
+    <w:p>
+      <w:pPr>
+        <w:pStyle w:val="Heading2"/>
+      </w:pPr>
+      <w:r>
+        <w:lastRenderedPageBreak/>
+        <w:t>Test set: Mortality, AHD and OI</w:t>
       </w:r>
     </w:p>
     <w:p>
@@ -9270,11 +9232,7 @@
         <w:spacing w:after="160"/>
       </w:pPr>
       <w:r>
-        <w:t xml:space="preserve">Uses a standardized population with the following parameters: 1,000,000 total population, 5% HIV prevalence (50,000 PLHIV), 80% diagnosed, 75% on ART, 85% </w:t>
-      </w:r>
-      <w:r>
-        <w:lastRenderedPageBreak/>
-        <w:t xml:space="preserve">virally suppressed, </w:t>
+        <w:t xml:space="preserve">Uses a standardized population with the following parameters: 1,000,000 total population, 5% HIV prevalence (50,000 PLHIV), 80% diagnosed, 75% on ART, 85% virally suppressed, </w:t>
       </w:r>
       <w:r>
         <w:t>2500</w:t>
@@ -9298,26 +9256,10 @@
           <w:b/>
           <w:bCs/>
         </w:rPr>
-        <w:t>MORTALITY_RATES</w:t>
-      </w:r>
-      <w:r>
-        <w:rPr>
-          <w:b/>
-          <w:bCs/>
-        </w:rPr>
-        <w:t>:</w:t>
-      </w:r>
-      <w:r>
-        <w:t xml:space="preserve"> </w:t>
-      </w:r>
-      <w:r>
-        <w:t>untreated_undiagnosed = 0.10,</w:t>
-      </w:r>
-      <w:r>
-        <w:t xml:space="preserve"> </w:t>
-      </w:r>
-      <w:r>
-        <w:t>new_art_initiations=0.06, treated= 0.008,</w:t>
+        <w:t>MORTALITY_RATES:</w:t>
+      </w:r>
+      <w:r>
+        <w:t xml:space="preserve"> untreated_undiagnosed = 0.10, new_art_initiations=0.06, treated= 0.008,</w:t>
       </w:r>
       <w:r>
         <w:t xml:space="preserve"> </w:t>
@@ -9708,21 +9650,15 @@
               <w:spacing w:after="160"/>
             </w:pPr>
             <w:r>
-              <w:t>Expected_deaths =</w:t>
-            </w:r>
-            <w:r>
-              <w:t>36</w:t>
-            </w:r>
-          </w:p>
-          <w:p>
-            <w:pPr>
-              <w:spacing w:after="160"/>
-            </w:pPr>
-            <w:r>
-              <w:t>Expected_deaths</w:t>
-            </w:r>
-            <w:r>
-              <w:t xml:space="preserve"> = end_deaths</w:t>
+              <w:t>Expected_deaths =36</w:t>
+            </w:r>
+          </w:p>
+          <w:p>
+            <w:pPr>
+              <w:spacing w:after="160"/>
+            </w:pPr>
+            <w:r>
+              <w:t>Expected_deaths = end_deaths</w:t>
             </w:r>
           </w:p>
         </w:tc>
@@ -9740,6 +9676,7 @@
               <w:spacing w:after="160"/>
             </w:pPr>
             <w:r>
+              <w:lastRenderedPageBreak/>
               <w:t>5</w:t>
             </w:r>
           </w:p>
@@ -9753,13 +9690,7 @@
               <w:spacing w:after="160"/>
             </w:pPr>
             <w:r>
-              <w:t xml:space="preserve">Established </w:t>
-            </w:r>
-            <w:r>
-              <w:t>suppressed</w:t>
-            </w:r>
-            <w:r>
-              <w:t xml:space="preserve"> uses treated mortality rate and assumption of 0 AHD</w:t>
+              <w:t>Established suppressed uses treated mortality rate and assumption of 0 AHD</w:t>
             </w:r>
           </w:p>
         </w:tc>
@@ -9772,22 +9703,13 @@
               <w:spacing w:after="160"/>
             </w:pPr>
             <w:r>
-              <w:t>Expected_deaths = n_</w:t>
-            </w:r>
-            <w:r>
-              <w:t>suppressed</w:t>
-            </w:r>
-            <w:r>
-              <w:t xml:space="preserve"> *0.</w:t>
+              <w:t>Expected_deaths = n_suppressed *0.</w:t>
             </w:r>
             <w:r>
               <w:t>0</w:t>
             </w:r>
             <w:r>
-              <w:t>0</w:t>
-            </w:r>
-            <w:r>
-              <w:t>3</w:t>
+              <w:t>03</w:t>
             </w:r>
           </w:p>
           <w:p>
@@ -9834,11 +9756,7 @@
               <w:spacing w:after="160"/>
             </w:pPr>
             <w:r>
-              <w:t xml:space="preserve">AHD mortality rate has no effect on mortality of established </w:t>
-            </w:r>
-            <w:r>
-              <w:lastRenderedPageBreak/>
-              <w:t xml:space="preserve">groups (assumed </w:t>
+              <w:t xml:space="preserve">AHD mortality rate has no effect on mortality of established groups (assumed </w:t>
             </w:r>
             <w:r>
               <w:t>prop AHD 0</w:t>
@@ -9857,7 +9775,6 @@
               <w:spacing w:after="160"/>
             </w:pPr>
             <w:r>
-              <w:lastRenderedPageBreak/>
               <w:t>Deaths_low_AHD = Deaths_high_AHD</w:t>
             </w:r>
           </w:p>
@@ -9988,13 +9905,7 @@
               <w:spacing w:after="160"/>
             </w:pPr>
             <w:r>
-              <w:t xml:space="preserve">New initiations – </w:t>
-            </w:r>
-            <w:r>
-              <w:t>OI management</w:t>
-            </w:r>
-            <w:r>
-              <w:t xml:space="preserve"> reduces base mortality (assume no AHD mortality)</w:t>
+              <w:t>New initiations – OI management reduces base mortality (assume no AHD mortality)</w:t>
             </w:r>
           </w:p>
         </w:tc>
@@ -10194,6 +10105,7 @@
               <w:spacing w:after="160"/>
             </w:pPr>
             <w:r>
+              <w:lastRenderedPageBreak/>
               <w:t>Fewer deaths at higher coverage</w:t>
             </w:r>
           </w:p>
@@ -10212,6 +10124,7 @@
               <w:spacing w:after="160"/>
             </w:pPr>
             <w:r>
+              <w:lastRenderedPageBreak/>
               <w:t>10</w:t>
             </w:r>
           </w:p>
@@ -10303,7 +10216,6 @@
               <w:spacing w:after="160"/>
             </w:pPr>
             <w:r>
-              <w:lastRenderedPageBreak/>
               <w:t>12</w:t>
             </w:r>
           </w:p>
@@ -10652,16 +10564,7 @@
               <w:spacing w:after="160"/>
             </w:pPr>
             <w:r>
-              <w:t xml:space="preserve">initiations </w:t>
-            </w:r>
-            <w:r>
-              <w:t xml:space="preserve">(high test) &gt; </w:t>
-            </w:r>
-            <w:r>
-              <w:t xml:space="preserve">initiations </w:t>
-            </w:r>
-            <w:r>
-              <w:t>(low test)</w:t>
+              <w:t>initiations (high test) &gt; initiations (low test)</w:t>
             </w:r>
           </w:p>
           <w:p>
@@ -10675,6 +10578,957 @@
               <w:t xml:space="preserve"> averted (high test) &gt; deaths averted (low test)</w:t>
             </w:r>
           </w:p>
+          <w:p>
+            <w:pPr>
+              <w:spacing w:after="160"/>
+            </w:pPr>
+          </w:p>
+        </w:tc>
+      </w:tr>
+    </w:tbl>
+    <w:p/>
+    <w:p>
+      <w:pPr>
+        <w:pStyle w:val="Heading2"/>
+      </w:pPr>
+      <w:r>
+        <w:t xml:space="preserve">Test set: </w:t>
+      </w:r>
+      <w:r>
+        <w:t>LTFU and retention</w:t>
+      </w:r>
+    </w:p>
+    <w:p>
+      <w:pPr>
+        <w:pStyle w:val="Heading3"/>
+      </w:pPr>
+      <w:r>
+        <w:t>Purpose</w:t>
+      </w:r>
+    </w:p>
+    <w:p>
+      <w:pPr>
+        <w:pStyle w:val="Heading3"/>
+        <w:rPr>
+          <w:b w:val="0"/>
+          <w:bCs w:val="0"/>
+          <w:sz w:val="24"/>
+          <w:szCs w:val="24"/>
+        </w:rPr>
+      </w:pPr>
+      <w:r>
+        <w:rPr>
+          <w:b w:val="0"/>
+          <w:bCs w:val="0"/>
+          <w:sz w:val="24"/>
+          <w:szCs w:val="24"/>
+        </w:rPr>
+        <w:t>Tests the loss to follow-up flow mechanics and the impact of retention interventions including multi-month dispensing (MMD), adherence counseling, and tracking/tracing.</w:t>
+      </w:r>
+    </w:p>
+    <w:p>
+      <w:pPr>
+        <w:pStyle w:val="Heading3"/>
+      </w:pPr>
+      <w:r>
+        <w:lastRenderedPageBreak/>
+        <w:t>Test Logic</w:t>
+      </w:r>
+    </w:p>
+    <w:p>
+      <w:pPr>
+        <w:spacing w:after="160"/>
+      </w:pPr>
+      <w:r>
+        <w:t>Uses a standardized population with the following parameters: 1,000,000 total population, 5% HIV prevalence (50,000 PLHIV), 80% diagnosed, 75% on ART, 85% virally suppressed, 2500 new infections per year, 1,000 AIDS deaths per year, crude birth rate 25 per 1000, 49% of population male ,and 40% of population under 15.</w:t>
+      </w:r>
+    </w:p>
+    <w:p>
+      <w:pPr>
+        <w:pStyle w:val="font-claude-response-body"/>
+        <w:rPr>
+          <w:rFonts w:ascii="Arial" w:hAnsi="Arial" w:cs="Arial"/>
+        </w:rPr>
+      </w:pPr>
+      <w:r>
+        <w:rPr>
+          <w:rStyle w:val="Strong"/>
+          <w:rFonts w:ascii="Arial" w:hAnsi="Arial" w:cs="Arial"/>
+        </w:rPr>
+        <w:t>LTFU rates:</w:t>
+      </w:r>
+      <w:r>
+        <w:rPr>
+          <w:rFonts w:ascii="Arial" w:hAnsi="Arial" w:cs="Arial"/>
+        </w:rPr>
+        <w:t xml:space="preserve"> ANNUAL_LTFU_RATE_SUPPRESSED = 0.05, ANNUAL_LTFU_RATE_UNSUPPRESSED = 0.15, prevalent LTFU stock = 15% of on_art</w:t>
+      </w:r>
+    </w:p>
+    <w:p>
+      <w:pPr>
+        <w:pStyle w:val="font-claude-response-body"/>
+        <w:rPr>
+          <w:rFonts w:ascii="Arial" w:hAnsi="Arial" w:cs="Arial"/>
+        </w:rPr>
+      </w:pPr>
+      <w:r>
+        <w:rPr>
+          <w:rStyle w:val="Strong"/>
+          <w:rFonts w:ascii="Arial" w:hAnsi="Arial" w:cs="Arial"/>
+        </w:rPr>
+        <w:t>RETENTION_SUPPRESSION_RATE:</w:t>
+      </w:r>
+      <w:r>
+        <w:rPr>
+          <w:rFonts w:ascii="Arial" w:hAnsi="Arial" w:cs="Arial"/>
+        </w:rPr>
+        <w:t xml:space="preserve"> 0.30 (proportion of retained unsuppressed patients who achieve suppression)</w:t>
+      </w:r>
+    </w:p>
+    <w:p>
+      <w:pPr>
+        <w:pStyle w:val="font-claude-response-body"/>
+        <w:rPr>
+          <w:rFonts w:ascii="Arial" w:hAnsi="Arial" w:cs="Arial"/>
+        </w:rPr>
+      </w:pPr>
+      <w:r>
+        <w:rPr>
+          <w:rStyle w:val="Strong"/>
+          <w:rFonts w:ascii="Arial" w:hAnsi="Arial" w:cs="Arial"/>
+        </w:rPr>
+        <w:t>Retention intervention params (overridden for isolation):</w:t>
+      </w:r>
+      <w:r>
+        <w:rPr>
+          <w:rFonts w:ascii="Arial" w:hAnsi="Arial" w:cs="Arial"/>
+        </w:rPr>
+        <w:t xml:space="preserve"> MMD 3-month efficacy = 0.20, adherence counseling efficacy = 0.15, tracking/tracing efficacy = 0.60</w:t>
+      </w:r>
+    </w:p>
+    <w:p>
+      <w:pPr>
+        <w:pStyle w:val="font-claude-response-body"/>
+        <w:rPr>
+          <w:rFonts w:ascii="Arial" w:hAnsi="Arial" w:cs="Arial"/>
+        </w:rPr>
+      </w:pPr>
+      <w:r>
+        <w:rPr>
+          <w:rStyle w:val="Strong"/>
+          <w:rFonts w:ascii="Arial" w:hAnsi="Arial" w:cs="Arial"/>
+        </w:rPr>
+        <w:t>zero_mortality() called once at top level</w:t>
+      </w:r>
+      <w:r>
+        <w:rPr>
+          <w:rFonts w:ascii="Arial" w:hAnsi="Arial" w:cs="Arial"/>
+        </w:rPr>
+        <w:t xml:space="preserve"> to isolate LTFU effects from mortality noise across all tests.</w:t>
+      </w:r>
+    </w:p>
+    <w:p>
+      <w:pPr>
+        <w:pStyle w:val="font-claude-response-body"/>
+        <w:rPr>
+          <w:rFonts w:ascii="Arial" w:hAnsi="Arial" w:cs="Arial"/>
+        </w:rPr>
+      </w:pPr>
+      <w:r>
+        <w:rPr>
+          <w:rStyle w:val="Strong"/>
+          <w:rFonts w:ascii="Arial" w:hAnsi="Arial" w:cs="Arial"/>
+        </w:rPr>
+        <w:t>Known cascade values</w:t>
+      </w:r>
+      <w:r>
+        <w:rPr>
+          <w:rStyle w:val="Strong"/>
+          <w:rFonts w:ascii="Arial" w:hAnsi="Arial" w:cs="Arial"/>
+        </w:rPr>
+        <w:t>:</w:t>
+      </w:r>
+    </w:p>
+    <w:p>
+      <w:pPr>
+        <w:pStyle w:val="whitespace-normal"/>
+        <w:numPr>
+          <w:ilvl w:val="0"/>
+          <w:numId w:val="37"/>
+        </w:numPr>
+        <w:rPr>
+          <w:rFonts w:ascii="Arial" w:hAnsi="Arial" w:cs="Arial"/>
+        </w:rPr>
+      </w:pPr>
+      <w:r>
+        <w:rPr>
+          <w:rFonts w:ascii="Arial" w:hAnsi="Arial" w:cs="Arial"/>
+        </w:rPr>
+        <w:t>on_art = 30,000 | suppressed = 25,500 | unsuppressed = 4,500</w:t>
+      </w:r>
+    </w:p>
+    <w:p>
+      <w:pPr>
+        <w:pStyle w:val="whitespace-normal"/>
+        <w:numPr>
+          <w:ilvl w:val="0"/>
+          <w:numId w:val="37"/>
+        </w:numPr>
+        <w:rPr>
+          <w:rFonts w:ascii="Arial" w:hAnsi="Arial" w:cs="Arial"/>
+        </w:rPr>
+      </w:pPr>
+      <w:r>
+        <w:rPr>
+          <w:rFonts w:ascii="Arial" w:hAnsi="Arial" w:cs="Arial"/>
+        </w:rPr>
+        <w:t>ltfu_new_suppressed = 1,275 | ltfu_new_unsuppressed = 675 | ltfu_new = 1,950</w:t>
+      </w:r>
+    </w:p>
+    <w:p>
+      <w:pPr>
+        <w:pStyle w:val="whitespace-normal"/>
+        <w:numPr>
+          <w:ilvl w:val="0"/>
+          <w:numId w:val="37"/>
+        </w:numPr>
+        <w:rPr>
+          <w:rFonts w:ascii="Arial" w:hAnsi="Arial" w:cs="Arial"/>
+        </w:rPr>
+      </w:pPr>
+      <w:r>
+        <w:rPr>
+          <w:rFonts w:ascii="Arial" w:hAnsi="Arial" w:cs="Arial"/>
+        </w:rPr>
+        <w:t>ltfu prevalent stock = 4,500</w:t>
+      </w:r>
+    </w:p>
+    <w:tbl>
+      <w:tblPr>
+        <w:tblStyle w:val="TableGrid"/>
+        <w:tblW w:w="0" w:type="auto"/>
+        <w:tblLook w:val="04A0" w:firstRow="1" w:lastRow="0" w:firstColumn="1" w:lastColumn="0" w:noHBand="0" w:noVBand="1"/>
+      </w:tblPr>
+      <w:tblGrid>
+        <w:gridCol w:w="549"/>
+        <w:gridCol w:w="2140"/>
+        <w:gridCol w:w="6462"/>
+      </w:tblGrid>
+      <w:tr>
+        <w:trPr>
+          <w:trHeight w:val="457"/>
+        </w:trPr>
+        <w:tc>
+          <w:tcPr>
+            <w:tcW w:w="549" w:type="dxa"/>
+          </w:tcPr>
+          <w:p>
+            <w:pPr>
+              <w:spacing w:after="160"/>
+              <w:rPr>
+                <w:b/>
+                <w:bCs/>
+              </w:rPr>
+            </w:pPr>
+            <w:r>
+              <w:rPr>
+                <w:b/>
+                <w:bCs/>
+              </w:rPr>
+              <w:t>#</w:t>
+            </w:r>
+          </w:p>
+        </w:tc>
+        <w:tc>
+          <w:tcPr>
+            <w:tcW w:w="2140" w:type="dxa"/>
+          </w:tcPr>
+          <w:p>
+            <w:pPr>
+              <w:spacing w:after="160"/>
+              <w:rPr>
+                <w:b/>
+                <w:bCs/>
+              </w:rPr>
+            </w:pPr>
+            <w:r>
+              <w:rPr>
+                <w:b/>
+                <w:bCs/>
+              </w:rPr>
+              <w:t>Description</w:t>
+            </w:r>
+          </w:p>
+        </w:tc>
+        <w:tc>
+          <w:tcPr>
+            <w:tcW w:w="6462" w:type="dxa"/>
+          </w:tcPr>
+          <w:p>
+            <w:pPr>
+              <w:spacing w:after="160"/>
+              <w:rPr>
+                <w:b/>
+                <w:bCs/>
+              </w:rPr>
+            </w:pPr>
+            <w:r>
+              <w:rPr>
+                <w:b/>
+                <w:bCs/>
+                <w:highlight w:val="yellow"/>
+              </w:rPr>
+              <w:t>Test Calculation/expectation</w:t>
+            </w:r>
+          </w:p>
+        </w:tc>
+      </w:tr>
+      <w:tr>
+        <w:trPr>
+          <w:trHeight w:val="457"/>
+        </w:trPr>
+        <w:tc>
+          <w:tcPr>
+            <w:tcW w:w="549" w:type="dxa"/>
+          </w:tcPr>
+          <w:p>
+            <w:pPr>
+              <w:spacing w:after="160"/>
+            </w:pPr>
+            <w:r>
+              <w:t>1.</w:t>
+            </w:r>
+          </w:p>
+        </w:tc>
+        <w:tc>
+          <w:tcPr>
+            <w:tcW w:w="2140" w:type="dxa"/>
+          </w:tcPr>
+          <w:p>
+            <w:pPr>
+              <w:spacing w:after="160"/>
+            </w:pPr>
+            <w:r>
+              <w:t>LTFU flow fields sum correctly and use correct rates</w:t>
+            </w:r>
+            <w:r>
+              <w:t xml:space="preserve"> </w:t>
+            </w:r>
+          </w:p>
+        </w:tc>
+        <w:tc>
+          <w:tcPr>
+            <w:tcW w:w="6462" w:type="dxa"/>
+          </w:tcPr>
+          <w:p>
+            <w:pPr>
+              <w:spacing w:after="160"/>
+            </w:pPr>
+            <w:r>
+              <w:t xml:space="preserve">ltfu_new = ltfu_new_suppressed + ltfu_new_unsuppressed = 1,275 + 675 = 1,950 </w:t>
+            </w:r>
+            <w:r>
+              <w:br/>
+            </w:r>
+            <w:r>
+              <w:br/>
+              <w:t xml:space="preserve">ltfu_new_suppressed = suppressed × 0.05 = 1,275 </w:t>
+            </w:r>
+            <w:r>
+              <w:br/>
+            </w:r>
+            <w:r>
+              <w:br/>
+              <w:t xml:space="preserve">ltfu_new_unsuppressed = unsuppressed × 0.15 = 675 </w:t>
+            </w:r>
+            <w:r>
+              <w:br/>
+            </w:r>
+            <w:r>
+              <w:br/>
+              <w:t>ltfu prevalent stock = on_art × 0.15 = 4,500</w:t>
+            </w:r>
+          </w:p>
+        </w:tc>
+      </w:tr>
+      <w:tr>
+        <w:trPr>
+          <w:trHeight w:val="457"/>
+        </w:trPr>
+        <w:tc>
+          <w:tcPr>
+            <w:tcW w:w="549" w:type="dxa"/>
+          </w:tcPr>
+          <w:p>
+            <w:pPr>
+              <w:spacing w:after="160"/>
+            </w:pPr>
+            <w:r>
+              <w:t>2</w:t>
+            </w:r>
+          </w:p>
+        </w:tc>
+        <w:tc>
+          <w:tcPr>
+            <w:tcW w:w="2140" w:type="dxa"/>
+          </w:tcPr>
+          <w:p>
+            <w:pPr>
+              <w:spacing w:after="160"/>
+            </w:pPr>
+            <w:r>
+              <w:t>Zero coverage</w:t>
+            </w:r>
+            <w:r>
+              <w:t xml:space="preserve"> of LTFU interventions and zero testing (MMD,</w:t>
+            </w:r>
+            <w:r>
+              <w:t xml:space="preserve"> </w:t>
+            </w:r>
+            <w:r>
+              <w:t>track and trace, adherence counselling)</w:t>
+            </w:r>
+            <w:r>
+              <w:br/>
+            </w:r>
+          </w:p>
+        </w:tc>
+        <w:tc>
+          <w:tcPr>
+            <w:tcW w:w="6462" w:type="dxa"/>
+          </w:tcPr>
+          <w:p>
+            <w:pPr>
+              <w:spacing w:after="160"/>
+            </w:pPr>
+            <w:r>
+              <w:t xml:space="preserve">ltfu_new_effective = ltfu_new = 1,950 </w:t>
+            </w:r>
+            <w:r>
+              <w:br/>
+            </w:r>
+            <w:r>
+              <w:br/>
+              <w:t xml:space="preserve">ltfu_prevented = 0 </w:t>
+            </w:r>
+            <w:r>
+              <w:br/>
+            </w:r>
+            <w:r>
+              <w:br/>
+              <w:t xml:space="preserve">ltfu_reengaged = 0 </w:t>
+            </w:r>
+            <w:r>
+              <w:br/>
+            </w:r>
+            <w:r>
+              <w:br/>
+              <w:t>end_on_art &lt; pops$on_art</w:t>
+            </w:r>
+          </w:p>
+        </w:tc>
+      </w:tr>
+      <w:tr>
+        <w:trPr>
+          <w:trHeight w:val="457"/>
+        </w:trPr>
+        <w:tc>
+          <w:tcPr>
+            <w:tcW w:w="549" w:type="dxa"/>
+          </w:tcPr>
+          <w:p>
+            <w:pPr>
+              <w:spacing w:after="160"/>
+            </w:pPr>
+            <w:r>
+              <w:lastRenderedPageBreak/>
+              <w:t>3</w:t>
+            </w:r>
+          </w:p>
+        </w:tc>
+        <w:tc>
+          <w:tcPr>
+            <w:tcW w:w="2140" w:type="dxa"/>
+          </w:tcPr>
+          <w:p>
+            <w:pPr>
+              <w:spacing w:after="160"/>
+            </w:pPr>
+            <w:r>
+              <w:t xml:space="preserve">MMD reduces new LTFU </w:t>
+            </w:r>
+          </w:p>
+        </w:tc>
+        <w:tc>
+          <w:tcPr>
+            <w:tcW w:w="6462" w:type="dxa"/>
+          </w:tcPr>
+          <w:p>
+            <w:pPr>
+              <w:spacing w:after="160"/>
+            </w:pPr>
+            <w:r>
+              <w:t xml:space="preserve">ltfu_new_effective (with MMD) &lt; ltfu_new_effective (no MMD) </w:t>
+            </w:r>
+            <w:r>
+              <w:br/>
+            </w:r>
+            <w:r>
+              <w:br/>
+              <w:t xml:space="preserve">ltfu_prevented (with MMD) &gt; 0 </w:t>
+            </w:r>
+          </w:p>
+        </w:tc>
+      </w:tr>
+      <w:tr>
+        <w:trPr>
+          <w:trHeight w:val="457"/>
+        </w:trPr>
+        <w:tc>
+          <w:tcPr>
+            <w:tcW w:w="549" w:type="dxa"/>
+          </w:tcPr>
+          <w:p>
+            <w:pPr>
+              <w:spacing w:after="160"/>
+            </w:pPr>
+            <w:r>
+              <w:t>4</w:t>
+            </w:r>
+          </w:p>
+        </w:tc>
+        <w:tc>
+          <w:tcPr>
+            <w:tcW w:w="2140" w:type="dxa"/>
+          </w:tcPr>
+          <w:p>
+            <w:pPr>
+              <w:spacing w:after="160"/>
+            </w:pPr>
+          </w:p>
+        </w:tc>
+        <w:tc>
+          <w:tcPr>
+            <w:tcW w:w="6462" w:type="dxa"/>
+          </w:tcPr>
+          <w:p>
+            <w:pPr>
+              <w:spacing w:after="160"/>
+            </w:pPr>
+          </w:p>
+        </w:tc>
+      </w:tr>
+      <w:tr>
+        <w:trPr>
+          <w:trHeight w:val="457"/>
+        </w:trPr>
+        <w:tc>
+          <w:tcPr>
+            <w:tcW w:w="549" w:type="dxa"/>
+          </w:tcPr>
+          <w:p>
+            <w:pPr>
+              <w:spacing w:after="160"/>
+            </w:pPr>
+            <w:r>
+              <w:t>5</w:t>
+            </w:r>
+          </w:p>
+        </w:tc>
+        <w:tc>
+          <w:tcPr>
+            <w:tcW w:w="2140" w:type="dxa"/>
+          </w:tcPr>
+          <w:p>
+            <w:pPr>
+              <w:spacing w:after="160"/>
+            </w:pPr>
+          </w:p>
+        </w:tc>
+        <w:tc>
+          <w:tcPr>
+            <w:tcW w:w="6462" w:type="dxa"/>
+          </w:tcPr>
+          <w:p>
+            <w:pPr>
+              <w:spacing w:after="160"/>
+            </w:pPr>
+          </w:p>
+        </w:tc>
+      </w:tr>
+      <w:tr>
+        <w:trPr>
+          <w:trHeight w:val="457"/>
+        </w:trPr>
+        <w:tc>
+          <w:tcPr>
+            <w:tcW w:w="549" w:type="dxa"/>
+          </w:tcPr>
+          <w:p>
+            <w:pPr>
+              <w:spacing w:after="160"/>
+            </w:pPr>
+            <w:r>
+              <w:t>6</w:t>
+            </w:r>
+          </w:p>
+        </w:tc>
+        <w:tc>
+          <w:tcPr>
+            <w:tcW w:w="2140" w:type="dxa"/>
+          </w:tcPr>
+          <w:p>
+            <w:pPr>
+              <w:spacing w:after="160"/>
+            </w:pPr>
+          </w:p>
+        </w:tc>
+        <w:tc>
+          <w:tcPr>
+            <w:tcW w:w="6462" w:type="dxa"/>
+          </w:tcPr>
+          <w:p>
+            <w:pPr>
+              <w:spacing w:after="160"/>
+            </w:pPr>
+          </w:p>
+        </w:tc>
+      </w:tr>
+      <w:tr>
+        <w:trPr>
+          <w:trHeight w:val="457"/>
+        </w:trPr>
+        <w:tc>
+          <w:tcPr>
+            <w:tcW w:w="549" w:type="dxa"/>
+          </w:tcPr>
+          <w:p>
+            <w:pPr>
+              <w:spacing w:after="160"/>
+            </w:pPr>
+            <w:r>
+              <w:t>7</w:t>
+            </w:r>
+          </w:p>
+        </w:tc>
+        <w:tc>
+          <w:tcPr>
+            <w:tcW w:w="2140" w:type="dxa"/>
+          </w:tcPr>
+          <w:p>
+            <w:pPr>
+              <w:spacing w:after="160"/>
+            </w:pPr>
+          </w:p>
+        </w:tc>
+        <w:tc>
+          <w:tcPr>
+            <w:tcW w:w="6462" w:type="dxa"/>
+          </w:tcPr>
+          <w:p>
+            <w:pPr>
+              <w:spacing w:after="160"/>
+            </w:pPr>
+          </w:p>
+        </w:tc>
+      </w:tr>
+      <w:tr>
+        <w:trPr>
+          <w:trHeight w:val="457"/>
+        </w:trPr>
+        <w:tc>
+          <w:tcPr>
+            <w:tcW w:w="549" w:type="dxa"/>
+          </w:tcPr>
+          <w:p>
+            <w:pPr>
+              <w:spacing w:after="160"/>
+            </w:pPr>
+            <w:r>
+              <w:t>8</w:t>
+            </w:r>
+          </w:p>
+        </w:tc>
+        <w:tc>
+          <w:tcPr>
+            <w:tcW w:w="2140" w:type="dxa"/>
+          </w:tcPr>
+          <w:p>
+            <w:pPr>
+              <w:spacing w:after="160"/>
+            </w:pPr>
+          </w:p>
+        </w:tc>
+        <w:tc>
+          <w:tcPr>
+            <w:tcW w:w="6462" w:type="dxa"/>
+          </w:tcPr>
+          <w:p>
+            <w:pPr>
+              <w:spacing w:after="160"/>
+            </w:pPr>
+          </w:p>
+        </w:tc>
+      </w:tr>
+      <w:tr>
+        <w:trPr>
+          <w:trHeight w:val="457"/>
+        </w:trPr>
+        <w:tc>
+          <w:tcPr>
+            <w:tcW w:w="549" w:type="dxa"/>
+          </w:tcPr>
+          <w:p>
+            <w:pPr>
+              <w:spacing w:after="160"/>
+            </w:pPr>
+            <w:r>
+              <w:t>9</w:t>
+            </w:r>
+          </w:p>
+        </w:tc>
+        <w:tc>
+          <w:tcPr>
+            <w:tcW w:w="2140" w:type="dxa"/>
+          </w:tcPr>
+          <w:p>
+            <w:pPr>
+              <w:spacing w:after="160"/>
+            </w:pPr>
+          </w:p>
+        </w:tc>
+        <w:tc>
+          <w:tcPr>
+            <w:tcW w:w="6462" w:type="dxa"/>
+          </w:tcPr>
+          <w:p>
+            <w:pPr>
+              <w:spacing w:after="160"/>
+            </w:pPr>
+          </w:p>
+        </w:tc>
+      </w:tr>
+      <w:tr>
+        <w:trPr>
+          <w:trHeight w:val="457"/>
+        </w:trPr>
+        <w:tc>
+          <w:tcPr>
+            <w:tcW w:w="549" w:type="dxa"/>
+          </w:tcPr>
+          <w:p>
+            <w:pPr>
+              <w:spacing w:after="160"/>
+            </w:pPr>
+            <w:r>
+              <w:t>10</w:t>
+            </w:r>
+          </w:p>
+        </w:tc>
+        <w:tc>
+          <w:tcPr>
+            <w:tcW w:w="2140" w:type="dxa"/>
+          </w:tcPr>
+          <w:p>
+            <w:pPr>
+              <w:spacing w:after="160"/>
+            </w:pPr>
+          </w:p>
+        </w:tc>
+        <w:tc>
+          <w:tcPr>
+            <w:tcW w:w="6462" w:type="dxa"/>
+          </w:tcPr>
+          <w:p>
+            <w:pPr>
+              <w:spacing w:after="160"/>
+            </w:pPr>
+          </w:p>
+        </w:tc>
+      </w:tr>
+      <w:tr>
+        <w:trPr>
+          <w:trHeight w:val="457"/>
+        </w:trPr>
+        <w:tc>
+          <w:tcPr>
+            <w:tcW w:w="549" w:type="dxa"/>
+          </w:tcPr>
+          <w:p>
+            <w:pPr>
+              <w:spacing w:after="160"/>
+            </w:pPr>
+            <w:r>
+              <w:t>11</w:t>
+            </w:r>
+          </w:p>
+        </w:tc>
+        <w:tc>
+          <w:tcPr>
+            <w:tcW w:w="2140" w:type="dxa"/>
+          </w:tcPr>
+          <w:p>
+            <w:pPr>
+              <w:spacing w:after="160"/>
+            </w:pPr>
+          </w:p>
+        </w:tc>
+        <w:tc>
+          <w:tcPr>
+            <w:tcW w:w="6462" w:type="dxa"/>
+          </w:tcPr>
+          <w:p>
+            <w:pPr>
+              <w:spacing w:after="160"/>
+            </w:pPr>
+          </w:p>
+        </w:tc>
+      </w:tr>
+      <w:tr>
+        <w:trPr>
+          <w:trHeight w:val="457"/>
+        </w:trPr>
+        <w:tc>
+          <w:tcPr>
+            <w:tcW w:w="549" w:type="dxa"/>
+          </w:tcPr>
+          <w:p>
+            <w:pPr>
+              <w:spacing w:after="160"/>
+            </w:pPr>
+            <w:r>
+              <w:t>12</w:t>
+            </w:r>
+          </w:p>
+        </w:tc>
+        <w:tc>
+          <w:tcPr>
+            <w:tcW w:w="2140" w:type="dxa"/>
+          </w:tcPr>
+          <w:p>
+            <w:pPr>
+              <w:spacing w:after="160"/>
+            </w:pPr>
+          </w:p>
+        </w:tc>
+        <w:tc>
+          <w:tcPr>
+            <w:tcW w:w="6462" w:type="dxa"/>
+          </w:tcPr>
+          <w:p>
+            <w:pPr>
+              <w:spacing w:after="160"/>
+            </w:pPr>
+          </w:p>
+        </w:tc>
+      </w:tr>
+      <w:tr>
+        <w:trPr>
+          <w:trHeight w:val="457"/>
+        </w:trPr>
+        <w:tc>
+          <w:tcPr>
+            <w:tcW w:w="549" w:type="dxa"/>
+          </w:tcPr>
+          <w:p>
+            <w:pPr>
+              <w:spacing w:after="160"/>
+            </w:pPr>
+            <w:r>
+              <w:t>13</w:t>
+            </w:r>
+          </w:p>
+        </w:tc>
+        <w:tc>
+          <w:tcPr>
+            <w:tcW w:w="2140" w:type="dxa"/>
+          </w:tcPr>
+          <w:p>
+            <w:pPr>
+              <w:spacing w:after="160"/>
+            </w:pPr>
+          </w:p>
+        </w:tc>
+        <w:tc>
+          <w:tcPr>
+            <w:tcW w:w="6462" w:type="dxa"/>
+          </w:tcPr>
+          <w:p>
+            <w:pPr>
+              <w:spacing w:after="160"/>
+            </w:pPr>
+          </w:p>
+        </w:tc>
+      </w:tr>
+      <w:tr>
+        <w:trPr>
+          <w:trHeight w:val="457"/>
+        </w:trPr>
+        <w:tc>
+          <w:tcPr>
+            <w:tcW w:w="549" w:type="dxa"/>
+          </w:tcPr>
+          <w:p>
+            <w:pPr>
+              <w:spacing w:after="160"/>
+            </w:pPr>
+            <w:r>
+              <w:t>14</w:t>
+            </w:r>
+          </w:p>
+        </w:tc>
+        <w:tc>
+          <w:tcPr>
+            <w:tcW w:w="2140" w:type="dxa"/>
+          </w:tcPr>
+          <w:p>
+            <w:pPr>
+              <w:spacing w:after="160"/>
+            </w:pPr>
+          </w:p>
+        </w:tc>
+        <w:tc>
+          <w:tcPr>
+            <w:tcW w:w="6462" w:type="dxa"/>
+          </w:tcPr>
+          <w:p>
+            <w:pPr>
+              <w:spacing w:after="160"/>
+            </w:pPr>
+          </w:p>
+        </w:tc>
+      </w:tr>
+      <w:tr>
+        <w:trPr>
+          <w:trHeight w:val="457"/>
+        </w:trPr>
+        <w:tc>
+          <w:tcPr>
+            <w:tcW w:w="549" w:type="dxa"/>
+          </w:tcPr>
+          <w:p>
+            <w:pPr>
+              <w:spacing w:after="160"/>
+            </w:pPr>
+            <w:r>
+              <w:t>15</w:t>
+            </w:r>
+          </w:p>
+        </w:tc>
+        <w:tc>
+          <w:tcPr>
+            <w:tcW w:w="2140" w:type="dxa"/>
+          </w:tcPr>
+          <w:p>
+            <w:pPr>
+              <w:spacing w:after="160"/>
+            </w:pPr>
+          </w:p>
+        </w:tc>
+        <w:tc>
+          <w:tcPr>
+            <w:tcW w:w="6462" w:type="dxa"/>
+          </w:tcPr>
           <w:p>
             <w:pPr>
               <w:spacing w:after="160"/>
@@ -12943,6 +13797,155 @@
     </w:lvl>
   </w:abstractNum>
   <w:abstractNum w:abstractNumId="16" w15:restartNumberingAfterBreak="0">
+    <w:nsid w:val="31584585"/>
+    <w:multiLevelType w:val="multilevel"/>
+    <w:tmpl w:val="A4FCDFAC"/>
+    <w:lvl w:ilvl="0">
+      <w:start w:val="1"/>
+      <w:numFmt w:val="bullet"/>
+      <w:lvlText w:val=""/>
+      <w:lvlJc w:val="left"/>
+      <w:pPr>
+        <w:tabs>
+          <w:tab w:val="num" w:pos="720"/>
+        </w:tabs>
+        <w:ind w:left="720" w:hanging="360"/>
+      </w:pPr>
+      <w:rPr>
+        <w:rFonts w:ascii="Symbol" w:hAnsi="Symbol" w:hint="default"/>
+        <w:sz w:val="20"/>
+      </w:rPr>
+    </w:lvl>
+    <w:lvl w:ilvl="1" w:tentative="1">
+      <w:start w:val="1"/>
+      <w:numFmt w:val="bullet"/>
+      <w:lvlText w:val="o"/>
+      <w:lvlJc w:val="left"/>
+      <w:pPr>
+        <w:tabs>
+          <w:tab w:val="num" w:pos="1440"/>
+        </w:tabs>
+        <w:ind w:left="1440" w:hanging="360"/>
+      </w:pPr>
+      <w:rPr>
+        <w:rFonts w:ascii="Courier New" w:hAnsi="Courier New" w:hint="default"/>
+        <w:sz w:val="20"/>
+      </w:rPr>
+    </w:lvl>
+    <w:lvl w:ilvl="2" w:tentative="1">
+      <w:start w:val="1"/>
+      <w:numFmt w:val="bullet"/>
+      <w:lvlText w:val=""/>
+      <w:lvlJc w:val="left"/>
+      <w:pPr>
+        <w:tabs>
+          <w:tab w:val="num" w:pos="2160"/>
+        </w:tabs>
+        <w:ind w:left="2160" w:hanging="360"/>
+      </w:pPr>
+      <w:rPr>
+        <w:rFonts w:ascii="Wingdings" w:hAnsi="Wingdings" w:hint="default"/>
+        <w:sz w:val="20"/>
+      </w:rPr>
+    </w:lvl>
+    <w:lvl w:ilvl="3" w:tentative="1">
+      <w:start w:val="1"/>
+      <w:numFmt w:val="bullet"/>
+      <w:lvlText w:val=""/>
+      <w:lvlJc w:val="left"/>
+      <w:pPr>
+        <w:tabs>
+          <w:tab w:val="num" w:pos="2880"/>
+        </w:tabs>
+        <w:ind w:left="2880" w:hanging="360"/>
+      </w:pPr>
+      <w:rPr>
+        <w:rFonts w:ascii="Wingdings" w:hAnsi="Wingdings" w:hint="default"/>
+        <w:sz w:val="20"/>
+      </w:rPr>
+    </w:lvl>
+    <w:lvl w:ilvl="4" w:tentative="1">
+      <w:start w:val="1"/>
+      <w:numFmt w:val="bullet"/>
+      <w:lvlText w:val=""/>
+      <w:lvlJc w:val="left"/>
+      <w:pPr>
+        <w:tabs>
+          <w:tab w:val="num" w:pos="3600"/>
+        </w:tabs>
+        <w:ind w:left="3600" w:hanging="360"/>
+      </w:pPr>
+      <w:rPr>
+        <w:rFonts w:ascii="Wingdings" w:hAnsi="Wingdings" w:hint="default"/>
+        <w:sz w:val="20"/>
+      </w:rPr>
+    </w:lvl>
+    <w:lvl w:ilvl="5" w:tentative="1">
+      <w:start w:val="1"/>
+      <w:numFmt w:val="bullet"/>
+      <w:lvlText w:val=""/>
+      <w:lvlJc w:val="left"/>
+      <w:pPr>
+        <w:tabs>
+          <w:tab w:val="num" w:pos="4320"/>
+        </w:tabs>
+        <w:ind w:left="4320" w:hanging="360"/>
+      </w:pPr>
+      <w:rPr>
+        <w:rFonts w:ascii="Wingdings" w:hAnsi="Wingdings" w:hint="default"/>
+        <w:sz w:val="20"/>
+      </w:rPr>
+    </w:lvl>
+    <w:lvl w:ilvl="6" w:tentative="1">
+      <w:start w:val="1"/>
+      <w:numFmt w:val="bullet"/>
+      <w:lvlText w:val=""/>
+      <w:lvlJc w:val="left"/>
+      <w:pPr>
+        <w:tabs>
+          <w:tab w:val="num" w:pos="5040"/>
+        </w:tabs>
+        <w:ind w:left="5040" w:hanging="360"/>
+      </w:pPr>
+      <w:rPr>
+        <w:rFonts w:ascii="Wingdings" w:hAnsi="Wingdings" w:hint="default"/>
+        <w:sz w:val="20"/>
+      </w:rPr>
+    </w:lvl>
+    <w:lvl w:ilvl="7" w:tentative="1">
+      <w:start w:val="1"/>
+      <w:numFmt w:val="bullet"/>
+      <w:lvlText w:val=""/>
+      <w:lvlJc w:val="left"/>
+      <w:pPr>
+        <w:tabs>
+          <w:tab w:val="num" w:pos="5760"/>
+        </w:tabs>
+        <w:ind w:left="5760" w:hanging="360"/>
+      </w:pPr>
+      <w:rPr>
+        <w:rFonts w:ascii="Wingdings" w:hAnsi="Wingdings" w:hint="default"/>
+        <w:sz w:val="20"/>
+      </w:rPr>
+    </w:lvl>
+    <w:lvl w:ilvl="8" w:tentative="1">
+      <w:start w:val="1"/>
+      <w:numFmt w:val="bullet"/>
+      <w:lvlText w:val=""/>
+      <w:lvlJc w:val="left"/>
+      <w:pPr>
+        <w:tabs>
+          <w:tab w:val="num" w:pos="6480"/>
+        </w:tabs>
+        <w:ind w:left="6480" w:hanging="360"/>
+      </w:pPr>
+      <w:rPr>
+        <w:rFonts w:ascii="Wingdings" w:hAnsi="Wingdings" w:hint="default"/>
+        <w:sz w:val="20"/>
+      </w:rPr>
+    </w:lvl>
+  </w:abstractNum>
+  <w:abstractNum w:abstractNumId="17" w15:restartNumberingAfterBreak="0">
     <w:nsid w:val="31CA4C82"/>
     <w:multiLevelType w:val="multilevel"/>
     <w:tmpl w:val="CE788926"/>
@@ -13091,7 +14094,7 @@
       </w:rPr>
     </w:lvl>
   </w:abstractNum>
-  <w:abstractNum w:abstractNumId="17" w15:restartNumberingAfterBreak="0">
+  <w:abstractNum w:abstractNumId="18" w15:restartNumberingAfterBreak="0">
     <w:nsid w:val="33B96DDF"/>
     <w:multiLevelType w:val="multilevel"/>
     <w:tmpl w:val="884647CE"/>
@@ -13240,7 +14243,7 @@
       </w:rPr>
     </w:lvl>
   </w:abstractNum>
-  <w:abstractNum w:abstractNumId="18" w15:restartNumberingAfterBreak="0">
+  <w:abstractNum w:abstractNumId="19" w15:restartNumberingAfterBreak="0">
     <w:nsid w:val="34F85DF1"/>
     <w:multiLevelType w:val="hybridMultilevel"/>
     <w:tmpl w:val="6DACE55E"/>
@@ -13326,7 +14329,7 @@
       </w:pPr>
     </w:lvl>
   </w:abstractNum>
-  <w:abstractNum w:abstractNumId="19" w15:restartNumberingAfterBreak="0">
+  <w:abstractNum w:abstractNumId="20" w15:restartNumberingAfterBreak="0">
     <w:nsid w:val="372A72B3"/>
     <w:multiLevelType w:val="multilevel"/>
     <w:tmpl w:val="15A82688"/>
@@ -13475,7 +14478,7 @@
       </w:rPr>
     </w:lvl>
   </w:abstractNum>
-  <w:abstractNum w:abstractNumId="20" w15:restartNumberingAfterBreak="0">
+  <w:abstractNum w:abstractNumId="21" w15:restartNumberingAfterBreak="0">
     <w:nsid w:val="3F2520BF"/>
     <w:multiLevelType w:val="multilevel"/>
     <w:tmpl w:val="10167F0A"/>
@@ -13624,7 +14627,7 @@
       </w:rPr>
     </w:lvl>
   </w:abstractNum>
-  <w:abstractNum w:abstractNumId="21" w15:restartNumberingAfterBreak="0">
+  <w:abstractNum w:abstractNumId="22" w15:restartNumberingAfterBreak="0">
     <w:nsid w:val="43BC3CCF"/>
     <w:multiLevelType w:val="multilevel"/>
     <w:tmpl w:val="3C8C1408"/>
@@ -13773,7 +14776,7 @@
       </w:rPr>
     </w:lvl>
   </w:abstractNum>
-  <w:abstractNum w:abstractNumId="22" w15:restartNumberingAfterBreak="0">
+  <w:abstractNum w:abstractNumId="23" w15:restartNumberingAfterBreak="0">
     <w:nsid w:val="460B64B9"/>
     <w:multiLevelType w:val="multilevel"/>
     <w:tmpl w:val="926CE0C2"/>
@@ -13922,7 +14925,7 @@
       </w:rPr>
     </w:lvl>
   </w:abstractNum>
-  <w:abstractNum w:abstractNumId="23" w15:restartNumberingAfterBreak="0">
+  <w:abstractNum w:abstractNumId="24" w15:restartNumberingAfterBreak="0">
     <w:nsid w:val="46D52C4A"/>
     <w:multiLevelType w:val="multilevel"/>
     <w:tmpl w:val="AD7CEAA0"/>
@@ -14071,7 +15074,7 @@
       </w:rPr>
     </w:lvl>
   </w:abstractNum>
-  <w:abstractNum w:abstractNumId="24" w15:restartNumberingAfterBreak="0">
+  <w:abstractNum w:abstractNumId="25" w15:restartNumberingAfterBreak="0">
     <w:nsid w:val="46EB78A3"/>
     <w:multiLevelType w:val="multilevel"/>
     <w:tmpl w:val="C026F046"/>
@@ -14220,7 +15223,7 @@
       </w:rPr>
     </w:lvl>
   </w:abstractNum>
-  <w:abstractNum w:abstractNumId="25" w15:restartNumberingAfterBreak="0">
+  <w:abstractNum w:abstractNumId="26" w15:restartNumberingAfterBreak="0">
     <w:nsid w:val="4E1F3226"/>
     <w:multiLevelType w:val="hybridMultilevel"/>
     <w:tmpl w:val="B32C39DC"/>
@@ -14333,7 +15336,7 @@
       </w:rPr>
     </w:lvl>
   </w:abstractNum>
-  <w:abstractNum w:abstractNumId="26" w15:restartNumberingAfterBreak="0">
+  <w:abstractNum w:abstractNumId="27" w15:restartNumberingAfterBreak="0">
     <w:nsid w:val="51852F6C"/>
     <w:multiLevelType w:val="hybridMultilevel"/>
     <w:tmpl w:val="B8E25894"/>
@@ -14446,7 +15449,7 @@
       </w:rPr>
     </w:lvl>
   </w:abstractNum>
-  <w:abstractNum w:abstractNumId="27" w15:restartNumberingAfterBreak="0">
+  <w:abstractNum w:abstractNumId="28" w15:restartNumberingAfterBreak="0">
     <w:nsid w:val="52460709"/>
     <w:multiLevelType w:val="multilevel"/>
     <w:tmpl w:val="0A5A706E"/>
@@ -14595,7 +15598,7 @@
       </w:rPr>
     </w:lvl>
   </w:abstractNum>
-  <w:abstractNum w:abstractNumId="28" w15:restartNumberingAfterBreak="0">
+  <w:abstractNum w:abstractNumId="29" w15:restartNumberingAfterBreak="0">
     <w:nsid w:val="57EA6864"/>
     <w:multiLevelType w:val="hybridMultilevel"/>
     <w:tmpl w:val="2DDE0918"/>
@@ -14708,7 +15711,7 @@
       </w:rPr>
     </w:lvl>
   </w:abstractNum>
-  <w:abstractNum w:abstractNumId="29" w15:restartNumberingAfterBreak="0">
+  <w:abstractNum w:abstractNumId="30" w15:restartNumberingAfterBreak="0">
     <w:nsid w:val="589100E7"/>
     <w:multiLevelType w:val="hybridMultilevel"/>
     <w:tmpl w:val="AE48755C"/>
@@ -14797,7 +15800,7 @@
       </w:pPr>
     </w:lvl>
   </w:abstractNum>
-  <w:abstractNum w:abstractNumId="30" w15:restartNumberingAfterBreak="0">
+  <w:abstractNum w:abstractNumId="31" w15:restartNumberingAfterBreak="0">
     <w:nsid w:val="5BDB22FF"/>
     <w:multiLevelType w:val="multilevel"/>
     <w:tmpl w:val="9A624C48"/>
@@ -14946,7 +15949,7 @@
       </w:rPr>
     </w:lvl>
   </w:abstractNum>
-  <w:abstractNum w:abstractNumId="31" w15:restartNumberingAfterBreak="0">
+  <w:abstractNum w:abstractNumId="32" w15:restartNumberingAfterBreak="0">
     <w:nsid w:val="5DC05C83"/>
     <w:multiLevelType w:val="hybridMultilevel"/>
     <w:tmpl w:val="C6707418"/>
@@ -15059,7 +16062,7 @@
       </w:rPr>
     </w:lvl>
   </w:abstractNum>
-  <w:abstractNum w:abstractNumId="32" w15:restartNumberingAfterBreak="0">
+  <w:abstractNum w:abstractNumId="33" w15:restartNumberingAfterBreak="0">
     <w:nsid w:val="64B25DB8"/>
     <w:multiLevelType w:val="hybridMultilevel"/>
     <w:tmpl w:val="3176DDE4"/>
@@ -15172,7 +16175,7 @@
       </w:rPr>
     </w:lvl>
   </w:abstractNum>
-  <w:abstractNum w:abstractNumId="33" w15:restartNumberingAfterBreak="0">
+  <w:abstractNum w:abstractNumId="34" w15:restartNumberingAfterBreak="0">
     <w:nsid w:val="715B01F7"/>
     <w:multiLevelType w:val="multilevel"/>
     <w:tmpl w:val="17D484E4"/>
@@ -15321,7 +16324,7 @@
       </w:rPr>
     </w:lvl>
   </w:abstractNum>
-  <w:abstractNum w:abstractNumId="34" w15:restartNumberingAfterBreak="0">
+  <w:abstractNum w:abstractNumId="35" w15:restartNumberingAfterBreak="0">
     <w:nsid w:val="7AC80EA7"/>
     <w:multiLevelType w:val="multilevel"/>
     <w:tmpl w:val="8ECCB664"/>
@@ -15470,7 +16473,7 @@
       </w:rPr>
     </w:lvl>
   </w:abstractNum>
-  <w:abstractNum w:abstractNumId="35" w15:restartNumberingAfterBreak="0">
+  <w:abstractNum w:abstractNumId="36" w15:restartNumberingAfterBreak="0">
     <w:nsid w:val="7E5430E8"/>
     <w:multiLevelType w:val="multilevel"/>
     <w:tmpl w:val="FF002A7A"/>
@@ -15629,19 +16632,19 @@
     <w:abstractNumId w:val="5"/>
   </w:num>
   <w:num w:numId="4" w16cid:durableId="1587029756">
-    <w:abstractNumId w:val="29"/>
+    <w:abstractNumId w:val="30"/>
   </w:num>
   <w:num w:numId="5" w16cid:durableId="1895044576">
-    <w:abstractNumId w:val="18"/>
+    <w:abstractNumId w:val="19"/>
     <w:lvlOverride w:ilvl="0">
       <w:startOverride w:val="1"/>
     </w:lvlOverride>
   </w:num>
   <w:num w:numId="6" w16cid:durableId="945699028">
-    <w:abstractNumId w:val="28"/>
+    <w:abstractNumId w:val="29"/>
   </w:num>
   <w:num w:numId="7" w16cid:durableId="2089231128">
-    <w:abstractNumId w:val="26"/>
+    <w:abstractNumId w:val="27"/>
   </w:num>
   <w:num w:numId="8" w16cid:durableId="1598639917">
     <w:abstractNumId w:val="13"/>
@@ -15653,49 +16656,49 @@
     <w:abstractNumId w:val="9"/>
   </w:num>
   <w:num w:numId="11" w16cid:durableId="400906209">
-    <w:abstractNumId w:val="25"/>
+    <w:abstractNumId w:val="26"/>
   </w:num>
   <w:num w:numId="12" w16cid:durableId="1488978462">
-    <w:abstractNumId w:val="31"/>
+    <w:abstractNumId w:val="32"/>
   </w:num>
   <w:num w:numId="13" w16cid:durableId="1082490718">
     <w:abstractNumId w:val="8"/>
   </w:num>
   <w:num w:numId="14" w16cid:durableId="892691908">
-    <w:abstractNumId w:val="32"/>
+    <w:abstractNumId w:val="33"/>
   </w:num>
   <w:num w:numId="15" w16cid:durableId="1421564118">
-    <w:abstractNumId w:val="23"/>
+    <w:abstractNumId w:val="24"/>
   </w:num>
   <w:num w:numId="16" w16cid:durableId="711271180">
-    <w:abstractNumId w:val="24"/>
+    <w:abstractNumId w:val="25"/>
   </w:num>
   <w:num w:numId="17" w16cid:durableId="1226603131">
-    <w:abstractNumId w:val="19"/>
+    <w:abstractNumId w:val="20"/>
   </w:num>
   <w:num w:numId="18" w16cid:durableId="1009989069">
     <w:abstractNumId w:val="6"/>
   </w:num>
   <w:num w:numId="19" w16cid:durableId="1876113810">
-    <w:abstractNumId w:val="30"/>
+    <w:abstractNumId w:val="31"/>
   </w:num>
   <w:num w:numId="20" w16cid:durableId="258952305">
-    <w:abstractNumId w:val="17"/>
+    <w:abstractNumId w:val="18"/>
   </w:num>
   <w:num w:numId="21" w16cid:durableId="193269063">
-    <w:abstractNumId w:val="22"/>
+    <w:abstractNumId w:val="23"/>
   </w:num>
   <w:num w:numId="22" w16cid:durableId="1957787929">
-    <w:abstractNumId w:val="35"/>
+    <w:abstractNumId w:val="36"/>
   </w:num>
   <w:num w:numId="23" w16cid:durableId="1798525176">
     <w:abstractNumId w:val="0"/>
   </w:num>
   <w:num w:numId="24" w16cid:durableId="2012947173">
-    <w:abstractNumId w:val="21"/>
+    <w:abstractNumId w:val="22"/>
   </w:num>
   <w:num w:numId="25" w16cid:durableId="1288661012">
-    <w:abstractNumId w:val="27"/>
+    <w:abstractNumId w:val="28"/>
   </w:num>
   <w:num w:numId="26" w16cid:durableId="1264921622">
     <w:abstractNumId w:val="1"/>
@@ -15713,22 +16716,25 @@
     <w:abstractNumId w:val="4"/>
   </w:num>
   <w:num w:numId="31" w16cid:durableId="60909378">
-    <w:abstractNumId w:val="20"/>
+    <w:abstractNumId w:val="21"/>
   </w:num>
   <w:num w:numId="32" w16cid:durableId="1784156210">
     <w:abstractNumId w:val="7"/>
   </w:num>
   <w:num w:numId="33" w16cid:durableId="1484656781">
-    <w:abstractNumId w:val="33"/>
+    <w:abstractNumId w:val="34"/>
   </w:num>
   <w:num w:numId="34" w16cid:durableId="1937707773">
-    <w:abstractNumId w:val="16"/>
+    <w:abstractNumId w:val="17"/>
   </w:num>
   <w:num w:numId="35" w16cid:durableId="1147013167">
-    <w:abstractNumId w:val="34"/>
+    <w:abstractNumId w:val="35"/>
   </w:num>
   <w:num w:numId="36" w16cid:durableId="2011564385">
     <w:abstractNumId w:val="15"/>
+  </w:num>
+  <w:num w:numId="37" w16cid:durableId="747532743">
+    <w:abstractNumId w:val="16"/>
   </w:num>
 </w:numbering>
 </file>

</xml_diff>

<commit_message>
First infections and prevention
</commit_message>
<xml_diff>
--- a/resources/Test_Framework_Description.docx
+++ b/resources/Test_Framework_Description.docx
@@ -10592,10 +10592,7 @@
         <w:pStyle w:val="Heading2"/>
       </w:pPr>
       <w:r>
-        <w:t xml:space="preserve">Test set: </w:t>
-      </w:r>
-      <w:r>
-        <w:t>LTFU and retention</w:t>
+        <w:t>Test set: LTFU and retention</w:t>
       </w:r>
     </w:p>
     <w:p>
@@ -10811,7 +10808,7 @@
       </w:tblPr>
       <w:tblGrid>
         <w:gridCol w:w="549"/>
-        <w:gridCol w:w="1998"/>
+        <w:gridCol w:w="2016"/>
         <w:gridCol w:w="6604"/>
       </w:tblGrid>
       <w:tr>
@@ -10841,7 +10838,7 @@
         </w:tc>
         <w:tc>
           <w:tcPr>
-            <w:tcW w:w="1998" w:type="dxa"/>
+            <w:tcW w:w="2016" w:type="dxa"/>
           </w:tcPr>
           <w:p>
             <w:pPr>
@@ -10902,17 +10899,14 @@
         </w:tc>
         <w:tc>
           <w:tcPr>
-            <w:tcW w:w="1998" w:type="dxa"/>
-          </w:tcPr>
-          <w:p>
-            <w:pPr>
-              <w:spacing w:after="160"/>
-            </w:pPr>
-            <w:r>
-              <w:t>LTFU flow fields sum correctly and use correct rates</w:t>
-            </w:r>
-            <w:r>
-              <w:t xml:space="preserve"> </w:t>
+            <w:tcW w:w="2016" w:type="dxa"/>
+          </w:tcPr>
+          <w:p>
+            <w:pPr>
+              <w:spacing w:after="160"/>
+            </w:pPr>
+            <w:r>
+              <w:t xml:space="preserve">LTFU flow fields sum correctly and use correct rates </w:t>
             </w:r>
           </w:p>
         </w:tc>
@@ -10973,7 +10967,7 @@
         </w:tc>
         <w:tc>
           <w:tcPr>
-            <w:tcW w:w="1998" w:type="dxa"/>
+            <w:tcW w:w="2016" w:type="dxa"/>
           </w:tcPr>
           <w:p>
             <w:pPr>
@@ -11054,7 +11048,7 @@
         </w:tc>
         <w:tc>
           <w:tcPr>
-            <w:tcW w:w="1998" w:type="dxa"/>
+            <w:tcW w:w="2016" w:type="dxa"/>
           </w:tcPr>
           <w:p>
             <w:pPr>
@@ -11108,7 +11102,7 @@
         </w:tc>
         <w:tc>
           <w:tcPr>
-            <w:tcW w:w="1998" w:type="dxa"/>
+            <w:tcW w:w="2016" w:type="dxa"/>
           </w:tcPr>
           <w:p>
             <w:pPr>
@@ -11146,16 +11140,7 @@
               <w:spacing w:after="160"/>
             </w:pPr>
             <w:r>
-              <w:t>ltfu</w:t>
-            </w:r>
-            <w:r>
-              <w:t>_new_effective (</w:t>
-            </w:r>
-            <w:r>
-              <w:t>80%</w:t>
-            </w:r>
-            <w:r>
-              <w:t>) &lt; ltfu_new_effective (</w:t>
+              <w:t>ltfu_new_effective (80%) &lt; ltfu_new_effective (</w:t>
             </w:r>
             <w:r>
               <w:t>20%)</w:t>
@@ -11174,13 +11159,7 @@
               <w:t>ltfu_prevented</w:t>
             </w:r>
             <w:r>
-              <w:t xml:space="preserve"> (80%) &gt; </w:t>
-            </w:r>
-            <w:r>
-              <w:t>ltfu_prevented</w:t>
-            </w:r>
-            <w:r>
-              <w:t xml:space="preserve"> (20%)</w:t>
+              <w:t xml:space="preserve"> (80%) &gt; ltfu_prevented (20%)</w:t>
             </w:r>
           </w:p>
         </w:tc>
@@ -11207,7 +11186,7 @@
         </w:tc>
         <w:tc>
           <w:tcPr>
-            <w:tcW w:w="1998" w:type="dxa"/>
+            <w:tcW w:w="2016" w:type="dxa"/>
           </w:tcPr>
           <w:p>
             <w:pPr>
@@ -11251,17 +11230,14 @@
         </w:tc>
         <w:tc>
           <w:tcPr>
-            <w:tcW w:w="1998" w:type="dxa"/>
-          </w:tcPr>
-          <w:p>
-            <w:pPr>
-              <w:spacing w:after="160"/>
-            </w:pPr>
-            <w:r>
-              <w:t>Adherence counselling</w:t>
-            </w:r>
-            <w:r>
-              <w:t xml:space="preserve"> reduces new LTFU</w:t>
+            <w:tcW w:w="2016" w:type="dxa"/>
+          </w:tcPr>
+          <w:p>
+            <w:pPr>
+              <w:spacing w:after="160"/>
+            </w:pPr>
+            <w:r>
+              <w:t>Adherence counselling reduces new LTFU</w:t>
             </w:r>
           </w:p>
         </w:tc>
@@ -11274,19 +11250,7 @@
               <w:spacing w:after="160"/>
             </w:pPr>
             <w:r>
-              <w:t xml:space="preserve">ltfu_new_effective (with </w:t>
-            </w:r>
-            <w:r>
-              <w:t>adhc</w:t>
-            </w:r>
-            <w:r>
-              <w:t xml:space="preserve">) &lt; ltfu_new_effective (no </w:t>
-            </w:r>
-            <w:r>
-              <w:t>adhc</w:t>
-            </w:r>
-            <w:r>
-              <w:t>)</w:t>
+              <w:t>ltfu_new_effective (with adhc) &lt; ltfu_new_effective (no adhc)</w:t>
             </w:r>
           </w:p>
         </w:tc>
@@ -11310,7 +11274,7 @@
         </w:tc>
         <w:tc>
           <w:tcPr>
-            <w:tcW w:w="1998" w:type="dxa"/>
+            <w:tcW w:w="2016" w:type="dxa"/>
           </w:tcPr>
           <w:p>
             <w:pPr>
@@ -11339,16 +11303,7 @@
               <w:spacing w:after="160"/>
             </w:pPr>
             <w:r>
-              <w:t>ltfu_new_effective</w:t>
-            </w:r>
-            <w:r>
-              <w:t xml:space="preserve"> (both) &lt; </w:t>
-            </w:r>
-            <w:r>
-              <w:t>ltfu_new_effective</w:t>
-            </w:r>
-            <w:r>
-              <w:t xml:space="preserve"> (</w:t>
+              <w:t>ltfu_new_effective (both) &lt; ltfu_new_effective (</w:t>
             </w:r>
             <w:r>
               <w:t>mmd only)</w:t>
@@ -11364,13 +11319,7 @@
               <w:spacing w:after="160"/>
             </w:pPr>
             <w:r>
-              <w:t>ltfu_new_effective (both) &lt; ltfu_new_effective (</w:t>
-            </w:r>
-            <w:r>
-              <w:t>adhc</w:t>
-            </w:r>
-            <w:r>
-              <w:t xml:space="preserve"> only)</w:t>
+              <w:t>ltfu_new_effective (both) &lt; ltfu_new_effective (adhc only)</w:t>
             </w:r>
           </w:p>
           <w:p>
@@ -11407,7 +11356,7 @@
         </w:tc>
         <w:tc>
           <w:tcPr>
-            <w:tcW w:w="1998" w:type="dxa"/>
+            <w:tcW w:w="2016" w:type="dxa"/>
           </w:tcPr>
           <w:p>
             <w:pPr>
@@ -11417,7 +11366,13 @@
               <w:t xml:space="preserve">Track and trace returns </w:t>
             </w:r>
             <w:r>
-              <w:t>LTFU patients, does not effect new LTFU rates</w:t>
+              <w:t xml:space="preserve">LTFU patients, does not </w:t>
+            </w:r>
+            <w:r>
+              <w:t>a</w:t>
+            </w:r>
+            <w:r>
+              <w:t>ffect new LTFU rates</w:t>
             </w:r>
           </w:p>
         </w:tc>
@@ -11429,6 +11384,66 @@
             <w:pPr>
               <w:spacing w:after="160"/>
             </w:pPr>
+            <w:r>
+              <w:t xml:space="preserve">Ltfu_reengaged (track&amp;trace) &gt; Ltfu_ </w:t>
+            </w:r>
+            <w:r>
+              <w:t>reengaged</w:t>
+            </w:r>
+            <w:r>
+              <w:t xml:space="preserve"> (no track&amp;traced</w:t>
+            </w:r>
+            <w:r>
+              <w:t>)</w:t>
+            </w:r>
+          </w:p>
+          <w:p>
+            <w:pPr>
+              <w:spacing w:after="160"/>
+            </w:pPr>
+          </w:p>
+          <w:p>
+            <w:pPr>
+              <w:spacing w:after="160"/>
+            </w:pPr>
+            <w:r>
+              <w:t>ltfu_prevented</w:t>
+            </w:r>
+            <w:r>
+              <w:t xml:space="preserve">(track&amp;trace) = </w:t>
+            </w:r>
+            <w:r>
+              <w:t>ltfu_prevented</w:t>
+            </w:r>
+            <w:r>
+              <w:t xml:space="preserve"> (no track&amp;trace)</w:t>
+            </w:r>
+          </w:p>
+          <w:p>
+            <w:pPr>
+              <w:spacing w:after="160"/>
+            </w:pPr>
+          </w:p>
+          <w:p>
+            <w:pPr>
+              <w:spacing w:after="160"/>
+            </w:pPr>
+            <w:r>
+              <w:t>ltfu_new_effective (track&amp;trace) = ltfu_new_effective (no track&amp;trace)</w:t>
+            </w:r>
+          </w:p>
+          <w:p>
+            <w:pPr>
+              <w:spacing w:after="160"/>
+            </w:pPr>
+          </w:p>
+          <w:p>
+            <w:pPr>
+              <w:spacing w:after="160"/>
+            </w:pPr>
+            <w:r>
+              <w:t>end_on_art (track&amp;trace) &gt; end_on_art (no track&amp;trace)</w:t>
+            </w:r>
           </w:p>
         </w:tc>
       </w:tr>
@@ -11451,12 +11466,25 @@
         </w:tc>
         <w:tc>
           <w:tcPr>
-            <w:tcW w:w="1998" w:type="dxa"/>
-          </w:tcPr>
-          <w:p>
-            <w:pPr>
-              <w:spacing w:after="160"/>
-            </w:pPr>
+            <w:tcW w:w="2016" w:type="dxa"/>
+          </w:tcPr>
+          <w:p>
+            <w:pPr>
+              <w:spacing w:after="160"/>
+            </w:pPr>
+            <w:r>
+              <w:t xml:space="preserve">Higher track&amp;trace coverage </w:t>
+            </w:r>
+            <w:r>
+              <w:lastRenderedPageBreak/>
+              <w:t xml:space="preserve">reengaged </w:t>
+            </w:r>
+            <w:r>
+              <w:t xml:space="preserve">proportionally </w:t>
+            </w:r>
+            <w:r>
+              <w:t>more patients (80%vs 20%)</w:t>
+            </w:r>
           </w:p>
         </w:tc>
         <w:tc>
@@ -11467,6 +11495,36 @@
             <w:pPr>
               <w:spacing w:after="160"/>
             </w:pPr>
+            <w:r>
+              <w:lastRenderedPageBreak/>
+              <w:t>Ltfu_</w:t>
+            </w:r>
+            <w:r>
+              <w:t xml:space="preserve">reengaged </w:t>
+            </w:r>
+            <w:r>
+              <w:t>(80%)&gt;Ltfu_</w:t>
+            </w:r>
+            <w:r>
+              <w:t xml:space="preserve">reengaged </w:t>
+            </w:r>
+            <w:r>
+              <w:t>(20%)</w:t>
+            </w:r>
+          </w:p>
+          <w:p>
+            <w:pPr>
+              <w:spacing w:after="160"/>
+            </w:pPr>
+            <w:r>
+              <w:t>Ltfu_reengaged (80%)&gt;</w:t>
+            </w:r>
+            <w:r>
+              <w:t>4*</w:t>
+            </w:r>
+            <w:r>
+              <w:t>Ltfu_reengaged (20%)</w:t>
+            </w:r>
           </w:p>
         </w:tc>
       </w:tr>
@@ -11489,7 +11547,7 @@
         </w:tc>
         <w:tc>
           <w:tcPr>
-            <w:tcW w:w="1998" w:type="dxa"/>
+            <w:tcW w:w="2016" w:type="dxa"/>
           </w:tcPr>
           <w:p>
             <w:pPr>
@@ -11527,12 +11585,15 @@
         </w:tc>
         <w:tc>
           <w:tcPr>
-            <w:tcW w:w="1998" w:type="dxa"/>
-          </w:tcPr>
-          <w:p>
-            <w:pPr>
-              <w:spacing w:after="160"/>
-            </w:pPr>
+            <w:tcW w:w="2016" w:type="dxa"/>
+          </w:tcPr>
+          <w:p>
+            <w:pPr>
+              <w:spacing w:after="160"/>
+            </w:pPr>
+            <w:r>
+              <w:t>Suppressed and unsuppressed new LTFU equal the total new LTFU</w:t>
+            </w:r>
           </w:p>
         </w:tc>
         <w:tc>
@@ -11543,6 +11604,9 @@
             <w:pPr>
               <w:spacing w:after="160"/>
             </w:pPr>
+            <w:r>
+              <w:t>Suppressed_ltfu+unsuppressed_ltfu = ltfu_new_effective</w:t>
+            </w:r>
           </w:p>
         </w:tc>
       </w:tr>
@@ -11565,12 +11629,15 @@
         </w:tc>
         <w:tc>
           <w:tcPr>
-            <w:tcW w:w="1998" w:type="dxa"/>
-          </w:tcPr>
-          <w:p>
-            <w:pPr>
-              <w:spacing w:after="160"/>
-            </w:pPr>
+            <w:tcW w:w="2016" w:type="dxa"/>
+          </w:tcPr>
+          <w:p>
+            <w:pPr>
+              <w:spacing w:after="160"/>
+            </w:pPr>
+            <w:r>
+              <w:t>Cascade limits: on art and suppressed</w:t>
+            </w:r>
           </w:p>
         </w:tc>
         <w:tc>
@@ -11581,6 +11648,29 @@
             <w:pPr>
               <w:spacing w:after="160"/>
             </w:pPr>
+            <w:r>
+              <w:t>end_suppressed</w:t>
+            </w:r>
+            <w:r>
+              <w:t xml:space="preserve"> &lt;= </w:t>
+            </w:r>
+            <w:r>
+              <w:t>end_on_art</w:t>
+            </w:r>
+          </w:p>
+          <w:p>
+            <w:pPr>
+              <w:spacing w:after="160"/>
+            </w:pPr>
+            <w:r>
+              <w:t>end_on_art</w:t>
+            </w:r>
+            <w:r>
+              <w:t xml:space="preserve"> &lt;=</w:t>
+            </w:r>
+            <w:r>
+              <w:t>end_diagnosed</w:t>
+            </w:r>
           </w:p>
         </w:tc>
       </w:tr>
@@ -11603,12 +11693,21 @@
         </w:tc>
         <w:tc>
           <w:tcPr>
-            <w:tcW w:w="1998" w:type="dxa"/>
-          </w:tcPr>
-          <w:p>
-            <w:pPr>
-              <w:spacing w:after="160"/>
-            </w:pPr>
+            <w:tcW w:w="2016" w:type="dxa"/>
+          </w:tcPr>
+          <w:p>
+            <w:pPr>
+              <w:spacing w:after="160"/>
+            </w:pPr>
+            <w:r>
+              <w:t>Without intervention, highe</w:t>
+            </w:r>
+            <w:r>
+              <w:t>r drop out of unsuppressed patients can inflate the third 95</w:t>
+            </w:r>
+            <w:r>
+              <w:t xml:space="preserve"> (denominator on ART shrink faster than suppressed)</w:t>
+            </w:r>
           </w:p>
         </w:tc>
         <w:tc>
@@ -11619,6 +11718,25 @@
             <w:pPr>
               <w:spacing w:after="160"/>
             </w:pPr>
+            <w:r>
+              <w:t>Third_95_end &gt; third_95_start</w:t>
+            </w:r>
+          </w:p>
+          <w:p>
+            <w:pPr>
+              <w:spacing w:after="160"/>
+            </w:pPr>
+          </w:p>
+          <w:p>
+            <w:pPr>
+              <w:spacing w:after="160"/>
+            </w:pPr>
+            <w:r>
+              <w:t>End_suppressed</w:t>
+            </w:r>
+            <w:r>
+              <w:t>_end &lt; end_suppressed_start</w:t>
+            </w:r>
           </w:p>
         </w:tc>
       </w:tr>
@@ -11641,12 +11759,24 @@
         </w:tc>
         <w:tc>
           <w:tcPr>
-            <w:tcW w:w="1998" w:type="dxa"/>
-          </w:tcPr>
-          <w:p>
-            <w:pPr>
-              <w:spacing w:after="160"/>
-            </w:pPr>
+            <w:tcW w:w="2016" w:type="dxa"/>
+          </w:tcPr>
+          <w:p>
+            <w:pPr>
+              <w:spacing w:after="160"/>
+            </w:pPr>
+            <w:r>
+              <w:t xml:space="preserve">Retention and treatment monitoring activities (MMD/DSD/ADH counselling) </w:t>
+            </w:r>
+            <w:r>
+              <w:t>–</w:t>
+            </w:r>
+            <w:r>
+              <w:t xml:space="preserve"> </w:t>
+            </w:r>
+            <w:r>
+              <w:t>reduce LTFU and keep absolute numbers on ART and suppressed</w:t>
+            </w:r>
           </w:p>
         </w:tc>
         <w:tc>
@@ -11657,6 +11787,22 @@
             <w:pPr>
               <w:spacing w:after="160"/>
             </w:pPr>
+            <w:r>
+              <w:t>End_suppressed_retention &gt;end_suppressed_no_retention</w:t>
+            </w:r>
+          </w:p>
+          <w:p>
+            <w:pPr>
+              <w:spacing w:after="160"/>
+            </w:pPr>
+          </w:p>
+          <w:p>
+            <w:pPr>
+              <w:spacing w:after="160"/>
+            </w:pPr>
+            <w:r>
+              <w:t>End_art_retention &gt; End_art_no_retention</w:t>
+            </w:r>
           </w:p>
         </w:tc>
       </w:tr>
@@ -11679,12 +11825,309 @@
         </w:tc>
         <w:tc>
           <w:tcPr>
-            <w:tcW w:w="1998" w:type="dxa"/>
-          </w:tcPr>
-          <w:p>
-            <w:pPr>
-              <w:spacing w:after="160"/>
-            </w:pPr>
+            <w:tcW w:w="2016" w:type="dxa"/>
+          </w:tcPr>
+          <w:p>
+            <w:pPr>
+              <w:spacing w:after="160"/>
+            </w:pPr>
+            <w:r>
+              <w:t>Zero LTFU rates have no new LTFU</w:t>
+            </w:r>
+          </w:p>
+        </w:tc>
+        <w:tc>
+          <w:tcPr>
+            <w:tcW w:w="6604" w:type="dxa"/>
+          </w:tcPr>
+          <w:p>
+            <w:pPr>
+              <w:spacing w:after="160"/>
+            </w:pPr>
+            <w:r>
+              <w:t>Ltfu_new</w:t>
+            </w:r>
+            <w:r>
+              <w:t>_effective</w:t>
+            </w:r>
+            <w:r>
+              <w:t xml:space="preserve"> = 0</w:t>
+            </w:r>
+          </w:p>
+        </w:tc>
+      </w:tr>
+      <w:tr>
+        <w:trPr>
+          <w:trHeight w:val="457"/>
+        </w:trPr>
+        <w:tc>
+          <w:tcPr>
+            <w:tcW w:w="549" w:type="dxa"/>
+          </w:tcPr>
+          <w:p>
+            <w:pPr>
+              <w:spacing w:after="160"/>
+            </w:pPr>
+            <w:r>
+              <w:t>16</w:t>
+            </w:r>
+          </w:p>
+        </w:tc>
+        <w:tc>
+          <w:tcPr>
+            <w:tcW w:w="2016" w:type="dxa"/>
+          </w:tcPr>
+          <w:p>
+            <w:pPr>
+              <w:spacing w:after="160"/>
+            </w:pPr>
+            <w:r>
+              <w:t>Fast track and community pick-</w:t>
+            </w:r>
+            <w:r>
+              <w:lastRenderedPageBreak/>
+              <w:t>up reduce LTFU respectively</w:t>
+            </w:r>
+          </w:p>
+        </w:tc>
+        <w:tc>
+          <w:tcPr>
+            <w:tcW w:w="6604" w:type="dxa"/>
+          </w:tcPr>
+          <w:p>
+            <w:pPr>
+              <w:spacing w:after="160"/>
+            </w:pPr>
+            <w:r>
+              <w:lastRenderedPageBreak/>
+              <w:t>Ltfu_new_effective</w:t>
+            </w:r>
+            <w:r>
+              <w:t xml:space="preserve"> (fast_track) &lt; </w:t>
+            </w:r>
+            <w:r>
+              <w:t>Ltfu_new_effective</w:t>
+            </w:r>
+            <w:r>
+              <w:t xml:space="preserve"> (none)</w:t>
+            </w:r>
+          </w:p>
+          <w:p>
+            <w:pPr>
+              <w:spacing w:after="160"/>
+            </w:pPr>
+            <w:r>
+              <w:t>Ltfu_new_effective (</w:t>
+            </w:r>
+            <w:r>
+              <w:t>CPU</w:t>
+            </w:r>
+            <w:r>
+              <w:t>) &lt; Ltfu_new_effective (none)</w:t>
+            </w:r>
+          </w:p>
+          <w:p>
+            <w:pPr>
+              <w:spacing w:after="160"/>
+            </w:pPr>
+          </w:p>
+          <w:p>
+            <w:pPr>
+              <w:spacing w:after="160"/>
+            </w:pPr>
+            <w:r>
+              <w:t xml:space="preserve">Ltfu_prevented (fast track) &gt; </w:t>
+            </w:r>
+            <w:r>
+              <w:t>ltfu_prevented (none)</w:t>
+            </w:r>
+          </w:p>
+          <w:p>
+            <w:pPr>
+              <w:spacing w:after="160"/>
+            </w:pPr>
+            <w:r>
+              <w:t>Ltfu_prevented (</w:t>
+            </w:r>
+            <w:r>
+              <w:t>CPU</w:t>
+            </w:r>
+            <w:r>
+              <w:t>) &gt; ltfu_prevented (none)</w:t>
+            </w:r>
+          </w:p>
+          <w:p>
+            <w:pPr>
+              <w:spacing w:after="160"/>
+            </w:pPr>
+          </w:p>
+        </w:tc>
+      </w:tr>
+      <w:tr>
+        <w:trPr>
+          <w:trHeight w:val="457"/>
+        </w:trPr>
+        <w:tc>
+          <w:tcPr>
+            <w:tcW w:w="549" w:type="dxa"/>
+          </w:tcPr>
+          <w:p>
+            <w:pPr>
+              <w:spacing w:after="160"/>
+            </w:pPr>
+            <w:r>
+              <w:t>17</w:t>
+            </w:r>
+          </w:p>
+        </w:tc>
+        <w:tc>
+          <w:tcPr>
+            <w:tcW w:w="2016" w:type="dxa"/>
+          </w:tcPr>
+          <w:p>
+            <w:pPr>
+              <w:spacing w:after="160"/>
+            </w:pPr>
+            <w:r>
+              <w:t xml:space="preserve">The 5 DSD and MMD </w:t>
+            </w:r>
+            <w:r>
+              <w:t>interventions combined prevent more than alone, stack multiplicatively and cannot exceed total expected new_LTFU</w:t>
+            </w:r>
+          </w:p>
+        </w:tc>
+        <w:tc>
+          <w:tcPr>
+            <w:tcW w:w="6604" w:type="dxa"/>
+          </w:tcPr>
+          <w:p>
+            <w:pPr>
+              <w:spacing w:after="160"/>
+            </w:pPr>
+            <w:r>
+              <w:t>Ltfu_new_effective (all) &lt; ltfu</w:t>
+            </w:r>
+            <w:r>
+              <w:t>_new_effective (mmd3)</w:t>
+            </w:r>
+          </w:p>
+          <w:p>
+            <w:pPr>
+              <w:spacing w:after="160"/>
+            </w:pPr>
+            <w:r>
+              <w:t>Ltfu_new_effective (all) &lt; ltfu_new_effective (</w:t>
+            </w:r>
+            <w:r>
+              <w:t>fast track</w:t>
+            </w:r>
+            <w:r>
+              <w:t>)</w:t>
+            </w:r>
+          </w:p>
+          <w:p>
+            <w:pPr>
+              <w:spacing w:after="160"/>
+            </w:pPr>
+            <w:r>
+              <w:t>Ltfu_new_effective (all) &lt; ltfu_new_effective (</w:t>
+            </w:r>
+            <w:r>
+              <w:t>CPU</w:t>
+            </w:r>
+            <w:r>
+              <w:t>)</w:t>
+            </w:r>
+          </w:p>
+          <w:p>
+            <w:pPr>
+              <w:spacing w:after="160"/>
+            </w:pPr>
+            <w:r>
+              <w:t xml:space="preserve">Ltfu_new_effective (all) &lt; ltfu_new_effective </w:t>
+            </w:r>
+            <w:r>
+              <w:t>(</w:t>
+            </w:r>
+            <w:r>
+              <w:t>sum of 5</w:t>
+            </w:r>
+            <w:r>
+              <w:t>)</w:t>
+            </w:r>
+          </w:p>
+          <w:p>
+            <w:pPr>
+              <w:spacing w:after="160"/>
+            </w:pPr>
+            <w:r>
+              <w:t xml:space="preserve">Ltfu_new_effective (all) &lt; </w:t>
+            </w:r>
+            <w:r>
+              <w:t>total possible new LTFU</w:t>
+            </w:r>
+          </w:p>
+          <w:p>
+            <w:pPr>
+              <w:spacing w:after="160"/>
+            </w:pPr>
+            <w:r>
+              <w:t>Ltfu_new_effective (all)</w:t>
+            </w:r>
+            <w:r>
+              <w:t xml:space="preserve"> &gt;=0</w:t>
+            </w:r>
+          </w:p>
+          <w:p>
+            <w:pPr>
+              <w:spacing w:after="160"/>
+            </w:pPr>
+          </w:p>
+          <w:p>
+            <w:pPr>
+              <w:spacing w:after="160"/>
+            </w:pPr>
+          </w:p>
+          <w:p>
+            <w:pPr>
+              <w:spacing w:after="160"/>
+            </w:pPr>
+          </w:p>
+          <w:p>
+            <w:pPr>
+              <w:spacing w:after="160"/>
+            </w:pPr>
+          </w:p>
+        </w:tc>
+      </w:tr>
+      <w:tr>
+        <w:trPr>
+          <w:trHeight w:val="457"/>
+        </w:trPr>
+        <w:tc>
+          <w:tcPr>
+            <w:tcW w:w="549" w:type="dxa"/>
+          </w:tcPr>
+          <w:p>
+            <w:pPr>
+              <w:spacing w:after="160"/>
+            </w:pPr>
+            <w:r>
+              <w:t>18</w:t>
+            </w:r>
+          </w:p>
+        </w:tc>
+        <w:tc>
+          <w:tcPr>
+            <w:tcW w:w="2016" w:type="dxa"/>
+          </w:tcPr>
+          <w:p>
+            <w:pPr>
+              <w:spacing w:after="160"/>
+            </w:pPr>
+            <w:r>
+              <w:t>Track and trace contributes to suppression</w:t>
+            </w:r>
           </w:p>
         </w:tc>
         <w:tc>

</xml_diff>

<commit_message>
AND and PNC contribute to total cascade
</commit_message>
<xml_diff>
--- a/resources/Test_Framework_Description.docx
+++ b/resources/Test_Framework_Description.docx
@@ -1568,7 +1568,7 @@
         <w:rPr>
           <w:noProof/>
         </w:rPr>
-        <w:pict w14:anchorId="3576BC4D">
+        <w:pict w14:anchorId="1018D382">
           <v:rect id="_x0000_i1030" alt="" style="width:451.3pt;height:.05pt;mso-width-percent:0;mso-height-percent:0;mso-width-percent:0;mso-height-percent:0" o:hralign="center" o:hrstd="t" o:hr="t" fillcolor="#a0a0a0" stroked="f"/>
         </w:pict>
       </w:r>
@@ -1838,7 +1838,7 @@
           <w:noProof/>
         </w:rPr>
         <w:lastRenderedPageBreak/>
-        <w:pict w14:anchorId="4E3E109E">
+        <w:pict w14:anchorId="65D84A11">
           <v:rect id="_x0000_i1029" alt="" style="width:451.3pt;height:.05pt;mso-width-percent:0;mso-height-percent:0;mso-width-percent:0;mso-height-percent:0" o:hralign="center" o:hrstd="t" o:hr="t" fillcolor="#a0a0a0" stroked="f"/>
         </w:pict>
       </w:r>
@@ -2106,7 +2106,7 @@
         <w:rPr>
           <w:noProof/>
         </w:rPr>
-        <w:pict w14:anchorId="4354A49B">
+        <w:pict w14:anchorId="4C760CE9">
           <v:rect id="_x0000_i1028" alt="" style="width:451.3pt;height:.05pt;mso-width-percent:0;mso-height-percent:0;mso-width-percent:0;mso-height-percent:0" o:hralign="center" o:hrstd="t" o:hr="t" fillcolor="#a0a0a0" stroked="f"/>
         </w:pict>
       </w:r>
@@ -2316,7 +2316,7 @@
         <w:rPr>
           <w:noProof/>
         </w:rPr>
-        <w:pict w14:anchorId="712BE98C">
+        <w:pict w14:anchorId="485C5CBE">
           <v:rect id="_x0000_i1027" alt="" style="width:451.3pt;height:.05pt;mso-width-percent:0;mso-height-percent:0;mso-width-percent:0;mso-height-percent:0" o:hralign="center" o:hrstd="t" o:hr="t" fillcolor="#a0a0a0" stroked="f"/>
         </w:pict>
       </w:r>
@@ -2546,7 +2546,7 @@
         <w:rPr>
           <w:noProof/>
         </w:rPr>
-        <w:pict w14:anchorId="32EE4A70">
+        <w:pict w14:anchorId="72F5DE2F">
           <v:rect id="_x0000_i1026" alt="" style="width:451.3pt;height:.05pt;mso-width-percent:0;mso-height-percent:0;mso-width-percent:0;mso-height-percent:0" o:hralign="center" o:hrstd="t" o:hr="t" fillcolor="#a0a0a0" stroked="f"/>
         </w:pict>
       </w:r>
@@ -2875,7 +2875,7 @@
         <w:rPr>
           <w:noProof/>
         </w:rPr>
-        <w:pict w14:anchorId="083FE401">
+        <w:pict w14:anchorId="5B8A22D4">
           <v:rect id="_x0000_i1025" alt="" style="width:451.3pt;height:.05pt;mso-width-percent:0;mso-height-percent:0;mso-width-percent:0;mso-height-percent:0" o:hralign="center" o:hrstd="t" o:hr="t" fillcolor="#a0a0a0" stroked="f"/>
         </w:pict>
       </w:r>
@@ -6570,37 +6570,7 @@
         </w:tc>
       </w:tr>
     </w:tbl>
-    <w:p>
-      <w:pPr>
-        <w:rPr>
-          <w:rFonts w:ascii="Times New Roman" w:hAnsi="Times New Roman" w:cs="Times New Roman"/>
-        </w:rPr>
-      </w:pPr>
-    </w:p>
-    <w:p>
-      <w:pPr>
-        <w:pStyle w:val="Heading4"/>
-        <w:rPr>
-          <w:rFonts w:ascii="Times New Roman" w:hAnsi="Times New Roman" w:cs="Times New Roman"/>
-        </w:rPr>
-      </w:pPr>
-    </w:p>
-    <w:p>
-      <w:pPr>
-        <w:pStyle w:val="Heading4"/>
-        <w:rPr>
-          <w:rFonts w:ascii="Times New Roman" w:hAnsi="Times New Roman" w:cs="Times New Roman"/>
-        </w:rPr>
-      </w:pPr>
-    </w:p>
-    <w:p>
-      <w:pPr>
-        <w:pStyle w:val="Heading4"/>
-        <w:rPr>
-          <w:rFonts w:ascii="Times New Roman" w:hAnsi="Times New Roman" w:cs="Times New Roman"/>
-        </w:rPr>
-      </w:pPr>
-    </w:p>
+    <w:p/>
     <w:p>
       <w:pPr>
         <w:pStyle w:val="Heading4"/>
@@ -7154,7 +7124,6 @@
               <w:rPr>
                 <w:rFonts w:ascii="Times New Roman" w:hAnsi="Times New Roman" w:cs="Times New Roman"/>
               </w:rPr>
-              <w:lastRenderedPageBreak/>
               <w:t>9.</w:t>
             </w:r>
           </w:p>
@@ -7217,6 +7186,7 @@
               <w:rPr>
                 <w:rFonts w:ascii="Times New Roman" w:hAnsi="Times New Roman" w:cs="Times New Roman"/>
               </w:rPr>
+              <w:lastRenderedPageBreak/>
               <w:t>10.</w:t>
             </w:r>
           </w:p>
@@ -7878,14 +7848,7 @@
               <w:rPr>
                 <w:rFonts w:ascii="Times New Roman" w:hAnsi="Times New Roman" w:cs="Times New Roman"/>
               </w:rPr>
-              <w:t xml:space="preserve">Very high suppression rates </w:t>
-            </w:r>
-            <w:r>
-              <w:rPr>
-                <w:rFonts w:ascii="Times New Roman" w:hAnsi="Times New Roman" w:cs="Times New Roman"/>
-              </w:rPr>
-              <w:lastRenderedPageBreak/>
-              <w:t>result in very few infections</w:t>
+              <w:t>Very high suppression rates result in very few infections</w:t>
             </w:r>
           </w:p>
         </w:tc>
@@ -7904,7 +7867,6 @@
               <w:rPr>
                 <w:rFonts w:ascii="Times New Roman" w:hAnsi="Times New Roman" w:cs="Times New Roman"/>
               </w:rPr>
-              <w:lastRenderedPageBreak/>
               <w:t xml:space="preserve">New_infections (98% suppressed) </w:t>
             </w:r>
             <w:r>
@@ -7943,6 +7905,7 @@
         <w:rPr>
           <w:rFonts w:ascii="Times New Roman" w:hAnsi="Times New Roman" w:cs="Times New Roman"/>
         </w:rPr>
+        <w:lastRenderedPageBreak/>
         <w:t>Boundary conditions</w:t>
       </w:r>
     </w:p>
@@ -8671,33 +8634,33 @@
         <w:rPr>
           <w:rFonts w:ascii="Times New Roman" w:hAnsi="Times New Roman" w:cs="Times New Roman"/>
         </w:rPr>
+        <w:t>Tests that changes in testing interventions and modalities are correctly handled by the model. Increases in testing(all other remaining equal) should result in higher number of individuals being diagnosed</w:t>
+      </w:r>
+      <w:r>
+        <w:rPr>
+          <w:rFonts w:ascii="Times New Roman" w:hAnsi="Times New Roman" w:cs="Times New Roman"/>
+        </w:rPr>
+        <w:t xml:space="preserve">, and subsequently a larger number of individuals being on treatment. </w:t>
+      </w:r>
+      <w:r>
+        <w:rPr>
+          <w:rFonts w:ascii="Times New Roman" w:hAnsi="Times New Roman" w:cs="Times New Roman"/>
+        </w:rPr>
+        <w:t>Also calculating difference between baseline and a scenario.</w:t>
+      </w:r>
+    </w:p>
+    <w:p>
+      <w:pPr>
+        <w:pStyle w:val="Heading3"/>
+        <w:rPr>
+          <w:rFonts w:ascii="Times New Roman" w:hAnsi="Times New Roman" w:cs="Times New Roman"/>
+        </w:rPr>
+      </w:pPr>
+      <w:r>
+        <w:rPr>
+          <w:rFonts w:ascii="Times New Roman" w:hAnsi="Times New Roman" w:cs="Times New Roman"/>
+        </w:rPr>
         <w:lastRenderedPageBreak/>
-        <w:t>Tests that changes in testing interventions and modalities are correctly handled by the model. Increases in testing(all other remaining equal) should result in higher number of individuals being diagnosed</w:t>
-      </w:r>
-      <w:r>
-        <w:rPr>
-          <w:rFonts w:ascii="Times New Roman" w:hAnsi="Times New Roman" w:cs="Times New Roman"/>
-        </w:rPr>
-        <w:t xml:space="preserve">, and subsequently a larger number of individuals being on treatment. </w:t>
-      </w:r>
-      <w:r>
-        <w:rPr>
-          <w:rFonts w:ascii="Times New Roman" w:hAnsi="Times New Roman" w:cs="Times New Roman"/>
-        </w:rPr>
-        <w:t>Also calculating difference between baseline and a scenario.</w:t>
-      </w:r>
-    </w:p>
-    <w:p>
-      <w:pPr>
-        <w:pStyle w:val="Heading3"/>
-        <w:rPr>
-          <w:rFonts w:ascii="Times New Roman" w:hAnsi="Times New Roman" w:cs="Times New Roman"/>
-        </w:rPr>
-      </w:pPr>
-      <w:r>
-        <w:rPr>
-          <w:rFonts w:ascii="Times New Roman" w:hAnsi="Times New Roman" w:cs="Times New Roman"/>
-        </w:rPr>
         <w:t>Test Logic</w:t>
       </w:r>
     </w:p>
@@ -9637,7 +9600,6 @@
               <w:rPr>
                 <w:rFonts w:ascii="Times New Roman" w:hAnsi="Times New Roman" w:cs="Times New Roman"/>
               </w:rPr>
-              <w:lastRenderedPageBreak/>
               <w:t>4</w:t>
             </w:r>
           </w:p>
@@ -9741,6 +9703,7 @@
         <w:rPr>
           <w:rFonts w:ascii="Times New Roman" w:hAnsi="Times New Roman" w:cs="Times New Roman"/>
         </w:rPr>
+        <w:lastRenderedPageBreak/>
         <w:t>Scale up scenario to 20</w:t>
       </w:r>
       <w:r>
@@ -10444,14 +10407,7 @@
               <w:rPr>
                 <w:rFonts w:ascii="Times New Roman" w:hAnsi="Times New Roman" w:cs="Times New Roman"/>
               </w:rPr>
-              <w:t xml:space="preserve">Scale down general facility testing  to </w:t>
-            </w:r>
-            <w:r>
-              <w:rPr>
-                <w:rFonts w:ascii="Times New Roman" w:hAnsi="Times New Roman" w:cs="Times New Roman"/>
-              </w:rPr>
-              <w:lastRenderedPageBreak/>
-              <w:t>10 000 tests – viral suppression</w:t>
+              <w:t>Scale down general facility testing  to 10 000 tests – viral suppression</w:t>
             </w:r>
           </w:p>
         </w:tc>
@@ -10470,7 +10426,6 @@
               <w:rPr>
                 <w:rFonts w:ascii="Times New Roman" w:hAnsi="Times New Roman" w:cs="Times New Roman"/>
               </w:rPr>
-              <w:lastRenderedPageBreak/>
               <w:t>Expected_vs_scenario=</w:t>
             </w:r>
             <w:r>
@@ -10549,6 +10504,7 @@
           <w:rFonts w:ascii="Times New Roman" w:hAnsi="Times New Roman" w:cs="Times New Roman"/>
           <w:color w:val="000000" w:themeColor="text1"/>
         </w:rPr>
+        <w:lastRenderedPageBreak/>
         <w:t>Compare three scenarios:</w:t>
       </w:r>
     </w:p>
@@ -11539,7 +11495,6 @@
               <w:rPr>
                 <w:rFonts w:ascii="Times New Roman" w:hAnsi="Times New Roman" w:cs="Times New Roman"/>
               </w:rPr>
-              <w:lastRenderedPageBreak/>
               <w:t>3</w:t>
             </w:r>
           </w:p>
@@ -11750,6 +11705,7 @@
           <w:iCs/>
           <w:color w:val="2E74B5"/>
         </w:rPr>
+        <w:lastRenderedPageBreak/>
         <w:t>Different linkage rates</w:t>
       </w:r>
     </w:p>
@@ -12435,20 +12391,20 @@
               <w:rPr>
                 <w:rFonts w:ascii="Times New Roman" w:hAnsi="Times New Roman" w:cs="Times New Roman"/>
               </w:rPr>
-              <w:t xml:space="preserve">VL testing improves suppression among </w:t>
+              <w:t>VL testing improves suppression among those unsuppressed that receive a test</w:t>
+            </w:r>
+            <w:r>
+              <w:rPr>
+                <w:rFonts w:ascii="Times New Roman" w:hAnsi="Times New Roman" w:cs="Times New Roman"/>
+              </w:rPr>
+              <w:t xml:space="preserve">. Additionally, results in more people suppressed </w:t>
             </w:r>
             <w:r>
               <w:rPr>
                 <w:rFonts w:ascii="Times New Roman" w:hAnsi="Times New Roman" w:cs="Times New Roman"/>
               </w:rPr>
               <w:lastRenderedPageBreak/>
-              <w:t>those unsuppressed that receive a test</w:t>
-            </w:r>
-            <w:r>
-              <w:rPr>
-                <w:rFonts w:ascii="Times New Roman" w:hAnsi="Times New Roman" w:cs="Times New Roman"/>
-              </w:rPr>
-              <w:t>. Additionally, results in more people suppressed at the end than at the beginning</w:t>
+              <w:t>at the end than at the beginning</w:t>
             </w:r>
           </w:p>
         </w:tc>
@@ -12482,7 +12438,6 @@
               <w:rPr>
                 <w:rFonts w:ascii="Times New Roman" w:hAnsi="Times New Roman" w:cs="Times New Roman"/>
               </w:rPr>
-              <w:lastRenderedPageBreak/>
               <w:t>expected_additional_suppressed =  number_reached * unsuppressed_rate * 0.20</w:t>
             </w:r>
           </w:p>
@@ -13017,13 +12972,13 @@
         </w:rPr>
       </w:pPr>
     </w:p>
-    <w:p>
-      <w:pPr>
-        <w:rPr>
-          <w:rFonts w:ascii="Times New Roman" w:hAnsi="Times New Roman" w:cs="Times New Roman"/>
-        </w:rPr>
-      </w:pPr>
-    </w:p>
+    <w:p/>
+    <w:p/>
+    <w:p/>
+    <w:p/>
+    <w:p/>
+    <w:p/>
+    <w:p/>
     <w:p>
       <w:pPr>
         <w:pStyle w:val="Heading2"/>
@@ -13031,54 +12986,6 @@
           <w:rFonts w:ascii="Times New Roman" w:hAnsi="Times New Roman" w:cs="Times New Roman"/>
         </w:rPr>
       </w:pPr>
-    </w:p>
-    <w:p>
-      <w:pPr>
-        <w:pStyle w:val="Heading2"/>
-        <w:rPr>
-          <w:rFonts w:ascii="Times New Roman" w:hAnsi="Times New Roman" w:cs="Times New Roman"/>
-        </w:rPr>
-      </w:pPr>
-    </w:p>
-    <w:p>
-      <w:pPr>
-        <w:pStyle w:val="Heading2"/>
-        <w:rPr>
-          <w:rFonts w:ascii="Times New Roman" w:hAnsi="Times New Roman" w:cs="Times New Roman"/>
-        </w:rPr>
-      </w:pPr>
-    </w:p>
-    <w:p>
-      <w:pPr>
-        <w:pStyle w:val="Heading2"/>
-        <w:rPr>
-          <w:rFonts w:ascii="Times New Roman" w:hAnsi="Times New Roman" w:cs="Times New Roman"/>
-        </w:rPr>
-      </w:pPr>
-    </w:p>
-    <w:p>
-      <w:pPr>
-        <w:pStyle w:val="Heading2"/>
-        <w:rPr>
-          <w:rFonts w:ascii="Times New Roman" w:hAnsi="Times New Roman" w:cs="Times New Roman"/>
-        </w:rPr>
-      </w:pPr>
-    </w:p>
-    <w:p>
-      <w:pPr>
-        <w:pStyle w:val="Heading2"/>
-        <w:rPr>
-          <w:rFonts w:ascii="Times New Roman" w:hAnsi="Times New Roman" w:cs="Times New Roman"/>
-        </w:rPr>
-      </w:pPr>
-    </w:p>
-    <w:p>
-      <w:pPr>
-        <w:pStyle w:val="Heading2"/>
-        <w:rPr>
-          <w:rFonts w:ascii="Times New Roman" w:hAnsi="Times New Roman" w:cs="Times New Roman"/>
-        </w:rPr>
-      </w:pPr>
       <w:r>
         <w:rPr>
           <w:rFonts w:ascii="Times New Roman" w:hAnsi="Times New Roman" w:cs="Times New Roman"/>
@@ -13111,6 +13018,7 @@
         <w:rPr>
           <w:rFonts w:ascii="Times New Roman" w:hAnsi="Times New Roman" w:cs="Times New Roman"/>
         </w:rPr>
+        <w:lastRenderedPageBreak/>
         <w:t xml:space="preserve">Tests </w:t>
       </w:r>
       <w:r>
@@ -13678,7 +13586,6 @@
               <w:rPr>
                 <w:rFonts w:ascii="Times New Roman" w:hAnsi="Times New Roman" w:cs="Times New Roman"/>
               </w:rPr>
-              <w:lastRenderedPageBreak/>
               <w:t>4.</w:t>
             </w:r>
           </w:p>
@@ -13913,6 +13820,7 @@
               <w:rPr>
                 <w:rFonts w:ascii="Times New Roman" w:hAnsi="Times New Roman" w:cs="Times New Roman"/>
               </w:rPr>
+              <w:lastRenderedPageBreak/>
               <w:t>6.</w:t>
             </w:r>
           </w:p>
@@ -14419,7 +14327,6 @@
               <w:rPr>
                 <w:rFonts w:ascii="Times New Roman" w:hAnsi="Times New Roman" w:cs="Times New Roman"/>
               </w:rPr>
-              <w:lastRenderedPageBreak/>
               <w:t>Fewer deaths than no coverage</w:t>
             </w:r>
           </w:p>
@@ -14501,7 +14408,6 @@
               <w:rPr>
                 <w:rFonts w:ascii="Times New Roman" w:hAnsi="Times New Roman" w:cs="Times New Roman"/>
               </w:rPr>
-              <w:lastRenderedPageBreak/>
               <w:t>10</w:t>
             </w:r>
           </w:p>
@@ -14570,6 +14476,7 @@
               <w:rPr>
                 <w:rFonts w:ascii="Times New Roman" w:hAnsi="Times New Roman" w:cs="Times New Roman"/>
               </w:rPr>
+              <w:lastRenderedPageBreak/>
               <w:t>11</w:t>
             </w:r>
           </w:p>
@@ -15201,46 +15108,46 @@
           <w:sz w:val="24"/>
           <w:szCs w:val="24"/>
         </w:rPr>
+        <w:t>Tests the loss to follow-up flow mechanics and the impact of retention interventions including multi-month dispensing (MMD), adherence counseling, and tracking/tracing.</w:t>
+      </w:r>
+    </w:p>
+    <w:p>
+      <w:pPr>
+        <w:pStyle w:val="Heading3"/>
+        <w:rPr>
+          <w:rFonts w:ascii="Times New Roman" w:hAnsi="Times New Roman" w:cs="Times New Roman"/>
+        </w:rPr>
+      </w:pPr>
+      <w:r>
+        <w:rPr>
+          <w:rFonts w:ascii="Times New Roman" w:hAnsi="Times New Roman" w:cs="Times New Roman"/>
+        </w:rPr>
+        <w:t>Test Logic</w:t>
+      </w:r>
+    </w:p>
+    <w:p>
+      <w:pPr>
+        <w:spacing w:after="160"/>
+        <w:rPr>
+          <w:rFonts w:ascii="Times New Roman" w:hAnsi="Times New Roman" w:cs="Times New Roman"/>
+        </w:rPr>
+      </w:pPr>
+      <w:r>
+        <w:rPr>
+          <w:rFonts w:ascii="Times New Roman" w:hAnsi="Times New Roman" w:cs="Times New Roman"/>
+        </w:rPr>
+        <w:t>Uses a standardized population with the following parameters: 1,000,000 total population, 5% HIV prevalence (50,000 PLHIV), 80% diagnosed, 75% on ART, 85% virally suppressed, 2500 new infections per year, 1,000 AIDS deaths per year, crude birth rate 25 per 1000, 49% of population male ,and 40% of population under 15.</w:t>
+      </w:r>
+    </w:p>
+    <w:p>
+      <w:pPr>
+        <w:pStyle w:val="font-claude-response-body"/>
+      </w:pPr>
+      <w:r>
+        <w:rPr>
+          <w:rStyle w:val="Strong"/>
+        </w:rPr>
         <w:lastRenderedPageBreak/>
-        <w:t>Tests the loss to follow-up flow mechanics and the impact of retention interventions including multi-month dispensing (MMD), adherence counseling, and tracking/tracing.</w:t>
-      </w:r>
-    </w:p>
-    <w:p>
-      <w:pPr>
-        <w:pStyle w:val="Heading3"/>
-        <w:rPr>
-          <w:rFonts w:ascii="Times New Roman" w:hAnsi="Times New Roman" w:cs="Times New Roman"/>
-        </w:rPr>
-      </w:pPr>
-      <w:r>
-        <w:rPr>
-          <w:rFonts w:ascii="Times New Roman" w:hAnsi="Times New Roman" w:cs="Times New Roman"/>
-        </w:rPr>
-        <w:t>Test Logic</w:t>
-      </w:r>
-    </w:p>
-    <w:p>
-      <w:pPr>
-        <w:spacing w:after="160"/>
-        <w:rPr>
-          <w:rFonts w:ascii="Times New Roman" w:hAnsi="Times New Roman" w:cs="Times New Roman"/>
-        </w:rPr>
-      </w:pPr>
-      <w:r>
-        <w:rPr>
-          <w:rFonts w:ascii="Times New Roman" w:hAnsi="Times New Roman" w:cs="Times New Roman"/>
-        </w:rPr>
-        <w:t>Uses a standardized population with the following parameters: 1,000,000 total population, 5% HIV prevalence (50,000 PLHIV), 80% diagnosed, 75% on ART, 85% virally suppressed, 2500 new infections per year, 1,000 AIDS deaths per year, crude birth rate 25 per 1000, 49% of population male ,and 40% of population under 15.</w:t>
-      </w:r>
-    </w:p>
-    <w:p>
-      <w:pPr>
-        <w:pStyle w:val="font-claude-response-body"/>
-      </w:pPr>
-      <w:r>
-        <w:rPr>
-          <w:rStyle w:val="Strong"/>
-        </w:rPr>
         <w:t>LTFU rates:</w:t>
       </w:r>
       <w:r>
@@ -15679,7 +15586,6 @@
               <w:rPr>
                 <w:rFonts w:ascii="Times New Roman" w:hAnsi="Times New Roman" w:cs="Times New Roman"/>
               </w:rPr>
-              <w:lastRenderedPageBreak/>
               <w:t>3</w:t>
             </w:r>
             <w:r>
@@ -15899,6 +15805,7 @@
               <w:rPr>
                 <w:rFonts w:ascii="Times New Roman" w:hAnsi="Times New Roman" w:cs="Times New Roman"/>
               </w:rPr>
+              <w:lastRenderedPageBreak/>
               <w:t>5</w:t>
             </w:r>
             <w:r>
@@ -16411,7 +16318,6 @@
               <w:rPr>
                 <w:rFonts w:ascii="Times New Roman" w:hAnsi="Times New Roman" w:cs="Times New Roman"/>
               </w:rPr>
-              <w:lastRenderedPageBreak/>
               <w:t>10</w:t>
             </w:r>
           </w:p>
@@ -16576,6 +16482,7 @@
               <w:rPr>
                 <w:rFonts w:ascii="Times New Roman" w:hAnsi="Times New Roman" w:cs="Times New Roman"/>
               </w:rPr>
+              <w:lastRenderedPageBreak/>
               <w:t>end_on_art &lt;=end_diagnosed</w:t>
             </w:r>
           </w:p>
@@ -16600,6 +16507,7 @@
               <w:rPr>
                 <w:rFonts w:ascii="Times New Roman" w:hAnsi="Times New Roman" w:cs="Times New Roman"/>
               </w:rPr>
+              <w:lastRenderedPageBreak/>
               <w:t>13</w:t>
             </w:r>
           </w:p>
@@ -17029,14 +16937,7 @@
               <w:rPr>
                 <w:rFonts w:ascii="Times New Roman" w:hAnsi="Times New Roman" w:cs="Times New Roman"/>
               </w:rPr>
-              <w:t xml:space="preserve">interventions combined prevent </w:t>
-            </w:r>
-            <w:r>
-              <w:rPr>
-                <w:rFonts w:ascii="Times New Roman" w:hAnsi="Times New Roman" w:cs="Times New Roman"/>
-              </w:rPr>
-              <w:lastRenderedPageBreak/>
-              <w:t>more than alone, stack multiplicatively and cannot exceed total expected new_LTFU</w:t>
+              <w:t>interventions combined prevent more than alone, stack multiplicatively and cannot exceed total expected new_LTFU</w:t>
             </w:r>
           </w:p>
         </w:tc>
@@ -17055,7 +16956,6 @@
               <w:rPr>
                 <w:rFonts w:ascii="Times New Roman" w:hAnsi="Times New Roman" w:cs="Times New Roman"/>
               </w:rPr>
-              <w:lastRenderedPageBreak/>
               <w:t>Ltfu_new_effective (all) &lt; ltfu</w:t>
             </w:r>
             <w:r>
@@ -17102,7 +17002,6 @@
               <w:rPr>
                 <w:rFonts w:ascii="Times New Roman" w:hAnsi="Times New Roman" w:cs="Times New Roman"/>
               </w:rPr>
-              <w:lastRenderedPageBreak/>
               <w:t>Ltfu_new_effective (all) &lt; ltfu_new_effective (</w:t>
             </w:r>
             <w:r>
@@ -20447,6 +20346,154 @@
           </w:p>
         </w:tc>
       </w:tr>
+      <w:tr>
+        <w:trPr>
+          <w:trHeight w:val="457"/>
+        </w:trPr>
+        <w:tc>
+          <w:tcPr>
+            <w:tcW w:w="549" w:type="dxa"/>
+          </w:tcPr>
+          <w:p>
+            <w:pPr>
+              <w:spacing w:after="160"/>
+              <w:rPr>
+                <w:rFonts w:ascii="Times New Roman" w:hAnsi="Times New Roman" w:cs="Times New Roman"/>
+              </w:rPr>
+            </w:pPr>
+            <w:r>
+              <w:rPr>
+                <w:rFonts w:ascii="Times New Roman" w:hAnsi="Times New Roman" w:cs="Times New Roman"/>
+              </w:rPr>
+              <w:lastRenderedPageBreak/>
+              <w:t>20</w:t>
+            </w:r>
+          </w:p>
+        </w:tc>
+        <w:tc>
+          <w:tcPr>
+            <w:tcW w:w="2016" w:type="dxa"/>
+          </w:tcPr>
+          <w:p>
+            <w:pPr>
+              <w:spacing w:after="160"/>
+              <w:rPr>
+                <w:rFonts w:ascii="Times New Roman" w:hAnsi="Times New Roman" w:cs="Times New Roman"/>
+              </w:rPr>
+            </w:pPr>
+            <w:r>
+              <w:rPr>
+                <w:rFonts w:ascii="Times New Roman" w:hAnsi="Times New Roman" w:cs="Times New Roman"/>
+              </w:rPr>
+              <w:t>PMTC contributes to broader cascade</w:t>
+            </w:r>
+          </w:p>
+        </w:tc>
+        <w:tc>
+          <w:tcPr>
+            <w:tcW w:w="6604" w:type="dxa"/>
+          </w:tcPr>
+          <w:p>
+            <w:pPr>
+              <w:pStyle w:val="ListParagraph"/>
+              <w:numPr>
+                <w:ilvl w:val="0"/>
+                <w:numId w:val="87"/>
+              </w:numPr>
+              <w:spacing w:after="160"/>
+              <w:rPr>
+                <w:rFonts w:ascii="Times New Roman" w:hAnsi="Times New Roman" w:cs="Times New Roman"/>
+              </w:rPr>
+            </w:pPr>
+            <w:r>
+              <w:rPr>
+                <w:rFonts w:ascii="Times New Roman" w:hAnsi="Times New Roman" w:cs="Times New Roman"/>
+              </w:rPr>
+              <w:t xml:space="preserve">Total_New_diagnoses (with ANC) &gt; </w:t>
+            </w:r>
+            <w:r>
+              <w:rPr>
+                <w:rFonts w:ascii="Times New Roman" w:hAnsi="Times New Roman" w:cs="Times New Roman"/>
+              </w:rPr>
+              <w:t>Total_New_diagnoses (with</w:t>
+            </w:r>
+            <w:r>
+              <w:rPr>
+                <w:rFonts w:ascii="Times New Roman" w:hAnsi="Times New Roman" w:cs="Times New Roman"/>
+              </w:rPr>
+              <w:t>out</w:t>
+            </w:r>
+            <w:r>
+              <w:rPr>
+                <w:rFonts w:ascii="Times New Roman" w:hAnsi="Times New Roman" w:cs="Times New Roman"/>
+              </w:rPr>
+              <w:t xml:space="preserve"> ANC)</w:t>
+            </w:r>
+          </w:p>
+          <w:p>
+            <w:pPr>
+              <w:pStyle w:val="ListParagraph"/>
+              <w:numPr>
+                <w:ilvl w:val="0"/>
+                <w:numId w:val="87"/>
+              </w:numPr>
+              <w:spacing w:after="160"/>
+              <w:rPr>
+                <w:rFonts w:ascii="Times New Roman" w:hAnsi="Times New Roman" w:cs="Times New Roman"/>
+              </w:rPr>
+            </w:pPr>
+            <w:r>
+              <w:rPr>
+                <w:rFonts w:ascii="Times New Roman" w:hAnsi="Times New Roman" w:cs="Times New Roman"/>
+              </w:rPr>
+              <w:t>Total_</w:t>
+            </w:r>
+            <w:r>
+              <w:rPr>
+                <w:rFonts w:ascii="Times New Roman" w:hAnsi="Times New Roman" w:cs="Times New Roman"/>
+              </w:rPr>
+              <w:t>art_inititations</w:t>
+            </w:r>
+            <w:r>
+              <w:rPr>
+                <w:rFonts w:ascii="Times New Roman" w:hAnsi="Times New Roman" w:cs="Times New Roman"/>
+              </w:rPr>
+              <w:t xml:space="preserve"> (with ANC) &gt; Total_</w:t>
+            </w:r>
+            <w:r>
+              <w:rPr>
+                <w:rFonts w:ascii="Times New Roman" w:hAnsi="Times New Roman" w:cs="Times New Roman"/>
+              </w:rPr>
+              <w:t xml:space="preserve"> </w:t>
+            </w:r>
+            <w:r>
+              <w:rPr>
+                <w:rFonts w:ascii="Times New Roman" w:hAnsi="Times New Roman" w:cs="Times New Roman"/>
+              </w:rPr>
+              <w:t>art_inititations</w:t>
+            </w:r>
+            <w:r>
+              <w:rPr>
+                <w:rFonts w:ascii="Times New Roman" w:hAnsi="Times New Roman" w:cs="Times New Roman"/>
+              </w:rPr>
+              <w:t xml:space="preserve"> (without ANC)</w:t>
+            </w:r>
+          </w:p>
+          <w:p>
+            <w:pPr>
+              <w:pStyle w:val="ListParagraph"/>
+              <w:numPr>
+                <w:ilvl w:val="0"/>
+                <w:numId w:val="87"/>
+              </w:numPr>
+              <w:spacing w:after="160"/>
+              <w:rPr>
+                <w:rFonts w:ascii="Times New Roman" w:hAnsi="Times New Roman" w:cs="Times New Roman"/>
+              </w:rPr>
+            </w:pPr>
+          </w:p>
+        </w:tc>
+      </w:tr>
     </w:tbl>
     <w:p>
       <w:pPr>
@@ -23762,6 +23809,119 @@
     </w:lvl>
   </w:abstractNum>
   <w:abstractNum w:abstractNumId="24" w15:restartNumberingAfterBreak="0">
+    <w:nsid w:val="1DD93A5E"/>
+    <w:multiLevelType w:val="hybridMultilevel"/>
+    <w:tmpl w:val="AF284584"/>
+    <w:lvl w:ilvl="0" w:tplc="08090001">
+      <w:start w:val="1"/>
+      <w:numFmt w:val="bullet"/>
+      <w:lvlText w:val=""/>
+      <w:lvlJc w:val="left"/>
+      <w:pPr>
+        <w:ind w:left="360" w:hanging="360"/>
+      </w:pPr>
+      <w:rPr>
+        <w:rFonts w:ascii="Symbol" w:hAnsi="Symbol" w:hint="default"/>
+      </w:rPr>
+    </w:lvl>
+    <w:lvl w:ilvl="1" w:tplc="08090003" w:tentative="1">
+      <w:start w:val="1"/>
+      <w:numFmt w:val="bullet"/>
+      <w:lvlText w:val="o"/>
+      <w:lvlJc w:val="left"/>
+      <w:pPr>
+        <w:ind w:left="1080" w:hanging="360"/>
+      </w:pPr>
+      <w:rPr>
+        <w:rFonts w:ascii="Courier New" w:hAnsi="Courier New" w:hint="default"/>
+      </w:rPr>
+    </w:lvl>
+    <w:lvl w:ilvl="2" w:tplc="08090005" w:tentative="1">
+      <w:start w:val="1"/>
+      <w:numFmt w:val="bullet"/>
+      <w:lvlText w:val=""/>
+      <w:lvlJc w:val="left"/>
+      <w:pPr>
+        <w:ind w:left="1800" w:hanging="360"/>
+      </w:pPr>
+      <w:rPr>
+        <w:rFonts w:ascii="Wingdings" w:hAnsi="Wingdings" w:hint="default"/>
+      </w:rPr>
+    </w:lvl>
+    <w:lvl w:ilvl="3" w:tplc="08090001" w:tentative="1">
+      <w:start w:val="1"/>
+      <w:numFmt w:val="bullet"/>
+      <w:lvlText w:val=""/>
+      <w:lvlJc w:val="left"/>
+      <w:pPr>
+        <w:ind w:left="2520" w:hanging="360"/>
+      </w:pPr>
+      <w:rPr>
+        <w:rFonts w:ascii="Symbol" w:hAnsi="Symbol" w:hint="default"/>
+      </w:rPr>
+    </w:lvl>
+    <w:lvl w:ilvl="4" w:tplc="08090003" w:tentative="1">
+      <w:start w:val="1"/>
+      <w:numFmt w:val="bullet"/>
+      <w:lvlText w:val="o"/>
+      <w:lvlJc w:val="left"/>
+      <w:pPr>
+        <w:ind w:left="3240" w:hanging="360"/>
+      </w:pPr>
+      <w:rPr>
+        <w:rFonts w:ascii="Courier New" w:hAnsi="Courier New" w:hint="default"/>
+      </w:rPr>
+    </w:lvl>
+    <w:lvl w:ilvl="5" w:tplc="08090005" w:tentative="1">
+      <w:start w:val="1"/>
+      <w:numFmt w:val="bullet"/>
+      <w:lvlText w:val=""/>
+      <w:lvlJc w:val="left"/>
+      <w:pPr>
+        <w:ind w:left="3960" w:hanging="360"/>
+      </w:pPr>
+      <w:rPr>
+        <w:rFonts w:ascii="Wingdings" w:hAnsi="Wingdings" w:hint="default"/>
+      </w:rPr>
+    </w:lvl>
+    <w:lvl w:ilvl="6" w:tplc="08090001" w:tentative="1">
+      <w:start w:val="1"/>
+      <w:numFmt w:val="bullet"/>
+      <w:lvlText w:val=""/>
+      <w:lvlJc w:val="left"/>
+      <w:pPr>
+        <w:ind w:left="4680" w:hanging="360"/>
+      </w:pPr>
+      <w:rPr>
+        <w:rFonts w:ascii="Symbol" w:hAnsi="Symbol" w:hint="default"/>
+      </w:rPr>
+    </w:lvl>
+    <w:lvl w:ilvl="7" w:tplc="08090003" w:tentative="1">
+      <w:start w:val="1"/>
+      <w:numFmt w:val="bullet"/>
+      <w:lvlText w:val="o"/>
+      <w:lvlJc w:val="left"/>
+      <w:pPr>
+        <w:ind w:left="5400" w:hanging="360"/>
+      </w:pPr>
+      <w:rPr>
+        <w:rFonts w:ascii="Courier New" w:hAnsi="Courier New" w:hint="default"/>
+      </w:rPr>
+    </w:lvl>
+    <w:lvl w:ilvl="8" w:tplc="08090005" w:tentative="1">
+      <w:start w:val="1"/>
+      <w:numFmt w:val="bullet"/>
+      <w:lvlText w:val=""/>
+      <w:lvlJc w:val="left"/>
+      <w:pPr>
+        <w:ind w:left="6120" w:hanging="360"/>
+      </w:pPr>
+      <w:rPr>
+        <w:rFonts w:ascii="Wingdings" w:hAnsi="Wingdings" w:hint="default"/>
+      </w:rPr>
+    </w:lvl>
+  </w:abstractNum>
+  <w:abstractNum w:abstractNumId="25" w15:restartNumberingAfterBreak="0">
     <w:nsid w:val="1E9C7402"/>
     <w:multiLevelType w:val="hybridMultilevel"/>
     <w:tmpl w:val="B0E82B0A"/>
@@ -23874,7 +24034,7 @@
       </w:rPr>
     </w:lvl>
   </w:abstractNum>
-  <w:abstractNum w:abstractNumId="25" w15:restartNumberingAfterBreak="0">
+  <w:abstractNum w:abstractNumId="26" w15:restartNumberingAfterBreak="0">
     <w:nsid w:val="1F6A6333"/>
     <w:multiLevelType w:val="hybridMultilevel"/>
     <w:tmpl w:val="AC129A0A"/>
@@ -23987,7 +24147,7 @@
       </w:rPr>
     </w:lvl>
   </w:abstractNum>
-  <w:abstractNum w:abstractNumId="26" w15:restartNumberingAfterBreak="0">
+  <w:abstractNum w:abstractNumId="27" w15:restartNumberingAfterBreak="0">
     <w:nsid w:val="24D7187D"/>
     <w:multiLevelType w:val="multilevel"/>
     <w:tmpl w:val="56067F5E"/>
@@ -24136,7 +24296,7 @@
       </w:rPr>
     </w:lvl>
   </w:abstractNum>
-  <w:abstractNum w:abstractNumId="27" w15:restartNumberingAfterBreak="0">
+  <w:abstractNum w:abstractNumId="28" w15:restartNumberingAfterBreak="0">
     <w:nsid w:val="25F60763"/>
     <w:multiLevelType w:val="hybridMultilevel"/>
     <w:tmpl w:val="025AA02A"/>
@@ -24248,7 +24408,7 @@
       </w:rPr>
     </w:lvl>
   </w:abstractNum>
-  <w:abstractNum w:abstractNumId="28" w15:restartNumberingAfterBreak="0">
+  <w:abstractNum w:abstractNumId="29" w15:restartNumberingAfterBreak="0">
     <w:nsid w:val="261C410E"/>
     <w:multiLevelType w:val="multilevel"/>
     <w:tmpl w:val="E5D24552"/>
@@ -24397,7 +24557,7 @@
       </w:rPr>
     </w:lvl>
   </w:abstractNum>
-  <w:abstractNum w:abstractNumId="29" w15:restartNumberingAfterBreak="0">
+  <w:abstractNum w:abstractNumId="30" w15:restartNumberingAfterBreak="0">
     <w:nsid w:val="278E3E6C"/>
     <w:multiLevelType w:val="multilevel"/>
     <w:tmpl w:val="D6BA254C"/>
@@ -24546,7 +24706,7 @@
       </w:rPr>
     </w:lvl>
   </w:abstractNum>
-  <w:abstractNum w:abstractNumId="30" w15:restartNumberingAfterBreak="0">
+  <w:abstractNum w:abstractNumId="31" w15:restartNumberingAfterBreak="0">
     <w:nsid w:val="2AB51A0F"/>
     <w:multiLevelType w:val="hybridMultilevel"/>
     <w:tmpl w:val="9BC8E37E"/>
@@ -24632,7 +24792,7 @@
       </w:pPr>
     </w:lvl>
   </w:abstractNum>
-  <w:abstractNum w:abstractNumId="31" w15:restartNumberingAfterBreak="0">
+  <w:abstractNum w:abstractNumId="32" w15:restartNumberingAfterBreak="0">
     <w:nsid w:val="2B104047"/>
     <w:multiLevelType w:val="multilevel"/>
     <w:tmpl w:val="6BA65B70"/>
@@ -24781,7 +24941,7 @@
       </w:rPr>
     </w:lvl>
   </w:abstractNum>
-  <w:abstractNum w:abstractNumId="32" w15:restartNumberingAfterBreak="0">
+  <w:abstractNum w:abstractNumId="33" w15:restartNumberingAfterBreak="0">
     <w:nsid w:val="2B16144E"/>
     <w:multiLevelType w:val="multilevel"/>
     <w:tmpl w:val="313AC492"/>
@@ -24930,7 +25090,7 @@
       </w:rPr>
     </w:lvl>
   </w:abstractNum>
-  <w:abstractNum w:abstractNumId="33" w15:restartNumberingAfterBreak="0">
+  <w:abstractNum w:abstractNumId="34" w15:restartNumberingAfterBreak="0">
     <w:nsid w:val="2B1E67D0"/>
     <w:multiLevelType w:val="hybridMultilevel"/>
     <w:tmpl w:val="DADA7590"/>
@@ -24984,7 +25144,7 @@
       <w:lvlJc w:val="left"/>
     </w:lvl>
   </w:abstractNum>
-  <w:abstractNum w:abstractNumId="34" w15:restartNumberingAfterBreak="0">
+  <w:abstractNum w:abstractNumId="35" w15:restartNumberingAfterBreak="0">
     <w:nsid w:val="2C7373CB"/>
     <w:multiLevelType w:val="multilevel"/>
     <w:tmpl w:val="E69EEE34"/>
@@ -25133,7 +25293,7 @@
       </w:rPr>
     </w:lvl>
   </w:abstractNum>
-  <w:abstractNum w:abstractNumId="35" w15:restartNumberingAfterBreak="0">
+  <w:abstractNum w:abstractNumId="36" w15:restartNumberingAfterBreak="0">
     <w:nsid w:val="2FD132C2"/>
     <w:multiLevelType w:val="multilevel"/>
     <w:tmpl w:val="F0C8B0DA"/>
@@ -25282,7 +25442,7 @@
       </w:rPr>
     </w:lvl>
   </w:abstractNum>
-  <w:abstractNum w:abstractNumId="36" w15:restartNumberingAfterBreak="0">
+  <w:abstractNum w:abstractNumId="37" w15:restartNumberingAfterBreak="0">
     <w:nsid w:val="31584585"/>
     <w:multiLevelType w:val="multilevel"/>
     <w:tmpl w:val="A4FCDFAC"/>
@@ -25431,7 +25591,7 @@
       </w:rPr>
     </w:lvl>
   </w:abstractNum>
-  <w:abstractNum w:abstractNumId="37" w15:restartNumberingAfterBreak="0">
+  <w:abstractNum w:abstractNumId="38" w15:restartNumberingAfterBreak="0">
     <w:nsid w:val="31BD6FE7"/>
     <w:multiLevelType w:val="hybridMultilevel"/>
     <w:tmpl w:val="7F28BA68"/>
@@ -25544,7 +25704,7 @@
       </w:rPr>
     </w:lvl>
   </w:abstractNum>
-  <w:abstractNum w:abstractNumId="38" w15:restartNumberingAfterBreak="0">
+  <w:abstractNum w:abstractNumId="39" w15:restartNumberingAfterBreak="0">
     <w:nsid w:val="31CA4C82"/>
     <w:multiLevelType w:val="multilevel"/>
     <w:tmpl w:val="CE788926"/>
@@ -25693,7 +25853,7 @@
       </w:rPr>
     </w:lvl>
   </w:abstractNum>
-  <w:abstractNum w:abstractNumId="39" w15:restartNumberingAfterBreak="0">
+  <w:abstractNum w:abstractNumId="40" w15:restartNumberingAfterBreak="0">
     <w:nsid w:val="33B96DDF"/>
     <w:multiLevelType w:val="multilevel"/>
     <w:tmpl w:val="884647CE"/>
@@ -25842,7 +26002,7 @@
       </w:rPr>
     </w:lvl>
   </w:abstractNum>
-  <w:abstractNum w:abstractNumId="40" w15:restartNumberingAfterBreak="0">
+  <w:abstractNum w:abstractNumId="41" w15:restartNumberingAfterBreak="0">
     <w:nsid w:val="34EC6CE4"/>
     <w:multiLevelType w:val="hybridMultilevel"/>
     <w:tmpl w:val="57D647EE"/>
@@ -25955,7 +26115,7 @@
       </w:rPr>
     </w:lvl>
   </w:abstractNum>
-  <w:abstractNum w:abstractNumId="41" w15:restartNumberingAfterBreak="0">
+  <w:abstractNum w:abstractNumId="42" w15:restartNumberingAfterBreak="0">
     <w:nsid w:val="34F85DF1"/>
     <w:multiLevelType w:val="hybridMultilevel"/>
     <w:tmpl w:val="6DACE55E"/>
@@ -26041,7 +26201,7 @@
       </w:pPr>
     </w:lvl>
   </w:abstractNum>
-  <w:abstractNum w:abstractNumId="42" w15:restartNumberingAfterBreak="0">
+  <w:abstractNum w:abstractNumId="43" w15:restartNumberingAfterBreak="0">
     <w:nsid w:val="372A72B3"/>
     <w:multiLevelType w:val="multilevel"/>
     <w:tmpl w:val="15A82688"/>
@@ -26190,7 +26350,7 @@
       </w:rPr>
     </w:lvl>
   </w:abstractNum>
-  <w:abstractNum w:abstractNumId="43" w15:restartNumberingAfterBreak="0">
+  <w:abstractNum w:abstractNumId="44" w15:restartNumberingAfterBreak="0">
     <w:nsid w:val="389621D2"/>
     <w:multiLevelType w:val="hybridMultilevel"/>
     <w:tmpl w:val="08EC88CE"/>
@@ -26303,7 +26463,7 @@
       </w:rPr>
     </w:lvl>
   </w:abstractNum>
-  <w:abstractNum w:abstractNumId="44" w15:restartNumberingAfterBreak="0">
+  <w:abstractNum w:abstractNumId="45" w15:restartNumberingAfterBreak="0">
     <w:nsid w:val="3BDF2BB7"/>
     <w:multiLevelType w:val="hybridMultilevel"/>
     <w:tmpl w:val="14EADB84"/>
@@ -26416,7 +26576,7 @@
       </w:rPr>
     </w:lvl>
   </w:abstractNum>
-  <w:abstractNum w:abstractNumId="45" w15:restartNumberingAfterBreak="0">
+  <w:abstractNum w:abstractNumId="46" w15:restartNumberingAfterBreak="0">
     <w:nsid w:val="3E6B45A9"/>
     <w:multiLevelType w:val="multilevel"/>
     <w:tmpl w:val="2EE43C8A"/>
@@ -26565,7 +26725,7 @@
       </w:rPr>
     </w:lvl>
   </w:abstractNum>
-  <w:abstractNum w:abstractNumId="46" w15:restartNumberingAfterBreak="0">
+  <w:abstractNum w:abstractNumId="47" w15:restartNumberingAfterBreak="0">
     <w:nsid w:val="3F2520BF"/>
     <w:multiLevelType w:val="multilevel"/>
     <w:tmpl w:val="10167F0A"/>
@@ -26714,7 +26874,7 @@
       </w:rPr>
     </w:lvl>
   </w:abstractNum>
-  <w:abstractNum w:abstractNumId="47" w15:restartNumberingAfterBreak="0">
+  <w:abstractNum w:abstractNumId="48" w15:restartNumberingAfterBreak="0">
     <w:nsid w:val="407505E8"/>
     <w:multiLevelType w:val="multilevel"/>
     <w:tmpl w:val="9078EBE8"/>
@@ -26863,7 +27023,7 @@
       </w:rPr>
     </w:lvl>
   </w:abstractNum>
-  <w:abstractNum w:abstractNumId="48" w15:restartNumberingAfterBreak="0">
+  <w:abstractNum w:abstractNumId="49" w15:restartNumberingAfterBreak="0">
     <w:nsid w:val="41395AFB"/>
     <w:multiLevelType w:val="multilevel"/>
     <w:tmpl w:val="4D52D892"/>
@@ -27012,7 +27172,7 @@
       </w:rPr>
     </w:lvl>
   </w:abstractNum>
-  <w:abstractNum w:abstractNumId="49" w15:restartNumberingAfterBreak="0">
+  <w:abstractNum w:abstractNumId="50" w15:restartNumberingAfterBreak="0">
     <w:nsid w:val="43BC3CCF"/>
     <w:multiLevelType w:val="multilevel"/>
     <w:tmpl w:val="3C8C1408"/>
@@ -27161,7 +27321,7 @@
       </w:rPr>
     </w:lvl>
   </w:abstractNum>
-  <w:abstractNum w:abstractNumId="50" w15:restartNumberingAfterBreak="0">
+  <w:abstractNum w:abstractNumId="51" w15:restartNumberingAfterBreak="0">
     <w:nsid w:val="452441AC"/>
     <w:multiLevelType w:val="multilevel"/>
     <w:tmpl w:val="57303D5C"/>
@@ -27310,7 +27470,7 @@
       </w:rPr>
     </w:lvl>
   </w:abstractNum>
-  <w:abstractNum w:abstractNumId="51" w15:restartNumberingAfterBreak="0">
+  <w:abstractNum w:abstractNumId="52" w15:restartNumberingAfterBreak="0">
     <w:nsid w:val="45993993"/>
     <w:multiLevelType w:val="multilevel"/>
     <w:tmpl w:val="F8E87114"/>
@@ -27459,7 +27619,7 @@
       </w:rPr>
     </w:lvl>
   </w:abstractNum>
-  <w:abstractNum w:abstractNumId="52" w15:restartNumberingAfterBreak="0">
+  <w:abstractNum w:abstractNumId="53" w15:restartNumberingAfterBreak="0">
     <w:nsid w:val="460B64B9"/>
     <w:multiLevelType w:val="multilevel"/>
     <w:tmpl w:val="926CE0C2"/>
@@ -27608,7 +27768,7 @@
       </w:rPr>
     </w:lvl>
   </w:abstractNum>
-  <w:abstractNum w:abstractNumId="53" w15:restartNumberingAfterBreak="0">
+  <w:abstractNum w:abstractNumId="54" w15:restartNumberingAfterBreak="0">
     <w:nsid w:val="46D52C4A"/>
     <w:multiLevelType w:val="multilevel"/>
     <w:tmpl w:val="AD7CEAA0"/>
@@ -27757,7 +27917,7 @@
       </w:rPr>
     </w:lvl>
   </w:abstractNum>
-  <w:abstractNum w:abstractNumId="54" w15:restartNumberingAfterBreak="0">
+  <w:abstractNum w:abstractNumId="55" w15:restartNumberingAfterBreak="0">
     <w:nsid w:val="46EB78A3"/>
     <w:multiLevelType w:val="multilevel"/>
     <w:tmpl w:val="C026F046"/>
@@ -27906,7 +28066,7 @@
       </w:rPr>
     </w:lvl>
   </w:abstractNum>
-  <w:abstractNum w:abstractNumId="55" w15:restartNumberingAfterBreak="0">
+  <w:abstractNum w:abstractNumId="56" w15:restartNumberingAfterBreak="0">
     <w:nsid w:val="4E0F4858"/>
     <w:multiLevelType w:val="hybridMultilevel"/>
     <w:tmpl w:val="7FCEA5BA"/>
@@ -28019,7 +28179,7 @@
       </w:rPr>
     </w:lvl>
   </w:abstractNum>
-  <w:abstractNum w:abstractNumId="56" w15:restartNumberingAfterBreak="0">
+  <w:abstractNum w:abstractNumId="57" w15:restartNumberingAfterBreak="0">
     <w:nsid w:val="4E1F3226"/>
     <w:multiLevelType w:val="hybridMultilevel"/>
     <w:tmpl w:val="B32C39DC"/>
@@ -28132,7 +28292,7 @@
       </w:rPr>
     </w:lvl>
   </w:abstractNum>
-  <w:abstractNum w:abstractNumId="57" w15:restartNumberingAfterBreak="0">
+  <w:abstractNum w:abstractNumId="58" w15:restartNumberingAfterBreak="0">
     <w:nsid w:val="51852F6C"/>
     <w:multiLevelType w:val="hybridMultilevel"/>
     <w:tmpl w:val="B8E25894"/>
@@ -28245,7 +28405,7 @@
       </w:rPr>
     </w:lvl>
   </w:abstractNum>
-  <w:abstractNum w:abstractNumId="58" w15:restartNumberingAfterBreak="0">
+  <w:abstractNum w:abstractNumId="59" w15:restartNumberingAfterBreak="0">
     <w:nsid w:val="51E91229"/>
     <w:multiLevelType w:val="multilevel"/>
     <w:tmpl w:val="BD560866"/>
@@ -28394,7 +28554,7 @@
       </w:rPr>
     </w:lvl>
   </w:abstractNum>
-  <w:abstractNum w:abstractNumId="59" w15:restartNumberingAfterBreak="0">
+  <w:abstractNum w:abstractNumId="60" w15:restartNumberingAfterBreak="0">
     <w:nsid w:val="52287EA4"/>
     <w:multiLevelType w:val="multilevel"/>
     <w:tmpl w:val="7186841C"/>
@@ -28543,7 +28703,7 @@
       </w:rPr>
     </w:lvl>
   </w:abstractNum>
-  <w:abstractNum w:abstractNumId="60" w15:restartNumberingAfterBreak="0">
+  <w:abstractNum w:abstractNumId="61" w15:restartNumberingAfterBreak="0">
     <w:nsid w:val="52460709"/>
     <w:multiLevelType w:val="multilevel"/>
     <w:tmpl w:val="0A5A706E"/>
@@ -28692,7 +28852,7 @@
       </w:rPr>
     </w:lvl>
   </w:abstractNum>
-  <w:abstractNum w:abstractNumId="61" w15:restartNumberingAfterBreak="0">
+  <w:abstractNum w:abstractNumId="62" w15:restartNumberingAfterBreak="0">
     <w:nsid w:val="533D0C4B"/>
     <w:multiLevelType w:val="multilevel"/>
     <w:tmpl w:val="7D8499FA"/>
@@ -28841,7 +29001,7 @@
       </w:rPr>
     </w:lvl>
   </w:abstractNum>
-  <w:abstractNum w:abstractNumId="62" w15:restartNumberingAfterBreak="0">
+  <w:abstractNum w:abstractNumId="63" w15:restartNumberingAfterBreak="0">
     <w:nsid w:val="5742528A"/>
     <w:multiLevelType w:val="multilevel"/>
     <w:tmpl w:val="7F86BB1A"/>
@@ -28990,7 +29150,7 @@
       </w:rPr>
     </w:lvl>
   </w:abstractNum>
-  <w:abstractNum w:abstractNumId="63" w15:restartNumberingAfterBreak="0">
+  <w:abstractNum w:abstractNumId="64" w15:restartNumberingAfterBreak="0">
     <w:nsid w:val="579C48F8"/>
     <w:multiLevelType w:val="hybridMultilevel"/>
     <w:tmpl w:val="35C2D2A4"/>
@@ -29103,7 +29263,7 @@
       </w:rPr>
     </w:lvl>
   </w:abstractNum>
-  <w:abstractNum w:abstractNumId="64" w15:restartNumberingAfterBreak="0">
+  <w:abstractNum w:abstractNumId="65" w15:restartNumberingAfterBreak="0">
     <w:nsid w:val="57EA6864"/>
     <w:multiLevelType w:val="hybridMultilevel"/>
     <w:tmpl w:val="2DDE0918"/>
@@ -29216,7 +29376,7 @@
       </w:rPr>
     </w:lvl>
   </w:abstractNum>
-  <w:abstractNum w:abstractNumId="65" w15:restartNumberingAfterBreak="0">
+  <w:abstractNum w:abstractNumId="66" w15:restartNumberingAfterBreak="0">
     <w:nsid w:val="589100E7"/>
     <w:multiLevelType w:val="hybridMultilevel"/>
     <w:tmpl w:val="AE48755C"/>
@@ -29305,7 +29465,7 @@
       </w:pPr>
     </w:lvl>
   </w:abstractNum>
-  <w:abstractNum w:abstractNumId="66" w15:restartNumberingAfterBreak="0">
+  <w:abstractNum w:abstractNumId="67" w15:restartNumberingAfterBreak="0">
     <w:nsid w:val="5BDB22FF"/>
     <w:multiLevelType w:val="multilevel"/>
     <w:tmpl w:val="9A624C48"/>
@@ -29454,7 +29614,7 @@
       </w:rPr>
     </w:lvl>
   </w:abstractNum>
-  <w:abstractNum w:abstractNumId="67" w15:restartNumberingAfterBreak="0">
+  <w:abstractNum w:abstractNumId="68" w15:restartNumberingAfterBreak="0">
     <w:nsid w:val="5DC05C83"/>
     <w:multiLevelType w:val="hybridMultilevel"/>
     <w:tmpl w:val="C6707418"/>
@@ -29567,7 +29727,7 @@
       </w:rPr>
     </w:lvl>
   </w:abstractNum>
-  <w:abstractNum w:abstractNumId="68" w15:restartNumberingAfterBreak="0">
+  <w:abstractNum w:abstractNumId="69" w15:restartNumberingAfterBreak="0">
     <w:nsid w:val="5E1C1394"/>
     <w:multiLevelType w:val="hybridMultilevel"/>
     <w:tmpl w:val="76B6A122"/>
@@ -29680,7 +29840,7 @@
       </w:rPr>
     </w:lvl>
   </w:abstractNum>
-  <w:abstractNum w:abstractNumId="69" w15:restartNumberingAfterBreak="0">
+  <w:abstractNum w:abstractNumId="70" w15:restartNumberingAfterBreak="0">
     <w:nsid w:val="5E4C51F2"/>
     <w:multiLevelType w:val="multilevel"/>
     <w:tmpl w:val="D6B46928"/>
@@ -29829,7 +29989,7 @@
       </w:rPr>
     </w:lvl>
   </w:abstractNum>
-  <w:abstractNum w:abstractNumId="70" w15:restartNumberingAfterBreak="0">
+  <w:abstractNum w:abstractNumId="71" w15:restartNumberingAfterBreak="0">
     <w:nsid w:val="5EC914B3"/>
     <w:multiLevelType w:val="hybridMultilevel"/>
     <w:tmpl w:val="77789A38"/>
@@ -29942,7 +30102,7 @@
       </w:rPr>
     </w:lvl>
   </w:abstractNum>
-  <w:abstractNum w:abstractNumId="71" w15:restartNumberingAfterBreak="0">
+  <w:abstractNum w:abstractNumId="72" w15:restartNumberingAfterBreak="0">
     <w:nsid w:val="63643440"/>
     <w:multiLevelType w:val="hybridMultilevel"/>
     <w:tmpl w:val="4E846D02"/>
@@ -30055,7 +30215,7 @@
       </w:rPr>
     </w:lvl>
   </w:abstractNum>
-  <w:abstractNum w:abstractNumId="72" w15:restartNumberingAfterBreak="0">
+  <w:abstractNum w:abstractNumId="73" w15:restartNumberingAfterBreak="0">
     <w:nsid w:val="647407F9"/>
     <w:multiLevelType w:val="multilevel"/>
     <w:tmpl w:val="2918D2BC"/>
@@ -30204,7 +30364,7 @@
       </w:rPr>
     </w:lvl>
   </w:abstractNum>
-  <w:abstractNum w:abstractNumId="73" w15:restartNumberingAfterBreak="0">
+  <w:abstractNum w:abstractNumId="74" w15:restartNumberingAfterBreak="0">
     <w:nsid w:val="64B25DB8"/>
     <w:multiLevelType w:val="hybridMultilevel"/>
     <w:tmpl w:val="3176DDE4"/>
@@ -30317,7 +30477,7 @@
       </w:rPr>
     </w:lvl>
   </w:abstractNum>
-  <w:abstractNum w:abstractNumId="74" w15:restartNumberingAfterBreak="0">
+  <w:abstractNum w:abstractNumId="75" w15:restartNumberingAfterBreak="0">
     <w:nsid w:val="6A690A94"/>
     <w:multiLevelType w:val="multilevel"/>
     <w:tmpl w:val="F06AB9F4"/>
@@ -30466,7 +30626,7 @@
       </w:rPr>
     </w:lvl>
   </w:abstractNum>
-  <w:abstractNum w:abstractNumId="75" w15:restartNumberingAfterBreak="0">
+  <w:abstractNum w:abstractNumId="76" w15:restartNumberingAfterBreak="0">
     <w:nsid w:val="6B240B76"/>
     <w:multiLevelType w:val="multilevel"/>
     <w:tmpl w:val="B3BE21DA"/>
@@ -30615,7 +30775,7 @@
       </w:rPr>
     </w:lvl>
   </w:abstractNum>
-  <w:abstractNum w:abstractNumId="76" w15:restartNumberingAfterBreak="0">
+  <w:abstractNum w:abstractNumId="77" w15:restartNumberingAfterBreak="0">
     <w:nsid w:val="6E6C6EDE"/>
     <w:multiLevelType w:val="multilevel"/>
     <w:tmpl w:val="2F0674F0"/>
@@ -30764,7 +30924,7 @@
       </w:rPr>
     </w:lvl>
   </w:abstractNum>
-  <w:abstractNum w:abstractNumId="77" w15:restartNumberingAfterBreak="0">
+  <w:abstractNum w:abstractNumId="78" w15:restartNumberingAfterBreak="0">
     <w:nsid w:val="6F822585"/>
     <w:multiLevelType w:val="multilevel"/>
     <w:tmpl w:val="500E816E"/>
@@ -30913,7 +31073,7 @@
       </w:rPr>
     </w:lvl>
   </w:abstractNum>
-  <w:abstractNum w:abstractNumId="78" w15:restartNumberingAfterBreak="0">
+  <w:abstractNum w:abstractNumId="79" w15:restartNumberingAfterBreak="0">
     <w:nsid w:val="70A941D0"/>
     <w:multiLevelType w:val="hybridMultilevel"/>
     <w:tmpl w:val="0CDEE118"/>
@@ -31026,7 +31186,7 @@
       </w:rPr>
     </w:lvl>
   </w:abstractNum>
-  <w:abstractNum w:abstractNumId="79" w15:restartNumberingAfterBreak="0">
+  <w:abstractNum w:abstractNumId="80" w15:restartNumberingAfterBreak="0">
     <w:nsid w:val="715B01F7"/>
     <w:multiLevelType w:val="multilevel"/>
     <w:tmpl w:val="17D484E4"/>
@@ -31175,7 +31335,7 @@
       </w:rPr>
     </w:lvl>
   </w:abstractNum>
-  <w:abstractNum w:abstractNumId="80" w15:restartNumberingAfterBreak="0">
+  <w:abstractNum w:abstractNumId="81" w15:restartNumberingAfterBreak="0">
     <w:nsid w:val="754D4B15"/>
     <w:multiLevelType w:val="multilevel"/>
     <w:tmpl w:val="38603636"/>
@@ -31324,7 +31484,7 @@
       </w:rPr>
     </w:lvl>
   </w:abstractNum>
-  <w:abstractNum w:abstractNumId="81" w15:restartNumberingAfterBreak="0">
+  <w:abstractNum w:abstractNumId="82" w15:restartNumberingAfterBreak="0">
     <w:nsid w:val="789A7CCA"/>
     <w:multiLevelType w:val="multilevel"/>
     <w:tmpl w:val="23E0ADF6"/>
@@ -31473,7 +31633,7 @@
       </w:rPr>
     </w:lvl>
   </w:abstractNum>
-  <w:abstractNum w:abstractNumId="82" w15:restartNumberingAfterBreak="0">
+  <w:abstractNum w:abstractNumId="83" w15:restartNumberingAfterBreak="0">
     <w:nsid w:val="7AC80EA7"/>
     <w:multiLevelType w:val="multilevel"/>
     <w:tmpl w:val="8ECCB664"/>
@@ -31622,7 +31782,7 @@
       </w:rPr>
     </w:lvl>
   </w:abstractNum>
-  <w:abstractNum w:abstractNumId="83" w15:restartNumberingAfterBreak="0">
+  <w:abstractNum w:abstractNumId="84" w15:restartNumberingAfterBreak="0">
     <w:nsid w:val="7B0F316D"/>
     <w:multiLevelType w:val="hybridMultilevel"/>
     <w:tmpl w:val="D52C8A9E"/>
@@ -31735,7 +31895,7 @@
       </w:rPr>
     </w:lvl>
   </w:abstractNum>
-  <w:abstractNum w:abstractNumId="84" w15:restartNumberingAfterBreak="0">
+  <w:abstractNum w:abstractNumId="85" w15:restartNumberingAfterBreak="0">
     <w:nsid w:val="7E5430E8"/>
     <w:multiLevelType w:val="multilevel"/>
     <w:tmpl w:val="FF002A7A"/>
@@ -31884,7 +32044,7 @@
       </w:rPr>
     </w:lvl>
   </w:abstractNum>
-  <w:abstractNum w:abstractNumId="85" w15:restartNumberingAfterBreak="0">
+  <w:abstractNum w:abstractNumId="86" w15:restartNumberingAfterBreak="0">
     <w:nsid w:val="7E707357"/>
     <w:multiLevelType w:val="hybridMultilevel"/>
     <w:tmpl w:val="577ED19A"/>
@@ -31998,7 +32158,7 @@
     </w:lvl>
   </w:abstractNum>
   <w:num w:numId="1" w16cid:durableId="1294671567">
-    <w:abstractNumId w:val="27"/>
+    <w:abstractNumId w:val="28"/>
   </w:num>
   <w:num w:numId="2" w16cid:durableId="1388527350">
     <w:abstractNumId w:val="22"/>
@@ -32007,22 +32167,22 @@
     <w:abstractNumId w:val="10"/>
   </w:num>
   <w:num w:numId="4" w16cid:durableId="1587029756">
-    <w:abstractNumId w:val="65"/>
+    <w:abstractNumId w:val="66"/>
   </w:num>
   <w:num w:numId="5" w16cid:durableId="1895044576">
-    <w:abstractNumId w:val="41"/>
+    <w:abstractNumId w:val="42"/>
     <w:lvlOverride w:ilvl="0">
       <w:startOverride w:val="1"/>
     </w:lvlOverride>
   </w:num>
   <w:num w:numId="6" w16cid:durableId="945699028">
-    <w:abstractNumId w:val="64"/>
+    <w:abstractNumId w:val="65"/>
   </w:num>
   <w:num w:numId="7" w16cid:durableId="2089231128">
-    <w:abstractNumId w:val="57"/>
+    <w:abstractNumId w:val="58"/>
   </w:num>
   <w:num w:numId="8" w16cid:durableId="1598639917">
-    <w:abstractNumId w:val="30"/>
+    <w:abstractNumId w:val="31"/>
   </w:num>
   <w:num w:numId="9" w16cid:durableId="842817522">
     <w:abstractNumId w:val="2"/>
@@ -32031,97 +32191,97 @@
     <w:abstractNumId w:val="20"/>
   </w:num>
   <w:num w:numId="11" w16cid:durableId="400906209">
-    <w:abstractNumId w:val="56"/>
+    <w:abstractNumId w:val="57"/>
   </w:num>
   <w:num w:numId="12" w16cid:durableId="1488978462">
-    <w:abstractNumId w:val="67"/>
+    <w:abstractNumId w:val="68"/>
   </w:num>
   <w:num w:numId="13" w16cid:durableId="1082490718">
     <w:abstractNumId w:val="16"/>
   </w:num>
   <w:num w:numId="14" w16cid:durableId="892691908">
-    <w:abstractNumId w:val="73"/>
+    <w:abstractNumId w:val="74"/>
   </w:num>
   <w:num w:numId="15" w16cid:durableId="1421564118">
-    <w:abstractNumId w:val="53"/>
+    <w:abstractNumId w:val="54"/>
   </w:num>
   <w:num w:numId="16" w16cid:durableId="711271180">
-    <w:abstractNumId w:val="54"/>
+    <w:abstractNumId w:val="55"/>
   </w:num>
   <w:num w:numId="17" w16cid:durableId="1226603131">
-    <w:abstractNumId w:val="42"/>
+    <w:abstractNumId w:val="43"/>
   </w:num>
   <w:num w:numId="18" w16cid:durableId="1009989069">
     <w:abstractNumId w:val="14"/>
   </w:num>
   <w:num w:numId="19" w16cid:durableId="1876113810">
-    <w:abstractNumId w:val="66"/>
+    <w:abstractNumId w:val="67"/>
   </w:num>
   <w:num w:numId="20" w16cid:durableId="258952305">
-    <w:abstractNumId w:val="39"/>
+    <w:abstractNumId w:val="40"/>
   </w:num>
   <w:num w:numId="21" w16cid:durableId="193269063">
-    <w:abstractNumId w:val="52"/>
+    <w:abstractNumId w:val="53"/>
   </w:num>
   <w:num w:numId="22" w16cid:durableId="1957787929">
-    <w:abstractNumId w:val="84"/>
+    <w:abstractNumId w:val="85"/>
   </w:num>
   <w:num w:numId="23" w16cid:durableId="1798525176">
     <w:abstractNumId w:val="0"/>
   </w:num>
   <w:num w:numId="24" w16cid:durableId="2012947173">
-    <w:abstractNumId w:val="49"/>
+    <w:abstractNumId w:val="50"/>
   </w:num>
   <w:num w:numId="25" w16cid:durableId="1288661012">
-    <w:abstractNumId w:val="60"/>
+    <w:abstractNumId w:val="61"/>
   </w:num>
   <w:num w:numId="26" w16cid:durableId="1264921622">
     <w:abstractNumId w:val="1"/>
   </w:num>
   <w:num w:numId="27" w16cid:durableId="1530334405">
-    <w:abstractNumId w:val="28"/>
+    <w:abstractNumId w:val="29"/>
   </w:num>
   <w:num w:numId="28" w16cid:durableId="798107868">
     <w:abstractNumId w:val="5"/>
   </w:num>
   <w:num w:numId="29" w16cid:durableId="1398014314">
-    <w:abstractNumId w:val="32"/>
+    <w:abstractNumId w:val="33"/>
   </w:num>
   <w:num w:numId="30" w16cid:durableId="1086147049">
     <w:abstractNumId w:val="9"/>
   </w:num>
   <w:num w:numId="31" w16cid:durableId="60909378">
-    <w:abstractNumId w:val="46"/>
+    <w:abstractNumId w:val="47"/>
   </w:num>
   <w:num w:numId="32" w16cid:durableId="1784156210">
     <w:abstractNumId w:val="15"/>
   </w:num>
   <w:num w:numId="33" w16cid:durableId="1484656781">
-    <w:abstractNumId w:val="79"/>
+    <w:abstractNumId w:val="80"/>
   </w:num>
   <w:num w:numId="34" w16cid:durableId="1937707773">
-    <w:abstractNumId w:val="38"/>
+    <w:abstractNumId w:val="39"/>
   </w:num>
   <w:num w:numId="35" w16cid:durableId="1147013167">
-    <w:abstractNumId w:val="82"/>
+    <w:abstractNumId w:val="83"/>
   </w:num>
   <w:num w:numId="36" w16cid:durableId="2011564385">
-    <w:abstractNumId w:val="34"/>
+    <w:abstractNumId w:val="35"/>
   </w:num>
   <w:num w:numId="37" w16cid:durableId="747532743">
-    <w:abstractNumId w:val="36"/>
+    <w:abstractNumId w:val="37"/>
   </w:num>
   <w:num w:numId="38" w16cid:durableId="1025598280">
-    <w:abstractNumId w:val="33"/>
+    <w:abstractNumId w:val="34"/>
     <w:lvlOverride w:ilvl="0">
       <w:startOverride w:val="1"/>
     </w:lvlOverride>
   </w:num>
   <w:num w:numId="39" w16cid:durableId="992368564">
-    <w:abstractNumId w:val="63"/>
+    <w:abstractNumId w:val="64"/>
   </w:num>
   <w:num w:numId="40" w16cid:durableId="127020779">
-    <w:abstractNumId w:val="44"/>
+    <w:abstractNumId w:val="45"/>
   </w:num>
   <w:num w:numId="41" w16cid:durableId="1573999260">
     <w:abstractNumId w:val="3"/>
@@ -32130,73 +32290,73 @@
     <w:abstractNumId w:val="12"/>
   </w:num>
   <w:num w:numId="43" w16cid:durableId="2033605837">
-    <w:abstractNumId w:val="85"/>
+    <w:abstractNumId w:val="86"/>
   </w:num>
   <w:num w:numId="44" w16cid:durableId="1300500461">
-    <w:abstractNumId w:val="37"/>
+    <w:abstractNumId w:val="38"/>
   </w:num>
   <w:num w:numId="45" w16cid:durableId="1327321127">
-    <w:abstractNumId w:val="25"/>
+    <w:abstractNumId w:val="26"/>
   </w:num>
   <w:num w:numId="46" w16cid:durableId="1239827843">
-    <w:abstractNumId w:val="71"/>
+    <w:abstractNumId w:val="72"/>
   </w:num>
   <w:num w:numId="47" w16cid:durableId="412094175">
-    <w:abstractNumId w:val="43"/>
+    <w:abstractNumId w:val="44"/>
   </w:num>
   <w:num w:numId="48" w16cid:durableId="1705591695">
     <w:abstractNumId w:val="6"/>
   </w:num>
   <w:num w:numId="49" w16cid:durableId="1026716683">
-    <w:abstractNumId w:val="24"/>
+    <w:abstractNumId w:val="25"/>
   </w:num>
   <w:num w:numId="50" w16cid:durableId="486823957">
-    <w:abstractNumId w:val="78"/>
+    <w:abstractNumId w:val="79"/>
   </w:num>
   <w:num w:numId="51" w16cid:durableId="2074769408">
-    <w:abstractNumId w:val="70"/>
+    <w:abstractNumId w:val="71"/>
   </w:num>
   <w:num w:numId="52" w16cid:durableId="2021813036">
-    <w:abstractNumId w:val="55"/>
+    <w:abstractNumId w:val="56"/>
   </w:num>
   <w:num w:numId="53" w16cid:durableId="1267157948">
-    <w:abstractNumId w:val="40"/>
+    <w:abstractNumId w:val="41"/>
   </w:num>
   <w:num w:numId="54" w16cid:durableId="974219990">
-    <w:abstractNumId w:val="68"/>
+    <w:abstractNumId w:val="69"/>
   </w:num>
   <w:num w:numId="55" w16cid:durableId="123888133">
     <w:abstractNumId w:val="21"/>
   </w:num>
   <w:num w:numId="56" w16cid:durableId="2117825813">
-    <w:abstractNumId w:val="83"/>
+    <w:abstractNumId w:val="84"/>
   </w:num>
   <w:num w:numId="57" w16cid:durableId="230819219">
-    <w:abstractNumId w:val="35"/>
+    <w:abstractNumId w:val="36"/>
   </w:num>
   <w:num w:numId="58" w16cid:durableId="1118137379">
     <w:abstractNumId w:val="18"/>
   </w:num>
   <w:num w:numId="59" w16cid:durableId="1788818624">
-    <w:abstractNumId w:val="48"/>
+    <w:abstractNumId w:val="49"/>
   </w:num>
   <w:num w:numId="60" w16cid:durableId="31343069">
-    <w:abstractNumId w:val="72"/>
+    <w:abstractNumId w:val="73"/>
   </w:num>
   <w:num w:numId="61" w16cid:durableId="563030481">
     <w:abstractNumId w:val="8"/>
   </w:num>
   <w:num w:numId="62" w16cid:durableId="1961496493">
-    <w:abstractNumId w:val="77"/>
+    <w:abstractNumId w:val="78"/>
   </w:num>
   <w:num w:numId="63" w16cid:durableId="62681998">
     <w:abstractNumId w:val="7"/>
   </w:num>
   <w:num w:numId="64" w16cid:durableId="1149787123">
-    <w:abstractNumId w:val="76"/>
+    <w:abstractNumId w:val="77"/>
   </w:num>
   <w:num w:numId="65" w16cid:durableId="1865097595">
-    <w:abstractNumId w:val="47"/>
+    <w:abstractNumId w:val="48"/>
   </w:num>
   <w:num w:numId="66" w16cid:durableId="463620971">
     <w:abstractNumId w:val="11"/>
@@ -32208,58 +32368,61 @@
     <w:abstractNumId w:val="4"/>
   </w:num>
   <w:num w:numId="69" w16cid:durableId="914239719">
-    <w:abstractNumId w:val="74"/>
+    <w:abstractNumId w:val="75"/>
   </w:num>
   <w:num w:numId="70" w16cid:durableId="1432775210">
-    <w:abstractNumId w:val="58"/>
+    <w:abstractNumId w:val="59"/>
   </w:num>
   <w:num w:numId="71" w16cid:durableId="1513490517">
     <w:abstractNumId w:val="17"/>
   </w:num>
   <w:num w:numId="72" w16cid:durableId="1694458611">
-    <w:abstractNumId w:val="59"/>
+    <w:abstractNumId w:val="60"/>
   </w:num>
   <w:num w:numId="73" w16cid:durableId="1278171729">
-    <w:abstractNumId w:val="61"/>
+    <w:abstractNumId w:val="62"/>
   </w:num>
   <w:num w:numId="74" w16cid:durableId="1314066541">
     <w:abstractNumId w:val="13"/>
   </w:num>
   <w:num w:numId="75" w16cid:durableId="1348215438">
-    <w:abstractNumId w:val="51"/>
+    <w:abstractNumId w:val="52"/>
   </w:num>
   <w:num w:numId="76" w16cid:durableId="934635367">
-    <w:abstractNumId w:val="62"/>
+    <w:abstractNumId w:val="63"/>
   </w:num>
   <w:num w:numId="77" w16cid:durableId="686449065">
-    <w:abstractNumId w:val="29"/>
+    <w:abstractNumId w:val="30"/>
   </w:num>
   <w:num w:numId="78" w16cid:durableId="1047023718">
-    <w:abstractNumId w:val="69"/>
+    <w:abstractNumId w:val="70"/>
   </w:num>
   <w:num w:numId="79" w16cid:durableId="813254171">
     <w:abstractNumId w:val="23"/>
   </w:num>
   <w:num w:numId="80" w16cid:durableId="55862390">
-    <w:abstractNumId w:val="45"/>
+    <w:abstractNumId w:val="46"/>
   </w:num>
   <w:num w:numId="81" w16cid:durableId="1101611562">
-    <w:abstractNumId w:val="50"/>
+    <w:abstractNumId w:val="51"/>
   </w:num>
   <w:num w:numId="82" w16cid:durableId="327754875">
+    <w:abstractNumId w:val="82"/>
+  </w:num>
+  <w:num w:numId="83" w16cid:durableId="796871371">
+    <w:abstractNumId w:val="32"/>
+  </w:num>
+  <w:num w:numId="84" w16cid:durableId="1482621684">
+    <w:abstractNumId w:val="27"/>
+  </w:num>
+  <w:num w:numId="85" w16cid:durableId="467942266">
     <w:abstractNumId w:val="81"/>
   </w:num>
-  <w:num w:numId="83" w16cid:durableId="796871371">
-    <w:abstractNumId w:val="31"/>
+  <w:num w:numId="86" w16cid:durableId="2102681995">
+    <w:abstractNumId w:val="76"/>
   </w:num>
-  <w:num w:numId="84" w16cid:durableId="1482621684">
-    <w:abstractNumId w:val="26"/>
-  </w:num>
-  <w:num w:numId="85" w16cid:durableId="467942266">
-    <w:abstractNumId w:val="80"/>
-  </w:num>
-  <w:num w:numId="86" w16cid:durableId="2102681995">
-    <w:abstractNumId w:val="75"/>
+  <w:num w:numId="87" w16cid:durableId="1254044792">
+    <w:abstractNumId w:val="24"/>
   </w:num>
 </w:numbering>
 </file>

</xml_diff>

<commit_message>
Updated pre counting checks
</commit_message>
<xml_diff>
--- a/resources/Test_Framework_Description.docx
+++ b/resources/Test_Framework_Description.docx
@@ -1436,7 +1436,16 @@
         </w:numPr>
       </w:pPr>
       <w:r>
-        <w:t>The 0.70 discount reflects that newly initiating women are less likely to fully suppress quickly compared to the established treatment population ###UPDATE from literature</w:t>
+        <w:t xml:space="preserve">The 0.70 discount reflects that newly initiating women are less likely to fully suppress quickly compared to the established treatment </w:t>
+      </w:r>
+      <w:r>
+        <w:rPr>
+          <w:color w:val="156082" w:themeColor="accent1"/>
+        </w:rPr>
+        <w:t xml:space="preserve">population ###UPDATE </w:t>
+      </w:r>
+      <w:r>
+        <w:t>from literature</w:t>
       </w:r>
     </w:p>
     <w:p>
@@ -1468,30 +1477,6 @@
         <w:rPr>
           <w:rStyle w:val="Strong"/>
         </w:rPr>
-        <w:t>General testing outputs</w:t>
-      </w:r>
-    </w:p>
-    <w:p>
-      <w:pPr>
-        <w:pStyle w:val="whitespace-normal"/>
-        <w:numPr>
-          <w:ilvl w:val="0"/>
-          <w:numId w:val="60"/>
-        </w:numPr>
-      </w:pPr>
-      <w:r>
-        <w:lastRenderedPageBreak/>
-        <w:t>ANC testing also contributes to the general testing cascade (new_diagnoses, re-engagement, ART initiations) using the same yield, linkage, and cost logic as other testing modalities</w:t>
-      </w:r>
-    </w:p>
-    <w:p>
-      <w:pPr>
-        <w:pStyle w:val="font-claude-response-body"/>
-      </w:pPr>
-      <w:r>
-        <w:rPr>
-          <w:rStyle w:val="Strong"/>
-        </w:rPr>
         <w:t>Costs</w:t>
       </w:r>
     </w:p>
@@ -1504,6 +1489,7 @@
         </w:numPr>
       </w:pPr>
       <w:r>
+        <w:lastRenderedPageBreak/>
         <w:t xml:space="preserve">Two cost components: </w:t>
       </w:r>
       <w:r>
@@ -1568,7 +1554,7 @@
         <w:rPr>
           <w:noProof/>
         </w:rPr>
-        <w:pict w14:anchorId="1018D382">
+        <w:pict w14:anchorId="56A3144F">
           <v:rect id="_x0000_i1030" alt="" style="width:451.3pt;height:.05pt;mso-width-percent:0;mso-height-percent:0;mso-width-percent:0;mso-height-percent:0" o:hralign="center" o:hrstd="t" o:hr="t" fillcolor="#a0a0a0" stroked="f"/>
         </w:pict>
       </w:r>
@@ -1837,8 +1823,7 @@
         <w:rPr>
           <w:noProof/>
         </w:rPr>
-        <w:lastRenderedPageBreak/>
-        <w:pict w14:anchorId="65D84A11">
+        <w:pict w14:anchorId="213FF463">
           <v:rect id="_x0000_i1029" alt="" style="width:451.3pt;height:.05pt;mso-width-percent:0;mso-height-percent:0;mso-width-percent:0;mso-height-percent:0" o:hralign="center" o:hrstd="t" o:hr="t" fillcolor="#a0a0a0" stroked="f"/>
         </w:pict>
       </w:r>
@@ -1871,6 +1856,7 @@
         </w:numPr>
       </w:pPr>
       <w:r>
+        <w:lastRenderedPageBreak/>
         <w:t>Targets pregnant women already on ART who are unsuppressed</w:t>
       </w:r>
     </w:p>
@@ -2106,7 +2092,7 @@
         <w:rPr>
           <w:noProof/>
         </w:rPr>
-        <w:pict w14:anchorId="4C760CE9">
+        <w:pict w14:anchorId="61BA6277">
           <v:rect id="_x0000_i1028" alt="" style="width:451.3pt;height:.05pt;mso-width-percent:0;mso-height-percent:0;mso-width-percent:0;mso-height-percent:0" o:hralign="center" o:hrstd="t" o:hr="t" fillcolor="#a0a0a0" stroked="f"/>
         </w:pict>
       </w:r>
@@ -2139,7 +2125,6 @@
         </w:numPr>
       </w:pPr>
       <w:r>
-        <w:lastRenderedPageBreak/>
         <w:t>Targets postpartum women already on ART who remain unsuppressed after ANC</w:t>
       </w:r>
     </w:p>
@@ -2193,6 +2178,7 @@
         <w:rPr>
           <w:rStyle w:val="HTMLCode"/>
         </w:rPr>
+        <w:lastRenderedPageBreak/>
         <w:t>pnc_vl_shift = min(pnc_vl_reached_preg × (1 − percent_suppressed/100) × efficacy, mtct_unsupp)</w:t>
       </w:r>
     </w:p>
@@ -2316,7 +2302,7 @@
         <w:rPr>
           <w:noProof/>
         </w:rPr>
-        <w:pict w14:anchorId="485C5CBE">
+        <w:pict w14:anchorId="65E45AD6">
           <v:rect id="_x0000_i1027" alt="" style="width:451.3pt;height:.05pt;mso-width-percent:0;mso-height-percent:0;mso-width-percent:0;mso-height-percent:0" o:hralign="center" o:hrstd="t" o:hr="t" fillcolor="#a0a0a0" stroked="f"/>
         </w:pict>
       </w:r>
@@ -2467,7 +2453,6 @@
         </w:numPr>
       </w:pPr>
       <w:r>
-        <w:lastRenderedPageBreak/>
         <w:t>Infant prophylaxis acts on the total pool of at-risk infants (all those born to HIV+ mothers), irrespective of which maternal group they come from — suppressed, unsuppressed, or no-ART</w:t>
       </w:r>
     </w:p>
@@ -2503,6 +2488,7 @@
         </w:numPr>
       </w:pPr>
       <w:r>
+        <w:lastRenderedPageBreak/>
         <w:t xml:space="preserve">Single cost component: </w:t>
       </w:r>
       <w:r>
@@ -2546,7 +2532,7 @@
         <w:rPr>
           <w:noProof/>
         </w:rPr>
-        <w:pict w14:anchorId="72F5DE2F">
+        <w:pict w14:anchorId="505B8EB9">
           <v:rect id="_x0000_i1026" alt="" style="width:451.3pt;height:.05pt;mso-width-percent:0;mso-height-percent:0;mso-width-percent:0;mso-height-percent:0" o:hralign="center" o:hrstd="t" o:hr="t" fillcolor="#a0a0a0" stroked="f"/>
         </w:pict>
       </w:r>
@@ -2747,7 +2733,6 @@
         </w:numPr>
       </w:pPr>
       <w:r>
-        <w:lastRenderedPageBreak/>
         <w:t xml:space="preserve">Of those on ART, a proportion achieve viral suppression: </w:t>
       </w:r>
       <w:r>
@@ -2808,6 +2793,7 @@
         </w:numPr>
       </w:pPr>
       <w:r>
+        <w:lastRenderedPageBreak/>
         <w:t xml:space="preserve">Infant deaths and deaths averted are wired directly into the aggregate </w:t>
       </w:r>
       <w:r>
@@ -2875,7 +2861,7 @@
         <w:rPr>
           <w:noProof/>
         </w:rPr>
-        <w:pict w14:anchorId="5B8A22D4">
+        <w:pict w14:anchorId="0B678216">
           <v:rect id="_x0000_i1025" alt="" style="width:451.3pt;height:.05pt;mso-width-percent:0;mso-height-percent:0;mso-width-percent:0;mso-height-percent:0" o:hralign="center" o:hrstd="t" o:hr="t" fillcolor="#a0a0a0" stroked="f"/>
         </w:pict>
       </w:r>
@@ -3639,6 +3625,7 @@
               <w:rPr>
                 <w:rFonts w:ascii="Times New Roman" w:hAnsi="Times New Roman" w:cs="Times New Roman"/>
               </w:rPr>
+              <w:lastRenderedPageBreak/>
               <w:t>Prevention interventions (deaths averted)</w:t>
             </w:r>
           </w:p>
@@ -4011,144 +3998,144 @@
               <w:rPr>
                 <w:rFonts w:ascii="Times New Roman" w:hAnsi="Times New Roman" w:cs="Times New Roman"/>
               </w:rPr>
+              <w:t>Viral load testing</w:t>
+            </w:r>
+          </w:p>
+        </w:tc>
+        <w:tc>
+          <w:tcPr>
+            <w:tcW w:w="5647" w:type="dxa"/>
+          </w:tcPr>
+          <w:p>
+            <w:pPr>
+              <w:spacing w:after="120"/>
+              <w:rPr>
+                <w:rFonts w:ascii="Times New Roman" w:hAnsi="Times New Roman" w:cs="Times New Roman"/>
+              </w:rPr>
+            </w:pPr>
+            <w:r>
+              <w:rPr>
+                <w:rFonts w:ascii="Times New Roman" w:hAnsi="Times New Roman" w:cs="Times New Roman"/>
+              </w:rPr>
+              <w:t>coverage_pct  = % of people on ART</w:t>
+            </w:r>
+            <w:r>
+              <w:rPr>
+                <w:rFonts w:ascii="Times New Roman" w:hAnsi="Times New Roman" w:cs="Times New Roman"/>
+              </w:rPr>
+              <w:t xml:space="preserve"> receiving viral load test</w:t>
+            </w:r>
+          </w:p>
+          <w:p>
+            <w:pPr>
+              <w:spacing w:after="120"/>
+              <w:rPr>
+                <w:rFonts w:ascii="Times New Roman" w:hAnsi="Times New Roman" w:cs="Times New Roman"/>
+              </w:rPr>
+            </w:pPr>
+            <w:r>
+              <w:rPr>
+                <w:rFonts w:ascii="Times New Roman" w:hAnsi="Times New Roman" w:cs="Times New Roman"/>
+              </w:rPr>
+              <w:t>eligible_pop   = people_on_art</w:t>
+            </w:r>
+          </w:p>
+          <w:p>
+            <w:pPr>
+              <w:spacing w:after="120"/>
+              <w:rPr>
+                <w:rFonts w:ascii="Times New Roman" w:hAnsi="Times New Roman" w:cs="Times New Roman"/>
+              </w:rPr>
+            </w:pPr>
+            <w:r>
+              <w:rPr>
+                <w:rFonts w:ascii="Times New Roman" w:hAnsi="Times New Roman" w:cs="Times New Roman"/>
+              </w:rPr>
+              <w:t>number_reached</w:t>
+            </w:r>
+            <w:r>
+              <w:rPr>
+                <w:rFonts w:ascii="Times New Roman" w:hAnsi="Times New Roman" w:cs="Times New Roman"/>
+              </w:rPr>
+              <w:t>=</w:t>
+            </w:r>
+            <w:r>
+              <w:rPr>
+                <w:rFonts w:ascii="Times New Roman" w:hAnsi="Times New Roman" w:cs="Times New Roman"/>
+              </w:rPr>
+              <w:t xml:space="preserve"> eligible_pop*(coverage_pct</w:t>
+            </w:r>
+            <w:r>
+              <w:rPr>
+                <w:rFonts w:ascii="Times New Roman" w:hAnsi="Times New Roman" w:cs="Times New Roman"/>
+              </w:rPr>
+              <w:t>/</w:t>
+            </w:r>
+            <w:r>
+              <w:rPr>
+                <w:rFonts w:ascii="Times New Roman" w:hAnsi="Times New Roman" w:cs="Times New Roman"/>
+              </w:rPr>
+              <w:t xml:space="preserve"> 100)</w:t>
+            </w:r>
+          </w:p>
+          <w:p>
+            <w:pPr>
+              <w:spacing w:after="120"/>
+              <w:rPr>
+                <w:rFonts w:ascii="Times New Roman" w:hAnsi="Times New Roman" w:cs="Times New Roman"/>
+              </w:rPr>
+            </w:pPr>
+            <w:r>
+              <w:rPr>
+                <w:rFonts w:ascii="Times New Roman" w:hAnsi="Times New Roman" w:cs="Times New Roman"/>
+              </w:rPr>
+              <w:t xml:space="preserve">unsuppressed_rate </w:t>
+            </w:r>
+            <w:r>
+              <w:rPr>
+                <w:rFonts w:ascii="Times New Roman" w:hAnsi="Times New Roman" w:cs="Times New Roman"/>
+              </w:rPr>
+              <w:t>=</w:t>
+            </w:r>
+            <w:r>
+              <w:rPr>
+                <w:rFonts w:ascii="Times New Roman" w:hAnsi="Times New Roman" w:cs="Times New Roman"/>
+              </w:rPr>
+              <w:t xml:space="preserve"> 1-</w:t>
+            </w:r>
+            <w:r>
+              <w:rPr>
+                <w:rFonts w:ascii="Times New Roman" w:hAnsi="Times New Roman" w:cs="Times New Roman"/>
+              </w:rPr>
+              <w:t>percent</w:t>
+            </w:r>
+            <w:r>
+              <w:rPr>
+                <w:rFonts w:ascii="Times New Roman" w:hAnsi="Times New Roman" w:cs="Times New Roman"/>
+              </w:rPr>
+              <w:t>_suppressed / 100</w:t>
+            </w:r>
+          </w:p>
+          <w:p>
+            <w:pPr>
+              <w:spacing w:after="120"/>
+              <w:rPr>
+                <w:rFonts w:ascii="Times New Roman" w:hAnsi="Times New Roman" w:cs="Times New Roman"/>
+              </w:rPr>
+            </w:pPr>
+          </w:p>
+          <w:p>
+            <w:pPr>
+              <w:spacing w:after="120"/>
+              <w:rPr>
+                <w:rFonts w:ascii="Times New Roman" w:hAnsi="Times New Roman" w:cs="Times New Roman"/>
+              </w:rPr>
+            </w:pPr>
+            <w:r>
+              <w:rPr>
+                <w:rFonts w:ascii="Times New Roman" w:hAnsi="Times New Roman" w:cs="Times New Roman"/>
+              </w:rPr>
               <w:lastRenderedPageBreak/>
-              <w:t>Viral load testing</w:t>
-            </w:r>
-          </w:p>
-        </w:tc>
-        <w:tc>
-          <w:tcPr>
-            <w:tcW w:w="5647" w:type="dxa"/>
-          </w:tcPr>
-          <w:p>
-            <w:pPr>
-              <w:spacing w:after="120"/>
-              <w:rPr>
-                <w:rFonts w:ascii="Times New Roman" w:hAnsi="Times New Roman" w:cs="Times New Roman"/>
-              </w:rPr>
-            </w:pPr>
-            <w:r>
-              <w:rPr>
-                <w:rFonts w:ascii="Times New Roman" w:hAnsi="Times New Roman" w:cs="Times New Roman"/>
-              </w:rPr>
-              <w:t>coverage_pct  = % of people on ART</w:t>
-            </w:r>
-            <w:r>
-              <w:rPr>
-                <w:rFonts w:ascii="Times New Roman" w:hAnsi="Times New Roman" w:cs="Times New Roman"/>
-              </w:rPr>
-              <w:t xml:space="preserve"> receiving viral load test</w:t>
-            </w:r>
-          </w:p>
-          <w:p>
-            <w:pPr>
-              <w:spacing w:after="120"/>
-              <w:rPr>
-                <w:rFonts w:ascii="Times New Roman" w:hAnsi="Times New Roman" w:cs="Times New Roman"/>
-              </w:rPr>
-            </w:pPr>
-            <w:r>
-              <w:rPr>
-                <w:rFonts w:ascii="Times New Roman" w:hAnsi="Times New Roman" w:cs="Times New Roman"/>
-              </w:rPr>
-              <w:t>eligible_pop   = people_on_art</w:t>
-            </w:r>
-          </w:p>
-          <w:p>
-            <w:pPr>
-              <w:spacing w:after="120"/>
-              <w:rPr>
-                <w:rFonts w:ascii="Times New Roman" w:hAnsi="Times New Roman" w:cs="Times New Roman"/>
-              </w:rPr>
-            </w:pPr>
-            <w:r>
-              <w:rPr>
-                <w:rFonts w:ascii="Times New Roman" w:hAnsi="Times New Roman" w:cs="Times New Roman"/>
-              </w:rPr>
-              <w:t>number_reached</w:t>
-            </w:r>
-            <w:r>
-              <w:rPr>
-                <w:rFonts w:ascii="Times New Roman" w:hAnsi="Times New Roman" w:cs="Times New Roman"/>
-              </w:rPr>
-              <w:t>=</w:t>
-            </w:r>
-            <w:r>
-              <w:rPr>
-                <w:rFonts w:ascii="Times New Roman" w:hAnsi="Times New Roman" w:cs="Times New Roman"/>
-              </w:rPr>
-              <w:t xml:space="preserve"> eligible_pop*(coverage_pct</w:t>
-            </w:r>
-            <w:r>
-              <w:rPr>
-                <w:rFonts w:ascii="Times New Roman" w:hAnsi="Times New Roman" w:cs="Times New Roman"/>
-              </w:rPr>
-              <w:t>/</w:t>
-            </w:r>
-            <w:r>
-              <w:rPr>
-                <w:rFonts w:ascii="Times New Roman" w:hAnsi="Times New Roman" w:cs="Times New Roman"/>
-              </w:rPr>
-              <w:t xml:space="preserve"> 100)</w:t>
-            </w:r>
-          </w:p>
-          <w:p>
-            <w:pPr>
-              <w:spacing w:after="120"/>
-              <w:rPr>
-                <w:rFonts w:ascii="Times New Roman" w:hAnsi="Times New Roman" w:cs="Times New Roman"/>
-              </w:rPr>
-            </w:pPr>
-            <w:r>
-              <w:rPr>
-                <w:rFonts w:ascii="Times New Roman" w:hAnsi="Times New Roman" w:cs="Times New Roman"/>
-              </w:rPr>
-              <w:t xml:space="preserve">unsuppressed_rate </w:t>
-            </w:r>
-            <w:r>
-              <w:rPr>
-                <w:rFonts w:ascii="Times New Roman" w:hAnsi="Times New Roman" w:cs="Times New Roman"/>
-              </w:rPr>
-              <w:t>=</w:t>
-            </w:r>
-            <w:r>
-              <w:rPr>
-                <w:rFonts w:ascii="Times New Roman" w:hAnsi="Times New Roman" w:cs="Times New Roman"/>
-              </w:rPr>
-              <w:t xml:space="preserve"> 1-</w:t>
-            </w:r>
-            <w:r>
-              <w:rPr>
-                <w:rFonts w:ascii="Times New Roman" w:hAnsi="Times New Roman" w:cs="Times New Roman"/>
-              </w:rPr>
-              <w:t>percent</w:t>
-            </w:r>
-            <w:r>
-              <w:rPr>
-                <w:rFonts w:ascii="Times New Roman" w:hAnsi="Times New Roman" w:cs="Times New Roman"/>
-              </w:rPr>
-              <w:t>_suppressed / 100</w:t>
-            </w:r>
-          </w:p>
-          <w:p>
-            <w:pPr>
-              <w:spacing w:after="120"/>
-              <w:rPr>
-                <w:rFonts w:ascii="Times New Roman" w:hAnsi="Times New Roman" w:cs="Times New Roman"/>
-              </w:rPr>
-            </w:pPr>
-          </w:p>
-          <w:p>
-            <w:pPr>
-              <w:spacing w:after="120"/>
-              <w:rPr>
-                <w:rFonts w:ascii="Times New Roman" w:hAnsi="Times New Roman" w:cs="Times New Roman"/>
-              </w:rPr>
-            </w:pPr>
-            <w:r>
-              <w:rPr>
-                <w:rFonts w:ascii="Times New Roman" w:hAnsi="Times New Roman" w:cs="Times New Roman"/>
-              </w:rPr>
               <w:t xml:space="preserve">expected_additional_suppressed </w:t>
             </w:r>
             <w:r>
@@ -4185,6 +4172,7 @@
               <w:rPr>
                 <w:rFonts w:ascii="Times New Roman" w:hAnsi="Times New Roman" w:cs="Times New Roman"/>
               </w:rPr>
+              <w:lastRenderedPageBreak/>
               <w:t>Mortality among a sub-group</w:t>
             </w:r>
           </w:p>
@@ -5041,14 +5029,7 @@
               <w:rPr>
                 <w:rFonts w:ascii="Times New Roman" w:hAnsi="Times New Roman" w:cs="Times New Roman"/>
               </w:rPr>
-              <w:t xml:space="preserve">Limits in place and working – app a little buggy about using the </w:t>
-            </w:r>
-            <w:r>
-              <w:rPr>
-                <w:rFonts w:ascii="Times New Roman" w:hAnsi="Times New Roman" w:cs="Times New Roman"/>
-              </w:rPr>
-              <w:lastRenderedPageBreak/>
-              <w:t>arrows straight after exceeding limits</w:t>
+              <w:t>Limits in place and working – app a little buggy about using the arrows straight after exceeding limits</w:t>
             </w:r>
           </w:p>
         </w:tc>
@@ -5668,7 +5649,6 @@
           <w:sz w:val="22"/>
           <w:szCs w:val="22"/>
         </w:rPr>
-        <w:lastRenderedPageBreak/>
         <w:t>All outputs are non-negative and respect biological ceilings (e.g. VMMC cannot exceed the uncircumcised pool).</w:t>
       </w:r>
     </w:p>
@@ -5722,7 +5702,16 @@
           <w:sz w:val="22"/>
           <w:szCs w:val="22"/>
         </w:rPr>
-        <w:t>Uses a standardised population with the following parameters: 1,000,000 total population, 5% HIV prevalence (50,000 PLHIV), 80% diagnosed, 75% on ART, 85% virally suppressed, 2,500 new infections per year, 1,000 AIDS deaths per year, crude birth rate 25 per 1,000, 49% of population male, and 40% of population under 15.</w:t>
+        <w:t xml:space="preserve">Uses a standardised population with the following parameters: 1,000,000 total population, 5% HIV prevalence (50,000 PLHIV), 80% diagnosed, 75% on ART, 85% virally suppressed, 2,500 new infections </w:t>
+      </w:r>
+      <w:r>
+        <w:rPr>
+          <w:rFonts w:ascii="Times New Roman" w:hAnsi="Times New Roman" w:cs="Times New Roman"/>
+          <w:sz w:val="22"/>
+          <w:szCs w:val="22"/>
+        </w:rPr>
+        <w:lastRenderedPageBreak/>
+        <w:t>per year, 1,000 AIDS deaths per year, crude birth rate 25 per 1,000, 49% of population male, and 40% of population under 15.</w:t>
       </w:r>
     </w:p>
     <w:p>
@@ -6413,7 +6402,14 @@
               <w:rPr>
                 <w:rFonts w:ascii="Times New Roman" w:hAnsi="Times New Roman" w:cs="Times New Roman"/>
               </w:rPr>
-              <w:t>Calibrated beta values produce correct infections given baseline prevention in place</w:t>
+              <w:t xml:space="preserve">Calibrated beta values produce correct infections </w:t>
+            </w:r>
+            <w:r>
+              <w:rPr>
+                <w:rFonts w:ascii="Times New Roman" w:hAnsi="Times New Roman" w:cs="Times New Roman"/>
+              </w:rPr>
+              <w:lastRenderedPageBreak/>
+              <w:t>given baseline prevention in place</w:t>
             </w:r>
           </w:p>
         </w:tc>
@@ -6432,6 +6428,7 @@
               <w:rPr>
                 <w:rFonts w:ascii="Times New Roman" w:hAnsi="Times New Roman" w:cs="Times New Roman"/>
               </w:rPr>
+              <w:lastRenderedPageBreak/>
               <w:t>Obsserved_infections = reproduced infections (with calibrated beta)</w:t>
             </w:r>
           </w:p>
@@ -7186,7 +7183,6 @@
               <w:rPr>
                 <w:rFonts w:ascii="Times New Roman" w:hAnsi="Times New Roman" w:cs="Times New Roman"/>
               </w:rPr>
-              <w:lastRenderedPageBreak/>
               <w:t>10.</w:t>
             </w:r>
           </w:p>
@@ -7293,6 +7289,7 @@
                 <w:b/>
                 <w:bCs/>
               </w:rPr>
+              <w:lastRenderedPageBreak/>
               <w:t>#</w:t>
             </w:r>
           </w:p>
@@ -7905,7 +7902,6 @@
         <w:rPr>
           <w:rFonts w:ascii="Times New Roman" w:hAnsi="Times New Roman" w:cs="Times New Roman"/>
         </w:rPr>
-        <w:lastRenderedPageBreak/>
         <w:t>Boundary conditions</w:t>
       </w:r>
     </w:p>
@@ -8039,7 +8035,14 @@
               <w:rPr>
                 <w:rFonts w:ascii="Times New Roman" w:hAnsi="Times New Roman" w:cs="Times New Roman"/>
               </w:rPr>
-              <w:t>New infections is always non-negative</w:t>
+              <w:t>New infections is always non-</w:t>
+            </w:r>
+            <w:r>
+              <w:rPr>
+                <w:rFonts w:ascii="Times New Roman" w:hAnsi="Times New Roman" w:cs="Times New Roman"/>
+              </w:rPr>
+              <w:lastRenderedPageBreak/>
+              <w:t>negative</w:t>
             </w:r>
             <w:r>
               <w:rPr>
@@ -8082,6 +8085,7 @@
               <w:rPr>
                 <w:rFonts w:ascii="Times New Roman" w:hAnsi="Times New Roman" w:cs="Times New Roman"/>
               </w:rPr>
+              <w:lastRenderedPageBreak/>
               <w:t>End_new_infections&gt;0</w:t>
             </w:r>
           </w:p>
@@ -8660,88 +8664,88 @@
         <w:rPr>
           <w:rFonts w:ascii="Times New Roman" w:hAnsi="Times New Roman" w:cs="Times New Roman"/>
         </w:rPr>
+        <w:t>Test Logic</w:t>
+      </w:r>
+    </w:p>
+    <w:p>
+      <w:pPr>
+        <w:spacing w:after="160"/>
+        <w:rPr>
+          <w:rFonts w:ascii="Times New Roman" w:hAnsi="Times New Roman" w:cs="Times New Roman"/>
+        </w:rPr>
+      </w:pPr>
+      <w:r>
+        <w:rPr>
+          <w:rFonts w:ascii="Times New Roman" w:hAnsi="Times New Roman" w:cs="Times New Roman"/>
+        </w:rPr>
+        <w:t>Uses a standardized population with the following parameters: 1,000,000 total population, 5% HIV prevalence (50,000 PLHIV), 80% diagnosed, 75% on ART, 85% virally suppressed, 5,000 new infections per year, 1,000 AIDS deaths per year</w:t>
+      </w:r>
+      <w:r>
+        <w:rPr>
+          <w:rFonts w:ascii="Times New Roman" w:hAnsi="Times New Roman" w:cs="Times New Roman"/>
+        </w:rPr>
+        <w:t xml:space="preserve">, </w:t>
+      </w:r>
+      <w:r>
+        <w:rPr>
+          <w:rFonts w:ascii="Times New Roman" w:hAnsi="Times New Roman" w:cs="Times New Roman"/>
+        </w:rPr>
+        <w:t xml:space="preserve">crude </w:t>
+      </w:r>
+      <w:r>
+        <w:rPr>
+          <w:rFonts w:ascii="Times New Roman" w:hAnsi="Times New Roman" w:cs="Times New Roman"/>
+        </w:rPr>
+        <w:t xml:space="preserve">birth rate </w:t>
+      </w:r>
+      <w:r>
+        <w:rPr>
+          <w:rFonts w:ascii="Times New Roman" w:hAnsi="Times New Roman" w:cs="Times New Roman"/>
+        </w:rPr>
+        <w:t>24 per 1000, 49% of population male</w:t>
+      </w:r>
+      <w:r>
+        <w:rPr>
+          <w:rFonts w:ascii="Times New Roman" w:hAnsi="Times New Roman" w:cs="Times New Roman"/>
+        </w:rPr>
+        <w:t xml:space="preserve"> </w:t>
+      </w:r>
+      <w:r>
+        <w:rPr>
+          <w:rFonts w:ascii="Times New Roman" w:hAnsi="Times New Roman" w:cs="Times New Roman"/>
+        </w:rPr>
+        <w:t>,</w:t>
+      </w:r>
+      <w:r>
+        <w:rPr>
+          <w:rFonts w:ascii="Times New Roman" w:hAnsi="Times New Roman" w:cs="Times New Roman"/>
+        </w:rPr>
+        <w:t>and 40%</w:t>
+      </w:r>
+      <w:r>
+        <w:rPr>
+          <w:rFonts w:ascii="Times New Roman" w:hAnsi="Times New Roman" w:cs="Times New Roman"/>
+        </w:rPr>
+        <w:t xml:space="preserve"> </w:t>
+      </w:r>
+      <w:r>
+        <w:rPr>
+          <w:rFonts w:ascii="Times New Roman" w:hAnsi="Times New Roman" w:cs="Times New Roman"/>
+        </w:rPr>
+        <w:t>of population under 15.</w:t>
+      </w:r>
+    </w:p>
+    <w:p>
+      <w:pPr>
+        <w:rPr>
+          <w:rFonts w:ascii="Times New Roman" w:hAnsi="Times New Roman" w:cs="Times New Roman"/>
+        </w:rPr>
+      </w:pPr>
+      <w:r>
+        <w:rPr>
+          <w:rFonts w:ascii="Times New Roman" w:hAnsi="Times New Roman" w:cs="Times New Roman"/>
+        </w:rPr>
         <w:lastRenderedPageBreak/>
-        <w:t>Test Logic</w:t>
-      </w:r>
-    </w:p>
-    <w:p>
-      <w:pPr>
-        <w:spacing w:after="160"/>
-        <w:rPr>
-          <w:rFonts w:ascii="Times New Roman" w:hAnsi="Times New Roman" w:cs="Times New Roman"/>
-        </w:rPr>
-      </w:pPr>
-      <w:r>
-        <w:rPr>
-          <w:rFonts w:ascii="Times New Roman" w:hAnsi="Times New Roman" w:cs="Times New Roman"/>
-        </w:rPr>
-        <w:t>Uses a standardized population with the following parameters: 1,000,000 total population, 5% HIV prevalence (50,000 PLHIV), 80% diagnosed, 75% on ART, 85% virally suppressed, 5,000 new infections per year, 1,000 AIDS deaths per year</w:t>
-      </w:r>
-      <w:r>
-        <w:rPr>
-          <w:rFonts w:ascii="Times New Roman" w:hAnsi="Times New Roman" w:cs="Times New Roman"/>
-        </w:rPr>
-        <w:t xml:space="preserve">, </w:t>
-      </w:r>
-      <w:r>
-        <w:rPr>
-          <w:rFonts w:ascii="Times New Roman" w:hAnsi="Times New Roman" w:cs="Times New Roman"/>
-        </w:rPr>
-        <w:t xml:space="preserve">crude </w:t>
-      </w:r>
-      <w:r>
-        <w:rPr>
-          <w:rFonts w:ascii="Times New Roman" w:hAnsi="Times New Roman" w:cs="Times New Roman"/>
-        </w:rPr>
-        <w:t xml:space="preserve">birth rate </w:t>
-      </w:r>
-      <w:r>
-        <w:rPr>
-          <w:rFonts w:ascii="Times New Roman" w:hAnsi="Times New Roman" w:cs="Times New Roman"/>
-        </w:rPr>
-        <w:t>24 per 1000, 49% of population male</w:t>
-      </w:r>
-      <w:r>
-        <w:rPr>
-          <w:rFonts w:ascii="Times New Roman" w:hAnsi="Times New Roman" w:cs="Times New Roman"/>
-        </w:rPr>
-        <w:t xml:space="preserve"> </w:t>
-      </w:r>
-      <w:r>
-        <w:rPr>
-          <w:rFonts w:ascii="Times New Roman" w:hAnsi="Times New Roman" w:cs="Times New Roman"/>
-        </w:rPr>
-        <w:t>,</w:t>
-      </w:r>
-      <w:r>
-        <w:rPr>
-          <w:rFonts w:ascii="Times New Roman" w:hAnsi="Times New Roman" w:cs="Times New Roman"/>
-        </w:rPr>
-        <w:t>and 40%</w:t>
-      </w:r>
-      <w:r>
-        <w:rPr>
-          <w:rFonts w:ascii="Times New Roman" w:hAnsi="Times New Roman" w:cs="Times New Roman"/>
-        </w:rPr>
-        <w:t xml:space="preserve"> </w:t>
-      </w:r>
-      <w:r>
-        <w:rPr>
-          <w:rFonts w:ascii="Times New Roman" w:hAnsi="Times New Roman" w:cs="Times New Roman"/>
-        </w:rPr>
-        <w:t>of population under 15.</w:t>
-      </w:r>
-    </w:p>
-    <w:p>
-      <w:pPr>
-        <w:rPr>
-          <w:rFonts w:ascii="Times New Roman" w:hAnsi="Times New Roman" w:cs="Times New Roman"/>
-        </w:rPr>
-      </w:pPr>
-      <w:r>
-        <w:rPr>
-          <w:rFonts w:ascii="Times New Roman" w:hAnsi="Times New Roman" w:cs="Times New Roman"/>
-        </w:rPr>
         <w:t>Intervention assumptions</w:t>
       </w:r>
       <w:r>
@@ -9703,7 +9707,6 @@
         <w:rPr>
           <w:rFonts w:ascii="Times New Roman" w:hAnsi="Times New Roman" w:cs="Times New Roman"/>
         </w:rPr>
-        <w:lastRenderedPageBreak/>
         <w:t>Scale up scenario to 20</w:t>
       </w:r>
       <w:r>
@@ -9842,7 +9845,14 @@
               <w:rPr>
                 <w:rFonts w:ascii="Times New Roman" w:hAnsi="Times New Roman" w:cs="Times New Roman"/>
               </w:rPr>
-              <w:t>Scale up general facility testing  by 10 000 tests – positive tests</w:t>
+              <w:t xml:space="preserve">Scale up general facility testing  by </w:t>
+            </w:r>
+            <w:r>
+              <w:rPr>
+                <w:rFonts w:ascii="Times New Roman" w:hAnsi="Times New Roman" w:cs="Times New Roman"/>
+              </w:rPr>
+              <w:lastRenderedPageBreak/>
+              <w:t>10 000 tests – positive tests</w:t>
             </w:r>
           </w:p>
         </w:tc>
@@ -9861,6 +9871,7 @@
               <w:rPr>
                 <w:rFonts w:ascii="Times New Roman" w:hAnsi="Times New Roman" w:cs="Times New Roman"/>
               </w:rPr>
+              <w:lastRenderedPageBreak/>
               <w:t>Expected_positive_scenario=2*expected_positive_baseline</w:t>
             </w:r>
           </w:p>
@@ -10504,7 +10515,6 @@
           <w:rFonts w:ascii="Times New Roman" w:hAnsi="Times New Roman" w:cs="Times New Roman"/>
           <w:color w:val="000000" w:themeColor="text1"/>
         </w:rPr>
-        <w:lastRenderedPageBreak/>
         <w:t>Compare three scenarios:</w:t>
       </w:r>
     </w:p>
@@ -10610,6 +10620,7 @@
                 <w:b/>
                 <w:bCs/>
               </w:rPr>
+              <w:lastRenderedPageBreak/>
               <w:t>#</w:t>
             </w:r>
           </w:p>
@@ -11705,7 +11716,6 @@
           <w:iCs/>
           <w:color w:val="2E74B5"/>
         </w:rPr>
-        <w:lastRenderedPageBreak/>
         <w:t>Different linkage rates</w:t>
       </w:r>
     </w:p>
@@ -11763,6 +11773,7 @@
                 <w:b/>
                 <w:bCs/>
               </w:rPr>
+              <w:lastRenderedPageBreak/>
               <w:t>#</w:t>
             </w:r>
           </w:p>
@@ -12397,14 +12408,7 @@
               <w:rPr>
                 <w:rFonts w:ascii="Times New Roman" w:hAnsi="Times New Roman" w:cs="Times New Roman"/>
               </w:rPr>
-              <w:t xml:space="preserve">. Additionally, results in more people suppressed </w:t>
-            </w:r>
-            <w:r>
-              <w:rPr>
-                <w:rFonts w:ascii="Times New Roman" w:hAnsi="Times New Roman" w:cs="Times New Roman"/>
-              </w:rPr>
-              <w:lastRenderedPageBreak/>
-              <w:t>at the end than at the beginning</w:t>
+              <w:t>. Additionally, results in more people suppressed at the end than at the beginning</w:t>
             </w:r>
           </w:p>
         </w:tc>
@@ -12423,7 +12427,6 @@
               <w:rPr>
                 <w:rFonts w:ascii="Times New Roman" w:hAnsi="Times New Roman" w:cs="Times New Roman"/>
               </w:rPr>
-              <w:lastRenderedPageBreak/>
               <w:t>number_reached = on_art * 0.6</w:t>
             </w:r>
           </w:p>
@@ -12508,39 +12511,45 @@
               <w:rPr>
                 <w:rFonts w:ascii="Times New Roman" w:hAnsi="Times New Roman" w:cs="Times New Roman"/>
               </w:rPr>
+              <w:t>3</w:t>
+            </w:r>
+          </w:p>
+        </w:tc>
+        <w:tc>
+          <w:tcPr>
+            <w:tcW w:w="2140" w:type="dxa"/>
+          </w:tcPr>
+          <w:p>
+            <w:pPr>
+              <w:spacing w:after="160"/>
+              <w:rPr>
+                <w:rFonts w:ascii="Times New Roman" w:hAnsi="Times New Roman" w:cs="Times New Roman"/>
+              </w:rPr>
+            </w:pPr>
+            <w:r>
+              <w:rPr>
+                <w:rFonts w:ascii="Times New Roman" w:hAnsi="Times New Roman" w:cs="Times New Roman"/>
+              </w:rPr>
+              <w:t xml:space="preserve">Intervention that </w:t>
+            </w:r>
+            <w:r>
+              <w:rPr>
+                <w:rFonts w:ascii="Times New Roman" w:hAnsi="Times New Roman" w:cs="Times New Roman"/>
+              </w:rPr>
+              <w:t>scales up (doubles)</w:t>
+            </w:r>
+            <w:r>
+              <w:rPr>
+                <w:rFonts w:ascii="Times New Roman" w:hAnsi="Times New Roman" w:cs="Times New Roman"/>
+              </w:rPr>
+              <w:t xml:space="preserve"> VL coverage over </w:t>
+            </w:r>
+            <w:r>
+              <w:rPr>
+                <w:rFonts w:ascii="Times New Roman" w:hAnsi="Times New Roman" w:cs="Times New Roman"/>
+              </w:rPr>
               <w:lastRenderedPageBreak/>
-              <w:t>3</w:t>
-            </w:r>
-          </w:p>
-        </w:tc>
-        <w:tc>
-          <w:tcPr>
-            <w:tcW w:w="2140" w:type="dxa"/>
-          </w:tcPr>
-          <w:p>
-            <w:pPr>
-              <w:spacing w:after="160"/>
-              <w:rPr>
-                <w:rFonts w:ascii="Times New Roman" w:hAnsi="Times New Roman" w:cs="Times New Roman"/>
-              </w:rPr>
-            </w:pPr>
-            <w:r>
-              <w:rPr>
-                <w:rFonts w:ascii="Times New Roman" w:hAnsi="Times New Roman" w:cs="Times New Roman"/>
-              </w:rPr>
-              <w:t xml:space="preserve">Intervention that </w:t>
-            </w:r>
-            <w:r>
-              <w:rPr>
-                <w:rFonts w:ascii="Times New Roman" w:hAnsi="Times New Roman" w:cs="Times New Roman"/>
-              </w:rPr>
-              <w:t>scales up (doubles)</w:t>
-            </w:r>
-            <w:r>
-              <w:rPr>
-                <w:rFonts w:ascii="Times New Roman" w:hAnsi="Times New Roman" w:cs="Times New Roman"/>
-              </w:rPr>
-              <w:t xml:space="preserve"> VL coverage over baseline (80% vs 40%) should have double the additional suppressed</w:t>
+              <w:t>baseline (80% vs 40%) should have double the additional suppressed</w:t>
             </w:r>
           </w:p>
         </w:tc>
@@ -12559,6 +12568,7 @@
               <w:rPr>
                 <w:rFonts w:ascii="Times New Roman" w:hAnsi="Times New Roman" w:cs="Times New Roman"/>
               </w:rPr>
+              <w:lastRenderedPageBreak/>
               <w:t>Additional_suppressed_scen_1 = 2*Additional_suppressed_base</w:t>
             </w:r>
           </w:p>
@@ -13018,41 +13028,41 @@
         <w:rPr>
           <w:rFonts w:ascii="Times New Roman" w:hAnsi="Times New Roman" w:cs="Times New Roman"/>
         </w:rPr>
+        <w:t xml:space="preserve">Tests </w:t>
+      </w:r>
+      <w:r>
+        <w:rPr>
+          <w:rFonts w:ascii="Times New Roman" w:hAnsi="Times New Roman" w:cs="Times New Roman"/>
+        </w:rPr>
+        <w:t xml:space="preserve">basic mortality assumptions as well as the impact of certain interventions like the AHD package and OI testing and management. </w:t>
+      </w:r>
+    </w:p>
+    <w:p>
+      <w:pPr>
+        <w:pStyle w:val="Heading3"/>
+        <w:rPr>
+          <w:rFonts w:ascii="Times New Roman" w:hAnsi="Times New Roman" w:cs="Times New Roman"/>
+        </w:rPr>
+      </w:pPr>
+      <w:r>
+        <w:rPr>
+          <w:rFonts w:ascii="Times New Roman" w:hAnsi="Times New Roman" w:cs="Times New Roman"/>
+        </w:rPr>
+        <w:t>Test Logic</w:t>
+      </w:r>
+    </w:p>
+    <w:p>
+      <w:pPr>
+        <w:spacing w:after="160"/>
+        <w:rPr>
+          <w:rFonts w:ascii="Times New Roman" w:hAnsi="Times New Roman" w:cs="Times New Roman"/>
+        </w:rPr>
+      </w:pPr>
+      <w:r>
+        <w:rPr>
+          <w:rFonts w:ascii="Times New Roman" w:hAnsi="Times New Roman" w:cs="Times New Roman"/>
+        </w:rPr>
         <w:lastRenderedPageBreak/>
-        <w:t xml:space="preserve">Tests </w:t>
-      </w:r>
-      <w:r>
-        <w:rPr>
-          <w:rFonts w:ascii="Times New Roman" w:hAnsi="Times New Roman" w:cs="Times New Roman"/>
-        </w:rPr>
-        <w:t xml:space="preserve">basic mortality assumptions as well as the impact of certain interventions like the AHD package and OI testing and management. </w:t>
-      </w:r>
-    </w:p>
-    <w:p>
-      <w:pPr>
-        <w:pStyle w:val="Heading3"/>
-        <w:rPr>
-          <w:rFonts w:ascii="Times New Roman" w:hAnsi="Times New Roman" w:cs="Times New Roman"/>
-        </w:rPr>
-      </w:pPr>
-      <w:r>
-        <w:rPr>
-          <w:rFonts w:ascii="Times New Roman" w:hAnsi="Times New Roman" w:cs="Times New Roman"/>
-        </w:rPr>
-        <w:t>Test Logic</w:t>
-      </w:r>
-    </w:p>
-    <w:p>
-      <w:pPr>
-        <w:spacing w:after="160"/>
-        <w:rPr>
-          <w:rFonts w:ascii="Times New Roman" w:hAnsi="Times New Roman" w:cs="Times New Roman"/>
-        </w:rPr>
-      </w:pPr>
-      <w:r>
-        <w:rPr>
-          <w:rFonts w:ascii="Times New Roman" w:hAnsi="Times New Roman" w:cs="Times New Roman"/>
-        </w:rPr>
         <w:t xml:space="preserve">Uses a standardized population with the following parameters: 1,000,000 total population, 5% HIV prevalence (50,000 PLHIV), 80% diagnosed, 75% on ART, 85% virally suppressed, </w:t>
       </w:r>
       <w:r>
@@ -13820,27 +13830,33 @@
               <w:rPr>
                 <w:rFonts w:ascii="Times New Roman" w:hAnsi="Times New Roman" w:cs="Times New Roman"/>
               </w:rPr>
+              <w:t>6.</w:t>
+            </w:r>
+          </w:p>
+        </w:tc>
+        <w:tc>
+          <w:tcPr>
+            <w:tcW w:w="2140" w:type="dxa"/>
+          </w:tcPr>
+          <w:p>
+            <w:pPr>
+              <w:spacing w:after="160"/>
+              <w:rPr>
+                <w:rFonts w:ascii="Times New Roman" w:hAnsi="Times New Roman" w:cs="Times New Roman"/>
+              </w:rPr>
+            </w:pPr>
+            <w:r>
+              <w:rPr>
+                <w:rFonts w:ascii="Times New Roman" w:hAnsi="Times New Roman" w:cs="Times New Roman"/>
+              </w:rPr>
+              <w:t xml:space="preserve">AHD mortality rate has no effect on mortality of established groups </w:t>
+            </w:r>
+            <w:r>
+              <w:rPr>
+                <w:rFonts w:ascii="Times New Roman" w:hAnsi="Times New Roman" w:cs="Times New Roman"/>
+              </w:rPr>
               <w:lastRenderedPageBreak/>
-              <w:t>6.</w:t>
-            </w:r>
-          </w:p>
-        </w:tc>
-        <w:tc>
-          <w:tcPr>
-            <w:tcW w:w="2140" w:type="dxa"/>
-          </w:tcPr>
-          <w:p>
-            <w:pPr>
-              <w:spacing w:after="160"/>
-              <w:rPr>
-                <w:rFonts w:ascii="Times New Roman" w:hAnsi="Times New Roman" w:cs="Times New Roman"/>
-              </w:rPr>
-            </w:pPr>
-            <w:r>
-              <w:rPr>
-                <w:rFonts w:ascii="Times New Roman" w:hAnsi="Times New Roman" w:cs="Times New Roman"/>
-              </w:rPr>
-              <w:t xml:space="preserve">AHD mortality rate has no effect on mortality of established groups (assumed </w:t>
+              <w:t xml:space="preserve">(assumed </w:t>
             </w:r>
             <w:r>
               <w:rPr>
@@ -13871,6 +13887,7 @@
               <w:rPr>
                 <w:rFonts w:ascii="Times New Roman" w:hAnsi="Times New Roman" w:cs="Times New Roman"/>
               </w:rPr>
+              <w:lastRenderedPageBreak/>
               <w:t>Deaths_low_AHD = Deaths_high_AHD</w:t>
             </w:r>
           </w:p>
@@ -14476,7 +14493,6 @@
               <w:rPr>
                 <w:rFonts w:ascii="Times New Roman" w:hAnsi="Times New Roman" w:cs="Times New Roman"/>
               </w:rPr>
-              <w:lastRenderedPageBreak/>
               <w:t>11</w:t>
             </w:r>
           </w:p>
@@ -14558,7 +14574,14 @@
               <w:rPr>
                 <w:rFonts w:ascii="Times New Roman" w:hAnsi="Times New Roman" w:cs="Times New Roman"/>
               </w:rPr>
-              <w:t>AHD package with CD4 testing reduces AHD mortality for new initiations</w:t>
+              <w:t xml:space="preserve">AHD package with CD4 testing reduces AHD </w:t>
+            </w:r>
+            <w:r>
+              <w:rPr>
+                <w:rFonts w:ascii="Times New Roman" w:hAnsi="Times New Roman" w:cs="Times New Roman"/>
+              </w:rPr>
+              <w:lastRenderedPageBreak/>
+              <w:t>mortality for new initiations</w:t>
             </w:r>
           </w:p>
         </w:tc>
@@ -14577,6 +14600,7 @@
               <w:rPr>
                 <w:rFonts w:ascii="Times New Roman" w:hAnsi="Times New Roman" w:cs="Times New Roman"/>
               </w:rPr>
+              <w:lastRenderedPageBreak/>
               <w:t>AHD and CD4 reduced deaths</w:t>
             </w:r>
           </w:p>
@@ -15147,49 +15171,49 @@
         <w:rPr>
           <w:rStyle w:val="Strong"/>
         </w:rPr>
+        <w:t>LTFU rates:</w:t>
+      </w:r>
+      <w:r>
+        <w:t xml:space="preserve"> ANNUAL_LTFU_RATE_SUPPRESSED = 0.05, ANNUAL_LTFU_RATE_UNSUPPRESSED = 0.15, prevalent LTFU stock = 15% of on_art</w:t>
+      </w:r>
+    </w:p>
+    <w:p>
+      <w:pPr>
+        <w:pStyle w:val="font-claude-response-body"/>
+      </w:pPr>
+      <w:r>
+        <w:rPr>
+          <w:rStyle w:val="Strong"/>
+        </w:rPr>
+        <w:t>RETENTION_SUPPRESSION_RATE:</w:t>
+      </w:r>
+      <w:r>
+        <w:t xml:space="preserve"> 0.30 (proportion of retained unsuppressed patients who achieve suppression)</w:t>
+      </w:r>
+    </w:p>
+    <w:p>
+      <w:pPr>
+        <w:pStyle w:val="font-claude-response-body"/>
+      </w:pPr>
+      <w:r>
+        <w:rPr>
+          <w:rStyle w:val="Strong"/>
+        </w:rPr>
+        <w:t>Retention intervention params (overridden for isolation):</w:t>
+      </w:r>
+      <w:r>
+        <w:t xml:space="preserve"> MMD 3-month efficacy = 0.20, adherence counseling efficacy = 0.15, tracking/tracing efficacy = 0.60</w:t>
+      </w:r>
+    </w:p>
+    <w:p>
+      <w:pPr>
+        <w:pStyle w:val="font-claude-response-body"/>
+      </w:pPr>
+      <w:r>
+        <w:rPr>
+          <w:rStyle w:val="Strong"/>
+        </w:rPr>
         <w:lastRenderedPageBreak/>
-        <w:t>LTFU rates:</w:t>
-      </w:r>
-      <w:r>
-        <w:t xml:space="preserve"> ANNUAL_LTFU_RATE_SUPPRESSED = 0.05, ANNUAL_LTFU_RATE_UNSUPPRESSED = 0.15, prevalent LTFU stock = 15% of on_art</w:t>
-      </w:r>
-    </w:p>
-    <w:p>
-      <w:pPr>
-        <w:pStyle w:val="font-claude-response-body"/>
-      </w:pPr>
-      <w:r>
-        <w:rPr>
-          <w:rStyle w:val="Strong"/>
-        </w:rPr>
-        <w:t>RETENTION_SUPPRESSION_RATE:</w:t>
-      </w:r>
-      <w:r>
-        <w:t xml:space="preserve"> 0.30 (proportion of retained unsuppressed patients who achieve suppression)</w:t>
-      </w:r>
-    </w:p>
-    <w:p>
-      <w:pPr>
-        <w:pStyle w:val="font-claude-response-body"/>
-      </w:pPr>
-      <w:r>
-        <w:rPr>
-          <w:rStyle w:val="Strong"/>
-        </w:rPr>
-        <w:t>Retention intervention params (overridden for isolation):</w:t>
-      </w:r>
-      <w:r>
-        <w:t xml:space="preserve"> MMD 3-month efficacy = 0.20, adherence counseling efficacy = 0.15, tracking/tracing efficacy = 0.60</w:t>
-      </w:r>
-    </w:p>
-    <w:p>
-      <w:pPr>
-        <w:pStyle w:val="font-claude-response-body"/>
-      </w:pPr>
-      <w:r>
-        <w:rPr>
-          <w:rStyle w:val="Strong"/>
-        </w:rPr>
         <w:t>zero_mortality() called once at top level</w:t>
       </w:r>
       <w:r>
@@ -15805,7 +15829,6 @@
               <w:rPr>
                 <w:rFonts w:ascii="Times New Roman" w:hAnsi="Times New Roman" w:cs="Times New Roman"/>
               </w:rPr>
-              <w:lastRenderedPageBreak/>
               <w:t>5</w:t>
             </w:r>
             <w:r>
@@ -15967,14 +15990,21 @@
               <w:rPr>
                 <w:rFonts w:ascii="Times New Roman" w:hAnsi="Times New Roman" w:cs="Times New Roman"/>
               </w:rPr>
-              <w:t xml:space="preserve"> counselling combine multiplicatively</w:t>
-            </w:r>
-            <w:r>
-              <w:rPr>
-                <w:rFonts w:ascii="Times New Roman" w:hAnsi="Times New Roman" w:cs="Times New Roman"/>
-              </w:rPr>
               <w:t xml:space="preserve"> </w:t>
             </w:r>
+            <w:r>
+              <w:rPr>
+                <w:rFonts w:ascii="Times New Roman" w:hAnsi="Times New Roman" w:cs="Times New Roman"/>
+              </w:rPr>
+              <w:lastRenderedPageBreak/>
+              <w:t>counselling combine multiplicatively</w:t>
+            </w:r>
+            <w:r>
+              <w:rPr>
+                <w:rFonts w:ascii="Times New Roman" w:hAnsi="Times New Roman" w:cs="Times New Roman"/>
+              </w:rPr>
+              <w:t xml:space="preserve"> </w:t>
+            </w:r>
           </w:p>
         </w:tc>
         <w:tc>
@@ -15992,6 +16022,7 @@
               <w:rPr>
                 <w:rFonts w:ascii="Times New Roman" w:hAnsi="Times New Roman" w:cs="Times New Roman"/>
               </w:rPr>
+              <w:lastRenderedPageBreak/>
               <w:t>ltfu_new_effective (both) &lt; ltfu_new_effective (</w:t>
             </w:r>
             <w:r>
@@ -16066,6 +16097,7 @@
               <w:rPr>
                 <w:rFonts w:ascii="Times New Roman" w:hAnsi="Times New Roman" w:cs="Times New Roman"/>
               </w:rPr>
+              <w:lastRenderedPageBreak/>
               <w:t>8</w:t>
             </w:r>
           </w:p>
@@ -16482,7 +16514,6 @@
               <w:rPr>
                 <w:rFonts w:ascii="Times New Roman" w:hAnsi="Times New Roman" w:cs="Times New Roman"/>
               </w:rPr>
-              <w:lastRenderedPageBreak/>
               <w:t>end_on_art &lt;=end_diagnosed</w:t>
             </w:r>
           </w:p>
@@ -16507,39 +16538,45 @@
               <w:rPr>
                 <w:rFonts w:ascii="Times New Roman" w:hAnsi="Times New Roman" w:cs="Times New Roman"/>
               </w:rPr>
+              <w:t>13</w:t>
+            </w:r>
+          </w:p>
+        </w:tc>
+        <w:tc>
+          <w:tcPr>
+            <w:tcW w:w="2016" w:type="dxa"/>
+          </w:tcPr>
+          <w:p>
+            <w:pPr>
+              <w:spacing w:after="160"/>
+              <w:rPr>
+                <w:rFonts w:ascii="Times New Roman" w:hAnsi="Times New Roman" w:cs="Times New Roman"/>
+              </w:rPr>
+            </w:pPr>
+            <w:r>
+              <w:rPr>
+                <w:rFonts w:ascii="Times New Roman" w:hAnsi="Times New Roman" w:cs="Times New Roman"/>
+              </w:rPr>
+              <w:t>Without intervention, highe</w:t>
+            </w:r>
+            <w:r>
+              <w:rPr>
+                <w:rFonts w:ascii="Times New Roman" w:hAnsi="Times New Roman" w:cs="Times New Roman"/>
+              </w:rPr>
+              <w:t>r drop out of unsuppressed patients can inflate the third 95</w:t>
+            </w:r>
+            <w:r>
+              <w:rPr>
+                <w:rFonts w:ascii="Times New Roman" w:hAnsi="Times New Roman" w:cs="Times New Roman"/>
+              </w:rPr>
+              <w:t xml:space="preserve"> (denominator on </w:t>
+            </w:r>
+            <w:r>
+              <w:rPr>
+                <w:rFonts w:ascii="Times New Roman" w:hAnsi="Times New Roman" w:cs="Times New Roman"/>
+              </w:rPr>
               <w:lastRenderedPageBreak/>
-              <w:t>13</w:t>
-            </w:r>
-          </w:p>
-        </w:tc>
-        <w:tc>
-          <w:tcPr>
-            <w:tcW w:w="2016" w:type="dxa"/>
-          </w:tcPr>
-          <w:p>
-            <w:pPr>
-              <w:spacing w:after="160"/>
-              <w:rPr>
-                <w:rFonts w:ascii="Times New Roman" w:hAnsi="Times New Roman" w:cs="Times New Roman"/>
-              </w:rPr>
-            </w:pPr>
-            <w:r>
-              <w:rPr>
-                <w:rFonts w:ascii="Times New Roman" w:hAnsi="Times New Roman" w:cs="Times New Roman"/>
-              </w:rPr>
-              <w:t>Without intervention, highe</w:t>
-            </w:r>
-            <w:r>
-              <w:rPr>
-                <w:rFonts w:ascii="Times New Roman" w:hAnsi="Times New Roman" w:cs="Times New Roman"/>
-              </w:rPr>
-              <w:t>r drop out of unsuppressed patients can inflate the third 95</w:t>
-            </w:r>
-            <w:r>
-              <w:rPr>
-                <w:rFonts w:ascii="Times New Roman" w:hAnsi="Times New Roman" w:cs="Times New Roman"/>
-              </w:rPr>
-              <w:t xml:space="preserve"> (denominator on ART shrink faster than suppressed)</w:t>
+              <w:t>ART shrink faster than suppressed)</w:t>
             </w:r>
           </w:p>
         </w:tc>
@@ -16558,6 +16595,7 @@
               <w:rPr>
                 <w:rFonts w:ascii="Times New Roman" w:hAnsi="Times New Roman" w:cs="Times New Roman"/>
               </w:rPr>
+              <w:lastRenderedPageBreak/>
               <w:t>Third_95_end &gt; third_95_start</w:t>
             </w:r>
           </w:p>
@@ -17130,7 +17168,6 @@
               <w:rPr>
                 <w:rFonts w:ascii="Times New Roman" w:hAnsi="Times New Roman" w:cs="Times New Roman"/>
               </w:rPr>
-              <w:lastRenderedPageBreak/>
               <w:t>18</w:t>
             </w:r>
           </w:p>
@@ -20409,25 +20446,7 @@
               <w:rPr>
                 <w:rFonts w:ascii="Times New Roman" w:hAnsi="Times New Roman" w:cs="Times New Roman"/>
               </w:rPr>
-              <w:t xml:space="preserve">Total_New_diagnoses (with ANC) &gt; </w:t>
-            </w:r>
-            <w:r>
-              <w:rPr>
-                <w:rFonts w:ascii="Times New Roman" w:hAnsi="Times New Roman" w:cs="Times New Roman"/>
-              </w:rPr>
-              <w:t>Total_New_diagnoses (with</w:t>
-            </w:r>
-            <w:r>
-              <w:rPr>
-                <w:rFonts w:ascii="Times New Roman" w:hAnsi="Times New Roman" w:cs="Times New Roman"/>
-              </w:rPr>
-              <w:t>out</w:t>
-            </w:r>
-            <w:r>
-              <w:rPr>
-                <w:rFonts w:ascii="Times New Roman" w:hAnsi="Times New Roman" w:cs="Times New Roman"/>
-              </w:rPr>
-              <w:t xml:space="preserve"> ANC)</w:t>
+              <w:t>Total_New_diagnoses (with ANC) &gt; Total_New_diagnoses (without ANC)</w:t>
             </w:r>
           </w:p>
           <w:p>
@@ -20464,13 +20483,7 @@
               <w:rPr>
                 <w:rFonts w:ascii="Times New Roman" w:hAnsi="Times New Roman" w:cs="Times New Roman"/>
               </w:rPr>
-              <w:t xml:space="preserve"> </w:t>
-            </w:r>
-            <w:r>
-              <w:rPr>
-                <w:rFonts w:ascii="Times New Roman" w:hAnsi="Times New Roman" w:cs="Times New Roman"/>
-              </w:rPr>
-              <w:t>art_inititations</w:t>
+              <w:t xml:space="preserve"> art_inititations</w:t>
             </w:r>
             <w:r>
               <w:rPr>
@@ -20502,6 +20515,1595 @@
         </w:rPr>
       </w:pPr>
     </w:p>
+    <w:p>
+      <w:pPr>
+        <w:rPr>
+          <w:rFonts w:ascii="Times New Roman" w:hAnsi="Times New Roman" w:cs="Times New Roman"/>
+        </w:rPr>
+      </w:pPr>
+    </w:p>
+    <w:p>
+      <w:pPr>
+        <w:rPr>
+          <w:rFonts w:ascii="Times New Roman" w:hAnsi="Times New Roman" w:cs="Times New Roman"/>
+        </w:rPr>
+      </w:pPr>
+    </w:p>
+    <w:p>
+      <w:pPr>
+        <w:pStyle w:val="Heading2"/>
+      </w:pPr>
+      <w:r>
+        <w:t>Baseline Data Sources</w:t>
+      </w:r>
+    </w:p>
+    <w:tbl>
+      <w:tblPr>
+        <w:tblStyle w:val="TableGrid"/>
+        <w:tblW w:w="0" w:type="auto"/>
+        <w:tblLook w:val="04A0" w:firstRow="1" w:lastRow="0" w:firstColumn="1" w:lastColumn="0" w:noHBand="0" w:noVBand="1"/>
+      </w:tblPr>
+      <w:tblGrid>
+        <w:gridCol w:w="562"/>
+        <w:gridCol w:w="1843"/>
+        <w:gridCol w:w="2410"/>
+        <w:gridCol w:w="3222"/>
+        <w:gridCol w:w="1313"/>
+      </w:tblGrid>
+      <w:tr>
+        <w:tc>
+          <w:tcPr>
+            <w:tcW w:w="562" w:type="dxa"/>
+          </w:tcPr>
+          <w:p>
+            <w:pPr>
+              <w:rPr>
+                <w:b/>
+                <w:bCs/>
+              </w:rPr>
+            </w:pPr>
+          </w:p>
+        </w:tc>
+        <w:tc>
+          <w:tcPr>
+            <w:tcW w:w="1843" w:type="dxa"/>
+          </w:tcPr>
+          <w:p>
+            <w:pPr>
+              <w:rPr>
+                <w:b/>
+                <w:bCs/>
+              </w:rPr>
+            </w:pPr>
+            <w:r>
+              <w:rPr>
+                <w:b/>
+                <w:bCs/>
+              </w:rPr>
+              <w:t>Group</w:t>
+            </w:r>
+          </w:p>
+        </w:tc>
+        <w:tc>
+          <w:tcPr>
+            <w:tcW w:w="2410" w:type="dxa"/>
+          </w:tcPr>
+          <w:p>
+            <w:pPr>
+              <w:rPr>
+                <w:b/>
+                <w:bCs/>
+              </w:rPr>
+            </w:pPr>
+            <w:r>
+              <w:rPr>
+                <w:b/>
+                <w:bCs/>
+              </w:rPr>
+              <w:t>Description</w:t>
+            </w:r>
+          </w:p>
+        </w:tc>
+        <w:tc>
+          <w:tcPr>
+            <w:tcW w:w="3222" w:type="dxa"/>
+          </w:tcPr>
+          <w:p>
+            <w:pPr>
+              <w:rPr>
+                <w:b/>
+                <w:bCs/>
+              </w:rPr>
+            </w:pPr>
+            <w:r>
+              <w:rPr>
+                <w:b/>
+                <w:bCs/>
+              </w:rPr>
+              <w:t>Source</w:t>
+            </w:r>
+          </w:p>
+        </w:tc>
+        <w:tc>
+          <w:tcPr>
+            <w:tcW w:w="1313" w:type="dxa"/>
+          </w:tcPr>
+          <w:p>
+            <w:pPr>
+              <w:rPr>
+                <w:b/>
+                <w:bCs/>
+              </w:rPr>
+            </w:pPr>
+            <w:r>
+              <w:rPr>
+                <w:b/>
+                <w:bCs/>
+              </w:rPr>
+              <w:t>Complete</w:t>
+            </w:r>
+          </w:p>
+        </w:tc>
+      </w:tr>
+      <w:tr>
+        <w:tc>
+          <w:tcPr>
+            <w:tcW w:w="562" w:type="dxa"/>
+          </w:tcPr>
+          <w:p>
+            <w:r>
+              <w:t>1</w:t>
+            </w:r>
+          </w:p>
+        </w:tc>
+        <w:tc>
+          <w:tcPr>
+            <w:tcW w:w="1843" w:type="dxa"/>
+          </w:tcPr>
+          <w:p>
+            <w:r>
+              <w:t>Prevention</w:t>
+            </w:r>
+          </w:p>
+        </w:tc>
+        <w:tc>
+          <w:tcPr>
+            <w:tcW w:w="2410" w:type="dxa"/>
+          </w:tcPr>
+          <w:p>
+            <w:r>
+              <w:t>Prep (Oral)</w:t>
+            </w:r>
+          </w:p>
+        </w:tc>
+        <w:tc>
+          <w:tcPr>
+            <w:tcW w:w="3222" w:type="dxa"/>
+          </w:tcPr>
+          <w:p>
+            <w:r>
+              <w:t>GAM</w:t>
+            </w:r>
+          </w:p>
+        </w:tc>
+        <w:tc>
+          <w:tcPr>
+            <w:tcW w:w="1313" w:type="dxa"/>
+          </w:tcPr>
+          <w:p>
+            <w:r>
+              <w:t>Yes</w:t>
+            </w:r>
+          </w:p>
+        </w:tc>
+      </w:tr>
+      <w:tr>
+        <w:tc>
+          <w:tcPr>
+            <w:tcW w:w="562" w:type="dxa"/>
+          </w:tcPr>
+          <w:p>
+            <w:r>
+              <w:t>2</w:t>
+            </w:r>
+          </w:p>
+        </w:tc>
+        <w:tc>
+          <w:tcPr>
+            <w:tcW w:w="1843" w:type="dxa"/>
+          </w:tcPr>
+          <w:p>
+            <w:r>
+              <w:t>Prevention</w:t>
+            </w:r>
+          </w:p>
+        </w:tc>
+        <w:tc>
+          <w:tcPr>
+            <w:tcW w:w="2410" w:type="dxa"/>
+          </w:tcPr>
+          <w:p>
+            <w:r>
+              <w:t>Prep (len)</w:t>
+            </w:r>
+          </w:p>
+        </w:tc>
+        <w:tc>
+          <w:tcPr>
+            <w:tcW w:w="3222" w:type="dxa"/>
+          </w:tcPr>
+          <w:p>
+            <w:r>
+              <w:t>Assumption (0)</w:t>
+            </w:r>
+          </w:p>
+        </w:tc>
+        <w:tc>
+          <w:tcPr>
+            <w:tcW w:w="1313" w:type="dxa"/>
+          </w:tcPr>
+          <w:p>
+            <w:r>
+              <w:t>Yes</w:t>
+            </w:r>
+          </w:p>
+        </w:tc>
+      </w:tr>
+      <w:tr>
+        <w:tc>
+          <w:tcPr>
+            <w:tcW w:w="562" w:type="dxa"/>
+          </w:tcPr>
+          <w:p>
+            <w:r>
+              <w:t>3</w:t>
+            </w:r>
+          </w:p>
+        </w:tc>
+        <w:tc>
+          <w:tcPr>
+            <w:tcW w:w="1843" w:type="dxa"/>
+          </w:tcPr>
+          <w:p>
+            <w:r>
+              <w:t>Prevention</w:t>
+            </w:r>
+          </w:p>
+        </w:tc>
+        <w:tc>
+          <w:tcPr>
+            <w:tcW w:w="2410" w:type="dxa"/>
+          </w:tcPr>
+          <w:p>
+            <w:r>
+              <w:t>VMMC</w:t>
+            </w:r>
+          </w:p>
+        </w:tc>
+        <w:tc>
+          <w:tcPr>
+            <w:tcW w:w="3222" w:type="dxa"/>
+          </w:tcPr>
+          <w:p>
+            <w:r>
+              <w:t>GAM (missing 0)</w:t>
+            </w:r>
+          </w:p>
+        </w:tc>
+        <w:tc>
+          <w:tcPr>
+            <w:tcW w:w="1313" w:type="dxa"/>
+          </w:tcPr>
+          <w:p>
+            <w:r>
+              <w:t>Yes</w:t>
+            </w:r>
+          </w:p>
+        </w:tc>
+      </w:tr>
+      <w:tr>
+        <w:tc>
+          <w:tcPr>
+            <w:tcW w:w="562" w:type="dxa"/>
+          </w:tcPr>
+          <w:p>
+            <w:r>
+              <w:t>4</w:t>
+            </w:r>
+          </w:p>
+        </w:tc>
+        <w:tc>
+          <w:tcPr>
+            <w:tcW w:w="1843" w:type="dxa"/>
+          </w:tcPr>
+          <w:p>
+            <w:r>
+              <w:t>Prevention</w:t>
+            </w:r>
+          </w:p>
+        </w:tc>
+        <w:tc>
+          <w:tcPr>
+            <w:tcW w:w="2410" w:type="dxa"/>
+          </w:tcPr>
+          <w:p>
+            <w:r>
+              <w:t>Condoms</w:t>
+            </w:r>
+          </w:p>
+        </w:tc>
+        <w:tc>
+          <w:tcPr>
+            <w:tcW w:w="3222" w:type="dxa"/>
+          </w:tcPr>
+          <w:p>
+            <w:r>
+              <w:t>GAM</w:t>
+            </w:r>
+          </w:p>
+        </w:tc>
+        <w:tc>
+          <w:tcPr>
+            <w:tcW w:w="1313" w:type="dxa"/>
+          </w:tcPr>
+          <w:p>
+            <w:r>
+              <w:t>Yes</w:t>
+            </w:r>
+          </w:p>
+        </w:tc>
+      </w:tr>
+      <w:tr>
+        <w:tc>
+          <w:tcPr>
+            <w:tcW w:w="562" w:type="dxa"/>
+          </w:tcPr>
+          <w:p>
+            <w:r>
+              <w:t>5</w:t>
+            </w:r>
+          </w:p>
+        </w:tc>
+        <w:tc>
+          <w:tcPr>
+            <w:tcW w:w="1843" w:type="dxa"/>
+          </w:tcPr>
+          <w:p>
+            <w:r>
+              <w:t>Prevention</w:t>
+            </w:r>
+          </w:p>
+        </w:tc>
+        <w:tc>
+          <w:tcPr>
+            <w:tcW w:w="2410" w:type="dxa"/>
+          </w:tcPr>
+          <w:p>
+            <w:r>
+              <w:t>PEP</w:t>
+            </w:r>
+          </w:p>
+        </w:tc>
+        <w:tc>
+          <w:tcPr>
+            <w:tcW w:w="3222" w:type="dxa"/>
+          </w:tcPr>
+          <w:p/>
+        </w:tc>
+        <w:tc>
+          <w:tcPr>
+            <w:tcW w:w="1313" w:type="dxa"/>
+          </w:tcPr>
+          <w:p>
+            <w:pPr>
+              <w:rPr>
+                <w:color w:val="EE0000"/>
+              </w:rPr>
+            </w:pPr>
+            <w:r>
+              <w:rPr>
+                <w:color w:val="EE0000"/>
+              </w:rPr>
+              <w:t>No</w:t>
+            </w:r>
+          </w:p>
+        </w:tc>
+      </w:tr>
+      <w:tr>
+        <w:tc>
+          <w:tcPr>
+            <w:tcW w:w="562" w:type="dxa"/>
+          </w:tcPr>
+          <w:p>
+            <w:r>
+              <w:t>6</w:t>
+            </w:r>
+          </w:p>
+        </w:tc>
+        <w:tc>
+          <w:tcPr>
+            <w:tcW w:w="1843" w:type="dxa"/>
+          </w:tcPr>
+          <w:p>
+            <w:r>
+              <w:t>Prevention</w:t>
+            </w:r>
+          </w:p>
+        </w:tc>
+        <w:tc>
+          <w:tcPr>
+            <w:tcW w:w="2410" w:type="dxa"/>
+          </w:tcPr>
+          <w:p>
+            <w:r>
+              <w:t>Infant Prophylaxis</w:t>
+            </w:r>
+          </w:p>
+        </w:tc>
+        <w:tc>
+          <w:tcPr>
+            <w:tcW w:w="3222" w:type="dxa"/>
+          </w:tcPr>
+          <w:p/>
+        </w:tc>
+        <w:tc>
+          <w:tcPr>
+            <w:tcW w:w="1313" w:type="dxa"/>
+          </w:tcPr>
+          <w:p>
+            <w:r>
+              <w:rPr>
+                <w:color w:val="EE0000"/>
+              </w:rPr>
+              <w:t>No</w:t>
+            </w:r>
+          </w:p>
+        </w:tc>
+      </w:tr>
+      <w:tr>
+        <w:tc>
+          <w:tcPr>
+            <w:tcW w:w="562" w:type="dxa"/>
+          </w:tcPr>
+          <w:p>
+            <w:r>
+              <w:t>7</w:t>
+            </w:r>
+          </w:p>
+        </w:tc>
+        <w:tc>
+          <w:tcPr>
+            <w:tcW w:w="1843" w:type="dxa"/>
+          </w:tcPr>
+          <w:p>
+            <w:r>
+              <w:t>Testing</w:t>
+            </w:r>
+          </w:p>
+        </w:tc>
+        <w:tc>
+          <w:tcPr>
+            <w:tcW w:w="2410" w:type="dxa"/>
+          </w:tcPr>
+          <w:p>
+            <w:r>
+              <w:t>Facility based</w:t>
+            </w:r>
+          </w:p>
+        </w:tc>
+        <w:tc>
+          <w:tcPr>
+            <w:tcW w:w="3222" w:type="dxa"/>
+          </w:tcPr>
+          <w:p>
+            <w:r>
+              <w:t>Pepfar + GAM + calc</w:t>
+            </w:r>
+          </w:p>
+        </w:tc>
+        <w:tc>
+          <w:tcPr>
+            <w:tcW w:w="1313" w:type="dxa"/>
+          </w:tcPr>
+          <w:p>
+            <w:r>
+              <w:t>Yes</w:t>
+            </w:r>
+          </w:p>
+        </w:tc>
+      </w:tr>
+      <w:tr>
+        <w:tc>
+          <w:tcPr>
+            <w:tcW w:w="562" w:type="dxa"/>
+          </w:tcPr>
+          <w:p>
+            <w:r>
+              <w:t>8</w:t>
+            </w:r>
+          </w:p>
+        </w:tc>
+        <w:tc>
+          <w:tcPr>
+            <w:tcW w:w="1843" w:type="dxa"/>
+          </w:tcPr>
+          <w:p>
+            <w:r>
+              <w:t>Testing</w:t>
+            </w:r>
+          </w:p>
+        </w:tc>
+        <w:tc>
+          <w:tcPr>
+            <w:tcW w:w="2410" w:type="dxa"/>
+          </w:tcPr>
+          <w:p>
+            <w:r>
+              <w:t>Network</w:t>
+            </w:r>
+          </w:p>
+        </w:tc>
+        <w:tc>
+          <w:tcPr>
+            <w:tcW w:w="3222" w:type="dxa"/>
+          </w:tcPr>
+          <w:p>
+            <w:r>
+              <w:t>Pepfar + GAM + calc</w:t>
+            </w:r>
+          </w:p>
+        </w:tc>
+        <w:tc>
+          <w:tcPr>
+            <w:tcW w:w="1313" w:type="dxa"/>
+          </w:tcPr>
+          <w:p>
+            <w:r>
+              <w:t>Yes</w:t>
+            </w:r>
+          </w:p>
+        </w:tc>
+      </w:tr>
+      <w:tr>
+        <w:tc>
+          <w:tcPr>
+            <w:tcW w:w="562" w:type="dxa"/>
+          </w:tcPr>
+          <w:p>
+            <w:r>
+              <w:t>9</w:t>
+            </w:r>
+          </w:p>
+        </w:tc>
+        <w:tc>
+          <w:tcPr>
+            <w:tcW w:w="1843" w:type="dxa"/>
+          </w:tcPr>
+          <w:p>
+            <w:r>
+              <w:t>Testing</w:t>
+            </w:r>
+          </w:p>
+        </w:tc>
+        <w:tc>
+          <w:tcPr>
+            <w:tcW w:w="2410" w:type="dxa"/>
+          </w:tcPr>
+          <w:p>
+            <w:r>
+              <w:t>Index</w:t>
+            </w:r>
+          </w:p>
+        </w:tc>
+        <w:tc>
+          <w:tcPr>
+            <w:tcW w:w="3222" w:type="dxa"/>
+          </w:tcPr>
+          <w:p>
+            <w:r>
+              <w:t>Pepfar + GAM + calc + limit</w:t>
+            </w:r>
+          </w:p>
+        </w:tc>
+        <w:tc>
+          <w:tcPr>
+            <w:tcW w:w="1313" w:type="dxa"/>
+          </w:tcPr>
+          <w:p>
+            <w:r>
+              <w:t>Yes</w:t>
+            </w:r>
+          </w:p>
+        </w:tc>
+      </w:tr>
+      <w:tr>
+        <w:tc>
+          <w:tcPr>
+            <w:tcW w:w="562" w:type="dxa"/>
+          </w:tcPr>
+          <w:p>
+            <w:r>
+              <w:t>10</w:t>
+            </w:r>
+          </w:p>
+        </w:tc>
+        <w:tc>
+          <w:tcPr>
+            <w:tcW w:w="1843" w:type="dxa"/>
+          </w:tcPr>
+          <w:p>
+            <w:r>
+              <w:t>Testing</w:t>
+            </w:r>
+          </w:p>
+        </w:tc>
+        <w:tc>
+          <w:tcPr>
+            <w:tcW w:w="2410" w:type="dxa"/>
+          </w:tcPr>
+          <w:p>
+            <w:r>
+              <w:t>Community</w:t>
+            </w:r>
+          </w:p>
+        </w:tc>
+        <w:tc>
+          <w:tcPr>
+            <w:tcW w:w="3222" w:type="dxa"/>
+          </w:tcPr>
+          <w:p>
+            <w:r>
+              <w:t>Pepfar + GAM + calc</w:t>
+            </w:r>
+          </w:p>
+        </w:tc>
+        <w:tc>
+          <w:tcPr>
+            <w:tcW w:w="1313" w:type="dxa"/>
+          </w:tcPr>
+          <w:p>
+            <w:r>
+              <w:t>Yes</w:t>
+            </w:r>
+          </w:p>
+        </w:tc>
+      </w:tr>
+      <w:tr>
+        <w:tc>
+          <w:tcPr>
+            <w:tcW w:w="562" w:type="dxa"/>
+          </w:tcPr>
+          <w:p>
+            <w:r>
+              <w:t>11</w:t>
+            </w:r>
+          </w:p>
+        </w:tc>
+        <w:tc>
+          <w:tcPr>
+            <w:tcW w:w="1843" w:type="dxa"/>
+          </w:tcPr>
+          <w:p>
+            <w:r>
+              <w:t>Testing</w:t>
+            </w:r>
+          </w:p>
+        </w:tc>
+        <w:tc>
+          <w:tcPr>
+            <w:tcW w:w="2410" w:type="dxa"/>
+          </w:tcPr>
+          <w:p>
+            <w:r>
+              <w:t>Key pops</w:t>
+            </w:r>
+          </w:p>
+        </w:tc>
+        <w:tc>
+          <w:tcPr>
+            <w:tcW w:w="3222" w:type="dxa"/>
+          </w:tcPr>
+          <w:p>
+            <w:r>
+              <w:t>Pepfar + GAM + calc</w:t>
+            </w:r>
+          </w:p>
+        </w:tc>
+        <w:tc>
+          <w:tcPr>
+            <w:tcW w:w="1313" w:type="dxa"/>
+          </w:tcPr>
+          <w:p>
+            <w:r>
+              <w:t>Yes</w:t>
+            </w:r>
+          </w:p>
+        </w:tc>
+      </w:tr>
+      <w:tr>
+        <w:tc>
+          <w:tcPr>
+            <w:tcW w:w="562" w:type="dxa"/>
+          </w:tcPr>
+          <w:p>
+            <w:r>
+              <w:t>12</w:t>
+            </w:r>
+          </w:p>
+        </w:tc>
+        <w:tc>
+          <w:tcPr>
+            <w:tcW w:w="1843" w:type="dxa"/>
+          </w:tcPr>
+          <w:p>
+            <w:r>
+              <w:t>Testing</w:t>
+            </w:r>
+          </w:p>
+        </w:tc>
+        <w:tc>
+          <w:tcPr>
+            <w:tcW w:w="2410" w:type="dxa"/>
+          </w:tcPr>
+          <w:p>
+            <w:r>
+              <w:t>HIVST Facility</w:t>
+            </w:r>
+          </w:p>
+        </w:tc>
+        <w:tc>
+          <w:tcPr>
+            <w:tcW w:w="3222" w:type="dxa"/>
+          </w:tcPr>
+          <w:p/>
+        </w:tc>
+        <w:tc>
+          <w:tcPr>
+            <w:tcW w:w="1313" w:type="dxa"/>
+          </w:tcPr>
+          <w:p>
+            <w:r>
+              <w:rPr>
+                <w:color w:val="EE0000"/>
+              </w:rPr>
+              <w:t>No</w:t>
+            </w:r>
+          </w:p>
+        </w:tc>
+      </w:tr>
+      <w:tr>
+        <w:tc>
+          <w:tcPr>
+            <w:tcW w:w="562" w:type="dxa"/>
+          </w:tcPr>
+          <w:p>
+            <w:r>
+              <w:t>13</w:t>
+            </w:r>
+          </w:p>
+        </w:tc>
+        <w:tc>
+          <w:tcPr>
+            <w:tcW w:w="1843" w:type="dxa"/>
+          </w:tcPr>
+          <w:p>
+            <w:r>
+              <w:t>Testing</w:t>
+            </w:r>
+          </w:p>
+        </w:tc>
+        <w:tc>
+          <w:tcPr>
+            <w:tcW w:w="2410" w:type="dxa"/>
+          </w:tcPr>
+          <w:p>
+            <w:r>
+              <w:t>HIVST Community</w:t>
+            </w:r>
+          </w:p>
+        </w:tc>
+        <w:tc>
+          <w:tcPr>
+            <w:tcW w:w="3222" w:type="dxa"/>
+          </w:tcPr>
+          <w:p/>
+        </w:tc>
+        <w:tc>
+          <w:tcPr>
+            <w:tcW w:w="1313" w:type="dxa"/>
+          </w:tcPr>
+          <w:p>
+            <w:r>
+              <w:rPr>
+                <w:color w:val="EE0000"/>
+              </w:rPr>
+              <w:t>No</w:t>
+            </w:r>
+          </w:p>
+        </w:tc>
+      </w:tr>
+      <w:tr>
+        <w:tc>
+          <w:tcPr>
+            <w:tcW w:w="562" w:type="dxa"/>
+          </w:tcPr>
+          <w:p>
+            <w:r>
+              <w:t>14</w:t>
+            </w:r>
+          </w:p>
+        </w:tc>
+        <w:tc>
+          <w:tcPr>
+            <w:tcW w:w="1843" w:type="dxa"/>
+          </w:tcPr>
+          <w:p>
+            <w:r>
+              <w:t>Testing</w:t>
+            </w:r>
+          </w:p>
+        </w:tc>
+        <w:tc>
+          <w:tcPr>
+            <w:tcW w:w="2410" w:type="dxa"/>
+          </w:tcPr>
+          <w:p>
+            <w:r>
+              <w:t>EID</w:t>
+            </w:r>
+          </w:p>
+        </w:tc>
+        <w:tc>
+          <w:tcPr>
+            <w:tcW w:w="3222" w:type="dxa"/>
+          </w:tcPr>
+          <w:p>
+            <w:r>
+              <w:t>UNICEF (missing mean)</w:t>
+            </w:r>
+          </w:p>
+        </w:tc>
+        <w:tc>
+          <w:tcPr>
+            <w:tcW w:w="1313" w:type="dxa"/>
+          </w:tcPr>
+          <w:p>
+            <w:r>
+              <w:t>Yes</w:t>
+            </w:r>
+          </w:p>
+        </w:tc>
+      </w:tr>
+      <w:tr>
+        <w:tc>
+          <w:tcPr>
+            <w:tcW w:w="562" w:type="dxa"/>
+          </w:tcPr>
+          <w:p>
+            <w:r>
+              <w:t>15</w:t>
+            </w:r>
+          </w:p>
+        </w:tc>
+        <w:tc>
+          <w:tcPr>
+            <w:tcW w:w="1843" w:type="dxa"/>
+          </w:tcPr>
+          <w:p>
+            <w:r>
+              <w:t>Testing</w:t>
+            </w:r>
+          </w:p>
+        </w:tc>
+        <w:tc>
+          <w:tcPr>
+            <w:tcW w:w="2410" w:type="dxa"/>
+          </w:tcPr>
+          <w:p>
+            <w:r>
+              <w:t>ANC</w:t>
+            </w:r>
+          </w:p>
+        </w:tc>
+        <w:tc>
+          <w:tcPr>
+            <w:tcW w:w="3222" w:type="dxa"/>
+          </w:tcPr>
+          <w:p/>
+        </w:tc>
+        <w:tc>
+          <w:tcPr>
+            <w:tcW w:w="1313" w:type="dxa"/>
+          </w:tcPr>
+          <w:p>
+            <w:r>
+              <w:rPr>
+                <w:color w:val="EE0000"/>
+              </w:rPr>
+              <w:t>No</w:t>
+            </w:r>
+          </w:p>
+        </w:tc>
+      </w:tr>
+      <w:tr>
+        <w:tc>
+          <w:tcPr>
+            <w:tcW w:w="562" w:type="dxa"/>
+          </w:tcPr>
+          <w:p>
+            <w:r>
+              <w:t>16</w:t>
+            </w:r>
+          </w:p>
+        </w:tc>
+        <w:tc>
+          <w:tcPr>
+            <w:tcW w:w="1843" w:type="dxa"/>
+          </w:tcPr>
+          <w:p>
+            <w:r>
+              <w:t>Testing</w:t>
+            </w:r>
+          </w:p>
+        </w:tc>
+        <w:tc>
+          <w:tcPr>
+            <w:tcW w:w="2410" w:type="dxa"/>
+          </w:tcPr>
+          <w:p>
+            <w:r>
+              <w:t>PNC</w:t>
+            </w:r>
+          </w:p>
+        </w:tc>
+        <w:tc>
+          <w:tcPr>
+            <w:tcW w:w="3222" w:type="dxa"/>
+          </w:tcPr>
+          <w:p/>
+        </w:tc>
+        <w:tc>
+          <w:tcPr>
+            <w:tcW w:w="1313" w:type="dxa"/>
+          </w:tcPr>
+          <w:p>
+            <w:r>
+              <w:rPr>
+                <w:color w:val="EE0000"/>
+              </w:rPr>
+              <w:t>No</w:t>
+            </w:r>
+          </w:p>
+        </w:tc>
+      </w:tr>
+      <w:tr>
+        <w:tc>
+          <w:tcPr>
+            <w:tcW w:w="562" w:type="dxa"/>
+          </w:tcPr>
+          <w:p>
+            <w:r>
+              <w:t>17</w:t>
+            </w:r>
+          </w:p>
+        </w:tc>
+        <w:tc>
+          <w:tcPr>
+            <w:tcW w:w="1843" w:type="dxa"/>
+          </w:tcPr>
+          <w:p>
+            <w:r>
+              <w:t xml:space="preserve">Treatment </w:t>
+            </w:r>
+          </w:p>
+        </w:tc>
+        <w:tc>
+          <w:tcPr>
+            <w:tcW w:w="2410" w:type="dxa"/>
+          </w:tcPr>
+          <w:p>
+            <w:r>
+              <w:t>Routine VL</w:t>
+            </w:r>
+          </w:p>
+        </w:tc>
+        <w:tc>
+          <w:tcPr>
+            <w:tcW w:w="3222" w:type="dxa"/>
+          </w:tcPr>
+          <w:p/>
+        </w:tc>
+        <w:tc>
+          <w:tcPr>
+            <w:tcW w:w="1313" w:type="dxa"/>
+          </w:tcPr>
+          <w:p/>
+        </w:tc>
+      </w:tr>
+      <w:tr>
+        <w:tc>
+          <w:tcPr>
+            <w:tcW w:w="562" w:type="dxa"/>
+          </w:tcPr>
+          <w:p>
+            <w:r>
+              <w:t>18</w:t>
+            </w:r>
+          </w:p>
+        </w:tc>
+        <w:tc>
+          <w:tcPr>
+            <w:tcW w:w="1843" w:type="dxa"/>
+          </w:tcPr>
+          <w:p>
+            <w:r>
+              <w:t>Treatment</w:t>
+            </w:r>
+          </w:p>
+        </w:tc>
+        <w:tc>
+          <w:tcPr>
+            <w:tcW w:w="2410" w:type="dxa"/>
+          </w:tcPr>
+          <w:p>
+            <w:r>
+              <w:t>CTX</w:t>
+            </w:r>
+          </w:p>
+        </w:tc>
+        <w:tc>
+          <w:tcPr>
+            <w:tcW w:w="3222" w:type="dxa"/>
+          </w:tcPr>
+          <w:p/>
+        </w:tc>
+        <w:tc>
+          <w:tcPr>
+            <w:tcW w:w="1313" w:type="dxa"/>
+          </w:tcPr>
+          <w:p/>
+        </w:tc>
+      </w:tr>
+      <w:tr>
+        <w:tc>
+          <w:tcPr>
+            <w:tcW w:w="562" w:type="dxa"/>
+          </w:tcPr>
+          <w:p>
+            <w:r>
+              <w:t>19</w:t>
+            </w:r>
+          </w:p>
+        </w:tc>
+        <w:tc>
+          <w:tcPr>
+            <w:tcW w:w="1843" w:type="dxa"/>
+          </w:tcPr>
+          <w:p>
+            <w:r>
+              <w:t>Treatment</w:t>
+            </w:r>
+          </w:p>
+        </w:tc>
+        <w:tc>
+          <w:tcPr>
+            <w:tcW w:w="2410" w:type="dxa"/>
+          </w:tcPr>
+          <w:p>
+            <w:r>
+              <w:t>OI screening and management</w:t>
+            </w:r>
+          </w:p>
+        </w:tc>
+        <w:tc>
+          <w:tcPr>
+            <w:tcW w:w="3222" w:type="dxa"/>
+          </w:tcPr>
+          <w:p/>
+        </w:tc>
+        <w:tc>
+          <w:tcPr>
+            <w:tcW w:w="1313" w:type="dxa"/>
+          </w:tcPr>
+          <w:p/>
+        </w:tc>
+      </w:tr>
+      <w:tr>
+        <w:tc>
+          <w:tcPr>
+            <w:tcW w:w="562" w:type="dxa"/>
+          </w:tcPr>
+          <w:p>
+            <w:r>
+              <w:t>20</w:t>
+            </w:r>
+          </w:p>
+        </w:tc>
+        <w:tc>
+          <w:tcPr>
+            <w:tcW w:w="1843" w:type="dxa"/>
+          </w:tcPr>
+          <w:p>
+            <w:r>
+              <w:t>Treatment</w:t>
+            </w:r>
+          </w:p>
+        </w:tc>
+        <w:tc>
+          <w:tcPr>
+            <w:tcW w:w="2410" w:type="dxa"/>
+          </w:tcPr>
+          <w:p>
+            <w:r>
+              <w:t>MMD 3 month</w:t>
+            </w:r>
+          </w:p>
+        </w:tc>
+        <w:tc>
+          <w:tcPr>
+            <w:tcW w:w="3222" w:type="dxa"/>
+          </w:tcPr>
+          <w:p/>
+        </w:tc>
+        <w:tc>
+          <w:tcPr>
+            <w:tcW w:w="1313" w:type="dxa"/>
+          </w:tcPr>
+          <w:p/>
+        </w:tc>
+      </w:tr>
+      <w:tr>
+        <w:tc>
+          <w:tcPr>
+            <w:tcW w:w="562" w:type="dxa"/>
+          </w:tcPr>
+          <w:p>
+            <w:r>
+              <w:t>21</w:t>
+            </w:r>
+          </w:p>
+        </w:tc>
+        <w:tc>
+          <w:tcPr>
+            <w:tcW w:w="1843" w:type="dxa"/>
+          </w:tcPr>
+          <w:p>
+            <w:r>
+              <w:t>Treatment</w:t>
+            </w:r>
+          </w:p>
+        </w:tc>
+        <w:tc>
+          <w:tcPr>
+            <w:tcW w:w="2410" w:type="dxa"/>
+          </w:tcPr>
+          <w:p>
+            <w:r>
+              <w:t>MMD</w:t>
+            </w:r>
+            <w:r>
+              <w:t xml:space="preserve"> 6 month</w:t>
+            </w:r>
+          </w:p>
+        </w:tc>
+        <w:tc>
+          <w:tcPr>
+            <w:tcW w:w="3222" w:type="dxa"/>
+          </w:tcPr>
+          <w:p/>
+        </w:tc>
+        <w:tc>
+          <w:tcPr>
+            <w:tcW w:w="1313" w:type="dxa"/>
+          </w:tcPr>
+          <w:p/>
+        </w:tc>
+      </w:tr>
+      <w:tr>
+        <w:tc>
+          <w:tcPr>
+            <w:tcW w:w="562" w:type="dxa"/>
+          </w:tcPr>
+          <w:p>
+            <w:r>
+              <w:t>22</w:t>
+            </w:r>
+          </w:p>
+        </w:tc>
+        <w:tc>
+          <w:tcPr>
+            <w:tcW w:w="1843" w:type="dxa"/>
+          </w:tcPr>
+          <w:p>
+            <w:r>
+              <w:t>Treatment</w:t>
+            </w:r>
+          </w:p>
+        </w:tc>
+        <w:tc>
+          <w:tcPr>
+            <w:tcW w:w="2410" w:type="dxa"/>
+          </w:tcPr>
+          <w:p>
+            <w:r>
+              <w:t>MMD 12 month</w:t>
+            </w:r>
+          </w:p>
+        </w:tc>
+        <w:tc>
+          <w:tcPr>
+            <w:tcW w:w="3222" w:type="dxa"/>
+          </w:tcPr>
+          <w:p/>
+        </w:tc>
+        <w:tc>
+          <w:tcPr>
+            <w:tcW w:w="1313" w:type="dxa"/>
+          </w:tcPr>
+          <w:p/>
+        </w:tc>
+      </w:tr>
+      <w:tr>
+        <w:tc>
+          <w:tcPr>
+            <w:tcW w:w="562" w:type="dxa"/>
+          </w:tcPr>
+          <w:p>
+            <w:r>
+              <w:lastRenderedPageBreak/>
+              <w:t>23</w:t>
+            </w:r>
+          </w:p>
+        </w:tc>
+        <w:tc>
+          <w:tcPr>
+            <w:tcW w:w="1843" w:type="dxa"/>
+          </w:tcPr>
+          <w:p>
+            <w:r>
+              <w:t>Treatment</w:t>
+            </w:r>
+          </w:p>
+        </w:tc>
+        <w:tc>
+          <w:tcPr>
+            <w:tcW w:w="2410" w:type="dxa"/>
+          </w:tcPr>
+          <w:p>
+            <w:r>
+              <w:t>Fast Track</w:t>
+            </w:r>
+          </w:p>
+        </w:tc>
+        <w:tc>
+          <w:tcPr>
+            <w:tcW w:w="3222" w:type="dxa"/>
+          </w:tcPr>
+          <w:p/>
+        </w:tc>
+        <w:tc>
+          <w:tcPr>
+            <w:tcW w:w="1313" w:type="dxa"/>
+          </w:tcPr>
+          <w:p/>
+        </w:tc>
+      </w:tr>
+      <w:tr>
+        <w:tc>
+          <w:tcPr>
+            <w:tcW w:w="562" w:type="dxa"/>
+          </w:tcPr>
+          <w:p>
+            <w:r>
+              <w:t>24</w:t>
+            </w:r>
+          </w:p>
+        </w:tc>
+        <w:tc>
+          <w:tcPr>
+            <w:tcW w:w="1843" w:type="dxa"/>
+          </w:tcPr>
+          <w:p>
+            <w:r>
+              <w:t>Treatment</w:t>
+            </w:r>
+          </w:p>
+        </w:tc>
+        <w:tc>
+          <w:tcPr>
+            <w:tcW w:w="2410" w:type="dxa"/>
+          </w:tcPr>
+          <w:p>
+            <w:r>
+              <w:t>C</w:t>
+            </w:r>
+            <w:r>
+              <w:t>ommunity pick-up</w:t>
+            </w:r>
+          </w:p>
+        </w:tc>
+        <w:tc>
+          <w:tcPr>
+            <w:tcW w:w="3222" w:type="dxa"/>
+          </w:tcPr>
+          <w:p/>
+        </w:tc>
+        <w:tc>
+          <w:tcPr>
+            <w:tcW w:w="1313" w:type="dxa"/>
+          </w:tcPr>
+          <w:p/>
+        </w:tc>
+      </w:tr>
+      <w:tr>
+        <w:tc>
+          <w:tcPr>
+            <w:tcW w:w="562" w:type="dxa"/>
+          </w:tcPr>
+          <w:p>
+            <w:r>
+              <w:t>25</w:t>
+            </w:r>
+          </w:p>
+        </w:tc>
+        <w:tc>
+          <w:tcPr>
+            <w:tcW w:w="1843" w:type="dxa"/>
+          </w:tcPr>
+          <w:p>
+            <w:r>
+              <w:t>Retention</w:t>
+            </w:r>
+          </w:p>
+        </w:tc>
+        <w:tc>
+          <w:tcPr>
+            <w:tcW w:w="2410" w:type="dxa"/>
+          </w:tcPr>
+          <w:p>
+            <w:r>
+              <w:t>ADH counselling</w:t>
+            </w:r>
+          </w:p>
+        </w:tc>
+        <w:tc>
+          <w:tcPr>
+            <w:tcW w:w="3222" w:type="dxa"/>
+          </w:tcPr>
+          <w:p/>
+        </w:tc>
+        <w:tc>
+          <w:tcPr>
+            <w:tcW w:w="1313" w:type="dxa"/>
+          </w:tcPr>
+          <w:p/>
+        </w:tc>
+      </w:tr>
+      <w:tr>
+        <w:tc>
+          <w:tcPr>
+            <w:tcW w:w="562" w:type="dxa"/>
+          </w:tcPr>
+          <w:p>
+            <w:r>
+              <w:t>26</w:t>
+            </w:r>
+          </w:p>
+        </w:tc>
+        <w:tc>
+          <w:tcPr>
+            <w:tcW w:w="1843" w:type="dxa"/>
+          </w:tcPr>
+          <w:p>
+            <w:r>
+              <w:t>Retention</w:t>
+            </w:r>
+          </w:p>
+        </w:tc>
+        <w:tc>
+          <w:tcPr>
+            <w:tcW w:w="2410" w:type="dxa"/>
+          </w:tcPr>
+          <w:p>
+            <w:r>
+              <w:t>Track and trace</w:t>
+            </w:r>
+          </w:p>
+        </w:tc>
+        <w:tc>
+          <w:tcPr>
+            <w:tcW w:w="3222" w:type="dxa"/>
+          </w:tcPr>
+          <w:p/>
+        </w:tc>
+        <w:tc>
+          <w:tcPr>
+            <w:tcW w:w="1313" w:type="dxa"/>
+          </w:tcPr>
+          <w:p/>
+        </w:tc>
+      </w:tr>
+      <w:tr>
+        <w:tc>
+          <w:tcPr>
+            <w:tcW w:w="562" w:type="dxa"/>
+          </w:tcPr>
+          <w:p>
+            <w:r>
+              <w:t>27</w:t>
+            </w:r>
+          </w:p>
+        </w:tc>
+        <w:tc>
+          <w:tcPr>
+            <w:tcW w:w="1843" w:type="dxa"/>
+          </w:tcPr>
+          <w:p>
+            <w:r>
+              <w:t>Retention</w:t>
+            </w:r>
+          </w:p>
+        </w:tc>
+        <w:tc>
+          <w:tcPr>
+            <w:tcW w:w="2410" w:type="dxa"/>
+          </w:tcPr>
+          <w:p>
+            <w:r>
+              <w:t>ANC VL</w:t>
+            </w:r>
+          </w:p>
+        </w:tc>
+        <w:tc>
+          <w:tcPr>
+            <w:tcW w:w="3222" w:type="dxa"/>
+          </w:tcPr>
+          <w:p/>
+        </w:tc>
+        <w:tc>
+          <w:tcPr>
+            <w:tcW w:w="1313" w:type="dxa"/>
+          </w:tcPr>
+          <w:p/>
+        </w:tc>
+      </w:tr>
+      <w:tr>
+        <w:tc>
+          <w:tcPr>
+            <w:tcW w:w="562" w:type="dxa"/>
+          </w:tcPr>
+          <w:p>
+            <w:r>
+              <w:t>28</w:t>
+            </w:r>
+          </w:p>
+        </w:tc>
+        <w:tc>
+          <w:tcPr>
+            <w:tcW w:w="1843" w:type="dxa"/>
+          </w:tcPr>
+          <w:p>
+            <w:r>
+              <w:t>Retention</w:t>
+            </w:r>
+          </w:p>
+        </w:tc>
+        <w:tc>
+          <w:tcPr>
+            <w:tcW w:w="2410" w:type="dxa"/>
+          </w:tcPr>
+          <w:p>
+            <w:r>
+              <w:t>PNC VL</w:t>
+            </w:r>
+          </w:p>
+        </w:tc>
+        <w:tc>
+          <w:tcPr>
+            <w:tcW w:w="3222" w:type="dxa"/>
+          </w:tcPr>
+          <w:p/>
+        </w:tc>
+        <w:tc>
+          <w:tcPr>
+            <w:tcW w:w="1313" w:type="dxa"/>
+          </w:tcPr>
+          <w:p/>
+        </w:tc>
+      </w:tr>
+      <w:tr>
+        <w:tc>
+          <w:tcPr>
+            <w:tcW w:w="562" w:type="dxa"/>
+          </w:tcPr>
+          <w:p>
+            <w:r>
+              <w:t>29</w:t>
+            </w:r>
+          </w:p>
+        </w:tc>
+        <w:tc>
+          <w:tcPr>
+            <w:tcW w:w="1843" w:type="dxa"/>
+          </w:tcPr>
+          <w:p>
+            <w:r>
+              <w:t>ADH</w:t>
+            </w:r>
+          </w:p>
+        </w:tc>
+        <w:tc>
+          <w:tcPr>
+            <w:tcW w:w="2410" w:type="dxa"/>
+          </w:tcPr>
+          <w:p>
+            <w:r>
+              <w:t xml:space="preserve">CD4 </w:t>
+            </w:r>
+            <w:r>
+              <w:t>testing</w:t>
+            </w:r>
+          </w:p>
+        </w:tc>
+        <w:tc>
+          <w:tcPr>
+            <w:tcW w:w="3222" w:type="dxa"/>
+          </w:tcPr>
+          <w:p/>
+        </w:tc>
+        <w:tc>
+          <w:tcPr>
+            <w:tcW w:w="1313" w:type="dxa"/>
+          </w:tcPr>
+          <w:p/>
+        </w:tc>
+      </w:tr>
+      <w:tr>
+        <w:tc>
+          <w:tcPr>
+            <w:tcW w:w="562" w:type="dxa"/>
+          </w:tcPr>
+          <w:p>
+            <w:r>
+              <w:t>30</w:t>
+            </w:r>
+          </w:p>
+        </w:tc>
+        <w:tc>
+          <w:tcPr>
+            <w:tcW w:w="1843" w:type="dxa"/>
+          </w:tcPr>
+          <w:p>
+            <w:r>
+              <w:t>ADH</w:t>
+            </w:r>
+          </w:p>
+        </w:tc>
+        <w:tc>
+          <w:tcPr>
+            <w:tcW w:w="2410" w:type="dxa"/>
+          </w:tcPr>
+          <w:p>
+            <w:r>
+              <w:t>AHD package</w:t>
+            </w:r>
+          </w:p>
+        </w:tc>
+        <w:tc>
+          <w:tcPr>
+            <w:tcW w:w="3222" w:type="dxa"/>
+          </w:tcPr>
+          <w:p/>
+        </w:tc>
+        <w:tc>
+          <w:tcPr>
+            <w:tcW w:w="1313" w:type="dxa"/>
+          </w:tcPr>
+          <w:p/>
+        </w:tc>
+      </w:tr>
+    </w:tbl>
+    <w:p/>
     <w:sectPr>
       <w:pgSz w:w="12240" w:h="15840"/>
       <w:pgMar w:top="1440" w:right="1440" w:bottom="1440" w:left="1440" w:header="708" w:footer="708" w:gutter="0"/>

</xml_diff>

<commit_message>
multiplier line removal after csv change
</commit_message>
<xml_diff>
--- a/resources/Test_Framework_Description.docx
+++ b/resources/Test_Framework_Description.docx
@@ -662,7 +662,19 @@
         </w:numPr>
       </w:pPr>
       <w:r>
-        <w:t>Effects stack multiplicatively (to avoid double-counting overlapping populations)</w:t>
+        <w:t xml:space="preserve">Effects stack </w:t>
+      </w:r>
+      <w:r>
+        <w:t xml:space="preserve">additively for DSD and </w:t>
+      </w:r>
+      <w:r>
+        <w:t>multiplicatively</w:t>
+      </w:r>
+      <w:r>
+        <w:t xml:space="preserve"> for DSD and other interventions</w:t>
+      </w:r>
+      <w:r>
+        <w:t xml:space="preserve"> (to avoid double-counting overlapping populations)</w:t>
       </w:r>
     </w:p>
     <w:p>
@@ -686,6 +698,7 @@
         </w:numPr>
       </w:pPr>
       <w:r>
+        <w:lastRenderedPageBreak/>
         <w:t>Net new LTFU = gross new LTFU minus those prevented from dropping out</w:t>
       </w:r>
     </w:p>
@@ -697,7 +710,6 @@
         <w:rPr>
           <w:rStyle w:val="Strong"/>
         </w:rPr>
-        <w:lastRenderedPageBreak/>
         <w:t>Re-engagement interventions (tracking/tracing, testing)</w:t>
       </w:r>
     </w:p>
@@ -1125,6 +1137,7 @@
         </w:numPr>
       </w:pPr>
       <w:r>
+        <w:lastRenderedPageBreak/>
         <w:t xml:space="preserve">AHD package (LAM/CrAg/fluconazole) reduces the AHD rate, but is </w:t>
       </w:r>
       <w:r>
@@ -1164,7 +1177,6 @@
         <w:rPr>
           <w:rStyle w:val="Strong"/>
         </w:rPr>
-        <w:lastRenderedPageBreak/>
         <w:t>Deaths averted</w:t>
       </w:r>
     </w:p>
@@ -1457,6 +1469,7 @@
         </w:numPr>
       </w:pPr>
       <w:r>
+        <w:lastRenderedPageBreak/>
         <w:t xml:space="preserve">Women who are diagnosed but do not link remain in the </w:t>
       </w:r>
       <w:r>
@@ -1489,7 +1502,6 @@
         </w:numPr>
       </w:pPr>
       <w:r>
-        <w:lastRenderedPageBreak/>
         <w:t xml:space="preserve">Two cost components: </w:t>
       </w:r>
       <w:r>
@@ -1554,7 +1566,7 @@
         <w:rPr>
           <w:noProof/>
         </w:rPr>
-        <w:pict w14:anchorId="56A3144F">
+        <w:pict w14:anchorId="4E64CB8B">
           <v:rect id="_x0000_i1030" alt="" style="width:451.3pt;height:.05pt;mso-width-percent:0;mso-height-percent:0;mso-width-percent:0;mso-height-percent:0" o:hralign="center" o:hrstd="t" o:hr="t" fillcolor="#a0a0a0" stroked="f"/>
         </w:pict>
       </w:r>
@@ -1823,7 +1835,8 @@
         <w:rPr>
           <w:noProof/>
         </w:rPr>
-        <w:pict w14:anchorId="213FF463">
+        <w:lastRenderedPageBreak/>
+        <w:pict w14:anchorId="3C84F817">
           <v:rect id="_x0000_i1029" alt="" style="width:451.3pt;height:.05pt;mso-width-percent:0;mso-height-percent:0;mso-width-percent:0;mso-height-percent:0" o:hralign="center" o:hrstd="t" o:hr="t" fillcolor="#a0a0a0" stroked="f"/>
         </w:pict>
       </w:r>
@@ -1856,7 +1869,6 @@
         </w:numPr>
       </w:pPr>
       <w:r>
-        <w:lastRenderedPageBreak/>
         <w:t>Targets pregnant women already on ART who are unsuppressed</w:t>
       </w:r>
     </w:p>
@@ -2092,7 +2104,7 @@
         <w:rPr>
           <w:noProof/>
         </w:rPr>
-        <w:pict w14:anchorId="61BA6277">
+        <w:pict w14:anchorId="7495D80C">
           <v:rect id="_x0000_i1028" alt="" style="width:451.3pt;height:.05pt;mso-width-percent:0;mso-height-percent:0;mso-width-percent:0;mso-height-percent:0" o:hralign="center" o:hrstd="t" o:hr="t" fillcolor="#a0a0a0" stroked="f"/>
         </w:pict>
       </w:r>
@@ -2125,6 +2137,7 @@
         </w:numPr>
       </w:pPr>
       <w:r>
+        <w:lastRenderedPageBreak/>
         <w:t>Targets postpartum women already on ART who remain unsuppressed after ANC</w:t>
       </w:r>
     </w:p>
@@ -2178,7 +2191,6 @@
         <w:rPr>
           <w:rStyle w:val="HTMLCode"/>
         </w:rPr>
-        <w:lastRenderedPageBreak/>
         <w:t>pnc_vl_shift = min(pnc_vl_reached_preg × (1 − percent_suppressed/100) × efficacy, mtct_unsupp)</w:t>
       </w:r>
     </w:p>
@@ -2302,7 +2314,7 @@
         <w:rPr>
           <w:noProof/>
         </w:rPr>
-        <w:pict w14:anchorId="65E45AD6">
+        <w:pict w14:anchorId="4371F0A6">
           <v:rect id="_x0000_i1027" alt="" style="width:451.3pt;height:.05pt;mso-width-percent:0;mso-height-percent:0;mso-width-percent:0;mso-height-percent:0" o:hralign="center" o:hrstd="t" o:hr="t" fillcolor="#a0a0a0" stroked="f"/>
         </w:pict>
       </w:r>
@@ -2453,6 +2465,7 @@
         </w:numPr>
       </w:pPr>
       <w:r>
+        <w:lastRenderedPageBreak/>
         <w:t>Infant prophylaxis acts on the total pool of at-risk infants (all those born to HIV+ mothers), irrespective of which maternal group they come from — suppressed, unsuppressed, or no-ART</w:t>
       </w:r>
     </w:p>
@@ -2488,7 +2501,6 @@
         </w:numPr>
       </w:pPr>
       <w:r>
-        <w:lastRenderedPageBreak/>
         <w:t xml:space="preserve">Single cost component: </w:t>
       </w:r>
       <w:r>
@@ -2532,7 +2544,7 @@
         <w:rPr>
           <w:noProof/>
         </w:rPr>
-        <w:pict w14:anchorId="505B8EB9">
+        <w:pict w14:anchorId="561960C2">
           <v:rect id="_x0000_i1026" alt="" style="width:451.3pt;height:.05pt;mso-width-percent:0;mso-height-percent:0;mso-width-percent:0;mso-height-percent:0" o:hralign="center" o:hrstd="t" o:hr="t" fillcolor="#a0a0a0" stroked="f"/>
         </w:pict>
       </w:r>
@@ -2733,6 +2745,7 @@
         </w:numPr>
       </w:pPr>
       <w:r>
+        <w:lastRenderedPageBreak/>
         <w:t xml:space="preserve">Of those on ART, a proportion achieve viral suppression: </w:t>
       </w:r>
       <w:r>
@@ -2793,7 +2806,6 @@
         </w:numPr>
       </w:pPr>
       <w:r>
-        <w:lastRenderedPageBreak/>
         <w:t xml:space="preserve">Infant deaths and deaths averted are wired directly into the aggregate </w:t>
       </w:r>
       <w:r>
@@ -2861,7 +2873,7 @@
         <w:rPr>
           <w:noProof/>
         </w:rPr>
-        <w:pict w14:anchorId="0B678216">
+        <w:pict w14:anchorId="0D567439">
           <v:rect id="_x0000_i1025" alt="" style="width:451.3pt;height:.05pt;mso-width-percent:0;mso-height-percent:0;mso-width-percent:0;mso-height-percent:0" o:hralign="center" o:hrstd="t" o:hr="t" fillcolor="#a0a0a0" stroked="f"/>
         </w:pict>
       </w:r>
@@ -3625,7 +3637,6 @@
               <w:rPr>
                 <w:rFonts w:ascii="Times New Roman" w:hAnsi="Times New Roman" w:cs="Times New Roman"/>
               </w:rPr>
-              <w:lastRenderedPageBreak/>
               <w:t>Prevention interventions (deaths averted)</w:t>
             </w:r>
           </w:p>
@@ -3998,6 +4009,7 @@
               <w:rPr>
                 <w:rFonts w:ascii="Times New Roman" w:hAnsi="Times New Roman" w:cs="Times New Roman"/>
               </w:rPr>
+              <w:lastRenderedPageBreak/>
               <w:t>Viral load testing</w:t>
             </w:r>
           </w:p>
@@ -4135,7 +4147,6 @@
               <w:rPr>
                 <w:rFonts w:ascii="Times New Roman" w:hAnsi="Times New Roman" w:cs="Times New Roman"/>
               </w:rPr>
-              <w:lastRenderedPageBreak/>
               <w:t xml:space="preserve">expected_additional_suppressed </w:t>
             </w:r>
             <w:r>
@@ -4172,7 +4183,6 @@
               <w:rPr>
                 <w:rFonts w:ascii="Times New Roman" w:hAnsi="Times New Roman" w:cs="Times New Roman"/>
               </w:rPr>
-              <w:lastRenderedPageBreak/>
               <w:t>Mortality among a sub-group</w:t>
             </w:r>
           </w:p>
@@ -5029,7 +5039,14 @@
               <w:rPr>
                 <w:rFonts w:ascii="Times New Roman" w:hAnsi="Times New Roman" w:cs="Times New Roman"/>
               </w:rPr>
-              <w:t>Limits in place and working – app a little buggy about using the arrows straight after exceeding limits</w:t>
+              <w:t xml:space="preserve">Limits in place and working – app a little buggy about using the </w:t>
+            </w:r>
+            <w:r>
+              <w:rPr>
+                <w:rFonts w:ascii="Times New Roman" w:hAnsi="Times New Roman" w:cs="Times New Roman"/>
+              </w:rPr>
+              <w:lastRenderedPageBreak/>
+              <w:t>arrows straight after exceeding limits</w:t>
             </w:r>
           </w:p>
         </w:tc>
@@ -5649,6 +5666,7 @@
           <w:sz w:val="22"/>
           <w:szCs w:val="22"/>
         </w:rPr>
+        <w:lastRenderedPageBreak/>
         <w:t>All outputs are non-negative and respect biological ceilings (e.g. VMMC cannot exceed the uncircumcised pool).</w:t>
       </w:r>
     </w:p>
@@ -5702,16 +5720,7 @@
           <w:sz w:val="22"/>
           <w:szCs w:val="22"/>
         </w:rPr>
-        <w:t xml:space="preserve">Uses a standardised population with the following parameters: 1,000,000 total population, 5% HIV prevalence (50,000 PLHIV), 80% diagnosed, 75% on ART, 85% virally suppressed, 2,500 new infections </w:t>
-      </w:r>
-      <w:r>
-        <w:rPr>
-          <w:rFonts w:ascii="Times New Roman" w:hAnsi="Times New Roman" w:cs="Times New Roman"/>
-          <w:sz w:val="22"/>
-          <w:szCs w:val="22"/>
-        </w:rPr>
-        <w:lastRenderedPageBreak/>
-        <w:t>per year, 1,000 AIDS deaths per year, crude birth rate 25 per 1,000, 49% of population male, and 40% of population under 15.</w:t>
+        <w:t>Uses a standardised population with the following parameters: 1,000,000 total population, 5% HIV prevalence (50,000 PLHIV), 80% diagnosed, 75% on ART, 85% virally suppressed, 2,500 new infections per year, 1,000 AIDS deaths per year, crude birth rate 25 per 1,000, 49% of population male, and 40% of population under 15.</w:t>
       </w:r>
     </w:p>
     <w:p>
@@ -6402,14 +6411,7 @@
               <w:rPr>
                 <w:rFonts w:ascii="Times New Roman" w:hAnsi="Times New Roman" w:cs="Times New Roman"/>
               </w:rPr>
-              <w:t xml:space="preserve">Calibrated beta values produce correct infections </w:t>
-            </w:r>
-            <w:r>
-              <w:rPr>
-                <w:rFonts w:ascii="Times New Roman" w:hAnsi="Times New Roman" w:cs="Times New Roman"/>
-              </w:rPr>
-              <w:lastRenderedPageBreak/>
-              <w:t>given baseline prevention in place</w:t>
+              <w:t>Calibrated beta values produce correct infections given baseline prevention in place</w:t>
             </w:r>
           </w:p>
         </w:tc>
@@ -6428,7 +6430,6 @@
               <w:rPr>
                 <w:rFonts w:ascii="Times New Roman" w:hAnsi="Times New Roman" w:cs="Times New Roman"/>
               </w:rPr>
-              <w:lastRenderedPageBreak/>
               <w:t>Obsserved_infections = reproduced infections (with calibrated beta)</w:t>
             </w:r>
           </w:p>
@@ -7183,6 +7184,7 @@
               <w:rPr>
                 <w:rFonts w:ascii="Times New Roman" w:hAnsi="Times New Roman" w:cs="Times New Roman"/>
               </w:rPr>
+              <w:lastRenderedPageBreak/>
               <w:t>10.</w:t>
             </w:r>
           </w:p>
@@ -7289,7 +7291,6 @@
                 <w:b/>
                 <w:bCs/>
               </w:rPr>
-              <w:lastRenderedPageBreak/>
               <w:t>#</w:t>
             </w:r>
           </w:p>
@@ -7902,6 +7903,7 @@
         <w:rPr>
           <w:rFonts w:ascii="Times New Roman" w:hAnsi="Times New Roman" w:cs="Times New Roman"/>
         </w:rPr>
+        <w:lastRenderedPageBreak/>
         <w:t>Boundary conditions</w:t>
       </w:r>
     </w:p>
@@ -8035,14 +8037,7 @@
               <w:rPr>
                 <w:rFonts w:ascii="Times New Roman" w:hAnsi="Times New Roman" w:cs="Times New Roman"/>
               </w:rPr>
-              <w:t>New infections is always non-</w:t>
-            </w:r>
-            <w:r>
-              <w:rPr>
-                <w:rFonts w:ascii="Times New Roman" w:hAnsi="Times New Roman" w:cs="Times New Roman"/>
-              </w:rPr>
-              <w:lastRenderedPageBreak/>
-              <w:t>negative</w:t>
+              <w:t>New infections is always non-negative</w:t>
             </w:r>
             <w:r>
               <w:rPr>
@@ -8085,7 +8080,6 @@
               <w:rPr>
                 <w:rFonts w:ascii="Times New Roman" w:hAnsi="Times New Roman" w:cs="Times New Roman"/>
               </w:rPr>
-              <w:lastRenderedPageBreak/>
               <w:t>End_new_infections&gt;0</w:t>
             </w:r>
           </w:p>
@@ -8664,6 +8658,7 @@
         <w:rPr>
           <w:rFonts w:ascii="Times New Roman" w:hAnsi="Times New Roman" w:cs="Times New Roman"/>
         </w:rPr>
+        <w:lastRenderedPageBreak/>
         <w:t>Test Logic</w:t>
       </w:r>
     </w:p>
@@ -8745,7 +8740,6 @@
         <w:rPr>
           <w:rFonts w:ascii="Times New Roman" w:hAnsi="Times New Roman" w:cs="Times New Roman"/>
         </w:rPr>
-        <w:lastRenderedPageBreak/>
         <w:t>Intervention assumptions</w:t>
       </w:r>
       <w:r>
@@ -9707,6 +9701,7 @@
         <w:rPr>
           <w:rFonts w:ascii="Times New Roman" w:hAnsi="Times New Roman" w:cs="Times New Roman"/>
         </w:rPr>
+        <w:lastRenderedPageBreak/>
         <w:t>Scale up scenario to 20</w:t>
       </w:r>
       <w:r>
@@ -9845,14 +9840,7 @@
               <w:rPr>
                 <w:rFonts w:ascii="Times New Roman" w:hAnsi="Times New Roman" w:cs="Times New Roman"/>
               </w:rPr>
-              <w:t xml:space="preserve">Scale up general facility testing  by </w:t>
-            </w:r>
-            <w:r>
-              <w:rPr>
-                <w:rFonts w:ascii="Times New Roman" w:hAnsi="Times New Roman" w:cs="Times New Roman"/>
-              </w:rPr>
-              <w:lastRenderedPageBreak/>
-              <w:t>10 000 tests – positive tests</w:t>
+              <w:t>Scale up general facility testing  by 10 000 tests – positive tests</w:t>
             </w:r>
           </w:p>
         </w:tc>
@@ -9871,7 +9859,6 @@
               <w:rPr>
                 <w:rFonts w:ascii="Times New Roman" w:hAnsi="Times New Roman" w:cs="Times New Roman"/>
               </w:rPr>
-              <w:lastRenderedPageBreak/>
               <w:t>Expected_positive_scenario=2*expected_positive_baseline</w:t>
             </w:r>
           </w:p>
@@ -10515,6 +10502,7 @@
           <w:rFonts w:ascii="Times New Roman" w:hAnsi="Times New Roman" w:cs="Times New Roman"/>
           <w:color w:val="000000" w:themeColor="text1"/>
         </w:rPr>
+        <w:lastRenderedPageBreak/>
         <w:t>Compare three scenarios:</w:t>
       </w:r>
     </w:p>
@@ -10620,7 +10608,6 @@
                 <w:b/>
                 <w:bCs/>
               </w:rPr>
-              <w:lastRenderedPageBreak/>
               <w:t>#</w:t>
             </w:r>
           </w:p>
@@ -11716,6 +11703,7 @@
           <w:iCs/>
           <w:color w:val="2E74B5"/>
         </w:rPr>
+        <w:lastRenderedPageBreak/>
         <w:t>Different linkage rates</w:t>
       </w:r>
     </w:p>
@@ -11773,7 +11761,6 @@
                 <w:b/>
                 <w:bCs/>
               </w:rPr>
-              <w:lastRenderedPageBreak/>
               <w:t>#</w:t>
             </w:r>
           </w:p>
@@ -12408,7 +12395,14 @@
               <w:rPr>
                 <w:rFonts w:ascii="Times New Roman" w:hAnsi="Times New Roman" w:cs="Times New Roman"/>
               </w:rPr>
-              <w:t>. Additionally, results in more people suppressed at the end than at the beginning</w:t>
+              <w:t xml:space="preserve">. Additionally, results in more people suppressed </w:t>
+            </w:r>
+            <w:r>
+              <w:rPr>
+                <w:rFonts w:ascii="Times New Roman" w:hAnsi="Times New Roman" w:cs="Times New Roman"/>
+              </w:rPr>
+              <w:lastRenderedPageBreak/>
+              <w:t>at the end than at the beginning</w:t>
             </w:r>
           </w:p>
         </w:tc>
@@ -12427,6 +12421,7 @@
               <w:rPr>
                 <w:rFonts w:ascii="Times New Roman" w:hAnsi="Times New Roman" w:cs="Times New Roman"/>
               </w:rPr>
+              <w:lastRenderedPageBreak/>
               <w:t>number_reached = on_art * 0.6</w:t>
             </w:r>
           </w:p>
@@ -12542,14 +12537,7 @@
               <w:rPr>
                 <w:rFonts w:ascii="Times New Roman" w:hAnsi="Times New Roman" w:cs="Times New Roman"/>
               </w:rPr>
-              <w:t xml:space="preserve"> VL coverage over </w:t>
-            </w:r>
-            <w:r>
-              <w:rPr>
-                <w:rFonts w:ascii="Times New Roman" w:hAnsi="Times New Roman" w:cs="Times New Roman"/>
-              </w:rPr>
-              <w:lastRenderedPageBreak/>
-              <w:t>baseline (80% vs 40%) should have double the additional suppressed</w:t>
+              <w:t xml:space="preserve"> VL coverage over baseline (80% vs 40%) should have double the additional suppressed</w:t>
             </w:r>
           </w:p>
         </w:tc>
@@ -12568,7 +12556,6 @@
               <w:rPr>
                 <w:rFonts w:ascii="Times New Roman" w:hAnsi="Times New Roman" w:cs="Times New Roman"/>
               </w:rPr>
-              <w:lastRenderedPageBreak/>
               <w:t>Additional_suppressed_scen_1 = 2*Additional_suppressed_base</w:t>
             </w:r>
           </w:p>
@@ -13028,6 +13015,7 @@
         <w:rPr>
           <w:rFonts w:ascii="Times New Roman" w:hAnsi="Times New Roman" w:cs="Times New Roman"/>
         </w:rPr>
+        <w:lastRenderedPageBreak/>
         <w:t xml:space="preserve">Tests </w:t>
       </w:r>
       <w:r>
@@ -13062,7 +13050,6 @@
         <w:rPr>
           <w:rFonts w:ascii="Times New Roman" w:hAnsi="Times New Roman" w:cs="Times New Roman"/>
         </w:rPr>
-        <w:lastRenderedPageBreak/>
         <w:t xml:space="preserve">Uses a standardized population with the following parameters: 1,000,000 total population, 5% HIV prevalence (50,000 PLHIV), 80% diagnosed, 75% on ART, 85% virally suppressed, </w:t>
       </w:r>
       <w:r>
@@ -13830,6 +13817,7 @@
               <w:rPr>
                 <w:rFonts w:ascii="Times New Roman" w:hAnsi="Times New Roman" w:cs="Times New Roman"/>
               </w:rPr>
+              <w:lastRenderedPageBreak/>
               <w:t>6.</w:t>
             </w:r>
           </w:p>
@@ -13849,14 +13837,7 @@
               <w:rPr>
                 <w:rFonts w:ascii="Times New Roman" w:hAnsi="Times New Roman" w:cs="Times New Roman"/>
               </w:rPr>
-              <w:t xml:space="preserve">AHD mortality rate has no effect on mortality of established groups </w:t>
-            </w:r>
-            <w:r>
-              <w:rPr>
-                <w:rFonts w:ascii="Times New Roman" w:hAnsi="Times New Roman" w:cs="Times New Roman"/>
-              </w:rPr>
-              <w:lastRenderedPageBreak/>
-              <w:t xml:space="preserve">(assumed </w:t>
+              <w:t xml:space="preserve">AHD mortality rate has no effect on mortality of established groups (assumed </w:t>
             </w:r>
             <w:r>
               <w:rPr>
@@ -13887,7 +13868,6 @@
               <w:rPr>
                 <w:rFonts w:ascii="Times New Roman" w:hAnsi="Times New Roman" w:cs="Times New Roman"/>
               </w:rPr>
-              <w:lastRenderedPageBreak/>
               <w:t>Deaths_low_AHD = Deaths_high_AHD</w:t>
             </w:r>
           </w:p>
@@ -14493,6 +14473,7 @@
               <w:rPr>
                 <w:rFonts w:ascii="Times New Roman" w:hAnsi="Times New Roman" w:cs="Times New Roman"/>
               </w:rPr>
+              <w:lastRenderedPageBreak/>
               <w:t>11</w:t>
             </w:r>
           </w:p>
@@ -14574,14 +14555,7 @@
               <w:rPr>
                 <w:rFonts w:ascii="Times New Roman" w:hAnsi="Times New Roman" w:cs="Times New Roman"/>
               </w:rPr>
-              <w:t xml:space="preserve">AHD package with CD4 testing reduces AHD </w:t>
-            </w:r>
-            <w:r>
-              <w:rPr>
-                <w:rFonts w:ascii="Times New Roman" w:hAnsi="Times New Roman" w:cs="Times New Roman"/>
-              </w:rPr>
-              <w:lastRenderedPageBreak/>
-              <w:t>mortality for new initiations</w:t>
+              <w:t>AHD package with CD4 testing reduces AHD mortality for new initiations</w:t>
             </w:r>
           </w:p>
         </w:tc>
@@ -14600,7 +14574,6 @@
               <w:rPr>
                 <w:rFonts w:ascii="Times New Roman" w:hAnsi="Times New Roman" w:cs="Times New Roman"/>
               </w:rPr>
-              <w:lastRenderedPageBreak/>
               <w:t>AHD and CD4 reduced deaths</w:t>
             </w:r>
           </w:p>
@@ -15171,6 +15144,7 @@
         <w:rPr>
           <w:rStyle w:val="Strong"/>
         </w:rPr>
+        <w:lastRenderedPageBreak/>
         <w:t>LTFU rates:</w:t>
       </w:r>
       <w:r>
@@ -15213,7 +15187,6 @@
         <w:rPr>
           <w:rStyle w:val="Strong"/>
         </w:rPr>
-        <w:lastRenderedPageBreak/>
         <w:t>zero_mortality() called once at top level</w:t>
       </w:r>
       <w:r>
@@ -15829,6 +15802,7 @@
               <w:rPr>
                 <w:rFonts w:ascii="Times New Roman" w:hAnsi="Times New Roman" w:cs="Times New Roman"/>
               </w:rPr>
+              <w:lastRenderedPageBreak/>
               <w:t>5</w:t>
             </w:r>
             <w:r>
@@ -15990,21 +15964,14 @@
               <w:rPr>
                 <w:rFonts w:ascii="Times New Roman" w:hAnsi="Times New Roman" w:cs="Times New Roman"/>
               </w:rPr>
+              <w:t xml:space="preserve"> counselling combine multiplicatively</w:t>
+            </w:r>
+            <w:r>
+              <w:rPr>
+                <w:rFonts w:ascii="Times New Roman" w:hAnsi="Times New Roman" w:cs="Times New Roman"/>
+              </w:rPr>
               <w:t xml:space="preserve"> </w:t>
             </w:r>
-            <w:r>
-              <w:rPr>
-                <w:rFonts w:ascii="Times New Roman" w:hAnsi="Times New Roman" w:cs="Times New Roman"/>
-              </w:rPr>
-              <w:lastRenderedPageBreak/>
-              <w:t>counselling combine multiplicatively</w:t>
-            </w:r>
-            <w:r>
-              <w:rPr>
-                <w:rFonts w:ascii="Times New Roman" w:hAnsi="Times New Roman" w:cs="Times New Roman"/>
-              </w:rPr>
-              <w:t xml:space="preserve"> </w:t>
-            </w:r>
           </w:p>
         </w:tc>
         <w:tc>
@@ -16022,7 +15989,6 @@
               <w:rPr>
                 <w:rFonts w:ascii="Times New Roman" w:hAnsi="Times New Roman" w:cs="Times New Roman"/>
               </w:rPr>
-              <w:lastRenderedPageBreak/>
               <w:t>ltfu_new_effective (both) &lt; ltfu_new_effective (</w:t>
             </w:r>
             <w:r>
@@ -16097,7 +16063,6 @@
               <w:rPr>
                 <w:rFonts w:ascii="Times New Roman" w:hAnsi="Times New Roman" w:cs="Times New Roman"/>
               </w:rPr>
-              <w:lastRenderedPageBreak/>
               <w:t>8</w:t>
             </w:r>
           </w:p>
@@ -16514,6 +16479,7 @@
               <w:rPr>
                 <w:rFonts w:ascii="Times New Roman" w:hAnsi="Times New Roman" w:cs="Times New Roman"/>
               </w:rPr>
+              <w:lastRenderedPageBreak/>
               <w:t>end_on_art &lt;=end_diagnosed</w:t>
             </w:r>
           </w:p>
@@ -16538,6 +16504,7 @@
               <w:rPr>
                 <w:rFonts w:ascii="Times New Roman" w:hAnsi="Times New Roman" w:cs="Times New Roman"/>
               </w:rPr>
+              <w:lastRenderedPageBreak/>
               <w:t>13</w:t>
             </w:r>
           </w:p>
@@ -16569,14 +16536,7 @@
               <w:rPr>
                 <w:rFonts w:ascii="Times New Roman" w:hAnsi="Times New Roman" w:cs="Times New Roman"/>
               </w:rPr>
-              <w:t xml:space="preserve"> (denominator on </w:t>
-            </w:r>
-            <w:r>
-              <w:rPr>
-                <w:rFonts w:ascii="Times New Roman" w:hAnsi="Times New Roman" w:cs="Times New Roman"/>
-              </w:rPr>
-              <w:lastRenderedPageBreak/>
-              <w:t>ART shrink faster than suppressed)</w:t>
+              <w:t xml:space="preserve"> (denominator on ART shrink faster than suppressed)</w:t>
             </w:r>
           </w:p>
         </w:tc>
@@ -16595,7 +16555,6 @@
               <w:rPr>
                 <w:rFonts w:ascii="Times New Roman" w:hAnsi="Times New Roman" w:cs="Times New Roman"/>
               </w:rPr>
-              <w:lastRenderedPageBreak/>
               <w:t>Third_95_end &gt; third_95_start</w:t>
             </w:r>
           </w:p>
@@ -17168,6 +17127,7 @@
               <w:rPr>
                 <w:rFonts w:ascii="Times New Roman" w:hAnsi="Times New Roman" w:cs="Times New Roman"/>
               </w:rPr>
+              <w:lastRenderedPageBreak/>
               <w:t>18</w:t>
             </w:r>
           </w:p>

</xml_diff>